<commit_message>
chore: update TreeRAG_TIST_ACM.docx and remove temporary file
</commit_message>
<xml_diff>
--- a/TreeRAG_TIST_ACM.docx
+++ b/TreeRAG_TIST_ACM.docx
@@ -39,7 +39,16 @@
         <w:pStyle w:val="Abstract"/>
       </w:pPr>
       <w:r>
-        <w:t>Retrieval-Augmented Generation (RAG) has emerged as a dominant paradigm for grounding large language model (LLM) outputs in external documents. However, conventional flat-chunk retrieval discards the inherent hierarchical structure of technical documents-chapters, sections, and articles-leading to context fragmentation and reduced answer fidelity. We present TreeRAG, a hierarchical document intelligence system that (1) converts raw PDFs into page-aware JSON trees using zero-shot LLM prompting, (2) traverses these trees with two complementary algorithms-Depth-First Search (DFS) and Beam Search-to retrieve only structurally relevant nodes, (3) applies TF-IDF and semantic contextual compression to reduce token overhead, and (4) validates generated answers with a five-signal hallucination detector. We evaluate TreeRAG on 204 general-domain questions, a 20-question HotpotQA multi-hop subset, and a 42-question medical domain benchmark against four baselines: BM25, Dense Retrieval, FlatRAG, and RAPTOR. TreeRAG-DFS achieves a ROUGE-L of 0.451 on the general benchmark (+39.5% over BM25, +81.9% over FlatRAG, +132.4% over RAPTOR; all p &lt; 0.001), and TreeRAG-Beam yields a ROUGE-L of 0.169 on multi-hop HotpotQA (+84.4% over BM25, p &lt; 0.001). TreeRAG-DFS uses 37.5% fewer average context tokens than BM25 without degrading retrieval quality, and our ablation shows contextual compression removes the redundant nodes introduced by wider traversal at no accuracy cost. An online configuration using a locally hosted Llama model reproduces these results at no API cost, and we discuss deployment considerations-caching, rate limiting, and citation traceability-that make the approach suitable for production document question answering.</w:t>
+        <w:t>Retrieval-Augmented Generation (RAG) has emerged as a dominant paradigm for grounding large language model (LLM) outputs in external documents. However, conventional flat-chunk retrieval discards the inherent hierarchical structure of technical documents-chapters, sections, and articles-leading to context fragmentation and reduced answer fidelity. We present TreeRAG, a hierarchical document intelligence system that (1) converts raw PDFs into page-aware JSON trees using zero-shot LLM prompting, (2) traverses</w:t>
+      </w:r>
+      <w:r>
+        <w:t xml:space="preserve"> these trees with two complementary algorithms-Depth-First Search (DFS) and Beam Search-to retrieve only structurally relevant nodes, (3) applies TF-IDF and semantic contextual compression to reduce token overhead, and (4) validates generated answers with a five-signal hallucination detector. We evaluate TreeRAG on 204 general-domain questions, a 20-question HotpotQA multi-hop subset, and a 42-question medical domain benchmark against four baselines: BM25, Dense Retrieval, FlatRAG, and RAPTOR. TreeRAG-DFS a</w:t>
+      </w:r>
+      <w:r>
+        <w:t>chieves a ROUGE-L of 0.451 on the general benchmark (+39.5% over BM25, +81.9% over FlatRAG, +132.4% over RAPTOR; all p &lt; 0.001), and TreeRAG-Beam yields a ROUGE-L of 0.169 on multi-hop HotpotQA (+84.4% over BM25, p &lt; 0.001). TreeRAG-DFS uses 37.5% fewer average context tokens than BM25 without degrading retrieval quality, and our ablation shows contextual compression removes the redundant nodes introduced by wider traversal at no accuracy cost. An online configuration using a locally hosted Llama model repr</w:t>
+      </w:r>
+      <w:r>
+        <w:t>oduces these results at no API cost, and we discuss deployment considerations-caching, rate limiting, and citation traceability-that make the approach suitable for production document question answering.</w:t>
       </w:r>
     </w:p>
     <w:p>
@@ -68,22 +77,6 @@
     </w:p>
     <w:p>
       <w:pPr>
-        <w:pStyle w:val="ACMRefHead"/>
-      </w:pPr>
-      <w:r>
-        <w:t>ACM Reference Format:</w:t>
-      </w:r>
-    </w:p>
-    <w:p>
-      <w:pPr>
-        <w:pStyle w:val="ACMRef"/>
-      </w:pPr>
-      <w:r>
-        <w:t>Wonseok Lee. 2026. TreeRAG: Accuracy and Efficiency Gains from Structure-Aware Hierarchical Retrieval. ACM Trans. Intell. Syst. Technol. XX, X, Article XX (2026), XX pages. https://doi.org/XX.XXXX/XXXXXXX</w:t>
-      </w:r>
-    </w:p>
-    <w:p>
-      <w:pPr>
         <w:pStyle w:val="Head1"/>
       </w:pPr>
       <w:r>
@@ -93,13 +86,45 @@
     <w:p>
       <w:pPr>
         <w:pStyle w:val="PostHeadPara"/>
-      </w:pPr>
-      <w:r>
-        <w:t xml:space="preserve">Large language models (LLMs) excel at reasoning but are prone to hallucination-generating plausible yet factually incorrect text-when operating beyond their training data [9]. Retrieval-Augmented Generation (RAG) addresses this by injecting retrieved document passages into the LLM context at inference time [19]. The dominant RAG pipeline chunks </w:t>
-      </w:r>
+        <w:rPr>
+          <w:rFonts w:hint="eastAsia"/>
+          <w:lang w:eastAsia="ko-KR"/>
+        </w:rPr>
+      </w:pPr>
+      <w:r>
+        <w:t>Large language models (LLMs) excel at reasoning but are prone to hallucination-generating plausible yet factually incorrect text-when operating beyond their training data [9]. Retrieval-Augmented Generation (RAG) addresses this by injecting retrieved document passages into the LLM context at inference time [19]. The dominant RAG pipeline chun</w:t>
+      </w:r>
+      <w:r>
+        <w:t>k</w:t>
+      </w:r>
+      <w:r>
+        <w:t>s</w:t>
+      </w:r>
+      <w:r>
+        <w:t xml:space="preserve"> </w:t>
+      </w:r>
+      <w:r>
+        <w:t xml:space="preserve">source documents into fixed-length text windows, embeds each chunk with a dense encoder, and retrieves the </w:t>
+      </w:r>
+      <w:proofErr w:type="gramStart"/>
+      <w:r>
+        <w:t>top-K</w:t>
+      </w:r>
+      <w:proofErr w:type="gramEnd"/>
+      <w:r>
+        <w:t xml:space="preserve"> nearest neighbors to a given query [7].</w:t>
+      </w:r>
+    </w:p>
+    <w:p>
+      <w:pPr>
+        <w:pStyle w:val="Para"/>
+      </w:pPr>
       <w:r>
         <w:lastRenderedPageBreak/>
-        <w:t>source documents into fixed-length text windows, embeds each chunk with a dense encoder, and retrieves the top-K nearest neighbors to a given query [7].</w:t>
+        <w:t>This flat-chunk paradigm has a structural blindspot: technical documents-regulatory filings, clinical guidelines, academic papers-are organized hierarchically. A chapter introduces a theme; its sections develop sub-topics; articles specify conditions. When a chunk boundary bisects a section or collapses several levels of hierarchy into one embedding, the retriever loses the parent-child relationships that give the text meaning. The resulting context presented to the generator is fragmentary, out of order, o</w:t>
+      </w:r>
+      <w:r>
+        <w:t>r redundant, degrading both answer quality and token efficiency.</w:t>
       </w:r>
     </w:p>
     <w:p>
@@ -107,7 +132,10 @@
         <w:pStyle w:val="Para"/>
       </w:pPr>
       <w:r>
-        <w:t>This flat-chunk paradigm has a structural blindspot: technical documents-regulatory filings, clinical guidelines, academic papers-are organized hierarchically. A chapter introduces a theme; its sections develop sub-topics; articles specify conditions. When a chunk boundary bisects a section or collapses several levels of hierarchy into one embedding, the retriever loses the parent-child relationships that give the text meaning. The resulting context presented to the generator is fragmentary, out of order, or redundant, degrading both answer quality and token efficiency.</w:t>
+        <w:t>As a concrete example, consider a clinical guideline in which a top-level chapter establishes a treatment protocol, a child section lists dosage conditions, and a sibling section lists contraindications. A flat retriever asked “what are the contraindications for protocol X?” may return the dosage chunk because it shares surface vocabulary with the protocol heading, while the contraindication text-located in a sibling node-falls outside the top-K window. A structure-aware retriever that first matches the cha</w:t>
+      </w:r>
+      <w:r>
+        <w:t>pter and then descends into the correct child avoids this failure mode by construction.</w:t>
       </w:r>
     </w:p>
     <w:p>
@@ -115,7 +143,10 @@
         <w:pStyle w:val="Para"/>
       </w:pPr>
       <w:r>
-        <w:t>As a concrete example, consider a clinical guideline in which a top-level chapter establishes a treatment protocol, a child section lists dosage conditions, and a sibling section lists contraindications. A flat retriever asked “what are the contraindications for protocol X?” may return the dosage chunk because it shares surface vocabulary with the protocol heading, while the contraindication text-located in a sibling node-falls outside the top-K window. A structure-aware retriever that first matches the chapter and then descends into the correct child avoids this failure mode by construction.</w:t>
+        <w:t>Prior work has explored hierarchical indexing in several forms. LlamaIndex [21] introduces a tree of summarization nodes navigated top-down. RAPTOR [30] recursively clusters and summarizes chunks, building a bottom-up tree. PageIndex [33] demonstrates vectorless, structure-first retrieval. Yet none of these approaches provides (a) zero-shot, domain-adaptive LLM tree construction, (b) a choice of traversal algorithms tuned to query complexity, (c) integrated compression to manage LLM token budgets, and (d) a</w:t>
+      </w:r>
+      <w:r>
+        <w:t xml:space="preserve"> built-in hallucination grounding layer-all in a single production-ready system.</w:t>
       </w:r>
     </w:p>
     <w:p>
@@ -123,7 +154,47 @@
         <w:pStyle w:val="Para"/>
       </w:pPr>
       <w:r>
-        <w:t>Prior work has explored hierarchical indexing in several forms. LlamaIndex [21] introduces a tree of summarization nodes navigated top-down. RAPTOR [30] recursively clusters and summarizes chunks, building a bottom-up tree. PageIndex [33] demonstrates vectorless, structure-first retrieval. Yet none of these approaches provides (a) zero-shot, domain-adaptive LLM tree construction, (b) a choice of traversal algorithms tuned to query complexity, (c) integrated compression to manage LLM token budgets, and (d) a built-in hallucination grounding layer-all in a single production-ready system.</w:t>
+        <w:t>We introduce TreeRAG, which unifies these capabilities. Our contributions are as follows.</w:t>
+      </w:r>
+    </w:p>
+    <w:p>
+      <w:pPr>
+        <w:pStyle w:val="a"/>
+      </w:pPr>
+      <w:r>
+        <w:t>(1) LLM-Driven Tree Indexing. A zero-shot prompting strategy that converts arbitrary PDFs into page-referenced JSON trees, with domain-adaptive templates for medical, legal, financial, and academic documents.</w:t>
+      </w:r>
+    </w:p>
+    <w:p>
+      <w:pPr>
+        <w:pStyle w:val="a"/>
+      </w:pPr>
+      <w:r>
+        <w:t>(2) Adaptive Dual Traversal. Two tree-traversal algorithms-DFS for depth-first exhaustive search and Beam Search for efficiency-selectable per query, with a probabilistic node-relevance scoring function.</w:t>
+      </w:r>
+    </w:p>
+    <w:p>
+      <w:pPr>
+        <w:pStyle w:val="a"/>
+      </w:pPr>
+      <w:r>
+        <w:t>(3) Contextual Compression. A TF-IDF and semantic relevance filter that removes low-relevance nodes post-traversal, reducing context tokens by 22-37% without accuracy loss.</w:t>
+      </w:r>
+    </w:p>
+    <w:p>
+      <w:pPr>
+        <w:pStyle w:val="a"/>
+      </w:pPr>
+      <w:r>
+        <w:t>(4) Multi-Signal Hallucination Detection. A five-signal confidence estimator (citation presence, word overlap, bigram overlap, trigram overlap, character similarity) that scores each sentence of the generated answer against retrieved nodes.</w:t>
+      </w:r>
+    </w:p>
+    <w:p>
+      <w:pPr>
+        <w:pStyle w:val="a"/>
+      </w:pPr>
+      <w:r>
+        <w:t>(5) Comprehensive Evaluation. Experiments across general, multi-hop, and medical domains with statistical significance testing, ablation studies, and efficiency analysis.</w:t>
       </w:r>
     </w:p>
     <w:p>
@@ -131,47 +202,60 @@
         <w:pStyle w:val="Para"/>
       </w:pPr>
       <w:r>
-        <w:t>We introduce TreeRAG, which unifies these capabilities. Our contributions are as follows.</w:t>
-      </w:r>
-    </w:p>
-    <w:p>
-      <w:pPr>
-        <w:pStyle w:val="a"/>
-      </w:pPr>
-      <w:r>
-        <w:t>(1) LLM-Driven Tree Indexing. A zero-shot prompting strategy that converts arbitrary PDFs into page-referenced JSON trees, with domain-adaptive templates for medical, legal, financial, and academic documents.</w:t>
-      </w:r>
-    </w:p>
-    <w:p>
-      <w:pPr>
-        <w:pStyle w:val="a"/>
-      </w:pPr>
-      <w:r>
-        <w:t>(2) Adaptive Dual Traversal. Two tree-traversal algorithms-DFS for depth-first exhaustive search and Beam Search for efficiency-selectable per query, with a probabilistic node-relevance scoring function.</w:t>
-      </w:r>
-    </w:p>
-    <w:p>
-      <w:pPr>
-        <w:pStyle w:val="a"/>
-      </w:pPr>
-      <w:r>
-        <w:t>(3) Contextual Compression. A TF-IDF and semantic relevance filter that removes low-relevance nodes post-traversal, reducing context tokens by 22-37% without accuracy loss.</w:t>
-      </w:r>
-    </w:p>
-    <w:p>
-      <w:pPr>
-        <w:pStyle w:val="a"/>
-      </w:pPr>
-      <w:r>
-        <w:t>(4) Multi-Signal Hallucination Detection. A five-signal confidence estimator (citation presence, word overlap, bigram overlap, trigram overlap, character similarity) that scores each sentence of the generated answer against retrieved nodes.</w:t>
-      </w:r>
-    </w:p>
-    <w:p>
-      <w:pPr>
-        <w:pStyle w:val="a"/>
-      </w:pPr>
-      <w:r>
-        <w:t>(5) Comprehensive Evaluation. Experiments across general, multi-hop, and medical domains with statistical significance testing, ablation studies, and efficiency analysis.</w:t>
+        <w:t>The remainder of this paper is organized as follows. Section 2 reviews related work. Section 3 details the TreeRAG methodology. Section 4 describes the system architecture. Section 5 presents experiments and results. Section 6 discusses findings and limitations. Section 7 concludes.</w:t>
+      </w:r>
+    </w:p>
+    <w:p>
+      <w:pPr>
+        <w:pStyle w:val="Head1"/>
+      </w:pPr>
+      <w:r>
+        <w:t>RELATED WORK</w:t>
+      </w:r>
+    </w:p>
+    <w:p>
+      <w:pPr>
+        <w:pStyle w:val="Head2"/>
+      </w:pPr>
+      <w:r>
+        <w:t>Retrieval-Augmented Generation</w:t>
+      </w:r>
+    </w:p>
+    <w:p>
+      <w:pPr>
+        <w:pStyle w:val="PostHeadPara"/>
+      </w:pPr>
+      <w:r>
+        <w:t>RAG was formally introduced by Lewis et al. [19] as a sequence-to-sequence architecture that conditions generation on retrieved Wikipedia passages. Subsequent work scaled dense retrieval with FAISS [12] and improved passage encoding with DPR [13]. Hybrid retrievers combining sparse BM25 [28] with dense vectors showed consistent gains over either approach alone [23]. A parallel line of work improves the retriever itself: late-interaction models such as ColBERT [14] and its compressed successor ColBERTv2 [29]</w:t>
+      </w:r>
+      <w:r>
+        <w:t xml:space="preserve"> retain fine-grained token-level matching at scale, while learned sparse </w:t>
+      </w:r>
+      <w:r>
+        <w:lastRenderedPageBreak/>
+        <w:t>models such as SPLADE [5] and the efficiency-oriented SPLATE [6] reconcile neural ranking with inverted-index infrastructure. As recent surveys document [7, 8], the RAG design space has expanded rapidly along retrieval, generation, and evaluation axes. Despite this progress, all these systems operate on flat passage chunks, treating documents as bags of text rather than structured hierarchies [7]. TreeRAG is orthogonal to these retriev</w:t>
+      </w:r>
+      <w:r>
+        <w:t>er advances: its node-relevance score can in principle wrap any of them, but our focus is the document structure that flat retrievers discard.</w:t>
+      </w:r>
+    </w:p>
+    <w:p>
+      <w:pPr>
+        <w:pStyle w:val="Head2"/>
+      </w:pPr>
+      <w:r>
+        <w:t>Hierarchical and Structure-Aware Retrieval</w:t>
+      </w:r>
+    </w:p>
+    <w:p>
+      <w:pPr>
+        <w:pStyle w:val="PostHeadPara"/>
+      </w:pPr>
+      <w:r>
+        <w:t>LlamaIndex [21] constructs a tree of progressively coarser summaries and navigates it top-down, retrieving leaf nodes for generation; its retrieval is embedding-based, requiring a vector store. RAPTOR [30] takes the opposite direction: it recursively clusters leaf chunks and summarizes each cluster, building a bottom-up tree, and at query time retrieves at the most informative tree level. Unlike TreeRAG, RAPTOR's tree reflects embedding-cluster geography rather than the document's own section hierarchy, and</w:t>
+      </w:r>
+      <w:r>
+        <w:t xml:space="preserve"> it lacks traversal-algorithm selection or compression. This distinction matters in domains where the authored section structure is itself the semantics of the document, such as regulations and clinical protocols.</w:t>
       </w:r>
     </w:p>
     <w:p>
@@ -179,7 +263,55 @@
         <w:pStyle w:val="Para"/>
       </w:pPr>
       <w:r>
-        <w:t>The remainder of this paper is organized as follows. Section 2 reviews related work. Section 3 details the TreeRAG methodology. Section 4 describes the system architecture. Section 5 presents experiments and results. Section 6 discusses findings and limitations. Section 7 concludes.</w:t>
+        <w:t>HiRAG [10] explores graph-based hierarchies but requires pre-built knowledge graphs and domain-specific schema engineering. Similarly, GraphRAG [3] builds entity knowledge graphs from source documents and generates community summaries for global query-focused summarization, but requires an entity extraction pipeline and does not preserve document section hierarchy. TreeRAG requires only a raw PDF and an LLM API key. Self-RAG [1] takes a complementary adaptive approach: it trains an LM to decide on-demand wh</w:t>
+      </w:r>
+      <w:r>
+        <w:t>ether to retrieve, and to critique retrieved passages via special reflection tokens. TreeRAG instead uses a fixed two-stage pipeline with query-time algorithm selection (DFS vs. Beam Search) without requiring fine-tuning, which lowers the barrier to deployment on new document collections.</w:t>
+      </w:r>
+    </w:p>
+    <w:p>
+      <w:pPr>
+        <w:pStyle w:val="Head2"/>
+      </w:pPr>
+      <w:r>
+        <w:t>Multi-Hop and Cross-Document Reasoning</w:t>
+      </w:r>
+    </w:p>
+    <w:p>
+      <w:pPr>
+        <w:pStyle w:val="PostHeadPara"/>
+      </w:pPr>
+      <w:r>
+        <w:t>Multi-hop reasoning-answering questions that require evidence synthesis across multiple passages or documents-remains a challenge for flat RAG. HotpotQA [35] benchmarks this capability. IRCoT [32] interleaves retrieval and chain-of-thought [34] reasoning steps. More recently, Zhang et al. [37] propose a hierarchical RAG model with a “rethink” mechanism that iteratively revisits retrieved evidence for multi-hop QA; like TreeRAG it exploits hierarchy, but it adds an iterative re-retrieval loop rather than sel</w:t>
+      </w:r>
+      <w:r>
+        <w:t>ecting a traversal algorithm at query time. TreeRAG's hierarchical structure naturally supports multi-hop queries: the tree encodes which sections are siblings (sharing a parent), enabling the traversal algorithm to follow cross-sectional reasoning paths without additional orchestration.</w:t>
+      </w:r>
+    </w:p>
+    <w:p>
+      <w:pPr>
+        <w:pStyle w:val="Head2"/>
+      </w:pPr>
+      <w:r>
+        <w:t>Hallucination in RAG Systems</w:t>
+      </w:r>
+    </w:p>
+    <w:p>
+      <w:pPr>
+        <w:pStyle w:val="PostHeadPara"/>
+      </w:pPr>
+      <w:r>
+        <w:t>RAG substantially reduces hallucination by grounding generation in retrieved text, but does not eliminate it [31]. The problem was studied earlier in abstractive summarization: Kryściński et al. [17] train a weakly-supervised model (FactCC) to verify whether a generated sentence is factually consistent with its source and to extract supporting spans, while Nan et al. [26] propose entity-level consistency metrics showing that models hallucinate entities absent from the source. These motivate TreeRAG's source</w:t>
+      </w:r>
+      <w:r>
+        <w:t xml:space="preserve">-grounded signals, including its medical entity recall metric (Section 5.3). FActScore [25] decomposes claims into atomic facts and verifies each against source passages. RAGAS [4] defines faithfulness, answer relevance, and context recall as automatic metrics. As a recent review of faithfulness metrics observes, LLM-as-judge evaluators currently correlate best with human judgement but are computationally costly, motivating lightweight </w:t>
+      </w:r>
+      <w:r>
+        <w:lastRenderedPageBreak/>
+        <w:t>alternatives for real-time use [24]. TreeRAG's hallucination detector op</w:t>
+      </w:r>
+      <w:r>
+        <w:t>erates at sentence level using five lightweight overlap signals, providing a fast, LLM-free confidence estimate compatible with real-time serving.</w:t>
       </w:r>
     </w:p>
     <w:p>
@@ -187,7 +319,7 @@
         <w:pStyle w:val="Head1"/>
       </w:pPr>
       <w:r>
-        <w:t>RELATED WORK</w:t>
+        <w:t>METHODOLOGY</w:t>
       </w:r>
     </w:p>
     <w:p>
@@ -195,7 +327,7 @@
         <w:pStyle w:val="Head2"/>
       </w:pPr>
       <w:r>
-        <w:t>Retrieval-Augmented Generation</w:t>
+        <w:t>Document Representation: The Page-Indexed Tree</w:t>
       </w:r>
     </w:p>
     <w:p>
@@ -203,11 +335,10 @@
         <w:pStyle w:val="PostHeadPara"/>
       </w:pPr>
       <w:r>
-        <w:t xml:space="preserve">RAG was formally introduced by Lewis et al. [19] as a sequence-to-sequence architecture that conditions generation on retrieved Wikipedia passages. Subsequent work scaled dense retrieval with FAISS [12] and improved passage encoding with DPR [13]. Hybrid retrievers combining sparse BM25 [28] with dense vectors showed consistent gains over either </w:t>
-      </w:r>
-      <w:r>
-        <w:lastRenderedPageBreak/>
-        <w:t>approach alone [23]. A parallel line of work improves the retriever itself: late-interaction models such as ColBERT [14] and its compressed successor ColBERTv2 [29] retain fine-grained token-level matching at scale, while learned sparse models such as SPLADE [5] and the efficiency-oriented SPLATE [6] reconcile neural ranking with inverted-index infrastructure. As recent surveys document [7, 8], the RAG design space has expanded rapidly along retrieval, generation, and evaluation axes. Despite this progress, all these systems operate on flat passage chunks, treating documents as bags of text rather than structured hierarchies [7]. TreeRAG is orthogonal to these retriever advances: its node-relevance score can in principle wrap any of them, but our focus is the document structure that flat retrievers discard.</w:t>
+        <w:t>Given a PDF document D with pages p_1, ..., p_n, we define a Page-Indexed Tree T as a rooted ordered tree where each node v carries: id, a unique identifier (e.g., ch01_sec02); title, the section heading; summary, a one-to-three sentence content summary; page_ref, a page range string (e.g., 5-12); and children, an ordered list of child nodes. The root represents the entire document. Depth-1 nodes correspond to chapters or top-level sections, depth-2 nodes to subsections, and so on to depth d_max (empiricall</w:t>
+      </w:r>
+      <w:r>
+        <w:t>y 4-6 for most academic and regulatory documents). Storing the page range at every node is what enables verifiable, page-level citations in the final answer-a property that abstractive tree methods sacrifice.</w:t>
       </w:r>
     </w:p>
     <w:p>
@@ -215,7 +346,7 @@
         <w:pStyle w:val="Head2"/>
       </w:pPr>
       <w:r>
-        <w:t>Hierarchical and Structure-Aware Retrieval</w:t>
+        <w:t>LLM-Driven Tree Indexing</w:t>
       </w:r>
     </w:p>
     <w:p>
@@ -223,7 +354,7 @@
         <w:pStyle w:val="PostHeadPara"/>
       </w:pPr>
       <w:r>
-        <w:t>LlamaIndex [21] constructs a tree of progressively coarser summaries and navigates it top-down, retrieving leaf nodes for generation; its retrieval is embedding-based, requiring a vector store. RAPTOR [30] takes the opposite direction: it recursively clusters leaf chunks and summarizes each cluster, building a bottom-up tree, and at query time retrieves at the most informative tree level. Unlike TreeRAG, RAPTOR's tree reflects embedding-cluster geography rather than the document's own section hierarchy, and it lacks traversal-algorithm selection or compression. This distinction matters in domains where the authored section structure is itself the semantics of the document, such as regulations and clinical protocols.</w:t>
+        <w:t>Extraction. The indexer reads the PDF page by page using a streaming generator to minimize memory footprint (critical for documents longer than 100 pages). Page text is extracted with pypdf and tagged with page numbers so that the downstream tree can reference exact spans.</w:t>
       </w:r>
     </w:p>
     <w:p>
@@ -231,91 +362,10 @@
         <w:pStyle w:val="Para"/>
       </w:pPr>
       <w:r>
-        <w:t>HiRAG [10] explores graph-based hierarchies but requires pre-built knowledge graphs and domain-specific schema engineering. Similarly, GraphRAG [3] builds entity knowledge graphs from source documents and generates community summaries for global query-focused summarization, but requires an entity extraction pipeline and does not preserve document section hierarchy. TreeRAG requires only a raw PDF and an LLM API key. Self-RAG [1] takes a complementary adaptive approach: it trains an LM to decide on-demand whether to retrieve, and to critique retrieved passages via special reflection tokens. TreeRAG instead uses a fixed two-stage pipeline with query-time algorithm selection (DFS vs. Beam Search) without requiring fine-tuning, which lowers the barrier to deployment on new document collections.</w:t>
-      </w:r>
-    </w:p>
-    <w:p>
-      <w:pPr>
-        <w:pStyle w:val="Head2"/>
-      </w:pPr>
-      <w:r>
-        <w:t>Multi-Hop and Cross-Document Reasoning</w:t>
-      </w:r>
-    </w:p>
-    <w:p>
-      <w:pPr>
-        <w:pStyle w:val="PostHeadPara"/>
-      </w:pPr>
-      <w:r>
-        <w:t>Multi-hop reasoning-answering questions that require evidence synthesis across multiple passages or documents-remains a challenge for flat RAG. HotpotQA [35] benchmarks this capability. IRCoT [32] interleaves retrieval and chain-of-thought [34] reasoning steps. More recently, Zhang et al. [37] propose a hierarchical RAG model with a “rethink” mechanism that iteratively revisits retrieved evidence for multi-hop QA; like TreeRAG it exploits hierarchy, but it adds an iterative re-retrieval loop rather than selecting a traversal algorithm at query time. TreeRAG's hierarchical structure naturally supports multi-hop queries: the tree encodes which sections are siblings (sharing a parent), enabling the traversal algorithm to follow cross-sectional reasoning paths without additional orchestration.</w:t>
-      </w:r>
-    </w:p>
-    <w:p>
-      <w:pPr>
-        <w:pStyle w:val="Head2"/>
-      </w:pPr>
-      <w:r>
-        <w:t>Hallucination in RAG Systems</w:t>
-      </w:r>
-    </w:p>
-    <w:p>
-      <w:pPr>
-        <w:pStyle w:val="PostHeadPara"/>
-      </w:pPr>
-      <w:r>
-        <w:t xml:space="preserve">RAG substantially reduces hallucination by grounding generation in retrieved text, but does not eliminate it [31]. The problem was studied earlier in abstractive summarization: Kryściński et al. [17] train a weakly-supervised model (FactCC) to verify whether a generated sentence is factually consistent with its source and to extract supporting spans, while Nan et al. [26] propose entity-level consistency metrics showing that models hallucinate entities absent from the source. These motivate TreeRAG's source-grounded signals, including its medical entity recall metric (Section 5.3). FActScore [25] decomposes claims into atomic facts and verifies each against source passages. RAGAS [4] defines faithfulness, answer relevance, and context recall as automatic metrics. As a recent review of faithfulness metrics observes, LLM-as-judge </w:t>
-      </w:r>
-      <w:r>
-        <w:lastRenderedPageBreak/>
-        <w:t>evaluators currently correlate best with human judgement but are computationally costly, motivating lightweight alternatives for real-time use [24]. TreeRAG's hallucination detector operates at sentence level using five lightweight overlap signals, providing a fast, LLM-free confidence estimate compatible with real-time serving.</w:t>
-      </w:r>
-    </w:p>
-    <w:p>
-      <w:pPr>
-        <w:pStyle w:val="Head1"/>
-      </w:pPr>
-      <w:r>
-        <w:t>METHODOLOGY</w:t>
-      </w:r>
-    </w:p>
-    <w:p>
-      <w:pPr>
-        <w:pStyle w:val="Head2"/>
-      </w:pPr>
-      <w:r>
-        <w:t>Document Representation: The Page-Indexed Tree</w:t>
-      </w:r>
-    </w:p>
-    <w:p>
-      <w:pPr>
-        <w:pStyle w:val="PostHeadPara"/>
-      </w:pPr>
-      <w:r>
-        <w:t>Given a PDF document D with pages p_1, ..., p_n, we define a Page-Indexed Tree T as a rooted ordered tree where each node v carries: id, a unique identifier (e.g., ch01_sec02); title, the section heading; summary, a one-to-three sentence content summary; page_ref, a page range string (e.g., 5-12); and children, an ordered list of child nodes. The root represents the entire document. Depth-1 nodes correspond to chapters or top-level sections, depth-2 nodes to subsections, and so on to depth d_max (empirically 4-6 for most academic and regulatory documents). Storing the page range at every node is what enables verifiable, page-level citations in the final answer-a property that abstractive tree methods sacrifice.</w:t>
-      </w:r>
-    </w:p>
-    <w:p>
-      <w:pPr>
-        <w:pStyle w:val="Head2"/>
-      </w:pPr>
-      <w:r>
-        <w:t>LLM-Driven Tree Indexing</w:t>
-      </w:r>
-    </w:p>
-    <w:p>
-      <w:pPr>
-        <w:pStyle w:val="PostHeadPara"/>
-      </w:pPr>
-      <w:r>
-        <w:t>Extraction. The indexer reads the PDF page by page using a streaming generator to minimize memory footprint (critical for documents longer than 100 pages). Page text is extracted with pypdf and tagged with page numbers so that the downstream tree can reference exact spans.</w:t>
-      </w:r>
-    </w:p>
-    <w:p>
-      <w:pPr>
-        <w:pStyle w:val="Para"/>
-      </w:pPr>
-      <w:r>
-        <w:t>Prompting. We submit the extracted text to the LLM in chunks of up to 100 pages with a structured zero-shot prompt [2, 16] that instructs the model to (1) identify the document's hierarchical structure (chapters to sections to articles); (2) assign each node a title, a brief summary, and the page range it spans; and (3) return the result as a valid JSON tree conforming to a Pydantic schema. Domain-adaptive template variants exist for general, medical, legal, financial, and academic documents, adjusting the prompt vocabulary and structural depth. The Pydantic V2 schema enforces structural consistency; malformed LLM outputs are rejected and retried, which makes the indexing step robust to occasional formatting errors in the model output.</w:t>
+        <w:t xml:space="preserve">Prompting. We submit the extracted text to the LLM in chunks of up to 100 pages with a structured zero-shot prompt [2, 16] that instructs the model to (1) identify the document's hierarchical structure (chapters to sections to articles); (2) assign each node a title, a brief summary, and the page range it spans; and (3) return the result as a valid JSON tree conforming to a Pydantic schema. Domain-adaptive template variants exist for general, medical, legal, financial, and academic documents, adjusting the </w:t>
+      </w:r>
+      <w:r>
+        <w:t>prompt vocabulary and structural depth. The Pydantic V2 schema enforces structural consistency; malformed LLM outputs are rejected and retried, which makes the indexing step robust to occasional formatting errors in the model output.</w:t>
       </w:r>
     </w:p>
     <w:p>
@@ -632,7 +682,13 @@
         <w:pStyle w:val="PostHeadPara"/>
       </w:pPr>
       <w:r>
-        <w:t>Post-traversal, the selected node set may still exceed the LLM context limit or contain redundant passages. Long contexts can degrade LLM performance, especially when relevant information appears in the middle of the input [22]. Prompt-compression methods such as LLMLingua [11] address this by dropping low-information tokens, achieving large compression ratios with little quality loss; TreeRAG instead compresses at the node level, pruning and deduplicating whole tree nodes by TF-IDF relevance so that page-level citations remain intact. The compressor (1) tokenizes each node's content (whitespace-based proxy) and assigns a token count; (2) computes TF-IDF cosine similarity between each node and the query, pruning nodes below MIN_CHUNK_RELEVANCE = 0.2; (3) merges node pairs with cosine similarity above SIMILARITY_THRESHOLD = 0.7, retaining the higher-scoring node's content; and (4) sorts the remaining nodes by relevance and truncates to MAX_OUTPUT_TOKENS = 4000. The net effect is a 22-37% reduction in context tokens (Table 3) with minimal retrieval-quality degradation, as shown in the ablation study (Section 5.4).</w:t>
+        <w:t>Post-traversal, the selected node set may still exceed the LLM context limit or contain redundant passages. Long contexts can degrade LLM performance, especially when relevant information appears in the middle of the input [22]. Prompt-compression methods such as LLMLingua [11] address this by dropping low-information tokens, achieving large compression ratios with little quality loss; TreeRAG instead compresses at the node level, pruning and deduplicating whole tree nodes by TF-IDF relevance so that page-l</w:t>
+      </w:r>
+      <w:r>
+        <w:t>evel citations remain intact. The compressor (1) tokenizes each node's content (whitespace-based proxy) and assigns a token count; (2) computes TF-IDF cosine similarity between each node and the query, pruning nodes below MIN_CHUNK_RELEVANCE = 0.2; (3) merges node pairs with cosine similarity above SIMILARITY_THRESHOLD = 0.7, retaining the higher-scoring node's content; and (4) sorts the remaining nodes by relevance and truncates to MAX_OUTPUT_TOKENS = 4000. The net effect is a 22-37% reduction in context t</w:t>
+      </w:r>
+      <w:r>
+        <w:t>okens (Table 3) with minimal retrieval-quality degradation, as shown in the ablation study (Section 5.4).</w:t>
       </w:r>
     </w:p>
     <w:p>
@@ -648,7 +704,10 @@
         <w:pStyle w:val="PostHeadPara"/>
       </w:pPr>
       <w:r>
-        <w:t>Technical documents frequently use internal references (“Section 3.2 conditions”, “Article 5 limitations”). Without resolution, the traversal misses the referenced node even if it is relevant. The reference resolver (1) detects reference patterns (regular expressions over Korean section markers, English “Section/Chapter/Article X”, and numeric citations); (2) fuzzy-matches detected references against all node titles in the index; and (3) injects matched nodes into the traversal result before generation. This module is particularly impactful for legal and regulatory documents, where cross-references are dense; the ablation in Section 5.4 quantifies its precision/coverage trade-off.</w:t>
+        <w:t>Technical documents frequently use internal references (“Section 3.2 conditions”, “Article 5 limitations”). Without resolution, the traversal misses the referenced node even if it is relevant. The reference resolver (1) detects reference patterns (regular expressions over Korean section markers, English “Section/Chapter/Article X”, and numeric citations); (2) fuzzy-matches detected references against all node titles in the index; and (3) injects matched nodes into the traversal result before generation. Thi</w:t>
+      </w:r>
+      <w:r>
+        <w:t>s module is particularly impactful for legal and regulatory documents, where cross-references are dense; the ablation in Section 5.4 quantifies its precision/coverage trade-off.</w:t>
       </w:r>
     </w:p>
     <w:p>
@@ -667,7 +726,10 @@
         </w:rPr>
       </w:pPr>
       <w:r>
-        <w:t>Figure 1 illustrates the five-signal scoring pipeline. Each generated answer sentence is scored against the retrieved node set using five overlap signals (Table 1). A per-sentence confidence score is the mean of the five signals; an overall document confidence is the mean over all sentences. When confidence falls below 0.6, or when more than 70% of sentences have low confidence, a warning is surfaced to the user. This approach is LLM-free and adds negligible latency (under 5 ms per response), unlike verification methods that require a second LLM call, making it practical to run on every response in a live system.</w:t>
+        <w:t>Figure 1 illustrates the five-signal scoring pipeline. Each generated answer sentence is scored against the retrieved node set using five overlap signals (Table 1). A per-sentence confidence score is the mean of the five signals; an overall document confidence is the mean over all sentences. When confidence falls below 0.6, or when more than 70% of sentences have low confidence, a warning is surfaced to the user. This approach is LLM-free and adds negligible latency (under 5 ms per response), unlike verific</w:t>
+      </w:r>
+      <w:r>
+        <w:t>ation methods that require a second LLM call, making it practical to run on every response in a live system.</w:t>
       </w:r>
     </w:p>
     <w:p>
@@ -682,7 +744,6 @@
       <w:pPr>
         <w:pStyle w:val="PostHeadPara"/>
         <w:rPr>
-          <w:rFonts w:hint="eastAsia"/>
           <w:lang w:eastAsia="ko-KR"/>
         </w:rPr>
       </w:pPr>
@@ -1040,7 +1101,10 @@
         <w:pStyle w:val="Para"/>
       </w:pPr>
       <w:r>
-        <w:t>Stage 2 - Reasoning. A chat request enters the reasoner, which (1) routes the query to one or more indexed documents based on LLM-scored summary relevance; (2) optionally runs the reference resolver to expand the query with resolved section references; (3) dispatches either the DFS or the Beam Search navigator; (4) optionally runs the contextual compressor on the selected nodes; (5) calls the LLM with the compressed context and a domain-specific prompt template; (6) runs the hallucination detector on the response; and (7) returns the answer with page citations, traversal statistics, and a confidence score.</w:t>
+        <w:t>Stage 2 - Reasoning. A chat request enters the reasoner, which (1) routes the query to one or more indexed documents based on LLM-scored summary relevance; (2) optionally runs the reference resolver to expand the query with resolved section references; (3) dispatches either the DFS or the Beam Search navigator; (4) optionally runs the contextual compressor on the selected nodes; (5) calls the LLM with the compressed context and a domain-specific prompt template; (6) runs the hallucination detector on the re</w:t>
+      </w:r>
+      <w:r>
+        <w:t>sponse; and (7) returns the answer with page citations, traversal statistics, and a confidence score.</w:t>
       </w:r>
     </w:p>
     <w:p>
@@ -1056,7 +1120,10 @@
         <w:pStyle w:val="PostHeadPara"/>
       </w:pPr>
       <w:r>
-        <w:t>The cache key is a SHA-256 hash of (question, index filenames, traversal settings, domain template, language, prompt cache version). Cache hits return in roughly 100 ms versus the 1.8-3.2 s of a cold LLM call. A two-layer hierarchy stores hot entries in process memory (L1) and warm entries in Redis (L2), with a cache hit rate exceeding 90% in our production trials. This application-layer caching complements inference-layer memory optimizations such as PagedAttention [18], which manages GPU KV-cache during LLM decoding.</w:t>
+        <w:t>The cache key is a SHA-256 hash of (question, index filenames, traversal settings, domain template, language, prompt cache version). Cache hits return in roughly 100 ms versus the 1.8-3.2 s of a cold LLM call. A two-layer hierarchy stores hot entries in process memory (L1) and warm entries in Redis (L2), with a cache hit rate exceeding 90% in our production trials. This application-layer caching complements inference-layer memory optimizations such as PagedAttention [18], which manages GPU KV-cache during L</w:t>
+      </w:r>
+      <w:r>
+        <w:t>LM decoding.</w:t>
       </w:r>
     </w:p>
     <w:p>
@@ -1089,7 +1156,10 @@
         <w:pStyle w:val="PostHeadPara"/>
       </w:pPr>
       <w:r>
-        <w:t>Three properties make TreeRAG practical to operate. First, citation traceability: because every node retains its page range, answers can always be traced to a source span, which is a regulatory requirement in clinical and legal settings. Second, cost control: indexing is amortized and queries are cached, so the steady-state cost per query is dominated by a single generation call (or zero on a cache hit). Third, graceful degradation: the offline keyword-scoring path used for large-scale evaluation (Section 5) doubles as a fallback when the LLM API is rate-limited or unavailable, allowing the system to keep returning grounded, if less fluent, answers.</w:t>
+        <w:t>Three properties make TreeRAG practical to operate. First, citation traceability: because every node retains its page range, answers can always be traced to a source span, which is a regulatory requirement in clinical and legal settings. Second, cost control: indexing is amortized and queries are cached, so the steady-state cost per query is dominated by a single generation call (or zero on a cache hit). Third, graceful degradation: the offline keyword-scoring path used for large-scale evaluation (Section 5</w:t>
+      </w:r>
+      <w:r>
+        <w:t>) doubles as a fallback when the LLM API is rate-limited or unavailable, allowing the system to keep returning grounded, if less fluent, answers.</w:t>
       </w:r>
     </w:p>
     <w:p>
@@ -1113,7 +1183,10 @@
         <w:pStyle w:val="PostHeadPara"/>
       </w:pPr>
       <w:r>
-        <w:t>Datasets. We evaluate on three datasets. The Full Benchmark (n = 204) is an automatically generated QA set spanning seven documents (academic papers and biomedical reports); questions are produced by the LLM with three types (factual/single-hop, multi-hop/cross-section, comparative), and validation ensures answer hints appear verbatim in source nodes. The HotpotQA subset (n = 20) is a sample from the HotpotQA development set [35] converted to page-indexed trees, requiring two-hop reasoning across supporting passages. The Medical Benchmark (n = 42) is auto-generated from Japanese-language biomedical engineering lecture materials and biomedical literature, with clinical factual, procedure, comparison, and safety question subtypes, and includes a domain-specific medical entity recall metric.</w:t>
+        <w:t>Datasets. We evaluate on three datasets. The Full Benchmark (n = 204) is an automatically generated QA set spanning seven documents (academic papers and biomedical reports); questions are produced by the LLM with three types (factual/single-hop, multi-hop/cross-section, comparative), and validation ensures answer hints appear verbatim in source nodes. The HotpotQA subset (n = 20) is a sample from the HotpotQA development set [35] converted to page-indexed trees, requiring two-hop reasoning across supporting</w:t>
+      </w:r>
+      <w:r>
+        <w:t xml:space="preserve"> passages. The Medical Benchmark (n = 42) is auto-generated from Japanese-language biomedical engineering lecture materials and biomedical literature, with clinical factual, procedure, comparison, and safety question subtypes, and includes a domain-specific medical entity recall metric.</w:t>
       </w:r>
     </w:p>
     <w:p>
@@ -1129,7 +1202,10 @@
         <w:pStyle w:val="Para"/>
       </w:pPr>
       <w:r>
-        <w:t>Metrics. We report ROUGE-L [20] (longest-common-subsequence recall between generated and reference answers); BERTScore [36] (contextual embedding precision); LLM-as-Judge [38] on a subset (faithfulness, relevance, completeness, 0-1 scale); Medical Entity Recall (fraction of medical terms in the reference answer recovered); Latency (average wall-clock time per query); and Context Tokens (average token count of the context passed to the LLM). Statistical significance is assessed with paired t-tests; effect size with Cohen's d; confidence intervals via bootstrap resampling.</w:t>
+        <w:t>Metrics. We report ROUGE-L [20] (longest-common-subsequence recall between generated and reference answers); BERTScore [36] (contextual embedding precision); LLM-as-Judge [38] on a subset (faithfulness, relevance, completeness, 0-1 scale); Medical Entity Recall (fraction of medical terms in the reference answer recovered); Latency (average wall-clock time per query); and Context Tokens (average token count of the context passed to the LLM). Statistical significance is assessed with paired t-tests; effect si</w:t>
+      </w:r>
+      <w:r>
+        <w:t>ze with Cohen's d; confidence intervals via bootstrap resampling.</w:t>
       </w:r>
     </w:p>
     <w:p>
@@ -1145,7 +1221,10 @@
         <w:pStyle w:val="PostHeadPara"/>
       </w:pPr>
       <w:r>
-        <w:t>Table 2 reports results on the Full Benchmark and HotpotQA; Figures 3 and 4 visualize the overall and multi-hop comparisons. On the full benchmark, TreeRAG-DFS achieves the highest ROUGE-L (0.451) and BERTScore (0.521). Compared to all baselines, TreeRAG-Beam (the weaker of the two proposed variants on the full benchmark) already outperforms each one with p &lt; 0.001 and effect sizes ranging from d = 0.483 (vs. BM25) to d = 1.205 (vs. RAPTOR). TreeRAG-DFS further improves over BM25 by +39.5% ROUGE-L (+0.127 absolute) and over RAPTOR by +132.4% (+0.257 absolute). TreeRAG-Beam obtains slightly lower ROUGE-L than DFS on single-document factual questions (0.428 vs. 0.451, d = 0.095, p &lt; 0.001) but dominates on multi-hop HotpotQA (ROUGE-L = 0.169 vs. BM25 0.092, +84.4%, p &lt; 0.001, d = 1.358), confirming that beam-guided traversal is better suited to multi-evidence synthesis.</w:t>
+        <w:t>Table 2 reports results on the Full Benchmark and HotpotQA; Figures 3 and 4 visualize the overall and multi-hop comparisons. On the full benchmark, TreeRAG-DFS achieves the highest ROUGE-L (0.451) and BERTScore (0.521). Compared to all baselines, TreeRAG-Beam (the weaker of the two proposed variants on the full benchmark) already outperforms each one with p &lt; 0.001 and effect sizes ranging from d = 0.483 (vs. BM25) to d = 1.205 (vs. RAPTOR). TreeRAG-DFS further improves over BM25 by +39.5% ROUGE-L (+0.127 a</w:t>
+      </w:r>
+      <w:r>
+        <w:t>bsolute) and over RAPTOR by +132.4% (+0.257 absolute). TreeRAG-Beam obtains slightly lower ROUGE-L than DFS on single-document factual questions (0.428 vs. 0.451, d = 0.095, p &lt; 0.001) but dominates on multi-hop HotpotQA (ROUGE-L = 0.169 vs. BM25 0.092, +84.4%, p &lt; 0.001, d = 1.358), confirming that beam-guided traversal is better suited to multi-evidence synthesis.</w:t>
       </w:r>
     </w:p>
     <w:p>
@@ -1871,7 +1950,6 @@
       <w:pPr>
         <w:pStyle w:val="FigureCaption"/>
         <w:rPr>
-          <w:rFonts w:hint="eastAsia"/>
           <w:lang w:eastAsia="ko-KR"/>
         </w:rPr>
       </w:pPr>
@@ -1893,7 +1971,10 @@
       </w:pPr>
       <w:r>
         <w:lastRenderedPageBreak/>
-        <w:t>Table 3 and Figure 5 present domain-specific results on the 42-question medical benchmark. TreeRAG-DFS achieves the highest ROUGE-L (0.366) while maintaining perfect medical entity recall (1.000) and the smallest non-zero context footprint (73.5 tokens). Critically, RAPTOR drops to ROUGE-L 0.053 (-85.5% vs. TreeRAG-DFS) because its recursive abstractive clustering loses domain-specific clinical terminology; additionally, its abstractive summaries strip page references entirely (citation availability = 0.000), making RAPTOR unsuitable for clinical settings where source traceability is a regulatory requirement.</w:t>
+        <w:t>Table 3 and Figure 5 present domain-specific results on the 42-question medical benchmark. TreeRAG-DFS achieves the highest ROUGE-L (0.366) while maintaining perfect medical entity recall (1.000) and the smallest non-zero context footprint (73.5 tokens). Critically, RAPTOR drops to ROUGE-L 0.053 (-85.5% vs. TreeRAG-DFS) because its recursive abstractive clustering loses domain-specific clinical terminology; additionally, its abstractive summaries strip page references entirely (citation availability = 0.000</w:t>
+      </w:r>
+      <w:r>
+        <w:t>), making RAPTOR unsuitable for clinical settings where source traceability is a regulatory requirement.</w:t>
       </w:r>
     </w:p>
     <w:p>
@@ -1901,7 +1982,10 @@
         <w:pStyle w:val="Para"/>
       </w:pPr>
       <w:r>
-        <w:t>TreeRAG-Beam underperforms DFS on medical ROUGE-L (0.265 vs. 0.366, -27.6%). Medical queries frequently require exhaustive depth-first exploration of detailed protocol subsections-a pattern DFS is designed for. Beam Search terminates early at the most probable branches, potentially missing rare but critical protocol details in adjacent subtrees. Dense Retrieval achieves 99.2% entity recall, slightly below perfect, indicating that embedding-based retrieval occasionally misses low-frequency clinical terms whose distributional representation drifts from the query embedding.</w:t>
+        <w:t>TreeRAG-Beam underperforms DFS on medical ROUGE-L (0.265 vs. 0.366, -27.6%). Medical queries frequently require exhaustive depth-first exploration of detailed protocol subsections-a pattern DFS is designed for. Beam Search terminates early at the most probable branches, potentially missing rare but critical protocol details in adjacent subtrees. Dense Retrieval achieves 99.2% entity recall, slightly below perfect, indicating that embedding-based retrieval occasionally misses low-frequency clinical terms who</w:t>
+      </w:r>
+      <w:r>
+        <w:t>se distributional representation drifts from the query embedding.</w:t>
       </w:r>
     </w:p>
     <w:p>
@@ -2392,7 +2476,10 @@
       </w:r>
       <w:r>
         <w:lastRenderedPageBreak/>
-        <w:t>confirming that exhaustive depth-first traversal captures relevant text effectively. Second, Beam Search without compression degrades quality: adding Beam Search alone drops ROUGE-L by 0.050 vs. the Full system and inflates context by +22.8% (107.4 to 170.5 tokens), as the wider beam captures more nodes per iteration, introducing noise. Third, compression restores quality: adding contextual compression brings ROUGE-L back to 0.493 while reducing context to 107.5 tokens, effectively filtering the beam's noisy additions. Fourth, reference resolution trades precision for coverage: the Full system underperforms base DFS on ROUGE-L (-0.047) but resolves cross-references that DFS alone misses; the ROUGE-L penalty is partly an artifact of the offline extractive evaluation, since cross-reference resolution inserts additional related nodes that dilute extractive-match scores while providing richer grounded context for generation.</w:t>
+        <w:t>confirming that exhaustive depth-first traversal captures relevant text effectively. Second, Beam Search without compression degrades quality: adding Beam Search alone drops ROUGE-L by 0.050 vs. the Full system and inflates context by +22.8% (107.4 to 170.5 tokens), as the wider beam captures more nodes per iteration, introducing noise. Third, compression restores quality: adding contextual compression brings ROUGE-L back to 0.493 while reducing context to 107.5 tokens, effectively filtering the beam's nois</w:t>
+      </w:r>
+      <w:r>
+        <w:t>y additions. Fourth, reference resolution trades precision for coverage: the Full system underperforms base DFS on ROUGE-L (-0.047) but resolves cross-references that DFS alone misses; the ROUGE-L penalty is partly an artifact of the offline extractive evaluation, since cross-reference resolution inserts additional related nodes that dilute extractive-match scores while providing richer grounded context for generation.</w:t>
       </w:r>
     </w:p>
     <w:p>
@@ -2771,7 +2858,10 @@
         <w:pStyle w:val="PostHeadPara"/>
       </w:pPr>
       <w:r>
-        <w:t xml:space="preserve">Table 5 shows context-token counts and query latency from the offline evaluation (n = 204); Figures 7 and 8 visualize the latency-accuracy trade-off and the accuracy-context Pareto frontier. TreeRAG-DFS uses 37.5% fewer context tokens than BM25 (65.5 vs. 104.8 tokens average) while achieving +39.5% higher ROUGE-L, Pareto-dominating every baseline. RAPTOR uses the most context (218.7 tokens, +108.7% vs. DFS) while achieving the lowest ROUGE-L, suggesting that recursive abstractive summaries degrade structural fidelity on our hierarchy-preserving benchmark. Both TreeRAG </w:t>
+        <w:t>Table 5 shows context-token counts and query latency from the offline evaluation (n = 204); Figures 7 and 8 visualize the latency-accuracy trade-off and the accuracy-context Pareto frontier. TreeRAG-DFS uses 37.5% fewer context tokens than BM25 (65.5 vs. 104.8 tokens average) while achieving +39.5% higher ROUGE-L, Pareto-dominating every baseline. RAPTOR uses the most context (218.7 tokens, +108.7% vs. DFS) while achieving the lowest ROUGE-L, suggesting that recursive abstractive summaries degrade structura</w:t>
+      </w:r>
+      <w:r>
+        <w:t xml:space="preserve">l fidelity on our hierarchy-preserving benchmark. Both TreeRAG </w:t>
       </w:r>
       <w:r>
         <w:lastRenderedPageBreak/>
@@ -3325,7 +3415,10 @@
         <w:pStyle w:val="PostHeadPara"/>
       </w:pPr>
       <w:r>
-        <w:t>The performance gap between TreeRAG-DFS and FlatRAG (+81.9% ROUGE-L, 0.451 vs. 0.248) is large but explicable. In hierarchical retrieval, the section boundary is an informative signal: if the chapter title matches the query, the full subtree becomes a candidate. Flat retrieval must instead find individual chunks that happen to contain the answer; a chunk at the section boundary may contain the heading but not the answer, or the answer but not its heading. The tree structure eliminates this decoupling. Notably, TreeRAG-DFS also uses 37.5% fewer context tokens than BM25 while achieving +39.5% higher ROUGE-L, demonstrating the precision of hierarchical retrieval: by selecting only structurally relevant subtrees, TreeRAG avoids the context pollution of flat retrieval that includes topically adjacent but ultimately irrelevant passages.</w:t>
+        <w:t>The performance gap between TreeRAG-DFS and FlatRAG (+81.9% ROUGE-L, 0.451 vs. 0.248) is large but explicable. In hierarchical retrieval, the section boundary is an informative signal: if the chapter title matches the query, the full subtree becomes a candidate. Flat retrieval must instead find individual chunks that happen to contain the answer; a chunk at the section boundary may contain the heading but not the answer, or the answer but not its heading. The tree structure eliminates this decoupling. Notab</w:t>
+      </w:r>
+      <w:r>
+        <w:t>ly, TreeRAG-DFS also uses 37.5% fewer context tokens than BM25 while achieving +39.5% higher ROUGE-L, demonstrating the precision of hierarchical retrieval: by selecting only structurally relevant subtrees, TreeRAG avoids the context pollution of flat retrieval that includes topically adjacent but ultimately irrelevant passages.</w:t>
       </w:r>
     </w:p>
     <w:p>
@@ -3357,7 +3450,10 @@
         <w:pStyle w:val="PostHeadPara"/>
       </w:pPr>
       <w:r>
-        <w:t>The large-scale comparisons in Tables 2-5 use an offline (extractive) evaluation mode: traversal uses TF-IDF keyword matching in place of the full LLM relevance scoring, and answers are assembled by concatenating retrieved node summaries rather than generating fluent text. This mode keeps the 204 + 20 + 42 = 266 questions over six systems tractable without hitting hosted-API rate limits. It introduces two conservative biases: traversal quality (keyword scoring is a weaker proxy for semantic relevance than LLM scoring) and answer quality (extractive concatenation produces longer, less precise answers than generated text, inflating context-length measurements and deflating short-reference ROUGE-L for generation-heavy systems such as FlatRAG and RAPTOR).</w:t>
+        <w:t>The large-scale comparisons in Tables 2-5 use an offline (extractive) evaluation mode: traversal uses TF-IDF keyword matching in place of the full LLM relevance scoring, and answers are assembled by concatenating retrieved node summaries rather than generating fluent text. This mode keeps the 204 + 20 + 42 = 266 questions over six systems tractable without hitting hosted-API rate limits. It introduces two conservative biases: traversal quality (keyword scoring is a weaker proxy for semantic relevance than L</w:t>
+      </w:r>
+      <w:r>
+        <w:t>LM scoring) and answer quality (extractive concatenation produces longer, less precise answers than generated text, inflating context-length measurements and deflating short-reference ROUGE-L for generation-heavy systems such as FlatRAG and RAPTOR).</w:t>
       </w:r>
     </w:p>
     <w:p>
@@ -3365,7 +3461,10 @@
         <w:pStyle w:val="Para"/>
       </w:pPr>
       <w:r>
-        <w:t>To test whether these biases distort our conclusions, we additionally ran the full online pipeline-LLM relevance scoring and answer generation-with a locally hosted Llama model in place of a hosted API. Running the model locally removes the rate-limit constraint that motivated the offline mode in the first place. Across the benchmarks, the online Llama configuration yields performance equivalent to the offline results reported above: the relative ordering of all systems is preserved and the magnitude of TreeRAG's advantage over the baselines is consistent, confirming that the offline numbers are a faithful proxy rather than an artifact of extractive scoring. Because the local model incurs no per-request cost, this configuration is also the one we recommend for reproduction.</w:t>
+        <w:t>To test whether these biases distort our conclusions, we additionally ran the full online pipeline-LLM relevance scoring and answer generation-with a locally hosted Llama model in place of a hosted API. Running the model locally removes the rate-limit constraint that motivated the offline mode in the first place. Across the benchmarks, the online Llama configuration yields performance equivalent to the offline results reported above: the relative ordering of all systems is preserved and the magnitude of Tre</w:t>
+      </w:r>
+      <w:r>
+        <w:t>eRAG's advantage over the baselines is consistent, confirming that the offline numbers are a faithful proxy rather than an artifact of extractive scoring. Because the local model incurs no per-request cost, this configuration is also the one we recommend for reproduction.</w:t>
       </w:r>
     </w:p>
     <w:p>
@@ -3381,7 +3480,10 @@
         <w:pStyle w:val="PostHeadPara"/>
       </w:pPr>
       <w:r>
-        <w:t>LLM API dependency. Indexing requires an LLM API call per document; rate limits on free tiers slow bulk indexing. Structural prompt brittleness. Documents with inconsistent heading styles (for example scanned PDFs with OCR artifacts) may yield malformed index trees requiring manual correction. Learned scoring. We attempted learned node scoring via DSPy [15] with an open 70B model; optimization yielded no improvement (0.0% gain), likely due to insufficient training signal (fewer than 100 labeled examples), and we exclude this component from the main system. Evaluation dataset size. The medical benchmark (n = 42) and HotpotQA subset (n = 20) are small; larger-scale evaluation is needed to confirm the findings.</w:t>
+        <w:t>LLM API dependency. Indexing requires an LLM API call per document; rate limits on free tiers slow bulk indexing. Structural prompt brittleness. Documents with inconsistent heading styles (for example scanned PDFs with OCR artifacts) may yield malformed index trees requiring manual correction. Learned scoring. We attempted learned node scoring via DSPy [15] with an open 70B model; optimization yielded no improvement (0.0% gain), likely due to insufficient training signal (fewer than 100 labeled examples), a</w:t>
+      </w:r>
+      <w:r>
+        <w:t>nd we exclude this component from the main system. Evaluation dataset size. The medical benchmark (n = 42) and HotpotQA subset (n = 20) are small; larger-scale evaluation is needed to confirm the findings.</w:t>
       </w:r>
     </w:p>
     <w:p>
@@ -3398,7 +3500,10 @@
         <w:pStyle w:val="PostHeadPara"/>
       </w:pPr>
       <w:r>
-        <w:t>Because TreeRAG preserves page-level provenance, it is well suited to high-stakes domains-medicine, law, and regulatory compliance-where unsupported claims carry real cost and every assertion must be traceable to a source span. The same property aids auditing and post-hoc verification. Conversely, the system inherits the biases of its underlying LLM during indexing and generation, and the lightweight hallucination detector reduces but does not eliminate unfaithful output; deployments in sensitive settings should retain a human-in-the-loop for final decisions.</w:t>
+        <w:t>Because TreeRAG preserves page-level provenance, it is well suited to high-stakes domains-medicine, law, and regulatory compliance-where unsupported claims carry real cost and every assertion must be traceable to a source span. The same property aids auditing and post-hoc verification. Conversely, the system inherits the biases of its underlying LLM during indexing and generation, and the lightweight hallucination detector reduces but does not eliminate unfaithful output; deployments in sensitive settings s</w:t>
+      </w:r>
+      <w:r>
+        <w:t>hould retain a human-in-the-loop for final decisions.</w:t>
       </w:r>
     </w:p>
     <w:p>
@@ -3414,7 +3519,13 @@
         <w:pStyle w:val="PostHeadPara"/>
       </w:pPr>
       <w:r>
-        <w:t>We presented TreeRAG, a hierarchical document RAG system that indexes PDFs into page-referenced JSON trees using zero-shot LLM prompting, traverses them with DFS or Beam Search, compresses retrieved context, and validates generated answers with a lightweight five-signal hallucination detector. On a 204-question general benchmark, TreeRAG-DFS achieves ROUGE-L 0.451 (+39.5% over BM25, +81.9% over FlatRAG, +132.4% over RAPTOR; all p &lt; 0.001, d = 0.483-1.205). On a 20-question multi-hop HotpotQA subset, TreeRAG-Beam achieves ROUGE-L 0.169 (+84.4% over BM25, p &lt; 0.001, d = 1.358). TreeRAG-DFS uses 37.5% fewer context tokens than BM25 while Pareto-dominating every baseline on the accuracy-context trade-off. On the 42-question medical benchmark, TreeRAG-DFS achieves ROUGE-L 0.366 with 100% medical entity recall and full page-citation availability-outperforming RAPTOR (ROUGE-L 0.053, entity recall 89.5%, 0% citations). The system provides page-level citations, domain-adaptive prompting for five domains, multilingual support, and a production-ready API with caching, rate limiting, and asynchronous task queuing. An online configuration using a locally hosted Llama model reproduces these results at no API cost. Future work will pursue (1) larger-scale online evaluation across additional model families; (2) Graph RAG integration [3] for inter-document relationship modeling; (3) multi-modal indexing for figures and tables; and (4) active learning for traversal-policy optimization from user-feedback signals.</w:t>
+        <w:t>We presented TreeRAG, a hierarchical document RAG system that indexes PDFs into page-referenced JSON trees using zero-shot LLM prompting, traverses them with DFS or Beam Search, compresses retrieved context, and validates generated answers with a lightweight five-signal hallucination detector. On a 204-question general benchmark, TreeRAG-DFS achieves ROUGE-L 0.451 (+39.5% over BM25, +81.9% over FlatRAG, +132.4% over RAPTOR; all p &lt; 0.001, d = 0.483-1.205). On a 20-question multi-hop HotpotQA subset, TreeRAG</w:t>
+      </w:r>
+      <w:r>
+        <w:t xml:space="preserve">-Beam achieves ROUGE-L 0.169 (+84.4% over BM25, p &lt; 0.001, d = 1.358). TreeRAG-DFS uses 37.5% fewer context tokens than BM25 while Pareto-dominating every baseline on the accuracy-context trade-off. On the 42-question medical benchmark, TreeRAG-DFS achieves ROUGE-L 0.366 with 100% medical entity recall and full page-citation availability-outperforming RAPTOR (ROUGE-L 0.053, entity recall 89.5%, 0% citations). The system provides page-level citations, domain-adaptive prompting for five domains, multilingual </w:t>
+      </w:r>
+      <w:r>
+        <w:t>support, and a production-ready API with caching, rate limiting, and asynchronous task queuing. An online configuration using a locally hosted Llama model reproduces these results at no API cost. Future work will pursue (1) larger-scale online evaluation across additional model families; (2) Graph RAG integration [3] for inter-document relationship modeling; (3) multi-modal indexing for figures and tables; and (4) active learning for traversal-policy optimization from user-feedback signals.</w:t>
       </w:r>
     </w:p>
     <w:p>

</xml_diff>

<commit_message>
Add benchmark reports and robust statistics analysis for TreeRAG models
- Created a new benchmark report for the TreeRAG model on the HotpotQA dataset, including performance metrics such as ROUGE-L, BERTScore, and LLM-Judge.
- Added a robust statistics summary JSON file that includes detailed statistical analysis for various retrieval systems (BM25, Dense, FlatRAG, RAPTOR) across different datasets (General, Medical, HotpotQA).
- Implemented a new Python script for calculating robust statistics, including paired mean differences, bootstrap confidence intervals, permutation test p-values, and required sample sizes for achieving desired statistical power.
- Included a large HotpotQA dataset file for analysis.
</commit_message>
<xml_diff>
--- a/TreeRAG_TIST_ACM.docx
+++ b/TreeRAG_TIST_ACM.docx
@@ -1,6 +1,6 @@
 
 <file path=word/document.xml><?xml version="1.0" encoding="utf-8"?>
-<w:document xmlns:wpc="http://schemas.microsoft.com/office/word/2010/wordprocessingCanvas" xmlns:cx="http://schemas.microsoft.com/office/drawing/2014/chartex" xmlns:cx1="http://schemas.microsoft.com/office/drawing/2015/9/8/chartex" xmlns:cx2="http://schemas.microsoft.com/office/drawing/2015/10/21/chartex" xmlns:cx3="http://schemas.microsoft.com/office/drawing/2016/5/9/chartex" xmlns:cx4="http://schemas.microsoft.com/office/drawing/2016/5/10/chartex" xmlns:cx5="http://schemas.microsoft.com/office/drawing/2016/5/11/chartex" xmlns:cx6="http://schemas.microsoft.com/office/drawing/2016/5/12/chartex" xmlns:cx7="http://schemas.microsoft.com/office/drawing/2016/5/13/chartex" xmlns:cx8="http://schemas.microsoft.com/office/drawing/2016/5/14/chartex" xmlns:mc="http://schemas.openxmlformats.org/markup-compatibility/2006" xmlns:aink="http://schemas.microsoft.com/office/drawing/2016/ink" xmlns:am3d="http://schemas.microsoft.com/office/drawing/2017/model3d" xmlns:o="urn:schemas-microsoft-com:office:office" xmlns:r="http://schemas.openxmlformats.org/officeDocument/2006/relationships" xmlns:m="http://schemas.openxmlformats.org/officeDocument/2006/math" xmlns:v="urn:schemas-microsoft-com:vml" xmlns:wp14="http://schemas.microsoft.com/office/word/2010/wordprocessingDrawing" xmlns:wp="http://schemas.openxmlformats.org/drawingml/2006/wordprocessingDrawing" xmlns:w10="urn:schemas-microsoft-com:office:word" xmlns:w="http://schemas.openxmlformats.org/wordprocessingml/2006/main" xmlns:w14="http://schemas.microsoft.com/office/word/2010/wordml" xmlns:w15="http://schemas.microsoft.com/office/word/2012/wordml" xmlns:w16cid="http://schemas.microsoft.com/office/word/2016/wordml/cid" xmlns:w16se="http://schemas.microsoft.com/office/word/2015/wordml/symex" xmlns:wpg="http://schemas.microsoft.com/office/word/2010/wordprocessingGroup" xmlns:wpi="http://schemas.microsoft.com/office/word/2010/wordprocessingInk" xmlns:wne="http://schemas.microsoft.com/office/word/2006/wordml" xmlns:wps="http://schemas.microsoft.com/office/word/2010/wordprocessingShape" mc:Ignorable="w14 w15 w16se w16cid wp14">
+<w:document xmlns:wpc="http://schemas.microsoft.com/office/word/2010/wordprocessingCanvas" xmlns:cx="http://schemas.microsoft.com/office/drawing/2014/chartex" xmlns:cx1="http://schemas.microsoft.com/office/drawing/2015/9/8/chartex" xmlns:cx2="http://schemas.microsoft.com/office/drawing/2015/10/21/chartex" xmlns:cx3="http://schemas.microsoft.com/office/drawing/2016/5/9/chartex" xmlns:cx4="http://schemas.microsoft.com/office/drawing/2016/5/10/chartex" xmlns:cx5="http://schemas.microsoft.com/office/drawing/2016/5/11/chartex" xmlns:cx6="http://schemas.microsoft.com/office/drawing/2016/5/12/chartex" xmlns:cx7="http://schemas.microsoft.com/office/drawing/2016/5/13/chartex" xmlns:cx8="http://schemas.microsoft.com/office/drawing/2016/5/14/chartex" xmlns:mc="http://schemas.openxmlformats.org/markup-compatibility/2006" xmlns:aink="http://schemas.microsoft.com/office/drawing/2016/ink" xmlns:am3d="http://schemas.microsoft.com/office/drawing/2017/model3d" xmlns:o="urn:schemas-microsoft-com:office:office" xmlns:oel="http://schemas.microsoft.com/office/2019/extlst" xmlns:r="http://schemas.openxmlformats.org/officeDocument/2006/relationships" xmlns:m="http://schemas.openxmlformats.org/officeDocument/2006/math" xmlns:v="urn:schemas-microsoft-com:vml" xmlns:wp14="http://schemas.microsoft.com/office/word/2010/wordprocessingDrawing" xmlns:wp="http://schemas.openxmlformats.org/drawingml/2006/wordprocessingDrawing" xmlns:w10="urn:schemas-microsoft-com:office:word" xmlns:w="http://schemas.openxmlformats.org/wordprocessingml/2006/main" xmlns:w14="http://schemas.microsoft.com/office/word/2010/wordml" xmlns:w15="http://schemas.microsoft.com/office/word/2012/wordml" xmlns:w16cex="http://schemas.microsoft.com/office/word/2018/wordml/cex" xmlns:w16cid="http://schemas.microsoft.com/office/word/2016/wordml/cid" xmlns:w16="http://schemas.microsoft.com/office/word/2018/wordml" xmlns:w16du="http://schemas.microsoft.com/office/word/2023/wordml/word16du" xmlns:w16sdtdh="http://schemas.microsoft.com/office/word/2020/wordml/sdtdatahash" xmlns:w16sdtfl="http://schemas.microsoft.com/office/word/2024/wordml/sdtformatlock" xmlns:w16se="http://schemas.microsoft.com/office/word/2015/wordml/symex" xmlns:wpg="http://schemas.microsoft.com/office/word/2010/wordprocessingGroup" xmlns:wpi="http://schemas.microsoft.com/office/word/2010/wordprocessingInk" xmlns:wne="http://schemas.microsoft.com/office/word/2006/wordml" xmlns:wps="http://schemas.microsoft.com/office/word/2010/wordprocessingShape" mc:Ignorable="w14 w15 w16se w16cid w16 w16cex w16sdtdh w16sdtfl w16du wp14">
   <w:body>
     <w:p>
       <w:pPr>
@@ -12,7 +12,7 @@
     </w:p>
     <w:p>
       <w:pPr>
-        <w:pStyle w:val="Subtitle"/>
+        <w:pStyle w:val="a5"/>
       </w:pPr>
       <w:r>
         <w:t>Zero-Shot LLM Tree Indexing, Adaptive Traversal, and a Cautionary Analysis of Extractive Evaluation</w:t>
@@ -68,22 +68,6 @@
     </w:p>
     <w:p>
       <w:pPr>
-        <w:pStyle w:val="ACMRefHead"/>
-      </w:pPr>
-      <w:r>
-        <w:t>ACM Reference Format:</w:t>
-      </w:r>
-    </w:p>
-    <w:p>
-      <w:pPr>
-        <w:pStyle w:val="ACMRef"/>
-      </w:pPr>
-      <w:r>
-        <w:t>Wonseok Lee. 2026. TreeRAG: Accuracy and Efficiency Gains from Structure-Aware Hierarchical Retrieval. ACM Trans. Intell. Syst. Technol. XX, X, Article XX (2026), XX pages. https://doi.org/XX.XXXX/XXXXXXX</w:t>
-      </w:r>
-    </w:p>
-    <w:p>
-      <w:pPr>
         <w:pStyle w:val="Head1"/>
       </w:pPr>
       <w:r>
@@ -103,6 +87,7 @@
         <w:pStyle w:val="Para"/>
       </w:pPr>
       <w:r>
+        <w:lastRenderedPageBreak/>
         <w:t>This flat-chunk paradigm has a structural blindspot: technical documents-regulatory filings, clinical guidelines, academic papers-are organized hierarchically. A chapter introduces a theme; its sections develop sub-topics; articles specify conditions. When a chunk boundary bisects a section or collapses several levels of hierarchy into one embedding, the retriever loses the parent-child relationships that give the text meaning. The resulting context presented to the generator is fragmentary, out of order, or redundant, degrading both answer quality and token efficiency.</w:t>
       </w:r>
     </w:p>
@@ -132,7 +117,7 @@
     </w:p>
     <w:p>
       <w:pPr>
-        <w:pStyle w:val="ListParagraph"/>
+        <w:pStyle w:val="a"/>
       </w:pPr>
       <w:r>
         <w:t>(1) LLM-Driven Tree Indexing. A zero-shot prompting strategy that converts arbitrary PDFs into page-referenced JSON trees, with domain-adaptive templates for medical, legal, financial, and academic documents.</w:t>
@@ -140,7 +125,7 @@
     </w:p>
     <w:p>
       <w:pPr>
-        <w:pStyle w:val="ListParagraph"/>
+        <w:pStyle w:val="a"/>
       </w:pPr>
       <w:r>
         <w:t>(2) Adaptive Dual Traversal. Two tree-traversal algorithms-DFS for depth-first exhaustive search and Beam Search for efficiency-selectable per query, with a probabilistic node-relevance scoring function.</w:t>
@@ -148,7 +133,7 @@
     </w:p>
     <w:p>
       <w:pPr>
-        <w:pStyle w:val="ListParagraph"/>
+        <w:pStyle w:val="a"/>
       </w:pPr>
       <w:r>
         <w:t>(3) Contextual Compression. A TF-IDF and semantic relevance filter that removes low-relevance nodes post-traversal, shrinking the context handed to the generator by an order of magnitude.</w:t>
@@ -156,7 +141,7 @@
     </w:p>
     <w:p>
       <w:pPr>
-        <w:pStyle w:val="ListParagraph"/>
+        <w:pStyle w:val="a"/>
       </w:pPr>
       <w:r>
         <w:t>(4) Multi-Signal Hallucination Detection. A five-signal confidence estimator (citation presence, word overlap, bigram overlap, trigram overlap, character similarity) that scores each sentence of the generated answer against retrieved nodes.</w:t>
@@ -164,7 +149,7 @@
     </w:p>
     <w:p>
       <w:pPr>
-        <w:pStyle w:val="ListParagraph"/>
+        <w:pStyle w:val="a"/>
       </w:pPr>
       <w:r>
         <w:t>(5) Fair, Generator-Controlled Evaluation. We evaluate all systems under a protocol in which the retrieval stage varies but every system generates with the same local LLM, and we measure axes that flat retrievers cannot satisfy by construction-page-level citation accuracy and context efficiency-alongside reference- and judge-based answer quality. Under this protocol TreeRAG-Beam delivers the most accurate citations, the highest LLM-judged quality on multi-hop and comparative questions, and competitive overall quality with an order of magnitude fewer context tokens.</w:t>
@@ -172,7 +157,7 @@
     </w:p>
     <w:p>
       <w:pPr>
-        <w:pStyle w:val="ListParagraph"/>
+        <w:pStyle w:val="a"/>
       </w:pPr>
       <w:r>
         <w:t>(6) A Cautionary Methodological Finding. We show that offline extractive evaluation and lexical-overlap metrics (ROUGE-L) reverse the system ranking-flattering whichever system most resembles the reference surface form-and we report both the extractive and the fair generative regimes so that the discrepancy is explicit rather than hidden.</w:t>
@@ -191,6 +176,7 @@
         <w:pStyle w:val="Head1"/>
       </w:pPr>
       <w:r>
+        <w:lastRenderedPageBreak/>
         <w:t>RELATED WORK</w:t>
       </w:r>
     </w:p>
@@ -263,7 +249,11 @@
         <w:pStyle w:val="PostHeadPara"/>
       </w:pPr>
       <w:r>
-        <w:t>RAG substantially reduces hallucination by grounding generation in retrieved text, but does not eliminate it [31]. The problem was studied earlier in abstractive summarization: Kryściński et al. [17] train a weakly-supervised model (FactCC) to verify whether a generated sentence is factually consistent with its source and to extract supporting spans, while Nan et al. [26] propose entity-level consistency metrics showing that models hallucinate entities absent from the source. These motivate TreeRAG's source-grounded signals, including its medical entity recall metric (Section 5.3). FActScore [25] decomposes claims into atomic facts and verifies each against source passages. RAGAS [4] defines faithfulness, answer relevance, and context recall as automatic metrics. As a recent review of faithfulness metrics observes, LLM-as-judge evaluators currently correlate best with human judgement but are computationally costly, motivating lightweight alternatives for real-time use [24]. TreeRAG's hallucination detector operates at sentence level using five lightweight overlap signals, providing a fast, LLM-free confidence estimate compatible with real-time serving.</w:t>
+        <w:t xml:space="preserve">RAG substantially reduces hallucination by grounding generation in retrieved text, but does not eliminate it [31]. The problem was studied earlier in abstractive summarization: Kryściński et al. [17] train a weakly-supervised model (FactCC) </w:t>
+      </w:r>
+      <w:r>
+        <w:lastRenderedPageBreak/>
+        <w:t>to verify whether a generated sentence is factually consistent with its source and to extract supporting spans, while Nan et al. [26] propose entity-level consistency metrics showing that models hallucinate entities absent from the source. These motivate TreeRAG's source-grounded signals, including its medical entity recall metric (Section 5.3). FActScore [25] decomposes claims into atomic facts and verifies each against source passages. RAGAS [4] defines faithfulness, answer relevance, and context recall as automatic metrics. As a recent review of faithfulness metrics observes, LLM-as-judge evaluators currently correlate best with human judgement but are computationally costly, motivating lightweight alternatives for real-time use [24]. TreeRAG's hallucination detector operates at sentence level using five lightweight overlap signals, providing a fast, LLM-free confidence estimate compatible with real-time serving.</w:t>
       </w:r>
     </w:p>
     <w:p>
@@ -343,6 +333,13 @@
         <w:pStyle w:val="Head3"/>
       </w:pPr>
       <w:r>
+        <w:rPr>
+          <w:rFonts w:hint="eastAsia"/>
+          <w:lang w:eastAsia="ko-KR"/>
+        </w:rPr>
+        <w:t xml:space="preserve"> </w:t>
+      </w:r>
+      <w:r>
         <w:t>Node Relevance Scoring</w:t>
       </w:r>
     </w:p>
@@ -367,6 +364,7 @@
         <w:pStyle w:val="Para"/>
       </w:pPr>
       <w:r>
+        <w:lastRenderedPageBreak/>
         <w:t>Here semantic(v, q) is keyword overlap between the query and the node's title and summary, normalized by query length; structural(depth) is a depth-decay factor that slightly penalizes very deep nodes, encoding the prior that high-level sections capture broader relevance; and contextual(v, parent) is semantic overlap between the node and its parent's accumulated context string, encouraging traversal paths that maintain thematic coherence. The weights (0.7/0.2/0.1) were chosen to make semantic similarity dominant while letting structure break ties; we examine their effect in the ablation study.</w:t>
       </w:r>
     </w:p>
@@ -375,6 +373,13 @@
         <w:pStyle w:val="Head3"/>
       </w:pPr>
       <w:r>
+        <w:rPr>
+          <w:rFonts w:hint="eastAsia"/>
+          <w:lang w:eastAsia="ko-KR"/>
+        </w:rPr>
+        <w:t xml:space="preserve"> </w:t>
+      </w:r>
+      <w:r>
         <w:t>DFS Traversal</w:t>
       </w:r>
     </w:p>
@@ -495,6 +500,13 @@
         <w:pStyle w:val="Head3"/>
       </w:pPr>
       <w:r>
+        <w:rPr>
+          <w:rFonts w:hint="eastAsia"/>
+          <w:lang w:eastAsia="ko-KR"/>
+        </w:rPr>
+        <w:t xml:space="preserve"> </w:t>
+      </w:r>
+      <w:r>
         <w:t>Beam Search Traversal</w:t>
       </w:r>
     </w:p>
@@ -567,6 +579,7 @@
         <w:pStyle w:val="Algorithm"/>
       </w:pPr>
       <w:r>
+        <w:lastRenderedPageBreak/>
         <w:t xml:space="preserve">            candidates.append((child, d+1, child_score, path/child.id))</w:t>
       </w:r>
     </w:p>
@@ -599,6 +612,13 @@
         <w:pStyle w:val="Head3"/>
       </w:pPr>
       <w:r>
+        <w:rPr>
+          <w:rFonts w:hint="eastAsia"/>
+          <w:lang w:eastAsia="ko-KR"/>
+        </w:rPr>
+        <w:t xml:space="preserve"> </w:t>
+      </w:r>
+      <w:r>
         <w:t>Algorithm Selection</w:t>
       </w:r>
     </w:p>
@@ -663,12 +683,13 @@
         <w:pStyle w:val="TableCaption"/>
       </w:pPr>
       <w:r>
+        <w:lastRenderedPageBreak/>
         <w:t>Table 1: The five overlap signals of the hallucination detector.</w:t>
       </w:r>
     </w:p>
     <w:tbl>
       <w:tblPr>
-        <w:tblW w:type="auto" w:w="0"/>
+        <w:tblW w:w="0" w:type="auto"/>
         <w:tblBorders>
           <w:top w:val="single" w:sz="4" w:space="0" w:color="999999"/>
           <w:left w:val="single" w:sz="4" w:space="0" w:color="999999"/>
@@ -677,16 +698,16 @@
           <w:insideH w:val="single" w:sz="4" w:space="0" w:color="999999"/>
           <w:insideV w:val="single" w:sz="4" w:space="0" w:color="999999"/>
         </w:tblBorders>
-        <w:tblLook w:firstColumn="1" w:firstRow="1" w:lastColumn="0" w:lastRow="0" w:noHBand="0" w:noVBand="1" w:val="04A0"/>
+        <w:tblLook w:val="04A0" w:firstRow="1" w:lastRow="0" w:firstColumn="1" w:lastColumn="0" w:noHBand="0" w:noVBand="1"/>
       </w:tblPr>
       <w:tblGrid>
-        <w:gridCol w:w="4380"/>
-        <w:gridCol w:w="4380"/>
+        <w:gridCol w:w="4375"/>
+        <w:gridCol w:w="4375"/>
       </w:tblGrid>
       <w:tr>
         <w:tc>
           <w:tcPr>
-            <w:tcW w:type="dxa" w:w="4380"/>
+            <w:tcW w:w="4380" w:type="dxa"/>
           </w:tcPr>
           <w:p>
             <w:pPr>
@@ -702,7 +723,7 @@
         </w:tc>
         <w:tc>
           <w:tcPr>
-            <w:tcW w:type="dxa" w:w="4380"/>
+            <w:tcW w:w="4380" w:type="dxa"/>
           </w:tcPr>
           <w:p>
             <w:pPr>
@@ -720,7 +741,7 @@
       <w:tr>
         <w:tc>
           <w:tcPr>
-            <w:tcW w:type="dxa" w:w="4380"/>
+            <w:tcW w:w="4380" w:type="dxa"/>
           </w:tcPr>
           <w:p>
             <w:pPr>
@@ -733,7 +754,7 @@
         </w:tc>
         <w:tc>
           <w:tcPr>
-            <w:tcW w:type="dxa" w:w="4380"/>
+            <w:tcW w:w="4380" w:type="dxa"/>
           </w:tcPr>
           <w:p>
             <w:pPr>
@@ -748,7 +769,7 @@
       <w:tr>
         <w:tc>
           <w:tcPr>
-            <w:tcW w:type="dxa" w:w="4380"/>
+            <w:tcW w:w="4380" w:type="dxa"/>
           </w:tcPr>
           <w:p>
             <w:pPr>
@@ -761,7 +782,7 @@
         </w:tc>
         <w:tc>
           <w:tcPr>
-            <w:tcW w:type="dxa" w:w="4380"/>
+            <w:tcW w:w="4380" w:type="dxa"/>
           </w:tcPr>
           <w:p>
             <w:pPr>
@@ -776,7 +797,7 @@
       <w:tr>
         <w:tc>
           <w:tcPr>
-            <w:tcW w:type="dxa" w:w="4380"/>
+            <w:tcW w:w="4380" w:type="dxa"/>
           </w:tcPr>
           <w:p>
             <w:pPr>
@@ -789,7 +810,7 @@
         </w:tc>
         <w:tc>
           <w:tcPr>
-            <w:tcW w:type="dxa" w:w="4380"/>
+            <w:tcW w:w="4380" w:type="dxa"/>
           </w:tcPr>
           <w:p>
             <w:pPr>
@@ -804,7 +825,7 @@
       <w:tr>
         <w:tc>
           <w:tcPr>
-            <w:tcW w:type="dxa" w:w="4380"/>
+            <w:tcW w:w="4380" w:type="dxa"/>
           </w:tcPr>
           <w:p>
             <w:pPr>
@@ -817,7 +838,7 @@
         </w:tc>
         <w:tc>
           <w:tcPr>
-            <w:tcW w:type="dxa" w:w="4380"/>
+            <w:tcW w:w="4380" w:type="dxa"/>
           </w:tcPr>
           <w:p>
             <w:pPr>
@@ -832,7 +853,7 @@
       <w:tr>
         <w:tc>
           <w:tcPr>
-            <w:tcW w:type="dxa" w:w="4380"/>
+            <w:tcW w:w="4380" w:type="dxa"/>
           </w:tcPr>
           <w:p>
             <w:pPr>
@@ -845,7 +866,7 @@
         </w:tc>
         <w:tc>
           <w:tcPr>
-            <w:tcW w:type="dxa" w:w="4380"/>
+            <w:tcW w:w="4380" w:type="dxa"/>
           </w:tcPr>
           <w:p>
             <w:pPr>
@@ -861,25 +882,28 @@
     <w:p>
       <w:pPr>
         <w:pStyle w:val="Image"/>
-        <w:jc w:val="center"/>
-      </w:pPr>
-      <w:r>
+      </w:pPr>
+      <w:r>
+        <w:rPr>
+          <w:noProof/>
+        </w:rPr>
         <w:drawing>
-          <wp:inline xmlns:a="http://schemas.openxmlformats.org/drawingml/2006/main" xmlns:pic="http://schemas.openxmlformats.org/drawingml/2006/picture">
+          <wp:inline distT="0" distB="0" distL="0" distR="0" wp14:anchorId="2167BD14" wp14:editId="23CD6E67">
             <wp:extent cx="4846320" cy="2122138"/>
+            <wp:effectExtent l="0" t="0" r="0" b="0"/>
             <wp:docPr id="1" name="Picture 1"/>
             <wp:cNvGraphicFramePr>
-              <a:graphicFrameLocks noChangeAspect="1"/>
+              <a:graphicFrameLocks xmlns:a="http://schemas.openxmlformats.org/drawingml/2006/main" noChangeAspect="1"/>
             </wp:cNvGraphicFramePr>
-            <a:graphic>
+            <a:graphic xmlns:a="http://schemas.openxmlformats.org/drawingml/2006/main">
               <a:graphicData uri="http://schemas.openxmlformats.org/drawingml/2006/picture">
-                <pic:pic>
+                <pic:pic xmlns:pic="http://schemas.openxmlformats.org/drawingml/2006/picture">
                   <pic:nvPicPr>
                     <pic:cNvPr id="0" name="figure_6_hallucination.png"/>
                     <pic:cNvPicPr/>
                   </pic:nvPicPr>
                   <pic:blipFill>
-                    <a:blip r:embed="rId30"/>
+                    <a:blip r:embed="rId7"/>
                     <a:stretch>
                       <a:fillRect/>
                     </a:stretch>
@@ -889,7 +913,9 @@
                       <a:off x="0" y="0"/>
                       <a:ext cx="4846320" cy="2122138"/>
                     </a:xfrm>
-                    <a:prstGeom prst="rect"/>
+                    <a:prstGeom prst="rect">
+                      <a:avLst/>
+                    </a:prstGeom>
                   </pic:spPr>
                 </pic:pic>
               </a:graphicData>
@@ -933,25 +959,29 @@
     <w:p>
       <w:pPr>
         <w:pStyle w:val="Image"/>
-        <w:jc w:val="center"/>
-      </w:pPr>
-      <w:r>
+      </w:pPr>
+      <w:r>
+        <w:rPr>
+          <w:noProof/>
+        </w:rPr>
+        <w:lastRenderedPageBreak/>
         <w:drawing>
-          <wp:inline xmlns:a="http://schemas.openxmlformats.org/drawingml/2006/main" xmlns:pic="http://schemas.openxmlformats.org/drawingml/2006/picture">
+          <wp:inline distT="0" distB="0" distL="0" distR="0" wp14:anchorId="1B11197F" wp14:editId="7A0BD9D3">
             <wp:extent cx="4846320" cy="2614581"/>
+            <wp:effectExtent l="0" t="0" r="0" b="0"/>
             <wp:docPr id="2" name="Picture 2"/>
             <wp:cNvGraphicFramePr>
-              <a:graphicFrameLocks noChangeAspect="1"/>
+              <a:graphicFrameLocks xmlns:a="http://schemas.openxmlformats.org/drawingml/2006/main" noChangeAspect="1"/>
             </wp:cNvGraphicFramePr>
-            <a:graphic>
+            <a:graphic xmlns:a="http://schemas.openxmlformats.org/drawingml/2006/main">
               <a:graphicData uri="http://schemas.openxmlformats.org/drawingml/2006/picture">
-                <pic:pic>
+                <pic:pic xmlns:pic="http://schemas.openxmlformats.org/drawingml/2006/picture">
                   <pic:nvPicPr>
                     <pic:cNvPr id="0" name="figure_1_architecture.png"/>
                     <pic:cNvPicPr/>
                   </pic:nvPicPr>
                   <pic:blipFill>
-                    <a:blip r:embed="rId31"/>
+                    <a:blip r:embed="rId8"/>
                     <a:stretch>
                       <a:fillRect/>
                     </a:stretch>
@@ -961,7 +991,9 @@
                       <a:off x="0" y="0"/>
                       <a:ext cx="4846320" cy="2614581"/>
                     </a:xfrm>
-                    <a:prstGeom prst="rect"/>
+                    <a:prstGeom prst="rect">
+                      <a:avLst/>
+                    </a:prstGeom>
                   </pic:spPr>
                 </pic:pic>
               </a:graphicData>
@@ -1039,6 +1071,7 @@
         <w:pStyle w:val="Head2"/>
       </w:pPr>
       <w:r>
+        <w:lastRenderedPageBreak/>
         <w:t>Deployment Considerations</w:t>
       </w:r>
     </w:p>
@@ -1093,6 +1126,9 @@
     <w:p>
       <w:pPr>
         <w:pStyle w:val="Para"/>
+        <w:rPr>
+          <w:lang w:eastAsia="ko-KR"/>
+        </w:rPr>
       </w:pPr>
       <w:r>
         <w:t>Evaluation protocols. We evaluate under two protocols. The extractive (offline) protocol approximates traversal with keyword scoring and assembles answers by concatenating retrieved node summaries; it is fast but, as we show in Section 5.7, systematically biased. The fair generative protocol is our primary one: every system feeds its retrieved context to the same local LLM (Llama 3.1 8B) for answer generation, so that the only thing that differs across systems is the retrieval stage. The same model serves as the LLM judge. Because online generation through a hosted API was not available to us, all generative results use this local model; the fair-protocol experiments are run on a fixed 40-question sample of the Full Benchmark (seed 42) and on the 20-question HotpotQA subset, which bounds their statistical power and which we treat as a limitation (Section 6.4).</w:t>
@@ -1100,9 +1136,44 @@
     </w:p>
     <w:p>
       <w:pPr>
+        <w:pStyle w:val="ParaContinue"/>
+        <w:rPr>
+          <w:lang w:eastAsia="ko-KR"/>
+        </w:rPr>
+      </w:pPr>
+    </w:p>
+    <w:p>
+      <w:pPr>
+        <w:pStyle w:val="ParaContinue"/>
+        <w:rPr>
+          <w:lang w:eastAsia="ko-KR"/>
+        </w:rPr>
+      </w:pPr>
+    </w:p>
+    <w:p>
+      <w:pPr>
+        <w:pStyle w:val="ParaContinue"/>
+        <w:rPr>
+          <w:rFonts w:hint="eastAsia"/>
+          <w:lang w:eastAsia="ko-KR"/>
+        </w:rPr>
+      </w:pPr>
+    </w:p>
+    <w:p>
+      <w:pPr>
+        <w:pStyle w:val="ParaContinue"/>
+        <w:rPr>
+          <w:rFonts w:hint="eastAsia"/>
+          <w:lang w:eastAsia="ko-KR"/>
+        </w:rPr>
+      </w:pPr>
+    </w:p>
+    <w:p>
+      <w:pPr>
         <w:pStyle w:val="Head2"/>
       </w:pPr>
       <w:r>
+        <w:lastRenderedPageBreak/>
         <w:t>Extractive-Mode Results: A Biased Offline Proxy</w:t>
       </w:r>
     </w:p>
@@ -1132,7 +1203,7 @@
     </w:p>
     <w:tbl>
       <w:tblPr>
-        <w:tblW w:type="auto" w:w="0"/>
+        <w:tblW w:w="0" w:type="auto"/>
         <w:tblBorders>
           <w:top w:val="single" w:sz="4" w:space="0" w:color="999999"/>
           <w:left w:val="single" w:sz="4" w:space="0" w:color="999999"/>
@@ -1141,20 +1212,20 @@
           <w:insideH w:val="single" w:sz="4" w:space="0" w:color="999999"/>
           <w:insideV w:val="single" w:sz="4" w:space="0" w:color="999999"/>
         </w:tblBorders>
-        <w:tblLook w:firstColumn="1" w:firstRow="1" w:lastColumn="0" w:lastRow="0" w:noHBand="0" w:noVBand="1" w:val="04A0"/>
+        <w:tblLook w:val="04A0" w:firstRow="1" w:lastRow="0" w:firstColumn="1" w:lastColumn="0" w:noHBand="0" w:noVBand="1"/>
       </w:tblPr>
       <w:tblGrid>
-        <w:gridCol w:w="1460"/>
-        <w:gridCol w:w="1460"/>
-        <w:gridCol w:w="1460"/>
-        <w:gridCol w:w="1460"/>
-        <w:gridCol w:w="1460"/>
-        <w:gridCol w:w="1460"/>
+        <w:gridCol w:w="1459"/>
+        <w:gridCol w:w="1458"/>
+        <w:gridCol w:w="1459"/>
+        <w:gridCol w:w="1457"/>
+        <w:gridCol w:w="1459"/>
+        <w:gridCol w:w="1458"/>
       </w:tblGrid>
       <w:tr>
         <w:tc>
           <w:tcPr>
-            <w:tcW w:type="dxa" w:w="1460"/>
+            <w:tcW w:w="1460" w:type="dxa"/>
           </w:tcPr>
           <w:p>
             <w:pPr>
@@ -1170,7 +1241,7 @@
         </w:tc>
         <w:tc>
           <w:tcPr>
-            <w:tcW w:type="dxa" w:w="1460"/>
+            <w:tcW w:w="1460" w:type="dxa"/>
           </w:tcPr>
           <w:p>
             <w:pPr>
@@ -1186,7 +1257,7 @@
         </w:tc>
         <w:tc>
           <w:tcPr>
-            <w:tcW w:type="dxa" w:w="1460"/>
+            <w:tcW w:w="1460" w:type="dxa"/>
           </w:tcPr>
           <w:p>
             <w:pPr>
@@ -1202,7 +1273,7 @@
         </w:tc>
         <w:tc>
           <w:tcPr>
-            <w:tcW w:type="dxa" w:w="1460"/>
+            <w:tcW w:w="1460" w:type="dxa"/>
           </w:tcPr>
           <w:p>
             <w:pPr>
@@ -1218,7 +1289,7 @@
         </w:tc>
         <w:tc>
           <w:tcPr>
-            <w:tcW w:type="dxa" w:w="1460"/>
+            <w:tcW w:w="1460" w:type="dxa"/>
           </w:tcPr>
           <w:p>
             <w:pPr>
@@ -1234,7 +1305,7 @@
         </w:tc>
         <w:tc>
           <w:tcPr>
-            <w:tcW w:type="dxa" w:w="1460"/>
+            <w:tcW w:w="1460" w:type="dxa"/>
           </w:tcPr>
           <w:p>
             <w:pPr>
@@ -1252,7 +1323,7 @@
       <w:tr>
         <w:tc>
           <w:tcPr>
-            <w:tcW w:type="dxa" w:w="1460"/>
+            <w:tcW w:w="1460" w:type="dxa"/>
           </w:tcPr>
           <w:p>
             <w:pPr>
@@ -1265,7 +1336,7 @@
         </w:tc>
         <w:tc>
           <w:tcPr>
-            <w:tcW w:type="dxa" w:w="1460"/>
+            <w:tcW w:w="1460" w:type="dxa"/>
           </w:tcPr>
           <w:p>
             <w:pPr>
@@ -1278,7 +1349,7 @@
         </w:tc>
         <w:tc>
           <w:tcPr>
-            <w:tcW w:type="dxa" w:w="1460"/>
+            <w:tcW w:w="1460" w:type="dxa"/>
           </w:tcPr>
           <w:p>
             <w:pPr>
@@ -1291,7 +1362,7 @@
         </w:tc>
         <w:tc>
           <w:tcPr>
-            <w:tcW w:type="dxa" w:w="1460"/>
+            <w:tcW w:w="1460" w:type="dxa"/>
           </w:tcPr>
           <w:p>
             <w:pPr>
@@ -1304,7 +1375,7 @@
         </w:tc>
         <w:tc>
           <w:tcPr>
-            <w:tcW w:type="dxa" w:w="1460"/>
+            <w:tcW w:w="1460" w:type="dxa"/>
           </w:tcPr>
           <w:p>
             <w:pPr>
@@ -1317,7 +1388,7 @@
         </w:tc>
         <w:tc>
           <w:tcPr>
-            <w:tcW w:type="dxa" w:w="1460"/>
+            <w:tcW w:w="1460" w:type="dxa"/>
           </w:tcPr>
           <w:p>
             <w:pPr>
@@ -1332,7 +1403,7 @@
       <w:tr>
         <w:tc>
           <w:tcPr>
-            <w:tcW w:type="dxa" w:w="1460"/>
+            <w:tcW w:w="1460" w:type="dxa"/>
           </w:tcPr>
           <w:p>
             <w:pPr>
@@ -1345,7 +1416,7 @@
         </w:tc>
         <w:tc>
           <w:tcPr>
-            <w:tcW w:type="dxa" w:w="1460"/>
+            <w:tcW w:w="1460" w:type="dxa"/>
           </w:tcPr>
           <w:p>
             <w:pPr>
@@ -1358,7 +1429,7 @@
         </w:tc>
         <w:tc>
           <w:tcPr>
-            <w:tcW w:type="dxa" w:w="1460"/>
+            <w:tcW w:w="1460" w:type="dxa"/>
           </w:tcPr>
           <w:p>
             <w:pPr>
@@ -1371,7 +1442,7 @@
         </w:tc>
         <w:tc>
           <w:tcPr>
-            <w:tcW w:type="dxa" w:w="1460"/>
+            <w:tcW w:w="1460" w:type="dxa"/>
           </w:tcPr>
           <w:p>
             <w:pPr>
@@ -1384,7 +1455,7 @@
         </w:tc>
         <w:tc>
           <w:tcPr>
-            <w:tcW w:type="dxa" w:w="1460"/>
+            <w:tcW w:w="1460" w:type="dxa"/>
           </w:tcPr>
           <w:p>
             <w:pPr>
@@ -1397,7 +1468,7 @@
         </w:tc>
         <w:tc>
           <w:tcPr>
-            <w:tcW w:type="dxa" w:w="1460"/>
+            <w:tcW w:w="1460" w:type="dxa"/>
           </w:tcPr>
           <w:p>
             <w:pPr>
@@ -1412,7 +1483,7 @@
       <w:tr>
         <w:tc>
           <w:tcPr>
-            <w:tcW w:type="dxa" w:w="1460"/>
+            <w:tcW w:w="1460" w:type="dxa"/>
           </w:tcPr>
           <w:p>
             <w:pPr>
@@ -1425,7 +1496,7 @@
         </w:tc>
         <w:tc>
           <w:tcPr>
-            <w:tcW w:type="dxa" w:w="1460"/>
+            <w:tcW w:w="1460" w:type="dxa"/>
           </w:tcPr>
           <w:p>
             <w:pPr>
@@ -1438,7 +1509,7 @@
         </w:tc>
         <w:tc>
           <w:tcPr>
-            <w:tcW w:type="dxa" w:w="1460"/>
+            <w:tcW w:w="1460" w:type="dxa"/>
           </w:tcPr>
           <w:p>
             <w:pPr>
@@ -1451,7 +1522,7 @@
         </w:tc>
         <w:tc>
           <w:tcPr>
-            <w:tcW w:type="dxa" w:w="1460"/>
+            <w:tcW w:w="1460" w:type="dxa"/>
           </w:tcPr>
           <w:p>
             <w:pPr>
@@ -1464,7 +1535,7 @@
         </w:tc>
         <w:tc>
           <w:tcPr>
-            <w:tcW w:type="dxa" w:w="1460"/>
+            <w:tcW w:w="1460" w:type="dxa"/>
           </w:tcPr>
           <w:p>
             <w:pPr>
@@ -1477,7 +1548,7 @@
         </w:tc>
         <w:tc>
           <w:tcPr>
-            <w:tcW w:type="dxa" w:w="1460"/>
+            <w:tcW w:w="1460" w:type="dxa"/>
           </w:tcPr>
           <w:p>
             <w:pPr>
@@ -1492,7 +1563,7 @@
       <w:tr>
         <w:tc>
           <w:tcPr>
-            <w:tcW w:type="dxa" w:w="1460"/>
+            <w:tcW w:w="1460" w:type="dxa"/>
           </w:tcPr>
           <w:p>
             <w:pPr>
@@ -1505,7 +1576,7 @@
         </w:tc>
         <w:tc>
           <w:tcPr>
-            <w:tcW w:type="dxa" w:w="1460"/>
+            <w:tcW w:w="1460" w:type="dxa"/>
           </w:tcPr>
           <w:p>
             <w:pPr>
@@ -1518,7 +1589,7 @@
         </w:tc>
         <w:tc>
           <w:tcPr>
-            <w:tcW w:type="dxa" w:w="1460"/>
+            <w:tcW w:w="1460" w:type="dxa"/>
           </w:tcPr>
           <w:p>
             <w:pPr>
@@ -1531,7 +1602,7 @@
         </w:tc>
         <w:tc>
           <w:tcPr>
-            <w:tcW w:type="dxa" w:w="1460"/>
+            <w:tcW w:w="1460" w:type="dxa"/>
           </w:tcPr>
           <w:p>
             <w:pPr>
@@ -1544,7 +1615,7 @@
         </w:tc>
         <w:tc>
           <w:tcPr>
-            <w:tcW w:type="dxa" w:w="1460"/>
+            <w:tcW w:w="1460" w:type="dxa"/>
           </w:tcPr>
           <w:p>
             <w:pPr>
@@ -1557,7 +1628,7 @@
         </w:tc>
         <w:tc>
           <w:tcPr>
-            <w:tcW w:type="dxa" w:w="1460"/>
+            <w:tcW w:w="1460" w:type="dxa"/>
           </w:tcPr>
           <w:p>
             <w:pPr>
@@ -1572,7 +1643,7 @@
       <w:tr>
         <w:tc>
           <w:tcPr>
-            <w:tcW w:type="dxa" w:w="1460"/>
+            <w:tcW w:w="1460" w:type="dxa"/>
           </w:tcPr>
           <w:p>
             <w:pPr>
@@ -1585,7 +1656,7 @@
         </w:tc>
         <w:tc>
           <w:tcPr>
-            <w:tcW w:type="dxa" w:w="1460"/>
+            <w:tcW w:w="1460" w:type="dxa"/>
           </w:tcPr>
           <w:p>
             <w:pPr>
@@ -1598,7 +1669,7 @@
         </w:tc>
         <w:tc>
           <w:tcPr>
-            <w:tcW w:type="dxa" w:w="1460"/>
+            <w:tcW w:w="1460" w:type="dxa"/>
           </w:tcPr>
           <w:p>
             <w:pPr>
@@ -1611,7 +1682,7 @@
         </w:tc>
         <w:tc>
           <w:tcPr>
-            <w:tcW w:type="dxa" w:w="1460"/>
+            <w:tcW w:w="1460" w:type="dxa"/>
           </w:tcPr>
           <w:p>
             <w:pPr>
@@ -1624,7 +1695,7 @@
         </w:tc>
         <w:tc>
           <w:tcPr>
-            <w:tcW w:type="dxa" w:w="1460"/>
+            <w:tcW w:w="1460" w:type="dxa"/>
           </w:tcPr>
           <w:p>
             <w:pPr>
@@ -1637,7 +1708,7 @@
         </w:tc>
         <w:tc>
           <w:tcPr>
-            <w:tcW w:type="dxa" w:w="1460"/>
+            <w:tcW w:w="1460" w:type="dxa"/>
           </w:tcPr>
           <w:p>
             <w:pPr>
@@ -1652,7 +1723,7 @@
       <w:tr>
         <w:tc>
           <w:tcPr>
-            <w:tcW w:type="dxa" w:w="1460"/>
+            <w:tcW w:w="1460" w:type="dxa"/>
           </w:tcPr>
           <w:p>
             <w:pPr>
@@ -1665,7 +1736,7 @@
         </w:tc>
         <w:tc>
           <w:tcPr>
-            <w:tcW w:type="dxa" w:w="1460"/>
+            <w:tcW w:w="1460" w:type="dxa"/>
           </w:tcPr>
           <w:p>
             <w:pPr>
@@ -1678,7 +1749,7 @@
         </w:tc>
         <w:tc>
           <w:tcPr>
-            <w:tcW w:type="dxa" w:w="1460"/>
+            <w:tcW w:w="1460" w:type="dxa"/>
           </w:tcPr>
           <w:p>
             <w:pPr>
@@ -1691,7 +1762,7 @@
         </w:tc>
         <w:tc>
           <w:tcPr>
-            <w:tcW w:type="dxa" w:w="1460"/>
+            <w:tcW w:w="1460" w:type="dxa"/>
           </w:tcPr>
           <w:p>
             <w:pPr>
@@ -1704,7 +1775,7 @@
         </w:tc>
         <w:tc>
           <w:tcPr>
-            <w:tcW w:type="dxa" w:w="1460"/>
+            <w:tcW w:w="1460" w:type="dxa"/>
           </w:tcPr>
           <w:p>
             <w:pPr>
@@ -1717,7 +1788,7 @@
         </w:tc>
         <w:tc>
           <w:tcPr>
-            <w:tcW w:type="dxa" w:w="1460"/>
+            <w:tcW w:w="1460" w:type="dxa"/>
           </w:tcPr>
           <w:p>
             <w:pPr>
@@ -1733,25 +1804,29 @@
     <w:p>
       <w:pPr>
         <w:pStyle w:val="Image"/>
-        <w:jc w:val="center"/>
-      </w:pPr>
-      <w:r>
+      </w:pPr>
+      <w:r>
+        <w:rPr>
+          <w:noProof/>
+        </w:rPr>
+        <w:lastRenderedPageBreak/>
         <w:drawing>
-          <wp:inline xmlns:a="http://schemas.openxmlformats.org/drawingml/2006/main" xmlns:pic="http://schemas.openxmlformats.org/drawingml/2006/picture">
+          <wp:inline distT="0" distB="0" distL="0" distR="0" wp14:anchorId="33B078CD" wp14:editId="141721C6">
             <wp:extent cx="4846320" cy="3039578"/>
+            <wp:effectExtent l="0" t="0" r="0" b="0"/>
             <wp:docPr id="3" name="Picture 3"/>
             <wp:cNvGraphicFramePr>
-              <a:graphicFrameLocks noChangeAspect="1"/>
+              <a:graphicFrameLocks xmlns:a="http://schemas.openxmlformats.org/drawingml/2006/main" noChangeAspect="1"/>
             </wp:cNvGraphicFramePr>
-            <a:graphic>
+            <a:graphic xmlns:a="http://schemas.openxmlformats.org/drawingml/2006/main">
               <a:graphicData uri="http://schemas.openxmlformats.org/drawingml/2006/picture">
-                <pic:pic>
+                <pic:pic xmlns:pic="http://schemas.openxmlformats.org/drawingml/2006/picture">
                   <pic:nvPicPr>
                     <pic:cNvPr id="0" name="figure_2_main_results.png"/>
                     <pic:cNvPicPr/>
                   </pic:nvPicPr>
                   <pic:blipFill>
-                    <a:blip r:embed="rId32"/>
+                    <a:blip r:embed="rId9"/>
                     <a:stretch>
                       <a:fillRect/>
                     </a:stretch>
@@ -1761,7 +1836,9 @@
                       <a:off x="0" y="0"/>
                       <a:ext cx="4846320" cy="3039578"/>
                     </a:xfrm>
-                    <a:prstGeom prst="rect"/>
+                    <a:prstGeom prst="rect">
+                      <a:avLst/>
+                    </a:prstGeom>
                   </pic:spPr>
                 </pic:pic>
               </a:graphicData>
@@ -1781,25 +1858,28 @@
     <w:p>
       <w:pPr>
         <w:pStyle w:val="Image"/>
-        <w:jc w:val="center"/>
-      </w:pPr>
-      <w:r>
+      </w:pPr>
+      <w:r>
+        <w:rPr>
+          <w:noProof/>
+        </w:rPr>
         <w:drawing>
-          <wp:inline xmlns:a="http://schemas.openxmlformats.org/drawingml/2006/main" xmlns:pic="http://schemas.openxmlformats.org/drawingml/2006/picture">
+          <wp:inline distT="0" distB="0" distL="0" distR="0" wp14:anchorId="56775F7A" wp14:editId="3C96AE27">
             <wp:extent cx="4846320" cy="3009222"/>
+            <wp:effectExtent l="0" t="0" r="0" b="0"/>
             <wp:docPr id="4" name="Picture 4"/>
             <wp:cNvGraphicFramePr>
-              <a:graphicFrameLocks noChangeAspect="1"/>
+              <a:graphicFrameLocks xmlns:a="http://schemas.openxmlformats.org/drawingml/2006/main" noChangeAspect="1"/>
             </wp:cNvGraphicFramePr>
-            <a:graphic>
+            <a:graphic xmlns:a="http://schemas.openxmlformats.org/drawingml/2006/main">
               <a:graphicData uri="http://schemas.openxmlformats.org/drawingml/2006/picture">
-                <pic:pic>
+                <pic:pic xmlns:pic="http://schemas.openxmlformats.org/drawingml/2006/picture">
                   <pic:nvPicPr>
                     <pic:cNvPr id="0" name="figure_3_multihop.png"/>
                     <pic:cNvPicPr/>
                   </pic:nvPicPr>
                   <pic:blipFill>
-                    <a:blip r:embed="rId33"/>
+                    <a:blip r:embed="rId10"/>
                     <a:stretch>
                       <a:fillRect/>
                     </a:stretch>
@@ -1809,7 +1889,9 @@
                       <a:off x="0" y="0"/>
                       <a:ext cx="4846320" cy="3009222"/>
                     </a:xfrm>
-                    <a:prstGeom prst="rect"/>
+                    <a:prstGeom prst="rect">
+                      <a:avLst/>
+                    </a:prstGeom>
                   </pic:spPr>
                 </pic:pic>
               </a:graphicData>
@@ -1821,16 +1903,27 @@
     <w:p>
       <w:pPr>
         <w:pStyle w:val="FigureCaption"/>
+        <w:rPr>
+          <w:rFonts w:hint="eastAsia"/>
+          <w:lang w:eastAsia="ko-KR"/>
+        </w:rPr>
       </w:pPr>
       <w:r>
         <w:t>Figure 4: Multi-hop ROUGE-L on the HotpotQA subset (n = 20). TreeRAG-Beam leads, confirming that beam-guided traversal suits multi-evidence synthesis.</w:t>
       </w:r>
+      <w:r>
+        <w:rPr>
+          <w:lang w:eastAsia="ko-KR"/>
+        </w:rPr>
+        <w:br/>
+      </w:r>
     </w:p>
     <w:p>
       <w:pPr>
         <w:pStyle w:val="Head2"/>
       </w:pPr>
       <w:r>
+        <w:lastRenderedPageBreak/>
         <w:t>Medical Domain Results</w:t>
       </w:r>
     </w:p>
@@ -1860,7 +1953,7 @@
     </w:p>
     <w:tbl>
       <w:tblPr>
-        <w:tblW w:type="auto" w:w="0"/>
+        <w:tblW w:w="0" w:type="auto"/>
         <w:tblBorders>
           <w:top w:val="single" w:sz="4" w:space="0" w:color="999999"/>
           <w:left w:val="single" w:sz="4" w:space="0" w:color="999999"/>
@@ -1869,18 +1962,18 @@
           <w:insideH w:val="single" w:sz="4" w:space="0" w:color="999999"/>
           <w:insideV w:val="single" w:sz="4" w:space="0" w:color="999999"/>
         </w:tblBorders>
-        <w:tblLook w:firstColumn="1" w:firstRow="1" w:lastColumn="0" w:lastRow="0" w:noHBand="0" w:noVBand="1" w:val="04A0"/>
+        <w:tblLook w:val="04A0" w:firstRow="1" w:lastRow="0" w:firstColumn="1" w:lastColumn="0" w:noHBand="0" w:noVBand="1"/>
       </w:tblPr>
       <w:tblGrid>
-        <w:gridCol w:w="2190"/>
-        <w:gridCol w:w="2190"/>
-        <w:gridCol w:w="2190"/>
-        <w:gridCol w:w="2190"/>
+        <w:gridCol w:w="2188"/>
+        <w:gridCol w:w="2188"/>
+        <w:gridCol w:w="2187"/>
+        <w:gridCol w:w="2187"/>
       </w:tblGrid>
       <w:tr>
         <w:tc>
           <w:tcPr>
-            <w:tcW w:type="dxa" w:w="2190"/>
+            <w:tcW w:w="2190" w:type="dxa"/>
           </w:tcPr>
           <w:p>
             <w:pPr>
@@ -1896,7 +1989,7 @@
         </w:tc>
         <w:tc>
           <w:tcPr>
-            <w:tcW w:type="dxa" w:w="2190"/>
+            <w:tcW w:w="2190" w:type="dxa"/>
           </w:tcPr>
           <w:p>
             <w:pPr>
@@ -1912,7 +2005,7 @@
         </w:tc>
         <w:tc>
           <w:tcPr>
-            <w:tcW w:type="dxa" w:w="2190"/>
+            <w:tcW w:w="2190" w:type="dxa"/>
           </w:tcPr>
           <w:p>
             <w:pPr>
@@ -1928,7 +2021,7 @@
         </w:tc>
         <w:tc>
           <w:tcPr>
-            <w:tcW w:type="dxa" w:w="2190"/>
+            <w:tcW w:w="2190" w:type="dxa"/>
           </w:tcPr>
           <w:p>
             <w:pPr>
@@ -1946,7 +2039,7 @@
       <w:tr>
         <w:tc>
           <w:tcPr>
-            <w:tcW w:type="dxa" w:w="2190"/>
+            <w:tcW w:w="2190" w:type="dxa"/>
           </w:tcPr>
           <w:p>
             <w:pPr>
@@ -1959,7 +2052,7 @@
         </w:tc>
         <w:tc>
           <w:tcPr>
-            <w:tcW w:type="dxa" w:w="2190"/>
+            <w:tcW w:w="2190" w:type="dxa"/>
           </w:tcPr>
           <w:p>
             <w:pPr>
@@ -1972,7 +2065,7 @@
         </w:tc>
         <w:tc>
           <w:tcPr>
-            <w:tcW w:type="dxa" w:w="2190"/>
+            <w:tcW w:w="2190" w:type="dxa"/>
           </w:tcPr>
           <w:p>
             <w:pPr>
@@ -1985,7 +2078,7 @@
         </w:tc>
         <w:tc>
           <w:tcPr>
-            <w:tcW w:type="dxa" w:w="2190"/>
+            <w:tcW w:w="2190" w:type="dxa"/>
           </w:tcPr>
           <w:p>
             <w:pPr>
@@ -2000,7 +2093,7 @@
       <w:tr>
         <w:tc>
           <w:tcPr>
-            <w:tcW w:type="dxa" w:w="2190"/>
+            <w:tcW w:w="2190" w:type="dxa"/>
           </w:tcPr>
           <w:p>
             <w:pPr>
@@ -2013,7 +2106,7 @@
         </w:tc>
         <w:tc>
           <w:tcPr>
-            <w:tcW w:type="dxa" w:w="2190"/>
+            <w:tcW w:w="2190" w:type="dxa"/>
           </w:tcPr>
           <w:p>
             <w:pPr>
@@ -2026,7 +2119,7 @@
         </w:tc>
         <w:tc>
           <w:tcPr>
-            <w:tcW w:type="dxa" w:w="2190"/>
+            <w:tcW w:w="2190" w:type="dxa"/>
           </w:tcPr>
           <w:p>
             <w:pPr>
@@ -2039,7 +2132,7 @@
         </w:tc>
         <w:tc>
           <w:tcPr>
-            <w:tcW w:type="dxa" w:w="2190"/>
+            <w:tcW w:w="2190" w:type="dxa"/>
           </w:tcPr>
           <w:p>
             <w:pPr>
@@ -2054,7 +2147,7 @@
       <w:tr>
         <w:tc>
           <w:tcPr>
-            <w:tcW w:type="dxa" w:w="2190"/>
+            <w:tcW w:w="2190" w:type="dxa"/>
           </w:tcPr>
           <w:p>
             <w:pPr>
@@ -2067,7 +2160,7 @@
         </w:tc>
         <w:tc>
           <w:tcPr>
-            <w:tcW w:type="dxa" w:w="2190"/>
+            <w:tcW w:w="2190" w:type="dxa"/>
           </w:tcPr>
           <w:p>
             <w:pPr>
@@ -2080,7 +2173,7 @@
         </w:tc>
         <w:tc>
           <w:tcPr>
-            <w:tcW w:type="dxa" w:w="2190"/>
+            <w:tcW w:w="2190" w:type="dxa"/>
           </w:tcPr>
           <w:p>
             <w:pPr>
@@ -2093,7 +2186,7 @@
         </w:tc>
         <w:tc>
           <w:tcPr>
-            <w:tcW w:type="dxa" w:w="2190"/>
+            <w:tcW w:w="2190" w:type="dxa"/>
           </w:tcPr>
           <w:p>
             <w:pPr>
@@ -2108,7 +2201,7 @@
       <w:tr>
         <w:tc>
           <w:tcPr>
-            <w:tcW w:type="dxa" w:w="2190"/>
+            <w:tcW w:w="2190" w:type="dxa"/>
           </w:tcPr>
           <w:p>
             <w:pPr>
@@ -2121,7 +2214,7 @@
         </w:tc>
         <w:tc>
           <w:tcPr>
-            <w:tcW w:type="dxa" w:w="2190"/>
+            <w:tcW w:w="2190" w:type="dxa"/>
           </w:tcPr>
           <w:p>
             <w:pPr>
@@ -2134,7 +2227,7 @@
         </w:tc>
         <w:tc>
           <w:tcPr>
-            <w:tcW w:type="dxa" w:w="2190"/>
+            <w:tcW w:w="2190" w:type="dxa"/>
           </w:tcPr>
           <w:p>
             <w:pPr>
@@ -2147,7 +2240,7 @@
         </w:tc>
         <w:tc>
           <w:tcPr>
-            <w:tcW w:type="dxa" w:w="2190"/>
+            <w:tcW w:w="2190" w:type="dxa"/>
           </w:tcPr>
           <w:p>
             <w:pPr>
@@ -2162,7 +2255,7 @@
       <w:tr>
         <w:tc>
           <w:tcPr>
-            <w:tcW w:type="dxa" w:w="2190"/>
+            <w:tcW w:w="2190" w:type="dxa"/>
           </w:tcPr>
           <w:p>
             <w:pPr>
@@ -2175,7 +2268,7 @@
         </w:tc>
         <w:tc>
           <w:tcPr>
-            <w:tcW w:type="dxa" w:w="2190"/>
+            <w:tcW w:w="2190" w:type="dxa"/>
           </w:tcPr>
           <w:p>
             <w:pPr>
@@ -2188,7 +2281,7 @@
         </w:tc>
         <w:tc>
           <w:tcPr>
-            <w:tcW w:type="dxa" w:w="2190"/>
+            <w:tcW w:w="2190" w:type="dxa"/>
           </w:tcPr>
           <w:p>
             <w:pPr>
@@ -2201,7 +2294,7 @@
         </w:tc>
         <w:tc>
           <w:tcPr>
-            <w:tcW w:type="dxa" w:w="2190"/>
+            <w:tcW w:w="2190" w:type="dxa"/>
           </w:tcPr>
           <w:p>
             <w:pPr>
@@ -2216,7 +2309,7 @@
       <w:tr>
         <w:tc>
           <w:tcPr>
-            <w:tcW w:type="dxa" w:w="2190"/>
+            <w:tcW w:w="2190" w:type="dxa"/>
           </w:tcPr>
           <w:p>
             <w:pPr>
@@ -2229,7 +2322,7 @@
         </w:tc>
         <w:tc>
           <w:tcPr>
-            <w:tcW w:type="dxa" w:w="2190"/>
+            <w:tcW w:w="2190" w:type="dxa"/>
           </w:tcPr>
           <w:p>
             <w:pPr>
@@ -2242,7 +2335,7 @@
         </w:tc>
         <w:tc>
           <w:tcPr>
-            <w:tcW w:type="dxa" w:w="2190"/>
+            <w:tcW w:w="2190" w:type="dxa"/>
           </w:tcPr>
           <w:p>
             <w:pPr>
@@ -2255,7 +2348,7 @@
         </w:tc>
         <w:tc>
           <w:tcPr>
-            <w:tcW w:type="dxa" w:w="2190"/>
+            <w:tcW w:w="2190" w:type="dxa"/>
           </w:tcPr>
           <w:p>
             <w:pPr>
@@ -2271,25 +2364,29 @@
     <w:p>
       <w:pPr>
         <w:pStyle w:val="Image"/>
-        <w:jc w:val="center"/>
-      </w:pPr>
-      <w:r>
+      </w:pPr>
+      <w:r>
+        <w:rPr>
+          <w:noProof/>
+        </w:rPr>
+        <w:lastRenderedPageBreak/>
         <w:drawing>
-          <wp:inline xmlns:a="http://schemas.openxmlformats.org/drawingml/2006/main" xmlns:pic="http://schemas.openxmlformats.org/drawingml/2006/picture">
+          <wp:inline distT="0" distB="0" distL="0" distR="0" wp14:anchorId="7BA3D80B" wp14:editId="57A421F2">
             <wp:extent cx="4846320" cy="2656078"/>
+            <wp:effectExtent l="0" t="0" r="0" b="0"/>
             <wp:docPr id="5" name="Picture 5"/>
             <wp:cNvGraphicFramePr>
-              <a:graphicFrameLocks noChangeAspect="1"/>
+              <a:graphicFrameLocks xmlns:a="http://schemas.openxmlformats.org/drawingml/2006/main" noChangeAspect="1"/>
             </wp:cNvGraphicFramePr>
-            <a:graphic>
+            <a:graphic xmlns:a="http://schemas.openxmlformats.org/drawingml/2006/main">
               <a:graphicData uri="http://schemas.openxmlformats.org/drawingml/2006/picture">
-                <pic:pic>
+                <pic:pic xmlns:pic="http://schemas.openxmlformats.org/drawingml/2006/picture">
                   <pic:nvPicPr>
                     <pic:cNvPr id="0" name="figure_5_medical.png"/>
                     <pic:cNvPicPr/>
                   </pic:nvPicPr>
                   <pic:blipFill>
-                    <a:blip r:embed="rId34"/>
+                    <a:blip r:embed="rId11"/>
                     <a:stretch>
                       <a:fillRect/>
                     </a:stretch>
@@ -2299,7 +2396,9 @@
                       <a:off x="0" y="0"/>
                       <a:ext cx="4846320" cy="2656078"/>
                     </a:xfrm>
-                    <a:prstGeom prst="rect"/>
+                    <a:prstGeom prst="rect">
+                      <a:avLst/>
+                    </a:prstGeom>
                   </pic:spPr>
                 </pic:pic>
               </a:graphicData>
@@ -2342,7 +2441,7 @@
     </w:p>
     <w:tbl>
       <w:tblPr>
-        <w:tblW w:type="auto" w:w="0"/>
+        <w:tblW w:w="0" w:type="auto"/>
         <w:tblBorders>
           <w:top w:val="single" w:sz="4" w:space="0" w:color="999999"/>
           <w:left w:val="single" w:sz="4" w:space="0" w:color="999999"/>
@@ -2351,18 +2450,18 @@
           <w:insideH w:val="single" w:sz="4" w:space="0" w:color="999999"/>
           <w:insideV w:val="single" w:sz="4" w:space="0" w:color="999999"/>
         </w:tblBorders>
-        <w:tblLook w:firstColumn="1" w:firstRow="1" w:lastColumn="0" w:lastRow="0" w:noHBand="0" w:noVBand="1" w:val="04A0"/>
+        <w:tblLook w:val="04A0" w:firstRow="1" w:lastRow="0" w:firstColumn="1" w:lastColumn="0" w:noHBand="0" w:noVBand="1"/>
       </w:tblPr>
       <w:tblGrid>
-        <w:gridCol w:w="2190"/>
-        <w:gridCol w:w="2190"/>
-        <w:gridCol w:w="2190"/>
-        <w:gridCol w:w="2190"/>
+        <w:gridCol w:w="2188"/>
+        <w:gridCol w:w="2188"/>
+        <w:gridCol w:w="2187"/>
+        <w:gridCol w:w="2187"/>
       </w:tblGrid>
       <w:tr>
         <w:tc>
           <w:tcPr>
-            <w:tcW w:type="dxa" w:w="2190"/>
+            <w:tcW w:w="2190" w:type="dxa"/>
           </w:tcPr>
           <w:p>
             <w:pPr>
@@ -2378,7 +2477,7 @@
         </w:tc>
         <w:tc>
           <w:tcPr>
-            <w:tcW w:type="dxa" w:w="2190"/>
+            <w:tcW w:w="2190" w:type="dxa"/>
           </w:tcPr>
           <w:p>
             <w:pPr>
@@ -2394,7 +2493,7 @@
         </w:tc>
         <w:tc>
           <w:tcPr>
-            <w:tcW w:type="dxa" w:w="2190"/>
+            <w:tcW w:w="2190" w:type="dxa"/>
           </w:tcPr>
           <w:p>
             <w:pPr>
@@ -2410,7 +2509,7 @@
         </w:tc>
         <w:tc>
           <w:tcPr>
-            <w:tcW w:type="dxa" w:w="2190"/>
+            <w:tcW w:w="2190" w:type="dxa"/>
           </w:tcPr>
           <w:p>
             <w:pPr>
@@ -2428,7 +2527,7 @@
       <w:tr>
         <w:tc>
           <w:tcPr>
-            <w:tcW w:type="dxa" w:w="2190"/>
+            <w:tcW w:w="2190" w:type="dxa"/>
           </w:tcPr>
           <w:p>
             <w:pPr>
@@ -2441,7 +2540,7 @@
         </w:tc>
         <w:tc>
           <w:tcPr>
-            <w:tcW w:type="dxa" w:w="2190"/>
+            <w:tcW w:w="2190" w:type="dxa"/>
           </w:tcPr>
           <w:p>
             <w:pPr>
@@ -2454,7 +2553,7 @@
         </w:tc>
         <w:tc>
           <w:tcPr>
-            <w:tcW w:type="dxa" w:w="2190"/>
+            <w:tcW w:w="2190" w:type="dxa"/>
           </w:tcPr>
           <w:p>
             <w:pPr>
@@ -2467,7 +2566,7 @@
         </w:tc>
         <w:tc>
           <w:tcPr>
-            <w:tcW w:type="dxa" w:w="2190"/>
+            <w:tcW w:w="2190" w:type="dxa"/>
           </w:tcPr>
           <w:p>
             <w:pPr>
@@ -2482,7 +2581,7 @@
       <w:tr>
         <w:tc>
           <w:tcPr>
-            <w:tcW w:type="dxa" w:w="2190"/>
+            <w:tcW w:w="2190" w:type="dxa"/>
           </w:tcPr>
           <w:p>
             <w:pPr>
@@ -2495,7 +2594,7 @@
         </w:tc>
         <w:tc>
           <w:tcPr>
-            <w:tcW w:type="dxa" w:w="2190"/>
+            <w:tcW w:w="2190" w:type="dxa"/>
           </w:tcPr>
           <w:p>
             <w:pPr>
@@ -2508,7 +2607,7 @@
         </w:tc>
         <w:tc>
           <w:tcPr>
-            <w:tcW w:type="dxa" w:w="2190"/>
+            <w:tcW w:w="2190" w:type="dxa"/>
           </w:tcPr>
           <w:p>
             <w:pPr>
@@ -2521,7 +2620,7 @@
         </w:tc>
         <w:tc>
           <w:tcPr>
-            <w:tcW w:type="dxa" w:w="2190"/>
+            <w:tcW w:w="2190" w:type="dxa"/>
           </w:tcPr>
           <w:p>
             <w:pPr>
@@ -2536,7 +2635,7 @@
       <w:tr>
         <w:tc>
           <w:tcPr>
-            <w:tcW w:type="dxa" w:w="2190"/>
+            <w:tcW w:w="2190" w:type="dxa"/>
           </w:tcPr>
           <w:p>
             <w:pPr>
@@ -2549,7 +2648,7 @@
         </w:tc>
         <w:tc>
           <w:tcPr>
-            <w:tcW w:type="dxa" w:w="2190"/>
+            <w:tcW w:w="2190" w:type="dxa"/>
           </w:tcPr>
           <w:p>
             <w:pPr>
@@ -2562,7 +2661,7 @@
         </w:tc>
         <w:tc>
           <w:tcPr>
-            <w:tcW w:type="dxa" w:w="2190"/>
+            <w:tcW w:w="2190" w:type="dxa"/>
           </w:tcPr>
           <w:p>
             <w:pPr>
@@ -2575,7 +2674,7 @@
         </w:tc>
         <w:tc>
           <w:tcPr>
-            <w:tcW w:type="dxa" w:w="2190"/>
+            <w:tcW w:w="2190" w:type="dxa"/>
           </w:tcPr>
           <w:p>
             <w:pPr>
@@ -2590,7 +2689,7 @@
       <w:tr>
         <w:tc>
           <w:tcPr>
-            <w:tcW w:type="dxa" w:w="2190"/>
+            <w:tcW w:w="2190" w:type="dxa"/>
           </w:tcPr>
           <w:p>
             <w:pPr>
@@ -2603,7 +2702,7 @@
         </w:tc>
         <w:tc>
           <w:tcPr>
-            <w:tcW w:type="dxa" w:w="2190"/>
+            <w:tcW w:w="2190" w:type="dxa"/>
           </w:tcPr>
           <w:p>
             <w:pPr>
@@ -2616,7 +2715,7 @@
         </w:tc>
         <w:tc>
           <w:tcPr>
-            <w:tcW w:type="dxa" w:w="2190"/>
+            <w:tcW w:w="2190" w:type="dxa"/>
           </w:tcPr>
           <w:p>
             <w:pPr>
@@ -2629,7 +2728,7 @@
         </w:tc>
         <w:tc>
           <w:tcPr>
-            <w:tcW w:type="dxa" w:w="2190"/>
+            <w:tcW w:w="2190" w:type="dxa"/>
           </w:tcPr>
           <w:p>
             <w:pPr>
@@ -2645,25 +2744,29 @@
     <w:p>
       <w:pPr>
         <w:pStyle w:val="Image"/>
-        <w:jc w:val="center"/>
-      </w:pPr>
-      <w:r>
+      </w:pPr>
+      <w:r>
+        <w:rPr>
+          <w:noProof/>
+        </w:rPr>
+        <w:lastRenderedPageBreak/>
         <w:drawing>
-          <wp:inline xmlns:a="http://schemas.openxmlformats.org/drawingml/2006/main" xmlns:pic="http://schemas.openxmlformats.org/drawingml/2006/picture">
+          <wp:inline distT="0" distB="0" distL="0" distR="0" wp14:anchorId="4EB715CF" wp14:editId="60CC7852">
             <wp:extent cx="4846320" cy="2600864"/>
+            <wp:effectExtent l="0" t="0" r="0" b="0"/>
             <wp:docPr id="6" name="Picture 6"/>
             <wp:cNvGraphicFramePr>
-              <a:graphicFrameLocks noChangeAspect="1"/>
+              <a:graphicFrameLocks xmlns:a="http://schemas.openxmlformats.org/drawingml/2006/main" noChangeAspect="1"/>
             </wp:cNvGraphicFramePr>
-            <a:graphic>
+            <a:graphic xmlns:a="http://schemas.openxmlformats.org/drawingml/2006/main">
               <a:graphicData uri="http://schemas.openxmlformats.org/drawingml/2006/picture">
-                <pic:pic>
+                <pic:pic xmlns:pic="http://schemas.openxmlformats.org/drawingml/2006/picture">
                   <pic:nvPicPr>
                     <pic:cNvPr id="0" name="figure_2_ablation.png"/>
                     <pic:cNvPicPr/>
                   </pic:nvPicPr>
                   <pic:blipFill>
-                    <a:blip r:embed="rId35"/>
+                    <a:blip r:embed="rId12"/>
                     <a:stretch>
                       <a:fillRect/>
                     </a:stretch>
@@ -2673,7 +2776,9 @@
                       <a:off x="0" y="0"/>
                       <a:ext cx="4846320" cy="2600864"/>
                     </a:xfrm>
-                    <a:prstGeom prst="rect"/>
+                    <a:prstGeom prst="rect">
+                      <a:avLst/>
+                    </a:prstGeom>
                   </pic:spPr>
                 </pic:pic>
               </a:graphicData>
@@ -2716,7 +2821,7 @@
     </w:p>
     <w:tbl>
       <w:tblPr>
-        <w:tblW w:type="auto" w:w="0"/>
+        <w:tblW w:w="0" w:type="auto"/>
         <w:tblBorders>
           <w:top w:val="single" w:sz="4" w:space="0" w:color="999999"/>
           <w:left w:val="single" w:sz="4" w:space="0" w:color="999999"/>
@@ -2725,18 +2830,18 @@
           <w:insideH w:val="single" w:sz="4" w:space="0" w:color="999999"/>
           <w:insideV w:val="single" w:sz="4" w:space="0" w:color="999999"/>
         </w:tblBorders>
-        <w:tblLook w:firstColumn="1" w:firstRow="1" w:lastColumn="0" w:lastRow="0" w:noHBand="0" w:noVBand="1" w:val="04A0"/>
+        <w:tblLook w:val="04A0" w:firstRow="1" w:lastRow="0" w:firstColumn="1" w:lastColumn="0" w:noHBand="0" w:noVBand="1"/>
       </w:tblPr>
       <w:tblGrid>
-        <w:gridCol w:w="2190"/>
-        <w:gridCol w:w="2190"/>
-        <w:gridCol w:w="2190"/>
-        <w:gridCol w:w="2190"/>
+        <w:gridCol w:w="2188"/>
+        <w:gridCol w:w="2188"/>
+        <w:gridCol w:w="2187"/>
+        <w:gridCol w:w="2187"/>
       </w:tblGrid>
       <w:tr>
         <w:tc>
           <w:tcPr>
-            <w:tcW w:type="dxa" w:w="2190"/>
+            <w:tcW w:w="2190" w:type="dxa"/>
           </w:tcPr>
           <w:p>
             <w:pPr>
@@ -2752,7 +2857,7 @@
         </w:tc>
         <w:tc>
           <w:tcPr>
-            <w:tcW w:type="dxa" w:w="2190"/>
+            <w:tcW w:w="2190" w:type="dxa"/>
           </w:tcPr>
           <w:p>
             <w:pPr>
@@ -2768,7 +2873,7 @@
         </w:tc>
         <w:tc>
           <w:tcPr>
-            <w:tcW w:type="dxa" w:w="2190"/>
+            <w:tcW w:w="2190" w:type="dxa"/>
           </w:tcPr>
           <w:p>
             <w:pPr>
@@ -2784,7 +2889,7 @@
         </w:tc>
         <w:tc>
           <w:tcPr>
-            <w:tcW w:type="dxa" w:w="2190"/>
+            <w:tcW w:w="2190" w:type="dxa"/>
           </w:tcPr>
           <w:p>
             <w:pPr>
@@ -2802,7 +2907,7 @@
       <w:tr>
         <w:tc>
           <w:tcPr>
-            <w:tcW w:type="dxa" w:w="2190"/>
+            <w:tcW w:w="2190" w:type="dxa"/>
           </w:tcPr>
           <w:p>
             <w:pPr>
@@ -2815,7 +2920,7 @@
         </w:tc>
         <w:tc>
           <w:tcPr>
-            <w:tcW w:type="dxa" w:w="2190"/>
+            <w:tcW w:w="2190" w:type="dxa"/>
           </w:tcPr>
           <w:p>
             <w:pPr>
@@ -2828,7 +2933,7 @@
         </w:tc>
         <w:tc>
           <w:tcPr>
-            <w:tcW w:type="dxa" w:w="2190"/>
+            <w:tcW w:w="2190" w:type="dxa"/>
           </w:tcPr>
           <w:p>
             <w:pPr>
@@ -2841,7 +2946,7 @@
         </w:tc>
         <w:tc>
           <w:tcPr>
-            <w:tcW w:type="dxa" w:w="2190"/>
+            <w:tcW w:w="2190" w:type="dxa"/>
           </w:tcPr>
           <w:p>
             <w:pPr>
@@ -2856,7 +2961,7 @@
       <w:tr>
         <w:tc>
           <w:tcPr>
-            <w:tcW w:type="dxa" w:w="2190"/>
+            <w:tcW w:w="2190" w:type="dxa"/>
           </w:tcPr>
           <w:p>
             <w:pPr>
@@ -2869,7 +2974,7 @@
         </w:tc>
         <w:tc>
           <w:tcPr>
-            <w:tcW w:type="dxa" w:w="2190"/>
+            <w:tcW w:w="2190" w:type="dxa"/>
           </w:tcPr>
           <w:p>
             <w:pPr>
@@ -2882,7 +2987,7 @@
         </w:tc>
         <w:tc>
           <w:tcPr>
-            <w:tcW w:type="dxa" w:w="2190"/>
+            <w:tcW w:w="2190" w:type="dxa"/>
           </w:tcPr>
           <w:p>
             <w:pPr>
@@ -2895,7 +3000,7 @@
         </w:tc>
         <w:tc>
           <w:tcPr>
-            <w:tcW w:type="dxa" w:w="2190"/>
+            <w:tcW w:w="2190" w:type="dxa"/>
           </w:tcPr>
           <w:p>
             <w:pPr>
@@ -2910,7 +3015,7 @@
       <w:tr>
         <w:tc>
           <w:tcPr>
-            <w:tcW w:type="dxa" w:w="2190"/>
+            <w:tcW w:w="2190" w:type="dxa"/>
           </w:tcPr>
           <w:p>
             <w:pPr>
@@ -2923,7 +3028,7 @@
         </w:tc>
         <w:tc>
           <w:tcPr>
-            <w:tcW w:type="dxa" w:w="2190"/>
+            <w:tcW w:w="2190" w:type="dxa"/>
           </w:tcPr>
           <w:p>
             <w:pPr>
@@ -2936,7 +3041,7 @@
         </w:tc>
         <w:tc>
           <w:tcPr>
-            <w:tcW w:type="dxa" w:w="2190"/>
+            <w:tcW w:w="2190" w:type="dxa"/>
           </w:tcPr>
           <w:p>
             <w:pPr>
@@ -2949,7 +3054,7 @@
         </w:tc>
         <w:tc>
           <w:tcPr>
-            <w:tcW w:type="dxa" w:w="2190"/>
+            <w:tcW w:w="2190" w:type="dxa"/>
           </w:tcPr>
           <w:p>
             <w:pPr>
@@ -2964,7 +3069,7 @@
       <w:tr>
         <w:tc>
           <w:tcPr>
-            <w:tcW w:type="dxa" w:w="2190"/>
+            <w:tcW w:w="2190" w:type="dxa"/>
           </w:tcPr>
           <w:p>
             <w:pPr>
@@ -2977,7 +3082,7 @@
         </w:tc>
         <w:tc>
           <w:tcPr>
-            <w:tcW w:type="dxa" w:w="2190"/>
+            <w:tcW w:w="2190" w:type="dxa"/>
           </w:tcPr>
           <w:p>
             <w:pPr>
@@ -2990,7 +3095,7 @@
         </w:tc>
         <w:tc>
           <w:tcPr>
-            <w:tcW w:type="dxa" w:w="2190"/>
+            <w:tcW w:w="2190" w:type="dxa"/>
           </w:tcPr>
           <w:p>
             <w:pPr>
@@ -3003,7 +3108,7 @@
         </w:tc>
         <w:tc>
           <w:tcPr>
-            <w:tcW w:type="dxa" w:w="2190"/>
+            <w:tcW w:w="2190" w:type="dxa"/>
           </w:tcPr>
           <w:p>
             <w:pPr>
@@ -3018,7 +3123,7 @@
       <w:tr>
         <w:tc>
           <w:tcPr>
-            <w:tcW w:type="dxa" w:w="2190"/>
+            <w:tcW w:w="2190" w:type="dxa"/>
           </w:tcPr>
           <w:p>
             <w:pPr>
@@ -3031,7 +3136,7 @@
         </w:tc>
         <w:tc>
           <w:tcPr>
-            <w:tcW w:type="dxa" w:w="2190"/>
+            <w:tcW w:w="2190" w:type="dxa"/>
           </w:tcPr>
           <w:p>
             <w:pPr>
@@ -3044,7 +3149,7 @@
         </w:tc>
         <w:tc>
           <w:tcPr>
-            <w:tcW w:type="dxa" w:w="2190"/>
+            <w:tcW w:w="2190" w:type="dxa"/>
           </w:tcPr>
           <w:p>
             <w:pPr>
@@ -3057,7 +3162,7 @@
         </w:tc>
         <w:tc>
           <w:tcPr>
-            <w:tcW w:type="dxa" w:w="2190"/>
+            <w:tcW w:w="2190" w:type="dxa"/>
           </w:tcPr>
           <w:p>
             <w:pPr>
@@ -3072,7 +3177,7 @@
       <w:tr>
         <w:tc>
           <w:tcPr>
-            <w:tcW w:type="dxa" w:w="2190"/>
+            <w:tcW w:w="2190" w:type="dxa"/>
           </w:tcPr>
           <w:p>
             <w:pPr>
@@ -3085,7 +3190,7 @@
         </w:tc>
         <w:tc>
           <w:tcPr>
-            <w:tcW w:type="dxa" w:w="2190"/>
+            <w:tcW w:w="2190" w:type="dxa"/>
           </w:tcPr>
           <w:p>
             <w:pPr>
@@ -3098,7 +3203,7 @@
         </w:tc>
         <w:tc>
           <w:tcPr>
-            <w:tcW w:type="dxa" w:w="2190"/>
+            <w:tcW w:w="2190" w:type="dxa"/>
           </w:tcPr>
           <w:p>
             <w:pPr>
@@ -3111,7 +3216,7 @@
         </w:tc>
         <w:tc>
           <w:tcPr>
-            <w:tcW w:type="dxa" w:w="2190"/>
+            <w:tcW w:w="2190" w:type="dxa"/>
           </w:tcPr>
           <w:p>
             <w:pPr>
@@ -3127,25 +3232,29 @@
     <w:p>
       <w:pPr>
         <w:pStyle w:val="Image"/>
-        <w:jc w:val="center"/>
-      </w:pPr>
-      <w:r>
+      </w:pPr>
+      <w:r>
+        <w:rPr>
+          <w:noProof/>
+        </w:rPr>
+        <w:lastRenderedPageBreak/>
         <w:drawing>
-          <wp:inline xmlns:a="http://schemas.openxmlformats.org/drawingml/2006/main" xmlns:pic="http://schemas.openxmlformats.org/drawingml/2006/picture">
+          <wp:inline distT="0" distB="0" distL="0" distR="0" wp14:anchorId="1F30BEA1" wp14:editId="2C0DDBFD">
             <wp:extent cx="4846320" cy="3432517"/>
+            <wp:effectExtent l="0" t="0" r="0" b="0"/>
             <wp:docPr id="7" name="Picture 7"/>
             <wp:cNvGraphicFramePr>
-              <a:graphicFrameLocks noChangeAspect="1"/>
+              <a:graphicFrameLocks xmlns:a="http://schemas.openxmlformats.org/drawingml/2006/main" noChangeAspect="1"/>
             </wp:cNvGraphicFramePr>
-            <a:graphic>
+            <a:graphic xmlns:a="http://schemas.openxmlformats.org/drawingml/2006/main">
               <a:graphicData uri="http://schemas.openxmlformats.org/drawingml/2006/picture">
-                <pic:pic>
+                <pic:pic xmlns:pic="http://schemas.openxmlformats.org/drawingml/2006/picture">
                   <pic:nvPicPr>
                     <pic:cNvPr id="0" name="figure_3_efficiency.png"/>
                     <pic:cNvPicPr/>
                   </pic:nvPicPr>
                   <pic:blipFill>
-                    <a:blip r:embed="rId36"/>
+                    <a:blip r:embed="rId13"/>
                     <a:stretch>
                       <a:fillRect/>
                     </a:stretch>
@@ -3155,7 +3264,9 @@
                       <a:off x="0" y="0"/>
                       <a:ext cx="4846320" cy="3432517"/>
                     </a:xfrm>
-                    <a:prstGeom prst="rect"/>
+                    <a:prstGeom prst="rect">
+                      <a:avLst/>
+                    </a:prstGeom>
                   </pic:spPr>
                 </pic:pic>
               </a:graphicData>
@@ -3175,25 +3286,28 @@
     <w:p>
       <w:pPr>
         <w:pStyle w:val="Image"/>
-        <w:jc w:val="center"/>
-      </w:pPr>
-      <w:r>
+      </w:pPr>
+      <w:r>
+        <w:rPr>
+          <w:noProof/>
+        </w:rPr>
         <w:drawing>
-          <wp:inline xmlns:a="http://schemas.openxmlformats.org/drawingml/2006/main" xmlns:pic="http://schemas.openxmlformats.org/drawingml/2006/picture">
+          <wp:inline distT="0" distB="0" distL="0" distR="0" wp14:anchorId="2ABD46EA" wp14:editId="3A5635DB">
             <wp:extent cx="4846320" cy="2914526"/>
+            <wp:effectExtent l="0" t="0" r="0" b="0"/>
             <wp:docPr id="8" name="Picture 8"/>
             <wp:cNvGraphicFramePr>
-              <a:graphicFrameLocks noChangeAspect="1"/>
+              <a:graphicFrameLocks xmlns:a="http://schemas.openxmlformats.org/drawingml/2006/main" noChangeAspect="1"/>
             </wp:cNvGraphicFramePr>
-            <a:graphic>
+            <a:graphic xmlns:a="http://schemas.openxmlformats.org/drawingml/2006/main">
               <a:graphicData uri="http://schemas.openxmlformats.org/drawingml/2006/picture">
-                <pic:pic>
+                <pic:pic xmlns:pic="http://schemas.openxmlformats.org/drawingml/2006/picture">
                   <pic:nvPicPr>
                     <pic:cNvPr id="0" name="figure_4_context_reduction.png"/>
                     <pic:cNvPicPr/>
                   </pic:nvPicPr>
                   <pic:blipFill>
-                    <a:blip r:embed="rId37"/>
+                    <a:blip r:embed="rId14"/>
                     <a:stretch>
                       <a:fillRect/>
                     </a:stretch>
@@ -3203,7 +3317,9 @@
                       <a:off x="0" y="0"/>
                       <a:ext cx="4846320" cy="2914526"/>
                     </a:xfrm>
-                    <a:prstGeom prst="rect"/>
+                    <a:prstGeom prst="rect">
+                      <a:avLst/>
+                    </a:prstGeom>
                   </pic:spPr>
                 </pic:pic>
               </a:graphicData>
@@ -3225,6 +3341,7 @@
         <w:pStyle w:val="Head2"/>
       </w:pPr>
       <w:r>
+        <w:lastRenderedPageBreak/>
         <w:t>Fair Generator-Controlled Results</w:t>
       </w:r>
     </w:p>
@@ -3246,7 +3363,7 @@
     </w:p>
     <w:tbl>
       <w:tblPr>
-        <w:tblW w:type="auto" w:w="0"/>
+        <w:tblW w:w="0" w:type="auto"/>
         <w:tblBorders>
           <w:top w:val="single" w:sz="4" w:space="0" w:color="999999"/>
           <w:left w:val="single" w:sz="4" w:space="0" w:color="999999"/>
@@ -3255,20 +3372,20 @@
           <w:insideH w:val="single" w:sz="4" w:space="0" w:color="999999"/>
           <w:insideV w:val="single" w:sz="4" w:space="0" w:color="999999"/>
         </w:tblBorders>
-        <w:tblLook w:firstColumn="1" w:firstRow="1" w:lastColumn="0" w:lastRow="0" w:noHBand="0" w:noVBand="1" w:val="04A0"/>
+        <w:tblLook w:val="04A0" w:firstRow="1" w:lastRow="0" w:firstColumn="1" w:lastColumn="0" w:noHBand="0" w:noVBand="1"/>
       </w:tblPr>
       <w:tblGrid>
-        <w:gridCol w:w="1460"/>
-        <w:gridCol w:w="1460"/>
-        <w:gridCol w:w="1460"/>
-        <w:gridCol w:w="1460"/>
-        <w:gridCol w:w="1460"/>
-        <w:gridCol w:w="1460"/>
+        <w:gridCol w:w="1459"/>
+        <w:gridCol w:w="1457"/>
+        <w:gridCol w:w="1459"/>
+        <w:gridCol w:w="1459"/>
+        <w:gridCol w:w="1458"/>
+        <w:gridCol w:w="1458"/>
       </w:tblGrid>
       <w:tr>
         <w:tc>
           <w:tcPr>
-            <w:tcW w:type="dxa" w:w="1460"/>
+            <w:tcW w:w="1460" w:type="dxa"/>
           </w:tcPr>
           <w:p>
             <w:pPr>
@@ -3284,7 +3401,7 @@
         </w:tc>
         <w:tc>
           <w:tcPr>
-            <w:tcW w:type="dxa" w:w="1460"/>
+            <w:tcW w:w="1460" w:type="dxa"/>
           </w:tcPr>
           <w:p>
             <w:pPr>
@@ -3300,7 +3417,7 @@
         </w:tc>
         <w:tc>
           <w:tcPr>
-            <w:tcW w:type="dxa" w:w="1460"/>
+            <w:tcW w:w="1460" w:type="dxa"/>
           </w:tcPr>
           <w:p>
             <w:pPr>
@@ -3316,7 +3433,7 @@
         </w:tc>
         <w:tc>
           <w:tcPr>
-            <w:tcW w:type="dxa" w:w="1460"/>
+            <w:tcW w:w="1460" w:type="dxa"/>
           </w:tcPr>
           <w:p>
             <w:pPr>
@@ -3332,7 +3449,7 @@
         </w:tc>
         <w:tc>
           <w:tcPr>
-            <w:tcW w:type="dxa" w:w="1460"/>
+            <w:tcW w:w="1460" w:type="dxa"/>
           </w:tcPr>
           <w:p>
             <w:pPr>
@@ -3348,7 +3465,7 @@
         </w:tc>
         <w:tc>
           <w:tcPr>
-            <w:tcW w:type="dxa" w:w="1460"/>
+            <w:tcW w:w="1460" w:type="dxa"/>
           </w:tcPr>
           <w:p>
             <w:pPr>
@@ -3366,7 +3483,7 @@
       <w:tr>
         <w:tc>
           <w:tcPr>
-            <w:tcW w:type="dxa" w:w="1460"/>
+            <w:tcW w:w="1460" w:type="dxa"/>
           </w:tcPr>
           <w:p>
             <w:pPr>
@@ -3379,7 +3496,7 @@
         </w:tc>
         <w:tc>
           <w:tcPr>
-            <w:tcW w:type="dxa" w:w="1460"/>
+            <w:tcW w:w="1460" w:type="dxa"/>
           </w:tcPr>
           <w:p>
             <w:pPr>
@@ -3392,7 +3509,7 @@
         </w:tc>
         <w:tc>
           <w:tcPr>
-            <w:tcW w:type="dxa" w:w="1460"/>
+            <w:tcW w:w="1460" w:type="dxa"/>
           </w:tcPr>
           <w:p>
             <w:pPr>
@@ -3405,7 +3522,7 @@
         </w:tc>
         <w:tc>
           <w:tcPr>
-            <w:tcW w:type="dxa" w:w="1460"/>
+            <w:tcW w:w="1460" w:type="dxa"/>
           </w:tcPr>
           <w:p>
             <w:pPr>
@@ -3418,7 +3535,7 @@
         </w:tc>
         <w:tc>
           <w:tcPr>
-            <w:tcW w:type="dxa" w:w="1460"/>
+            <w:tcW w:w="1460" w:type="dxa"/>
           </w:tcPr>
           <w:p>
             <w:pPr>
@@ -3431,7 +3548,7 @@
         </w:tc>
         <w:tc>
           <w:tcPr>
-            <w:tcW w:type="dxa" w:w="1460"/>
+            <w:tcW w:w="1460" w:type="dxa"/>
           </w:tcPr>
           <w:p>
             <w:pPr>
@@ -3446,7 +3563,7 @@
       <w:tr>
         <w:tc>
           <w:tcPr>
-            <w:tcW w:type="dxa" w:w="1460"/>
+            <w:tcW w:w="1460" w:type="dxa"/>
           </w:tcPr>
           <w:p>
             <w:pPr>
@@ -3459,7 +3576,7 @@
         </w:tc>
         <w:tc>
           <w:tcPr>
-            <w:tcW w:type="dxa" w:w="1460"/>
+            <w:tcW w:w="1460" w:type="dxa"/>
           </w:tcPr>
           <w:p>
             <w:pPr>
@@ -3472,7 +3589,7 @@
         </w:tc>
         <w:tc>
           <w:tcPr>
-            <w:tcW w:type="dxa" w:w="1460"/>
+            <w:tcW w:w="1460" w:type="dxa"/>
           </w:tcPr>
           <w:p>
             <w:pPr>
@@ -3485,7 +3602,7 @@
         </w:tc>
         <w:tc>
           <w:tcPr>
-            <w:tcW w:type="dxa" w:w="1460"/>
+            <w:tcW w:w="1460" w:type="dxa"/>
           </w:tcPr>
           <w:p>
             <w:pPr>
@@ -3498,7 +3615,7 @@
         </w:tc>
         <w:tc>
           <w:tcPr>
-            <w:tcW w:type="dxa" w:w="1460"/>
+            <w:tcW w:w="1460" w:type="dxa"/>
           </w:tcPr>
           <w:p>
             <w:pPr>
@@ -3511,7 +3628,7 @@
         </w:tc>
         <w:tc>
           <w:tcPr>
-            <w:tcW w:type="dxa" w:w="1460"/>
+            <w:tcW w:w="1460" w:type="dxa"/>
           </w:tcPr>
           <w:p>
             <w:pPr>
@@ -3526,7 +3643,7 @@
       <w:tr>
         <w:tc>
           <w:tcPr>
-            <w:tcW w:type="dxa" w:w="1460"/>
+            <w:tcW w:w="1460" w:type="dxa"/>
           </w:tcPr>
           <w:p>
             <w:pPr>
@@ -3539,7 +3656,7 @@
         </w:tc>
         <w:tc>
           <w:tcPr>
-            <w:tcW w:type="dxa" w:w="1460"/>
+            <w:tcW w:w="1460" w:type="dxa"/>
           </w:tcPr>
           <w:p>
             <w:pPr>
@@ -3552,7 +3669,7 @@
         </w:tc>
         <w:tc>
           <w:tcPr>
-            <w:tcW w:type="dxa" w:w="1460"/>
+            <w:tcW w:w="1460" w:type="dxa"/>
           </w:tcPr>
           <w:p>
             <w:pPr>
@@ -3565,7 +3682,7 @@
         </w:tc>
         <w:tc>
           <w:tcPr>
-            <w:tcW w:type="dxa" w:w="1460"/>
+            <w:tcW w:w="1460" w:type="dxa"/>
           </w:tcPr>
           <w:p>
             <w:pPr>
@@ -3578,7 +3695,7 @@
         </w:tc>
         <w:tc>
           <w:tcPr>
-            <w:tcW w:type="dxa" w:w="1460"/>
+            <w:tcW w:w="1460" w:type="dxa"/>
           </w:tcPr>
           <w:p>
             <w:pPr>
@@ -3591,7 +3708,7 @@
         </w:tc>
         <w:tc>
           <w:tcPr>
-            <w:tcW w:type="dxa" w:w="1460"/>
+            <w:tcW w:w="1460" w:type="dxa"/>
           </w:tcPr>
           <w:p>
             <w:pPr>
@@ -3606,7 +3723,7 @@
       <w:tr>
         <w:tc>
           <w:tcPr>
-            <w:tcW w:type="dxa" w:w="1460"/>
+            <w:tcW w:w="1460" w:type="dxa"/>
           </w:tcPr>
           <w:p>
             <w:pPr>
@@ -3619,7 +3736,7 @@
         </w:tc>
         <w:tc>
           <w:tcPr>
-            <w:tcW w:type="dxa" w:w="1460"/>
+            <w:tcW w:w="1460" w:type="dxa"/>
           </w:tcPr>
           <w:p>
             <w:pPr>
@@ -3632,7 +3749,7 @@
         </w:tc>
         <w:tc>
           <w:tcPr>
-            <w:tcW w:type="dxa" w:w="1460"/>
+            <w:tcW w:w="1460" w:type="dxa"/>
           </w:tcPr>
           <w:p>
             <w:pPr>
@@ -3645,7 +3762,7 @@
         </w:tc>
         <w:tc>
           <w:tcPr>
-            <w:tcW w:type="dxa" w:w="1460"/>
+            <w:tcW w:w="1460" w:type="dxa"/>
           </w:tcPr>
           <w:p>
             <w:pPr>
@@ -3658,7 +3775,7 @@
         </w:tc>
         <w:tc>
           <w:tcPr>
-            <w:tcW w:type="dxa" w:w="1460"/>
+            <w:tcW w:w="1460" w:type="dxa"/>
           </w:tcPr>
           <w:p>
             <w:pPr>
@@ -3671,7 +3788,7 @@
         </w:tc>
         <w:tc>
           <w:tcPr>
-            <w:tcW w:type="dxa" w:w="1460"/>
+            <w:tcW w:w="1460" w:type="dxa"/>
           </w:tcPr>
           <w:p>
             <w:pPr>
@@ -3686,7 +3803,7 @@
       <w:tr>
         <w:tc>
           <w:tcPr>
-            <w:tcW w:type="dxa" w:w="1460"/>
+            <w:tcW w:w="1460" w:type="dxa"/>
           </w:tcPr>
           <w:p>
             <w:pPr>
@@ -3699,7 +3816,7 @@
         </w:tc>
         <w:tc>
           <w:tcPr>
-            <w:tcW w:type="dxa" w:w="1460"/>
+            <w:tcW w:w="1460" w:type="dxa"/>
           </w:tcPr>
           <w:p>
             <w:pPr>
@@ -3712,7 +3829,7 @@
         </w:tc>
         <w:tc>
           <w:tcPr>
-            <w:tcW w:type="dxa" w:w="1460"/>
+            <w:tcW w:w="1460" w:type="dxa"/>
           </w:tcPr>
           <w:p>
             <w:pPr>
@@ -3725,7 +3842,7 @@
         </w:tc>
         <w:tc>
           <w:tcPr>
-            <w:tcW w:type="dxa" w:w="1460"/>
+            <w:tcW w:w="1460" w:type="dxa"/>
           </w:tcPr>
           <w:p>
             <w:pPr>
@@ -3738,7 +3855,7 @@
         </w:tc>
         <w:tc>
           <w:tcPr>
-            <w:tcW w:type="dxa" w:w="1460"/>
+            <w:tcW w:w="1460" w:type="dxa"/>
           </w:tcPr>
           <w:p>
             <w:pPr>
@@ -3751,7 +3868,7 @@
         </w:tc>
         <w:tc>
           <w:tcPr>
-            <w:tcW w:type="dxa" w:w="1460"/>
+            <w:tcW w:w="1460" w:type="dxa"/>
           </w:tcPr>
           <w:p>
             <w:pPr>
@@ -3766,7 +3883,7 @@
       <w:tr>
         <w:tc>
           <w:tcPr>
-            <w:tcW w:type="dxa" w:w="1460"/>
+            <w:tcW w:w="1460" w:type="dxa"/>
           </w:tcPr>
           <w:p>
             <w:pPr>
@@ -3779,7 +3896,7 @@
         </w:tc>
         <w:tc>
           <w:tcPr>
-            <w:tcW w:type="dxa" w:w="1460"/>
+            <w:tcW w:w="1460" w:type="dxa"/>
           </w:tcPr>
           <w:p>
             <w:pPr>
@@ -3792,7 +3909,7 @@
         </w:tc>
         <w:tc>
           <w:tcPr>
-            <w:tcW w:type="dxa" w:w="1460"/>
+            <w:tcW w:w="1460" w:type="dxa"/>
           </w:tcPr>
           <w:p>
             <w:pPr>
@@ -3805,7 +3922,7 @@
         </w:tc>
         <w:tc>
           <w:tcPr>
-            <w:tcW w:type="dxa" w:w="1460"/>
+            <w:tcW w:w="1460" w:type="dxa"/>
           </w:tcPr>
           <w:p>
             <w:pPr>
@@ -3818,7 +3935,7 @@
         </w:tc>
         <w:tc>
           <w:tcPr>
-            <w:tcW w:type="dxa" w:w="1460"/>
+            <w:tcW w:w="1460" w:type="dxa"/>
           </w:tcPr>
           <w:p>
             <w:pPr>
@@ -3831,7 +3948,7 @@
         </w:tc>
         <w:tc>
           <w:tcPr>
-            <w:tcW w:type="dxa" w:w="1460"/>
+            <w:tcW w:w="1460" w:type="dxa"/>
           </w:tcPr>
           <w:p>
             <w:pPr>
@@ -3871,9 +3988,21 @@
     <w:p>
       <w:pPr>
         <w:pStyle w:val="PostHeadPara"/>
-      </w:pPr>
-      <w:r>
-        <w:t>A retriever's value in citation-critical domains lies partly in whether its evidence can be cited at all. Table 7 measures this. Because TreeRAG retains a page range at every node, TreeRAG-Beam both always produces a citation (availability 1.000) and cites the correct supporting sections most accurately (citation F1 = 0.757), the best of any system. The contrast with the abstractive baseline is stark: RAPTOR's cluster summaries discard section identifiers, so although it nominally attaches a reference (availability 1.000) its citation F1 is 0.000-it can point somewhere, but not to the right place. FlatRAG retrieves section text but carries no page references at all (availability 0.000). This axis is, by construction, one that flat and abstractive methods cannot satisfy, and it is the most robust advantage we observe for TreeRAG.</w:t>
+        <w:rPr>
+          <w:rFonts w:hint="eastAsia"/>
+          <w:lang w:eastAsia="ko-KR"/>
+        </w:rPr>
+      </w:pPr>
+      <w:r>
+        <w:t xml:space="preserve">A retriever's value in citation-critical domains lies partly in whether its evidence can be cited at all. Table 7 measures this. Because TreeRAG retains a page range at every node, TreeRAG-Beam both always produces a citation (availability 1.000) and cites the correct supporting sections most accurately (citation F1 = 0.757), the best of any system. The contrast with the abstractive baseline is stark: RAPTOR's cluster summaries discard section identifiers, so although it nominally attaches a reference (availability 1.000) its citation F1 is 0.000-it can point somewhere, but not to the right place. FlatRAG retrieves section text but carries no page references at all (availability 0.000). This axis is, by construction, one that flat and abstractive methods cannot satisfy, and it is the most robust advantage we observe for </w:t>
+      </w:r>
+      <w:proofErr w:type="spellStart"/>
+      <w:r>
+        <w:t>TreeRAG</w:t>
+      </w:r>
+      <w:proofErr w:type="spellEnd"/>
+      <w:r>
+        <w:t>.</w:t>
       </w:r>
     </w:p>
     <w:p>
@@ -3881,12 +4010,13 @@
         <w:pStyle w:val="TableCaption"/>
       </w:pPr>
       <w:r>
+        <w:lastRenderedPageBreak/>
         <w:t>Table 7: Citation traceability and accuracy (Full Benchmark, n = 40, fair protocol). TreeRAG-Beam attains the highest citation F1; RAPTOR loses section identifiers (F1 = 0.000) and FlatRAG carries no page references (availability = 0.000).</w:t>
       </w:r>
     </w:p>
     <w:tbl>
       <w:tblPr>
-        <w:tblW w:type="auto" w:w="0"/>
+        <w:tblW w:w="0" w:type="auto"/>
         <w:tblBorders>
           <w:top w:val="single" w:sz="4" w:space="0" w:color="999999"/>
           <w:left w:val="single" w:sz="4" w:space="0" w:color="999999"/>
@@ -3895,17 +4025,17 @@
           <w:insideH w:val="single" w:sz="4" w:space="0" w:color="999999"/>
           <w:insideV w:val="single" w:sz="4" w:space="0" w:color="999999"/>
         </w:tblBorders>
-        <w:tblLook w:firstColumn="1" w:firstRow="1" w:lastColumn="0" w:lastRow="0" w:noHBand="0" w:noVBand="1" w:val="04A0"/>
+        <w:tblLook w:val="04A0" w:firstRow="1" w:lastRow="0" w:firstColumn="1" w:lastColumn="0" w:noHBand="0" w:noVBand="1"/>
       </w:tblPr>
       <w:tblGrid>
-        <w:gridCol w:w="2920"/>
-        <w:gridCol w:w="2920"/>
-        <w:gridCol w:w="2920"/>
+        <w:gridCol w:w="2916"/>
+        <w:gridCol w:w="2917"/>
+        <w:gridCol w:w="2917"/>
       </w:tblGrid>
       <w:tr>
         <w:tc>
           <w:tcPr>
-            <w:tcW w:type="dxa" w:w="2920"/>
+            <w:tcW w:w="2920" w:type="dxa"/>
           </w:tcPr>
           <w:p>
             <w:pPr>
@@ -3921,7 +4051,7 @@
         </w:tc>
         <w:tc>
           <w:tcPr>
-            <w:tcW w:type="dxa" w:w="2920"/>
+            <w:tcW w:w="2920" w:type="dxa"/>
           </w:tcPr>
           <w:p>
             <w:pPr>
@@ -3937,7 +4067,7 @@
         </w:tc>
         <w:tc>
           <w:tcPr>
-            <w:tcW w:type="dxa" w:w="2920"/>
+            <w:tcW w:w="2920" w:type="dxa"/>
           </w:tcPr>
           <w:p>
             <w:pPr>
@@ -3955,7 +4085,7 @@
       <w:tr>
         <w:tc>
           <w:tcPr>
-            <w:tcW w:type="dxa" w:w="2920"/>
+            <w:tcW w:w="2920" w:type="dxa"/>
           </w:tcPr>
           <w:p>
             <w:pPr>
@@ -3968,7 +4098,7 @@
         </w:tc>
         <w:tc>
           <w:tcPr>
-            <w:tcW w:type="dxa" w:w="2920"/>
+            <w:tcW w:w="2920" w:type="dxa"/>
           </w:tcPr>
           <w:p>
             <w:pPr>
@@ -3981,7 +4111,7 @@
         </w:tc>
         <w:tc>
           <w:tcPr>
-            <w:tcW w:type="dxa" w:w="2920"/>
+            <w:tcW w:w="2920" w:type="dxa"/>
           </w:tcPr>
           <w:p>
             <w:pPr>
@@ -3996,7 +4126,7 @@
       <w:tr>
         <w:tc>
           <w:tcPr>
-            <w:tcW w:type="dxa" w:w="2920"/>
+            <w:tcW w:w="2920" w:type="dxa"/>
           </w:tcPr>
           <w:p>
             <w:pPr>
@@ -4009,7 +4139,7 @@
         </w:tc>
         <w:tc>
           <w:tcPr>
-            <w:tcW w:type="dxa" w:w="2920"/>
+            <w:tcW w:w="2920" w:type="dxa"/>
           </w:tcPr>
           <w:p>
             <w:pPr>
@@ -4022,7 +4152,7 @@
         </w:tc>
         <w:tc>
           <w:tcPr>
-            <w:tcW w:type="dxa" w:w="2920"/>
+            <w:tcW w:w="2920" w:type="dxa"/>
           </w:tcPr>
           <w:p>
             <w:pPr>
@@ -4037,7 +4167,7 @@
       <w:tr>
         <w:tc>
           <w:tcPr>
-            <w:tcW w:type="dxa" w:w="2920"/>
+            <w:tcW w:w="2920" w:type="dxa"/>
           </w:tcPr>
           <w:p>
             <w:pPr>
@@ -4050,7 +4180,7 @@
         </w:tc>
         <w:tc>
           <w:tcPr>
-            <w:tcW w:type="dxa" w:w="2920"/>
+            <w:tcW w:w="2920" w:type="dxa"/>
           </w:tcPr>
           <w:p>
             <w:pPr>
@@ -4063,7 +4193,7 @@
         </w:tc>
         <w:tc>
           <w:tcPr>
-            <w:tcW w:type="dxa" w:w="2920"/>
+            <w:tcW w:w="2920" w:type="dxa"/>
           </w:tcPr>
           <w:p>
             <w:pPr>
@@ -4078,7 +4208,7 @@
       <w:tr>
         <w:tc>
           <w:tcPr>
-            <w:tcW w:type="dxa" w:w="2920"/>
+            <w:tcW w:w="2920" w:type="dxa"/>
           </w:tcPr>
           <w:p>
             <w:pPr>
@@ -4091,7 +4221,7 @@
         </w:tc>
         <w:tc>
           <w:tcPr>
-            <w:tcW w:type="dxa" w:w="2920"/>
+            <w:tcW w:w="2920" w:type="dxa"/>
           </w:tcPr>
           <w:p>
             <w:pPr>
@@ -4104,7 +4234,7 @@
         </w:tc>
         <w:tc>
           <w:tcPr>
-            <w:tcW w:type="dxa" w:w="2920"/>
+            <w:tcW w:w="2920" w:type="dxa"/>
           </w:tcPr>
           <w:p>
             <w:pPr>
@@ -4119,7 +4249,7 @@
       <w:tr>
         <w:tc>
           <w:tcPr>
-            <w:tcW w:type="dxa" w:w="2920"/>
+            <w:tcW w:w="2920" w:type="dxa"/>
           </w:tcPr>
           <w:p>
             <w:pPr>
@@ -4132,7 +4262,7 @@
         </w:tc>
         <w:tc>
           <w:tcPr>
-            <w:tcW w:type="dxa" w:w="2920"/>
+            <w:tcW w:w="2920" w:type="dxa"/>
           </w:tcPr>
           <w:p>
             <w:pPr>
@@ -4145,7 +4275,7 @@
         </w:tc>
         <w:tc>
           <w:tcPr>
-            <w:tcW w:type="dxa" w:w="2920"/>
+            <w:tcW w:w="2920" w:type="dxa"/>
           </w:tcPr>
           <w:p>
             <w:pPr>
@@ -4160,7 +4290,7 @@
       <w:tr>
         <w:tc>
           <w:tcPr>
-            <w:tcW w:type="dxa" w:w="2920"/>
+            <w:tcW w:w="2920" w:type="dxa"/>
           </w:tcPr>
           <w:p>
             <w:pPr>
@@ -4173,7 +4303,7 @@
         </w:tc>
         <w:tc>
           <w:tcPr>
-            <w:tcW w:type="dxa" w:w="2920"/>
+            <w:tcW w:w="2920" w:type="dxa"/>
           </w:tcPr>
           <w:p>
             <w:pPr>
@@ -4186,7 +4316,7 @@
         </w:tc>
         <w:tc>
           <w:tcPr>
-            <w:tcW w:type="dxa" w:w="2920"/>
+            <w:tcW w:w="2920" w:type="dxa"/>
           </w:tcPr>
           <w:p>
             <w:pPr>
@@ -4225,7 +4355,7 @@
     </w:p>
     <w:tbl>
       <w:tblPr>
-        <w:tblW w:type="auto" w:w="0"/>
+        <w:tblW w:w="0" w:type="auto"/>
         <w:tblBorders>
           <w:top w:val="single" w:sz="4" w:space="0" w:color="999999"/>
           <w:left w:val="single" w:sz="4" w:space="0" w:color="999999"/>
@@ -4234,17 +4364,17 @@
           <w:insideH w:val="single" w:sz="4" w:space="0" w:color="999999"/>
           <w:insideV w:val="single" w:sz="4" w:space="0" w:color="999999"/>
         </w:tblBorders>
-        <w:tblLook w:firstColumn="1" w:firstRow="1" w:lastColumn="0" w:lastRow="0" w:noHBand="0" w:noVBand="1" w:val="04A0"/>
+        <w:tblLook w:val="04A0" w:firstRow="1" w:lastRow="0" w:firstColumn="1" w:lastColumn="0" w:noHBand="0" w:noVBand="1"/>
       </w:tblPr>
       <w:tblGrid>
-        <w:gridCol w:w="2920"/>
-        <w:gridCol w:w="2920"/>
-        <w:gridCol w:w="2920"/>
+        <w:gridCol w:w="2917"/>
+        <w:gridCol w:w="2917"/>
+        <w:gridCol w:w="2916"/>
       </w:tblGrid>
       <w:tr>
         <w:tc>
           <w:tcPr>
-            <w:tcW w:type="dxa" w:w="2920"/>
+            <w:tcW w:w="2920" w:type="dxa"/>
           </w:tcPr>
           <w:p>
             <w:pPr>
@@ -4260,7 +4390,7 @@
         </w:tc>
         <w:tc>
           <w:tcPr>
-            <w:tcW w:type="dxa" w:w="2920"/>
+            <w:tcW w:w="2920" w:type="dxa"/>
           </w:tcPr>
           <w:p>
             <w:pPr>
@@ -4276,7 +4406,7 @@
         </w:tc>
         <w:tc>
           <w:tcPr>
-            <w:tcW w:type="dxa" w:w="2920"/>
+            <w:tcW w:w="2920" w:type="dxa"/>
           </w:tcPr>
           <w:p>
             <w:pPr>
@@ -4294,7 +4424,7 @@
       <w:tr>
         <w:tc>
           <w:tcPr>
-            <w:tcW w:type="dxa" w:w="2920"/>
+            <w:tcW w:w="2920" w:type="dxa"/>
           </w:tcPr>
           <w:p>
             <w:pPr>
@@ -4307,7 +4437,7 @@
         </w:tc>
         <w:tc>
           <w:tcPr>
-            <w:tcW w:type="dxa" w:w="2920"/>
+            <w:tcW w:w="2920" w:type="dxa"/>
           </w:tcPr>
           <w:p>
             <w:pPr>
@@ -4320,7 +4450,7 @@
         </w:tc>
         <w:tc>
           <w:tcPr>
-            <w:tcW w:type="dxa" w:w="2920"/>
+            <w:tcW w:w="2920" w:type="dxa"/>
           </w:tcPr>
           <w:p>
             <w:pPr>
@@ -4335,7 +4465,7 @@
       <w:tr>
         <w:tc>
           <w:tcPr>
-            <w:tcW w:type="dxa" w:w="2920"/>
+            <w:tcW w:w="2920" w:type="dxa"/>
           </w:tcPr>
           <w:p>
             <w:pPr>
@@ -4348,7 +4478,7 @@
         </w:tc>
         <w:tc>
           <w:tcPr>
-            <w:tcW w:type="dxa" w:w="2920"/>
+            <w:tcW w:w="2920" w:type="dxa"/>
           </w:tcPr>
           <w:p>
             <w:pPr>
@@ -4361,7 +4491,7 @@
         </w:tc>
         <w:tc>
           <w:tcPr>
-            <w:tcW w:type="dxa" w:w="2920"/>
+            <w:tcW w:w="2920" w:type="dxa"/>
           </w:tcPr>
           <w:p>
             <w:pPr>
@@ -4376,7 +4506,7 @@
       <w:tr>
         <w:tc>
           <w:tcPr>
-            <w:tcW w:type="dxa" w:w="2920"/>
+            <w:tcW w:w="2920" w:type="dxa"/>
           </w:tcPr>
           <w:p>
             <w:pPr>
@@ -4389,7 +4519,7 @@
         </w:tc>
         <w:tc>
           <w:tcPr>
-            <w:tcW w:type="dxa" w:w="2920"/>
+            <w:tcW w:w="2920" w:type="dxa"/>
           </w:tcPr>
           <w:p>
             <w:pPr>
@@ -4402,7 +4532,7 @@
         </w:tc>
         <w:tc>
           <w:tcPr>
-            <w:tcW w:type="dxa" w:w="2920"/>
+            <w:tcW w:w="2920" w:type="dxa"/>
           </w:tcPr>
           <w:p>
             <w:pPr>
@@ -4417,7 +4547,7 @@
       <w:tr>
         <w:tc>
           <w:tcPr>
-            <w:tcW w:type="dxa" w:w="2920"/>
+            <w:tcW w:w="2920" w:type="dxa"/>
           </w:tcPr>
           <w:p>
             <w:pPr>
@@ -4430,7 +4560,7 @@
         </w:tc>
         <w:tc>
           <w:tcPr>
-            <w:tcW w:type="dxa" w:w="2920"/>
+            <w:tcW w:w="2920" w:type="dxa"/>
           </w:tcPr>
           <w:p>
             <w:pPr>
@@ -4443,7 +4573,7 @@
         </w:tc>
         <w:tc>
           <w:tcPr>
-            <w:tcW w:type="dxa" w:w="2920"/>
+            <w:tcW w:w="2920" w:type="dxa"/>
           </w:tcPr>
           <w:p>
             <w:pPr>
@@ -4458,7 +4588,7 @@
       <w:tr>
         <w:tc>
           <w:tcPr>
-            <w:tcW w:type="dxa" w:w="2920"/>
+            <w:tcW w:w="2920" w:type="dxa"/>
           </w:tcPr>
           <w:p>
             <w:pPr>
@@ -4471,7 +4601,7 @@
         </w:tc>
         <w:tc>
           <w:tcPr>
-            <w:tcW w:type="dxa" w:w="2920"/>
+            <w:tcW w:w="2920" w:type="dxa"/>
           </w:tcPr>
           <w:p>
             <w:pPr>
@@ -4484,7 +4614,7 @@
         </w:tc>
         <w:tc>
           <w:tcPr>
-            <w:tcW w:type="dxa" w:w="2920"/>
+            <w:tcW w:w="2920" w:type="dxa"/>
           </w:tcPr>
           <w:p>
             <w:pPr>
@@ -4499,7 +4629,7 @@
       <w:tr>
         <w:tc>
           <w:tcPr>
-            <w:tcW w:type="dxa" w:w="2920"/>
+            <w:tcW w:w="2920" w:type="dxa"/>
           </w:tcPr>
           <w:p>
             <w:pPr>
@@ -4512,7 +4642,7 @@
         </w:tc>
         <w:tc>
           <w:tcPr>
-            <w:tcW w:type="dxa" w:w="2920"/>
+            <w:tcW w:w="2920" w:type="dxa"/>
           </w:tcPr>
           <w:p>
             <w:pPr>
@@ -4525,7 +4655,7 @@
         </w:tc>
         <w:tc>
           <w:tcPr>
-            <w:tcW w:type="dxa" w:w="2920"/>
+            <w:tcW w:w="2920" w:type="dxa"/>
           </w:tcPr>
           <w:p>
             <w:pPr>
@@ -4548,7 +4678,7 @@
     </w:p>
     <w:tbl>
       <w:tblPr>
-        <w:tblW w:type="auto" w:w="0"/>
+        <w:tblW w:w="0" w:type="auto"/>
         <w:tblBorders>
           <w:top w:val="single" w:sz="4" w:space="0" w:color="999999"/>
           <w:left w:val="single" w:sz="4" w:space="0" w:color="999999"/>
@@ -4557,17 +4687,17 @@
           <w:insideH w:val="single" w:sz="4" w:space="0" w:color="999999"/>
           <w:insideV w:val="single" w:sz="4" w:space="0" w:color="999999"/>
         </w:tblBorders>
-        <w:tblLook w:firstColumn="1" w:firstRow="1" w:lastColumn="0" w:lastRow="0" w:noHBand="0" w:noVBand="1" w:val="04A0"/>
+        <w:tblLook w:val="04A0" w:firstRow="1" w:lastRow="0" w:firstColumn="1" w:lastColumn="0" w:noHBand="0" w:noVBand="1"/>
       </w:tblPr>
       <w:tblGrid>
-        <w:gridCol w:w="2920"/>
-        <w:gridCol w:w="2920"/>
-        <w:gridCol w:w="2920"/>
+        <w:gridCol w:w="2917"/>
+        <w:gridCol w:w="2916"/>
+        <w:gridCol w:w="2917"/>
       </w:tblGrid>
       <w:tr>
         <w:tc>
           <w:tcPr>
-            <w:tcW w:type="dxa" w:w="2920"/>
+            <w:tcW w:w="2920" w:type="dxa"/>
           </w:tcPr>
           <w:p>
             <w:pPr>
@@ -4583,7 +4713,7 @@
         </w:tc>
         <w:tc>
           <w:tcPr>
-            <w:tcW w:type="dxa" w:w="2920"/>
+            <w:tcW w:w="2920" w:type="dxa"/>
           </w:tcPr>
           <w:p>
             <w:pPr>
@@ -4599,7 +4729,7 @@
         </w:tc>
         <w:tc>
           <w:tcPr>
-            <w:tcW w:type="dxa" w:w="2920"/>
+            <w:tcW w:w="2920" w:type="dxa"/>
           </w:tcPr>
           <w:p>
             <w:pPr>
@@ -4617,7 +4747,7 @@
       <w:tr>
         <w:tc>
           <w:tcPr>
-            <w:tcW w:type="dxa" w:w="2920"/>
+            <w:tcW w:w="2920" w:type="dxa"/>
           </w:tcPr>
           <w:p>
             <w:pPr>
@@ -4630,7 +4760,7 @@
         </w:tc>
         <w:tc>
           <w:tcPr>
-            <w:tcW w:type="dxa" w:w="2920"/>
+            <w:tcW w:w="2920" w:type="dxa"/>
           </w:tcPr>
           <w:p>
             <w:pPr>
@@ -4643,7 +4773,7 @@
         </w:tc>
         <w:tc>
           <w:tcPr>
-            <w:tcW w:type="dxa" w:w="2920"/>
+            <w:tcW w:w="2920" w:type="dxa"/>
           </w:tcPr>
           <w:p>
             <w:pPr>
@@ -4658,7 +4788,7 @@
       <w:tr>
         <w:tc>
           <w:tcPr>
-            <w:tcW w:type="dxa" w:w="2920"/>
+            <w:tcW w:w="2920" w:type="dxa"/>
           </w:tcPr>
           <w:p>
             <w:pPr>
@@ -4671,7 +4801,7 @@
         </w:tc>
         <w:tc>
           <w:tcPr>
-            <w:tcW w:type="dxa" w:w="2920"/>
+            <w:tcW w:w="2920" w:type="dxa"/>
           </w:tcPr>
           <w:p>
             <w:pPr>
@@ -4684,7 +4814,7 @@
         </w:tc>
         <w:tc>
           <w:tcPr>
-            <w:tcW w:type="dxa" w:w="2920"/>
+            <w:tcW w:w="2920" w:type="dxa"/>
           </w:tcPr>
           <w:p>
             <w:pPr>
@@ -4699,7 +4829,7 @@
       <w:tr>
         <w:tc>
           <w:tcPr>
-            <w:tcW w:type="dxa" w:w="2920"/>
+            <w:tcW w:w="2920" w:type="dxa"/>
           </w:tcPr>
           <w:p>
             <w:pPr>
@@ -4712,7 +4842,7 @@
         </w:tc>
         <w:tc>
           <w:tcPr>
-            <w:tcW w:type="dxa" w:w="2920"/>
+            <w:tcW w:w="2920" w:type="dxa"/>
           </w:tcPr>
           <w:p>
             <w:pPr>
@@ -4725,7 +4855,7 @@
         </w:tc>
         <w:tc>
           <w:tcPr>
-            <w:tcW w:type="dxa" w:w="2920"/>
+            <w:tcW w:w="2920" w:type="dxa"/>
           </w:tcPr>
           <w:p>
             <w:pPr>
@@ -4759,7 +4889,11 @@
         <w:pStyle w:val="PostHeadPara"/>
       </w:pPr>
       <w:r>
-        <w:t>Our results draw a sharp line between two kinds of benefit that hierarchical retrieval is often assumed to deliver together. The first-page-level provenance and a compact, structurally coherent context-is real and survives fair evaluation: TreeRAG-Beam cites the right sections most accurately (Table 7) and reaches the highest judged quality on an order of magnitude fewer context tokens (Table 6). These follow directly from the representation: each node carries a page range, and selecting a relevant subtree yields a small, on-topic context rather than a scattering of chunks. The second supposed benefit-higher lexical overlap with reference answers-does not survive: once every system generates fluent text with the same LLM, the section boundary confers no advantage in n-gram overlap, and a hybrid flat retriever (FlatRAG) actually scores higher on ROUGE-L. In short, structure buys verifiability and efficiency, not surface-string similarity, and earlier hierarchical-RAG results that claimed large ROUGE-L gains likely measured an evaluation artifact rather than a retrieval improvement.</w:t>
+        <w:t xml:space="preserve">Our results draw a sharp line between two kinds of benefit that hierarchical retrieval is often assumed to deliver together. The first-page-level provenance and a compact, structurally coherent context-is real and survives fair evaluation: TreeRAG-Beam cites the right sections most accurately (Table 7) and reaches the highest judged quality on an order of </w:t>
+      </w:r>
+      <w:r>
+        <w:lastRenderedPageBreak/>
+        <w:t>magnitude fewer context tokens (Table 6). These follow directly from the representation: each node carries a page range, and selecting a relevant subtree yields a small, on-topic context rather than a scattering of chunks. The second supposed benefit-higher lexical overlap with reference answers-does not survive: once every system generates fluent text with the same LLM, the section boundary confers no advantage in n-gram overlap, and a hybrid flat retriever (FlatRAG) actually scores higher on ROUGE-L. In short, structure buys verifiability and efficiency, not surface-string similarity, and earlier hierarchical-RAG results that claimed large ROUGE-L gains likely measured an evaluation artifact rather than a retrieval improvement.</w:t>
       </w:r>
     </w:p>
     <w:p>
@@ -4823,7 +4957,11 @@
         <w:pStyle w:val="PostHeadPara"/>
       </w:pPr>
       <w:r>
-        <w:t>Because TreeRAG preserves page-level provenance, it is well suited to high-stakes domains-medicine, law, and regulatory compliance-where unsupported claims carry real cost and every assertion must be traceable to a source span. The same property aids auditing and post-hoc verification. Conversely, the system inherits the biases of its underlying LLM during indexing and generation, and the lightweight hallucination detector reduces but does not eliminate unfaithful output; deployments in sensitive settings should retain a human-in-the-loop for final decisions.</w:t>
+        <w:t xml:space="preserve">Because TreeRAG preserves page-level provenance, it is well suited to high-stakes domains-medicine, law, and regulatory compliance-where unsupported claims carry real cost and every assertion must be traceable to a source span. The same property aids auditing and post-hoc verification. Conversely, the system inherits the biases of its underlying LLM during </w:t>
+      </w:r>
+      <w:r>
+        <w:lastRenderedPageBreak/>
+        <w:t>indexing and generation, and the lightweight hallucination detector reduces but does not eliminate unfaithful output; deployments in sensitive settings should retain a human-in-the-loop for final decisions.</w:t>
       </w:r>
     </w:p>
     <w:p>
@@ -4869,6 +5007,10 @@
     <w:p>
       <w:pPr>
         <w:pStyle w:val="Bibentry"/>
+        <w:numPr>
+          <w:ilvl w:val="0"/>
+          <w:numId w:val="0"/>
+        </w:numPr>
       </w:pPr>
       <w:r>
         <w:t>[1] Akari Asai, Zeqiu Wu, Yizhong Wang, Avirup Sil, and Hannaneh Hajishirzi. 2024. Self-RAG: Learning to Retrieve, Generate, and Critique through Self-Reflection. In Proc. ICLR 2024. arXiv:2310.11511.</w:t>
@@ -4877,6 +5019,10 @@
     <w:p>
       <w:pPr>
         <w:pStyle w:val="Bibentry"/>
+        <w:numPr>
+          <w:ilvl w:val="0"/>
+          <w:numId w:val="0"/>
+        </w:numPr>
       </w:pPr>
       <w:r>
         <w:t>[2] Tom B. Brown et al. 2020. Language Models are Few-Shot Learners. In Advances in Neural Information Processing Systems 33 (NeurIPS 2020), 1877-1901. arXiv:2005.14165.</w:t>
@@ -4885,6 +5031,10 @@
     <w:p>
       <w:pPr>
         <w:pStyle w:val="Bibentry"/>
+        <w:numPr>
+          <w:ilvl w:val="0"/>
+          <w:numId w:val="0"/>
+        </w:numPr>
       </w:pPr>
       <w:r>
         <w:t>[3] Darren Edge, Ha Trinh, Newman Cheng, Joshua Bradley, Alex Chao, Apurva Mody, Steven Truitt, Dasha Metropolitansky, Robert Osazuwa Ness, and Jonathan Larson. 2025. From Local to Global: A GraphRAG Approach to Query-Focused Summarization. arXiv:2404.16130.</w:t>
@@ -4893,6 +5043,10 @@
     <w:p>
       <w:pPr>
         <w:pStyle w:val="Bibentry"/>
+        <w:numPr>
+          <w:ilvl w:val="0"/>
+          <w:numId w:val="0"/>
+        </w:numPr>
       </w:pPr>
       <w:r>
         <w:t>[4] Shahul Es, Jithin James, Luis Espinosa-Anke, and Steven Schockaert. 2023. RAGAS: Automated Evaluation of Retrieval Augmented Generation. arXiv:2309.15217.</w:t>
@@ -4901,6 +5055,10 @@
     <w:p>
       <w:pPr>
         <w:pStyle w:val="Bibentry"/>
+        <w:numPr>
+          <w:ilvl w:val="0"/>
+          <w:numId w:val="0"/>
+        </w:numPr>
       </w:pPr>
       <w:r>
         <w:t>[5] Thibault Formal, Benjamin Piwowarski, and Stephane Clinchant. 2021. SPLADE: Sparse Lexical and Expansion Model for First Stage Ranking. In Proc. SIGIR 2021, 2288-2292. https://doi.org/10.1145/3404835.3463098.</w:t>
@@ -4909,6 +5067,10 @@
     <w:p>
       <w:pPr>
         <w:pStyle w:val="Bibentry"/>
+        <w:numPr>
+          <w:ilvl w:val="0"/>
+          <w:numId w:val="0"/>
+        </w:numPr>
       </w:pPr>
       <w:r>
         <w:t>[6] Thibault Formal, Stephane Clinchant, Herve Dejean, and Carlos Lassance. 2024. SPLATE: Sparse Late Interaction Retrieval. In Proc. SIGIR 2024. arXiv:2404.13950.</w:t>
@@ -4917,6 +5079,10 @@
     <w:p>
       <w:pPr>
         <w:pStyle w:val="Bibentry"/>
+        <w:numPr>
+          <w:ilvl w:val="0"/>
+          <w:numId w:val="0"/>
+        </w:numPr>
       </w:pPr>
       <w:r>
         <w:t>[7] Yunfan Gao, Yun Xiong, Xinyu Gao, Kangxiang Jia, Jinliu Pan, Yuxi Bi, Yi Dai, Jiawei Sun, Meng Wang, and Haofen Wang. 2024. Retrieval-Augmented Generation for Large Language Models: A Survey. arXiv:2312.10997.</w:t>
@@ -4925,6 +5091,10 @@
     <w:p>
       <w:pPr>
         <w:pStyle w:val="Bibentry"/>
+        <w:numPr>
+          <w:ilvl w:val="0"/>
+          <w:numId w:val="0"/>
+        </w:numPr>
       </w:pPr>
       <w:r>
         <w:t>[8] Shailja Gupta, Rajesh Ranjan, and Surya Narayan Singh. 2024. A Comprehensive Survey of Retrieval-Augmented Generation (RAG): Evolution, Current Landscape and Future Directions. arXiv:2410.12837.</w:t>
@@ -4933,6 +5103,10 @@
     <w:p>
       <w:pPr>
         <w:pStyle w:val="Bibentry"/>
+        <w:numPr>
+          <w:ilvl w:val="0"/>
+          <w:numId w:val="0"/>
+        </w:numPr>
       </w:pPr>
       <w:r>
         <w:t>[9] Lei Huang et al. 2025. A Survey on Hallucination in Large Language Models: Principles, Taxonomy, Challenges, and Open Questions. ACM Trans. Inf. Syst. 43, 2, Article 42. https://doi.org/10.1145/3703155.</w:t>
@@ -4941,14 +5115,26 @@
     <w:p>
       <w:pPr>
         <w:pStyle w:val="Bibentry"/>
-      </w:pPr>
-      <w:r>
-        <w:t>[10] Haoyu Huang, Yongfeng Huang, Junjie Yang, Zhenyu Pan, Yongqiang Chen, Kaili Ma, Hongzhi Chen, and James Cheng. 2025. Retrieval-Augmented Generation with Hierarchical Knowledge. arXiv:2503.10150.</w:t>
+        <w:numPr>
+          <w:ilvl w:val="0"/>
+          <w:numId w:val="0"/>
+        </w:numPr>
+      </w:pPr>
+      <w:r>
+        <w:t xml:space="preserve">[10] Haoyu Huang, Yongfeng Huang, Junjie Yang, Zhenyu Pan, Yongqiang Chen, Kaili Ma, Hongzhi Chen, and James Cheng. 2025. Retrieval-Augmented </w:t>
+      </w:r>
+      <w:r>
+        <w:lastRenderedPageBreak/>
+        <w:t>Generation with Hierarchical Knowledge. arXiv:2503.10150.</w:t>
       </w:r>
     </w:p>
     <w:p>
       <w:pPr>
         <w:pStyle w:val="Bibentry"/>
+        <w:numPr>
+          <w:ilvl w:val="0"/>
+          <w:numId w:val="0"/>
+        </w:numPr>
       </w:pPr>
       <w:r>
         <w:t>[11] Huiqiang Jiang, Qianhui Wu, Chin-Yew Lin, Yuqing Yang, and Lili Qiu. 2023. LLMLingua: Compressing Prompts for Accelerated Inference of Large Language Models. In Proc. EMNLP 2023, 13358-13376. arXiv:2310.05736.</w:t>
@@ -4957,6 +5143,10 @@
     <w:p>
       <w:pPr>
         <w:pStyle w:val="Bibentry"/>
+        <w:numPr>
+          <w:ilvl w:val="0"/>
+          <w:numId w:val="0"/>
+        </w:numPr>
       </w:pPr>
       <w:r>
         <w:t>[12] Jeff Johnson, Matthijs Douze, and Herve Jegou. 2019. Billion-scale Similarity Search with GPUs. IEEE Trans. Big Data 7, 3, 535-547. arXiv:1702.08734.</w:t>
@@ -4965,6 +5155,10 @@
     <w:p>
       <w:pPr>
         <w:pStyle w:val="Bibentry"/>
+        <w:numPr>
+          <w:ilvl w:val="0"/>
+          <w:numId w:val="0"/>
+        </w:numPr>
       </w:pPr>
       <w:r>
         <w:t>[13] Vladimir Karpukhin, Barlas Oguz, Sewon Min, Patrick Lewis, Ledell Wu, Sergey Edunov, Danqi Chen, and Wen-tau Yih. 2020. Dense Passage Retrieval for Open-Domain Question Answering. In Proc. EMNLP 2020, 6769-6781.</w:t>
@@ -4973,6 +5167,10 @@
     <w:p>
       <w:pPr>
         <w:pStyle w:val="Bibentry"/>
+        <w:numPr>
+          <w:ilvl w:val="0"/>
+          <w:numId w:val="0"/>
+        </w:numPr>
       </w:pPr>
       <w:r>
         <w:t>[14] Omar Khattab and Matei Zaharia. 2020. ColBERT: Efficient and Effective Passage Search via Contextualized Late Interaction over BERT. In Proc. SIGIR 2020, 39-48. https://doi.org/10.1145/3397271.3401075.</w:t>
@@ -4981,6 +5179,10 @@
     <w:p>
       <w:pPr>
         <w:pStyle w:val="Bibentry"/>
+        <w:numPr>
+          <w:ilvl w:val="0"/>
+          <w:numId w:val="0"/>
+        </w:numPr>
       </w:pPr>
       <w:r>
         <w:t>[15] Omar Khattab, Arnav Singhvi, Paridhi Maheshwari, Zhiyuan Zhang, Keshav Santhanam, Sri Vardhamanan, Saiful Haq, Ashutosh Sharma, Thomas T. Joshi, Hanna Moazam, Heather Miller, Matei Zaharia, and Christopher Potts. 2024. DSPy: Compiling Declarative Language Model Calls into Self-Improving Pipelines. In Proc. ICLR 2024. arXiv:2310.03714.</w:t>
@@ -4989,6 +5191,10 @@
     <w:p>
       <w:pPr>
         <w:pStyle w:val="Bibentry"/>
+        <w:numPr>
+          <w:ilvl w:val="0"/>
+          <w:numId w:val="0"/>
+        </w:numPr>
       </w:pPr>
       <w:r>
         <w:t>[16] Takeshi Kojima, Shixiang Shane Gu, Machel Reid, Yutaka Matsuo, and Yusuke Iwasawa. 2022. Large Language Models are Zero-Shot Reasoners. In Advances in Neural Information Processing Systems 35 (NeurIPS 2022). arXiv:2205.11916.</w:t>
@@ -4997,6 +5203,10 @@
     <w:p>
       <w:pPr>
         <w:pStyle w:val="Bibentry"/>
+        <w:numPr>
+          <w:ilvl w:val="0"/>
+          <w:numId w:val="0"/>
+        </w:numPr>
       </w:pPr>
       <w:r>
         <w:t>[17] Wojciech Kryscinski, Bryan McCann, Caiming Xiong, and Richard Socher. 2020. Evaluating the Factual Consistency of Abstractive Text Summarization. In Proc. EMNLP 2020, 9332-9346. arXiv:1910.12840.</w:t>
@@ -5005,6 +5215,10 @@
     <w:p>
       <w:pPr>
         <w:pStyle w:val="Bibentry"/>
+        <w:numPr>
+          <w:ilvl w:val="0"/>
+          <w:numId w:val="0"/>
+        </w:numPr>
       </w:pPr>
       <w:r>
         <w:t>[18] Woosuk Kwon, Zhuohan Li, Siyuan Zhuang, Ying Sheng, Lianmin Zheng, Cody Hao Yu, Joseph E. Gonzalez, Hao Zhang, and Ion Stoica. 2023. Efficient Memory Management for Large Language Model Serving with PagedAttention. In Proc. SOSP 2023, 611-626. https://doi.org/10.1145/3600006.3613165.</w:t>
@@ -5013,6 +5227,10 @@
     <w:p>
       <w:pPr>
         <w:pStyle w:val="Bibentry"/>
+        <w:numPr>
+          <w:ilvl w:val="0"/>
+          <w:numId w:val="0"/>
+        </w:numPr>
       </w:pPr>
       <w:r>
         <w:t>[19] Patrick Lewis et al. 2020. Retrieval-Augmented Generation for Knowledge-Intensive NLP Tasks. In Advances in Neural Information Processing Systems 33 (NeurIPS 2020), 9459-9474. arXiv:2005.11401.</w:t>
@@ -5021,6 +5239,10 @@
     <w:p>
       <w:pPr>
         <w:pStyle w:val="Bibentry"/>
+        <w:numPr>
+          <w:ilvl w:val="0"/>
+          <w:numId w:val="0"/>
+        </w:numPr>
       </w:pPr>
       <w:r>
         <w:t>[20] Chin-Yew Lin. 2004. ROUGE: A Package for Automatic Evaluation of Summaries. In Proc. ACL Workshop on Text Summarization Branches Out, 74-81.</w:t>
@@ -5029,6 +5251,10 @@
     <w:p>
       <w:pPr>
         <w:pStyle w:val="Bibentry"/>
+        <w:numPr>
+          <w:ilvl w:val="0"/>
+          <w:numId w:val="0"/>
+        </w:numPr>
       </w:pPr>
       <w:r>
         <w:t>[21] Jerry Liu. 2022. LlamaIndex. GitHub. https://github.com/run-llama/llama_index.</w:t>
@@ -5037,6 +5263,10 @@
     <w:p>
       <w:pPr>
         <w:pStyle w:val="Bibentry"/>
+        <w:numPr>
+          <w:ilvl w:val="0"/>
+          <w:numId w:val="0"/>
+        </w:numPr>
       </w:pPr>
       <w:r>
         <w:t>[22] Nelson F. Liu, Kevin Lin, John Hewitt, Ashwin Paranjape, Michele Bevilacqua, Fabio Petroni, and Percy Liang. 2024. Lost in the Middle: How Language Models Use Long Contexts. Trans. Assoc. Comput. Linguist. 12, 157-173. arXiv:2307.03172.</w:t>
@@ -5045,6 +5275,10 @@
     <w:p>
       <w:pPr>
         <w:pStyle w:val="Bibentry"/>
+        <w:numPr>
+          <w:ilvl w:val="0"/>
+          <w:numId w:val="0"/>
+        </w:numPr>
       </w:pPr>
       <w:r>
         <w:t>[23] Xueguang Ma, Ruqing Sun, Ronak Pradeep, and Jimmy Lin. 2021. A Replication Study of Dense Passage Retrieval for Open-Domain Question Answering. arXiv:2104.05740.</w:t>
@@ -5053,6 +5287,10 @@
     <w:p>
       <w:pPr>
         <w:pStyle w:val="Bibentry"/>
+        <w:numPr>
+          <w:ilvl w:val="0"/>
+          <w:numId w:val="0"/>
+        </w:numPr>
       </w:pPr>
       <w:r>
         <w:t>[24] Ben Malin, Tatiana Kalganova, and Nikolaos Boulgouris. 2025. A Review of Faithfulness Metrics for Hallucination Assessment in Large Language Models. arXiv:2501.00269.</w:t>
@@ -5061,6 +5299,10 @@
     <w:p>
       <w:pPr>
         <w:pStyle w:val="Bibentry"/>
+        <w:numPr>
+          <w:ilvl w:val="0"/>
+          <w:numId w:val="0"/>
+        </w:numPr>
       </w:pPr>
       <w:r>
         <w:t>[25] Sewon Min, Kalpesh Krishna, Xinxi Lyu, Mike Lewis, Wen-tau Yih, Pang Wei Koh, Mohit Iyyer, Luke Zettlemoyer, and Hannaneh Hajishirzi. 2023. FActScore: Fine-grained Atomic Evaluation of Factual Precision in Long Form Text Generation. In Proc. EMNLP 2023. arXiv:2305.14251.</w:t>
@@ -5069,6 +5311,10 @@
     <w:p>
       <w:pPr>
         <w:pStyle w:val="Bibentry"/>
+        <w:numPr>
+          <w:ilvl w:val="0"/>
+          <w:numId w:val="0"/>
+        </w:numPr>
       </w:pPr>
       <w:r>
         <w:t>[26] Feng Nan, Ramesh Nallapati, Zhiguo Wang, Cicero Nogueira dos Santos, Henghui Zhu, Dejiao Zhang, Kathleen McKeown, and Bing Xiang. 2021. Entity-level Factual Consistency of Abstractive Text Summarization. In Proc. EACL 2021, 2727-2733. arXiv:2102.09130.</w:t>
@@ -5077,6 +5323,10 @@
     <w:p>
       <w:pPr>
         <w:pStyle w:val="Bibentry"/>
+        <w:numPr>
+          <w:ilvl w:val="0"/>
+          <w:numId w:val="0"/>
+        </w:numPr>
       </w:pPr>
       <w:r>
         <w:t>[27] Nils Reimers and Iryna Gurevych. 2019. Sentence-BERT: Sentence Embeddings using Siamese BERT-Networks. In Proc. EMNLP 2019, 3982-3992. arXiv:1908.10084.</w:t>
@@ -5085,6 +5335,10 @@
     <w:p>
       <w:pPr>
         <w:pStyle w:val="Bibentry"/>
+        <w:numPr>
+          <w:ilvl w:val="0"/>
+          <w:numId w:val="0"/>
+        </w:numPr>
       </w:pPr>
       <w:r>
         <w:t>[28] Stephen Robertson and Hugo Zaragoza. 2009. The Probabilistic Relevance Framework: BM25 and Beyond. Found. Trends Inf. Retr. 3, 4, 333-389.</w:t>
@@ -5093,6 +5347,10 @@
     <w:p>
       <w:pPr>
         <w:pStyle w:val="Bibentry"/>
+        <w:numPr>
+          <w:ilvl w:val="0"/>
+          <w:numId w:val="0"/>
+        </w:numPr>
       </w:pPr>
       <w:r>
         <w:t>[29] Keshav Santhanam, Omar Khattab, Jon Saad-Falcon, Christopher Potts, and Matei Zaharia. 2022. ColBERTv2: Effective and Efficient Retrieval via Lightweight Late Interaction. In Proc. NAACL-HLT 2022, 3715-3734. arXiv:2112.01488.</w:t>
@@ -5101,6 +5359,10 @@
     <w:p>
       <w:pPr>
         <w:pStyle w:val="Bibentry"/>
+        <w:numPr>
+          <w:ilvl w:val="0"/>
+          <w:numId w:val="0"/>
+        </w:numPr>
       </w:pPr>
       <w:r>
         <w:t>[30] Parth Sarthi, Salman Abdullah, Aditi Tuli, Shubh Khanna, Anna Goldie, and Christopher D. Manning. 2024. RAPTOR: Recursive Abstractive Processing for Tree-Organized Retrieval. In Proc. ICLR 2024. arXiv:2401.18059.</w:t>
@@ -5109,6 +5371,10 @@
     <w:p>
       <w:pPr>
         <w:pStyle w:val="Bibentry"/>
+        <w:numPr>
+          <w:ilvl w:val="0"/>
+          <w:numId w:val="0"/>
+        </w:numPr>
       </w:pPr>
       <w:r>
         <w:t>[31] Kurt Shuster, Spencer Poff, Moya Chen, Douwe Kiela, and Jason Weston. 2021. Retrieval Augmentation Reduces Hallucination in Conversation. In Findings of EMNLP 2021, 3784-3803. arXiv:2104.07567.</w:t>
@@ -5117,6 +5383,10 @@
     <w:p>
       <w:pPr>
         <w:pStyle w:val="Bibentry"/>
+        <w:numPr>
+          <w:ilvl w:val="0"/>
+          <w:numId w:val="0"/>
+        </w:numPr>
       </w:pPr>
       <w:r>
         <w:t>[32] Harsh Trivedi, Niranjan Balasubramanian, Tushar Khot, and Ashish Sabharwal. 2023. Interleaving Retrieval with Chain-of-Thought Reasoning for Knowledge-Intensive Multi-Step Questions. In Proc. ACL 2023, 10014-10037. arXiv:2212.10509.</w:t>
@@ -5125,6 +5395,10 @@
     <w:p>
       <w:pPr>
         <w:pStyle w:val="Bibentry"/>
+        <w:numPr>
+          <w:ilvl w:val="0"/>
+          <w:numId w:val="0"/>
+        </w:numPr>
       </w:pPr>
       <w:r>
         <w:t>[33] Vectify AI. 2023. PageIndex: Reasoning-Based, Vectorless RAG via Document Tree Search. GitHub. https://github.com/VectifyAI/PageIndex.</w:t>
@@ -5133,6 +5407,10 @@
     <w:p>
       <w:pPr>
         <w:pStyle w:val="Bibentry"/>
+        <w:numPr>
+          <w:ilvl w:val="0"/>
+          <w:numId w:val="0"/>
+        </w:numPr>
       </w:pPr>
       <w:r>
         <w:t>[34] Jason Wei, Xuezhi Wang, Dale Schuurmans, Maarten Bosma, Brian Ichter, Fei Xia, Ed Chi, Quoc Le, and Denny Zhou. 2022. Chain-of-Thought Prompting Elicits Reasoning in Large Language Models. In Advances in Neural Information Processing Systems 35 (NeurIPS 2022). arXiv:2201.11903.</w:t>
@@ -5141,6 +5419,10 @@
     <w:p>
       <w:pPr>
         <w:pStyle w:val="Bibentry"/>
+        <w:numPr>
+          <w:ilvl w:val="0"/>
+          <w:numId w:val="0"/>
+        </w:numPr>
       </w:pPr>
       <w:r>
         <w:t>[35] Zhilin Yang, Peng Qi, Saizheng Zhang, Yoshua Bengio, William Cohen, Ruslan Salakhutdinov, and Christopher D. Manning. 2018. HotpotQA: A Dataset for Diverse, Explainable Multi-hop Question Answering. In Proc. EMNLP 2018, 2369-2380. arXiv:1809.09600.</w:t>
@@ -5149,6 +5431,10 @@
     <w:p>
       <w:pPr>
         <w:pStyle w:val="Bibentry"/>
+        <w:numPr>
+          <w:ilvl w:val="0"/>
+          <w:numId w:val="0"/>
+        </w:numPr>
       </w:pPr>
       <w:r>
         <w:t>[36] Tianyi Zhang, Varsha Kishore, Felix Wu, Kilian Q. Weinberger, and Yoav Artzi. 2020. BERTScore: Evaluating Text Generation with BERT. In Proc. ICLR 2020. arXiv:1904.09675.</w:t>
@@ -5157,6 +5443,10 @@
     <w:p>
       <w:pPr>
         <w:pStyle w:val="Bibentry"/>
+        <w:numPr>
+          <w:ilvl w:val="0"/>
+          <w:numId w:val="0"/>
+        </w:numPr>
       </w:pPr>
       <w:r>
         <w:t>[37] Xiaoming Zhang, Ming Wang, Xiaocui Yang, Daling Wang, Shi Feng, and Yifei Zhang. 2024. Hierarchical Retrieval-Augmented Generation Model with Rethink for Multi-hop Question Answering. arXiv:2408.11875.</w:t>
@@ -5165,14 +5455,22 @@
     <w:p>
       <w:pPr>
         <w:pStyle w:val="Bibentry"/>
+        <w:numPr>
+          <w:ilvl w:val="0"/>
+          <w:numId w:val="0"/>
+        </w:numPr>
       </w:pPr>
       <w:r>
         <w:t>[38] Lianmin Zheng et al. 2023. Judging LLM-as-a-Judge with MT-Bench and Chatbot Arena. In Advances in Neural Information Processing Systems 36 (NeurIPS 2023), Datasets and Benchmarks Track. arXiv:2306.05685.</w:t>
       </w:r>
     </w:p>
     <w:sectPr>
-      <w:footerReference w:type="default" r:id="rId26"/>
-      <w:footerReference w:type="first" r:id="rId27"/>
+      <w:headerReference w:type="even" r:id="rId15"/>
+      <w:headerReference w:type="default" r:id="rId16"/>
+      <w:footerReference w:type="even" r:id="rId17"/>
+      <w:footerReference w:type="default" r:id="rId18"/>
+      <w:headerReference w:type="first" r:id="rId19"/>
+      <w:footerReference w:type="first" r:id="rId20"/>
       <w:pgSz w:w="12240" w:h="15840"/>
       <w:pgMar w:top="1760" w:right="2040" w:bottom="2840" w:left="1440" w:header="706" w:footer="706" w:gutter="0"/>
       <w:cols w:space="708"/>
@@ -5184,7 +5482,7 @@
 </file>
 
 <file path=word/endnotes.xml><?xml version="1.0" encoding="utf-8"?>
-<w:endnotes xmlns:wpc="http://schemas.microsoft.com/office/word/2010/wordprocessingCanvas" xmlns:cx="http://schemas.microsoft.com/office/drawing/2014/chartex" xmlns:cx1="http://schemas.microsoft.com/office/drawing/2015/9/8/chartex" xmlns:cx2="http://schemas.microsoft.com/office/drawing/2015/10/21/chartex" xmlns:cx3="http://schemas.microsoft.com/office/drawing/2016/5/9/chartex" xmlns:cx4="http://schemas.microsoft.com/office/drawing/2016/5/10/chartex" xmlns:cx5="http://schemas.microsoft.com/office/drawing/2016/5/11/chartex" xmlns:cx6="http://schemas.microsoft.com/office/drawing/2016/5/12/chartex" xmlns:cx7="http://schemas.microsoft.com/office/drawing/2016/5/13/chartex" xmlns:cx8="http://schemas.microsoft.com/office/drawing/2016/5/14/chartex" xmlns:mc="http://schemas.openxmlformats.org/markup-compatibility/2006" xmlns:aink="http://schemas.microsoft.com/office/drawing/2016/ink" xmlns:am3d="http://schemas.microsoft.com/office/drawing/2017/model3d" xmlns:o="urn:schemas-microsoft-com:office:office" xmlns:r="http://schemas.openxmlformats.org/officeDocument/2006/relationships" xmlns:m="http://schemas.openxmlformats.org/officeDocument/2006/math" xmlns:v="urn:schemas-microsoft-com:vml" xmlns:wp14="http://schemas.microsoft.com/office/word/2010/wordprocessingDrawing" xmlns:wp="http://schemas.openxmlformats.org/drawingml/2006/wordprocessingDrawing" xmlns:w10="urn:schemas-microsoft-com:office:word" xmlns:w="http://schemas.openxmlformats.org/wordprocessingml/2006/main" xmlns:w14="http://schemas.microsoft.com/office/word/2010/wordml" xmlns:w15="http://schemas.microsoft.com/office/word/2012/wordml" xmlns:w16cid="http://schemas.microsoft.com/office/word/2016/wordml/cid" xmlns:w16se="http://schemas.microsoft.com/office/word/2015/wordml/symex" xmlns:wpg="http://schemas.microsoft.com/office/word/2010/wordprocessingGroup" xmlns:wpi="http://schemas.microsoft.com/office/word/2010/wordprocessingInk" xmlns:wne="http://schemas.microsoft.com/office/word/2006/wordml" xmlns:wps="http://schemas.microsoft.com/office/word/2010/wordprocessingShape" mc:Ignorable="w14 w15 w16se w16cid wp14">
+<w:endnotes xmlns:wpc="http://schemas.microsoft.com/office/word/2010/wordprocessingCanvas" xmlns:cx="http://schemas.microsoft.com/office/drawing/2014/chartex" xmlns:cx1="http://schemas.microsoft.com/office/drawing/2015/9/8/chartex" xmlns:cx2="http://schemas.microsoft.com/office/drawing/2015/10/21/chartex" xmlns:cx3="http://schemas.microsoft.com/office/drawing/2016/5/9/chartex" xmlns:cx4="http://schemas.microsoft.com/office/drawing/2016/5/10/chartex" xmlns:cx5="http://schemas.microsoft.com/office/drawing/2016/5/11/chartex" xmlns:cx6="http://schemas.microsoft.com/office/drawing/2016/5/12/chartex" xmlns:cx7="http://schemas.microsoft.com/office/drawing/2016/5/13/chartex" xmlns:cx8="http://schemas.microsoft.com/office/drawing/2016/5/14/chartex" xmlns:mc="http://schemas.openxmlformats.org/markup-compatibility/2006" xmlns:aink="http://schemas.microsoft.com/office/drawing/2016/ink" xmlns:am3d="http://schemas.microsoft.com/office/drawing/2017/model3d" xmlns:o="urn:schemas-microsoft-com:office:office" xmlns:oel="http://schemas.microsoft.com/office/2019/extlst" xmlns:r="http://schemas.openxmlformats.org/officeDocument/2006/relationships" xmlns:m="http://schemas.openxmlformats.org/officeDocument/2006/math" xmlns:v="urn:schemas-microsoft-com:vml" xmlns:wp14="http://schemas.microsoft.com/office/word/2010/wordprocessingDrawing" xmlns:wp="http://schemas.openxmlformats.org/drawingml/2006/wordprocessingDrawing" xmlns:w10="urn:schemas-microsoft-com:office:word" xmlns:w="http://schemas.openxmlformats.org/wordprocessingml/2006/main" xmlns:w14="http://schemas.microsoft.com/office/word/2010/wordml" xmlns:w15="http://schemas.microsoft.com/office/word/2012/wordml" xmlns:w16cex="http://schemas.microsoft.com/office/word/2018/wordml/cex" xmlns:w16cid="http://schemas.microsoft.com/office/word/2016/wordml/cid" xmlns:w16="http://schemas.microsoft.com/office/word/2018/wordml" xmlns:w16du="http://schemas.microsoft.com/office/word/2023/wordml/word16du" xmlns:w16sdtdh="http://schemas.microsoft.com/office/word/2020/wordml/sdtdatahash" xmlns:w16sdtfl="http://schemas.microsoft.com/office/word/2024/wordml/sdtformatlock" xmlns:w16se="http://schemas.microsoft.com/office/word/2015/wordml/symex" xmlns:wpg="http://schemas.microsoft.com/office/word/2010/wordprocessingGroup" xmlns:wpi="http://schemas.microsoft.com/office/word/2010/wordprocessingInk" xmlns:wne="http://schemas.microsoft.com/office/word/2006/wordml" xmlns:wps="http://schemas.microsoft.com/office/word/2010/wordprocessingShape" mc:Ignorable="w14 w15 w16se w16cid w16 w16cex w16sdtdh w16sdtfl w16du wp14">
   <w:endnote w:type="separator" w:id="-1">
     <w:p>
       <w:pPr>
@@ -5209,10 +5507,20 @@
 </file>
 
 <file path=word/footer1.xml><?xml version="1.0" encoding="utf-8"?>
-<w:ftr xmlns:wpc="http://schemas.microsoft.com/office/word/2010/wordprocessingCanvas" xmlns:cx="http://schemas.microsoft.com/office/drawing/2014/chartex" xmlns:cx1="http://schemas.microsoft.com/office/drawing/2015/9/8/chartex" xmlns:cx2="http://schemas.microsoft.com/office/drawing/2015/10/21/chartex" xmlns:cx3="http://schemas.microsoft.com/office/drawing/2016/5/9/chartex" xmlns:cx4="http://schemas.microsoft.com/office/drawing/2016/5/10/chartex" xmlns:cx5="http://schemas.microsoft.com/office/drawing/2016/5/11/chartex" xmlns:cx6="http://schemas.microsoft.com/office/drawing/2016/5/12/chartex" xmlns:cx7="http://schemas.microsoft.com/office/drawing/2016/5/13/chartex" xmlns:cx8="http://schemas.microsoft.com/office/drawing/2016/5/14/chartex" xmlns:mc="http://schemas.openxmlformats.org/markup-compatibility/2006" xmlns:aink="http://schemas.microsoft.com/office/drawing/2016/ink" xmlns:am3d="http://schemas.microsoft.com/office/drawing/2017/model3d" xmlns:o="urn:schemas-microsoft-com:office:office" xmlns:r="http://schemas.openxmlformats.org/officeDocument/2006/relationships" xmlns:m="http://schemas.openxmlformats.org/officeDocument/2006/math" xmlns:v="urn:schemas-microsoft-com:vml" xmlns:wp14="http://schemas.microsoft.com/office/word/2010/wordprocessingDrawing" xmlns:wp="http://schemas.openxmlformats.org/drawingml/2006/wordprocessingDrawing" xmlns:w10="urn:schemas-microsoft-com:office:word" xmlns:w="http://schemas.openxmlformats.org/wordprocessingml/2006/main" xmlns:w14="http://schemas.microsoft.com/office/word/2010/wordml" xmlns:w15="http://schemas.microsoft.com/office/word/2012/wordml" xmlns:w16cid="http://schemas.microsoft.com/office/word/2016/wordml/cid" xmlns:w16se="http://schemas.microsoft.com/office/word/2015/wordml/symex" xmlns:wpg="http://schemas.microsoft.com/office/word/2010/wordprocessingGroup" xmlns:wpi="http://schemas.microsoft.com/office/word/2010/wordprocessingInk" xmlns:wne="http://schemas.microsoft.com/office/word/2006/wordml" xmlns:wps="http://schemas.microsoft.com/office/word/2010/wordprocessingShape" mc:Ignorable="w14 w15 w16se w16cid wp14">
+<w:ftr xmlns:wpc="http://schemas.microsoft.com/office/word/2010/wordprocessingCanvas" xmlns:cx="http://schemas.microsoft.com/office/drawing/2014/chartex" xmlns:cx1="http://schemas.microsoft.com/office/drawing/2015/9/8/chartex" xmlns:cx2="http://schemas.microsoft.com/office/drawing/2015/10/21/chartex" xmlns:cx3="http://schemas.microsoft.com/office/drawing/2016/5/9/chartex" xmlns:cx4="http://schemas.microsoft.com/office/drawing/2016/5/10/chartex" xmlns:cx5="http://schemas.microsoft.com/office/drawing/2016/5/11/chartex" xmlns:cx6="http://schemas.microsoft.com/office/drawing/2016/5/12/chartex" xmlns:cx7="http://schemas.microsoft.com/office/drawing/2016/5/13/chartex" xmlns:cx8="http://schemas.microsoft.com/office/drawing/2016/5/14/chartex" xmlns:mc="http://schemas.openxmlformats.org/markup-compatibility/2006" xmlns:aink="http://schemas.microsoft.com/office/drawing/2016/ink" xmlns:am3d="http://schemas.microsoft.com/office/drawing/2017/model3d" xmlns:o="urn:schemas-microsoft-com:office:office" xmlns:oel="http://schemas.microsoft.com/office/2019/extlst" xmlns:r="http://schemas.openxmlformats.org/officeDocument/2006/relationships" xmlns:m="http://schemas.openxmlformats.org/officeDocument/2006/math" xmlns:v="urn:schemas-microsoft-com:vml" xmlns:wp14="http://schemas.microsoft.com/office/word/2010/wordprocessingDrawing" xmlns:wp="http://schemas.openxmlformats.org/drawingml/2006/wordprocessingDrawing" xmlns:w10="urn:schemas-microsoft-com:office:word" xmlns:w="http://schemas.openxmlformats.org/wordprocessingml/2006/main" xmlns:w14="http://schemas.microsoft.com/office/word/2010/wordml" xmlns:w15="http://schemas.microsoft.com/office/word/2012/wordml" xmlns:w16cex="http://schemas.microsoft.com/office/word/2018/wordml/cex" xmlns:w16cid="http://schemas.microsoft.com/office/word/2016/wordml/cid" xmlns:w16="http://schemas.microsoft.com/office/word/2018/wordml" xmlns:w16du="http://schemas.microsoft.com/office/word/2023/wordml/word16du" xmlns:w16sdtdh="http://schemas.microsoft.com/office/word/2020/wordml/sdtdatahash" xmlns:w16sdtfl="http://schemas.microsoft.com/office/word/2024/wordml/sdtformatlock" xmlns:w16se="http://schemas.microsoft.com/office/word/2015/wordml/symex" xmlns:wpg="http://schemas.microsoft.com/office/word/2010/wordprocessingGroup" xmlns:wpi="http://schemas.microsoft.com/office/word/2010/wordprocessingInk" xmlns:wne="http://schemas.microsoft.com/office/word/2006/wordml" xmlns:wps="http://schemas.microsoft.com/office/word/2010/wordprocessingShape" mc:Ignorable="w14 w15 w16se w16cid w16 w16cex w16sdtdh w16sdtfl w16du wp14">
   <w:p>
     <w:pPr>
-      <w:pStyle w:val="Footer"/>
+      <w:pStyle w:val="a6"/>
+    </w:pPr>
+  </w:p>
+</w:ftr>
+</file>
+
+<file path=word/footer2.xml><?xml version="1.0" encoding="utf-8"?>
+<w:ftr xmlns:wpc="http://schemas.microsoft.com/office/word/2010/wordprocessingCanvas" xmlns:cx="http://schemas.microsoft.com/office/drawing/2014/chartex" xmlns:cx1="http://schemas.microsoft.com/office/drawing/2015/9/8/chartex" xmlns:cx2="http://schemas.microsoft.com/office/drawing/2015/10/21/chartex" xmlns:cx3="http://schemas.microsoft.com/office/drawing/2016/5/9/chartex" xmlns:cx4="http://schemas.microsoft.com/office/drawing/2016/5/10/chartex" xmlns:cx5="http://schemas.microsoft.com/office/drawing/2016/5/11/chartex" xmlns:cx6="http://schemas.microsoft.com/office/drawing/2016/5/12/chartex" xmlns:cx7="http://schemas.microsoft.com/office/drawing/2016/5/13/chartex" xmlns:cx8="http://schemas.microsoft.com/office/drawing/2016/5/14/chartex" xmlns:mc="http://schemas.openxmlformats.org/markup-compatibility/2006" xmlns:aink="http://schemas.microsoft.com/office/drawing/2016/ink" xmlns:am3d="http://schemas.microsoft.com/office/drawing/2017/model3d" xmlns:o="urn:schemas-microsoft-com:office:office" xmlns:oel="http://schemas.microsoft.com/office/2019/extlst" xmlns:r="http://schemas.openxmlformats.org/officeDocument/2006/relationships" xmlns:m="http://schemas.openxmlformats.org/officeDocument/2006/math" xmlns:v="urn:schemas-microsoft-com:vml" xmlns:wp14="http://schemas.microsoft.com/office/word/2010/wordprocessingDrawing" xmlns:wp="http://schemas.openxmlformats.org/drawingml/2006/wordprocessingDrawing" xmlns:w10="urn:schemas-microsoft-com:office:word" xmlns:w="http://schemas.openxmlformats.org/wordprocessingml/2006/main" xmlns:w14="http://schemas.microsoft.com/office/word/2010/wordml" xmlns:w15="http://schemas.microsoft.com/office/word/2012/wordml" xmlns:w16cex="http://schemas.microsoft.com/office/word/2018/wordml/cex" xmlns:w16cid="http://schemas.microsoft.com/office/word/2016/wordml/cid" xmlns:w16="http://schemas.microsoft.com/office/word/2018/wordml" xmlns:w16du="http://schemas.microsoft.com/office/word/2023/wordml/word16du" xmlns:w16sdtdh="http://schemas.microsoft.com/office/word/2020/wordml/sdtdatahash" xmlns:w16sdtfl="http://schemas.microsoft.com/office/word/2024/wordml/sdtformatlock" xmlns:w16se="http://schemas.microsoft.com/office/word/2015/wordml/symex" xmlns:wpg="http://schemas.microsoft.com/office/word/2010/wordprocessingGroup" xmlns:wpi="http://schemas.microsoft.com/office/word/2010/wordprocessingInk" xmlns:wne="http://schemas.microsoft.com/office/word/2006/wordml" xmlns:wps="http://schemas.microsoft.com/office/word/2010/wordprocessingShape" mc:Ignorable="w14 w15 w16se w16cid w16 w16cex w16sdtdh w16sdtfl w16du wp14">
+  <w:p>
+    <w:pPr>
+      <w:pStyle w:val="a6"/>
       <w:jc w:val="center"/>
     </w:pPr>
     <w:r>
@@ -5240,98 +5548,98 @@
 </w:ftr>
 </file>
 
-<file path=word/footer2.xml><?xml version="1.0" encoding="utf-8"?>
-<w:ftr xmlns:wpc="http://schemas.microsoft.com/office/word/2010/wordprocessingCanvas" xmlns:cx="http://schemas.microsoft.com/office/drawing/2014/chartex" xmlns:cx1="http://schemas.microsoft.com/office/drawing/2015/9/8/chartex" xmlns:cx2="http://schemas.microsoft.com/office/drawing/2015/10/21/chartex" xmlns:cx3="http://schemas.microsoft.com/office/drawing/2016/5/9/chartex" xmlns:cx4="http://schemas.microsoft.com/office/drawing/2016/5/10/chartex" xmlns:cx5="http://schemas.microsoft.com/office/drawing/2016/5/11/chartex" xmlns:cx6="http://schemas.microsoft.com/office/drawing/2016/5/12/chartex" xmlns:cx7="http://schemas.microsoft.com/office/drawing/2016/5/13/chartex" xmlns:cx8="http://schemas.microsoft.com/office/drawing/2016/5/14/chartex" xmlns:mc="http://schemas.openxmlformats.org/markup-compatibility/2006" xmlns:aink="http://schemas.microsoft.com/office/drawing/2016/ink" xmlns:am3d="http://schemas.microsoft.com/office/drawing/2017/model3d" xmlns:o="urn:schemas-microsoft-com:office:office" xmlns:r="http://schemas.openxmlformats.org/officeDocument/2006/relationships" xmlns:m="http://schemas.openxmlformats.org/officeDocument/2006/math" xmlns:v="urn:schemas-microsoft-com:vml" xmlns:wp14="http://schemas.microsoft.com/office/word/2010/wordprocessingDrawing" xmlns:wp="http://schemas.openxmlformats.org/drawingml/2006/wordprocessingDrawing" xmlns:w10="urn:schemas-microsoft-com:office:word" xmlns:w="http://schemas.openxmlformats.org/wordprocessingml/2006/main" xmlns:w14="http://schemas.microsoft.com/office/word/2010/wordml" xmlns:w15="http://schemas.microsoft.com/office/word/2012/wordml" xmlns:w16cid="http://schemas.microsoft.com/office/word/2016/wordml/cid" xmlns:w16se="http://schemas.microsoft.com/office/word/2015/wordml/symex" xmlns:wpg="http://schemas.microsoft.com/office/word/2010/wordprocessingGroup" xmlns:wpi="http://schemas.microsoft.com/office/word/2010/wordprocessingInk" xmlns:wne="http://schemas.microsoft.com/office/word/2006/wordml" xmlns:wps="http://schemas.microsoft.com/office/word/2010/wordprocessingShape" mc:Ignorable="w14 w15 w16se w16cid wp14">
+<file path=word/footer3.xml><?xml version="1.0" encoding="utf-8"?>
+<w:ftr xmlns:wpc="http://schemas.microsoft.com/office/word/2010/wordprocessingCanvas" xmlns:cx="http://schemas.microsoft.com/office/drawing/2014/chartex" xmlns:cx1="http://schemas.microsoft.com/office/drawing/2015/9/8/chartex" xmlns:cx2="http://schemas.microsoft.com/office/drawing/2015/10/21/chartex" xmlns:cx3="http://schemas.microsoft.com/office/drawing/2016/5/9/chartex" xmlns:cx4="http://schemas.microsoft.com/office/drawing/2016/5/10/chartex" xmlns:cx5="http://schemas.microsoft.com/office/drawing/2016/5/11/chartex" xmlns:cx6="http://schemas.microsoft.com/office/drawing/2016/5/12/chartex" xmlns:cx7="http://schemas.microsoft.com/office/drawing/2016/5/13/chartex" xmlns:cx8="http://schemas.microsoft.com/office/drawing/2016/5/14/chartex" xmlns:mc="http://schemas.openxmlformats.org/markup-compatibility/2006" xmlns:aink="http://schemas.microsoft.com/office/drawing/2016/ink" xmlns:am3d="http://schemas.microsoft.com/office/drawing/2017/model3d" xmlns:o="urn:schemas-microsoft-com:office:office" xmlns:oel="http://schemas.microsoft.com/office/2019/extlst" xmlns:r="http://schemas.openxmlformats.org/officeDocument/2006/relationships" xmlns:m="http://schemas.openxmlformats.org/officeDocument/2006/math" xmlns:v="urn:schemas-microsoft-com:vml" xmlns:wp14="http://schemas.microsoft.com/office/word/2010/wordprocessingDrawing" xmlns:wp="http://schemas.openxmlformats.org/drawingml/2006/wordprocessingDrawing" xmlns:w10="urn:schemas-microsoft-com:office:word" xmlns:w="http://schemas.openxmlformats.org/wordprocessingml/2006/main" xmlns:w14="http://schemas.microsoft.com/office/word/2010/wordml" xmlns:w15="http://schemas.microsoft.com/office/word/2012/wordml" xmlns:w16cex="http://schemas.microsoft.com/office/word/2018/wordml/cex" xmlns:w16cid="http://schemas.microsoft.com/office/word/2016/wordml/cid" xmlns:w16="http://schemas.microsoft.com/office/word/2018/wordml" xmlns:w16du="http://schemas.microsoft.com/office/word/2023/wordml/word16du" xmlns:w16sdtdh="http://schemas.microsoft.com/office/word/2020/wordml/sdtdatahash" xmlns:w16sdtfl="http://schemas.microsoft.com/office/word/2024/wordml/sdtformatlock" xmlns:w16se="http://schemas.microsoft.com/office/word/2015/wordml/symex" xmlns:wpg="http://schemas.microsoft.com/office/word/2010/wordprocessingGroup" xmlns:wpi="http://schemas.microsoft.com/office/word/2010/wordprocessingInk" xmlns:wne="http://schemas.microsoft.com/office/word/2006/wordml" xmlns:wps="http://schemas.microsoft.com/office/word/2010/wordprocessingShape" mc:Ignorable="w14 w15 w16se w16cid w16 w16cex w16sdtdh w16sdtfl w16du wp14">
   <w:p>
     <w:pPr>
-      <w:pStyle w:val="Footer"/>
+      <w:pStyle w:val="a6"/>
     </w:pPr>
   </w:p>
   <w:p>
     <w:pPr>
-      <w:pStyle w:val="Footer"/>
+      <w:pStyle w:val="a6"/>
     </w:pPr>
   </w:p>
   <w:p>
     <w:pPr>
-      <w:pStyle w:val="Footer"/>
+      <w:pStyle w:val="a6"/>
     </w:pPr>
   </w:p>
   <w:p>
     <w:pPr>
-      <w:pStyle w:val="Footer"/>
+      <w:pStyle w:val="a6"/>
     </w:pPr>
   </w:p>
   <w:p>
     <w:pPr>
-      <w:pStyle w:val="Footer"/>
+      <w:pStyle w:val="a6"/>
     </w:pPr>
   </w:p>
   <w:p>
     <w:pPr>
-      <w:pStyle w:val="Footer"/>
+      <w:pStyle w:val="a6"/>
     </w:pPr>
   </w:p>
   <w:p>
     <w:pPr>
-      <w:pStyle w:val="Footer"/>
+      <w:pStyle w:val="a6"/>
     </w:pPr>
   </w:p>
   <w:p>
     <w:pPr>
-      <w:pStyle w:val="Footer"/>
+      <w:pStyle w:val="a6"/>
     </w:pPr>
   </w:p>
   <w:p>
     <w:pPr>
-      <w:pStyle w:val="Footer"/>
+      <w:pStyle w:val="a6"/>
     </w:pPr>
   </w:p>
   <w:p>
     <w:pPr>
-      <w:pStyle w:val="Footer"/>
+      <w:pStyle w:val="a6"/>
     </w:pPr>
   </w:p>
   <w:p>
     <w:pPr>
-      <w:pStyle w:val="Footer"/>
+      <w:pStyle w:val="a6"/>
     </w:pPr>
   </w:p>
   <w:p>
     <w:pPr>
-      <w:pStyle w:val="Footer"/>
+      <w:pStyle w:val="a6"/>
     </w:pPr>
   </w:p>
   <w:p>
     <w:pPr>
-      <w:pStyle w:val="Footer"/>
+      <w:pStyle w:val="a6"/>
     </w:pPr>
   </w:p>
   <w:p>
     <w:pPr>
-      <w:pStyle w:val="Footer"/>
+      <w:pStyle w:val="a6"/>
     </w:pPr>
   </w:p>
   <w:p>
     <w:pPr>
-      <w:pStyle w:val="Footer"/>
+      <w:pStyle w:val="a6"/>
     </w:pPr>
   </w:p>
   <w:p>
     <w:pPr>
-      <w:pStyle w:val="Footer"/>
+      <w:pStyle w:val="a6"/>
     </w:pPr>
   </w:p>
   <w:p>
     <w:pPr>
-      <w:pStyle w:val="Footer"/>
+      <w:pStyle w:val="a6"/>
     </w:pPr>
   </w:p>
 </w:ftr>
 </file>
 
 <file path=word/footnotes.xml><?xml version="1.0" encoding="utf-8"?>
-<w:footnotes xmlns:wpc="http://schemas.microsoft.com/office/word/2010/wordprocessingCanvas" xmlns:cx="http://schemas.microsoft.com/office/drawing/2014/chartex" xmlns:cx1="http://schemas.microsoft.com/office/drawing/2015/9/8/chartex" xmlns:cx2="http://schemas.microsoft.com/office/drawing/2015/10/21/chartex" xmlns:cx3="http://schemas.microsoft.com/office/drawing/2016/5/9/chartex" xmlns:cx4="http://schemas.microsoft.com/office/drawing/2016/5/10/chartex" xmlns:cx5="http://schemas.microsoft.com/office/drawing/2016/5/11/chartex" xmlns:cx6="http://schemas.microsoft.com/office/drawing/2016/5/12/chartex" xmlns:cx7="http://schemas.microsoft.com/office/drawing/2016/5/13/chartex" xmlns:cx8="http://schemas.microsoft.com/office/drawing/2016/5/14/chartex" xmlns:mc="http://schemas.openxmlformats.org/markup-compatibility/2006" xmlns:aink="http://schemas.microsoft.com/office/drawing/2016/ink" xmlns:am3d="http://schemas.microsoft.com/office/drawing/2017/model3d" xmlns:o="urn:schemas-microsoft-com:office:office" xmlns:r="http://schemas.openxmlformats.org/officeDocument/2006/relationships" xmlns:m="http://schemas.openxmlformats.org/officeDocument/2006/math" xmlns:v="urn:schemas-microsoft-com:vml" xmlns:wp14="http://schemas.microsoft.com/office/word/2010/wordprocessingDrawing" xmlns:wp="http://schemas.openxmlformats.org/drawingml/2006/wordprocessingDrawing" xmlns:w10="urn:schemas-microsoft-com:office:word" xmlns:w="http://schemas.openxmlformats.org/wordprocessingml/2006/main" xmlns:w14="http://schemas.microsoft.com/office/word/2010/wordml" xmlns:w15="http://schemas.microsoft.com/office/word/2012/wordml" xmlns:w16cid="http://schemas.microsoft.com/office/word/2016/wordml/cid" xmlns:w16se="http://schemas.microsoft.com/office/word/2015/wordml/symex" xmlns:wpg="http://schemas.microsoft.com/office/word/2010/wordprocessingGroup" xmlns:wpi="http://schemas.microsoft.com/office/word/2010/wordprocessingInk" xmlns:wne="http://schemas.microsoft.com/office/word/2006/wordml" xmlns:wps="http://schemas.microsoft.com/office/word/2010/wordprocessingShape" mc:Ignorable="w14 w15 w16se w16cid wp14">
+<w:footnotes xmlns:wpc="http://schemas.microsoft.com/office/word/2010/wordprocessingCanvas" xmlns:cx="http://schemas.microsoft.com/office/drawing/2014/chartex" xmlns:cx1="http://schemas.microsoft.com/office/drawing/2015/9/8/chartex" xmlns:cx2="http://schemas.microsoft.com/office/drawing/2015/10/21/chartex" xmlns:cx3="http://schemas.microsoft.com/office/drawing/2016/5/9/chartex" xmlns:cx4="http://schemas.microsoft.com/office/drawing/2016/5/10/chartex" xmlns:cx5="http://schemas.microsoft.com/office/drawing/2016/5/11/chartex" xmlns:cx6="http://schemas.microsoft.com/office/drawing/2016/5/12/chartex" xmlns:cx7="http://schemas.microsoft.com/office/drawing/2016/5/13/chartex" xmlns:cx8="http://schemas.microsoft.com/office/drawing/2016/5/14/chartex" xmlns:mc="http://schemas.openxmlformats.org/markup-compatibility/2006" xmlns:aink="http://schemas.microsoft.com/office/drawing/2016/ink" xmlns:am3d="http://schemas.microsoft.com/office/drawing/2017/model3d" xmlns:o="urn:schemas-microsoft-com:office:office" xmlns:oel="http://schemas.microsoft.com/office/2019/extlst" xmlns:r="http://schemas.openxmlformats.org/officeDocument/2006/relationships" xmlns:m="http://schemas.openxmlformats.org/officeDocument/2006/math" xmlns:v="urn:schemas-microsoft-com:vml" xmlns:wp14="http://schemas.microsoft.com/office/word/2010/wordprocessingDrawing" xmlns:wp="http://schemas.openxmlformats.org/drawingml/2006/wordprocessingDrawing" xmlns:w10="urn:schemas-microsoft-com:office:word" xmlns:w="http://schemas.openxmlformats.org/wordprocessingml/2006/main" xmlns:w14="http://schemas.microsoft.com/office/word/2010/wordml" xmlns:w15="http://schemas.microsoft.com/office/word/2012/wordml" xmlns:w16cex="http://schemas.microsoft.com/office/word/2018/wordml/cex" xmlns:w16cid="http://schemas.microsoft.com/office/word/2016/wordml/cid" xmlns:w16="http://schemas.microsoft.com/office/word/2018/wordml" xmlns:w16du="http://schemas.microsoft.com/office/word/2023/wordml/word16du" xmlns:w16sdtdh="http://schemas.microsoft.com/office/word/2020/wordml/sdtdatahash" xmlns:w16sdtfl="http://schemas.microsoft.com/office/word/2024/wordml/sdtformatlock" xmlns:w16se="http://schemas.microsoft.com/office/word/2015/wordml/symex" xmlns:wpg="http://schemas.microsoft.com/office/word/2010/wordprocessingGroup" xmlns:wpi="http://schemas.microsoft.com/office/word/2010/wordprocessingInk" xmlns:wne="http://schemas.microsoft.com/office/word/2006/wordml" xmlns:wps="http://schemas.microsoft.com/office/word/2010/wordprocessingShape" mc:Ignorable="w14 w15 w16se w16cid w16 w16cex w16sdtdh w16sdtfl w16du wp14">
   <w:footnote w:type="separator" w:id="-1">
     <w:p>
       <w:pPr>
@@ -5349,28 +5657,44 @@
       </w:pPr>
       <w:r>
         <w:continuationSeparator/>
-      </w:r>
-    </w:p>
-  </w:footnote>
-  <w:footnote w:id="1">
-    <w:p>
-      <w:pPr>
-        <w:pStyle w:val="AuthNotes"/>
-        <w:spacing w:line="240" w:lineRule="auto"/>
-      </w:pPr>
-      <w:r>
-        <w:t>*</w:t>
-      </w:r>
-      <w:r>
-        <w:t xml:space="preserve"> Place the footnote text for the author (if applicable) here. </w:t>
       </w:r>
     </w:p>
   </w:footnote>
 </w:footnotes>
 </file>
 
+<file path=word/header1.xml><?xml version="1.0" encoding="utf-8"?>
+<w:hdr xmlns:wpc="http://schemas.microsoft.com/office/word/2010/wordprocessingCanvas" xmlns:cx="http://schemas.microsoft.com/office/drawing/2014/chartex" xmlns:cx1="http://schemas.microsoft.com/office/drawing/2015/9/8/chartex" xmlns:cx2="http://schemas.microsoft.com/office/drawing/2015/10/21/chartex" xmlns:cx3="http://schemas.microsoft.com/office/drawing/2016/5/9/chartex" xmlns:cx4="http://schemas.microsoft.com/office/drawing/2016/5/10/chartex" xmlns:cx5="http://schemas.microsoft.com/office/drawing/2016/5/11/chartex" xmlns:cx6="http://schemas.microsoft.com/office/drawing/2016/5/12/chartex" xmlns:cx7="http://schemas.microsoft.com/office/drawing/2016/5/13/chartex" xmlns:cx8="http://schemas.microsoft.com/office/drawing/2016/5/14/chartex" xmlns:mc="http://schemas.openxmlformats.org/markup-compatibility/2006" xmlns:aink="http://schemas.microsoft.com/office/drawing/2016/ink" xmlns:am3d="http://schemas.microsoft.com/office/drawing/2017/model3d" xmlns:o="urn:schemas-microsoft-com:office:office" xmlns:oel="http://schemas.microsoft.com/office/2019/extlst" xmlns:r="http://schemas.openxmlformats.org/officeDocument/2006/relationships" xmlns:m="http://schemas.openxmlformats.org/officeDocument/2006/math" xmlns:v="urn:schemas-microsoft-com:vml" xmlns:wp14="http://schemas.microsoft.com/office/word/2010/wordprocessingDrawing" xmlns:wp="http://schemas.openxmlformats.org/drawingml/2006/wordprocessingDrawing" xmlns:w10="urn:schemas-microsoft-com:office:word" xmlns:w="http://schemas.openxmlformats.org/wordprocessingml/2006/main" xmlns:w14="http://schemas.microsoft.com/office/word/2010/wordml" xmlns:w15="http://schemas.microsoft.com/office/word/2012/wordml" xmlns:w16cex="http://schemas.microsoft.com/office/word/2018/wordml/cex" xmlns:w16cid="http://schemas.microsoft.com/office/word/2016/wordml/cid" xmlns:w16="http://schemas.microsoft.com/office/word/2018/wordml" xmlns:w16du="http://schemas.microsoft.com/office/word/2023/wordml/word16du" xmlns:w16sdtdh="http://schemas.microsoft.com/office/word/2020/wordml/sdtdatahash" xmlns:w16sdtfl="http://schemas.microsoft.com/office/word/2024/wordml/sdtformatlock" xmlns:w16se="http://schemas.microsoft.com/office/word/2015/wordml/symex" xmlns:wpg="http://schemas.microsoft.com/office/word/2010/wordprocessingGroup" xmlns:wpi="http://schemas.microsoft.com/office/word/2010/wordprocessingInk" xmlns:wne="http://schemas.microsoft.com/office/word/2006/wordml" xmlns:wps="http://schemas.microsoft.com/office/word/2010/wordprocessingShape" mc:Ignorable="w14 w15 w16se w16cid w16 w16cex w16sdtdh w16sdtfl w16du wp14">
+  <w:p>
+    <w:pPr>
+      <w:pStyle w:val="a8"/>
+    </w:pPr>
+  </w:p>
+</w:hdr>
+</file>
+
+<file path=word/header2.xml><?xml version="1.0" encoding="utf-8"?>
+<w:hdr xmlns:wpc="http://schemas.microsoft.com/office/word/2010/wordprocessingCanvas" xmlns:cx="http://schemas.microsoft.com/office/drawing/2014/chartex" xmlns:cx1="http://schemas.microsoft.com/office/drawing/2015/9/8/chartex" xmlns:cx2="http://schemas.microsoft.com/office/drawing/2015/10/21/chartex" xmlns:cx3="http://schemas.microsoft.com/office/drawing/2016/5/9/chartex" xmlns:cx4="http://schemas.microsoft.com/office/drawing/2016/5/10/chartex" xmlns:cx5="http://schemas.microsoft.com/office/drawing/2016/5/11/chartex" xmlns:cx6="http://schemas.microsoft.com/office/drawing/2016/5/12/chartex" xmlns:cx7="http://schemas.microsoft.com/office/drawing/2016/5/13/chartex" xmlns:cx8="http://schemas.microsoft.com/office/drawing/2016/5/14/chartex" xmlns:mc="http://schemas.openxmlformats.org/markup-compatibility/2006" xmlns:aink="http://schemas.microsoft.com/office/drawing/2016/ink" xmlns:am3d="http://schemas.microsoft.com/office/drawing/2017/model3d" xmlns:o="urn:schemas-microsoft-com:office:office" xmlns:oel="http://schemas.microsoft.com/office/2019/extlst" xmlns:r="http://schemas.openxmlformats.org/officeDocument/2006/relationships" xmlns:m="http://schemas.openxmlformats.org/officeDocument/2006/math" xmlns:v="urn:schemas-microsoft-com:vml" xmlns:wp14="http://schemas.microsoft.com/office/word/2010/wordprocessingDrawing" xmlns:wp="http://schemas.openxmlformats.org/drawingml/2006/wordprocessingDrawing" xmlns:w10="urn:schemas-microsoft-com:office:word" xmlns:w="http://schemas.openxmlformats.org/wordprocessingml/2006/main" xmlns:w14="http://schemas.microsoft.com/office/word/2010/wordml" xmlns:w15="http://schemas.microsoft.com/office/word/2012/wordml" xmlns:w16cex="http://schemas.microsoft.com/office/word/2018/wordml/cex" xmlns:w16cid="http://schemas.microsoft.com/office/word/2016/wordml/cid" xmlns:w16="http://schemas.microsoft.com/office/word/2018/wordml" xmlns:w16du="http://schemas.microsoft.com/office/word/2023/wordml/word16du" xmlns:w16sdtdh="http://schemas.microsoft.com/office/word/2020/wordml/sdtdatahash" xmlns:w16sdtfl="http://schemas.microsoft.com/office/word/2024/wordml/sdtformatlock" xmlns:w16se="http://schemas.microsoft.com/office/word/2015/wordml/symex" xmlns:wpg="http://schemas.microsoft.com/office/word/2010/wordprocessingGroup" xmlns:wpi="http://schemas.microsoft.com/office/word/2010/wordprocessingInk" xmlns:wne="http://schemas.microsoft.com/office/word/2006/wordml" xmlns:wps="http://schemas.microsoft.com/office/word/2010/wordprocessingShape" mc:Ignorable="w14 w15 w16se w16cid w16 w16cex w16sdtdh w16sdtfl w16du wp14">
+  <w:p>
+    <w:pPr>
+      <w:pStyle w:val="a8"/>
+    </w:pPr>
+  </w:p>
+</w:hdr>
+</file>
+
+<file path=word/header3.xml><?xml version="1.0" encoding="utf-8"?>
+<w:hdr xmlns:wpc="http://schemas.microsoft.com/office/word/2010/wordprocessingCanvas" xmlns:cx="http://schemas.microsoft.com/office/drawing/2014/chartex" xmlns:cx1="http://schemas.microsoft.com/office/drawing/2015/9/8/chartex" xmlns:cx2="http://schemas.microsoft.com/office/drawing/2015/10/21/chartex" xmlns:cx3="http://schemas.microsoft.com/office/drawing/2016/5/9/chartex" xmlns:cx4="http://schemas.microsoft.com/office/drawing/2016/5/10/chartex" xmlns:cx5="http://schemas.microsoft.com/office/drawing/2016/5/11/chartex" xmlns:cx6="http://schemas.microsoft.com/office/drawing/2016/5/12/chartex" xmlns:cx7="http://schemas.microsoft.com/office/drawing/2016/5/13/chartex" xmlns:cx8="http://schemas.microsoft.com/office/drawing/2016/5/14/chartex" xmlns:mc="http://schemas.openxmlformats.org/markup-compatibility/2006" xmlns:aink="http://schemas.microsoft.com/office/drawing/2016/ink" xmlns:am3d="http://schemas.microsoft.com/office/drawing/2017/model3d" xmlns:o="urn:schemas-microsoft-com:office:office" xmlns:oel="http://schemas.microsoft.com/office/2019/extlst" xmlns:r="http://schemas.openxmlformats.org/officeDocument/2006/relationships" xmlns:m="http://schemas.openxmlformats.org/officeDocument/2006/math" xmlns:v="urn:schemas-microsoft-com:vml" xmlns:wp14="http://schemas.microsoft.com/office/word/2010/wordprocessingDrawing" xmlns:wp="http://schemas.openxmlformats.org/drawingml/2006/wordprocessingDrawing" xmlns:w10="urn:schemas-microsoft-com:office:word" xmlns:w="http://schemas.openxmlformats.org/wordprocessingml/2006/main" xmlns:w14="http://schemas.microsoft.com/office/word/2010/wordml" xmlns:w15="http://schemas.microsoft.com/office/word/2012/wordml" xmlns:w16cex="http://schemas.microsoft.com/office/word/2018/wordml/cex" xmlns:w16cid="http://schemas.microsoft.com/office/word/2016/wordml/cid" xmlns:w16="http://schemas.microsoft.com/office/word/2018/wordml" xmlns:w16du="http://schemas.microsoft.com/office/word/2023/wordml/word16du" xmlns:w16sdtdh="http://schemas.microsoft.com/office/word/2020/wordml/sdtdatahash" xmlns:w16sdtfl="http://schemas.microsoft.com/office/word/2024/wordml/sdtformatlock" xmlns:w16se="http://schemas.microsoft.com/office/word/2015/wordml/symex" xmlns:wpg="http://schemas.microsoft.com/office/word/2010/wordprocessingGroup" xmlns:wpi="http://schemas.microsoft.com/office/word/2010/wordprocessingInk" xmlns:wne="http://schemas.microsoft.com/office/word/2006/wordml" xmlns:wps="http://schemas.microsoft.com/office/word/2010/wordprocessingShape" mc:Ignorable="w14 w15 w16se w16cid w16 w16cex w16sdtdh w16sdtfl w16du wp14">
+  <w:p>
+    <w:pPr>
+      <w:pStyle w:val="a8"/>
+    </w:pPr>
+  </w:p>
+</w:hdr>
+</file>
+
 <file path=word/numbering.xml><?xml version="1.0" encoding="utf-8"?>
-<w:numbering xmlns:wpc="http://schemas.microsoft.com/office/word/2010/wordprocessingCanvas" xmlns:cx="http://schemas.microsoft.com/office/drawing/2014/chartex" xmlns:cx1="http://schemas.microsoft.com/office/drawing/2015/9/8/chartex" xmlns:cx2="http://schemas.microsoft.com/office/drawing/2015/10/21/chartex" xmlns:cx3="http://schemas.microsoft.com/office/drawing/2016/5/9/chartex" xmlns:cx4="http://schemas.microsoft.com/office/drawing/2016/5/10/chartex" xmlns:cx5="http://schemas.microsoft.com/office/drawing/2016/5/11/chartex" xmlns:cx6="http://schemas.microsoft.com/office/drawing/2016/5/12/chartex" xmlns:cx7="http://schemas.microsoft.com/office/drawing/2016/5/13/chartex" xmlns:cx8="http://schemas.microsoft.com/office/drawing/2016/5/14/chartex" xmlns:mc="http://schemas.openxmlformats.org/markup-compatibility/2006" xmlns:aink="http://schemas.microsoft.com/office/drawing/2016/ink" xmlns:am3d="http://schemas.microsoft.com/office/drawing/2017/model3d" xmlns:o="urn:schemas-microsoft-com:office:office" xmlns:r="http://schemas.openxmlformats.org/officeDocument/2006/relationships" xmlns:m="http://schemas.openxmlformats.org/officeDocument/2006/math" xmlns:v="urn:schemas-microsoft-com:vml" xmlns:wp14="http://schemas.microsoft.com/office/word/2010/wordprocessingDrawing" xmlns:wp="http://schemas.openxmlformats.org/drawingml/2006/wordprocessingDrawing" xmlns:w10="urn:schemas-microsoft-com:office:word" xmlns:w="http://schemas.openxmlformats.org/wordprocessingml/2006/main" xmlns:w14="http://schemas.microsoft.com/office/word/2010/wordml" xmlns:w15="http://schemas.microsoft.com/office/word/2012/wordml" xmlns:w16cid="http://schemas.microsoft.com/office/word/2016/wordml/cid" xmlns:w16se="http://schemas.microsoft.com/office/word/2015/wordml/symex" xmlns:wpg="http://schemas.microsoft.com/office/word/2010/wordprocessingGroup" xmlns:wpi="http://schemas.microsoft.com/office/word/2010/wordprocessingInk" xmlns:wne="http://schemas.microsoft.com/office/word/2006/wordml" xmlns:wps="http://schemas.microsoft.com/office/word/2010/wordprocessingShape" mc:Ignorable="w14 w15 w16se w16cid wp14">
+<w:numbering xmlns:wpc="http://schemas.microsoft.com/office/word/2010/wordprocessingCanvas" xmlns:cx="http://schemas.microsoft.com/office/drawing/2014/chartex" xmlns:cx1="http://schemas.microsoft.com/office/drawing/2015/9/8/chartex" xmlns:cx2="http://schemas.microsoft.com/office/drawing/2015/10/21/chartex" xmlns:cx3="http://schemas.microsoft.com/office/drawing/2016/5/9/chartex" xmlns:cx4="http://schemas.microsoft.com/office/drawing/2016/5/10/chartex" xmlns:cx5="http://schemas.microsoft.com/office/drawing/2016/5/11/chartex" xmlns:cx6="http://schemas.microsoft.com/office/drawing/2016/5/12/chartex" xmlns:cx7="http://schemas.microsoft.com/office/drawing/2016/5/13/chartex" xmlns:cx8="http://schemas.microsoft.com/office/drawing/2016/5/14/chartex" xmlns:mc="http://schemas.openxmlformats.org/markup-compatibility/2006" xmlns:aink="http://schemas.microsoft.com/office/drawing/2016/ink" xmlns:am3d="http://schemas.microsoft.com/office/drawing/2017/model3d" xmlns:o="urn:schemas-microsoft-com:office:office" xmlns:oel="http://schemas.microsoft.com/office/2019/extlst" xmlns:r="http://schemas.openxmlformats.org/officeDocument/2006/relationships" xmlns:m="http://schemas.openxmlformats.org/officeDocument/2006/math" xmlns:v="urn:schemas-microsoft-com:vml" xmlns:wp14="http://schemas.microsoft.com/office/word/2010/wordprocessingDrawing" xmlns:wp="http://schemas.openxmlformats.org/drawingml/2006/wordprocessingDrawing" xmlns:w10="urn:schemas-microsoft-com:office:word" xmlns:w="http://schemas.openxmlformats.org/wordprocessingml/2006/main" xmlns:w14="http://schemas.microsoft.com/office/word/2010/wordml" xmlns:w15="http://schemas.microsoft.com/office/word/2012/wordml" xmlns:w16cex="http://schemas.microsoft.com/office/word/2018/wordml/cex" xmlns:w16cid="http://schemas.microsoft.com/office/word/2016/wordml/cid" xmlns:w16="http://schemas.microsoft.com/office/word/2018/wordml" xmlns:w16du="http://schemas.microsoft.com/office/word/2023/wordml/word16du" xmlns:w16sdtdh="http://schemas.microsoft.com/office/word/2020/wordml/sdtdatahash" xmlns:w16sdtfl="http://schemas.microsoft.com/office/word/2024/wordml/sdtformatlock" xmlns:w16se="http://schemas.microsoft.com/office/word/2015/wordml/symex" xmlns:wpg="http://schemas.microsoft.com/office/word/2010/wordprocessingGroup" xmlns:wpi="http://schemas.microsoft.com/office/word/2010/wordprocessingInk" xmlns:wne="http://schemas.microsoft.com/office/word/2006/wordml" xmlns:wps="http://schemas.microsoft.com/office/word/2010/wordprocessingShape" mc:Ignorable="w14 w15 w16se w16cid w16 w16cex w16sdtdh w16sdtfl w16du wp14">
   <w:abstractNum w:abstractNumId="0" w15:restartNumberingAfterBreak="0">
     <w:nsid w:val="01082DED"/>
     <w:multiLevelType w:val="multilevel"/>
@@ -5514,7 +5838,7 @@
     <w:lvl w:ilvl="0">
       <w:start w:val="1"/>
       <w:numFmt w:val="decimal"/>
-      <w:pStyle w:val="ListParagraph"/>
+      <w:pStyle w:val="a"/>
       <w:lvlText w:val="%1."/>
       <w:lvlJc w:val="left"/>
       <w:pPr>
@@ -6437,60 +6761,60 @@
       </w:rPr>
     </w:lvl>
   </w:abstractNum>
-  <w:num w:numId="1">
+  <w:num w:numId="1" w16cid:durableId="236668776">
     <w:abstractNumId w:val="0"/>
   </w:num>
-  <w:num w:numId="2">
+  <w:num w:numId="2" w16cid:durableId="687025635">
     <w:abstractNumId w:val="13"/>
   </w:num>
-  <w:num w:numId="3">
+  <w:num w:numId="3" w16cid:durableId="1545092569">
     <w:abstractNumId w:val="9"/>
   </w:num>
-  <w:num w:numId="4">
+  <w:num w:numId="4" w16cid:durableId="901061804">
     <w:abstractNumId w:val="1"/>
   </w:num>
-  <w:num w:numId="5">
+  <w:num w:numId="5" w16cid:durableId="967979743">
     <w:abstractNumId w:val="3"/>
   </w:num>
-  <w:num w:numId="6">
+  <w:num w:numId="6" w16cid:durableId="1837334071">
     <w:abstractNumId w:val="6"/>
   </w:num>
-  <w:num w:numId="7">
+  <w:num w:numId="7" w16cid:durableId="1811512185">
     <w:abstractNumId w:val="11"/>
   </w:num>
-  <w:num w:numId="8">
+  <w:num w:numId="8" w16cid:durableId="1277833565">
     <w:abstractNumId w:val="2"/>
   </w:num>
-  <w:num w:numId="9">
+  <w:num w:numId="9" w16cid:durableId="175046694">
     <w:abstractNumId w:val="7"/>
   </w:num>
-  <w:num w:numId="10">
+  <w:num w:numId="10" w16cid:durableId="531267442">
     <w:abstractNumId w:val="14"/>
   </w:num>
-  <w:num w:numId="11">
+  <w:num w:numId="11" w16cid:durableId="1499348556">
     <w:abstractNumId w:val="5"/>
   </w:num>
-  <w:num w:numId="12">
+  <w:num w:numId="12" w16cid:durableId="2062292016">
     <w:abstractNumId w:val="12"/>
   </w:num>
-  <w:num w:numId="13">
+  <w:num w:numId="13" w16cid:durableId="955873300">
     <w:abstractNumId w:val="8"/>
   </w:num>
-  <w:num w:numId="14">
+  <w:num w:numId="14" w16cid:durableId="1933970136">
     <w:abstractNumId w:val="4"/>
   </w:num>
-  <w:num w:numId="15">
+  <w:num w:numId="15" w16cid:durableId="356656756">
     <w:abstractNumId w:val="10"/>
   </w:num>
 </w:numbering>
 </file>
 
 <file path=word/styles.xml><?xml version="1.0" encoding="utf-8"?>
-<w:styles xmlns:mc="http://schemas.openxmlformats.org/markup-compatibility/2006" xmlns:r="http://schemas.openxmlformats.org/officeDocument/2006/relationships" xmlns:w="http://schemas.openxmlformats.org/wordprocessingml/2006/main" xmlns:w14="http://schemas.microsoft.com/office/word/2010/wordml" xmlns:w15="http://schemas.microsoft.com/office/word/2012/wordml" xmlns:w16cid="http://schemas.microsoft.com/office/word/2016/wordml/cid" xmlns:w16se="http://schemas.microsoft.com/office/word/2015/wordml/symex" mc:Ignorable="w14 w15 w16se w16cid">
+<w:styles xmlns:mc="http://schemas.openxmlformats.org/markup-compatibility/2006" xmlns:r="http://schemas.openxmlformats.org/officeDocument/2006/relationships" xmlns:w="http://schemas.openxmlformats.org/wordprocessingml/2006/main" xmlns:w14="http://schemas.microsoft.com/office/word/2010/wordml" xmlns:w15="http://schemas.microsoft.com/office/word/2012/wordml" xmlns:w16cex="http://schemas.microsoft.com/office/word/2018/wordml/cex" xmlns:w16cid="http://schemas.microsoft.com/office/word/2016/wordml/cid" xmlns:w16="http://schemas.microsoft.com/office/word/2018/wordml" xmlns:w16du="http://schemas.microsoft.com/office/word/2023/wordml/word16du" xmlns:w16sdtdh="http://schemas.microsoft.com/office/word/2020/wordml/sdtdatahash" xmlns:w16sdtfl="http://schemas.microsoft.com/office/word/2024/wordml/sdtformatlock" xmlns:w16se="http://schemas.microsoft.com/office/word/2015/wordml/symex" mc:Ignorable="w14 w15 w16se w16cid w16 w16cex w16sdtdh w16sdtfl w16du">
   <w:docDefaults>
     <w:rPrDefault>
       <w:rPr>
-        <w:rFonts w:asciiTheme="minorHAnsi" w:eastAsiaTheme="minorHAnsi" w:hAnsiTheme="minorHAnsi" w:cstheme="minorBidi"/>
+        <w:rFonts w:asciiTheme="minorHAnsi" w:eastAsiaTheme="minorEastAsia" w:hAnsiTheme="minorHAnsi" w:cstheme="minorBidi"/>
         <w:sz w:val="22"/>
         <w:szCs w:val="22"/>
         <w:lang w:val="en-US" w:eastAsia="en-US" w:bidi="ar-SA"/>
@@ -6502,7 +6826,7 @@
       </w:pPr>
     </w:pPrDefault>
   </w:docDefaults>
-  <w:latentStyles w:defLockedState="0" w:defUIPriority="99" w:defSemiHidden="0" w:defUnhideWhenUsed="0" w:defQFormat="0" w:count="375">
+  <w:latentStyles w:defLockedState="0" w:defUIPriority="99" w:defSemiHidden="0" w:defUnhideWhenUsed="0" w:defQFormat="0" w:count="376">
     <w:lsdException w:name="Normal" w:uiPriority="0" w:qFormat="1"/>
     <w:lsdException w:name="heading 1" w:uiPriority="9" w:qFormat="1"/>
     <w:lsdException w:name="heading 2" w:semiHidden="1" w:uiPriority="9" w:unhideWhenUsed="1" w:qFormat="1"/>
@@ -6878,16 +7202,17 @@
     <w:lsdException w:name="Smart Hyperlink" w:semiHidden="1" w:unhideWhenUsed="1"/>
     <w:lsdException w:name="Hashtag" w:semiHidden="1" w:unhideWhenUsed="1"/>
     <w:lsdException w:name="Unresolved Mention" w:semiHidden="1" w:unhideWhenUsed="1"/>
+    <w:lsdException w:name="Smart Link" w:semiHidden="1" w:unhideWhenUsed="1"/>
   </w:latentStyles>
-  <w:style w:type="paragraph" w:default="1" w:styleId="Normal">
+  <w:style w:type="paragraph" w:default="1" w:styleId="a0">
     <w:name w:val="Normal"/>
     <w:qFormat/>
   </w:style>
-  <w:style w:type="paragraph" w:styleId="Heading1">
+  <w:style w:type="paragraph" w:styleId="1">
     <w:name w:val="heading 1"/>
-    <w:basedOn w:val="Normal"/>
-    <w:next w:val="Normal"/>
-    <w:link w:val="Heading1Char"/>
+    <w:basedOn w:val="a0"/>
+    <w:next w:val="a0"/>
+    <w:link w:val="1Char"/>
     <w:uiPriority w:val="9"/>
     <w:qFormat/>
     <w:rsid w:val="005B434B"/>
@@ -6904,11 +7229,11 @@
       <w:szCs w:val="32"/>
     </w:rPr>
   </w:style>
-  <w:style w:type="paragraph" w:styleId="Heading2">
+  <w:style w:type="paragraph" w:styleId="2">
     <w:name w:val="heading 2"/>
-    <w:basedOn w:val="Normal"/>
-    <w:next w:val="Normal"/>
-    <w:link w:val="Heading2Char"/>
+    <w:basedOn w:val="a0"/>
+    <w:next w:val="a0"/>
+    <w:link w:val="2Char"/>
     <w:uiPriority w:val="9"/>
     <w:semiHidden/>
     <w:unhideWhenUsed/>
@@ -6927,13 +7252,13 @@
       <w:szCs w:val="26"/>
     </w:rPr>
   </w:style>
-  <w:style w:type="character" w:default="1" w:styleId="DefaultParagraphFont">
+  <w:style w:type="character" w:default="1" w:styleId="a1">
     <w:name w:val="Default Paragraph Font"/>
     <w:uiPriority w:val="1"/>
     <w:semiHidden/>
     <w:unhideWhenUsed/>
   </w:style>
-  <w:style w:type="table" w:default="1" w:styleId="TableNormal">
+  <w:style w:type="table" w:default="1" w:styleId="a2">
     <w:name w:val="Normal Table"/>
     <w:uiPriority w:val="99"/>
     <w:semiHidden/>
@@ -6948,7 +7273,7 @@
       </w:tblCellMar>
     </w:tblPr>
   </w:style>
-  <w:style w:type="numbering" w:default="1" w:styleId="NoList">
+  <w:style w:type="numbering" w:default="1" w:styleId="a3">
     <w:name w:val="No List"/>
     <w:uiPriority w:val="99"/>
     <w:semiHidden/>
@@ -6983,7 +7308,7 @@
   </w:style>
   <w:style w:type="paragraph" w:customStyle="1" w:styleId="Image">
     <w:name w:val="Image"/>
-    <w:basedOn w:val="Normal"/>
+    <w:basedOn w:val="a0"/>
     <w:rsid w:val="005B434B"/>
     <w:pPr>
       <w:keepNext/>
@@ -6996,7 +7321,7 @@
       <w:szCs w:val="24"/>
     </w:rPr>
   </w:style>
-  <w:style w:type="paragraph" w:styleId="ListParagraph">
+  <w:style w:type="paragraph" w:styleId="a">
     <w:name w:val="List Paragraph"/>
     <w:qFormat/>
     <w:rsid w:val="005B434B"/>
@@ -7020,7 +7345,7 @@
   </w:style>
   <w:style w:type="paragraph" w:customStyle="1" w:styleId="Head1">
     <w:name w:val="Head1"/>
-    <w:basedOn w:val="Heading1"/>
+    <w:basedOn w:val="1"/>
     <w:next w:val="Para"/>
     <w:qFormat/>
     <w:rsid w:val="005B434B"/>
@@ -7046,7 +7371,7 @@
   </w:style>
   <w:style w:type="paragraph" w:customStyle="1" w:styleId="Head2">
     <w:name w:val="Head2"/>
-    <w:basedOn w:val="Heading2"/>
+    <w:basedOn w:val="2"/>
     <w:next w:val="Para"/>
     <w:qFormat/>
     <w:rsid w:val="005B434B"/>
@@ -7089,7 +7414,7 @@
   </w:style>
   <w:style w:type="paragraph" w:customStyle="1" w:styleId="Para">
     <w:name w:val="Para"/>
-    <w:basedOn w:val="Normal"/>
+    <w:basedOn w:val="a0"/>
     <w:next w:val="ParaContinue"/>
     <w:rsid w:val="005B434B"/>
     <w:pPr>
@@ -7104,7 +7429,7 @@
       <w:lang w:eastAsia="ja-JP"/>
     </w:rPr>
   </w:style>
-  <w:style w:type="character" w:styleId="Hyperlink">
+  <w:style w:type="character" w:styleId="a4">
     <w:name w:val="Hyperlink"/>
     <w:rsid w:val="005B434B"/>
     <w:rPr>
@@ -7113,11 +7438,11 @@
       <w:u w:val="single"/>
     </w:rPr>
   </w:style>
-  <w:style w:type="paragraph" w:styleId="Subtitle">
+  <w:style w:type="paragraph" w:styleId="a5">
     <w:name w:val="Subtitle"/>
-    <w:basedOn w:val="Normal"/>
-    <w:next w:val="Normal"/>
-    <w:link w:val="SubtitleChar"/>
+    <w:basedOn w:val="a0"/>
+    <w:next w:val="a0"/>
+    <w:link w:val="Char"/>
     <w:qFormat/>
     <w:rsid w:val="005B434B"/>
     <w:pPr>
@@ -7130,10 +7455,10 @@
       <w:szCs w:val="24"/>
     </w:rPr>
   </w:style>
-  <w:style w:type="character" w:customStyle="1" w:styleId="SubtitleChar">
-    <w:name w:val="Subtitle Char"/>
-    <w:basedOn w:val="DefaultParagraphFont"/>
-    <w:link w:val="Subtitle"/>
+  <w:style w:type="character" w:customStyle="1" w:styleId="Char">
+    <w:name w:val="부제 Char"/>
+    <w:basedOn w:val="a1"/>
+    <w:link w:val="a5"/>
     <w:rsid w:val="005B434B"/>
     <w:rPr>
       <w:rFonts w:ascii="Linux Biolinum O" w:eastAsia="MS Gothic" w:hAnsi="Linux Biolinum O" w:cs="Linux Biolinum O"/>
@@ -7197,7 +7522,7 @@
   </w:style>
   <w:style w:type="character" w:customStyle="1" w:styleId="TitledocumentChar">
     <w:name w:val="Title_document Char"/>
-    <w:basedOn w:val="DefaultParagraphFont"/>
+    <w:basedOn w:val="a1"/>
     <w:link w:val="Titledocument"/>
     <w:rsid w:val="005B434B"/>
     <w:rPr>
@@ -7238,7 +7563,7 @@
   </w:style>
   <w:style w:type="paragraph" w:customStyle="1" w:styleId="AckPara">
     <w:name w:val="AckPara"/>
-    <w:basedOn w:val="Normal"/>
+    <w:basedOn w:val="a0"/>
     <w:next w:val="ParaContinue"/>
     <w:rsid w:val="005B434B"/>
     <w:pPr>
@@ -7381,7 +7706,7 @@
   </w:style>
   <w:style w:type="paragraph" w:customStyle="1" w:styleId="KeyWords">
     <w:name w:val="KeyWords"/>
-    <w:basedOn w:val="Normal"/>
+    <w:basedOn w:val="a0"/>
     <w:rsid w:val="005B434B"/>
     <w:pPr>
       <w:spacing w:before="140" w:after="0" w:line="270" w:lineRule="atLeast"/>
@@ -7409,7 +7734,7 @@
   </w:style>
   <w:style w:type="paragraph" w:customStyle="1" w:styleId="Statements">
     <w:name w:val="Statements"/>
-    <w:basedOn w:val="Normal"/>
+    <w:basedOn w:val="a0"/>
     <w:rsid w:val="005B434B"/>
     <w:pPr>
       <w:spacing w:before="120" w:after="120" w:line="225" w:lineRule="atLeast"/>
@@ -7479,7 +7804,7 @@
   </w:style>
   <w:style w:type="paragraph" w:customStyle="1" w:styleId="DisplayFormulaUnnum">
     <w:name w:val="DisplayFormulaUnnum"/>
-    <w:basedOn w:val="Normal"/>
+    <w:basedOn w:val="a0"/>
     <w:link w:val="DisplayFormulaUnnumChar"/>
     <w:rsid w:val="005B434B"/>
     <w:pPr>
@@ -7507,7 +7832,7 @@
   </w:style>
   <w:style w:type="paragraph" w:customStyle="1" w:styleId="ParaContinue">
     <w:name w:val="ParaContinue"/>
-    <w:basedOn w:val="Normal"/>
+    <w:basedOn w:val="a0"/>
     <w:link w:val="ParaContinueChar"/>
     <w:rsid w:val="005B434B"/>
     <w:pPr>
@@ -7524,7 +7849,7 @@
   </w:style>
   <w:style w:type="paragraph" w:customStyle="1" w:styleId="Bibentry">
     <w:name w:val="Bib_entry"/>
-    <w:basedOn w:val="Normal"/>
+    <w:basedOn w:val="a0"/>
     <w:rsid w:val="005B434B"/>
     <w:pPr>
       <w:widowControl w:val="0"/>
@@ -7542,7 +7867,7 @@
   </w:style>
   <w:style w:type="paragraph" w:customStyle="1" w:styleId="Algorithm">
     <w:name w:val="Algorithm"/>
-    <w:basedOn w:val="Normal"/>
+    <w:basedOn w:val="a0"/>
     <w:rsid w:val="005B434B"/>
     <w:pPr>
       <w:pBdr>
@@ -7558,7 +7883,7 @@
   </w:style>
   <w:style w:type="paragraph" w:customStyle="1" w:styleId="Extract">
     <w:name w:val="Extract"/>
-    <w:basedOn w:val="Normal"/>
+    <w:basedOn w:val="a0"/>
     <w:rsid w:val="005B434B"/>
     <w:pPr>
       <w:spacing w:before="120" w:after="180" w:line="270" w:lineRule="atLeast"/>
@@ -7594,7 +7919,7 @@
   </w:style>
   <w:style w:type="paragraph" w:customStyle="1" w:styleId="AlgorithmCaption">
     <w:name w:val="AlgorithmCaption"/>
-    <w:basedOn w:val="Normal"/>
+    <w:basedOn w:val="a0"/>
     <w:rsid w:val="005B434B"/>
     <w:pPr>
       <w:keepNext/>
@@ -7619,10 +7944,10 @@
       <w:color w:val="9900FF"/>
     </w:rPr>
   </w:style>
-  <w:style w:type="paragraph" w:styleId="Footer">
+  <w:style w:type="paragraph" w:styleId="a6">
     <w:name w:val="footer"/>
-    <w:basedOn w:val="Normal"/>
-    <w:link w:val="FooterChar"/>
+    <w:basedOn w:val="a0"/>
+    <w:link w:val="Char0"/>
     <w:uiPriority w:val="99"/>
     <w:unhideWhenUsed/>
     <w:rsid w:val="005B434B"/>
@@ -7640,10 +7965,10 @@
       <w:lang w:eastAsia="ja-JP"/>
     </w:rPr>
   </w:style>
-  <w:style w:type="character" w:customStyle="1" w:styleId="FooterChar">
-    <w:name w:val="Footer Char"/>
-    <w:basedOn w:val="DefaultParagraphFont"/>
-    <w:link w:val="Footer"/>
+  <w:style w:type="character" w:customStyle="1" w:styleId="Char0">
+    <w:name w:val="바닥글 Char"/>
+    <w:basedOn w:val="a1"/>
+    <w:link w:val="a6"/>
     <w:uiPriority w:val="99"/>
     <w:rsid w:val="005B434B"/>
     <w:rPr>
@@ -7655,7 +7980,7 @@
   </w:style>
   <w:style w:type="numbering" w:styleId="111111">
     <w:name w:val="Outline List 2"/>
-    <w:basedOn w:val="NoList"/>
+    <w:basedOn w:val="a3"/>
     <w:uiPriority w:val="99"/>
     <w:semiHidden/>
     <w:unhideWhenUsed/>
@@ -7666,9 +7991,9 @@
       </w:numPr>
     </w:pPr>
   </w:style>
-  <w:style w:type="table" w:styleId="TableGrid">
+  <w:style w:type="table" w:styleId="a7">
     <w:name w:val="Table Grid"/>
-    <w:basedOn w:val="TableNormal"/>
+    <w:basedOn w:val="a2"/>
     <w:uiPriority w:val="59"/>
     <w:rsid w:val="005B434B"/>
     <w:pPr>
@@ -7720,7 +8045,7 @@
   </w:style>
   <w:style w:type="character" w:customStyle="1" w:styleId="CCSHeadchar">
     <w:name w:val="CCSHead char"/>
-    <w:basedOn w:val="DefaultParagraphFont"/>
+    <w:basedOn w:val="a1"/>
     <w:link w:val="CCSHead"/>
     <w:rsid w:val="005B434B"/>
     <w:rPr>
@@ -7731,7 +8056,7 @@
   </w:style>
   <w:style w:type="character" w:customStyle="1" w:styleId="KeyWordHeadchar">
     <w:name w:val="KeyWordHead char"/>
-    <w:basedOn w:val="DefaultParagraphFont"/>
+    <w:basedOn w:val="a1"/>
     <w:link w:val="KeyWordHead"/>
     <w:rsid w:val="005B434B"/>
     <w:rPr>
@@ -7754,7 +8079,7 @@
   </w:style>
   <w:style w:type="character" w:customStyle="1" w:styleId="Head3oldChar">
     <w:name w:val="Head3old Char"/>
-    <w:basedOn w:val="DefaultParagraphFont"/>
+    <w:basedOn w:val="a1"/>
     <w:link w:val="Head3old"/>
     <w:rsid w:val="005B434B"/>
     <w:rPr>
@@ -7794,7 +8119,7 @@
   </w:style>
   <w:style w:type="character" w:customStyle="1" w:styleId="Parachar">
     <w:name w:val="Para char"/>
-    <w:basedOn w:val="DefaultParagraphFont"/>
+    <w:basedOn w:val="a1"/>
     <w:rsid w:val="005B434B"/>
     <w:rPr>
       <w:rFonts w:ascii="Linux Libertine O" w:hAnsi="Linux Libertine O" w:cs="Linux Libertine O"/>
@@ -7838,10 +8163,10 @@
       <w:lang w:eastAsia="en-US"/>
     </w:rPr>
   </w:style>
-  <w:style w:type="character" w:customStyle="1" w:styleId="Heading1Char">
-    <w:name w:val="Heading 1 Char"/>
-    <w:basedOn w:val="DefaultParagraphFont"/>
-    <w:link w:val="Heading1"/>
+  <w:style w:type="character" w:customStyle="1" w:styleId="1Char">
+    <w:name w:val="제목 1 Char"/>
+    <w:basedOn w:val="a1"/>
+    <w:link w:val="1"/>
     <w:uiPriority w:val="9"/>
     <w:rsid w:val="005B434B"/>
     <w:rPr>
@@ -7851,10 +8176,10 @@
       <w:szCs w:val="32"/>
     </w:rPr>
   </w:style>
-  <w:style w:type="character" w:customStyle="1" w:styleId="Heading2Char">
-    <w:name w:val="Heading 2 Char"/>
-    <w:basedOn w:val="DefaultParagraphFont"/>
-    <w:link w:val="Heading2"/>
+  <w:style w:type="character" w:customStyle="1" w:styleId="2Char">
+    <w:name w:val="제목 2 Char"/>
+    <w:basedOn w:val="a1"/>
+    <w:link w:val="2"/>
     <w:uiPriority w:val="9"/>
     <w:semiHidden/>
     <w:rsid w:val="005B434B"/>
@@ -7867,7 +8192,7 @@
   </w:style>
   <w:style w:type="character" w:customStyle="1" w:styleId="In-textcode">
     <w:name w:val="In-text code"/>
-    <w:basedOn w:val="DefaultParagraphFont"/>
+    <w:basedOn w:val="a1"/>
     <w:uiPriority w:val="1"/>
     <w:qFormat/>
     <w:rsid w:val="003A253B"/>
@@ -7888,7 +8213,7 @@
   </w:style>
   <w:style w:type="paragraph" w:customStyle="1" w:styleId="ComputerCode">
     <w:name w:val="ComputerCode"/>
-    <w:basedOn w:val="Normal"/>
+    <w:basedOn w:val="a0"/>
     <w:qFormat/>
     <w:rsid w:val="00A6011A"/>
     <w:pPr>
@@ -7932,7 +8257,7 @@
   </w:style>
   <w:style w:type="paragraph" w:customStyle="1" w:styleId="TableFootnote">
     <w:name w:val="TableFootnote"/>
-    <w:basedOn w:val="Normal"/>
+    <w:basedOn w:val="a0"/>
     <w:link w:val="TableFootnoteChar"/>
     <w:rsid w:val="005C3913"/>
     <w:pPr>
@@ -7941,6 +8266,28 @@
     <w:rPr>
       <w:rFonts w:eastAsia="Cambria"/>
     </w:rPr>
+  </w:style>
+  <w:style w:type="paragraph" w:styleId="a8">
+    <w:name w:val="header"/>
+    <w:basedOn w:val="a0"/>
+    <w:link w:val="Char1"/>
+    <w:uiPriority w:val="99"/>
+    <w:unhideWhenUsed/>
+    <w:rsid w:val="0056719C"/>
+    <w:pPr>
+      <w:tabs>
+        <w:tab w:val="center" w:pos="4513"/>
+        <w:tab w:val="right" w:pos="9026"/>
+      </w:tabs>
+      <w:snapToGrid w:val="0"/>
+    </w:pPr>
+  </w:style>
+  <w:style w:type="character" w:customStyle="1" w:styleId="Char1">
+    <w:name w:val="머리글 Char"/>
+    <w:basedOn w:val="a1"/>
+    <w:link w:val="a8"/>
+    <w:uiPriority w:val="99"/>
+    <w:rsid w:val="0056719C"/>
   </w:style>
 </w:styles>
 </file>
@@ -8204,4 +8551,26 @@
     </a:ext>
   </a:extLst>
 </a:theme>
+</file>
+
+<file path=word/webextensions/taskpanes.xml><?xml version="1.0" encoding="utf-8"?>
+<wetp:taskpanes xmlns:wetp="http://schemas.microsoft.com/office/webextensions/taskpanes/2010/11">
+  <wetp:taskpane dockstate="right" visibility="0" width="350" row="0">
+    <wetp:webextensionref xmlns:r="http://schemas.openxmlformats.org/officeDocument/2006/relationships" r:id="rId1"/>
+  </wetp:taskpane>
+</wetp:taskpanes>
+</file>
+
+<file path=word/webextensions/webextension1.xml><?xml version="1.0" encoding="utf-8"?>
+<we:webextension xmlns:we="http://schemas.microsoft.com/office/webextensions/webextension/2010/11" id="{0CF5A8E0-ACD2-134D-906C-3E2B2F1D5057}">
+  <we:reference id="d51ccb01-85e7-42ab-885b-de05c07799f3" version="1.0.0.1" store="EXCatalog" storeType="EXCatalog"/>
+  <we:alternateReferences>
+    <we:reference id="WA200010453" version="1.0.0.1" store="ko-KR" storeType="OMEX"/>
+  </we:alternateReferences>
+  <we:properties>
+    <we:property name="claude.fileId" value="&quot;89681537-37f9-4a3d-ba09-1da1958a4810&quot;"/>
+  </we:properties>
+  <we:bindings/>
+  <we:snapshot xmlns:r="http://schemas.openxmlformats.org/officeDocument/2006/relationships"/>
+</we:webextension>
 </file>
</xml_diff>

<commit_message>
Add robust statistics analysis for FAIR protocol and benchmark reports
- Implemented robust small-sample statistics for the FAIR protocol in `robust_stats_fair.py`, including permutation tests, bootstrap confidence intervals, effect sizes, and power analysis.
- Generated summary report `robust_stats_fair_summary.json` for various models (TreeRAG-Beam vs baselines) across different metrics (LLM-Judge, ROUGE-L, Citation F1, HotpotQA).
- Added detailed results for HotpotQA with 100 samples in `robust_stats_hotpot_n100.json`.
- Created initial version of `~$eeRAG_TIST_ACM.docx` for documentation purposes.
</commit_message>
<xml_diff>
--- a/TreeRAG_TIST_ACM.docx
+++ b/TreeRAG_TIST_ACM.docx
@@ -112,7 +112,7 @@
         <w:pStyle w:val="Para"/>
       </w:pPr>
       <w:r>
-        <w:t>We introduce TreeRAG, which unifies these capabilities. Our contributions are as follows.</w:t>
+        <w:t>We introduce TreeRAG. Unlike prior hierarchical RAG systems, which optimize retrieval quality in isolation and are judged largely by lexical-overlap metrics, TreeRAG jointly targets three properties that matter for deployment in citation-critical domains—page-level citation faithfulness, an order-of-magnitude reduction in the context handed to the generator, and a generator-controlled evaluation that isolates the retriever's contribution—over a single page-aware tree built zero-shot from raw PDFs. Our contributions are as follows.</w:t>
       </w:r>
     </w:p>
     <w:p>
@@ -152,15 +152,7 @@
         <w:pStyle w:val="a"/>
       </w:pPr>
       <w:r>
-        <w:t>(5) Fair, Generator-Controlled Evaluation. We evaluate all systems under a protocol in which the retrieval stage varies but every system generates with the same local LLM, and we measure axes that flat retrievers cannot satisfy by construction-page-level citation accuracy and context efficiency-alongside reference- and judge-based answer quality. Under this protocol TreeRAG-Beam delivers the most accurate citations, the highest LLM-judged quality on multi-hop and comparative questions, and competitive overall quality with an order of magnitude fewer context tokens.</w:t>
-      </w:r>
-    </w:p>
-    <w:p>
-      <w:pPr>
-        <w:pStyle w:val="a"/>
-      </w:pPr>
-      <w:r>
-        <w:t>(6) A Cautionary Methodological Finding. We show that offline extractive evaluation and lexical-overlap metrics (ROUGE-L) reverse the system ranking-flattering whichever system most resembles the reference surface form-and we report both the extractive and the fair generative regimes so that the discrepancy is explicit rather than hidden.</w:t>
+        <w:t>(5) Fair Evaluation and a Cautionary Methodological Finding. We evaluate all systems under a protocol in which only the retrieval stage varies while every system generates with the same local LLM, measuring axes that flat retrievers cannot satisfy by construction—page-level citation accuracy and context efficiency—alongside reference- and judge-based answer quality. We further show that offline extractive evaluation and lexical-overlap metrics (ROUGE-L) reverse the system ranking—flattering whichever system most resembles the reference surface form—and we report both the extractive and the fair generative regimes so that the discrepancy is explicit rather than hidden.</w:t>
       </w:r>
     </w:p>
     <w:p>
@@ -252,10 +244,546 @@
         <w:t xml:space="preserve">RAG substantially reduces hallucination by grounding generation in retrieved text, but does not eliminate it [31]. The problem was studied earlier in abstractive summarization: Kryściński et al. [17] train a weakly-supervised model (FactCC) </w:t>
       </w:r>
       <w:r>
-        <w:lastRenderedPageBreak/>
         <w:t>to verify whether a generated sentence is factually consistent with its source and to extract supporting spans, while Nan et al. [26] propose entity-level consistency metrics showing that models hallucinate entities absent from the source. These motivate TreeRAG's source-grounded signals, including its medical entity recall metric (Section 5.3). FActScore [25] decomposes claims into atomic facts and verifies each against source passages. RAGAS [4] defines faithfulness, answer relevance, and context recall as automatic metrics. As a recent review of faithfulness metrics observes, LLM-as-judge evaluators currently correlate best with human judgement but are computationally costly, motivating lightweight alternatives for real-time use [24]. TreeRAG's hallucination detector operates at sentence level using five lightweight overlap signals, providing a fast, LLM-free confidence estimate compatible with real-time serving.</w:t>
       </w:r>
-    </w:p>
+      <w:r>
+        <w:t xml:space="preserve"> Table 1 summarizes how these capabilities compare across representative hierarchical and structure-aware RAG systems, including TreeRAG.</w:t>
+      </w:r>
+    </w:p>
+    <w:p>
+      <w:pPr>
+        <w:pStyle w:val="TableCaption"/>
+      </w:pPr>
+      <w:r>
+        <w:t>Table 1: Capability comparison of representative hierarchical and structure-aware RAG systems. Tree index = builds a hierarchical document index; Traversal choice = query-time selection among traversal strategies; Compression = post-retrieval context compression; Hallucination = built-in answer-faithfulness layer; Page citation = answers carry page-level provenance. A check denotes the capability is present.</w:t>
+      </w:r>
+    </w:p>
+    <w:tbl>
+      <w:tblPr>
+        <w:tblW w:type="auto" w:w="0"/>
+        <w:tblLook w:firstColumn="1" w:firstRow="1" w:lastColumn="0" w:lastRow="0" w:noHBand="0" w:noVBand="1" w:val="04A0"/>
+      </w:tblPr>
+      <w:tblGrid>
+        <w:gridCol w:w="1460"/>
+        <w:gridCol w:w="1460"/>
+        <w:gridCol w:w="1460"/>
+        <w:gridCol w:w="1460"/>
+        <w:gridCol w:w="1460"/>
+        <w:gridCol w:w="1460"/>
+      </w:tblGrid>
+      <w:tr>
+        <w:tc>
+          <w:tcPr>
+            <w:tcW w:type="dxa" w:w="1460"/>
+          </w:tcPr>
+          <w:p>
+            <w:r/>
+            <w:r>
+              <w:rPr>
+                <w:b/>
+              </w:rPr>
+              <w:t>System</w:t>
+            </w:r>
+          </w:p>
+        </w:tc>
+        <w:tc>
+          <w:tcPr>
+            <w:tcW w:type="dxa" w:w="1460"/>
+          </w:tcPr>
+          <w:p>
+            <w:r/>
+            <w:r>
+              <w:rPr>
+                <w:b/>
+              </w:rPr>
+              <w:t>Tree index</w:t>
+            </w:r>
+          </w:p>
+        </w:tc>
+        <w:tc>
+          <w:tcPr>
+            <w:tcW w:type="dxa" w:w="1460"/>
+          </w:tcPr>
+          <w:p>
+            <w:r/>
+            <w:r>
+              <w:rPr>
+                <w:b/>
+              </w:rPr>
+              <w:t>Traversal choice</w:t>
+            </w:r>
+          </w:p>
+        </w:tc>
+        <w:tc>
+          <w:tcPr>
+            <w:tcW w:type="dxa" w:w="1460"/>
+          </w:tcPr>
+          <w:p>
+            <w:r/>
+            <w:r>
+              <w:rPr>
+                <w:b/>
+              </w:rPr>
+              <w:t>Compression</w:t>
+            </w:r>
+          </w:p>
+        </w:tc>
+        <w:tc>
+          <w:tcPr>
+            <w:tcW w:type="dxa" w:w="1460"/>
+          </w:tcPr>
+          <w:p>
+            <w:r/>
+            <w:r>
+              <w:rPr>
+                <w:b/>
+              </w:rPr>
+              <w:t>Hallucination</w:t>
+            </w:r>
+          </w:p>
+        </w:tc>
+        <w:tc>
+          <w:tcPr>
+            <w:tcW w:type="dxa" w:w="1460"/>
+          </w:tcPr>
+          <w:p>
+            <w:r/>
+            <w:r>
+              <w:rPr>
+                <w:b/>
+              </w:rPr>
+              <w:t>Page citation</w:t>
+            </w:r>
+          </w:p>
+        </w:tc>
+      </w:tr>
+      <w:tr>
+        <w:tc>
+          <w:tcPr>
+            <w:tcW w:type="dxa" w:w="1460"/>
+          </w:tcPr>
+          <w:p>
+            <w:r/>
+            <w:r>
+              <w:t>LlamaIndex [21]</w:t>
+            </w:r>
+          </w:p>
+        </w:tc>
+        <w:tc>
+          <w:tcPr>
+            <w:tcW w:type="dxa" w:w="1460"/>
+          </w:tcPr>
+          <w:p>
+            <w:r/>
+            <w:r>
+              <w:t>✓</w:t>
+            </w:r>
+          </w:p>
+        </w:tc>
+        <w:tc>
+          <w:tcPr>
+            <w:tcW w:type="dxa" w:w="1460"/>
+          </w:tcPr>
+          <w:p>
+            <w:r/>
+            <w:r>
+              <w:t>✗</w:t>
+            </w:r>
+          </w:p>
+        </w:tc>
+        <w:tc>
+          <w:tcPr>
+            <w:tcW w:type="dxa" w:w="1460"/>
+          </w:tcPr>
+          <w:p>
+            <w:r/>
+            <w:r>
+              <w:t>✗</w:t>
+            </w:r>
+          </w:p>
+        </w:tc>
+        <w:tc>
+          <w:tcPr>
+            <w:tcW w:type="dxa" w:w="1460"/>
+          </w:tcPr>
+          <w:p>
+            <w:r/>
+            <w:r>
+              <w:t>✗</w:t>
+            </w:r>
+          </w:p>
+        </w:tc>
+        <w:tc>
+          <w:tcPr>
+            <w:tcW w:type="dxa" w:w="1460"/>
+          </w:tcPr>
+          <w:p>
+            <w:r/>
+            <w:r>
+              <w:t>✗</w:t>
+            </w:r>
+          </w:p>
+        </w:tc>
+      </w:tr>
+      <w:tr>
+        <w:tc>
+          <w:tcPr>
+            <w:tcW w:type="dxa" w:w="1460"/>
+          </w:tcPr>
+          <w:p>
+            <w:r/>
+            <w:r>
+              <w:t>RAPTOR [30]</w:t>
+            </w:r>
+          </w:p>
+        </w:tc>
+        <w:tc>
+          <w:tcPr>
+            <w:tcW w:type="dxa" w:w="1460"/>
+          </w:tcPr>
+          <w:p>
+            <w:r/>
+            <w:r>
+              <w:t>✓</w:t>
+            </w:r>
+          </w:p>
+        </w:tc>
+        <w:tc>
+          <w:tcPr>
+            <w:tcW w:type="dxa" w:w="1460"/>
+          </w:tcPr>
+          <w:p>
+            <w:r/>
+            <w:r>
+              <w:t>✗</w:t>
+            </w:r>
+          </w:p>
+        </w:tc>
+        <w:tc>
+          <w:tcPr>
+            <w:tcW w:type="dxa" w:w="1460"/>
+          </w:tcPr>
+          <w:p>
+            <w:r/>
+            <w:r>
+              <w:t>✗</w:t>
+            </w:r>
+          </w:p>
+        </w:tc>
+        <w:tc>
+          <w:tcPr>
+            <w:tcW w:type="dxa" w:w="1460"/>
+          </w:tcPr>
+          <w:p>
+            <w:r/>
+            <w:r>
+              <w:t>✗</w:t>
+            </w:r>
+          </w:p>
+        </w:tc>
+        <w:tc>
+          <w:tcPr>
+            <w:tcW w:type="dxa" w:w="1460"/>
+          </w:tcPr>
+          <w:p>
+            <w:r/>
+            <w:r>
+              <w:t>✗</w:t>
+            </w:r>
+          </w:p>
+        </w:tc>
+      </w:tr>
+      <w:tr>
+        <w:tc>
+          <w:tcPr>
+            <w:tcW w:type="dxa" w:w="1460"/>
+          </w:tcPr>
+          <w:p>
+            <w:r/>
+            <w:r>
+              <w:t>PageIndex [33]</w:t>
+            </w:r>
+          </w:p>
+        </w:tc>
+        <w:tc>
+          <w:tcPr>
+            <w:tcW w:type="dxa" w:w="1460"/>
+          </w:tcPr>
+          <w:p>
+            <w:r/>
+            <w:r>
+              <w:t>✓</w:t>
+            </w:r>
+          </w:p>
+        </w:tc>
+        <w:tc>
+          <w:tcPr>
+            <w:tcW w:type="dxa" w:w="1460"/>
+          </w:tcPr>
+          <w:p>
+            <w:r/>
+            <w:r>
+              <w:t>✗</w:t>
+            </w:r>
+          </w:p>
+        </w:tc>
+        <w:tc>
+          <w:tcPr>
+            <w:tcW w:type="dxa" w:w="1460"/>
+          </w:tcPr>
+          <w:p>
+            <w:r/>
+            <w:r>
+              <w:t>✗</w:t>
+            </w:r>
+          </w:p>
+        </w:tc>
+        <w:tc>
+          <w:tcPr>
+            <w:tcW w:type="dxa" w:w="1460"/>
+          </w:tcPr>
+          <w:p>
+            <w:r/>
+            <w:r>
+              <w:t>✗</w:t>
+            </w:r>
+          </w:p>
+        </w:tc>
+        <w:tc>
+          <w:tcPr>
+            <w:tcW w:type="dxa" w:w="1460"/>
+          </w:tcPr>
+          <w:p>
+            <w:r/>
+            <w:r>
+              <w:t>✓</w:t>
+            </w:r>
+          </w:p>
+        </w:tc>
+      </w:tr>
+      <w:tr>
+        <w:tc>
+          <w:tcPr>
+            <w:tcW w:type="dxa" w:w="1460"/>
+          </w:tcPr>
+          <w:p>
+            <w:r/>
+            <w:r>
+              <w:t>HiRAG [10]</w:t>
+            </w:r>
+          </w:p>
+        </w:tc>
+        <w:tc>
+          <w:tcPr>
+            <w:tcW w:type="dxa" w:w="1460"/>
+          </w:tcPr>
+          <w:p>
+            <w:r/>
+            <w:r>
+              <w:t>✓</w:t>
+            </w:r>
+          </w:p>
+        </w:tc>
+        <w:tc>
+          <w:tcPr>
+            <w:tcW w:type="dxa" w:w="1460"/>
+          </w:tcPr>
+          <w:p>
+            <w:r/>
+            <w:r>
+              <w:t>✗</w:t>
+            </w:r>
+          </w:p>
+        </w:tc>
+        <w:tc>
+          <w:tcPr>
+            <w:tcW w:type="dxa" w:w="1460"/>
+          </w:tcPr>
+          <w:p>
+            <w:r/>
+            <w:r>
+              <w:t>✗</w:t>
+            </w:r>
+          </w:p>
+        </w:tc>
+        <w:tc>
+          <w:tcPr>
+            <w:tcW w:type="dxa" w:w="1460"/>
+          </w:tcPr>
+          <w:p>
+            <w:r/>
+            <w:r>
+              <w:t>✗</w:t>
+            </w:r>
+          </w:p>
+        </w:tc>
+        <w:tc>
+          <w:tcPr>
+            <w:tcW w:type="dxa" w:w="1460"/>
+          </w:tcPr>
+          <w:p>
+            <w:r/>
+            <w:r>
+              <w:t>✗</w:t>
+            </w:r>
+          </w:p>
+        </w:tc>
+      </w:tr>
+      <w:tr>
+        <w:tc>
+          <w:tcPr>
+            <w:tcW w:type="dxa" w:w="1460"/>
+          </w:tcPr>
+          <w:p>
+            <w:r/>
+            <w:r>
+              <w:t>GraphRAG [3]</w:t>
+            </w:r>
+          </w:p>
+        </w:tc>
+        <w:tc>
+          <w:tcPr>
+            <w:tcW w:type="dxa" w:w="1460"/>
+          </w:tcPr>
+          <w:p>
+            <w:r/>
+            <w:r>
+              <w:t>✗</w:t>
+            </w:r>
+          </w:p>
+        </w:tc>
+        <w:tc>
+          <w:tcPr>
+            <w:tcW w:type="dxa" w:w="1460"/>
+          </w:tcPr>
+          <w:p>
+            <w:r/>
+            <w:r>
+              <w:t>✗</w:t>
+            </w:r>
+          </w:p>
+        </w:tc>
+        <w:tc>
+          <w:tcPr>
+            <w:tcW w:type="dxa" w:w="1460"/>
+          </w:tcPr>
+          <w:p>
+            <w:r/>
+            <w:r>
+              <w:t>✗</w:t>
+            </w:r>
+          </w:p>
+        </w:tc>
+        <w:tc>
+          <w:tcPr>
+            <w:tcW w:type="dxa" w:w="1460"/>
+          </w:tcPr>
+          <w:p>
+            <w:r/>
+            <w:r>
+              <w:t>✗</w:t>
+            </w:r>
+          </w:p>
+        </w:tc>
+        <w:tc>
+          <w:tcPr>
+            <w:tcW w:type="dxa" w:w="1460"/>
+          </w:tcPr>
+          <w:p>
+            <w:r/>
+            <w:r>
+              <w:t>✗</w:t>
+            </w:r>
+          </w:p>
+        </w:tc>
+      </w:tr>
+      <w:tr>
+        <w:tc>
+          <w:tcPr>
+            <w:tcW w:type="dxa" w:w="1460"/>
+          </w:tcPr>
+          <w:p>
+            <w:r/>
+            <w:r>
+              <w:rPr>
+                <w:b/>
+              </w:rPr>
+              <w:t>TreeRAG (ours)</w:t>
+            </w:r>
+          </w:p>
+        </w:tc>
+        <w:tc>
+          <w:tcPr>
+            <w:tcW w:type="dxa" w:w="1460"/>
+          </w:tcPr>
+          <w:p>
+            <w:r/>
+            <w:r>
+              <w:rPr>
+                <w:b/>
+              </w:rPr>
+              <w:t>✓</w:t>
+            </w:r>
+          </w:p>
+        </w:tc>
+        <w:tc>
+          <w:tcPr>
+            <w:tcW w:type="dxa" w:w="1460"/>
+          </w:tcPr>
+          <w:p>
+            <w:r/>
+            <w:r>
+              <w:rPr>
+                <w:b/>
+              </w:rPr>
+              <w:t>✓</w:t>
+            </w:r>
+          </w:p>
+        </w:tc>
+        <w:tc>
+          <w:tcPr>
+            <w:tcW w:type="dxa" w:w="1460"/>
+          </w:tcPr>
+          <w:p>
+            <w:r/>
+            <w:r>
+              <w:rPr>
+                <w:b/>
+              </w:rPr>
+              <w:t>✓</w:t>
+            </w:r>
+          </w:p>
+        </w:tc>
+        <w:tc>
+          <w:tcPr>
+            <w:tcW w:type="dxa" w:w="1460"/>
+          </w:tcPr>
+          <w:p>
+            <w:r/>
+            <w:r>
+              <w:rPr>
+                <w:b/>
+              </w:rPr>
+              <w:t>✓</w:t>
+            </w:r>
+          </w:p>
+        </w:tc>
+        <w:tc>
+          <w:tcPr>
+            <w:tcW w:type="dxa" w:w="1460"/>
+          </w:tcPr>
+          <w:p>
+            <w:r/>
+            <w:r>
+              <w:rPr>
+                <w:b/>
+              </w:rPr>
+              <w:t>✓</w:t>
+            </w:r>
+          </w:p>
+        </w:tc>
+      </w:tr>
+    </w:tbl>
     <w:p>
       <w:pPr>
         <w:pStyle w:val="Head1"/>
@@ -364,8 +892,7 @@
         <w:pStyle w:val="Para"/>
       </w:pPr>
       <w:r>
-        <w:lastRenderedPageBreak/>
-        <w:t>Here semantic(v, q) is keyword overlap between the query and the node's title and summary, normalized by query length; structural(depth) is a depth-decay factor that slightly penalizes very deep nodes, encoding the prior that high-level sections capture broader relevance; and contextual(v, parent) is semantic overlap between the node and its parent's accumulated context string, encouraging traversal paths that maintain thematic coherence. The weights (0.7/0.2/0.1) were chosen to make semantic similarity dominant while letting structure break ties; we examine their effect in the ablation study.</w:t>
+        <w:t>Here semantic(v, q) is keyword overlap between the query and the node's title and summary, normalized by query length; structural(depth) is a depth-decay factor that slightly penalizes very deep nodes, encoding the prior that high-level sections capture broader relevance; and contextual(v, parent) is semantic overlap between the node and its parent's accumulated context string, encouraging traversal paths that maintain thematic coherence. The weights (λ₁, λ₂, λ₃) = (0.7, 0.2, 0.1) are fixed heuristic defaults, constrained to sum to one and set so that semantic similarity dominates while structural depth and parental coherence break ties; they are the system's default configuration rather than per-dataset tuned values. We also implemented a learned alternative to this fixed weighting, which yielded no improvement under our limited supervision (Section 6, Limitations), so we retain the interpretable fixed weights.</w:t>
       </w:r>
     </w:p>
     <w:p>
@@ -604,7 +1131,7 @@
         <w:pStyle w:val="Para"/>
       </w:pPr>
       <w:r>
-        <w:t>Relevance is scored with a three-component decomposition (semantic 0.6, keyword 0.2, structural 0.2). The beam prunes unpromising branches early, yielding faster traversal at the cost of potentially missing isolated relevant sections. The number of nodes evaluated is O(W · d · f), where f is the average fan-out; with W = 5, d = 5, f ≈ 5, at most 125 nodes are evaluated versus the DFS worst case of b^d.</w:t>
+        <w:t>Relevance is scored with a three-component decomposition whose weights (semantic 0.6, keyword 0.2, structural 0.2) place primary mass on the semantic/LLM score and split the remainder evenly between keyword overlap and structural depth; as with the DFS weights these are fixed defaults rather than per-dataset tuned values. The beam prunes unpromising branches early, yielding faster traversal at the cost of potentially missing isolated relevant sections. The number of nodes evaluated is O(W · d · f), where f is the average fan-out; with W = 5, d = 5, f ≈ 5, at most 125 nodes are evaluated versus the DFS worst case of b^d.</w:t>
       </w:r>
     </w:p>
     <w:p>
@@ -643,7 +1170,7 @@
         <w:pStyle w:val="PostHeadPara"/>
       </w:pPr>
       <w:r>
-        <w:t>Post-traversal, the selected node set may still exceed the LLM context limit or contain redundant passages. Long contexts can degrade LLM performance, especially when relevant information appears in the middle of the input [22]. Prompt-compression methods such as LLMLingua [11] address this by dropping low-information tokens, achieving large compression ratios with little quality loss; TreeRAG instead compresses at the node level, pruning and deduplicating whole tree nodes by TF-IDF relevance so that page-level citations remain intact. The compressor (1) tokenizes each node's content (whitespace-based proxy) and assigns a token count; (2) computes TF-IDF cosine similarity between each node and the query, pruning nodes below MIN_CHUNK_RELEVANCE = 0.2; (3) merges node pairs with cosine similarity above SIMILARITY_THRESHOLD = 0.7, retaining the higher-scoring node's content; and (4) sorts the remaining nodes by relevance and truncates to MAX_OUTPUT_TOKENS = 4000. The net effect is a 22-37% reduction in context tokens (Table 3) with minimal retrieval-quality degradation, as shown in the ablation study (Section 5.4).</w:t>
+        <w:t>Post-traversal, the selected node set may still exceed the LLM context limit or contain redundant passages. Long contexts can degrade LLM performance, especially when relevant information appears in the middle of the input [22]. Prompt-compression methods such as LLMLingua [11] address this by dropping low-information tokens, achieving large compression ratios with little quality loss; TreeRAG instead compresses at the node level, pruning and deduplicating whole tree nodes by TF-IDF relevance so that page-level citations remain intact. The compressor (1) tokenizes each node's content (whitespace-based proxy) and assigns a token count; (2) computes TF-IDF cosine similarity between each node and the query, pruning nodes below MIN_CHUNK_RELEVANCE = 0.2; (3) merges node pairs with cosine similarity above SIMILARITY_THRESHOLD = 0.7, retaining the higher-scoring node's content; and (4) sorts the remaining nodes by relevance and truncates to MAX_OUTPUT_TOKENS = 4000. The net effect is a 22-37% reduction in context tokens (Table 4) with minimal retrieval-quality degradation, as shown in the ablation study (Section 5.4).</w:t>
       </w:r>
     </w:p>
     <w:p>
@@ -675,7 +1202,7 @@
         <w:pStyle w:val="PostHeadPara"/>
       </w:pPr>
       <w:r>
-        <w:t>Figure 1 illustrates the five-signal scoring pipeline. Each generated answer sentence is scored against the retrieved node set using five overlap signals (Table 1). A per-sentence confidence score is the mean of the five signals; an overall document confidence is the mean over all sentences. When confidence falls below 0.6, or when more than 70% of sentences have low confidence, a warning is surfaced to the user. This approach is LLM-free and adds negligible latency (under 5 ms per response), unlike verification methods that require a second LLM call, making it practical to run on every response in a live system.</w:t>
+        <w:t>Figure 1 illustrates the five-signal scoring pipeline. Each generated answer sentence is scored against the retrieved node set using five overlap signals (Table 2). A per-sentence confidence score is the mean of the five signals; an overall document confidence is the mean over all sentences. When confidence falls below 0.6, or when more than 70% of sentences have low confidence, a warning is surfaced to the user. The five signals are simple n-gram and character-overlap statistics computed in a single pass, so the detector is LLM-free and adds negligible latency relative to the generation call. This is a deliberate accuracy-for-speed trade-off: unlike LLM-based verifiers such as FActScore [25] and RAGAS [4], which issue additional model queries per claim, our detector is cheap enough to run on every response in a live system, at the cost of coarser, surface-level faithfulness signals.</w:t>
       </w:r>
     </w:p>
     <w:p>
@@ -683,8 +1210,7 @@
         <w:pStyle w:val="TableCaption"/>
       </w:pPr>
       <w:r>
-        <w:lastRenderedPageBreak/>
-        <w:t>Table 1: The five overlap signals of the hallucination detector.</w:t>
+        <w:t>Table 2: The five overlap signals of the hallucination detector.</w:t>
       </w:r>
     </w:p>
     <w:tbl>
@@ -1104,7 +1630,7 @@
         <w:pStyle w:val="PostHeadPara"/>
       </w:pPr>
       <w:r>
-        <w:t>Datasets. We evaluate on three datasets. The Full Benchmark (n = 204) is an automatically generated QA set spanning seven documents (academic papers and biomedical reports); questions are produced by the LLM with three types (factual/single-hop, multi-hop/cross-section, comparative), and validation ensures answer hints appear verbatim in source nodes. The HotpotQA subset (n = 20) is a sample from the HotpotQA development set [35] converted to page-indexed trees, requiring two-hop reasoning across supporting passages. The Medical Benchmark (n = 42) is auto-generated from Japanese-language biomedical engineering lecture materials and biomedical literature, with clinical factual, procedure, comparison, and safety question subtypes, and includes a domain-specific medical entity recall metric.</w:t>
+        <w:t>Datasets. We evaluate on three datasets. The Full Benchmark (n = 204) is an automatically generated QA set spanning seven documents (academic papers and biomedical reports); questions are produced by the LLM with three types (factual/single-hop, multi-hop/cross-section, comparative), and validation ensures answer hints appear verbatim in source nodes. The HotpotQA subset is a sample from the HotpotQA development set [35] converted to page-indexed trees, requiring two-hop reasoning across supporting passages; we use 20 questions for the offline extractive protocol and expand to 100 questions for the fair generative protocol (Section 5.6). The Medical Benchmark (n = 42) is auto-generated from Japanese-language biomedical engineering lecture materials and biomedical literature, with clinical factual, procedure, comparison, and safety question subtypes, and includes a domain-specific medical entity recall metric.</w:t>
       </w:r>
     </w:p>
     <w:p>
@@ -1131,7 +1657,7 @@
         </w:rPr>
       </w:pPr>
       <w:r>
-        <w:t>Evaluation protocols. We evaluate under two protocols. The extractive (offline) protocol approximates traversal with keyword scoring and assembles answers by concatenating retrieved node summaries; it is fast but, as we show in Section 5.7, systematically biased. The fair generative protocol is our primary one: every system feeds its retrieved context to the same local LLM (Llama 3.1 8B) for answer generation, so that the only thing that differs across systems is the retrieval stage. The same model serves as the LLM judge. Because online generation through a hosted API was not available to us, all generative results use this local model; the fair-protocol experiments are run on a fixed 40-question sample of the Full Benchmark (seed 42) and on the 20-question HotpotQA subset, which bounds their statistical power and which we treat as a limitation (Section 6.4).</w:t>
+        <w:t>Evaluation protocols. We evaluate under two protocols. The extractive (offline) protocol approximates traversal with keyword scoring and assembles answers by concatenating retrieved node summaries; it is fast but, as we show in Section 5.7, systematically biased. The fair generative protocol is our primary one: every system feeds its retrieved context to the same local LLM (Llama 3.1 8B) for answer generation, so that the only thing that differs across systems is the retrieval stage. The same model serves as the LLM judge. Because online generation through a hosted API was not available to us, all generative results use this local model; the fair-protocol experiments are run on a fixed 40-question sample of the Full Benchmark (seed 42) and on the HotpotQA subset (100 questions under the fair protocol, expanded from an initial 20), which bounds their statistical power and which we treat as a limitation (Section 6.4).</w:t>
       </w:r>
     </w:p>
     <w:p>
@@ -1182,7 +1708,7 @@
         <w:pStyle w:val="PostHeadPara"/>
       </w:pPr>
       <w:r>
-        <w:t>We first report the extractive protocol because it mirrors the offline evaluation common in prior work and because the contrast with the fair protocol (Section 5.6) is itself a finding. The reader should treat the numbers in this subsection as an upper-biased proxy for TreeRAG: extractive concatenation of node summaries inflates n-gram overlap with the reference for our systems, an artifact we quantify in Section 5.7. Table 2 reports results on the Full Benchmark and HotpotQA; Figures 3 and 4 visualize the overall and multi-hop comparisons. On the full benchmark, TreeRAG-DFS achieves the highest ROUGE-L (0.451) and BERTScore (0.521). Compared to all baselines, TreeRAG-Beam (the weaker of the two proposed variants on the full benchmark) already outperforms each one with p &lt; 0.001 and effect sizes ranging from d = 0.483 (vs. BM25) to d = 1.205 (vs. RAPTOR). TreeRAG-DFS further improves over BM25 by +39.5% ROUGE-L (+0.127 absolute) and over RAPTOR by +132.4% (+0.257 absolute). TreeRAG-Beam obtains slightly lower ROUGE-L than DFS on single-document factual questions (0.428 vs. 0.451, d = 0.095, p &lt; 0.001) but dominates on multi-hop HotpotQA (ROUGE-L = 0.169 vs. BM25 0.092, +84.4%, p &lt; 0.001, d = 1.358), confirming that beam-guided traversal is better suited to multi-evidence synthesis.</w:t>
+        <w:t>We first report the extractive protocol because it mirrors the offline evaluation common in prior work and because the contrast with the fair protocol (Section 5.6) is itself a finding. The reader should treat the numbers in this subsection as an upper-biased proxy for TreeRAG: extractive concatenation of node summaries inflates n-gram overlap with the reference for our systems, an artifact we quantify in Section 5.7. Table 3 reports results on the Full Benchmark and HotpotQA; Figures 3 and 4 visualize the overall and multi-hop comparisons. On the full benchmark, TreeRAG-DFS achieves the highest ROUGE-L (0.451) and BERTScore (0.521). Compared to all baselines, TreeRAG-Beam (the weaker of the two proposed variants on the full benchmark) already outperforms each one with p &lt; 0.001 and effect sizes ranging from d = 0.483 (vs. BM25) to d = 1.205 (vs. RAPTOR). TreeRAG-DFS further improves over BM25 by +39.5% ROUGE-L (+0.127 absolute) and over RAPTOR by +132.4% (+0.257 absolute). TreeRAG-Beam obtains slightly lower ROUGE-L than DFS on single-document factual questions (0.428 vs. 0.451, d = 0.095, p &lt; 0.001) but dominates on multi-hop HotpotQA under this offline extractive scoring (ROUGE-L = 0.169 vs. BM25 0.092, +84.4%, p &lt; 0.001, d = 1.358). This offline advantage does not survive the fair generative protocol: when we expand the HotpotQA subset to 100 questions and re-run it under the fair protocol, the flat baselines lead on ROUGE-L while TreeRAG-DFS leads on LLM-Judge (Section 5.6).</w:t>
       </w:r>
     </w:p>
     <w:p>
@@ -1198,7 +1724,7 @@
         <w:pStyle w:val="TableCaption"/>
       </w:pPr>
       <w:r>
-        <w:t>Table 2: Main Results (n = 204 / n = 20). Best per column in bold (see text); all † comparisons have p &lt; 0.001 vs. TreeRAG-Beam (paired t-test). Latency is offline traversal time only (no LLM call).</w:t>
+        <w:t>Table 3: Main Results (n = 204 / n = 20). Best per column in bold (see text); all † comparisons have p &lt; 0.001 vs. TreeRAG-Beam (paired t-test). Latency is offline traversal time only (no LLM call).</w:t>
       </w:r>
     </w:p>
     <w:tbl>
@@ -1909,7 +2435,7 @@
         </w:rPr>
       </w:pPr>
       <w:r>
-        <w:t>Figure 4: Multi-hop ROUGE-L on the HotpotQA subset (n = 20). TreeRAG-Beam leads, confirming that beam-guided traversal suits multi-evidence synthesis.</w:t>
+        <w:t>Figure 4: Multi-hop ROUGE-L on the HotpotQA subset under the offline extractive protocol (n = 20). TreeRAG-Beam leads here, but this reverses under the fair generative protocol at n = 100, where flat baselines lead on ROUGE-L and TreeRAG-DFS leads on LLM-Judge (Section 5.6).</w:t>
       </w:r>
       <w:r>
         <w:rPr>
@@ -1932,7 +2458,7 @@
         <w:pStyle w:val="PostHeadPara"/>
       </w:pPr>
       <w:r>
-        <w:t>Table 3 and Figure 5 present domain-specific results on the 42-question medical benchmark. TreeRAG-DFS achieves the highest ROUGE-L (0.366) while maintaining perfect medical entity recall (1.000) and the smallest non-zero context footprint (73.5 tokens). Critically, RAPTOR drops to ROUGE-L 0.053 (-85.5% vs. TreeRAG-DFS) because its recursive abstractive clustering loses domain-specific clinical terminology; additionally, its abstractive summaries strip page references entirely (citation availability = 0.000), making RAPTOR unsuitable for clinical settings where source traceability is a regulatory requirement.</w:t>
+        <w:t>Table 4 and Figure 5 present domain-specific results on the 42-question medical benchmark. TreeRAG-DFS achieves the highest ROUGE-L (0.366) while maintaining perfect medical entity recall (1.000) and the smallest non-zero context footprint (73.5 tokens). Critically, RAPTOR drops to ROUGE-L 0.053 (-85.5% vs. TreeRAG-DFS) because its recursive abstractive clustering loses domain-specific clinical terminology; additionally, its abstractive summaries strip page references entirely (citation availability = 0.000), making RAPTOR unsuitable for clinical settings where source traceability is a regulatory requirement.</w:t>
       </w:r>
     </w:p>
     <w:p>
@@ -1948,7 +2474,7 @@
         <w:pStyle w:val="TableCaption"/>
       </w:pPr>
       <w:r>
-        <w:t>Table 3: Medical Domain Results (n = 42). ‡ FlatRAG in offline mode uses no retrieved passage context (0 tokens); online mode retrieves hybrid chunks.</w:t>
+        <w:t>Table 4: Medical Domain Results (n = 42). ‡ FlatRAG in offline mode uses no retrieved passage context (0 tokens); online mode retrieves hybrid chunks.</w:t>
       </w:r>
     </w:p>
     <w:tbl>
@@ -2428,7 +2954,7 @@
         <w:pStyle w:val="PostHeadPara"/>
       </w:pPr>
       <w:r>
-        <w:t>Table 4 and Figure 6 isolate the contribution of each component by progressively enabling features. Four findings emerge. First, DFS alone is a strong baseline: base DFS achieves the highest ROUGE-L (0.496 vs. 0.449 for Full, delta = +0.047), confirming that exhaustive depth-first traversal captures relevant text effectively. Second, Beam Search without compression degrades quality: adding Beam Search alone drops ROUGE-L by 0.050 vs. the Full system and inflates context by +22.8% (107.4 to 170.5 tokens), as the wider beam captures more nodes per iteration, introducing noise. Third, compression restores quality: adding contextual compression brings ROUGE-L back to 0.493 while reducing context to 107.5 tokens, effectively filtering the beam's noisy additions. Fourth, reference resolution trades precision for coverage: the Full system underperforms base DFS on ROUGE-L (-0.047) but resolves cross-references that DFS alone misses; the ROUGE-L penalty is partly an artifact of the offline extractive evaluation, since cross-reference resolution inserts additional related nodes that dilute extractive-match scores while providing richer grounded context for generation.</w:t>
+        <w:t>Table 5 and Figure 6 isolate the contribution of each component by progressively enabling features. Four findings emerge. First, DFS alone is a strong baseline: base DFS achieves the highest ROUGE-L (0.496 vs. 0.449 for Full, delta = +0.047), confirming that exhaustive depth-first traversal captures relevant text effectively. Second, Beam Search without compression degrades quality: adding Beam Search alone drops ROUGE-L by 0.050 vs. the Full system and inflates context by +22.8% (107.4 to 170.5 tokens), as the wider beam captures more nodes per iteration, introducing noise. Third, compression restores quality: adding contextual compression brings ROUGE-L back to 0.493 while reducing context to 107.5 tokens, effectively filtering the beam's noisy additions. Fourth, reference resolution trades precision for coverage: the Full system underperforms base DFS on ROUGE-L (-0.047) but resolves cross-references that DFS alone misses; the ROUGE-L penalty is partly an artifact of the offline extractive evaluation, since cross-reference resolution inserts additional related nodes that dilute extractive-match scores while providing richer grounded context for generation.</w:t>
       </w:r>
     </w:p>
     <w:p>
@@ -2436,7 +2962,7 @@
         <w:pStyle w:val="TableCaption"/>
       </w:pPr>
       <w:r>
-        <w:t>Table 4: Ablation Study (n = 70, General Benchmark). Delta = difference vs. Full System; positive = higher than Full.</w:t>
+        <w:t>Table 5: Ablation Study (n = 70, General Benchmark). Delta = difference vs. Full System; positive = higher than Full.</w:t>
       </w:r>
     </w:p>
     <w:tbl>
@@ -2808,7 +3334,7 @@
         <w:pStyle w:val="PostHeadPara"/>
       </w:pPr>
       <w:r>
-        <w:t>Table 5 shows context-token counts and query latency from the offline evaluation (n = 204); Figures 7 and 8 visualize the latency-accuracy trade-off and the accuracy-context Pareto frontier. TreeRAG-DFS uses 37.5% fewer context tokens than BM25 (65.5 vs. 104.8 tokens average) while achieving +39.5% higher ROUGE-L, Pareto-dominating every baseline. RAPTOR uses the most context (218.7 tokens, +108.7% vs. DFS) while achieving the lowest ROUGE-L, suggesting that recursive abstractive summaries degrade structural fidelity on our hierarchy-preserving benchmark. Both TreeRAG variants also outperform all baselines on offline latency, completing traversal in roughly 1 ms; in production, the LLM scoring step adds a few hundred milliseconds but is cached after the first call.</w:t>
+        <w:t>Table 6 shows context-token counts and query latency from the offline evaluation (n = 204); Figures 7 and 8 visualize the latency-accuracy trade-off and the accuracy-context Pareto frontier. TreeRAG-DFS uses 37.5% fewer context tokens than BM25 (65.5 vs. 104.8 tokens average) while achieving +39.5% higher ROUGE-L, Pareto-dominating every baseline. RAPTOR uses the most context (218.7 tokens, +108.7% vs. DFS) while achieving the lowest ROUGE-L, suggesting that recursive abstractive summaries degrade structural fidelity on our hierarchy-preserving benchmark. Both TreeRAG variants also outperform all baselines on offline latency, completing traversal in roughly 1 ms; in production, the LLM scoring step adds a few hundred milliseconds but is cached after the first call.</w:t>
       </w:r>
     </w:p>
     <w:p>
@@ -2816,7 +3342,7 @@
         <w:pStyle w:val="TableCaption"/>
       </w:pPr>
       <w:r>
-        <w:t>Table 5: Efficiency Analysis (offline mode, n = 204). † Offline latency includes tree traversal only (no LLM call); online generation adds ~1-3 s per query, collapsing to ~100 ms with L1/L2 cache hits. ‡ FlatRAG in offline mode uses no retrieved passage context.</w:t>
+        <w:t>Table 6: Efficiency Analysis (offline mode, n = 204). † Offline latency includes tree traversal only (no LLM call); online generation adds ~1-3 s per query, collapsing to ~100 ms with L1/L2 cache hits. ‡ FlatRAG in offline mode uses no retrieved passage context.</w:t>
       </w:r>
     </w:p>
     <w:tbl>
@@ -3350,7 +3876,7 @@
         <w:pStyle w:val="PostHeadPara"/>
       </w:pPr>
       <w:r>
-        <w:t>We now turn to our primary protocol, in which all six systems generate answers with the same local Llama 3.1 8B and only the retriever differs (Table 6). The picture is more nuanced than the extractive proxy suggested. On lexical-overlap metrics a flat system leads: FlatRAG attains the highest ROUGE-L (0.386) and BERTScore (0.403), and the differences among the remaining systems are small and, at n = 40, mostly not statistically significant. On the LLM-Judge metric, however, TreeRAG-Beam is the single best system (0.827), and it reaches this while feeding the generator only 14 context tokens on average-an order of magnitude fewer than BM25 and Dense Retrieval (124) or RAPTOR (258)-thanks to contextual compression over a compact subtree. TreeRAG-DFS uses the fewest tokens (9) at a small quality cost. The clear trade-off is latency: TreeRAG performs LLM-scored node selection during traversal, so it is several times slower per query (21.5 s for Beam, 51.6 s for DFS) than the single-call baselines (6-8 s). We read Table 6 as showing that TreeRAG buys judged answer quality and token economy at the price of latency, rather than dominating on every axis.</w:t>
+        <w:t>We now turn to our primary protocol, in which all six systems generate answers with the same local Llama 3.1 8B and only the retriever differs (Table 7). The picture is more nuanced than the extractive proxy suggested. On lexical-overlap metrics a flat system leads: FlatRAG attains the highest ROUGE-L (0.386) and BERTScore (0.403), and the differences among the remaining systems are small and, at n = 40, mostly not statistically significant. On the LLM-Judge metric, however, TreeRAG-Beam is the single best system (0.827), and it reaches this while feeding the generator only 14 context tokens on average-an order of magnitude fewer than BM25 and Dense Retrieval (124) or RAPTOR (258)-thanks to contextual compression over a compact subtree. TreeRAG-DFS uses the fewest tokens (9) at a small quality cost. The clear trade-off is latency: TreeRAG performs LLM-scored node selection during traversal, so it is several times slower per query (21.5 s for Beam, 51.6 s for DFS) than the single-call baselines (6-8 s). We read Table 7 as showing that TreeRAG buys judged answer quality and token economy at the price of latency, rather than dominating on every axis.</w:t>
       </w:r>
     </w:p>
     <w:p>
@@ -3358,7 +3884,7 @@
         <w:pStyle w:val="TableCaption"/>
       </w:pPr>
       <w:r>
-        <w:t>Table 6: Fair generator-controlled results (Full Benchmark, n = 40, seed 42). Every system generates answers with the same local Llama 3.1 8B; only retrieval differs. ‡ Context instrumentation could not capture FlatRAG's passage context; its true context is non-zero.</w:t>
+        <w:t>Table 7: Fair generator-controlled results (Full Benchmark, n = 40, seed 42). Every system generates answers with the same local Llama 3.1 8B; only retrieval differs. ‡ Context instrumentation could not capture FlatRAG's passage context; its true context is non-zero.</w:t>
       </w:r>
     </w:p>
     <w:tbl>
@@ -3974,7 +4500,7 @@
         <w:pStyle w:val="PostHeadPara"/>
       </w:pPr>
       <w:r>
-        <w:t>Comparing Table 2 (extractive) with Table 6 (fair generative) exposes a methodological hazard. Under the extractive proxy, TreeRAG-DFS appears to win decisively, with ROUGE-L 0.451 versus 0.248 for FlatRAG-an apparent +81.9% advantage. Under fair generation, the ranking inverts: FlatRAG leads ROUGE-L (0.386) and TreeRAG-DFS falls to 0.252. Nothing about the retrievers changed between the two tables; only the answer surface form did. Extractive concatenation of TreeRAG's node summaries happens to resemble the reference phrasing, inflating n-gram overlap, whereas fluent generation-which any deployed system actually uses-does not. We therefore caution that offline extractive evaluation and lexical-overlap metrics can manufacture or erase apparent gains for structure-aware retrieval, and we recommend that hierarchical-RAG systems be compared under a generator-controlled protocol. Reporting only the extractive numbers, as an earlier version of this work did, would have substantially overstated TreeRAG's accuracy.</w:t>
+        <w:t>Comparing Table 3 (extractive) with Table 7 (fair generative) exposes a methodological hazard. Under the extractive proxy, TreeRAG-DFS appears to win decisively, with ROUGE-L 0.451 versus 0.248 for FlatRAG-an apparent +81.9% advantage. Under fair generation, the ranking inverts: FlatRAG leads ROUGE-L (0.386) and TreeRAG-DFS falls to 0.252. Nothing about the retrievers changed between the two tables; only the answer surface form did. Extractive concatenation of TreeRAG's node summaries happens to resemble the reference phrasing, inflating n-gram overlap, whereas fluent generation-which any deployed system actually uses-does not. We therefore caution that offline extractive evaluation and lexical-overlap metrics can manufacture or erase apparent gains for structure-aware retrieval, and we recommend that hierarchical-RAG systems be compared under a generator-controlled protocol. Reporting only the extractive numbers, as an earlier version of this work did, would have substantially overstated TreeRAG's accuracy.</w:t>
       </w:r>
     </w:p>
     <w:p>
@@ -3994,7 +4520,7 @@
         </w:rPr>
       </w:pPr>
       <w:r>
-        <w:t xml:space="preserve">A retriever's value in citation-critical domains lies partly in whether its evidence can be cited at all. Table 7 measures this. Because TreeRAG retains a page range at every node, TreeRAG-Beam both always produces a citation (availability 1.000) and cites the correct supporting sections most accurately (citation F1 = 0.757), the best of any system. The contrast with the abstractive baseline is stark: RAPTOR's cluster summaries discard section identifiers, so although it nominally attaches a reference (availability 1.000) its citation F1 is 0.000-it can point somewhere, but not to the right place. FlatRAG retrieves section text but carries no page references at all (availability 0.000). This axis is, by construction, one that flat and abstractive methods cannot satisfy, and it is the most robust advantage we observe for </w:t>
+        <w:t xml:space="preserve">A retriever's value in citation-critical domains lies partly in whether its evidence can be cited at all. Table 8 measures this. Because TreeRAG retains a page range at every node, TreeRAG-Beam both always produces a citation (availability 1.000) and cites the correct supporting sections most accurately (citation F1 = 0.757), the best of any system. The contrast with the abstractive baseline is stark: RAPTOR's cluster summaries discard section identifiers, so although it nominally attaches a reference (availability 1.000) its citation F1 is 0.000-it can point somewhere, but not to the right place. FlatRAG retrieves section text but carries no page references at all (availability 0.000). This axis is, by construction, one that flat and abstractive methods cannot satisfy, and it is the most robust advantage we observe for </w:t>
       </w:r>
       <w:proofErr w:type="spellStart"/>
       <w:r>
@@ -4010,8 +4536,7 @@
         <w:pStyle w:val="TableCaption"/>
       </w:pPr>
       <w:r>
-        <w:lastRenderedPageBreak/>
-        <w:t>Table 7: Citation traceability and accuracy (Full Benchmark, n = 40, fair protocol). TreeRAG-Beam attains the highest citation F1; RAPTOR loses section identifiers (F1 = 0.000) and FlatRAG carries no page references (availability = 0.000).</w:t>
+        <w:t>Table 8: Citation traceability and accuracy (Full Benchmark, n = 40, fair protocol). TreeRAG-Beam attains the highest citation F1; RAPTOR loses section identifiers (F1 = 0.000) and FlatRAG carries no page references (availability = 0.000).</w:t>
       </w:r>
     </w:p>
     <w:tbl>
@@ -4342,7 +4867,7 @@
         <w:pStyle w:val="PostHeadPara"/>
       </w:pPr>
       <w:r>
-        <w:t>Table 8 reports the HotpotQA multi-hop subset and Table 9 breaks the Full Benchmark down by question type. Two things stand out. First, HotpotQA references are short English factoids (for example, the name of an effect), so ROUGE-L heavily penalizes TreeRAG's longer generated answers (0.148) even though its LLM-Judge score is the highest (0.83); this is the same lexical-metric artifact described in Section 5.7, in an extreme form. Second, the per-type breakdown shows the consistent pattern across our work: a flat baseline wins ROUGE-L in every category, but TreeRAG-Beam attains the highest LLM-Judge on multi-hop (0.818) and comparative (0.850) questions and is competitive on factual (0.822). The multi-hop advantage of TreeRAG-Beam over Dense Retrieval is statistically significant (p = 0.044), consistent with the hypothesis that beam traversal helps bridge evidence across sibling sections. We state plainly that these are small-sample results (n = 11 multi-hop, n = 8 comparative) and report them as indicative rather than conclusive.</w:t>
+        <w:t>Table 9 reports the HotpotQA multi-hop subset—expanded from 20 to 100 questions from the official development set and re-run under the fair generative protocol—and Table 10 breaks the Full Benchmark down by question type. Two things stand out. First, the multi-hop result is metric-dependent. HotpotQA references are short English factoids (for example, the name of an effect), so ROUGE-L penalizes TreeRAG's longer generated answers and the flat baselines lead lexically (BM25 0.122 vs. TreeRAG-DFS 0.065); but on LLM-Judge, which rates answer quality rather than lexical overlap, TreeRAG-DFS is the best system (0.649), beating BM25 by +0.075 (p = 0.008) and RAPTOR by +0.064 (p = 0.032) with adequate power, while the Dense and FlatRAG comparisons remain positive but underpowered. The earlier n = 20 evaluation had instead shown TreeRAG winning ROUGE-L; the n = 100 fair-protocol re-run corrects that signal as an artifact of offline extractive scoring (Section 5.7), and we therefore frame the multi-hop contribution around LLM-Judge rather than ROUGE-L. Second, the per-type breakdown shows the consistent pattern across our work: a flat baseline wins ROUGE-L in every category, but TreeRAG-Beam attains the highest LLM-Judge on multi-hop (0.818) and comparative (0.850) questions and is competitive on factual (0.822). The multi-hop advantage of TreeRAG-Beam over Dense Retrieval is statistically significant (p = 0.044), consistent with the hypothesis that beam traversal helps bridge evidence across sibling sections. We state plainly that the per-type cells are small-sample results (n = 11 multi-hop, n = 8 comparative) and report them as indicative rather than conclusive.</w:t>
       </w:r>
     </w:p>
     <w:p>
@@ -4350,7 +4875,7 @@
         <w:pStyle w:val="TableCaption"/>
       </w:pPr>
       <w:r>
-        <w:t>Table 8: HotpotQA multi-hop (n = 20), fair generative protocol. ROUGE-L penalizes TreeRAG's longer answers against short factoid references; TreeRAG-Beam attains the highest LLM-Judge.</w:t>
+        <w:t>Table 9: HotpotQA multi-hop (n = 100), fair generative protocol. The original 20-question subset was expanded to 100 questions from the official development set and all six systems re-run. Flat baselines lead on ROUGE-L because longest-common-subsequence recall rewards terse extractive matches over the longer fluent answers a generator produces; on LLM-Judge, TreeRAG-DFS attains the highest score (0.649), significantly above BM25 (p = 0.008) and RAPTOR (p = 0.032).</w:t>
       </w:r>
     </w:p>
     <w:tbl>
@@ -4444,7 +4969,10 @@
               <w:pStyle w:val="TableCell"/>
             </w:pPr>
             <w:r>
-              <w:t>0.481</w:t>
+              <w:rPr>
+                <w:b/>
+              </w:rPr>
+              <w:t>0.122</w:t>
             </w:r>
           </w:p>
         </w:tc>
@@ -4457,7 +4985,10 @@
               <w:pStyle w:val="TableCell"/>
             </w:pPr>
             <w:r>
-              <w:t>0.81</w:t>
+              <w:rPr>
+                <w:b w:val="0"/>
+              </w:rPr>
+              <w:t>0.574</w:t>
             </w:r>
           </w:p>
         </w:tc>
@@ -4485,7 +5016,10 @@
               <w:pStyle w:val="TableCell"/>
             </w:pPr>
             <w:r>
-              <w:t>0.498</w:t>
+              <w:rPr>
+                <w:b w:val="0"/>
+              </w:rPr>
+              <w:t>0.102</w:t>
             </w:r>
           </w:p>
         </w:tc>
@@ -4498,7 +5032,10 @@
               <w:pStyle w:val="TableCell"/>
             </w:pPr>
             <w:r>
-              <w:t>0.81</w:t>
+              <w:rPr>
+                <w:b w:val="0"/>
+              </w:rPr>
+              <w:t>0.598</w:t>
             </w:r>
           </w:p>
         </w:tc>
@@ -4526,7 +5063,10 @@
               <w:pStyle w:val="TableCell"/>
             </w:pPr>
             <w:r>
-              <w:t>0.468</w:t>
+              <w:rPr>
+                <w:b w:val="0"/>
+              </w:rPr>
+              <w:t>0.098</w:t>
             </w:r>
           </w:p>
         </w:tc>
@@ -4539,7 +5079,10 @@
               <w:pStyle w:val="TableCell"/>
             </w:pPr>
             <w:r>
-              <w:t>0.80</w:t>
+              <w:rPr>
+                <w:b w:val="0"/>
+              </w:rPr>
+              <w:t>0.614</w:t>
             </w:r>
           </w:p>
         </w:tc>
@@ -4567,7 +5110,10 @@
               <w:pStyle w:val="TableCell"/>
             </w:pPr>
             <w:r>
-              <w:t>0.597</w:t>
+              <w:rPr>
+                <w:b w:val="0"/>
+              </w:rPr>
+              <w:t>0.086</w:t>
             </w:r>
           </w:p>
         </w:tc>
@@ -4580,7 +5126,10 @@
               <w:pStyle w:val="TableCell"/>
             </w:pPr>
             <w:r>
-              <w:t>0.74</w:t>
+              <w:rPr>
+                <w:b w:val="0"/>
+              </w:rPr>
+              <w:t>0.585</w:t>
             </w:r>
           </w:p>
         </w:tc>
@@ -4608,7 +5157,10 @@
               <w:pStyle w:val="TableCell"/>
             </w:pPr>
             <w:r>
-              <w:t>0.148</w:t>
+              <w:rPr>
+                <w:b w:val="0"/>
+              </w:rPr>
+              <w:t>0.065</w:t>
             </w:r>
           </w:p>
         </w:tc>
@@ -4621,7 +5173,10 @@
               <w:pStyle w:val="TableCell"/>
             </w:pPr>
             <w:r>
-              <w:t>0.80</w:t>
+              <w:rPr>
+                <w:b/>
+              </w:rPr>
+              <w:t>0.649</w:t>
             </w:r>
           </w:p>
         </w:tc>
@@ -4649,7 +5204,10 @@
               <w:pStyle w:val="TableCell"/>
             </w:pPr>
             <w:r>
-              <w:t>0.148</w:t>
+              <w:rPr>
+                <w:b w:val="0"/>
+              </w:rPr>
+              <w:t>0.065</w:t>
             </w:r>
           </w:p>
         </w:tc>
@@ -4662,7 +5220,10 @@
               <w:pStyle w:val="TableCell"/>
             </w:pPr>
             <w:r>
-              <w:t>0.83</w:t>
+              <w:rPr>
+                <w:b w:val="0"/>
+              </w:rPr>
+              <w:t>0.621</w:t>
             </w:r>
           </w:p>
         </w:tc>
@@ -4673,7 +5234,7 @@
         <w:pStyle w:val="TableCaption"/>
       </w:pPr>
       <w:r>
-        <w:t>Table 9: Per-type breakdown (Full Benchmark, n = 40, fair protocol). A flat baseline wins ROUGE-L in every category, while TreeRAG-Beam attains the highest LLM-Judge on multi-hop and comparative questions (multi-hop margin over Dense Retrieval significant, p = 0.044).</w:t>
+        <w:t>Table 10: Per-type breakdown (Full Benchmark, n = 40, fair protocol). A flat baseline wins ROUGE-L in every category, while TreeRAG-Beam attains the highest LLM-Judge on multi-hop and comparative questions (multi-hop margin over Dense Retrieval significant, p = 0.044).</w:t>
       </w:r>
     </w:p>
     <w:tbl>
@@ -4889,11 +5450,18 @@
         <w:pStyle w:val="PostHeadPara"/>
       </w:pPr>
       <w:r>
-        <w:t xml:space="preserve">Our results draw a sharp line between two kinds of benefit that hierarchical retrieval is often assumed to deliver together. The first-page-level provenance and a compact, structurally coherent context-is real and survives fair evaluation: TreeRAG-Beam cites the right sections most accurately (Table 7) and reaches the highest judged quality on an order of </w:t>
-      </w:r>
-      <w:r>
-        <w:lastRenderedPageBreak/>
-        <w:t>magnitude fewer context tokens (Table 6). These follow directly from the representation: each node carries a page range, and selecting a relevant subtree yields a small, on-topic context rather than a scattering of chunks. The second supposed benefit-higher lexical overlap with reference answers-does not survive: once every system generates fluent text with the same LLM, the section boundary confers no advantage in n-gram overlap, and a hybrid flat retriever (FlatRAG) actually scores higher on ROUGE-L. In short, structure buys verifiability and efficiency, not surface-string similarity, and earlier hierarchical-RAG results that claimed large ROUGE-L gains likely measured an evaluation artifact rather than a retrieval improvement.</w:t>
+        <w:t xml:space="preserve">Our results draw a sharp line between two kinds of benefit that hierarchical retrieval is often assumed to deliver together. The first-page-level provenance and a compact, structurally coherent context-is real and survives fair evaluation: TreeRAG-Beam cites the right sections most accurately (Table 8) and reaches the highest judged quality on an order of </w:t>
+      </w:r>
+      <w:r>
+        <w:t>magnitude fewer context tokens (Table 7). These follow directly from the representation: each node carries a page range, and selecting a relevant subtree yields a small, on-topic context rather than a scattering of chunks. The second supposed benefit-higher lexical overlap with reference answers-does not survive: once every system generates fluent text with the same LLM, the section boundary confers no advantage in n-gram overlap, and a hybrid flat retriever (FlatRAG) actually scores higher on ROUGE-L. In short, structure buys verifiability and efficiency, not surface-string similarity, and earlier hierarchical-RAG results that claimed large ROUGE-L gains likely measured an evaluation artifact rather than a retrieval improvement.</w:t>
+      </w:r>
+    </w:p>
+    <w:p>
+      <w:pPr>
+        <w:pStyle w:val="PostHeadPara"/>
+      </w:pPr>
+      <w:r>
+        <w:t>The expanded multi-hop evaluation (Section 5.6) is a clean test of this distinction. On the 100-question HotpotQA set the lexical and semantic verdicts point in opposite directions: the flat baselines lead on ROUGE-L while our DFS variant attains the highest LLM-Judge score, significantly above BM25 and RAPTOR. Because HotpotQA references are terse factoids, longest-common-subsequence recall rewards whichever system reproduces the reference surface form rather than whichever answer is most adequate; the judge, which scores adequacy, recovers the structure-aware advantage. This is the same mechanism described above, now observed on an independent multi-hop benchmark, and it is why we frame the multi-hop contribution around judged quality rather than ROUGE-L.</w:t>
       </w:r>
     </w:p>
     <w:p>
@@ -4925,7 +5493,7 @@
         <w:pStyle w:val="PostHeadPara"/>
       </w:pPr>
       <w:r>
-        <w:t>Several caveats bound our conclusions. Sample size: the fair-protocol experiments use a 40-question sample of the Full Benchmark and a 20-question HotpotQA subset, which limits statistical power; most pairwise differences are not significant at this scale, and the per-type cells (n = 8-21) are smaller still. Single generator and judge: all generative results use one local model (Llama 3.1 8B) for both answer generation and LLM-as-Judge, so judge scores could carry model-specific preferences; because every answer under comparison is produced by that same model, this is not a per-system self-preference, but corroborating the judgement with an independent model remains important. Citation metric: Citation F1 is computed against gold supporting sections and rewards systems that emit section/page identifiers; it measures provenance fidelity, not answer correctness. Generator scale: an 8B local model is weaker than hosted frontier models, and absolute scores would likely rise with a stronger generator, though we have no evidence the relative ordering would change. Larger-sample, multi-model replication is the primary item of future work.</w:t>
+        <w:t>Several caveats bound our conclusions. Sample size: the fair-protocol experiments use a 40-question sample of the Full Benchmark and a 100-question HotpotQA subset (expanded from the original 20), which limits statistical power; most pairwise differences are not significant at this scale, and the per-type cells (n = 8-21) are smaller still. We partially address the multi-hop concern by expanding the HotpotQA evaluation to 100 questions (Section 5.6); extending the same expansion to the general fair-protocol sample is future work. Single generator and judge: all generative results use one local model (Llama 3.1 8B) for both answer generation and LLM-as-Judge, so judge scores could carry model-specific preferences; because every answer under comparison is produced by that same model, this is not a per-system self-preference, but corroborating these judgements with an independent, stronger judge—for example a hosted frontier model used only for evaluation—is the most important robustness check we plan, and we expect absolute scores, but not the relative ordering, to shift under such a judge. Citation metric: Citation F1 is computed against gold supporting sections and rewards systems that emit section/page identifiers; it measures provenance fidelity, not answer correctness. Generator scale: an 8B local model is weaker than hosted frontier models, and absolute scores would likely rise with a stronger generator, though we have no evidence the relative ordering would change. Larger-sample, multi-model replication is the primary item of future work.</w:t>
       </w:r>
     </w:p>
     <w:p>

</xml_diff>

<commit_message>
Add government report index for sunscreen regulations
- Created a new JSON index file for government report 0039, detailing the FDA's review process for sunscreen active ingredients.
- Included summaries for 14 sections covering topics such as how sunscreen works, the OTC monograph process, GRASE determinations, and the impact of the Sunscreen Innovation Act.
- Each section provides insights into the regulatory landscape and challenges faced by sunscreen manufacturers.
</commit_message>
<xml_diff>
--- a/TreeRAG_TIST_ACM.docx
+++ b/TreeRAG_TIST_ACM.docx
@@ -61,6 +61,9 @@
     <w:p>
       <w:pPr>
         <w:pStyle w:val="KeyWords"/>
+        <w:rPr>
+          <w:lang w:eastAsia="ko-KR"/>
+        </w:rPr>
       </w:pPr>
       <w:r>
         <w:t>Additional Keywords and Phrases: Retrieval-Augmented Generation, Hierarchical Indexing, Tree Traversal, Beam Search, Contextual Compression, Hallucination Detection</w:t>
@@ -68,9 +71,43 @@
     </w:p>
     <w:p>
       <w:pPr>
+        <w:pStyle w:val="KeyWords"/>
+        <w:rPr>
+          <w:lang w:eastAsia="ko-KR"/>
+        </w:rPr>
+      </w:pPr>
+    </w:p>
+    <w:p>
+      <w:pPr>
+        <w:pStyle w:val="KeyWords"/>
+        <w:rPr>
+          <w:lang w:eastAsia="ko-KR"/>
+        </w:rPr>
+      </w:pPr>
+    </w:p>
+    <w:p>
+      <w:pPr>
+        <w:pStyle w:val="KeyWords"/>
+        <w:rPr>
+          <w:lang w:eastAsia="ko-KR"/>
+        </w:rPr>
+      </w:pPr>
+    </w:p>
+    <w:p>
+      <w:pPr>
+        <w:pStyle w:val="KeyWords"/>
+        <w:rPr>
+          <w:rFonts w:hint="eastAsia"/>
+          <w:lang w:eastAsia="ko-KR"/>
+        </w:rPr>
+      </w:pPr>
+    </w:p>
+    <w:p>
+      <w:pPr>
         <w:pStyle w:val="Head1"/>
       </w:pPr>
       <w:r>
+        <w:lastRenderedPageBreak/>
         <w:t>INTRODUCTION</w:t>
       </w:r>
     </w:p>
@@ -87,8 +124,128 @@
         <w:pStyle w:val="Para"/>
       </w:pPr>
       <w:r>
+        <w:t>This flat-chunk paradigm has a structural blindspot: technical documents-regulatory filings, clinical guidelines, academic papers-are organized hierarchically. A chapter introduces a theme; its sections develop sub-topics; articles specify conditions. When a chunk boundary bisects a section or collapses several levels of hierarchy into one embedding, the retriever loses the parent-child relationships that give the text meaning. The resulting context presented to the generator is fragmentary, out of order, or redundant, degrading both answer quality and token efficiency.</w:t>
+      </w:r>
+    </w:p>
+    <w:p>
+      <w:pPr>
+        <w:pStyle w:val="Para"/>
+      </w:pPr>
+      <w:r>
+        <w:t>As a concrete example, consider a clinical guideline in which a top-level chapter establishes a treatment protocol, a child section lists dosage conditions, and a sibling section lists contraindications. A flat retriever asked “what are the contraindications for protocol X?” may return the dosage chunk because it shares surface vocabulary with the protocol heading, while the contraindication text-located in a sibling node-falls outside the top-K window. A structure-aware retriever that first matches the chapter and then descends into the correct child avoids this failure mode by construction.</w:t>
+      </w:r>
+    </w:p>
+    <w:p>
+      <w:pPr>
+        <w:pStyle w:val="Para"/>
+      </w:pPr>
+      <w:r>
+        <w:t>Prior work has explored hierarchical indexing in several forms. LlamaIndex [21] introduces a tree of summarization nodes navigated top-down. RAPTOR [30] recursively clusters and summarizes chunks, building a bottom-up tree. PageIndex [33] demonstrates vectorless, structure-first retrieval. Yet none of these approaches provides (a) zero-shot, domain-adaptive LLM tree construction, (b) a choice of traversal algorithms tuned to query complexity, (c) integrated compression to manage LLM token budgets, and (d) a built-in hallucination grounding layer-all in a single production-ready system.</w:t>
+      </w:r>
+    </w:p>
+    <w:p>
+      <w:pPr>
+        <w:pStyle w:val="Para"/>
+      </w:pPr>
+      <w:r>
+        <w:t>We introduce TreeRAG, which unifies these capabilities. Our contributions are as follows.</w:t>
+      </w:r>
+    </w:p>
+    <w:p>
+      <w:pPr>
+        <w:pStyle w:val="a"/>
+      </w:pPr>
+      <w:r>
+        <w:t>(1) LLM-Driven Tree Indexing. A zero-shot prompting strategy that converts arbitrary PDFs into page-referenced JSON trees, with domain-adaptive templates for medical, legal, financial, and academic documents.</w:t>
+      </w:r>
+    </w:p>
+    <w:p>
+      <w:pPr>
+        <w:pStyle w:val="a"/>
+      </w:pPr>
+      <w:r>
+        <w:t>(2) Adaptive Dual Traversal. Two tree-traversal algorithms-DFS for depth-first exhaustive search and Beam Search for efficiency-selectable per query, with a probabilistic node-relevance scoring function.</w:t>
+      </w:r>
+    </w:p>
+    <w:p>
+      <w:pPr>
+        <w:pStyle w:val="a"/>
+      </w:pPr>
+      <w:r>
+        <w:t>(3) Contextual Compression. A TF-IDF and semantic relevance filter that removes low-relevance nodes post-traversal, shrinking the context handed to the generator by an order of magnitude.</w:t>
+      </w:r>
+    </w:p>
+    <w:p>
+      <w:pPr>
+        <w:pStyle w:val="a"/>
+      </w:pPr>
+      <w:r>
+        <w:t>(4) Multi-Signal Hallucination Detection. A five-signal confidence estimator (citation presence, word overlap, bigram overlap, trigram overlap, character similarity) that scores each sentence of the generated answer against retrieved nodes.</w:t>
+      </w:r>
+    </w:p>
+    <w:p>
+      <w:pPr>
+        <w:pStyle w:val="a"/>
+      </w:pPr>
+      <w:r>
+        <w:t>(5) Fair, Generator-Controlled Evaluation. We evaluate all systems under a protocol in which the retrieval stage varies but every system generates with the same local LLM, and we measure axes that flat retrievers cannot satisfy by construction-page-level citation accuracy and context efficiency-alongside reference- and judge-based answer quality. Under this protocol TreeRAG-Beam delivers the most accurate citations, the highest LLM-judged quality on multi-hop and comparative questions, and competitive overall quality with an order of magnitude fewer context tokens.</w:t>
+      </w:r>
+    </w:p>
+    <w:p>
+      <w:pPr>
+        <w:pStyle w:val="a"/>
+      </w:pPr>
+      <w:r>
+        <w:t>(6) A Cautionary Methodological Finding. We show that offline extractive evaluation and lexical-overlap metrics (ROUGE-L) reverse the system ranking-flattering whichever system most resembles the reference surface form-and we report both the extractive and the fair generative regimes so that the discrepancy is explicit rather than hidden.</w:t>
+      </w:r>
+    </w:p>
+    <w:p>
+      <w:pPr>
+        <w:pStyle w:val="Para"/>
+      </w:pPr>
+      <w:r>
         <w:lastRenderedPageBreak/>
-        <w:t>This flat-chunk paradigm has a structural blindspot: technical documents-regulatory filings, clinical guidelines, academic papers-are organized hierarchically. A chapter introduces a theme; its sections develop sub-topics; articles specify conditions. When a chunk boundary bisects a section or collapses several levels of hierarchy into one embedding, the retriever loses the parent-child relationships that give the text meaning. The resulting context presented to the generator is fragmentary, out of order, or redundant, degrading both answer quality and token efficiency.</w:t>
+        <w:t>The remainder of this paper is organized as follows. Section 2 reviews related work. Section 3 details the TreeRAG methodology. Section 4 describes the system architecture. Section 5 presents experiments and results. Section 6 discusses findings and limitations. Section 7 concludes.</w:t>
+      </w:r>
+    </w:p>
+    <w:p>
+      <w:pPr>
+        <w:pStyle w:val="Head1"/>
+      </w:pPr>
+      <w:r>
+        <w:t>RELATED WORK</w:t>
+      </w:r>
+    </w:p>
+    <w:p>
+      <w:pPr>
+        <w:pStyle w:val="Head2"/>
+      </w:pPr>
+      <w:r>
+        <w:t>Retrieval-Augmented Generation</w:t>
+      </w:r>
+    </w:p>
+    <w:p>
+      <w:pPr>
+        <w:pStyle w:val="PostHeadPara"/>
+      </w:pPr>
+      <w:r>
+        <w:t>RAG was formally introduced by Lewis et al. [19] as a sequence-to-sequence architecture that conditions generation on retrieved Wikipedia passages. Subsequent work scaled dense retrieval with FAISS [12] and improved passage encoding with DPR [13]. Hybrid retrievers combining sparse BM25 [28] with dense vectors showed consistent gains over either approach alone [23]. A parallel line of work improves the retriever itself: late-interaction models such as ColBERT [14] and its compressed successor ColBERTv2 [29] retain fine-grained token-level matching at scale, while learned sparse models such as SPLADE [5] and the efficiency-oriented SPLATE [6] reconcile neural ranking with inverted-index infrastructure. As recent surveys document [7, 8], the RAG design space has expanded rapidly along retrieval, generation, and evaluation axes. Despite this progress, all these systems operate on flat passage chunks, treating documents as bags of text rather than structured hierarchies [7]. TreeRAG is orthogonal to these retriever advances: its node-relevance score can in principle wrap any of them, but our focus is the document structure that flat retrievers discard.</w:t>
+      </w:r>
+    </w:p>
+    <w:p>
+      <w:pPr>
+        <w:pStyle w:val="Head2"/>
+      </w:pPr>
+      <w:r>
+        <w:t>Hierarchical and Structure-Aware Retrieval</w:t>
+      </w:r>
+    </w:p>
+    <w:p>
+      <w:pPr>
+        <w:pStyle w:val="PostHeadPara"/>
+      </w:pPr>
+      <w:r>
+        <w:t>LlamaIndex [21] constructs a tree of progressively coarser summaries and navigates it top-down, retrieving leaf nodes for generation; its retrieval is embedding-based, requiring a vector store. RAPTOR [30] takes the opposite direction: it recursively clusters leaf chunks and summarizes each cluster, building a bottom-up tree, and at query time retrieves at the most informative tree level. Unlike TreeRAG, RAPTOR's tree reflects embedding-cluster geography rather than the document's own section hierarchy, and it lacks traversal-algorithm selection or compression. This distinction matters in domains where the authored section structure is itself the semantics of the document, such as regulations and clinical protocols.</w:t>
       </w:r>
     </w:p>
     <w:p>
@@ -96,7 +253,83 @@
         <w:pStyle w:val="Para"/>
       </w:pPr>
       <w:r>
-        <w:t>As a concrete example, consider a clinical guideline in which a top-level chapter establishes a treatment protocol, a child section lists dosage conditions, and a sibling section lists contraindications. A flat retriever asked “what are the contraindications for protocol X?” may return the dosage chunk because it shares surface vocabulary with the protocol heading, while the contraindication text-located in a sibling node-falls outside the top-K window. A structure-aware retriever that first matches the chapter and then descends into the correct child avoids this failure mode by construction.</w:t>
+        <w:t>HiRAG [10] explores graph-based hierarchies but requires pre-built knowledge graphs and domain-specific schema engineering. Similarly, GraphRAG [3] builds entity knowledge graphs from source documents and generates community summaries for global query-focused summarization, but requires an entity extraction pipeline and does not preserve document section hierarchy. TreeRAG requires only a raw PDF and an LLM API key. Self-RAG [1] takes a complementary adaptive approach: it trains an LM to decide on-demand whether to retrieve, and to critique retrieved passages via special reflection tokens. TreeRAG instead uses a fixed two-stage pipeline with query-time algorithm selection (DFS vs. Beam Search) without requiring fine-tuning, which lowers the barrier to deployment on new document collections.</w:t>
+      </w:r>
+    </w:p>
+    <w:p>
+      <w:pPr>
+        <w:pStyle w:val="Head2"/>
+      </w:pPr>
+      <w:r>
+        <w:t>Multi-Hop and Cross-Document Reasoning</w:t>
+      </w:r>
+    </w:p>
+    <w:p>
+      <w:pPr>
+        <w:pStyle w:val="PostHeadPara"/>
+      </w:pPr>
+      <w:r>
+        <w:t xml:space="preserve">Multi-hop reasoning-answering questions that require evidence synthesis across multiple passages or documents-remains a challenge for flat RAG. HotpotQA [35] benchmarks this capability. IRCoT [32] interleaves retrieval and chain-of-thought [34] reasoning steps. More recently, Zhang et al. [37] propose a hierarchical RAG model with a “rethink” mechanism that iteratively revisits retrieved evidence for multi-hop QA; like TreeRAG it exploits hierarchy, but it adds an iterative re-retrieval loop rather than selecting a traversal algorithm at query time. TreeRAG's hierarchical structure naturally supports </w:t>
+      </w:r>
+      <w:r>
+        <w:lastRenderedPageBreak/>
+        <w:t>multi-hop queries: the tree encodes which sections are siblings (sharing a parent), enabling the traversal algorithm to follow cross-sectional reasoning paths without additional orchestration.</w:t>
+      </w:r>
+    </w:p>
+    <w:p>
+      <w:pPr>
+        <w:pStyle w:val="Head2"/>
+      </w:pPr>
+      <w:r>
+        <w:t>Hallucination in RAG Systems</w:t>
+      </w:r>
+    </w:p>
+    <w:p>
+      <w:pPr>
+        <w:pStyle w:val="PostHeadPara"/>
+      </w:pPr>
+      <w:r>
+        <w:t>RAG substantially reduces hallucination by grounding generation in retrieved text, but does not eliminate it [31]. The problem was studied earlier in abstractive summarization: Kryściński et al. [17] train a weakly-supervised model (FactCC) to verify whether a generated sentence is factually consistent with its source and to extract supporting spans, while Nan et al. [26] propose entity-level consistency metrics showing that models hallucinate entities absent from the source. These motivate TreeRAG's source-grounded signals, including its medical entity recall metric (Section 5.3). FActScore [25] decomposes claims into atomic facts and verifies each against source passages. RAGAS [4] defines faithfulness, answer relevance, and context recall as automatic metrics. As a recent review of faithfulness metrics observes, LLM-as-judge evaluators currently correlate best with human judgement but are computationally costly, motivating lightweight alternatives for real-time use [24]. TreeRAG's hallucination detector operates at sentence level using five lightweight overlap signals, providing a fast, LLM-free confidence estimate compatible with real-time serving.</w:t>
+      </w:r>
+    </w:p>
+    <w:p>
+      <w:pPr>
+        <w:pStyle w:val="Head1"/>
+      </w:pPr>
+      <w:r>
+        <w:t>METHODOLOGY</w:t>
+      </w:r>
+    </w:p>
+    <w:p>
+      <w:pPr>
+        <w:pStyle w:val="Head2"/>
+      </w:pPr>
+      <w:r>
+        <w:t>Document Representation: The Page-Indexed Tree</w:t>
+      </w:r>
+    </w:p>
+    <w:p>
+      <w:pPr>
+        <w:pStyle w:val="PostHeadPara"/>
+      </w:pPr>
+      <w:r>
+        <w:t>Given a PDF document D with pages p_1, ..., p_n, we define a Page-Indexed Tree T as a rooted ordered tree where each node v carries: id, a unique identifier (e.g., ch01_sec02); title, the section heading; summary, a one-to-three sentence content summary; page_ref, a page range string (e.g., 5-12); and children, an ordered list of child nodes. The root represents the entire document. Depth-1 nodes correspond to chapters or top-level sections, depth-2 nodes to subsections, and so on to depth d_max (empirically 4-6 for most academic and regulatory documents). Storing the page range at every node is what enables verifiable, page-level citations in the final answer-a property that abstractive tree methods sacrifice.</w:t>
+      </w:r>
+    </w:p>
+    <w:p>
+      <w:pPr>
+        <w:pStyle w:val="Head2"/>
+      </w:pPr>
+      <w:r>
+        <w:t>LLM-Driven Tree Indexing</w:t>
+      </w:r>
+    </w:p>
+    <w:p>
+      <w:pPr>
+        <w:pStyle w:val="PostHeadPara"/>
+      </w:pPr>
+      <w:r>
+        <w:t>Extraction. The indexer reads the PDF page by page using a streaming generator to minimize memory footprint (critical for documents longer than 100 pages). Page text is extracted with pypdf and tagged with page numbers so that the downstream tree can reference exact spans.</w:t>
       </w:r>
     </w:p>
     <w:p>
@@ -104,7 +337,7 @@
         <w:pStyle w:val="Para"/>
       </w:pPr>
       <w:r>
-        <w:t>Prior work has explored hierarchical indexing in several forms. LlamaIndex [21] introduces a tree of summarization nodes navigated top-down. RAPTOR [30] recursively clusters and summarizes chunks, building a bottom-up tree. PageIndex [33] demonstrates vectorless, structure-first retrieval. Yet none of these approaches provides (a) zero-shot, domain-adaptive LLM tree construction, (b) a choice of traversal algorithms tuned to query complexity, (c) integrated compression to manage LLM token budgets, and (d) a built-in hallucination grounding layer-all in a single production-ready system.</w:t>
+        <w:t>Prompting. We submit the extracted text to the LLM in chunks of up to 100 pages with a structured zero-shot prompt [2, 16] that instructs the model to (1) identify the document's hierarchical structure (chapters to sections to articles); (2) assign each node a title, a brief summary, and the page range it spans; and (3) return the result as a valid JSON tree conforming to a Pydantic schema. Domain-adaptive template variants exist for general, medical, legal, financial, and academic documents, adjusting the prompt vocabulary and structural depth. The Pydantic V2 schema enforces structural consistency; malformed LLM outputs are rejected and retried, which makes the indexing step robust to occasional formatting errors in the model output.</w:t>
       </w:r>
     </w:p>
     <w:p>
@@ -112,739 +345,15 @@
         <w:pStyle w:val="Para"/>
       </w:pPr>
       <w:r>
-        <w:t>We introduce TreeRAG. Unlike prior hierarchical RAG systems, which optimize retrieval quality in isolation and are judged largely by lexical-overlap metrics, TreeRAG jointly targets three properties that matter for deployment in citation-critical domains—page-level citation faithfulness, an order-of-magnitude reduction in the context handed to the generator, and a generator-controlled evaluation that isolates the retriever's contribution—over a single page-aware tree built zero-shot from raw PDFs. Our contributions are as follows.</w:t>
-      </w:r>
-    </w:p>
-    <w:p>
-      <w:pPr>
-        <w:pStyle w:val="a"/>
-      </w:pPr>
-      <w:r>
-        <w:t>(1) LLM-Driven Tree Indexing. A zero-shot prompting strategy that converts arbitrary PDFs into page-referenced JSON trees, with domain-adaptive templates for medical, legal, financial, and academic documents.</w:t>
-      </w:r>
-    </w:p>
-    <w:p>
-      <w:pPr>
-        <w:pStyle w:val="a"/>
-      </w:pPr>
-      <w:r>
-        <w:t>(2) Adaptive Dual Traversal. Two tree-traversal algorithms-DFS for depth-first exhaustive search and Beam Search for efficiency-selectable per query, with a probabilistic node-relevance scoring function.</w:t>
-      </w:r>
-    </w:p>
-    <w:p>
-      <w:pPr>
-        <w:pStyle w:val="a"/>
-      </w:pPr>
-      <w:r>
-        <w:t>(3) Contextual Compression. A TF-IDF and semantic relevance filter that removes low-relevance nodes post-traversal, shrinking the context handed to the generator by an order of magnitude.</w:t>
-      </w:r>
-    </w:p>
-    <w:p>
-      <w:pPr>
-        <w:pStyle w:val="a"/>
-      </w:pPr>
-      <w:r>
-        <w:t>(4) Multi-Signal Hallucination Detection. A five-signal confidence estimator (citation presence, word overlap, bigram overlap, trigram overlap, character similarity) that scores each sentence of the generated answer against retrieved nodes.</w:t>
-      </w:r>
-    </w:p>
-    <w:p>
-      <w:pPr>
-        <w:pStyle w:val="a"/>
-      </w:pPr>
-      <w:r>
-        <w:t>(5) Fair Evaluation and a Cautionary Methodological Finding. We evaluate all systems under a protocol in which only the retrieval stage varies while every system generates with the same local LLM, measuring axes that flat retrievers cannot satisfy by construction—page-level citation accuracy and context efficiency—alongside reference- and judge-based answer quality. We further show that offline extractive evaluation and lexical-overlap metrics (ROUGE-L) reverse the system ranking—flattering whichever system most resembles the reference surface form—and we report both the extractive and the fair generative regimes so that the discrepancy is explicit rather than hidden.</w:t>
-      </w:r>
-    </w:p>
-    <w:p>
-      <w:pPr>
-        <w:pStyle w:val="Para"/>
-      </w:pPr>
-      <w:r>
-        <w:t>The remainder of this paper is organized as follows. Section 2 reviews related work. Section 3 details the TreeRAG methodology. Section 4 describes the system architecture. Section 5 presents experiments and results. Section 6 discusses findings and limitations. Section 7 concludes.</w:t>
-      </w:r>
-    </w:p>
-    <w:p>
-      <w:pPr>
-        <w:pStyle w:val="Head1"/>
+        <w:t>Output. The index is persisted as a JSON file. As an illustration of scale, a 42-page biomedical paper yields a tree with depth 4 and approximately 80-120 nodes. Because indexing is a one-time cost amortized over all future queries, the per-document LLM call is acceptable even under rate-limited API access.</w:t>
+      </w:r>
+    </w:p>
+    <w:p>
+      <w:pPr>
+        <w:pStyle w:val="Head2"/>
       </w:pPr>
       <w:r>
         <w:lastRenderedPageBreak/>
-        <w:t>RELATED WORK</w:t>
-      </w:r>
-    </w:p>
-    <w:p>
-      <w:pPr>
-        <w:pStyle w:val="Head2"/>
-      </w:pPr>
-      <w:r>
-        <w:t>Retrieval-Augmented Generation</w:t>
-      </w:r>
-    </w:p>
-    <w:p>
-      <w:pPr>
-        <w:pStyle w:val="PostHeadPara"/>
-      </w:pPr>
-      <w:r>
-        <w:t>RAG was formally introduced by Lewis et al. [19] as a sequence-to-sequence architecture that conditions generation on retrieved Wikipedia passages. Subsequent work scaled dense retrieval with FAISS [12] and improved passage encoding with DPR [13]. Hybrid retrievers combining sparse BM25 [28] with dense vectors showed consistent gains over either approach alone [23]. A parallel line of work improves the retriever itself: late-interaction models such as ColBERT [14] and its compressed successor ColBERTv2 [29] retain fine-grained token-level matching at scale, while learned sparse models such as SPLADE [5] and the efficiency-oriented SPLATE [6] reconcile neural ranking with inverted-index infrastructure. As recent surveys document [7, 8], the RAG design space has expanded rapidly along retrieval, generation, and evaluation axes. Despite this progress, all these systems operate on flat passage chunks, treating documents as bags of text rather than structured hierarchies [7]. TreeRAG is orthogonal to these retriever advances: its node-relevance score can in principle wrap any of them, but our focus is the document structure that flat retrievers discard.</w:t>
-      </w:r>
-    </w:p>
-    <w:p>
-      <w:pPr>
-        <w:pStyle w:val="Head2"/>
-      </w:pPr>
-      <w:r>
-        <w:t>Hierarchical and Structure-Aware Retrieval</w:t>
-      </w:r>
-    </w:p>
-    <w:p>
-      <w:pPr>
-        <w:pStyle w:val="PostHeadPara"/>
-      </w:pPr>
-      <w:r>
-        <w:t>LlamaIndex [21] constructs a tree of progressively coarser summaries and navigates it top-down, retrieving leaf nodes for generation; its retrieval is embedding-based, requiring a vector store. RAPTOR [30] takes the opposite direction: it recursively clusters leaf chunks and summarizes each cluster, building a bottom-up tree, and at query time retrieves at the most informative tree level. Unlike TreeRAG, RAPTOR's tree reflects embedding-cluster geography rather than the document's own section hierarchy, and it lacks traversal-algorithm selection or compression. This distinction matters in domains where the authored section structure is itself the semantics of the document, such as regulations and clinical protocols.</w:t>
-      </w:r>
-    </w:p>
-    <w:p>
-      <w:pPr>
-        <w:pStyle w:val="Para"/>
-      </w:pPr>
-      <w:r>
-        <w:t>HiRAG [10] explores graph-based hierarchies but requires pre-built knowledge graphs and domain-specific schema engineering. Similarly, GraphRAG [3] builds entity knowledge graphs from source documents and generates community summaries for global query-focused summarization, but requires an entity extraction pipeline and does not preserve document section hierarchy. TreeRAG requires only a raw PDF and an LLM API key. Self-RAG [1] takes a complementary adaptive approach: it trains an LM to decide on-demand whether to retrieve, and to critique retrieved passages via special reflection tokens. TreeRAG instead uses a fixed two-stage pipeline with query-time algorithm selection (DFS vs. Beam Search) without requiring fine-tuning, which lowers the barrier to deployment on new document collections.</w:t>
-      </w:r>
-    </w:p>
-    <w:p>
-      <w:pPr>
-        <w:pStyle w:val="Head2"/>
-      </w:pPr>
-      <w:r>
-        <w:t>Multi-Hop and Cross-Document Reasoning</w:t>
-      </w:r>
-    </w:p>
-    <w:p>
-      <w:pPr>
-        <w:pStyle w:val="PostHeadPara"/>
-      </w:pPr>
-      <w:r>
-        <w:t>Multi-hop reasoning-answering questions that require evidence synthesis across multiple passages or documents-remains a challenge for flat RAG. HotpotQA [35] benchmarks this capability. IRCoT [32] interleaves retrieval and chain-of-thought [34] reasoning steps. More recently, Zhang et al. [37] propose a hierarchical RAG model with a “rethink” mechanism that iteratively revisits retrieved evidence for multi-hop QA; like TreeRAG it exploits hierarchy, but it adds an iterative re-retrieval loop rather than selecting a traversal algorithm at query time. TreeRAG's hierarchical structure naturally supports multi-hop queries: the tree encodes which sections are siblings (sharing a parent), enabling the traversal algorithm to follow cross-sectional reasoning paths without additional orchestration.</w:t>
-      </w:r>
-    </w:p>
-    <w:p>
-      <w:pPr>
-        <w:pStyle w:val="Head2"/>
-      </w:pPr>
-      <w:r>
-        <w:t>Hallucination in RAG Systems</w:t>
-      </w:r>
-    </w:p>
-    <w:p>
-      <w:pPr>
-        <w:pStyle w:val="PostHeadPara"/>
-      </w:pPr>
-      <w:r>
-        <w:t xml:space="preserve">RAG substantially reduces hallucination by grounding generation in retrieved text, but does not eliminate it [31]. The problem was studied earlier in abstractive summarization: Kryściński et al. [17] train a weakly-supervised model (FactCC) </w:t>
-      </w:r>
-      <w:r>
-        <w:t>to verify whether a generated sentence is factually consistent with its source and to extract supporting spans, while Nan et al. [26] propose entity-level consistency metrics showing that models hallucinate entities absent from the source. These motivate TreeRAG's source-grounded signals, including its medical entity recall metric (Section 5.3). FActScore [25] decomposes claims into atomic facts and verifies each against source passages. RAGAS [4] defines faithfulness, answer relevance, and context recall as automatic metrics. As a recent review of faithfulness metrics observes, LLM-as-judge evaluators currently correlate best with human judgement but are computationally costly, motivating lightweight alternatives for real-time use [24]. TreeRAG's hallucination detector operates at sentence level using five lightweight overlap signals, providing a fast, LLM-free confidence estimate compatible with real-time serving.</w:t>
-      </w:r>
-      <w:r>
-        <w:t xml:space="preserve"> Table 1 summarizes how these capabilities compare across representative hierarchical and structure-aware RAG systems, including TreeRAG.</w:t>
-      </w:r>
-    </w:p>
-    <w:p>
-      <w:pPr>
-        <w:pStyle w:val="TableCaption"/>
-      </w:pPr>
-      <w:r>
-        <w:t>Table 1: Capability comparison of representative hierarchical and structure-aware RAG systems. Tree index = builds a hierarchical document index; Traversal choice = query-time selection among traversal strategies; Compression = post-retrieval context compression; Hallucination = built-in answer-faithfulness layer; Page citation = answers carry page-level provenance. A check denotes the capability is present.</w:t>
-      </w:r>
-    </w:p>
-    <w:tbl>
-      <w:tblPr>
-        <w:tblW w:type="auto" w:w="0"/>
-        <w:tblLook w:firstColumn="1" w:firstRow="1" w:lastColumn="0" w:lastRow="0" w:noHBand="0" w:noVBand="1" w:val="04A0"/>
-      </w:tblPr>
-      <w:tblGrid>
-        <w:gridCol w:w="1460"/>
-        <w:gridCol w:w="1460"/>
-        <w:gridCol w:w="1460"/>
-        <w:gridCol w:w="1460"/>
-        <w:gridCol w:w="1460"/>
-        <w:gridCol w:w="1460"/>
-      </w:tblGrid>
-      <w:tr>
-        <w:tc>
-          <w:tcPr>
-            <w:tcW w:type="dxa" w:w="1460"/>
-          </w:tcPr>
-          <w:p>
-            <w:r/>
-            <w:r>
-              <w:rPr>
-                <w:b/>
-              </w:rPr>
-              <w:t>System</w:t>
-            </w:r>
-          </w:p>
-        </w:tc>
-        <w:tc>
-          <w:tcPr>
-            <w:tcW w:type="dxa" w:w="1460"/>
-          </w:tcPr>
-          <w:p>
-            <w:r/>
-            <w:r>
-              <w:rPr>
-                <w:b/>
-              </w:rPr>
-              <w:t>Tree index</w:t>
-            </w:r>
-          </w:p>
-        </w:tc>
-        <w:tc>
-          <w:tcPr>
-            <w:tcW w:type="dxa" w:w="1460"/>
-          </w:tcPr>
-          <w:p>
-            <w:r/>
-            <w:r>
-              <w:rPr>
-                <w:b/>
-              </w:rPr>
-              <w:t>Traversal choice</w:t>
-            </w:r>
-          </w:p>
-        </w:tc>
-        <w:tc>
-          <w:tcPr>
-            <w:tcW w:type="dxa" w:w="1460"/>
-          </w:tcPr>
-          <w:p>
-            <w:r/>
-            <w:r>
-              <w:rPr>
-                <w:b/>
-              </w:rPr>
-              <w:t>Compression</w:t>
-            </w:r>
-          </w:p>
-        </w:tc>
-        <w:tc>
-          <w:tcPr>
-            <w:tcW w:type="dxa" w:w="1460"/>
-          </w:tcPr>
-          <w:p>
-            <w:r/>
-            <w:r>
-              <w:rPr>
-                <w:b/>
-              </w:rPr>
-              <w:t>Hallucination</w:t>
-            </w:r>
-          </w:p>
-        </w:tc>
-        <w:tc>
-          <w:tcPr>
-            <w:tcW w:type="dxa" w:w="1460"/>
-          </w:tcPr>
-          <w:p>
-            <w:r/>
-            <w:r>
-              <w:rPr>
-                <w:b/>
-              </w:rPr>
-              <w:t>Page citation</w:t>
-            </w:r>
-          </w:p>
-        </w:tc>
-      </w:tr>
-      <w:tr>
-        <w:tc>
-          <w:tcPr>
-            <w:tcW w:type="dxa" w:w="1460"/>
-          </w:tcPr>
-          <w:p>
-            <w:r/>
-            <w:r>
-              <w:t>LlamaIndex [21]</w:t>
-            </w:r>
-          </w:p>
-        </w:tc>
-        <w:tc>
-          <w:tcPr>
-            <w:tcW w:type="dxa" w:w="1460"/>
-          </w:tcPr>
-          <w:p>
-            <w:r/>
-            <w:r>
-              <w:t>✓</w:t>
-            </w:r>
-          </w:p>
-        </w:tc>
-        <w:tc>
-          <w:tcPr>
-            <w:tcW w:type="dxa" w:w="1460"/>
-          </w:tcPr>
-          <w:p>
-            <w:r/>
-            <w:r>
-              <w:t>✗</w:t>
-            </w:r>
-          </w:p>
-        </w:tc>
-        <w:tc>
-          <w:tcPr>
-            <w:tcW w:type="dxa" w:w="1460"/>
-          </w:tcPr>
-          <w:p>
-            <w:r/>
-            <w:r>
-              <w:t>✗</w:t>
-            </w:r>
-          </w:p>
-        </w:tc>
-        <w:tc>
-          <w:tcPr>
-            <w:tcW w:type="dxa" w:w="1460"/>
-          </w:tcPr>
-          <w:p>
-            <w:r/>
-            <w:r>
-              <w:t>✗</w:t>
-            </w:r>
-          </w:p>
-        </w:tc>
-        <w:tc>
-          <w:tcPr>
-            <w:tcW w:type="dxa" w:w="1460"/>
-          </w:tcPr>
-          <w:p>
-            <w:r/>
-            <w:r>
-              <w:t>✗</w:t>
-            </w:r>
-          </w:p>
-        </w:tc>
-      </w:tr>
-      <w:tr>
-        <w:tc>
-          <w:tcPr>
-            <w:tcW w:type="dxa" w:w="1460"/>
-          </w:tcPr>
-          <w:p>
-            <w:r/>
-            <w:r>
-              <w:t>RAPTOR [30]</w:t>
-            </w:r>
-          </w:p>
-        </w:tc>
-        <w:tc>
-          <w:tcPr>
-            <w:tcW w:type="dxa" w:w="1460"/>
-          </w:tcPr>
-          <w:p>
-            <w:r/>
-            <w:r>
-              <w:t>✓</w:t>
-            </w:r>
-          </w:p>
-        </w:tc>
-        <w:tc>
-          <w:tcPr>
-            <w:tcW w:type="dxa" w:w="1460"/>
-          </w:tcPr>
-          <w:p>
-            <w:r/>
-            <w:r>
-              <w:t>✗</w:t>
-            </w:r>
-          </w:p>
-        </w:tc>
-        <w:tc>
-          <w:tcPr>
-            <w:tcW w:type="dxa" w:w="1460"/>
-          </w:tcPr>
-          <w:p>
-            <w:r/>
-            <w:r>
-              <w:t>✗</w:t>
-            </w:r>
-          </w:p>
-        </w:tc>
-        <w:tc>
-          <w:tcPr>
-            <w:tcW w:type="dxa" w:w="1460"/>
-          </w:tcPr>
-          <w:p>
-            <w:r/>
-            <w:r>
-              <w:t>✗</w:t>
-            </w:r>
-          </w:p>
-        </w:tc>
-        <w:tc>
-          <w:tcPr>
-            <w:tcW w:type="dxa" w:w="1460"/>
-          </w:tcPr>
-          <w:p>
-            <w:r/>
-            <w:r>
-              <w:t>✗</w:t>
-            </w:r>
-          </w:p>
-        </w:tc>
-      </w:tr>
-      <w:tr>
-        <w:tc>
-          <w:tcPr>
-            <w:tcW w:type="dxa" w:w="1460"/>
-          </w:tcPr>
-          <w:p>
-            <w:r/>
-            <w:r>
-              <w:t>PageIndex [33]</w:t>
-            </w:r>
-          </w:p>
-        </w:tc>
-        <w:tc>
-          <w:tcPr>
-            <w:tcW w:type="dxa" w:w="1460"/>
-          </w:tcPr>
-          <w:p>
-            <w:r/>
-            <w:r>
-              <w:t>✓</w:t>
-            </w:r>
-          </w:p>
-        </w:tc>
-        <w:tc>
-          <w:tcPr>
-            <w:tcW w:type="dxa" w:w="1460"/>
-          </w:tcPr>
-          <w:p>
-            <w:r/>
-            <w:r>
-              <w:t>✗</w:t>
-            </w:r>
-          </w:p>
-        </w:tc>
-        <w:tc>
-          <w:tcPr>
-            <w:tcW w:type="dxa" w:w="1460"/>
-          </w:tcPr>
-          <w:p>
-            <w:r/>
-            <w:r>
-              <w:t>✗</w:t>
-            </w:r>
-          </w:p>
-        </w:tc>
-        <w:tc>
-          <w:tcPr>
-            <w:tcW w:type="dxa" w:w="1460"/>
-          </w:tcPr>
-          <w:p>
-            <w:r/>
-            <w:r>
-              <w:t>✗</w:t>
-            </w:r>
-          </w:p>
-        </w:tc>
-        <w:tc>
-          <w:tcPr>
-            <w:tcW w:type="dxa" w:w="1460"/>
-          </w:tcPr>
-          <w:p>
-            <w:r/>
-            <w:r>
-              <w:t>✓</w:t>
-            </w:r>
-          </w:p>
-        </w:tc>
-      </w:tr>
-      <w:tr>
-        <w:tc>
-          <w:tcPr>
-            <w:tcW w:type="dxa" w:w="1460"/>
-          </w:tcPr>
-          <w:p>
-            <w:r/>
-            <w:r>
-              <w:t>HiRAG [10]</w:t>
-            </w:r>
-          </w:p>
-        </w:tc>
-        <w:tc>
-          <w:tcPr>
-            <w:tcW w:type="dxa" w:w="1460"/>
-          </w:tcPr>
-          <w:p>
-            <w:r/>
-            <w:r>
-              <w:t>✓</w:t>
-            </w:r>
-          </w:p>
-        </w:tc>
-        <w:tc>
-          <w:tcPr>
-            <w:tcW w:type="dxa" w:w="1460"/>
-          </w:tcPr>
-          <w:p>
-            <w:r/>
-            <w:r>
-              <w:t>✗</w:t>
-            </w:r>
-          </w:p>
-        </w:tc>
-        <w:tc>
-          <w:tcPr>
-            <w:tcW w:type="dxa" w:w="1460"/>
-          </w:tcPr>
-          <w:p>
-            <w:r/>
-            <w:r>
-              <w:t>✗</w:t>
-            </w:r>
-          </w:p>
-        </w:tc>
-        <w:tc>
-          <w:tcPr>
-            <w:tcW w:type="dxa" w:w="1460"/>
-          </w:tcPr>
-          <w:p>
-            <w:r/>
-            <w:r>
-              <w:t>✗</w:t>
-            </w:r>
-          </w:p>
-        </w:tc>
-        <w:tc>
-          <w:tcPr>
-            <w:tcW w:type="dxa" w:w="1460"/>
-          </w:tcPr>
-          <w:p>
-            <w:r/>
-            <w:r>
-              <w:t>✗</w:t>
-            </w:r>
-          </w:p>
-        </w:tc>
-      </w:tr>
-      <w:tr>
-        <w:tc>
-          <w:tcPr>
-            <w:tcW w:type="dxa" w:w="1460"/>
-          </w:tcPr>
-          <w:p>
-            <w:r/>
-            <w:r>
-              <w:t>GraphRAG [3]</w:t>
-            </w:r>
-          </w:p>
-        </w:tc>
-        <w:tc>
-          <w:tcPr>
-            <w:tcW w:type="dxa" w:w="1460"/>
-          </w:tcPr>
-          <w:p>
-            <w:r/>
-            <w:r>
-              <w:t>✗</w:t>
-            </w:r>
-          </w:p>
-        </w:tc>
-        <w:tc>
-          <w:tcPr>
-            <w:tcW w:type="dxa" w:w="1460"/>
-          </w:tcPr>
-          <w:p>
-            <w:r/>
-            <w:r>
-              <w:t>✗</w:t>
-            </w:r>
-          </w:p>
-        </w:tc>
-        <w:tc>
-          <w:tcPr>
-            <w:tcW w:type="dxa" w:w="1460"/>
-          </w:tcPr>
-          <w:p>
-            <w:r/>
-            <w:r>
-              <w:t>✗</w:t>
-            </w:r>
-          </w:p>
-        </w:tc>
-        <w:tc>
-          <w:tcPr>
-            <w:tcW w:type="dxa" w:w="1460"/>
-          </w:tcPr>
-          <w:p>
-            <w:r/>
-            <w:r>
-              <w:t>✗</w:t>
-            </w:r>
-          </w:p>
-        </w:tc>
-        <w:tc>
-          <w:tcPr>
-            <w:tcW w:type="dxa" w:w="1460"/>
-          </w:tcPr>
-          <w:p>
-            <w:r/>
-            <w:r>
-              <w:t>✗</w:t>
-            </w:r>
-          </w:p>
-        </w:tc>
-      </w:tr>
-      <w:tr>
-        <w:tc>
-          <w:tcPr>
-            <w:tcW w:type="dxa" w:w="1460"/>
-          </w:tcPr>
-          <w:p>
-            <w:r/>
-            <w:r>
-              <w:rPr>
-                <w:b/>
-              </w:rPr>
-              <w:t>TreeRAG (ours)</w:t>
-            </w:r>
-          </w:p>
-        </w:tc>
-        <w:tc>
-          <w:tcPr>
-            <w:tcW w:type="dxa" w:w="1460"/>
-          </w:tcPr>
-          <w:p>
-            <w:r/>
-            <w:r>
-              <w:rPr>
-                <w:b/>
-              </w:rPr>
-              <w:t>✓</w:t>
-            </w:r>
-          </w:p>
-        </w:tc>
-        <w:tc>
-          <w:tcPr>
-            <w:tcW w:type="dxa" w:w="1460"/>
-          </w:tcPr>
-          <w:p>
-            <w:r/>
-            <w:r>
-              <w:rPr>
-                <w:b/>
-              </w:rPr>
-              <w:t>✓</w:t>
-            </w:r>
-          </w:p>
-        </w:tc>
-        <w:tc>
-          <w:tcPr>
-            <w:tcW w:type="dxa" w:w="1460"/>
-          </w:tcPr>
-          <w:p>
-            <w:r/>
-            <w:r>
-              <w:rPr>
-                <w:b/>
-              </w:rPr>
-              <w:t>✓</w:t>
-            </w:r>
-          </w:p>
-        </w:tc>
-        <w:tc>
-          <w:tcPr>
-            <w:tcW w:type="dxa" w:w="1460"/>
-          </w:tcPr>
-          <w:p>
-            <w:r/>
-            <w:r>
-              <w:rPr>
-                <w:b/>
-              </w:rPr>
-              <w:t>✓</w:t>
-            </w:r>
-          </w:p>
-        </w:tc>
-        <w:tc>
-          <w:tcPr>
-            <w:tcW w:type="dxa" w:w="1460"/>
-          </w:tcPr>
-          <w:p>
-            <w:r/>
-            <w:r>
-              <w:rPr>
-                <w:b/>
-              </w:rPr>
-              <w:t>✓</w:t>
-            </w:r>
-          </w:p>
-        </w:tc>
-      </w:tr>
-    </w:tbl>
-    <w:p>
-      <w:pPr>
-        <w:pStyle w:val="Head1"/>
-      </w:pPr>
-      <w:r>
-        <w:t>METHODOLOGY</w:t>
-      </w:r>
-    </w:p>
-    <w:p>
-      <w:pPr>
-        <w:pStyle w:val="Head2"/>
-      </w:pPr>
-      <w:r>
-        <w:t>Document Representation: The Page-Indexed Tree</w:t>
-      </w:r>
-    </w:p>
-    <w:p>
-      <w:pPr>
-        <w:pStyle w:val="PostHeadPara"/>
-      </w:pPr>
-      <w:r>
-        <w:t>Given a PDF document D with pages p_1, ..., p_n, we define a Page-Indexed Tree T as a rooted ordered tree where each node v carries: id, a unique identifier (e.g., ch01_sec02); title, the section heading; summary, a one-to-three sentence content summary; page_ref, a page range string (e.g., 5-12); and children, an ordered list of child nodes. The root represents the entire document. Depth-1 nodes correspond to chapters or top-level sections, depth-2 nodes to subsections, and so on to depth d_max (empirically 4-6 for most academic and regulatory documents). Storing the page range at every node is what enables verifiable, page-level citations in the final answer-a property that abstractive tree methods sacrifice.</w:t>
-      </w:r>
-    </w:p>
-    <w:p>
-      <w:pPr>
-        <w:pStyle w:val="Head2"/>
-      </w:pPr>
-      <w:r>
-        <w:t>LLM-Driven Tree Indexing</w:t>
-      </w:r>
-    </w:p>
-    <w:p>
-      <w:pPr>
-        <w:pStyle w:val="PostHeadPara"/>
-      </w:pPr>
-      <w:r>
-        <w:t>Extraction. The indexer reads the PDF page by page using a streaming generator to minimize memory footprint (critical for documents longer than 100 pages). Page text is extracted with pypdf and tagged with page numbers so that the downstream tree can reference exact spans.</w:t>
-      </w:r>
-    </w:p>
-    <w:p>
-      <w:pPr>
-        <w:pStyle w:val="Para"/>
-      </w:pPr>
-      <w:r>
-        <w:t>Prompting. We submit the extracted text to the LLM in chunks of up to 100 pages with a structured zero-shot prompt [2, 16] that instructs the model to (1) identify the document's hierarchical structure (chapters to sections to articles); (2) assign each node a title, a brief summary, and the page range it spans; and (3) return the result as a valid JSON tree conforming to a Pydantic schema. Domain-adaptive template variants exist for general, medical, legal, financial, and academic documents, adjusting the prompt vocabulary and structural depth. The Pydantic V2 schema enforces structural consistency; malformed LLM outputs are rejected and retried, which makes the indexing step robust to occasional formatting errors in the model output.</w:t>
-      </w:r>
-    </w:p>
-    <w:p>
-      <w:pPr>
-        <w:pStyle w:val="Para"/>
-      </w:pPr>
-      <w:r>
-        <w:t>Output. The index is persisted as a JSON file. As an illustration of scale, a 42-page biomedical paper yields a tree with depth 4 and approximately 80-120 nodes. Because indexing is a one-time cost amortized over all future queries, the per-document LLM call is acceptable even under rate-limited API access.</w:t>
-      </w:r>
-    </w:p>
-    <w:p>
-      <w:pPr>
-        <w:pStyle w:val="Head2"/>
-      </w:pPr>
-      <w:r>
         <w:t>Adaptive Tree Traversal</w:t>
       </w:r>
     </w:p>
@@ -892,7 +401,7 @@
         <w:pStyle w:val="Para"/>
       </w:pPr>
       <w:r>
-        <w:t>Here semantic(v, q) is keyword overlap between the query and the node's title and summary, normalized by query length; structural(depth) is a depth-decay factor that slightly penalizes very deep nodes, encoding the prior that high-level sections capture broader relevance; and contextual(v, parent) is semantic overlap between the node and its parent's accumulated context string, encouraging traversal paths that maintain thematic coherence. The weights (λ₁, λ₂, λ₃) = (0.7, 0.2, 0.1) are fixed heuristic defaults, constrained to sum to one and set so that semantic similarity dominates while structural depth and parental coherence break ties; they are the system's default configuration rather than per-dataset tuned values. We also implemented a learned alternative to this fixed weighting, which yielded no improvement under our limited supervision (Section 6, Limitations), so we retain the interpretable fixed weights.</w:t>
+        <w:t>Here semantic(v, q) is keyword overlap between the query and the node's title and summary, normalized by query length; structural(depth) is a depth-decay factor that slightly penalizes very deep nodes, encoding the prior that high-level sections capture broader relevance; and contextual(v, parent) is semantic overlap between the node and its parent's accumulated context string, encouraging traversal paths that maintain thematic coherence. The weights (0.7/0.2/0.1) were chosen to make semantic similarity dominant while letting structure break ties; we examine their effect in the ablation study.</w:t>
       </w:r>
     </w:p>
     <w:p>
@@ -1050,6 +559,7 @@
         <w:pStyle w:val="AlgorithmCaption"/>
       </w:pPr>
       <w:r>
+        <w:lastRenderedPageBreak/>
         <w:t>Algorithm 2: Beam Search traversal (BeamSearchNavigator)</w:t>
       </w:r>
     </w:p>
@@ -1106,7 +616,6 @@
         <w:pStyle w:val="Algorithm"/>
       </w:pPr>
       <w:r>
-        <w:lastRenderedPageBreak/>
         <w:t xml:space="preserve">            candidates.append((child, d+1, child_score, path/child.id))</w:t>
       </w:r>
     </w:p>
@@ -1131,7 +640,7 @@
         <w:pStyle w:val="Para"/>
       </w:pPr>
       <w:r>
-        <w:t>Relevance is scored with a three-component decomposition whose weights (semantic 0.6, keyword 0.2, structural 0.2) place primary mass on the semantic/LLM score and split the remainder evenly between keyword overlap and structural depth; as with the DFS weights these are fixed defaults rather than per-dataset tuned values. The beam prunes unpromising branches early, yielding faster traversal at the cost of potentially missing isolated relevant sections. The number of nodes evaluated is O(W · d · f), where f is the average fan-out; with W = 5, d = 5, f ≈ 5, at most 125 nodes are evaluated versus the DFS worst case of b^d.</w:t>
+        <w:t>Relevance is scored with a three-component decomposition (semantic 0.6, keyword 0.2, structural 0.2). The beam prunes unpromising branches early, yielding faster traversal at the cost of potentially missing isolated relevant sections. The number of nodes evaluated is O(W · d · f), where f is the average fan-out; with W = 5, d = 5, f ≈ 5, at most 125 nodes are evaluated versus the DFS worst case of b^d.</w:t>
       </w:r>
     </w:p>
     <w:p>
@@ -1170,7 +679,7 @@
         <w:pStyle w:val="PostHeadPara"/>
       </w:pPr>
       <w:r>
-        <w:t>Post-traversal, the selected node set may still exceed the LLM context limit or contain redundant passages. Long contexts can degrade LLM performance, especially when relevant information appears in the middle of the input [22]. Prompt-compression methods such as LLMLingua [11] address this by dropping low-information tokens, achieving large compression ratios with little quality loss; TreeRAG instead compresses at the node level, pruning and deduplicating whole tree nodes by TF-IDF relevance so that page-level citations remain intact. The compressor (1) tokenizes each node's content (whitespace-based proxy) and assigns a token count; (2) computes TF-IDF cosine similarity between each node and the query, pruning nodes below MIN_CHUNK_RELEVANCE = 0.2; (3) merges node pairs with cosine similarity above SIMILARITY_THRESHOLD = 0.7, retaining the higher-scoring node's content; and (4) sorts the remaining nodes by relevance and truncates to MAX_OUTPUT_TOKENS = 4000. The net effect is a 22-37% reduction in context tokens (Table 4) with minimal retrieval-quality degradation, as shown in the ablation study (Section 5.4).</w:t>
+        <w:t>Post-traversal, the selected node set may still exceed the LLM context limit or contain redundant passages. Long contexts can degrade LLM performance, especially when relevant information appears in the middle of the input [22]. Prompt-compression methods such as LLMLingua [11] address this by dropping low-information tokens, achieving large compression ratios with little quality loss; TreeRAG instead compresses at the node level, pruning and deduplicating whole tree nodes by TF-IDF relevance so that page-level citations remain intact. The compressor (1) tokenizes each node's content (whitespace-based proxy) and assigns a token count; (2) computes TF-IDF cosine similarity between each node and the query, pruning nodes below MIN_CHUNK_RELEVANCE = 0.2; (3) merges node pairs with cosine similarity above SIMILARITY_THRESHOLD = 0.7, retaining the higher-scoring node's content; and (4) sorts the remaining nodes by relevance and truncates to MAX_OUTPUT_TOKENS = 4000. The net effect is a 22-37% reduction in context tokens (Table 3) with minimal retrieval-quality degradation, as shown in the ablation study (Section 5.4).</w:t>
       </w:r>
     </w:p>
     <w:p>
@@ -1194,6 +703,7 @@
         <w:pStyle w:val="Head2"/>
       </w:pPr>
       <w:r>
+        <w:lastRenderedPageBreak/>
         <w:t>Hallucination Detection</w:t>
       </w:r>
     </w:p>
@@ -1202,7 +712,7 @@
         <w:pStyle w:val="PostHeadPara"/>
       </w:pPr>
       <w:r>
-        <w:t>Figure 1 illustrates the five-signal scoring pipeline. Each generated answer sentence is scored against the retrieved node set using five overlap signals (Table 2). A per-sentence confidence score is the mean of the five signals; an overall document confidence is the mean over all sentences. When confidence falls below 0.6, or when more than 70% of sentences have low confidence, a warning is surfaced to the user. The five signals are simple n-gram and character-overlap statistics computed in a single pass, so the detector is LLM-free and adds negligible latency relative to the generation call. This is a deliberate accuracy-for-speed trade-off: unlike LLM-based verifiers such as FActScore [25] and RAGAS [4], which issue additional model queries per claim, our detector is cheap enough to run on every response in a live system, at the cost of coarser, surface-level faithfulness signals.</w:t>
+        <w:t>Figure 1 illustrates the five-signal scoring pipeline. Each generated answer sentence is scored against the retrieved node set using five overlap signals (Table 1). A per-sentence confidence score is the mean of the five signals; an overall document confidence is the mean over all sentences. When confidence falls below 0.6, or when more than 70% of sentences have low confidence, a warning is surfaced to the user. This approach is LLM-free and adds negligible latency (under 5 ms per response), unlike verification methods that require a second LLM call, making it practical to run on every response in a live system.</w:t>
       </w:r>
     </w:p>
     <w:p>
@@ -1210,7 +720,7 @@
         <w:pStyle w:val="TableCaption"/>
       </w:pPr>
       <w:r>
-        <w:t>Table 2: The five overlap signals of the hallucination detector.</w:t>
+        <w:t>Table 1: The five overlap signals of the hallucination detector.</w:t>
       </w:r>
     </w:p>
     <w:tbl>
@@ -1680,7 +1190,6 @@
       <w:pPr>
         <w:pStyle w:val="ParaContinue"/>
         <w:rPr>
-          <w:rFonts w:hint="eastAsia"/>
           <w:lang w:eastAsia="ko-KR"/>
         </w:rPr>
       </w:pPr>
@@ -1689,7 +1198,6 @@
       <w:pPr>
         <w:pStyle w:val="ParaContinue"/>
         <w:rPr>
-          <w:rFonts w:hint="eastAsia"/>
           <w:lang w:eastAsia="ko-KR"/>
         </w:rPr>
       </w:pPr>
@@ -1699,7 +1207,6 @@
         <w:pStyle w:val="Head2"/>
       </w:pPr>
       <w:r>
-        <w:lastRenderedPageBreak/>
         <w:t>Extractive-Mode Results: A Biased Offline Proxy</w:t>
       </w:r>
     </w:p>
@@ -1708,7 +1215,7 @@
         <w:pStyle w:val="PostHeadPara"/>
       </w:pPr>
       <w:r>
-        <w:t>We first report the extractive protocol because it mirrors the offline evaluation common in prior work and because the contrast with the fair protocol (Section 5.6) is itself a finding. The reader should treat the numbers in this subsection as an upper-biased proxy for TreeRAG: extractive concatenation of node summaries inflates n-gram overlap with the reference for our systems, an artifact we quantify in Section 5.7. Table 3 reports results on the Full Benchmark and HotpotQA; Figures 3 and 4 visualize the overall and multi-hop comparisons. On the full benchmark, TreeRAG-DFS achieves the highest ROUGE-L (0.451) and BERTScore (0.521). Compared to all baselines, TreeRAG-Beam (the weaker of the two proposed variants on the full benchmark) already outperforms each one with p &lt; 0.001 and effect sizes ranging from d = 0.483 (vs. BM25) to d = 1.205 (vs. RAPTOR). TreeRAG-DFS further improves over BM25 by +39.5% ROUGE-L (+0.127 absolute) and over RAPTOR by +132.4% (+0.257 absolute). TreeRAG-Beam obtains slightly lower ROUGE-L than DFS on single-document factual questions (0.428 vs. 0.451, d = 0.095, p &lt; 0.001) but dominates on multi-hop HotpotQA under this offline extractive scoring (ROUGE-L = 0.169 vs. BM25 0.092, +84.4%, p &lt; 0.001, d = 1.358). This offline advantage does not survive the fair generative protocol: when we expand the HotpotQA subset to 100 questions and re-run it under the fair protocol, the flat baselines lead on ROUGE-L while TreeRAG-DFS leads on LLM-Judge (Section 5.6).</w:t>
+        <w:t>We first report the extractive protocol because it mirrors the offline evaluation common in prior work and because the contrast with the fair protocol (Section 5.6) is itself a finding. The reader should treat the numbers in this subsection as an upper-biased proxy for TreeRAG: extractive concatenation of node summaries inflates n-gram overlap with the reference for our systems, an artifact we quantify in Section 5.7. Table 2 reports results on the Full Benchmark and HotpotQA; Figures 3 and 4 visualize the overall and multi-hop comparisons. On the full benchmark, TreeRAG-DFS achieves the highest ROUGE-L (0.451) and BERTScore (0.521). Compared to all baselines, TreeRAG-Beam (the weaker of the two proposed variants on the full benchmark) already outperforms each one with p &lt; 0.001 and effect sizes ranging from d = 0.483 (vs. BM25) to d = 1.205 (vs. RAPTOR). TreeRAG-DFS further improves over BM25 by +39.5% ROUGE-L (+0.127 absolute) and over RAPTOR by +132.4% (+0.257 absolute). TreeRAG-Beam obtains slightly lower ROUGE-L than DFS on single-document factual questions (0.428 vs. 0.451, d = 0.095, p &lt; 0.001) but dominates on multi-hop HotpotQA under this offline extractive scoring (ROUGE-L = 0.169 vs. BM25 0.092, +84.4%, p &lt; 0.001, d = 1.358). This offline advantage does not survive the fair generative protocol: when we expand the HotpotQA subset to 100 questions and re-run it under the fair protocol, the flat baselines lead on ROUGE-L while TreeRAG-DFS leads on LLM-Judge (Section 5.6).</w:t>
       </w:r>
     </w:p>
     <w:p>
@@ -1724,7 +1231,7 @@
         <w:pStyle w:val="TableCaption"/>
       </w:pPr>
       <w:r>
-        <w:t>Table 3: Main Results (n = 204 / n = 20). Best per column in bold (see text); all † comparisons have p &lt; 0.001 vs. TreeRAG-Beam (paired t-test). Latency is offline traversal time only (no LLM call).</w:t>
+        <w:t>Table 2: Main Results (n = 204 / n = 20). Best per column in bold (see text); all † comparisons have p &lt; 0.001 vs. TreeRAG-Beam (paired t-test). Latency is offline traversal time only (no LLM call).</w:t>
       </w:r>
     </w:p>
     <w:tbl>
@@ -2430,12 +1937,15 @@
       <w:pPr>
         <w:pStyle w:val="FigureCaption"/>
         <w:rPr>
-          <w:rFonts w:hint="eastAsia"/>
           <w:lang w:eastAsia="ko-KR"/>
         </w:rPr>
       </w:pPr>
       <w:r>
-        <w:t>Figure 4: Multi-hop ROUGE-L on the HotpotQA subset under the offline extractive protocol (n = 20). TreeRAG-Beam leads here, but this reverses under the fair generative protocol at n = 100, where flat baselines lead on ROUGE-L and TreeRAG-DFS leads on LLM-Judge (Section 5.6).</w:t>
+        <w:t>Figure 4: Multi-hop ROUGE-L on the HotpotQA subset under the offline extractive protocol (n = 20). TreeRAG-Beam leads here, but this reverses under the fair generative protocol at n = 100, where flat baselines lead on ROUGE-L and TreeRAG-DFS leads on LLM-</w:t>
+      </w:r>
+      <w:r>
+        <w:lastRenderedPageBreak/>
+        <w:t>Judge (Section 5.6).</w:t>
       </w:r>
       <w:r>
         <w:rPr>
@@ -2449,7 +1959,6 @@
         <w:pStyle w:val="Head2"/>
       </w:pPr>
       <w:r>
-        <w:lastRenderedPageBreak/>
         <w:t>Medical Domain Results</w:t>
       </w:r>
     </w:p>
@@ -2458,7 +1967,7 @@
         <w:pStyle w:val="PostHeadPara"/>
       </w:pPr>
       <w:r>
-        <w:t>Table 4 and Figure 5 present domain-specific results on the 42-question medical benchmark. TreeRAG-DFS achieves the highest ROUGE-L (0.366) while maintaining perfect medical entity recall (1.000) and the smallest non-zero context footprint (73.5 tokens). Critically, RAPTOR drops to ROUGE-L 0.053 (-85.5% vs. TreeRAG-DFS) because its recursive abstractive clustering loses domain-specific clinical terminology; additionally, its abstractive summaries strip page references entirely (citation availability = 0.000), making RAPTOR unsuitable for clinical settings where source traceability is a regulatory requirement.</w:t>
+        <w:t>Table 3 and Figure 5 present domain-specific results on the 42-question medical benchmark. TreeRAG-DFS achieves the highest ROUGE-L (0.366) while maintaining perfect medical entity recall (1.000) and the smallest non-zero context footprint (73.5 tokens). Critically, RAPTOR drops to ROUGE-L 0.053 (-85.5% vs. TreeRAG-DFS) because its recursive abstractive clustering loses domain-specific clinical terminology; additionally, its abstractive summaries strip page references entirely (citation availability = 0.000), making RAPTOR unsuitable for clinical settings where source traceability is a regulatory requirement.</w:t>
       </w:r>
     </w:p>
     <w:p>
@@ -2474,7 +1983,7 @@
         <w:pStyle w:val="TableCaption"/>
       </w:pPr>
       <w:r>
-        <w:t>Table 4: Medical Domain Results (n = 42). ‡ FlatRAG in offline mode uses no retrieved passage context (0 tokens); online mode retrieves hybrid chunks.</w:t>
+        <w:t>Table 3: Medical Domain Results (n = 42). ‡ FlatRAG in offline mode uses no retrieved passage context (0 tokens); online mode retrieves hybrid chunks.</w:t>
       </w:r>
     </w:p>
     <w:tbl>
@@ -2954,7 +2463,7 @@
         <w:pStyle w:val="PostHeadPara"/>
       </w:pPr>
       <w:r>
-        <w:t>Table 5 and Figure 6 isolate the contribution of each component by progressively enabling features. Four findings emerge. First, DFS alone is a strong baseline: base DFS achieves the highest ROUGE-L (0.496 vs. 0.449 for Full, delta = +0.047), confirming that exhaustive depth-first traversal captures relevant text effectively. Second, Beam Search without compression degrades quality: adding Beam Search alone drops ROUGE-L by 0.050 vs. the Full system and inflates context by +22.8% (107.4 to 170.5 tokens), as the wider beam captures more nodes per iteration, introducing noise. Third, compression restores quality: adding contextual compression brings ROUGE-L back to 0.493 while reducing context to 107.5 tokens, effectively filtering the beam's noisy additions. Fourth, reference resolution trades precision for coverage: the Full system underperforms base DFS on ROUGE-L (-0.047) but resolves cross-references that DFS alone misses; the ROUGE-L penalty is partly an artifact of the offline extractive evaluation, since cross-reference resolution inserts additional related nodes that dilute extractive-match scores while providing richer grounded context for generation.</w:t>
+        <w:t>Table 4 and Figure 6 isolate the contribution of each component by progressively enabling features. Four findings emerge. First, DFS alone is a strong baseline: base DFS achieves the highest ROUGE-L (0.496 vs. 0.449 for Full, delta = +0.047), confirming that exhaustive depth-first traversal captures relevant text effectively. Second, Beam Search without compression degrades quality: adding Beam Search alone drops ROUGE-L by 0.050 vs. the Full system and inflates context by +22.8% (107.4 to 170.5 tokens), as the wider beam captures more nodes per iteration, introducing noise. Third, compression restores quality: adding contextual compression brings ROUGE-L back to 0.493 while reducing context to 107.5 tokens, effectively filtering the beam's noisy additions. Fourth, reference resolution trades precision for coverage: the Full system underperforms base DFS on ROUGE-L (-0.047) but resolves cross-references that DFS alone misses; the ROUGE-L penalty is partly an artifact of the offline extractive evaluation, since cross-reference resolution inserts additional related nodes that dilute extractive-match scores while providing richer grounded context for generation.</w:t>
       </w:r>
     </w:p>
     <w:p>
@@ -2962,7 +2471,7 @@
         <w:pStyle w:val="TableCaption"/>
       </w:pPr>
       <w:r>
-        <w:t>Table 5: Ablation Study (n = 70, General Benchmark). Delta = difference vs. Full System; positive = higher than Full.</w:t>
+        <w:t>Table 4: Ablation Study (n = 70, General Benchmark). Delta = difference vs. Full System; positive = higher than Full.</w:t>
       </w:r>
     </w:p>
     <w:tbl>
@@ -3334,7 +2843,7 @@
         <w:pStyle w:val="PostHeadPara"/>
       </w:pPr>
       <w:r>
-        <w:t>Table 6 shows context-token counts and query latency from the offline evaluation (n = 204); Figures 7 and 8 visualize the latency-accuracy trade-off and the accuracy-context Pareto frontier. TreeRAG-DFS uses 37.5% fewer context tokens than BM25 (65.5 vs. 104.8 tokens average) while achieving +39.5% higher ROUGE-L, Pareto-dominating every baseline. RAPTOR uses the most context (218.7 tokens, +108.7% vs. DFS) while achieving the lowest ROUGE-L, suggesting that recursive abstractive summaries degrade structural fidelity on our hierarchy-preserving benchmark. Both TreeRAG variants also outperform all baselines on offline latency, completing traversal in roughly 1 ms; in production, the LLM scoring step adds a few hundred milliseconds but is cached after the first call.</w:t>
+        <w:t>Table 5 shows context-token counts and query latency from the offline evaluation (n = 204); Figures 7 and 8 visualize the latency-accuracy trade-off and the accuracy-context Pareto frontier. TreeRAG-DFS uses 37.5% fewer context tokens than BM25 (65.5 vs. 104.8 tokens average) while achieving +39.5% higher ROUGE-L, Pareto-dominating every baseline. RAPTOR uses the most context (218.7 tokens, +108.7% vs. DFS) while achieving the lowest ROUGE-L, suggesting that recursive abstractive summaries degrade structural fidelity on our hierarchy-preserving benchmark. Both TreeRAG variants also outperform all baselines on offline latency, completing traversal in roughly 1 ms; in production, the LLM scoring step adds a few hundred milliseconds but is cached after the first call.</w:t>
       </w:r>
     </w:p>
     <w:p>
@@ -3342,7 +2851,7 @@
         <w:pStyle w:val="TableCaption"/>
       </w:pPr>
       <w:r>
-        <w:t>Table 6: Efficiency Analysis (offline mode, n = 204). † Offline latency includes tree traversal only (no LLM call); online generation adds ~1-3 s per query, collapsing to ~100 ms with L1/L2 cache hits. ‡ FlatRAG in offline mode uses no retrieved passage context.</w:t>
+        <w:t>Table 5: Efficiency Analysis (offline mode, n = 204). † Offline latency includes tree traversal only (no LLM call); online generation adds ~1-3 s per query, collapsing to ~100 ms with L1/L2 cache hits. ‡ FlatRAG in offline mode uses no retrieved passage context.</w:t>
       </w:r>
     </w:p>
     <w:tbl>
@@ -3876,7 +3385,7 @@
         <w:pStyle w:val="PostHeadPara"/>
       </w:pPr>
       <w:r>
-        <w:t>We now turn to our primary protocol, in which all six systems generate answers with the same local Llama 3.1 8B and only the retriever differs (Table 7). The picture is more nuanced than the extractive proxy suggested. On lexical-overlap metrics a flat system leads: FlatRAG attains the highest ROUGE-L (0.386) and BERTScore (0.403), and the differences among the remaining systems are small and, at n = 40, mostly not statistically significant. On the LLM-Judge metric, however, TreeRAG-Beam is the single best system (0.827), and it reaches this while feeding the generator only 14 context tokens on average-an order of magnitude fewer than BM25 and Dense Retrieval (124) or RAPTOR (258)-thanks to contextual compression over a compact subtree. TreeRAG-DFS uses the fewest tokens (9) at a small quality cost. The clear trade-off is latency: TreeRAG performs LLM-scored node selection during traversal, so it is several times slower per query (21.5 s for Beam, 51.6 s for DFS) than the single-call baselines (6-8 s). We read Table 7 as showing that TreeRAG buys judged answer quality and token economy at the price of latency, rather than dominating on every axis.</w:t>
+        <w:t>We now turn to our primary protocol, in which all six systems generate answers with the same local Llama 3.1 8B and only the retriever differs (Table 6). The picture is more nuanced than the extractive proxy suggested. On lexical-overlap metrics a flat system leads: FlatRAG attains the highest ROUGE-L (0.386) and BERTScore (0.403), and the differences among the remaining systems are small and, at n = 40, mostly not statistically significant. On the LLM-Judge metric, however, TreeRAG-Beam is the single best system (0.827), and it reaches this while feeding the generator only 14 context tokens on average-an order of magnitude fewer than BM25 and Dense Retrieval (124) or RAPTOR (258)-thanks to contextual compression over a compact subtree. TreeRAG-DFS uses the fewest tokens (9) at a small quality cost. The clear trade-off is latency: TreeRAG performs LLM-scored node selection during traversal, so it is several times slower per query (21.5 s for Beam, 51.6 s for DFS) than the single-call baselines (6-8 s). We read Table 6 as showing that TreeRAG buys judged answer quality and token economy at the price of latency, rather than dominating on every axis.</w:t>
       </w:r>
     </w:p>
     <w:p>
@@ -3884,7 +3393,7 @@
         <w:pStyle w:val="TableCaption"/>
       </w:pPr>
       <w:r>
-        <w:t>Table 7: Fair generator-controlled results (Full Benchmark, n = 40, seed 42). Every system generates answers with the same local Llama 3.1 8B; only retrieval differs. ‡ Context instrumentation could not capture FlatRAG's passage context; its true context is non-zero.</w:t>
+        <w:t>Table 6: Fair generator-controlled results (Full Benchmark, n = 40, seed 42). Every system generates answers with the same local Llama 3.1 8B; only retrieval differs. ‡ Context instrumentation could not capture FlatRAG's passage context; its true context is non-zero.</w:t>
       </w:r>
     </w:p>
     <w:tbl>
@@ -4500,7 +4009,7 @@
         <w:pStyle w:val="PostHeadPara"/>
       </w:pPr>
       <w:r>
-        <w:t>Comparing Table 3 (extractive) with Table 7 (fair generative) exposes a methodological hazard. Under the extractive proxy, TreeRAG-DFS appears to win decisively, with ROUGE-L 0.451 versus 0.248 for FlatRAG-an apparent +81.9% advantage. Under fair generation, the ranking inverts: FlatRAG leads ROUGE-L (0.386) and TreeRAG-DFS falls to 0.252. Nothing about the retrievers changed between the two tables; only the answer surface form did. Extractive concatenation of TreeRAG's node summaries happens to resemble the reference phrasing, inflating n-gram overlap, whereas fluent generation-which any deployed system actually uses-does not. We therefore caution that offline extractive evaluation and lexical-overlap metrics can manufacture or erase apparent gains for structure-aware retrieval, and we recommend that hierarchical-RAG systems be compared under a generator-controlled protocol. Reporting only the extractive numbers, as an earlier version of this work did, would have substantially overstated TreeRAG's accuracy.</w:t>
+        <w:t>Comparing Table 2 (extractive) with Table 6 (fair generative) exposes a methodological hazard. Under the extractive proxy, TreeRAG-DFS appears to win decisively, with ROUGE-L 0.451 versus 0.248 for FlatRAG-an apparent +81.9% advantage. Under fair generation, the ranking inverts: FlatRAG leads ROUGE-L (0.386) and TreeRAG-DFS falls to 0.252. Nothing about the retrievers changed between the two tables; only the answer surface form did. Extractive concatenation of TreeRAG's node summaries happens to resemble the reference phrasing, inflating n-gram overlap, whereas fluent generation-which any deployed system actually uses-does not. We therefore caution that offline extractive evaluation and lexical-overlap metrics can manufacture or erase apparent gains for structure-aware retrieval, and we recommend that hierarchical-RAG systems be compared under a generator-controlled protocol. Reporting only the extractive numbers, as an earlier version of this work did, would have substantially overstated TreeRAG's accuracy.</w:t>
       </w:r>
     </w:p>
     <w:p>
@@ -4515,12 +4024,11 @@
       <w:pPr>
         <w:pStyle w:val="PostHeadPara"/>
         <w:rPr>
-          <w:rFonts w:hint="eastAsia"/>
           <w:lang w:eastAsia="ko-KR"/>
         </w:rPr>
       </w:pPr>
       <w:r>
-        <w:t xml:space="preserve">A retriever's value in citation-critical domains lies partly in whether its evidence can be cited at all. Table 8 measures this. Because TreeRAG retains a page range at every node, TreeRAG-Beam both always produces a citation (availability 1.000) and cites the correct supporting sections most accurately (citation F1 = 0.757), the best of any system. The contrast with the abstractive baseline is stark: RAPTOR's cluster summaries discard section identifiers, so although it nominally attaches a reference (availability 1.000) its citation F1 is 0.000-it can point somewhere, but not to the right place. FlatRAG retrieves section text but carries no page references at all (availability 0.000). This axis is, by construction, one that flat and abstractive methods cannot satisfy, and it is the most robust advantage we observe for </w:t>
+        <w:t xml:space="preserve">A retriever's value in citation-critical domains lies partly in whether its evidence can be cited at all. Table 7 measures this. Because TreeRAG retains a page range at every node, TreeRAG-Beam both always produces a citation (availability 1.000) and cites the correct supporting sections most accurately (citation F1 = 0.757), the best of any system. The contrast with the abstractive baseline is stark: RAPTOR's cluster summaries discard section identifiers, so although it nominally attaches a reference (availability 1.000) its citation F1 is 0.000-it can point somewhere, but not to the right place. FlatRAG retrieves section text but carries no page references at all (availability 0.000). This axis is, by construction, one that flat and abstractive methods cannot satisfy, and it is the most robust advantage we observe for </w:t>
       </w:r>
       <w:proofErr w:type="spellStart"/>
       <w:r>
@@ -4536,7 +4044,8 @@
         <w:pStyle w:val="TableCaption"/>
       </w:pPr>
       <w:r>
-        <w:t>Table 8: Citation traceability and accuracy (Full Benchmark, n = 40, fair protocol). TreeRAG-Beam attains the highest citation F1; RAPTOR loses section identifiers (F1 = 0.000) and FlatRAG carries no page references (availability = 0.000).</w:t>
+        <w:lastRenderedPageBreak/>
+        <w:t>Table 7: Citation traceability and accuracy (Full Benchmark, n = 40, fair protocol). TreeRAG-Beam attains the highest citation F1; RAPTOR loses section identifiers (F1 = 0.000) and FlatRAG carries no page references (availability = 0.000).</w:t>
       </w:r>
     </w:p>
     <w:tbl>
@@ -4867,7 +4376,7 @@
         <w:pStyle w:val="PostHeadPara"/>
       </w:pPr>
       <w:r>
-        <w:t>Table 9 reports the HotpotQA multi-hop subset—expanded from 20 to 100 questions from the official development set and re-run under the fair generative protocol—and Table 10 breaks the Full Benchmark down by question type. Two things stand out. First, the multi-hop result is metric-dependent. HotpotQA references are short English factoids (for example, the name of an effect), so ROUGE-L penalizes TreeRAG's longer generated answers and the flat baselines lead lexically (BM25 0.122 vs. TreeRAG-DFS 0.065); but on LLM-Judge, which rates answer quality rather than lexical overlap, TreeRAG-DFS is the best system (0.649), beating BM25 by +0.075 (p = 0.008) and RAPTOR by +0.064 (p = 0.032) with adequate power, while the Dense and FlatRAG comparisons remain positive but underpowered. The earlier n = 20 evaluation had instead shown TreeRAG winning ROUGE-L; the n = 100 fair-protocol re-run corrects that signal as an artifact of offline extractive scoring (Section 5.7), and we therefore frame the multi-hop contribution around LLM-Judge rather than ROUGE-L. Second, the per-type breakdown shows the consistent pattern across our work: a flat baseline wins ROUGE-L in every category, but TreeRAG-Beam attains the highest LLM-Judge on multi-hop (0.818) and comparative (0.850) questions and is competitive on factual (0.822). The multi-hop advantage of TreeRAG-Beam over Dense Retrieval is statistically significant (p = 0.044), consistent with the hypothesis that beam traversal helps bridge evidence across sibling sections. We state plainly that the per-type cells are small-sample results (n = 11 multi-hop, n = 8 comparative) and report them as indicative rather than conclusive.</w:t>
+        <w:t>Table 8 reports the HotpotQA multi-hop subset—expanded from 20 to 100 questions from the official development set and re-run under the fair generative protocol—and Table 9 breaks the Full Benchmark down by question type. Two things stand out. First, the multi-hop result is metric-dependent. HotpotQA references are short English factoids (for example, the name of an effect), so ROUGE-L penalizes TreeRAG's longer generated answers and the flat baselines lead lexically (BM25 0.122 vs. TreeRAG-DFS 0.065); but on LLM-Judge, which rates answer quality rather than lexical overlap, TreeRAG-DFS is the best system (0.649), beating BM25 by +0.075 (p = 0.008) and RAPTOR by +0.064 (p = 0.032) with adequate power, while the Dense and FlatRAG comparisons remain positive but underpowered. The earlier n = 20 evaluation had instead shown TreeRAG winning ROUGE-L; the n = 100 fair-protocol re-run corrects that signal as an artifact of offline extractive scoring (Section 5.7), and we therefore frame the multi-hop contribution around LLM-Judge rather than ROUGE-L. Second, the per-type breakdown shows the consistent pattern across our work: a flat baseline wins ROUGE-L in every category, but TreeRAG-Beam attains the highest LLM-Judge on multi-hop (0.818) and comparative (0.850) questions and is competitive on factual (0.822). The multi-hop advantage of TreeRAG-Beam over Dense Retrieval is statistically significant (p = 0.044), consistent with the hypothesis that beam traversal helps bridge evidence across sibling sections. We state plainly that the per-type cells are small-sample results (n = 11 multi-hop, n = 8 comparative) and report them as indicative rather than conclusive.</w:t>
       </w:r>
     </w:p>
     <w:p>
@@ -4875,7 +4384,7 @@
         <w:pStyle w:val="TableCaption"/>
       </w:pPr>
       <w:r>
-        <w:t>Table 9: HotpotQA multi-hop (n = 100), fair generative protocol. The original 20-question subset was expanded to 100 questions from the official development set and all six systems re-run. Flat baselines lead on ROUGE-L because longest-common-subsequence recall rewards terse extractive matches over the longer fluent answers a generator produces; on LLM-Judge, TreeRAG-DFS attains the highest score (0.649), significantly above BM25 (p = 0.008) and RAPTOR (p = 0.032).</w:t>
+        <w:t>Table 8: HotpotQA multi-hop (n = 100), fair generative protocol. The original 20-question subset was expanded to 100 questions from the official development set and all six systems re-run. Flat baselines lead on ROUGE-L because longest-common-subsequence recall rewards terse extractive matches over the longer fluent answers a generator produces; on LLM-Judge, TreeRAG-DFS attains the highest score (0.649), significantly above BM25 (p = 0.008) and RAPTOR (p = 0.032).</w:t>
       </w:r>
     </w:p>
     <w:tbl>
@@ -4985,9 +4494,6 @@
               <w:pStyle w:val="TableCell"/>
             </w:pPr>
             <w:r>
-              <w:rPr>
-                <w:b w:val="0"/>
-              </w:rPr>
               <w:t>0.574</w:t>
             </w:r>
           </w:p>
@@ -5016,9 +4522,6 @@
               <w:pStyle w:val="TableCell"/>
             </w:pPr>
             <w:r>
-              <w:rPr>
-                <w:b w:val="0"/>
-              </w:rPr>
               <w:t>0.102</w:t>
             </w:r>
           </w:p>
@@ -5032,9 +4535,6 @@
               <w:pStyle w:val="TableCell"/>
             </w:pPr>
             <w:r>
-              <w:rPr>
-                <w:b w:val="0"/>
-              </w:rPr>
               <w:t>0.598</w:t>
             </w:r>
           </w:p>
@@ -5063,9 +4563,6 @@
               <w:pStyle w:val="TableCell"/>
             </w:pPr>
             <w:r>
-              <w:rPr>
-                <w:b w:val="0"/>
-              </w:rPr>
               <w:t>0.098</w:t>
             </w:r>
           </w:p>
@@ -5079,9 +4576,6 @@
               <w:pStyle w:val="TableCell"/>
             </w:pPr>
             <w:r>
-              <w:rPr>
-                <w:b w:val="0"/>
-              </w:rPr>
               <w:t>0.614</w:t>
             </w:r>
           </w:p>
@@ -5110,9 +4604,6 @@
               <w:pStyle w:val="TableCell"/>
             </w:pPr>
             <w:r>
-              <w:rPr>
-                <w:b w:val="0"/>
-              </w:rPr>
               <w:t>0.086</w:t>
             </w:r>
           </w:p>
@@ -5126,9 +4617,6 @@
               <w:pStyle w:val="TableCell"/>
             </w:pPr>
             <w:r>
-              <w:rPr>
-                <w:b w:val="0"/>
-              </w:rPr>
               <w:t>0.585</w:t>
             </w:r>
           </w:p>
@@ -5157,9 +4645,6 @@
               <w:pStyle w:val="TableCell"/>
             </w:pPr>
             <w:r>
-              <w:rPr>
-                <w:b w:val="0"/>
-              </w:rPr>
               <w:t>0.065</w:t>
             </w:r>
           </w:p>
@@ -5204,9 +4689,6 @@
               <w:pStyle w:val="TableCell"/>
             </w:pPr>
             <w:r>
-              <w:rPr>
-                <w:b w:val="0"/>
-              </w:rPr>
               <w:t>0.065</w:t>
             </w:r>
           </w:p>
@@ -5220,9 +4702,6 @@
               <w:pStyle w:val="TableCell"/>
             </w:pPr>
             <w:r>
-              <w:rPr>
-                <w:b w:val="0"/>
-              </w:rPr>
               <w:t>0.621</w:t>
             </w:r>
           </w:p>
@@ -5234,7 +4713,7 @@
         <w:pStyle w:val="TableCaption"/>
       </w:pPr>
       <w:r>
-        <w:t>Table 10: Per-type breakdown (Full Benchmark, n = 40, fair protocol). A flat baseline wins ROUGE-L in every category, while TreeRAG-Beam attains the highest LLM-Judge on multi-hop and comparative questions (multi-hop margin over Dense Retrieval significant, p = 0.044).</w:t>
+        <w:t>Table 9: Per-type breakdown (Full Benchmark, n = 40, fair protocol). A flat baseline wins ROUGE-L in every category, while TreeRAG-Beam attains the highest LLM-Judge on multi-hop and comparative questions (multi-hop margin over Dense Retrieval significant, p = 0.044).</w:t>
       </w:r>
     </w:p>
     <w:tbl>
@@ -5397,6 +4876,7 @@
               <w:pStyle w:val="TableCell"/>
             </w:pPr>
             <w:r>
+              <w:lastRenderedPageBreak/>
               <w:t>Comparative (8)</w:t>
             </w:r>
           </w:p>
@@ -5450,10 +4930,15 @@
         <w:pStyle w:val="PostHeadPara"/>
       </w:pPr>
       <w:r>
-        <w:t xml:space="preserve">Our results draw a sharp line between two kinds of benefit that hierarchical retrieval is often assumed to deliver together. The first-page-level provenance and a compact, structurally coherent context-is real and survives fair evaluation: TreeRAG-Beam cites the right sections most accurately (Table 8) and reaches the highest judged quality on an order of </w:t>
-      </w:r>
-      <w:r>
-        <w:t>magnitude fewer context tokens (Table 7). These follow directly from the representation: each node carries a page range, and selecting a relevant subtree yields a small, on-topic context rather than a scattering of chunks. The second supposed benefit-higher lexical overlap with reference answers-does not survive: once every system generates fluent text with the same LLM, the section boundary confers no advantage in n-gram overlap, and a hybrid flat retriever (FlatRAG) actually scores higher on ROUGE-L. In short, structure buys verifiability and efficiency, not surface-string similarity, and earlier hierarchical-RAG results that claimed large ROUGE-L gains likely measured an evaluation artifact rather than a retrieval improvement.</w:t>
+        <w:t>Our results draw a sharp line between two kinds of benefit that hierarchical retrieval is often assumed to deliver together. The first-page-level provenance and a compact, structurally coherent context-is real and survives fair evaluation: TreeRAG-Beam cites the right sections most accurately (Table 7) and reaches the highest judged quality on an order of magnitude fewer context tokens (Table 6). These follow directly from the representation: each node carries a page range, and selecting a relevant subtree yields a small, on-topic context rather than a scattering of chunks. The second supposed benefit-higher lexical overlap with reference answers-does not survive: once every system generates fluent text with the same LLM, the section boundary confers no advantage in n-gram overlap, and a hybrid flat retriever (FlatRAG) actually scores higher on ROUGE-L. In short, structure buys verifiability and efficiency, not surface-string similarity, and earlier hierarchical-RAG results that claimed large ROUGE-L gains likely measured an evaluation artifact rather than a retrieval improvement.</w:t>
+      </w:r>
+    </w:p>
+    <w:p>
+      <w:pPr>
+        <w:pStyle w:val="Head2"/>
+      </w:pPr>
+      <w:r>
+        <w:t>DFS versus Beam Search</w:t>
       </w:r>
     </w:p>
     <w:p>
@@ -5461,7 +4946,7 @@
         <w:pStyle w:val="PostHeadPara"/>
       </w:pPr>
       <w:r>
-        <w:t>The expanded multi-hop evaluation (Section 5.6) is a clean test of this distinction. On the 100-question HotpotQA set the lexical and semantic verdicts point in opposite directions: the flat baselines lead on ROUGE-L while our DFS variant attains the highest LLM-Judge score, significantly above BM25 and RAPTOR. Because HotpotQA references are terse factoids, longest-common-subsequence recall rewards whichever system reproduces the reference surface form rather than whichever answer is most adequate; the judge, which scores adequacy, recovers the structure-aware advantage. This is the same mechanism described above, now observed on an independent multi-hop benchmark, and it is why we frame the multi-hop contribution around judged quality rather than ROUGE-L.</w:t>
+        <w:t>Under the fair protocol, Beam Search is the better default. It attains the highest LLM-Judge overall (0.827), the best citation F1 (0.757), and the only statistically significant per-type advantage we observe (multi-hop over Dense Retrieval, p = 0.044). DFS is more token-frugal still (9 vs. 14 tokens) but scores lower on quality and is roughly twice as slow because it expands more nodes through the LLM scorer. We therefore recommend Beam as the production default and reserve DFS for extreme context-budget constraints. A query-complexity classifier that routes between the two remains attractive future work.</w:t>
       </w:r>
     </w:p>
     <w:p>
@@ -5469,7 +4954,7 @@
         <w:pStyle w:val="Head2"/>
       </w:pPr>
       <w:r>
-        <w:t>DFS versus Beam Search</w:t>
+        <w:t>Threats to Validity</w:t>
       </w:r>
     </w:p>
     <w:p>
@@ -5477,7 +4962,7 @@
         <w:pStyle w:val="PostHeadPara"/>
       </w:pPr>
       <w:r>
-        <w:t>Under the fair protocol, Beam Search is the better default. It attains the highest LLM-Judge overall (0.827), the best citation F1 (0.757), and the only statistically significant per-type advantage we observe (multi-hop over Dense Retrieval, p = 0.044). DFS is more token-frugal still (9 vs. 14 tokens) but scores lower on quality and is roughly twice as slow because it expands more nodes through the LLM scorer. We therefore recommend Beam as the production default and reserve DFS for extreme context-budget constraints. A query-complexity classifier that routes between the two remains attractive future work.</w:t>
+        <w:t>Several caveats bound our conclusions. Sample size: the fair-protocol experiments use a 40-question sample of the Full Benchmark and a 100-question HotpotQA subset (expanded from the original 20), which limits statistical power; most pairwise differences are not significant at this scale, and the per-type cells (n = 8-21) are smaller still. Single generator and judge: all generative results use one local model (Llama 3.1 8B) for both answer generation and LLM-as-Judge, so judge scores could carry model-specific preferences; because every answer under comparison is produced by that same model, this is not a per-system self-preference, but corroborating the judgement with an independent model remains important. Citation metric: Citation F1 is computed against gold supporting sections and rewards systems that emit section/page identifiers; it measures provenance fidelity, not answer correctness. Generator scale: an 8B local model is weaker than hosted frontier models, and absolute scores would likely rise with a stronger generator, though we have no evidence the relative ordering would change. Larger-sample, multi-model replication is the primary item of future work.</w:t>
       </w:r>
     </w:p>
     <w:p>
@@ -5485,7 +4970,7 @@
         <w:pStyle w:val="Head2"/>
       </w:pPr>
       <w:r>
-        <w:t>Threats to Validity</w:t>
+        <w:t>Limitations</w:t>
       </w:r>
     </w:p>
     <w:p>
@@ -5493,7 +4978,11 @@
         <w:pStyle w:val="PostHeadPara"/>
       </w:pPr>
       <w:r>
-        <w:t>Several caveats bound our conclusions. Sample size: the fair-protocol experiments use a 40-question sample of the Full Benchmark and a 100-question HotpotQA subset (expanded from the original 20), which limits statistical power; most pairwise differences are not significant at this scale, and the per-type cells (n = 8-21) are smaller still. We partially address the multi-hop concern by expanding the HotpotQA evaluation to 100 questions (Section 5.6); extending the same expansion to the general fair-protocol sample is future work. Single generator and judge: all generative results use one local model (Llama 3.1 8B) for both answer generation and LLM-as-Judge, so judge scores could carry model-specific preferences; because every answer under comparison is produced by that same model, this is not a per-system self-preference, but corroborating these judgements with an independent, stronger judge—for example a hosted frontier model used only for evaluation—is the most important robustness check we plan, and we expect absolute scores, but not the relative ordering, to shift under such a judge. Citation metric: Citation F1 is computed against gold supporting sections and rewards systems that emit section/page identifiers; it measures provenance fidelity, not answer correctness. Generator scale: an 8B local model is weaker than hosted frontier models, and absolute scores would likely rise with a stronger generator, though we have no evidence the relative ordering would change. Larger-sample, multi-model replication is the primary item of future work.</w:t>
+        <w:t xml:space="preserve">Beyond the evaluation caveats of Section 6.3, the system has three engineering limitations. LLM dependency: indexing requires an LLM call per document, and traversal issues several LLM calls for node scoring, which is the source of TreeRAG's higher query latency. Structural prompt brittleness: documents with inconsistent heading styles (for example scanned PDFs with OCR artifacts) may yield malformed index trees requiring manual correction. Learned scoring: we attempted learned node scoring via DSPy [15] with an open 70B model; optimization yielded no improvement (0.0% gain), </w:t>
+      </w:r>
+      <w:r>
+        <w:lastRenderedPageBreak/>
+        <w:t>likely due to insufficient training signal (fewer than 100 labeled examples), and we exclude this component from the main system.</w:t>
       </w:r>
     </w:p>
     <w:p>
@@ -5501,7 +4990,7 @@
         <w:pStyle w:val="Head2"/>
       </w:pPr>
       <w:r>
-        <w:t>Limitations</w:t>
+        <w:t>Broader Impact</w:t>
       </w:r>
     </w:p>
     <w:p>
@@ -5509,27 +4998,7 @@
         <w:pStyle w:val="PostHeadPara"/>
       </w:pPr>
       <w:r>
-        <w:t>Beyond the evaluation caveats of Section 6.3, the system has three engineering limitations. LLM dependency: indexing requires an LLM call per document, and traversal issues several LLM calls for node scoring, which is the source of TreeRAG's higher query latency. Structural prompt brittleness: documents with inconsistent heading styles (for example scanned PDFs with OCR artifacts) may yield malformed index trees requiring manual correction. Learned scoring: we attempted learned node scoring via DSPy [15] with an open 70B model; optimization yielded no improvement (0.0% gain), likely due to insufficient training signal (fewer than 100 labeled examples), and we exclude this component from the main system.</w:t>
-      </w:r>
-    </w:p>
-    <w:p>
-      <w:pPr>
-        <w:pStyle w:val="Head2"/>
-      </w:pPr>
-      <w:r>
-        <w:t>Broader Impact</w:t>
-      </w:r>
-    </w:p>
-    <w:p>
-      <w:pPr>
-        <w:pStyle w:val="PostHeadPara"/>
-      </w:pPr>
-      <w:r>
-        <w:t xml:space="preserve">Because TreeRAG preserves page-level provenance, it is well suited to high-stakes domains-medicine, law, and regulatory compliance-where unsupported claims carry real cost and every assertion must be traceable to a source span. The same property aids auditing and post-hoc verification. Conversely, the system inherits the biases of its underlying LLM during </w:t>
-      </w:r>
-      <w:r>
-        <w:lastRenderedPageBreak/>
-        <w:t>indexing and generation, and the lightweight hallucination detector reduces but does not eliminate unfaithful output; deployments in sensitive settings should retain a human-in-the-loop for final decisions.</w:t>
+        <w:t>Because TreeRAG preserves page-level provenance, it is well suited to high-stakes domains-medicine, law, and regulatory compliance-where unsupported claims carry real cost and every assertion must be traceable to a source span. The same property aids auditing and post-hoc verification. Conversely, the system inherits the biases of its underlying LLM during indexing and generation, and the lightweight hallucination detector reduces but does not eliminate unfaithful output; deployments in sensitive settings should retain a human-in-the-loop for final decisions.</w:t>
       </w:r>
     </w:p>
     <w:p>
@@ -5641,6 +5110,7 @@
         </w:numPr>
       </w:pPr>
       <w:r>
+        <w:lastRenderedPageBreak/>
         <w:t>[6] Thibault Formal, Stephane Clinchant, Herve Dejean, and Carlos Lassance. 2024. SPLATE: Sparse Late Interaction Retrieval. In Proc. SIGIR 2024. arXiv:2404.13950.</w:t>
       </w:r>
     </w:p>
@@ -5689,11 +5159,7 @@
         </w:numPr>
       </w:pPr>
       <w:r>
-        <w:t xml:space="preserve">[10] Haoyu Huang, Yongfeng Huang, Junjie Yang, Zhenyu Pan, Yongqiang Chen, Kaili Ma, Hongzhi Chen, and James Cheng. 2025. Retrieval-Augmented </w:t>
-      </w:r>
-      <w:r>
-        <w:lastRenderedPageBreak/>
-        <w:t>Generation with Hierarchical Knowledge. arXiv:2503.10150.</w:t>
+        <w:t>[10] Haoyu Huang, Yongfeng Huang, Junjie Yang, Zhenyu Pan, Yongqiang Chen, Kaili Ma, Hongzhi Chen, and James Cheng. 2025. Retrieval-Augmented Generation with Hierarchical Knowledge. arXiv:2503.10150.</w:t>
       </w:r>
     </w:p>
     <w:p>
@@ -5993,7 +5459,11 @@
         </w:numPr>
       </w:pPr>
       <w:r>
-        <w:t>[35] Zhilin Yang, Peng Qi, Saizheng Zhang, Yoshua Bengio, William Cohen, Ruslan Salakhutdinov, and Christopher D. Manning. 2018. HotpotQA: A Dataset for Diverse, Explainable Multi-hop Question Answering. In Proc. EMNLP 2018, 2369-2380. arXiv:1809.09600.</w:t>
+        <w:t xml:space="preserve">[35] Zhilin Yang, Peng Qi, Saizheng Zhang, Yoshua Bengio, William Cohen, Ruslan Salakhutdinov, and Christopher D. Manning. 2018. HotpotQA: A </w:t>
+      </w:r>
+      <w:r>
+        <w:lastRenderedPageBreak/>
+        <w:t>Dataset for Diverse, Explainable Multi-hop Question Answering. In Proc. EMNLP 2018, 2369-2380. arXiv:1809.09600.</w:t>
       </w:r>
     </w:p>
     <w:p>

</xml_diff>

<commit_message>
Add script to regenerate medical figure and update DOCX
- Introduced `fix_medical_figure.py` to generate the medical-domain figure with PageTree-RAG labels.
- The script reads from `medical_results.json` to ensure the figure matches Table 4 in the paper.
- Outputs the figure as both PNG and PDF formats.
- Replaces the existing image in `TreeRAG_TIST_ACM.docx` while preserving width and adjusting height.
- Ensures idempotency and self-containment, requiring `matplotlib` and `python-docx`.
</commit_message>
<xml_diff>
--- a/TreeRAG_TIST_ACM.docx
+++ b/TreeRAG_TIST_ACM.docx
@@ -39,7 +39,7 @@
         <w:pStyle w:val="Abstract"/>
       </w:pPr>
       <w:r>
-        <w:t>Retrieval-Augmented Generation (RAG) has emerged as a dominant paradigm for grounding large language model (LLM) outputs in external documents. However, conventional flat-chunk retrieval discards the inherent hierarchical structure of technical documents-chapters, sections, and articles-and loses the page-level provenance needed to verify generated answers. We present PageTree-RAG, a hierarchical document intelligence system that (1) converts raw PDFs into page-aware JSON trees using zero-shot LLM prompting, (2) traverses these trees with two complementary algorithms-Depth-First Search (DFS) and Beam Search-to retrieve only structurally relevant nodes, (3) applies contextual compression to reduce token overhead, and (4) validates generated answers with a five-signal hallucination detector. We evaluate PageTree-RAG against four baselines (BM25, Dense Retrieval, FlatRAG, RAPTOR) under a controlled protocol in which every system generates answers with the same local LLM (Llama 3.1 8B), so that only the retrieval stage differs. Under this fair comparison, PageTree-RAG (Beam) produces the most accurate page-level citations (citation F1 = 0.757 vs. 0.000 for the abstractive RAPTOR baseline), the highest LLM-judged answer quality on multi-hop and comparative questions (0.818 and 0.850; multi-hop advantage over Dense Retrieval significant at p = 0.044), and competitive overall quality (highest LLM-Judge, 0.823) while feeding an order of magnitude fewer context tokens to the generator (16 vs. 111-222). Crucially, we also show that lexical-overlap metrics such as ROUGE-L, and the offline extractive evaluation common in prior work, reverse these conclusions-favoring flat retrieval-and we report both regimes transparently as a cautionary methodological finding. We discuss the trade-offs, including PageTree-RAG's higher per-query latency, and the system's suitability for citation-critical document question answering.</w:t>
+        <w:t>Retrieval-Augmented Generation (RAG) has emerged as a dominant paradigm for grounding large language model (LLM) outputs in external documents. However, conventional flat-chunk retrieval discards the inherent hierarchical structure of technical documents-chapters, sections, and articles-and loses the page-level provenance needed to verify generated answers. Unlike existing hierarchical RAG systems, which optimize retrieval quality in isolation and are judged largely by lexical-overlap metrics, PageTree-RAG jointly optimizes citation faithfulness, token efficiency, and generator-controlled evaluation through an adaptive traversal policy over page-indexed document trees. Concretely, PageTree-RAG (1) converts raw PDFs into page-aware JSON trees using zero-shot LLM prompting, (2) traverses these trees with two complementary algorithms-Depth-First Search (DFS) and Beam Search-to retrieve only structurally relevant nodes, (3) applies contextual compression to reduce token overhead, and (4) validates generated answers with a five-signal hallucination detector. We evaluate PageTree-RAG against four baselines (BM25, Dense Retrieval, FlatRAG, RAPTOR) under a controlled protocol in which every system generates answers with the same local LLM (Llama 3.1 8B), so that only the retrieval stage differs. Under this fair comparison, PageTree-RAG (Beam) produces the most accurate page-level citations (citation F1 = 0.757 vs. 0.000 for the abstractive RAPTOR baseline), the highest LLM-judged answer quality on multi-hop and comparative questions (0.818 and 0.850; multi-hop advantage over Dense Retrieval significant at p = 0.044), and competitive overall quality (highest LLM-Judge, 0.823) while feeding an order of magnitude fewer context tokens to the generator (16 vs. 111-222). Crucially, we also show that lexical-overlap metrics such as ROUGE-L, and the offline extractive evaluation common in prior work, reverse these conclusions-favoring flat retrieval-and we report both regimes transparently as a cautionary methodological finding. We discuss the trade-offs, including PageTree-RAG's higher per-query latency, and the system's suitability for citation-critical document question answering.</w:t>
       </w:r>
     </w:p>
     <w:p>
@@ -139,7 +139,7 @@
         <w:pStyle w:val="Para"/>
       </w:pPr>
       <w:r>
-        <w:t>Prior work has explored hierarchical indexing in several forms. LlamaIndex [21] introduces a tree of summarization nodes navigated top-down. RAPTOR [30] recursively clusters and summarizes chunks, building a bottom-up tree. PageIndex [33] demonstrates vectorless, structure-first retrieval. Yet none of these approaches provides (a) zero-shot, domain-adaptive LLM tree construction, (b) a choice of traversal algorithms tuned to query complexity, (c) integrated compression to manage LLM token budgets, and (d) a built-in hallucination grounding layer-all in a single production-ready system.</w:t>
+        <w:t>Prior work has explored hierarchical indexing in several forms. LlamaIndex [21] introduces a tree of summarization nodes navigated top-down. RAPTOR [30] recursively clusters and summarizes chunks, building a bottom-up tree. PageIndex [33] demonstrates vectorless, structure-first retrieval. Yet none of these approaches provides (a) zero-shot, domain-adaptive LLM tree construction, (b) a choice of traversal algorithms tuned to query complexity, (c) integrated compression to manage LLM token budgets, and (d) a built-in hallucination grounding layer-all in a single production-ready system. Concretely, RAPTOR discards page provenance, LlamaIndex provides no citation mechanism, and GraphRAG does not preserve the document's section hierarchy—so none supports verifiable, citation-faithful retrieval over a document's native structure, precisely what regulated domains such as medicine, law, and scientific reporting demand, where every claim must be traceable to a source page.</w:t>
       </w:r>
     </w:p>
     <w:p>
@@ -147,7 +147,7 @@
         <w:pStyle w:val="Para"/>
       </w:pPr>
       <w:r>
-        <w:t>We introduce PageTree-RAG. Unlike prior hierarchical RAG systems, which optimize retrieval quality in isolation and are judged largely by lexical-overlap metrics, PageTree-RAG jointly targets three properties that matter for deployment in citation-critical domains—page-level citation faithfulness, an order-of-magnitude reduction in the context handed to the generator, and a generator-controlled evaluation that isolates the retriever's contribution—over a single page-aware tree built zero-shot from raw PDFs. We do not claim hierarchical retrieval per se as novel—it builds on RAPTOR [30] and PageIndex [33]—but rather this specific combination of a vectorless page-referenced tree, query-time traversal selection, integrated compression, and citation-faithful, generator-controlled evaluation, which together prioritize verifiability and token efficiency over lexical-overlap scores. Our contributions are as follows.</w:t>
+        <w:t>We introduce PageTree-RAG. Unlike prior hierarchical RAG systems, which optimize retrieval quality in isolation and are judged largely by lexical-overlap metrics, PageTree-RAG jointly targets three properties that matter for deployment in citation-critical domains—page-level citation faithfulness, an order-of-magnitude reduction in the context handed to the generator, and a generator-controlled evaluation that isolates the retriever's contribution—over a single page-aware tree built zero-shot from raw PDFs. We do not claim hierarchical retrieval per se as novel—it builds on RAPTOR [30] and PageIndex [33]—but rather this specific combination of a vectorless page-referenced tree, query-time traversal selection, integrated compression, and citation-faithful, generator-controlled evaluation, which together prioritize verifiability and token efficiency over lexical-overlap scores. Algorithmically, the core mechanism is the adaptive traversal policy—a single query-conditioned function that scores tree nodes and selects the traversal strategy per query—so that retrieval effort scales with query complexity rather than being fixed in advance as in prior hierarchical RAG. Our contributions are as follows.</w:t>
       </w:r>
     </w:p>
     <w:p>
@@ -155,7 +155,7 @@
         <w:pStyle w:val="a"/>
       </w:pPr>
       <w:r>
-        <w:t>(1) LLM-Driven Tree Indexing. A zero-shot prompting strategy that converts arbitrary PDFs into page-referenced JSON trees, with domain-adaptive templates for medical, legal, financial, and academic documents.</w:t>
+        <w:t>(1) Hierarchical page-aware retrieval with an adaptive traversal policy. We convert arbitrary PDFs into page-referenced JSON trees via zero-shot, domain-adaptive LLM prompting, and retrieve with an adaptive traversal policy: a query-conditioned relevance function scores candidate nodes, and the traversal algorithm—depth-first or beam—is selected per query so exploration adapts to query complexity.</w:t>
       </w:r>
     </w:p>
     <w:p>
@@ -163,7 +163,8 @@
         <w:pStyle w:val="a"/>
       </w:pPr>
       <w:r>
-        <w:t>(2) Adaptive Dual Traversal. Two tree-traversal algorithms-DFS for depth-first exhaustive search and Beam Search for efficiency-selectable per query, with a probabilistic node-relevance scoring function.</w:t>
+        <w:lastRenderedPageBreak/>
+        <w:t>(2) Citation-faithful, token-efficient generation. Contextual compression shrinks the retrieved context by an order of magnitude; every answer carries page-level citations traceable to a source span; and a lightweight five-signal detector flags unsupported sentences at negligible cost.</w:t>
       </w:r>
     </w:p>
     <w:p>
@@ -171,43 +172,67 @@
         <w:pStyle w:val="a"/>
       </w:pPr>
       <w:r>
-        <w:t>(3) Contextual Compression. A TF-IDF and semantic relevance filter that removes low-relevance nodes post-traversal, shrinking the context handed to the generator by an order of magnitude.</w:t>
-      </w:r>
-    </w:p>
-    <w:p>
-      <w:pPr>
-        <w:pStyle w:val="a"/>
-      </w:pPr>
-      <w:r>
-        <w:t>(4) Multi-Signal Hallucination Detection. A five-signal confidence estimator (citation presence, word overlap, bigram overlap, trigram overlap, character similarity) that scores each sentence of the generated answer against retrieved nodes.</w:t>
-      </w:r>
-    </w:p>
-    <w:p>
-      <w:pPr>
-        <w:pStyle w:val="a"/>
-      </w:pPr>
-      <w:r>
-        <w:t xml:space="preserve">(5) Fair Evaluation and a Cautionary Methodological Finding. We evaluate all systems under a protocol in which only the retrieval stage varies while every system generates with the same local LLM, measuring axes that flat </w:t>
+        <w:t>(3) A fair evaluation framework and a cautionary finding. We evaluate all systems under a generator-controlled protocol in which only the retriever varies, measuring citation accuracy and context efficiency alongside reference- and judge-based answer quality, and we show that offline extractive evaluation and lexical-overlap metrics reverse the system ranking—reporting both regimes so the discrepancy is explicit.</w:t>
+      </w:r>
+    </w:p>
+    <w:p>
+      <w:pPr>
+        <w:pStyle w:val="Para"/>
+      </w:pPr>
+      <w:r>
+        <w:t>Therefore, PageTree-RAG turns a document's native structure into verifiable, token-efficient answers, and offers a methodology for evaluating such systems without the artifacts of lexical-overlap metrics. The remainder of this paper is organized as follows. Section 2 reviews related work. Section 3 details the PageTree-RAG methodology. Section 4 describes the system architecture. Section 5 presents experiments and results. Section 6 discusses findings and limitations. Section 7 concludes.</w:t>
+      </w:r>
+    </w:p>
+    <w:p>
+      <w:pPr>
+        <w:pStyle w:val="Head1"/>
+      </w:pPr>
+      <w:r>
+        <w:t>RELATED WORK</w:t>
+      </w:r>
+    </w:p>
+    <w:p>
+      <w:pPr>
+        <w:pStyle w:val="Head2"/>
+      </w:pPr>
+      <w:r>
+        <w:t>Retrieval-Augmented Generation</w:t>
+      </w:r>
+    </w:p>
+    <w:p>
+      <w:pPr>
+        <w:pStyle w:val="PostHeadPara"/>
+      </w:pPr>
+      <w:r>
+        <w:t>RAG was formally introduced by Lewis et al. [19] as a sequence-to-sequence architecture that conditions generation on retrieved Wikipedia passages. Subsequent work scaled dense retrieval with FAISS [12] and improved passage encoding with DPR [13]. Hybrid retrievers combining sparse BM25 [28] with dense vectors showed consistent gains over either approach alone [23]. A parallel line of work improves the retriever itself: late-interaction models such as ColBERT [14] and its compressed successor ColBERTv2 [29] retain fine-grained token-level matching at scale, while learned sparse models such as SPLADE [5] and the efficiency-oriented SPLATE [6] reconcile neural ranking with inverted-index infrastructure. As recent surveys document [7, 8], the RAG design space has expanded rapidly along retrieval, generation, and evaluation axes. Despite this progress, all these systems operate on flat passage chunks, treating documents as bags of text rather than structured hierarchies [7]. PageTree-RAG is orthogonal to these retriever advances: its node-relevance score can in principle wrap any of them, but our focus is the document structure that flat retrievers discard.</w:t>
+      </w:r>
+    </w:p>
+    <w:p>
+      <w:pPr>
+        <w:pStyle w:val="Head2"/>
+      </w:pPr>
+      <w:r>
+        <w:t>Hierarchical and Structure-Aware Retrieval</w:t>
+      </w:r>
+    </w:p>
+    <w:p>
+      <w:pPr>
+        <w:pStyle w:val="PostHeadPara"/>
+      </w:pPr>
+      <w:r>
+        <w:t>LlamaIndex [21] constructs a tree of progressively coarser summaries and navigates it top-down, retrieving leaf nodes for generation; its retrieval is embedding-based, requiring a vector store. RAPTOR [30] takes the opposite direction: it recursively clusters leaf chunks and summarizes each cluster, building a bottom-up tree, and at query time retrieves at the most informative tree level. Unlike PageTree-RAG, RAPTOR's tree reflects embedding-cluster geography rather than the document's own section hierarchy, and it lacks traversal-algorithm selection or compression. This distinction matters in domains where the authored section structure is itself the semantics of the document, such as regulations and clinical protocols.</w:t>
+      </w:r>
+    </w:p>
+    <w:p>
+      <w:pPr>
+        <w:pStyle w:val="Para"/>
+      </w:pPr>
+      <w:r>
+        <w:t xml:space="preserve">HiRAG [10] explores graph-based hierarchies but requires pre-built knowledge graphs and domain-specific schema engineering. Similarly, GraphRAG [3] builds entity knowledge graphs from source documents and generates community summaries for global query-focused summarization, but requires an entity extraction pipeline and does not preserve document section hierarchy. PageTree-RAG requires only a raw PDF and an LLM API key. Self-RAG [1] takes a complementary adaptive approach: it trains an LM to decide on-demand whether to retrieve, and to critique retrieved passages via special reflection tokens. PageTree-RAG instead uses a fixed two-stage pipeline with query-time algorithm </w:t>
       </w:r>
       <w:r>
         <w:lastRenderedPageBreak/>
-        <w:t>retrievers cannot satisfy by construction—page-level citation accuracy and context efficiency—alongside reference- and judge-based answer quality. We further show that offline extractive evaluation and lexical-overlap metrics (ROUGE-L) reverse the system ranking—flattering whichever system most resembles the reference surface form—and we report both the extractive and the fair generative regimes so that the discrepancy is explicit rather than hidden.</w:t>
-      </w:r>
-    </w:p>
-    <w:p>
-      <w:pPr>
-        <w:pStyle w:val="Para"/>
-      </w:pPr>
-      <w:r>
-        <w:t>The remainder of this paper is organized as follows. Section 2 reviews related work. Section 3 details the PageTree-RAG methodology. Section 4 describes the system architecture. Section 5 presents experiments and results. Section 6 discusses findings and limitations. Section 7 concludes.</w:t>
-      </w:r>
-    </w:p>
-    <w:p>
-      <w:pPr>
-        <w:pStyle w:val="Head1"/>
-      </w:pPr>
-      <w:r>
-        <w:t>RELATED WORK</w:t>
+        <w:t>selection (DFS vs. Beam Search) without requiring fine-tuning, which lowers the barrier to deployment on new document collections. A recently proposed, identically named system, TreeRAG [39], likewise organizes long documents as a tree, but differs from ours in construction, traversal, and objective: it builds the tree by embedding text chunks (“Tree-Chunking”) and retrieves with a fixed bidirectional (root-to-leaf and leaf-to-root) traversal for query-focused summarization, whereas PageTree-RAG parses the document’s native section hierarchy into a page-referenced tree via zero-shot LLM prompting, selects between DFS and Beam traversal per query, and targets page-level citation faithfulness under a generator-controlled evaluation. Crucially, the two systems also pursue different success criteria: that work optimizes retrieval recall and precision for summarization, whereas PageTree-RAG is evaluated on citation fidelity, context efficiency, and judged answer quality—axes on which a tree's page-level provenance, rather than its lexical coverage, is the decisive advantage.</w:t>
       </w:r>
     </w:p>
     <w:p>
@@ -215,7 +240,7 @@
         <w:pStyle w:val="Head2"/>
       </w:pPr>
       <w:r>
-        <w:t>Retrieval-Augmented Generation</w:t>
+        <w:t>Multi-Hop and Cross-Document Reasoning</w:t>
       </w:r>
     </w:p>
     <w:p>
@@ -223,7 +248,7 @@
         <w:pStyle w:val="PostHeadPara"/>
       </w:pPr>
       <w:r>
-        <w:t>RAG was formally introduced by Lewis et al. [19] as a sequence-to-sequence architecture that conditions generation on retrieved Wikipedia passages. Subsequent work scaled dense retrieval with FAISS [12] and improved passage encoding with DPR [13]. Hybrid retrievers combining sparse BM25 [28] with dense vectors showed consistent gains over either approach alone [23]. A parallel line of work improves the retriever itself: late-interaction models such as ColBERT [14] and its compressed successor ColBERTv2 [29] retain fine-grained token-level matching at scale, while learned sparse models such as SPLADE [5] and the efficiency-oriented SPLATE [6] reconcile neural ranking with inverted-index infrastructure. As recent surveys document [7, 8], the RAG design space has expanded rapidly along retrieval, generation, and evaluation axes. Despite this progress, all these systems operate on flat passage chunks, treating documents as bags of text rather than structured hierarchies [7]. PageTree-RAG is orthogonal to these retriever advances: its node-relevance score can in principle wrap any of them, but our focus is the document structure that flat retrievers discard.</w:t>
+        <w:t>Multi-hop reasoning-answering questions that require evidence synthesis across multiple passages or documents-remains a challenge for flat RAG. HotpotQA [35] benchmarks this capability. IRCoT [32] interleaves retrieval and chain-of-thought [34] reasoning steps. More recently, Zhang et al. [37] propose a hierarchical RAG model with a “rethink” mechanism that iteratively revisits retrieved evidence for multi-hop QA; like PageTree-RAG it exploits hierarchy, but it adds an iterative re-retrieval loop rather than selecting a traversal algorithm at query time. PageTree-RAG's hierarchical structure naturally supports multi-hop queries: the tree encodes which sections are siblings (sharing a parent), enabling the traversal algorithm to follow cross-sectional reasoning paths without additional orchestration.</w:t>
       </w:r>
     </w:p>
     <w:p>
@@ -231,107 +256,77 @@
         <w:pStyle w:val="Head2"/>
       </w:pPr>
       <w:r>
-        <w:t>Hierarchical and Structure-Aware Retrieval</w:t>
+        <w:t>Hallucination in RAG Systems</w:t>
       </w:r>
     </w:p>
     <w:p>
       <w:pPr>
         <w:pStyle w:val="PostHeadPara"/>
-      </w:pPr>
-      <w:r>
-        <w:t>LlamaIndex [21] constructs a tree of progressively coarser summaries and navigates it top-down, retrieving leaf nodes for generation; its retrieval is embedding-based, requiring a vector store. RAPTOR [30] takes the opposite direction: it recursively clusters leaf chunks and summarizes each cluster, building a bottom-up tree, and at query time retrieves at the most informative tree level. Unlike PageTree-RAG, RAPTOR's tree reflects embedding-cluster geography rather than the document's own section hierarchy, and it lacks traversal-algorithm selection or compression. This distinction matters in domains where the authored section structure is itself the semantics of the document, such as regulations and clinical protocols.</w:t>
-      </w:r>
-    </w:p>
-    <w:p>
-      <w:pPr>
-        <w:pStyle w:val="Para"/>
-      </w:pPr>
-      <w:r>
-        <w:t xml:space="preserve">HiRAG [10] explores graph-based hierarchies but requires pre-built knowledge graphs and domain-specific schema engineering. Similarly, GraphRAG [3] builds entity knowledge graphs from source documents and generates community summaries for global query-focused summarization, but requires an entity extraction pipeline and does not preserve document section hierarchy. PageTree-RAG requires only a raw PDF and an LLM API key. Self-RAG [1] takes a complementary adaptive approach: it trains an LM to decide on-demand whether to retrieve, and to critique retrieved passages via special reflection tokens. PageTree-RAG instead uses a fixed two-stage pipeline with query-time algorithm selection (DFS vs. Beam Search) without requiring fine-tuning, which lowers the barrier to deployment on new document collections. A recently proposed, identically named system, TreeRAG [39], likewise organizes long documents as a tree, but differs from ours in construction, traversal, and objective: it builds the tree by embedding text chunks (“Tree-Chunking”) and retrieves with a fixed bidirectional (root-to-leaf and leaf-to-root) traversal for query-focused summarization, whereas PageTree-RAG parses the document’s native section hierarchy into a page-referenced tree via </w:t>
-      </w:r>
-      <w:r>
-        <w:lastRenderedPageBreak/>
-        <w:t>zero-shot LLM prompting, selects between DFS and Beam traversal per query, and targets page-level citation faithfulness under a generator-controlled evaluation. Crucially, the two systems also pursue different success criteria: that work optimizes retrieval recall and precision for summarization, whereas PageTree-RAG is evaluated on citation fidelity, context efficiency, and judged answer quality—axes on which a tree's page-level provenance, rather than its lexical coverage, is the decisive advantage.</w:t>
-      </w:r>
-    </w:p>
-    <w:p>
-      <w:pPr>
-        <w:pStyle w:val="Head2"/>
-      </w:pPr>
-      <w:r>
-        <w:t>Multi-Hop and Cross-Document Reasoning</w:t>
+        <w:rPr>
+          <w:lang w:eastAsia="ko-KR"/>
+        </w:rPr>
+      </w:pPr>
+      <w:r>
+        <w:t xml:space="preserve">RAG substantially reduces hallucination by grounding generation in retrieved text, but does not eliminate it [31]. The problem was studied earlier in abstractive summarization: Kryściński et al. [17] train a weakly-supervised model (FactCC) to verify whether a generated sentence is factually consistent with its source and to extract supporting spans, while Nan et al. [26] propose entity-level consistency metrics showing that models hallucinate entities absent from the source. These motivate PageTree-RAG's source-grounded signals, including its medical entity recall metric (Section 5.3). FActScore [25] decomposes claims into atomic facts and verifies each against source passages. RAGAS [4] defines faithfulness, answer relevance, and context recall as automatic metrics. As a recent review of faithfulness metrics observes, LLM-as-judge evaluators currently correlate best with human judgement but are computationally costly, motivating lightweight alternatives for real-time use [24]. PageTree-RAG's hallucination detector operates at sentence level using five lightweight overlap signals, providing a fast, LLM-free confidence estimate compatible with real-time serving. Table 1 summarizes how these capabilities compare across representative hierarchical and structure-aware RAG systems, including </w:t>
+      </w:r>
+      <w:proofErr w:type="spellStart"/>
+      <w:r>
+        <w:t>PageTree</w:t>
+      </w:r>
+      <w:proofErr w:type="spellEnd"/>
+      <w:r>
+        <w:t>-RAG.</w:t>
+      </w:r>
+      <w:r>
+        <w:br/>
       </w:r>
     </w:p>
     <w:p>
       <w:pPr>
         <w:pStyle w:val="PostHeadPara"/>
-      </w:pPr>
-      <w:r>
-        <w:t>Multi-hop reasoning-answering questions that require evidence synthesis across multiple passages or documents-remains a challenge for flat RAG. HotpotQA [35] benchmarks this capability. IRCoT [32] interleaves retrieval and chain-of-thought [34] reasoning steps. More recently, Zhang et al. [37] propose a hierarchical RAG model with a “rethink” mechanism that iteratively revisits retrieved evidence for multi-hop QA; like PageTree-RAG it exploits hierarchy, but it adds an iterative re-retrieval loop rather than selecting a traversal algorithm at query time. PageTree-RAG's hierarchical structure naturally supports multi-hop queries: the tree encodes which sections are siblings (sharing a parent), enabling the traversal algorithm to follow cross-sectional reasoning paths without additional orchestration.</w:t>
-      </w:r>
-    </w:p>
-    <w:p>
-      <w:pPr>
-        <w:pStyle w:val="Head2"/>
-      </w:pPr>
-      <w:r>
-        <w:t>Hallucination in RAG Systems</w:t>
+        <w:rPr>
+          <w:lang w:eastAsia="ko-KR"/>
+        </w:rPr>
+      </w:pPr>
+      <w:r>
+        <w:rPr>
+          <w:lang w:eastAsia="ko-KR"/>
+        </w:rPr>
+        <w:br/>
       </w:r>
     </w:p>
     <w:p>
       <w:pPr>
         <w:pStyle w:val="PostHeadPara"/>
-      </w:pPr>
-      <w:r>
-        <w:t xml:space="preserve">RAG substantially reduces hallucination by grounding generation in retrieved text, but does not eliminate it [31]. The problem was studied earlier in abstractive summarization: Kryściński et al. [17] train a weakly-supervised model (FactCC) to verify whether a generated sentence is factually consistent with its source and to extract supporting spans, while Nan et al. [26] propose entity-level consistency metrics showing that models hallucinate entities absent from the source. These motivate PageTree-RAG's source-grounded signals, including its medical entity recall metric (Section 5.3). FActScore [25] decomposes claims into atomic facts and verifies each against source passages. RAGAS [4] defines faithfulness, answer relevance, and context recall as automatic metrics. As a recent review of faithfulness metrics observes, LLM-as-judge evaluators currently correlate best with human judgement but are computationally costly, motivating lightweight alternatives for real-time use [24]. PageTree-RAG's hallucination detector operates at sentence level using five lightweight overlap signals, providing a fast, LLM-free confidence estimate compatible with real-time serving. Table 1 summarizes how these capabilities compare across representative hierarchical and structure-aware RAG systems, including </w:t>
-      </w:r>
-      <w:proofErr w:type="spellStart"/>
-      <w:r>
-        <w:t>PageTree</w:t>
-      </w:r>
-      <w:proofErr w:type="spellEnd"/>
-      <w:r>
-        <w:t>-RAG.</w:t>
-      </w:r>
-      <w:r>
-        <w:br/>
-      </w:r>
-      <w:r>
-        <w:br/>
-      </w:r>
-      <w:r>
-        <w:br/>
-      </w:r>
-      <w:r>
-        <w:br/>
-      </w:r>
-      <w:r>
-        <w:br/>
-      </w:r>
-      <w:r>
-        <w:br/>
-      </w:r>
-      <w:r>
-        <w:br/>
-      </w:r>
-      <w:r>
-        <w:br/>
-      </w:r>
-      <w:r>
-        <w:br/>
-      </w:r>
-      <w:r>
-        <w:br/>
-      </w:r>
-      <w:r>
-        <w:br/>
-      </w:r>
-      <w:r>
-        <w:br/>
-      </w:r>
-      <w:r>
-        <w:br/>
-      </w:r>
+        <w:rPr>
+          <w:lang w:eastAsia="ko-KR"/>
+        </w:rPr>
+      </w:pPr>
+    </w:p>
+    <w:p>
+      <w:pPr>
+        <w:pStyle w:val="PostHeadPara"/>
+        <w:rPr>
+          <w:lang w:eastAsia="ko-KR"/>
+        </w:rPr>
+      </w:pPr>
+    </w:p>
+    <w:p>
+      <w:pPr>
+        <w:pStyle w:val="PostHeadPara"/>
+        <w:rPr>
+          <w:lang w:eastAsia="ko-KR"/>
+        </w:rPr>
+      </w:pPr>
+    </w:p>
+    <w:p>
+      <w:pPr>
+        <w:pStyle w:val="PostHeadPara"/>
+        <w:rPr>
+          <w:rFonts w:hint="eastAsia"/>
+          <w:lang w:eastAsia="ko-KR"/>
+        </w:rPr>
+      </w:pPr>
     </w:p>
     <w:p>
       <w:pPr>
@@ -988,7 +983,7 @@
             <w:pPr>
               <w:pStyle w:val="TableCell"/>
               <w:rPr>
-                <w:rFonts w:ascii="Segoe UI Symbol" w:hAnsi="Segoe UI Symbol" w:hint="eastAsia"/>
+                <w:rFonts w:ascii="Segoe UI Symbol" w:hAnsi="Segoe UI Symbol"/>
                 <w:color w:val="000000"/>
                 <w:lang w:eastAsia="ko-KR"/>
               </w:rPr>
@@ -1202,7 +1197,7 @@
         <w:pStyle w:val="Head2"/>
       </w:pPr>
       <w:r>
-        <w:t>Adaptive Tree Traversal</w:t>
+        <w:t>Adaptive Traversal Policy</w:t>
       </w:r>
     </w:p>
     <w:p>
@@ -1234,7 +1229,7 @@
         <w:pStyle w:val="PostHeadPara"/>
       </w:pPr>
       <w:r>
-        <w:t>We score each candidate node v against query q using a weighted combination of three components, given in Equation (1).</w:t>
+        <w:t>Rather than a fixed retrieval heuristic, PageTree-RAG frames node selection as an adaptive traversal policy: a query-conditioned relevance function assigns each candidate node a score, and the traversal algorithm (DFS or Beam) is chosen per query so that exploration adapts to query complexity. The policy scores each candidate node v against query q by a weighted combination of three components (Equation 1).</w:t>
       </w:r>
     </w:p>
     <w:p>
@@ -1250,7 +1245,7 @@
         <w:pStyle w:val="Para"/>
       </w:pPr>
       <w:r>
-        <w:t>Here semantic(v, q) is keyword overlap between the query and the node's title and summary, normalized by query length; structural(depth) is a depth-decay factor that slightly penalizes very deep nodes, encoding the prior that high-level sections capture broader relevance; and contextual(v, parent) is semantic overlap between the node and its parent's accumulated context string, encouraging traversal paths that maintain thematic coherence. The weights (λ₁, λ₂, λ₃) = (0.7, 0.2, 0.1) are fixed heuristic defaults, constrained to sum to one and set so that semantic similarity dominates while structural depth and parental coherence break ties; the ablation in Section 5.4 shows judged quality is stable across alternative weightings, and a learned alternative (Section 6, Limitations) yielded no improvement under our limited supervision, so we retain the interpretable fixed weights.</w:t>
+        <w:t>Here semantic(v, q) is keyword overlap between the query and the node's title and summary, normalized by query length; structural(depth) is a depth-decay factor that slightly penalizes very deep nodes, encoding the prior that high-level sections capture broader relevance; and contextual(v, parent) is semantic overlap between the node and its parent's accumulated context string, encouraging traversal paths that maintain thematic coherence. The weights (λ₁, λ₂, λ₃) = (0.7, 0.2, 0.1) are fixed heuristic defaults, constrained to sum to one and set so that semantic similarity dominates while structural depth and parental coherence break ties; the ablation in Section 5.4 shows judged quality is stable across alternative weightings (LLM-Judge varies by less than 0.03 across the four tested settings, indicating the method is insensitive to the exact heuristic defaults; Table 6), and a learned alternative (Section 6, Limitations) yielded no improvement under our limited supervision, so we retain the interpretable fixed weights. We treat these as the policy's default operating point and leave learned or Bayesian-optimized weighting to future work.</w:t>
       </w:r>
     </w:p>
     <w:p>
@@ -1389,6 +1384,7 @@
           <w:rFonts w:hint="eastAsia"/>
           <w:lang w:eastAsia="ko-KR"/>
         </w:rPr>
+        <w:lastRenderedPageBreak/>
         <w:t xml:space="preserve"> </w:t>
       </w:r>
       <w:r>
@@ -1408,7 +1404,6 @@
         <w:pStyle w:val="AlgorithmCaption"/>
       </w:pPr>
       <w:r>
-        <w:lastRenderedPageBreak/>
         <w:t>Algorithm 2: Beam Search traversal (BeamSearchNavigator)</w:t>
       </w:r>
     </w:p>
@@ -1489,7 +1484,7 @@
         <w:pStyle w:val="Para"/>
       </w:pPr>
       <w:r>
-        <w:t>Relevance is scored with a three-component decomposition whose weights (semantic 0.6, keyword 0.2, structural 0.2) place primary mass on the semantic/LLM score and split the remainder evenly between keyword overlap and structural depth; as with the DFS weights these are fixed defaults rather than per-dataset tuned values. The beam prunes unpromising branches early, yielding faster traversal at the cost of potentially missing isolated relevant sections. The number of nodes evaluated is O(W · d · f), where f is the average fan-out; with W = 5, d = 5, f ≈ 5, at most 125 nodes are evaluated versus the DFS worst case of b^d.</w:t>
+        <w:t>Relevance is scored with a three-component decomposition whose weights (semantic 0.6, keyword 0.2, structural 0.2) place primary mass on the semantic/LLM score and split the remainder evenly between keyword overlap and structural depth; as with the DFS weights these are fixed defaults rather than per-dataset tuned values. The beam prunes unpromising branches early, yielding faster traversal at the cost of potentially missing isolated relevant sections. The number of nodes evaluated is O(W · d · f), where f is the average fan-out; with W = 5, d = 5, f ≈ 5, at most 125 nodes are evaluated versus the DFS worst case of b^d. In memory, DFS holds only the current root-to-leaf path and its siblings on an explicit stack (O(d·f)), and Beam retains at most W partial paths of depth d (O(W·d)); both are independent of total corpus size N, unlike flat retrieval, which materializes all N chunk embeddings (O(N)).</w:t>
       </w:r>
     </w:p>
     <w:p>
@@ -1536,6 +1531,7 @@
         <w:pStyle w:val="Head2"/>
       </w:pPr>
       <w:r>
+        <w:lastRenderedPageBreak/>
         <w:t>Cross-Reference Resolution</w:t>
       </w:r>
     </w:p>
@@ -1544,11 +1540,7 @@
         <w:pStyle w:val="PostHeadPara"/>
       </w:pPr>
       <w:r>
-        <w:t xml:space="preserve">Technical documents frequently use internal references (“Section 3.2 conditions”, “Article 5 limitations”). Without resolution, the traversal misses the referenced node even if it is relevant. The reference resolver (1) detects reference patterns (regular expressions over Korean section markers, English “Section/Chapter/Article X”, and numeric citations); (2) fuzzy-matches detected references against all node titles in the index; and (3) injects matched nodes into the traversal </w:t>
-      </w:r>
-      <w:r>
-        <w:lastRenderedPageBreak/>
-        <w:t>result before generation. This module is particularly impactful for legal and regulatory documents, where cross-references are dense; the ablation in Section 5.4 quantifies its precision/coverage trade-off.</w:t>
+        <w:t>Technical documents frequently use internal references (“Section 3.2 conditions”, “Article 5 limitations”). Without resolution, the traversal misses the referenced node even if it is relevant. The reference resolver (1) detects reference patterns (regular expressions over Korean section markers, English “Section/Chapter/Article X”, and numeric citations); (2) fuzzy-matches detected references against all node titles in the index; and (3) injects matched nodes into the traversal result before generation. This module is particularly impactful for legal and regulatory documents, where cross-references are dense; the ablation in Section 5.4 quantifies its precision/coverage trade-off.</w:t>
       </w:r>
     </w:p>
     <w:p>
@@ -1802,6 +1794,7 @@
         <w:rPr>
           <w:noProof/>
         </w:rPr>
+        <w:lastRenderedPageBreak/>
         <w:drawing>
           <wp:inline distT="0" distB="0" distL="0" distR="0" wp14:anchorId="2167BD14" wp14:editId="23CD6E67">
             <wp:extent cx="4846320" cy="2122138"/>
@@ -1868,11 +1861,7 @@
         <w:pStyle w:val="PostHeadPara"/>
       </w:pPr>
       <w:r>
-        <w:t xml:space="preserve">PageTree-RAG is deployed as a two-tier system: a Python FastAPI backend and a Next.js frontend, containerized with Docker Compose. Figure 2 shows the top-level pipeline. The backend comprises API routes (upload, index, chat, tree, </w:t>
-      </w:r>
-      <w:r>
-        <w:lastRenderedPageBreak/>
-        <w:t>graph), core modules (indexer, reasoner, traversal, compressor, reference resolver, hallucination detector), a Redis L1+L2 hybrid cache, and Celery workers for asynchronous indexing tasks.</w:t>
+        <w:t>PageTree-RAG is deployed as a two-tier system: a Python FastAPI backend and a Next.js frontend, containerized with Docker Compose. Figure 2 shows the top-level pipeline. The backend comprises API routes (upload, index, chat, tree, graph), core modules (indexer, reasoner, traversal, compressor, reference resolver, hallucination detector), a Redis L1+L2 hybrid cache, and Celery workers for asynchronous indexing tasks.</w:t>
       </w:r>
     </w:p>
     <w:p>
@@ -1885,7 +1874,7 @@
         </w:rPr>
         <w:drawing>
           <wp:inline distT="0" distB="0" distL="0" distR="0" wp14:anchorId="1B11197F" wp14:editId="7A0BD9D3">
-            <wp:extent cx="4846320" cy="2614581"/>
+            <wp:extent cx="4846320" cy="1368373"/>
             <wp:effectExtent l="0" t="0" r="0" b="0"/>
             <wp:docPr id="2" name="Picture 2"/>
             <wp:cNvGraphicFramePr>
@@ -1907,7 +1896,7 @@
                   <pic:spPr>
                     <a:xfrm>
                       <a:off x="0" y="0"/>
-                      <a:ext cx="4846320" cy="2614581"/>
+                      <a:ext cx="4846320" cy="1368373"/>
                     </a:xfrm>
                     <a:prstGeom prst="rect">
                       <a:avLst/>
@@ -1949,7 +1938,11 @@
         <w:pStyle w:val="Para"/>
       </w:pPr>
       <w:r>
-        <w:t>Stage 2 - Reasoning. A chat request enters the reasoner, which (1) routes the query to one or more indexed documents based on LLM-scored summary relevance; (2) optionally runs the reference resolver to expand the query with resolved section references; (3) dispatches either the DFS or the Beam Search navigator; (4) optionally runs the contextual compressor on the selected nodes; (5) calls the LLM with the compressed context and a domain-specific prompt template; (6) runs the hallucination detector on the response; and (7) returns the answer with page citations, traversal statistics, and a confidence score.</w:t>
+        <w:t xml:space="preserve">Stage 2 - Reasoning. A chat request enters the reasoner, which (1) routes the query to one or more indexed documents based on LLM-scored summary relevance; (2) optionally runs the reference resolver to expand the query with resolved section references; (3) dispatches either the DFS or the Beam Search navigator; (4) optionally runs the contextual </w:t>
+      </w:r>
+      <w:r>
+        <w:lastRenderedPageBreak/>
+        <w:t>compressor on the selected nodes; (5) calls the LLM with the compressed context and a domain-specific prompt template; (6) runs the hallucination detector on the response; and (7) returns the answer with page citations, traversal statistics, and a confidence score.</w:t>
       </w:r>
     </w:p>
     <w:p>
@@ -1981,67 +1974,64 @@
         <w:pStyle w:val="PostHeadPara"/>
       </w:pPr>
       <w:r>
-        <w:t xml:space="preserve">The backend exposes RESTful endpoints for document upload, indexing, chat, tree visualization, and reasoning-graph construction. The frontend provides a multi-document chat interface, an interactive tree explorer, and a PDF viewer with </w:t>
-      </w:r>
+        <w:t>The backend exposes RESTful endpoints for document upload, indexing, chat, tree visualization, and reasoning-graph construction. The frontend provides a multi-document chat interface, an interactive tree explorer, and a PDF viewer with page-highlighted citations. Rate limiting and security middleware (Content-Security-Policy headers, file MIME/size validation, path-traversal guards) are production-hardened.</w:t>
+      </w:r>
+    </w:p>
+    <w:p>
+      <w:pPr>
+        <w:pStyle w:val="Head2"/>
+      </w:pPr>
+      <w:r>
+        <w:t>Deployment Considerations</w:t>
+      </w:r>
+    </w:p>
+    <w:p>
+      <w:pPr>
+        <w:pStyle w:val="PostHeadPara"/>
+      </w:pPr>
+      <w:r>
+        <w:t>Three properties make PageTree-RAG practical to operate. First, citation traceability: because every node retains its page range, answers can always be traced to a source span, which is a regulatory requirement in clinical and legal settings. Second, cost control: indexing is amortized and queries are cached, so the steady-state cost per query is dominated by a single generation call (or zero on a cache hit). Third, graceful degradation: the offline keyword-scoring path used for large-scale evaluation (Section 5) doubles as a fallback when the LLM API is rate-limited or unavailable, allowing the system to keep returning grounded, if less fluent, answers.</w:t>
+      </w:r>
+    </w:p>
+    <w:p>
+      <w:pPr>
+        <w:pStyle w:val="Head1"/>
+      </w:pPr>
+      <w:r>
+        <w:t>EXPERIMENTS</w:t>
+      </w:r>
+    </w:p>
+    <w:p>
+      <w:pPr>
+        <w:pStyle w:val="Head2"/>
+      </w:pPr>
+      <w:r>
+        <w:t>Experimental Setup</w:t>
+      </w:r>
+    </w:p>
+    <w:p>
+      <w:pPr>
+        <w:pStyle w:val="PostHeadPara"/>
+      </w:pPr>
+      <w:r>
+        <w:t>Datasets. We evaluate on three datasets. The Full Benchmark (n = 204) is an automatically generated QA set spanning seven documents (academic papers and biomedical reports); questions are produced by the LLM with three types (factual/single-hop, multi-hop/cross-section, comparative), and validation ensures answer hints appear verbatim in source nodes. The HotpotQA subset is a sample from the HotpotQA development set [35] converted to page-indexed trees, requiring two-hop reasoning across supporting passages; we use 20 questions for the offline extractive protocol and expand to 100 questions for the fair generative protocol (Section 5.6). The Medical Benchmark (n = 42) is auto-generated from Japanese-language biomedical engineering lecture materials and biomedical literature, with clinical factual, procedure, comparison, and safety question subtypes, and includes a domain-specific medical entity recall metric.</w:t>
+      </w:r>
+    </w:p>
+    <w:p>
+      <w:pPr>
+        <w:pStyle w:val="Para"/>
+      </w:pPr>
+      <w:r>
+        <w:t>Baselines. We compare against BM25 (Okapi BM25 keyword retrieval over document chunks), Dense Retrieval (Sentence-BERT [27] embedding with cosine retrieval), FlatRAG (a hybrid of BM25 60%, semantic 25%, structural 15%), and RAPTOR (recursive abstractive processing of chunks into a tree [30]), alongside our PageTree-RAG (DFS) and PageTree-RAG (Beam).</w:t>
+      </w:r>
+    </w:p>
+    <w:p>
+      <w:pPr>
+        <w:pStyle w:val="Para"/>
+      </w:pPr>
       <w:r>
         <w:lastRenderedPageBreak/>
-        <w:t>page-highlighted citations. Rate limiting and security middleware (Content-Security-Policy headers, file MIME/size validation, path-traversal guards) are production-hardened.</w:t>
-      </w:r>
-    </w:p>
-    <w:p>
-      <w:pPr>
-        <w:pStyle w:val="Head2"/>
-      </w:pPr>
-      <w:r>
-        <w:t>Deployment Considerations</w:t>
-      </w:r>
-    </w:p>
-    <w:p>
-      <w:pPr>
-        <w:pStyle w:val="PostHeadPara"/>
-      </w:pPr>
-      <w:r>
-        <w:t>Three properties make PageTree-RAG practical to operate. First, citation traceability: because every node retains its page range, answers can always be traced to a source span, which is a regulatory requirement in clinical and legal settings. Second, cost control: indexing is amortized and queries are cached, so the steady-state cost per query is dominated by a single generation call (or zero on a cache hit). Third, graceful degradation: the offline keyword-scoring path used for large-scale evaluation (Section 5) doubles as a fallback when the LLM API is rate-limited or unavailable, allowing the system to keep returning grounded, if less fluent, answers.</w:t>
-      </w:r>
-    </w:p>
-    <w:p>
-      <w:pPr>
-        <w:pStyle w:val="Head1"/>
-      </w:pPr>
-      <w:r>
-        <w:t>EXPERIMENTS</w:t>
-      </w:r>
-    </w:p>
-    <w:p>
-      <w:pPr>
-        <w:pStyle w:val="Head2"/>
-      </w:pPr>
-      <w:r>
-        <w:t>Experimental Setup</w:t>
-      </w:r>
-    </w:p>
-    <w:p>
-      <w:pPr>
-        <w:pStyle w:val="PostHeadPara"/>
-      </w:pPr>
-      <w:r>
-        <w:t>Datasets. We evaluate on three datasets. The Full Benchmark (n = 204) is an automatically generated QA set spanning seven documents (academic papers and biomedical reports); questions are produced by the LLM with three types (factual/single-hop, multi-hop/cross-section, comparative), and validation ensures answer hints appear verbatim in source nodes. The HotpotQA subset is a sample from the HotpotQA development set [35] converted to page-indexed trees, requiring two-hop reasoning across supporting passages; we use 20 questions for the offline extractive protocol and expand to 100 questions for the fair generative protocol (Section 5.6). The Medical Benchmark (n = 42) is auto-generated from Japanese-language biomedical engineering lecture materials and biomedical literature, with clinical factual, procedure, comparison, and safety question subtypes, and includes a domain-specific medical entity recall metric.</w:t>
-      </w:r>
-    </w:p>
-    <w:p>
-      <w:pPr>
-        <w:pStyle w:val="Para"/>
-      </w:pPr>
-      <w:r>
-        <w:t>Baselines. We compare against BM25 (Okapi BM25 keyword retrieval over document chunks), Dense Retrieval (Sentence-BERT [27] embedding with cosine retrieval), FlatRAG (a hybrid of BM25 60%, semantic 25%, structural 15%), and RAPTOR (recursive abstractive processing of chunks into a tree [30]), alongside our PageTree-RAG (DFS) and PageTree-RAG (Beam).</w:t>
-      </w:r>
-    </w:p>
-    <w:p>
-      <w:pPr>
-        <w:pStyle w:val="Para"/>
-      </w:pPr>
-      <w:r>
-        <w:t>Metrics. We report ROUGE-L [20] (longest-common-subsequence recall against reference answers); BERTScore [36] (contextual embedding precision); LLM-as-Judge [38], scored by the same locally hosted Llama 3.1 8B model used for generation (faithfulness, relevance, completeness, 0-1 scale); Medical Entity Recall (fraction of reference medical terms recovered); Latency (average wall-clock time per query); and Context Tokens (average token count handed to the generator). To measure source provenance we add two citation metrics: Citation Availability (fraction of answers that carry a valid page reference) and Citation F1 (overlap between the sections/pages cited and the gold supporting sections). Statistical significance is assessed with paired t-tests and effect size with Cohen's d.</w:t>
+        <w:t>Metrics. We report ROUGE-L [20] (longest-common-subsequence recall against reference answers); BERTScore [36] (contextual embedding precision); LLM-as-Judge [38], scored by the same locally hosted Llama 3.1 8B model used for generation (faithfulness, relevance, completeness, 0-1 scale); Medical Entity Recall (fraction of reference medical terms recovered); Latency (average wall-clock time per query); and Context Tokens (average token count handed to the generator). To measure source provenance we add two citation metrics: Citation Availability (fraction of answers that carry a valid page reference) and Citation F1 (overlap between the sections/pages cited and the gold supporting sections). Statistical significance is assessed with paired t-tests and effect size with Cohen's d. For significance we report paired t-tests and, for the small multi-hop cells, assumption-free paired permutation tests—preferred because they test the null hypothesis directly without a normality assumption—alongside Cohen's d effect sizes; bootstrap 95% confidence intervals and a power analysis for the headline comparisons are consolidated in Table 13 (Statistical Robustness).</w:t>
       </w:r>
     </w:p>
     <w:p>
@@ -2060,24 +2050,27 @@
         <w:pStyle w:val="Head2"/>
       </w:pPr>
       <w:r>
+        <w:t>Extractive-Mode Results: A Biased Offline Proxy</w:t>
+      </w:r>
+    </w:p>
+    <w:p>
+      <w:pPr>
+        <w:pStyle w:val="PostHeadPara"/>
+      </w:pPr>
+      <w:r>
+        <w:t>We first report the extractive protocol because it mirrors the offline evaluation common in prior work and because the contrast with the fair protocol (Section 5.6) is itself a finding. The reader should treat the numbers in this subsection as an upper-biased proxy for PageTree-RAG: extractive concatenation of node summaries inflates n-gram overlap with the reference for our systems, an artifact we quantify in Section 5.7. Table 3 reports results on the Full Benchmark and HotpotQA; Figures 3 and 4 visualize the overall and multi-hop comparisons. On the full benchmark, PageTree-RAG (DFS) achieves the highest ROUGE-L (0.451) and BERTScore (0.521). Compared to all baselines, PageTree-RAG (Beam) (the weaker of the two proposed variants on the full benchmark) already outperforms each one with p &lt; 0.001 and effect sizes ranging from d = 0.483 (vs. BM25) to d = 1.205 (vs. RAPTOR). PageTree-RAG (DFS) further improves over BM25 by +39.5% ROUGE-L (+0.127 absolute) and over RAPTOR by +132.4% (+0.257 absolute). PageTree-RAG (Beam) obtains slightly lower ROUGE-L than DFS on single-document factual questions (0.428 vs. 0.451, d = 0.095, p &lt; 0.001) but dominates on multi-hop HotpotQA under this offline extractive scoring (ROUGE-L = 0.169 vs. BM25 0.092, +84.4%, p &lt; 0.001, d = 1.358). This offline advantage does not survive the fair generative protocol: when we expand the HotpotQA subset to 100 questions and re-run it under the fair protocol, the flat baselines lead on ROUGE-L while PageTree-RAG (DFS) leads on LLM-Judge (Section 5.6).</w:t>
+      </w:r>
+    </w:p>
+    <w:p>
+      <w:pPr>
+        <w:pStyle w:val="Para"/>
+      </w:pPr>
+      <w:r>
+        <w:t xml:space="preserve">FlatRAG's high LLM-Judge score (0.81) despite low ROUGE-L (0.248) highlights a known divergence between lexical overlap metrics and semantic quality: FlatRAG's hybrid scoring produces fluent answers that an LLM judge rates highly, even though they miss the specific phrasing of reference answers. PageTree-RAG (Beam)'s LLM-Judge (0.70) is second highest. RAPTOR underperforms on both ROUGE-L (0.194) and LLM-Judge (0.67), likely because its cluster-based tree does not preserve section-level structure-known to be suboptimal for documents with explicit hierarchies [30]. The latency column (offline ms) shows both PageTree-RAG variants are faster than BM25 and RAPTOR even in offline mode, because </w:t>
+      </w:r>
+      <w:r>
         <w:lastRenderedPageBreak/>
-        <w:t>Extractive-Mode Results: A Biased Offline Proxy</w:t>
-      </w:r>
-    </w:p>
-    <w:p>
-      <w:pPr>
-        <w:pStyle w:val="PostHeadPara"/>
-      </w:pPr>
-      <w:r>
-        <w:t>We first report the extractive protocol because it mirrors the offline evaluation common in prior work and because the contrast with the fair protocol (Section 5.6) is itself a finding. The reader should treat the numbers in this subsection as an upper-biased proxy for PageTree-RAG: extractive concatenation of node summaries inflates n-gram overlap with the reference for our systems, an artifact we quantify in Section 5.7. Table 3 reports results on the Full Benchmark and HotpotQA; Figures 3 and 4 visualize the overall and multi-hop comparisons. On the full benchmark, PageTree-RAG (DFS) achieves the highest ROUGE-L (0.451) and BERTScore (0.521). Compared to all baselines, PageTree-RAG (Beam) (the weaker of the two proposed variants on the full benchmark) already outperforms each one with p &lt; 0.001 and effect sizes ranging from d = 0.483 (vs. BM25) to d = 1.205 (vs. RAPTOR). PageTree-RAG (DFS) further improves over BM25 by +39.5% ROUGE-L (+0.127 absolute) and over RAPTOR by +132.4% (+0.257 absolute). PageTree-RAG (Beam) obtains slightly lower ROUGE-L than DFS on single-document factual questions (0.428 vs. 0.451, d = 0.095, p &lt; 0.001) but dominates on multi-hop HotpotQA under this offline extractive scoring (ROUGE-L = 0.169 vs. BM25 0.092, +84.4%, p &lt; 0.001, d = 1.358). This offline advantage does not survive the fair generative protocol: when we expand the HotpotQA subset to 100 questions and re-run it under the fair protocol, the flat baselines lead on ROUGE-L while PageTree-RAG (DFS) leads on LLM-Judge (Section 5.6).</w:t>
-      </w:r>
-    </w:p>
-    <w:p>
-      <w:pPr>
-        <w:pStyle w:val="Para"/>
-      </w:pPr>
-      <w:r>
-        <w:t>FlatRAG's high LLM-Judge score (0.81) despite low ROUGE-L (0.248) highlights a known divergence between lexical overlap metrics and semantic quality: FlatRAG's hybrid scoring produces fluent answers that an LLM judge rates highly, even though they miss the specific phrasing of reference answers. PageTree-RAG (Beam)'s LLM-Judge (0.70) is second highest. RAPTOR underperforms on both ROUGE-L (0.194) and LLM-Judge (0.67), likely because its cluster-based tree does not preserve section-level structure-known to be suboptimal for documents with explicit hierarchies [30]. The latency column (offline ms) shows both PageTree-RAG variants are faster than BM25 and RAPTOR even in offline mode, because keyword-based tree traversal over a pre-built JSON index is more efficient than BM25's inverted-index lookup over raw chunks or RAPTOR's recursive summarization pipeline.</w:t>
+        <w:t>keyword-based tree traversal over a pre-built JSON index is more efficient than BM25's inverted-index lookup over raw chunks or RAPTOR's recursive summarization pipeline.</w:t>
       </w:r>
     </w:p>
     <w:p>
@@ -2699,7 +2692,7 @@
         <w:lastRenderedPageBreak/>
         <w:drawing>
           <wp:inline distT="0" distB="0" distL="0" distR="0" wp14:anchorId="33B078CD" wp14:editId="141721C6">
-            <wp:extent cx="4846320" cy="3039578"/>
+            <wp:extent cx="4846320" cy="3136605"/>
             <wp:effectExtent l="0" t="0" r="0" b="0"/>
             <wp:docPr id="3" name="Picture 3"/>
             <wp:cNvGraphicFramePr>
@@ -2721,7 +2714,7 @@
                   <pic:spPr>
                     <a:xfrm>
                       <a:off x="0" y="0"/>
-                      <a:ext cx="4846320" cy="3039578"/>
+                      <a:ext cx="4846320" cy="3136605"/>
                     </a:xfrm>
                     <a:prstGeom prst="rect">
                       <a:avLst/>
@@ -2739,7 +2732,7 @@
         <w:pStyle w:val="FigureCaption"/>
       </w:pPr>
       <w:r>
-        <w:t>Figure 3: ROUGE-L and BERTScore on the full benchmark (n = 204). Both PageTree-RAG variants outperform all four baselines.</w:t>
+        <w:t>Figure 3: Main results under the fair generative protocol (n = 100): ROUGE-L and BERTScore by system. Flat baselines lead on these lexical-overlap metrics, whereas PageTree-RAG leads on LLM-Judge (Table 8); the divergence is analyzed in Section 5.5.</w:t>
       </w:r>
     </w:p>
     <w:p>
@@ -2755,7 +2748,7 @@
         </w:rPr>
         <w:drawing>
           <wp:inline distT="0" distB="0" distL="0" distR="0" wp14:anchorId="56775F7A" wp14:editId="3C96AE27">
-            <wp:extent cx="4846320" cy="3009222"/>
+            <wp:extent cx="4846320" cy="3105266"/>
             <wp:effectExtent l="0" t="0" r="0" b="0"/>
             <wp:docPr id="4" name="Picture 4"/>
             <wp:cNvGraphicFramePr>
@@ -2777,7 +2770,7 @@
                   <pic:spPr>
                     <a:xfrm>
                       <a:off x="0" y="0"/>
-                      <a:ext cx="4846320" cy="3009222"/>
+                      <a:ext cx="4846320" cy="3105266"/>
                     </a:xfrm>
                     <a:prstGeom prst="rect">
                       <a:avLst/>
@@ -2798,11 +2791,8 @@
         </w:rPr>
       </w:pPr>
       <w:r>
-        <w:t xml:space="preserve">Figure 4: Multi-hop ROUGE-L on the HotpotQA subset under the offline extractive protocol (n = 20). PageTree-RAG (Beam) leads here, but this reverses under the fair generative protocol at n = 100, where flat baselines lead on ROUGE-L and PageTree-RAG (DFS) </w:t>
-      </w:r>
-      <w:r>
         <w:lastRenderedPageBreak/>
-        <w:t>leads on LLM-Judge (Section 5.6).</w:t>
+        <w:t>Figure 4: ROUGE-L on the Full Benchmark versus the HotpotQA multi-hop subset (fair generative protocol). Every system drops sharply on multi-hop under lexical overlap; on LLM-Judge PageTree-RAG (DFS) leads the multi-hop set (Table 10, Section 5.6).</w:t>
       </w:r>
       <w:r>
         <w:rPr>
@@ -3264,7 +3254,7 @@
         <w:lastRenderedPageBreak/>
         <w:drawing>
           <wp:inline distT="0" distB="0" distL="0" distR="0" wp14:anchorId="7BA3D80B" wp14:editId="57A421F2">
-            <wp:extent cx="4846320" cy="2656078"/>
+            <wp:extent cx="4846320" cy="2645427"/>
             <wp:effectExtent l="0" t="0" r="0" b="0"/>
             <wp:docPr id="5" name="Picture 5"/>
             <wp:cNvGraphicFramePr>
@@ -3286,7 +3276,7 @@
                   <pic:spPr>
                     <a:xfrm>
                       <a:off x="0" y="0"/>
-                      <a:ext cx="4846320" cy="2656078"/>
+                      <a:ext cx="4846320" cy="2645427"/>
                     </a:xfrm>
                     <a:prstGeom prst="rect">
                       <a:avLst/>
@@ -3641,10 +3631,16 @@
         <w:rPr>
           <w:lang w:eastAsia="ko-KR"/>
         </w:rPr>
+        <w:br/>
+      </w:r>
+      <w:r>
+        <w:rPr>
+          <w:lang w:eastAsia="ko-KR"/>
+        </w:rPr>
+        <w:br/>
+      </w:r>
+      <w:r>
         <w:lastRenderedPageBreak/>
-        <w:br/>
-      </w:r>
-      <w:r>
         <w:t>Table 6: Hyperparameter sensitivity of PageTree-RAG (Beam) under the fair generative protocol (n = 50, seed 42; LLM-Judge by llama3.1:8b). One factor is varied at a time; the default setting is shown in bold.</w:t>
       </w:r>
     </w:p>
@@ -4999,7 +4995,7 @@
         <w:pStyle w:val="PostHeadPara"/>
       </w:pPr>
       <w:r>
-        <w:t>Table 6 reports a one-factor-at-a-time sensitivity sweep over the four main hyperparameters, evaluated under the fair protocol on 50 questions. Beam width shows a clear optimum: a width of one collapses judged quality (0.735), the default width of five is best (0.813), and a wider beam of eight adds tokens and latency without improving quality. Traversal depth and the relevance weights are comparatively flat—LLM-Judge stays within roughly 0.79–0.82 across depths 2–10 and across all four weightings—indicating the fixed defaults are robust rather than finely tuned. The compression threshold is likewise stable, with a slightly higher value (0.8) marginally edging out the default (0.7) on judged quality; we retain the more conservative default. Overall the sweep supports the default configuration and shows that no single hyperparameter is a hidden lever behind the reported results.</w:t>
+        <w:t>Table 6 reports a one-factor-at-a-time sensitivity sweep over the four main hyperparameters, evaluated under the fair protocol on 50 questions. Beam width shows a clear optimum: a width of one collapses judged quality (0.735), the default width of five is best (0.813), and a wider beam of eight adds tokens and latency without improving quality. Traversal depth and the relevance weights are comparatively flat—LLM-Judge stays within roughly 0.79–0.82 across depths 2–10 and across all four weightings—indicating the fixed defaults are robust rather than finely tuned. The compression threshold is likewise stable, with a slightly higher value (0.8) marginally edging out the default (0.7) on judged quality; we retain the more conservative default. Overall the sweep supports the default configuration and shows that no single hyperparameter is a hidden lever behind the reported results. We therefore adopt τ = 0.7 as a conservative default that balances context size against judged answer quality. Because the sweep varies one factor at a time, it does not capture parameter interactions (for example beam width × depth); an exhaustive grid search is outside the scope of this work and is left to future work.</w:t>
       </w:r>
     </w:p>
     <w:p>
@@ -5501,7 +5497,7 @@
         <w:lastRenderedPageBreak/>
         <w:drawing>
           <wp:inline distT="0" distB="0" distL="0" distR="0" wp14:anchorId="1F30BEA1" wp14:editId="2C0DDBFD">
-            <wp:extent cx="4846320" cy="3432517"/>
+            <wp:extent cx="4846320" cy="2738537"/>
             <wp:effectExtent l="0" t="0" r="0" b="0"/>
             <wp:docPr id="7" name="Picture 7"/>
             <wp:cNvGraphicFramePr>
@@ -5523,7 +5519,7 @@
                   <pic:spPr>
                     <a:xfrm>
                       <a:off x="0" y="0"/>
-                      <a:ext cx="4846320" cy="3432517"/>
+                      <a:ext cx="4846320" cy="2738537"/>
                     </a:xfrm>
                     <a:prstGeom prst="rect">
                       <a:avLst/>
@@ -5541,7 +5537,7 @@
         <w:pStyle w:val="FigureCaption"/>
       </w:pPr>
       <w:r>
-        <w:t>Figure 7: Latency-accuracy trade-off (n = 204). Both PageTree-RAG variants sit in the high-accuracy, low-latency region.</w:t>
+        <w:t>Figure 7: Latency versus LLM-Judge (fair generative protocol, n = 100). PageTree-RAG reaches the highest judged quality but at higher per-query latency, because it runs LLM-scored node selection during traversal; latency is the cost of the approach.</w:t>
       </w:r>
     </w:p>
     <w:p>
@@ -5554,7 +5550,7 @@
         </w:rPr>
         <w:drawing>
           <wp:inline distT="0" distB="0" distL="0" distR="0" wp14:anchorId="2ABD46EA" wp14:editId="3A5635DB">
-            <wp:extent cx="4846320" cy="2914526"/>
+            <wp:extent cx="4846320" cy="3011163"/>
             <wp:effectExtent l="0" t="0" r="0" b="0"/>
             <wp:docPr id="8" name="Picture 8"/>
             <wp:cNvGraphicFramePr>
@@ -5576,7 +5572,7 @@
                   <pic:spPr>
                     <a:xfrm>
                       <a:off x="0" y="0"/>
-                      <a:ext cx="4846320" cy="2914526"/>
+                      <a:ext cx="4846320" cy="3011163"/>
                     </a:xfrm>
                     <a:prstGeom prst="rect">
                       <a:avLst/>
@@ -5592,9 +5588,25 @@
     <w:p>
       <w:pPr>
         <w:pStyle w:val="FigureCaption"/>
-      </w:pPr>
-      <w:r>
-        <w:t>Figure 8: Accuracy versus context size (n = 204). PageTree-RAG (DFS) Pareto-dominates every baseline, achieving higher ROUGE-L with fewer context tokens.</w:t>
+        <w:rPr>
+          <w:lang w:eastAsia="ko-KR"/>
+        </w:rPr>
+      </w:pPr>
+      <w:r>
+        <w:t>Figure 8: LLM-Judge versus context size (fair generative protocol, n = 100). PageTree-RAG sits on the Pareto frontier—highest judged quality at an order of magnitude fewer context tokens; FlatRAG uses no retrieval context by construction.</w:t>
+      </w:r>
+      <w:r>
+        <w:rPr>
+          <w:lang w:eastAsia="ko-KR"/>
+        </w:rPr>
+        <w:br/>
+      </w:r>
+      <w:r>
+        <w:rPr>
+          <w:lang w:eastAsia="ko-KR"/>
+        </w:rPr>
+        <w:lastRenderedPageBreak/>
+        <w:br/>
       </w:r>
     </w:p>
     <w:p>
@@ -5602,7 +5614,6 @@
         <w:pStyle w:val="Head2"/>
       </w:pPr>
       <w:r>
-        <w:lastRenderedPageBreak/>
         <w:t>Fair Generator-Controlled Results</w:t>
       </w:r>
     </w:p>
@@ -6266,11 +6277,11 @@
         </w:rPr>
       </w:pPr>
       <w:r>
-        <w:t xml:space="preserve">A retriever's value in citation-critical domains lies partly in whether its evidence can be cited at all. Table 9 measures this. Because PageTree-RAG retains a page range at every node, PageTree-RAG (Beam) both always produces a citation (availability 1.000) and cites the correct supporting sections most accurately (citation F1 = 0.757), the best of any system. The contrast with the abstractive baseline is stark: RAPTOR's cluster summaries discard section identifiers, so although it nominally attaches a reference (availability 1.000) its citation F1 is 0.000-it can point somewhere, but not to the right place. </w:t>
+        <w:t xml:space="preserve">A retriever's value in citation-critical domains lies partly in whether its evidence can be cited at all. Table 9 measures this. Because PageTree-RAG retains a page range at every node, PageTree-RAG (Beam) both always produces a citation (availability 1.000) and cites the correct supporting sections most accurately (citation F1 = 0.757), the best of any system. </w:t>
       </w:r>
       <w:r>
         <w:lastRenderedPageBreak/>
-        <w:t xml:space="preserve">FlatRAG retrieves section text but carries no page references at all (availability 0.000). This axis is, by construction, one that flat and abstractive methods cannot satisfy, and it is the most robust advantage we observe for </w:t>
+        <w:t xml:space="preserve">The contrast with the abstractive baseline is stark: RAPTOR's cluster summaries discard section identifiers, so although it nominally attaches a reference (availability 1.000) its citation F1 is 0.000-it can point somewhere, but not to the right place. FlatRAG retrieves section text but carries no page references at all (availability 0.000). This axis is, by construction, one that flat and abstractive methods cannot satisfy, and it is the most robust advantage we observe for </w:t>
       </w:r>
       <w:proofErr w:type="spellStart"/>
       <w:r>
@@ -7176,20 +7187,34 @@
     </w:p>
     <w:tbl>
       <w:tblPr>
-        <w:tblW w:type="auto" w:w="0"/>
-        <w:tblLook w:firstColumn="1" w:firstRow="1" w:lastColumn="0" w:lastRow="0" w:noHBand="0" w:noVBand="1" w:val="04A0"/>
+        <w:tblW w:w="0" w:type="auto"/>
+        <w:tblBorders>
+          <w:top w:val="single" w:sz="4" w:space="0" w:color="999999"/>
+          <w:left w:val="single" w:sz="4" w:space="0" w:color="999999"/>
+          <w:bottom w:val="single" w:sz="4" w:space="0" w:color="999999"/>
+          <w:right w:val="single" w:sz="4" w:space="0" w:color="999999"/>
+          <w:insideH w:val="single" w:sz="4" w:space="0" w:color="999999"/>
+          <w:insideV w:val="single" w:sz="4" w:space="0" w:color="999999"/>
+        </w:tblBorders>
+        <w:tblLook w:val="04A0" w:firstRow="1" w:lastRow="0" w:firstColumn="1" w:lastColumn="0" w:noHBand="0" w:noVBand="1"/>
       </w:tblPr>
       <w:tblGrid>
-        <w:gridCol w:w="2920"/>
-        <w:gridCol w:w="2920"/>
-        <w:gridCol w:w="2920"/>
+        <w:gridCol w:w="2917"/>
+        <w:gridCol w:w="2917"/>
+        <w:gridCol w:w="2916"/>
       </w:tblGrid>
       <w:tr>
         <w:tc>
           <w:tcPr>
-            <w:tcW w:type="dxa" w:w="2920"/>
-          </w:tcPr>
-          <w:p>
+            <w:tcW w:w="2920" w:type="dxa"/>
+          </w:tcPr>
+          <w:p>
+            <w:pPr>
+              <w:pStyle w:val="TableCell"/>
+              <w:rPr>
+                <w:b/>
+              </w:rPr>
+            </w:pPr>
             <w:r>
               <w:rPr>
                 <w:b/>
@@ -7200,9 +7225,15 @@
         </w:tc>
         <w:tc>
           <w:tcPr>
-            <w:tcW w:type="dxa" w:w="2920"/>
-          </w:tcPr>
-          <w:p>
+            <w:tcW w:w="2920" w:type="dxa"/>
+          </w:tcPr>
+          <w:p>
+            <w:pPr>
+              <w:pStyle w:val="TableCell"/>
+              <w:rPr>
+                <w:b/>
+              </w:rPr>
+            </w:pPr>
             <w:r>
               <w:rPr>
                 <w:b/>
@@ -7213,9 +7244,15 @@
         </w:tc>
         <w:tc>
           <w:tcPr>
-            <w:tcW w:type="dxa" w:w="2920"/>
-          </w:tcPr>
-          <w:p>
+            <w:tcW w:w="2920" w:type="dxa"/>
+          </w:tcPr>
+          <w:p>
+            <w:pPr>
+              <w:pStyle w:val="TableCell"/>
+              <w:rPr>
+                <w:b/>
+              </w:rPr>
+            </w:pPr>
             <w:r>
               <w:rPr>
                 <w:b/>
@@ -7228,35 +7265,41 @@
       <w:tr>
         <w:tc>
           <w:tcPr>
-            <w:tcW w:type="dxa" w:w="2920"/>
-          </w:tcPr>
-          <w:p>
-            <w:r>
+            <w:tcW w:w="2920" w:type="dxa"/>
+          </w:tcPr>
+          <w:p>
+            <w:pPr>
+              <w:pStyle w:val="TableCell"/>
+            </w:pPr>
+            <w:r>
+              <w:t>BM25</w:t>
+            </w:r>
+          </w:p>
+        </w:tc>
+        <w:tc>
+          <w:tcPr>
+            <w:tcW w:w="2920" w:type="dxa"/>
+          </w:tcPr>
+          <w:p>
+            <w:pPr>
+              <w:pStyle w:val="TableCell"/>
+            </w:pPr>
+            <w:r>
+              <w:t>0.038</w:t>
+            </w:r>
+          </w:p>
+        </w:tc>
+        <w:tc>
+          <w:tcPr>
+            <w:tcW w:w="2920" w:type="dxa"/>
+          </w:tcPr>
+          <w:p>
+            <w:pPr>
+              <w:pStyle w:val="TableCell"/>
               <w:rPr>
-                <w:b w:val="0"/>
+                <w:b/>
               </w:rPr>
-              <w:t>BM25</w:t>
-            </w:r>
-          </w:p>
-        </w:tc>
-        <w:tc>
-          <w:tcPr>
-            <w:tcW w:type="dxa" w:w="2920"/>
-          </w:tcPr>
-          <w:p>
-            <w:r>
-              <w:rPr>
-                <w:b w:val="0"/>
-              </w:rPr>
-              <w:t>0.038</w:t>
-            </w:r>
-          </w:p>
-        </w:tc>
-        <w:tc>
-          <w:tcPr>
-            <w:tcW w:type="dxa" w:w="2920"/>
-          </w:tcPr>
-          <w:p>
+            </w:pPr>
             <w:r>
               <w:rPr>
                 <w:b/>
@@ -7269,39 +7312,39 @@
       <w:tr>
         <w:tc>
           <w:tcPr>
-            <w:tcW w:type="dxa" w:w="2920"/>
-          </w:tcPr>
-          <w:p>
-            <w:r>
-              <w:rPr>
-                <w:b w:val="0"/>
-              </w:rPr>
+            <w:tcW w:w="2920" w:type="dxa"/>
+          </w:tcPr>
+          <w:p>
+            <w:pPr>
+              <w:pStyle w:val="TableCell"/>
+            </w:pPr>
+            <w:r>
               <w:t>Dense Retrieval</w:t>
             </w:r>
           </w:p>
         </w:tc>
         <w:tc>
           <w:tcPr>
-            <w:tcW w:type="dxa" w:w="2920"/>
-          </w:tcPr>
-          <w:p>
-            <w:r>
-              <w:rPr>
-                <w:b w:val="0"/>
-              </w:rPr>
+            <w:tcW w:w="2920" w:type="dxa"/>
+          </w:tcPr>
+          <w:p>
+            <w:pPr>
+              <w:pStyle w:val="TableCell"/>
+            </w:pPr>
+            <w:r>
               <w:t>0.026</w:t>
             </w:r>
           </w:p>
         </w:tc>
         <w:tc>
           <w:tcPr>
-            <w:tcW w:type="dxa" w:w="2920"/>
-          </w:tcPr>
-          <w:p>
-            <w:r>
-              <w:rPr>
-                <w:b w:val="0"/>
-              </w:rPr>
+            <w:tcW w:w="2920" w:type="dxa"/>
+          </w:tcPr>
+          <w:p>
+            <w:pPr>
+              <w:pStyle w:val="TableCell"/>
+            </w:pPr>
+            <w:r>
               <w:t>0.815</w:t>
             </w:r>
           </w:p>
@@ -7310,39 +7353,39 @@
       <w:tr>
         <w:tc>
           <w:tcPr>
-            <w:tcW w:type="dxa" w:w="2920"/>
-          </w:tcPr>
-          <w:p>
-            <w:r>
-              <w:rPr>
-                <w:b w:val="0"/>
-              </w:rPr>
+            <w:tcW w:w="2920" w:type="dxa"/>
+          </w:tcPr>
+          <w:p>
+            <w:pPr>
+              <w:pStyle w:val="TableCell"/>
+            </w:pPr>
+            <w:r>
               <w:t>FlatRAG</w:t>
             </w:r>
           </w:p>
         </w:tc>
         <w:tc>
           <w:tcPr>
-            <w:tcW w:type="dxa" w:w="2920"/>
-          </w:tcPr>
-          <w:p>
-            <w:r>
-              <w:rPr>
-                <w:b w:val="0"/>
-              </w:rPr>
+            <w:tcW w:w="2920" w:type="dxa"/>
+          </w:tcPr>
+          <w:p>
+            <w:pPr>
+              <w:pStyle w:val="TableCell"/>
+            </w:pPr>
+            <w:r>
               <w:t>0.146</w:t>
             </w:r>
           </w:p>
         </w:tc>
         <w:tc>
           <w:tcPr>
-            <w:tcW w:type="dxa" w:w="2920"/>
-          </w:tcPr>
-          <w:p>
-            <w:r>
-              <w:rPr>
-                <w:b w:val="0"/>
-              </w:rPr>
+            <w:tcW w:w="2920" w:type="dxa"/>
+          </w:tcPr>
+          <w:p>
+            <w:pPr>
+              <w:pStyle w:val="TableCell"/>
+            </w:pPr>
+            <w:r>
               <w:t>0.757</w:t>
             </w:r>
           </w:p>
@@ -7351,39 +7394,39 @@
       <w:tr>
         <w:tc>
           <w:tcPr>
-            <w:tcW w:type="dxa" w:w="2920"/>
-          </w:tcPr>
-          <w:p>
-            <w:r>
-              <w:rPr>
-                <w:b w:val="0"/>
-              </w:rPr>
+            <w:tcW w:w="2920" w:type="dxa"/>
+          </w:tcPr>
+          <w:p>
+            <w:pPr>
+              <w:pStyle w:val="TableCell"/>
+            </w:pPr>
+            <w:r>
               <w:t>RAPTOR</w:t>
             </w:r>
           </w:p>
         </w:tc>
         <w:tc>
           <w:tcPr>
-            <w:tcW w:type="dxa" w:w="2920"/>
-          </w:tcPr>
-          <w:p>
-            <w:r>
-              <w:rPr>
-                <w:b w:val="0"/>
-              </w:rPr>
+            <w:tcW w:w="2920" w:type="dxa"/>
+          </w:tcPr>
+          <w:p>
+            <w:pPr>
+              <w:pStyle w:val="TableCell"/>
+            </w:pPr>
+            <w:r>
               <w:t>0.021</w:t>
             </w:r>
           </w:p>
         </w:tc>
         <w:tc>
           <w:tcPr>
-            <w:tcW w:type="dxa" w:w="2920"/>
-          </w:tcPr>
-          <w:p>
-            <w:r>
-              <w:rPr>
-                <w:b w:val="0"/>
-              </w:rPr>
+            <w:tcW w:w="2920" w:type="dxa"/>
+          </w:tcPr>
+          <w:p>
+            <w:pPr>
+              <w:pStyle w:val="TableCell"/>
+            </w:pPr>
+            <w:r>
               <w:t>0.523</w:t>
             </w:r>
           </w:p>
@@ -7392,39 +7435,39 @@
       <w:tr>
         <w:tc>
           <w:tcPr>
-            <w:tcW w:type="dxa" w:w="2920"/>
-          </w:tcPr>
-          <w:p>
-            <w:r>
-              <w:rPr>
-                <w:b w:val="0"/>
-              </w:rPr>
+            <w:tcW w:w="2920" w:type="dxa"/>
+          </w:tcPr>
+          <w:p>
+            <w:pPr>
+              <w:pStyle w:val="TableCell"/>
+            </w:pPr>
+            <w:r>
               <w:t>PageTree-RAG (DFS)</w:t>
             </w:r>
           </w:p>
         </w:tc>
         <w:tc>
           <w:tcPr>
-            <w:tcW w:type="dxa" w:w="2920"/>
-          </w:tcPr>
-          <w:p>
-            <w:r>
-              <w:rPr>
-                <w:b w:val="0"/>
-              </w:rPr>
+            <w:tcW w:w="2920" w:type="dxa"/>
+          </w:tcPr>
+          <w:p>
+            <w:pPr>
+              <w:pStyle w:val="TableCell"/>
+            </w:pPr>
+            <w:r>
               <w:t>0.119</w:t>
             </w:r>
           </w:p>
         </w:tc>
         <w:tc>
           <w:tcPr>
-            <w:tcW w:type="dxa" w:w="2920"/>
-          </w:tcPr>
-          <w:p>
-            <w:r>
-              <w:rPr>
-                <w:b w:val="0"/>
-              </w:rPr>
+            <w:tcW w:w="2920" w:type="dxa"/>
+          </w:tcPr>
+          <w:p>
+            <w:pPr>
+              <w:pStyle w:val="TableCell"/>
+            </w:pPr>
+            <w:r>
               <w:t>0.735</w:t>
             </w:r>
           </w:p>
@@ -7433,22 +7476,28 @@
       <w:tr>
         <w:tc>
           <w:tcPr>
-            <w:tcW w:type="dxa" w:w="2920"/>
-          </w:tcPr>
-          <w:p>
-            <w:r>
+            <w:tcW w:w="2920" w:type="dxa"/>
+          </w:tcPr>
+          <w:p>
+            <w:pPr>
+              <w:pStyle w:val="TableCell"/>
+            </w:pPr>
+            <w:r>
+              <w:t>PageTree-RAG (Beam)</w:t>
+            </w:r>
+          </w:p>
+        </w:tc>
+        <w:tc>
+          <w:tcPr>
+            <w:tcW w:w="2920" w:type="dxa"/>
+          </w:tcPr>
+          <w:p>
+            <w:pPr>
+              <w:pStyle w:val="TableCell"/>
               <w:rPr>
-                <w:b w:val="0"/>
+                <w:b/>
               </w:rPr>
-              <w:t>PageTree-RAG (Beam)</w:t>
-            </w:r>
-          </w:p>
-        </w:tc>
-        <w:tc>
-          <w:tcPr>
-            <w:tcW w:type="dxa" w:w="2920"/>
-          </w:tcPr>
-          <w:p>
+            </w:pPr>
             <w:r>
               <w:rPr>
                 <w:b/>
@@ -7459,9 +7508,15 @@
         </w:tc>
         <w:tc>
           <w:tcPr>
-            <w:tcW w:type="dxa" w:w="2920"/>
-          </w:tcPr>
-          <w:p>
+            <w:tcW w:w="2920" w:type="dxa"/>
+          </w:tcPr>
+          <w:p>
+            <w:pPr>
+              <w:pStyle w:val="TableCell"/>
+              <w:rPr>
+                <w:b/>
+              </w:rPr>
+            </w:pPr>
             <w:r>
               <w:rPr>
                 <w:b/>
@@ -7474,6 +7529,1648 @@
     </w:tbl>
     <w:p>
       <w:pPr>
+        <w:pStyle w:val="Head2"/>
+      </w:pPr>
+      <w:r>
+        <w:t>Statistical Robustness</w:t>
+      </w:r>
+    </w:p>
+    <w:p>
+      <w:pPr>
+        <w:pStyle w:val="PostHeadPara"/>
+      </w:pPr>
+      <w:r>
+        <w:t>Because several evaluation cells are small, we supplement the paired t-tests with three assumption-light analyses of the headline PageTree-RAG (DFS)-vs-baseline comparisons: bias-corrected bootstrap 95% confidence intervals for the mean per-question difference (10,000 resamples), an assumption-free paired permutation test (10,000 sign-flips), and a power analysis reporting the paired effect size d_z, the post-hoc achieved power (two-sided α = 0.05), and the sample size n₈₀ required for 80% power. Table 13 consolidates these across benchmarks.</w:t>
+      </w:r>
+    </w:p>
+    <w:p>
+      <w:pPr>
+        <w:pStyle w:val="TableCaption"/>
+      </w:pPr>
+      <w:r>
+        <w:t>Table 13: Robust small-sample statistics for PageTree-RAG (DFS) versus each baseline. Δ = paired mean difference (positive favors PageTree-RAG); CIs are 10,000-sample bootstrap percentiles; p_perm is the paired permutation p-value; Power is post-hoc achieved power; n₈₀ is the sample size needed for 80% power. General and medical rows use the offline extractive protocol; HotpotQA rows use the fair generative protocol.</w:t>
+      </w:r>
+    </w:p>
+    <w:tbl>
+      <w:tblPr>
+        <w:tblW w:w="0" w:type="auto"/>
+        <w:tblLook w:val="04A0" w:firstRow="1" w:lastRow="0" w:firstColumn="1" w:lastColumn="0" w:noHBand="0" w:noVBand="1"/>
+      </w:tblPr>
+      <w:tblGrid>
+        <w:gridCol w:w="1250"/>
+        <w:gridCol w:w="965"/>
+        <w:gridCol w:w="979"/>
+        <w:gridCol w:w="879"/>
+        <w:gridCol w:w="968"/>
+        <w:gridCol w:w="915"/>
+        <w:gridCol w:w="965"/>
+        <w:gridCol w:w="935"/>
+        <w:gridCol w:w="904"/>
+      </w:tblGrid>
+      <w:tr>
+        <w:tc>
+          <w:tcPr>
+            <w:tcW w:w="973" w:type="dxa"/>
+          </w:tcPr>
+          <w:p>
+            <w:r>
+              <w:rPr>
+                <w:b/>
+              </w:rPr>
+              <w:t>Benchmark</w:t>
+            </w:r>
+          </w:p>
+        </w:tc>
+        <w:tc>
+          <w:tcPr>
+            <w:tcW w:w="973" w:type="dxa"/>
+          </w:tcPr>
+          <w:p>
+            <w:r>
+              <w:rPr>
+                <w:b/>
+              </w:rPr>
+              <w:t>Metric</w:t>
+            </w:r>
+          </w:p>
+        </w:tc>
+        <w:tc>
+          <w:tcPr>
+            <w:tcW w:w="973" w:type="dxa"/>
+          </w:tcPr>
+          <w:p>
+            <w:r>
+              <w:rPr>
+                <w:b/>
+              </w:rPr>
+              <w:t>vs. baseline</w:t>
+            </w:r>
+          </w:p>
+        </w:tc>
+        <w:tc>
+          <w:tcPr>
+            <w:tcW w:w="973" w:type="dxa"/>
+          </w:tcPr>
+          <w:p>
+            <w:r>
+              <w:rPr>
+                <w:b/>
+              </w:rPr>
+              <w:t>n</w:t>
+            </w:r>
+          </w:p>
+        </w:tc>
+        <w:tc>
+          <w:tcPr>
+            <w:tcW w:w="973" w:type="dxa"/>
+          </w:tcPr>
+          <w:p>
+            <w:r>
+              <w:rPr>
+                <w:b/>
+              </w:rPr>
+              <w:t>Δ [95% CI]</w:t>
+            </w:r>
+          </w:p>
+        </w:tc>
+        <w:tc>
+          <w:tcPr>
+            <w:tcW w:w="973" w:type="dxa"/>
+          </w:tcPr>
+          <w:p>
+            <w:r>
+              <w:rPr>
+                <w:b/>
+              </w:rPr>
+              <w:t>d_z</w:t>
+            </w:r>
+          </w:p>
+        </w:tc>
+        <w:tc>
+          <w:tcPr>
+            <w:tcW w:w="973" w:type="dxa"/>
+          </w:tcPr>
+          <w:p>
+            <w:r>
+              <w:rPr>
+                <w:b/>
+              </w:rPr>
+              <w:t>p_perm</w:t>
+            </w:r>
+          </w:p>
+        </w:tc>
+        <w:tc>
+          <w:tcPr>
+            <w:tcW w:w="973" w:type="dxa"/>
+          </w:tcPr>
+          <w:p>
+            <w:r>
+              <w:rPr>
+                <w:b/>
+              </w:rPr>
+              <w:t>Power</w:t>
+            </w:r>
+          </w:p>
+        </w:tc>
+        <w:tc>
+          <w:tcPr>
+            <w:tcW w:w="973" w:type="dxa"/>
+          </w:tcPr>
+          <w:p>
+            <w:r>
+              <w:rPr>
+                <w:b/>
+              </w:rPr>
+              <w:t>n₈₀</w:t>
+            </w:r>
+          </w:p>
+        </w:tc>
+      </w:tr>
+      <w:tr>
+        <w:tc>
+          <w:tcPr>
+            <w:tcW w:w="973" w:type="dxa"/>
+          </w:tcPr>
+          <w:p>
+            <w:r>
+              <w:lastRenderedPageBreak/>
+              <w:t>General</w:t>
+            </w:r>
+          </w:p>
+        </w:tc>
+        <w:tc>
+          <w:tcPr>
+            <w:tcW w:w="973" w:type="dxa"/>
+          </w:tcPr>
+          <w:p>
+            <w:r>
+              <w:t>ROUGE-L</w:t>
+            </w:r>
+          </w:p>
+        </w:tc>
+        <w:tc>
+          <w:tcPr>
+            <w:tcW w:w="973" w:type="dxa"/>
+          </w:tcPr>
+          <w:p>
+            <w:r>
+              <w:t>BM25</w:t>
+            </w:r>
+          </w:p>
+        </w:tc>
+        <w:tc>
+          <w:tcPr>
+            <w:tcW w:w="973" w:type="dxa"/>
+          </w:tcPr>
+          <w:p>
+            <w:r>
+              <w:t>204</w:t>
+            </w:r>
+          </w:p>
+        </w:tc>
+        <w:tc>
+          <w:tcPr>
+            <w:tcW w:w="973" w:type="dxa"/>
+          </w:tcPr>
+          <w:p>
+            <w:r>
+              <w:t>+0.128 [+0.100, +0.156]</w:t>
+            </w:r>
+          </w:p>
+        </w:tc>
+        <w:tc>
+          <w:tcPr>
+            <w:tcW w:w="973" w:type="dxa"/>
+          </w:tcPr>
+          <w:p>
+            <w:r>
+              <w:t>+0.62</w:t>
+            </w:r>
+          </w:p>
+        </w:tc>
+        <w:tc>
+          <w:tcPr>
+            <w:tcW w:w="973" w:type="dxa"/>
+          </w:tcPr>
+          <w:p>
+            <w:r>
+              <w:t>&lt;0.0001</w:t>
+            </w:r>
+          </w:p>
+        </w:tc>
+        <w:tc>
+          <w:tcPr>
+            <w:tcW w:w="973" w:type="dxa"/>
+          </w:tcPr>
+          <w:p>
+            <w:r>
+              <w:t>1.00</w:t>
+            </w:r>
+          </w:p>
+        </w:tc>
+        <w:tc>
+          <w:tcPr>
+            <w:tcW w:w="973" w:type="dxa"/>
+          </w:tcPr>
+          <w:p>
+            <w:r>
+              <w:t>22</w:t>
+            </w:r>
+          </w:p>
+        </w:tc>
+      </w:tr>
+      <w:tr>
+        <w:tc>
+          <w:tcPr>
+            <w:tcW w:w="973" w:type="dxa"/>
+          </w:tcPr>
+          <w:p>
+            <w:r>
+              <w:t>General</w:t>
+            </w:r>
+          </w:p>
+        </w:tc>
+        <w:tc>
+          <w:tcPr>
+            <w:tcW w:w="973" w:type="dxa"/>
+          </w:tcPr>
+          <w:p>
+            <w:r>
+              <w:t>ROUGE-L</w:t>
+            </w:r>
+          </w:p>
+        </w:tc>
+        <w:tc>
+          <w:tcPr>
+            <w:tcW w:w="973" w:type="dxa"/>
+          </w:tcPr>
+          <w:p>
+            <w:r>
+              <w:t>Dense</w:t>
+            </w:r>
+          </w:p>
+        </w:tc>
+        <w:tc>
+          <w:tcPr>
+            <w:tcW w:w="973" w:type="dxa"/>
+          </w:tcPr>
+          <w:p>
+            <w:r>
+              <w:t>204</w:t>
+            </w:r>
+          </w:p>
+        </w:tc>
+        <w:tc>
+          <w:tcPr>
+            <w:tcW w:w="973" w:type="dxa"/>
+          </w:tcPr>
+          <w:p>
+            <w:r>
+              <w:t>+0.161 [+0.136, +0.187]</w:t>
+            </w:r>
+          </w:p>
+        </w:tc>
+        <w:tc>
+          <w:tcPr>
+            <w:tcW w:w="973" w:type="dxa"/>
+          </w:tcPr>
+          <w:p>
+            <w:r>
+              <w:t>+0.87</w:t>
+            </w:r>
+          </w:p>
+        </w:tc>
+        <w:tc>
+          <w:tcPr>
+            <w:tcW w:w="973" w:type="dxa"/>
+          </w:tcPr>
+          <w:p>
+            <w:r>
+              <w:t>&lt;0.0001</w:t>
+            </w:r>
+          </w:p>
+        </w:tc>
+        <w:tc>
+          <w:tcPr>
+            <w:tcW w:w="973" w:type="dxa"/>
+          </w:tcPr>
+          <w:p>
+            <w:r>
+              <w:t>1.00</w:t>
+            </w:r>
+          </w:p>
+        </w:tc>
+        <w:tc>
+          <w:tcPr>
+            <w:tcW w:w="973" w:type="dxa"/>
+          </w:tcPr>
+          <w:p>
+            <w:r>
+              <w:t>12</w:t>
+            </w:r>
+          </w:p>
+        </w:tc>
+      </w:tr>
+      <w:tr>
+        <w:tc>
+          <w:tcPr>
+            <w:tcW w:w="973" w:type="dxa"/>
+          </w:tcPr>
+          <w:p>
+            <w:r>
+              <w:t>General</w:t>
+            </w:r>
+          </w:p>
+        </w:tc>
+        <w:tc>
+          <w:tcPr>
+            <w:tcW w:w="973" w:type="dxa"/>
+          </w:tcPr>
+          <w:p>
+            <w:r>
+              <w:t>ROUGE-L</w:t>
+            </w:r>
+          </w:p>
+        </w:tc>
+        <w:tc>
+          <w:tcPr>
+            <w:tcW w:w="973" w:type="dxa"/>
+          </w:tcPr>
+          <w:p>
+            <w:r>
+              <w:t>FlatRAG</w:t>
+            </w:r>
+          </w:p>
+        </w:tc>
+        <w:tc>
+          <w:tcPr>
+            <w:tcW w:w="973" w:type="dxa"/>
+          </w:tcPr>
+          <w:p>
+            <w:r>
+              <w:t>204</w:t>
+            </w:r>
+          </w:p>
+        </w:tc>
+        <w:tc>
+          <w:tcPr>
+            <w:tcW w:w="973" w:type="dxa"/>
+          </w:tcPr>
+          <w:p>
+            <w:r>
+              <w:t>+0.203 [+0.175, +0.232]</w:t>
+            </w:r>
+          </w:p>
+        </w:tc>
+        <w:tc>
+          <w:tcPr>
+            <w:tcW w:w="973" w:type="dxa"/>
+          </w:tcPr>
+          <w:p>
+            <w:r>
+              <w:t>+0.97</w:t>
+            </w:r>
+          </w:p>
+        </w:tc>
+        <w:tc>
+          <w:tcPr>
+            <w:tcW w:w="973" w:type="dxa"/>
+          </w:tcPr>
+          <w:p>
+            <w:r>
+              <w:t>&lt;0.0001</w:t>
+            </w:r>
+          </w:p>
+        </w:tc>
+        <w:tc>
+          <w:tcPr>
+            <w:tcW w:w="973" w:type="dxa"/>
+          </w:tcPr>
+          <w:p>
+            <w:r>
+              <w:t>1.00</w:t>
+            </w:r>
+          </w:p>
+        </w:tc>
+        <w:tc>
+          <w:tcPr>
+            <w:tcW w:w="973" w:type="dxa"/>
+          </w:tcPr>
+          <w:p>
+            <w:r>
+              <w:t>10</w:t>
+            </w:r>
+          </w:p>
+        </w:tc>
+      </w:tr>
+      <w:tr>
+        <w:tc>
+          <w:tcPr>
+            <w:tcW w:w="973" w:type="dxa"/>
+          </w:tcPr>
+          <w:p>
+            <w:r>
+              <w:t>General</w:t>
+            </w:r>
+          </w:p>
+        </w:tc>
+        <w:tc>
+          <w:tcPr>
+            <w:tcW w:w="973" w:type="dxa"/>
+          </w:tcPr>
+          <w:p>
+            <w:r>
+              <w:t>ROUGE-L</w:t>
+            </w:r>
+          </w:p>
+        </w:tc>
+        <w:tc>
+          <w:tcPr>
+            <w:tcW w:w="973" w:type="dxa"/>
+          </w:tcPr>
+          <w:p>
+            <w:r>
+              <w:t>RAPTOR</w:t>
+            </w:r>
+          </w:p>
+        </w:tc>
+        <w:tc>
+          <w:tcPr>
+            <w:tcW w:w="973" w:type="dxa"/>
+          </w:tcPr>
+          <w:p>
+            <w:r>
+              <w:t>204</w:t>
+            </w:r>
+          </w:p>
+        </w:tc>
+        <w:tc>
+          <w:tcPr>
+            <w:tcW w:w="973" w:type="dxa"/>
+          </w:tcPr>
+          <w:p>
+            <w:r>
+              <w:t>+0.257 [+0.228, +0.286]</w:t>
+            </w:r>
+          </w:p>
+        </w:tc>
+        <w:tc>
+          <w:tcPr>
+            <w:tcW w:w="973" w:type="dxa"/>
+          </w:tcPr>
+          <w:p>
+            <w:r>
+              <w:t>+1.22</w:t>
+            </w:r>
+          </w:p>
+        </w:tc>
+        <w:tc>
+          <w:tcPr>
+            <w:tcW w:w="973" w:type="dxa"/>
+          </w:tcPr>
+          <w:p>
+            <w:r>
+              <w:t>&lt;0.0001</w:t>
+            </w:r>
+          </w:p>
+        </w:tc>
+        <w:tc>
+          <w:tcPr>
+            <w:tcW w:w="973" w:type="dxa"/>
+          </w:tcPr>
+          <w:p>
+            <w:r>
+              <w:t>1.00</w:t>
+            </w:r>
+          </w:p>
+        </w:tc>
+        <w:tc>
+          <w:tcPr>
+            <w:tcW w:w="973" w:type="dxa"/>
+          </w:tcPr>
+          <w:p>
+            <w:r>
+              <w:t>7</w:t>
+            </w:r>
+          </w:p>
+        </w:tc>
+      </w:tr>
+      <w:tr>
+        <w:tc>
+          <w:tcPr>
+            <w:tcW w:w="973" w:type="dxa"/>
+          </w:tcPr>
+          <w:p>
+            <w:r>
+              <w:t>Medical</w:t>
+            </w:r>
+          </w:p>
+        </w:tc>
+        <w:tc>
+          <w:tcPr>
+            <w:tcW w:w="973" w:type="dxa"/>
+          </w:tcPr>
+          <w:p>
+            <w:r>
+              <w:t>ROUGE-L</w:t>
+            </w:r>
+          </w:p>
+        </w:tc>
+        <w:tc>
+          <w:tcPr>
+            <w:tcW w:w="973" w:type="dxa"/>
+          </w:tcPr>
+          <w:p>
+            <w:r>
+              <w:t>BM25</w:t>
+            </w:r>
+          </w:p>
+        </w:tc>
+        <w:tc>
+          <w:tcPr>
+            <w:tcW w:w="973" w:type="dxa"/>
+          </w:tcPr>
+          <w:p>
+            <w:r>
+              <w:t>42</w:t>
+            </w:r>
+          </w:p>
+        </w:tc>
+        <w:tc>
+          <w:tcPr>
+            <w:tcW w:w="973" w:type="dxa"/>
+          </w:tcPr>
+          <w:p>
+            <w:r>
+              <w:t>+0.007 [−0.021, +0.031]</w:t>
+            </w:r>
+          </w:p>
+        </w:tc>
+        <w:tc>
+          <w:tcPr>
+            <w:tcW w:w="973" w:type="dxa"/>
+          </w:tcPr>
+          <w:p>
+            <w:r>
+              <w:t>+0.09</w:t>
+            </w:r>
+          </w:p>
+        </w:tc>
+        <w:tc>
+          <w:tcPr>
+            <w:tcW w:w="973" w:type="dxa"/>
+          </w:tcPr>
+          <w:p>
+            <w:r>
+              <w:t>0.629</w:t>
+            </w:r>
+          </w:p>
+        </w:tc>
+        <w:tc>
+          <w:tcPr>
+            <w:tcW w:w="973" w:type="dxa"/>
+          </w:tcPr>
+          <w:p>
+            <w:r>
+              <w:t>0.08</w:t>
+            </w:r>
+          </w:p>
+        </w:tc>
+        <w:tc>
+          <w:tcPr>
+            <w:tcW w:w="973" w:type="dxa"/>
+          </w:tcPr>
+          <w:p>
+            <w:r>
+              <w:t>1075</w:t>
+            </w:r>
+          </w:p>
+        </w:tc>
+      </w:tr>
+      <w:tr>
+        <w:tc>
+          <w:tcPr>
+            <w:tcW w:w="973" w:type="dxa"/>
+          </w:tcPr>
+          <w:p>
+            <w:r>
+              <w:t>Medical</w:t>
+            </w:r>
+          </w:p>
+        </w:tc>
+        <w:tc>
+          <w:tcPr>
+            <w:tcW w:w="973" w:type="dxa"/>
+          </w:tcPr>
+          <w:p>
+            <w:r>
+              <w:t>ROUGE-L</w:t>
+            </w:r>
+          </w:p>
+        </w:tc>
+        <w:tc>
+          <w:tcPr>
+            <w:tcW w:w="973" w:type="dxa"/>
+          </w:tcPr>
+          <w:p>
+            <w:r>
+              <w:t>Dense</w:t>
+            </w:r>
+          </w:p>
+        </w:tc>
+        <w:tc>
+          <w:tcPr>
+            <w:tcW w:w="973" w:type="dxa"/>
+          </w:tcPr>
+          <w:p>
+            <w:r>
+              <w:t>42</w:t>
+            </w:r>
+          </w:p>
+        </w:tc>
+        <w:tc>
+          <w:tcPr>
+            <w:tcW w:w="973" w:type="dxa"/>
+          </w:tcPr>
+          <w:p>
+            <w:r>
+              <w:t>+0.051 [+0.021, +0.086]</w:t>
+            </w:r>
+          </w:p>
+        </w:tc>
+        <w:tc>
+          <w:tcPr>
+            <w:tcW w:w="973" w:type="dxa"/>
+          </w:tcPr>
+          <w:p>
+            <w:r>
+              <w:t>+0.46</w:t>
+            </w:r>
+          </w:p>
+        </w:tc>
+        <w:tc>
+          <w:tcPr>
+            <w:tcW w:w="973" w:type="dxa"/>
+          </w:tcPr>
+          <w:p>
+            <w:r>
+              <w:t>0.0018</w:t>
+            </w:r>
+          </w:p>
+        </w:tc>
+        <w:tc>
+          <w:tcPr>
+            <w:tcW w:w="973" w:type="dxa"/>
+          </w:tcPr>
+          <w:p>
+            <w:r>
+              <w:t>0.83</w:t>
+            </w:r>
+          </w:p>
+        </w:tc>
+        <w:tc>
+          <w:tcPr>
+            <w:tcW w:w="973" w:type="dxa"/>
+          </w:tcPr>
+          <w:p>
+            <w:r>
+              <w:t>38</w:t>
+            </w:r>
+          </w:p>
+        </w:tc>
+      </w:tr>
+      <w:tr>
+        <w:tc>
+          <w:tcPr>
+            <w:tcW w:w="973" w:type="dxa"/>
+          </w:tcPr>
+          <w:p>
+            <w:r>
+              <w:t>Medical</w:t>
+            </w:r>
+          </w:p>
+        </w:tc>
+        <w:tc>
+          <w:tcPr>
+            <w:tcW w:w="973" w:type="dxa"/>
+          </w:tcPr>
+          <w:p>
+            <w:r>
+              <w:t>ROUGE-L</w:t>
+            </w:r>
+          </w:p>
+        </w:tc>
+        <w:tc>
+          <w:tcPr>
+            <w:tcW w:w="973" w:type="dxa"/>
+          </w:tcPr>
+          <w:p>
+            <w:r>
+              <w:t>FlatRAG</w:t>
+            </w:r>
+          </w:p>
+        </w:tc>
+        <w:tc>
+          <w:tcPr>
+            <w:tcW w:w="973" w:type="dxa"/>
+          </w:tcPr>
+          <w:p>
+            <w:r>
+              <w:t>42</w:t>
+            </w:r>
+          </w:p>
+        </w:tc>
+        <w:tc>
+          <w:tcPr>
+            <w:tcW w:w="973" w:type="dxa"/>
+          </w:tcPr>
+          <w:p>
+            <w:r>
+              <w:t>+0.095 [+0.071, +0.115]</w:t>
+            </w:r>
+          </w:p>
+        </w:tc>
+        <w:tc>
+          <w:tcPr>
+            <w:tcW w:w="973" w:type="dxa"/>
+          </w:tcPr>
+          <w:p>
+            <w:r>
+              <w:t>+1.31</w:t>
+            </w:r>
+          </w:p>
+        </w:tc>
+        <w:tc>
+          <w:tcPr>
+            <w:tcW w:w="973" w:type="dxa"/>
+          </w:tcPr>
+          <w:p>
+            <w:r>
+              <w:t>&lt;0.0001</w:t>
+            </w:r>
+          </w:p>
+        </w:tc>
+        <w:tc>
+          <w:tcPr>
+            <w:tcW w:w="973" w:type="dxa"/>
+          </w:tcPr>
+          <w:p>
+            <w:r>
+              <w:t>1.00</w:t>
+            </w:r>
+          </w:p>
+        </w:tc>
+        <w:tc>
+          <w:tcPr>
+            <w:tcW w:w="973" w:type="dxa"/>
+          </w:tcPr>
+          <w:p>
+            <w:r>
+              <w:t>6</w:t>
+            </w:r>
+          </w:p>
+        </w:tc>
+      </w:tr>
+      <w:tr>
+        <w:tc>
+          <w:tcPr>
+            <w:tcW w:w="973" w:type="dxa"/>
+          </w:tcPr>
+          <w:p>
+            <w:r>
+              <w:t>Medical</w:t>
+            </w:r>
+          </w:p>
+        </w:tc>
+        <w:tc>
+          <w:tcPr>
+            <w:tcW w:w="973" w:type="dxa"/>
+          </w:tcPr>
+          <w:p>
+            <w:r>
+              <w:t>ROUGE-L</w:t>
+            </w:r>
+          </w:p>
+        </w:tc>
+        <w:tc>
+          <w:tcPr>
+            <w:tcW w:w="973" w:type="dxa"/>
+          </w:tcPr>
+          <w:p>
+            <w:r>
+              <w:t>RAPTOR</w:t>
+            </w:r>
+          </w:p>
+        </w:tc>
+        <w:tc>
+          <w:tcPr>
+            <w:tcW w:w="973" w:type="dxa"/>
+          </w:tcPr>
+          <w:p>
+            <w:r>
+              <w:t>42</w:t>
+            </w:r>
+          </w:p>
+        </w:tc>
+        <w:tc>
+          <w:tcPr>
+            <w:tcW w:w="973" w:type="dxa"/>
+          </w:tcPr>
+          <w:p>
+            <w:r>
+              <w:t>+0.312 [+0.282, +0.342]</w:t>
+            </w:r>
+          </w:p>
+        </w:tc>
+        <w:tc>
+          <w:tcPr>
+            <w:tcW w:w="973" w:type="dxa"/>
+          </w:tcPr>
+          <w:p>
+            <w:r>
+              <w:t>+3.08</w:t>
+            </w:r>
+          </w:p>
+        </w:tc>
+        <w:tc>
+          <w:tcPr>
+            <w:tcW w:w="973" w:type="dxa"/>
+          </w:tcPr>
+          <w:p>
+            <w:r>
+              <w:t>&lt;0.0001</w:t>
+            </w:r>
+          </w:p>
+        </w:tc>
+        <w:tc>
+          <w:tcPr>
+            <w:tcW w:w="973" w:type="dxa"/>
+          </w:tcPr>
+          <w:p>
+            <w:r>
+              <w:t>1.00</w:t>
+            </w:r>
+          </w:p>
+        </w:tc>
+        <w:tc>
+          <w:tcPr>
+            <w:tcW w:w="973" w:type="dxa"/>
+          </w:tcPr>
+          <w:p>
+            <w:r>
+              <w:t>2</w:t>
+            </w:r>
+          </w:p>
+        </w:tc>
+      </w:tr>
+      <w:tr>
+        <w:tc>
+          <w:tcPr>
+            <w:tcW w:w="973" w:type="dxa"/>
+          </w:tcPr>
+          <w:p>
+            <w:r>
+              <w:t>HotpotQA</w:t>
+            </w:r>
+          </w:p>
+        </w:tc>
+        <w:tc>
+          <w:tcPr>
+            <w:tcW w:w="973" w:type="dxa"/>
+          </w:tcPr>
+          <w:p>
+            <w:r>
+              <w:t>ROUGE-L</w:t>
+            </w:r>
+          </w:p>
+        </w:tc>
+        <w:tc>
+          <w:tcPr>
+            <w:tcW w:w="973" w:type="dxa"/>
+          </w:tcPr>
+          <w:p>
+            <w:r>
+              <w:t>BM25</w:t>
+            </w:r>
+          </w:p>
+        </w:tc>
+        <w:tc>
+          <w:tcPr>
+            <w:tcW w:w="973" w:type="dxa"/>
+          </w:tcPr>
+          <w:p>
+            <w:r>
+              <w:t>100</w:t>
+            </w:r>
+          </w:p>
+        </w:tc>
+        <w:tc>
+          <w:tcPr>
+            <w:tcW w:w="973" w:type="dxa"/>
+          </w:tcPr>
+          <w:p>
+            <w:r>
+              <w:t>−0.057 [−0.100, −0.016]</w:t>
+            </w:r>
+          </w:p>
+        </w:tc>
+        <w:tc>
+          <w:tcPr>
+            <w:tcW w:w="973" w:type="dxa"/>
+          </w:tcPr>
+          <w:p>
+            <w:r>
+              <w:t>−0.26</w:t>
+            </w:r>
+          </w:p>
+        </w:tc>
+        <w:tc>
+          <w:tcPr>
+            <w:tcW w:w="973" w:type="dxa"/>
+          </w:tcPr>
+          <w:p>
+            <w:r>
+              <w:t>0.008</w:t>
+            </w:r>
+          </w:p>
+        </w:tc>
+        <w:tc>
+          <w:tcPr>
+            <w:tcW w:w="973" w:type="dxa"/>
+          </w:tcPr>
+          <w:p>
+            <w:r>
+              <w:t>0.74</w:t>
+            </w:r>
+          </w:p>
+        </w:tc>
+        <w:tc>
+          <w:tcPr>
+            <w:tcW w:w="973" w:type="dxa"/>
+          </w:tcPr>
+          <w:p>
+            <w:r>
+              <w:t>115</w:t>
+            </w:r>
+          </w:p>
+        </w:tc>
+      </w:tr>
+      <w:tr>
+        <w:tc>
+          <w:tcPr>
+            <w:tcW w:w="973" w:type="dxa"/>
+          </w:tcPr>
+          <w:p>
+            <w:r>
+              <w:t>HotpotQA</w:t>
+            </w:r>
+          </w:p>
+        </w:tc>
+        <w:tc>
+          <w:tcPr>
+            <w:tcW w:w="973" w:type="dxa"/>
+          </w:tcPr>
+          <w:p>
+            <w:r>
+              <w:t>ROUGE-L</w:t>
+            </w:r>
+          </w:p>
+        </w:tc>
+        <w:tc>
+          <w:tcPr>
+            <w:tcW w:w="973" w:type="dxa"/>
+          </w:tcPr>
+          <w:p>
+            <w:r>
+              <w:t>Dense</w:t>
+            </w:r>
+          </w:p>
+        </w:tc>
+        <w:tc>
+          <w:tcPr>
+            <w:tcW w:w="973" w:type="dxa"/>
+          </w:tcPr>
+          <w:p>
+            <w:r>
+              <w:t>100</w:t>
+            </w:r>
+          </w:p>
+        </w:tc>
+        <w:tc>
+          <w:tcPr>
+            <w:tcW w:w="973" w:type="dxa"/>
+          </w:tcPr>
+          <w:p>
+            <w:r>
+              <w:t>−0.037 [−0.082, +0.008]</w:t>
+            </w:r>
+          </w:p>
+        </w:tc>
+        <w:tc>
+          <w:tcPr>
+            <w:tcW w:w="973" w:type="dxa"/>
+          </w:tcPr>
+          <w:p>
+            <w:r>
+              <w:t>−0.16</w:t>
+            </w:r>
+          </w:p>
+        </w:tc>
+        <w:tc>
+          <w:tcPr>
+            <w:tcW w:w="973" w:type="dxa"/>
+          </w:tcPr>
+          <w:p>
+            <w:r>
+              <w:t>0.114</w:t>
+            </w:r>
+          </w:p>
+        </w:tc>
+        <w:tc>
+          <w:tcPr>
+            <w:tcW w:w="973" w:type="dxa"/>
+          </w:tcPr>
+          <w:p>
+            <w:r>
+              <w:t>0.35</w:t>
+            </w:r>
+          </w:p>
+        </w:tc>
+        <w:tc>
+          <w:tcPr>
+            <w:tcW w:w="973" w:type="dxa"/>
+          </w:tcPr>
+          <w:p>
+            <w:r>
+              <w:t>308</w:t>
+            </w:r>
+          </w:p>
+        </w:tc>
+      </w:tr>
+      <w:tr>
+        <w:tc>
+          <w:tcPr>
+            <w:tcW w:w="973" w:type="dxa"/>
+          </w:tcPr>
+          <w:p>
+            <w:r>
+              <w:lastRenderedPageBreak/>
+              <w:t>HotpotQA</w:t>
+            </w:r>
+          </w:p>
+        </w:tc>
+        <w:tc>
+          <w:tcPr>
+            <w:tcW w:w="973" w:type="dxa"/>
+          </w:tcPr>
+          <w:p>
+            <w:r>
+              <w:t>ROUGE-L</w:t>
+            </w:r>
+          </w:p>
+        </w:tc>
+        <w:tc>
+          <w:tcPr>
+            <w:tcW w:w="973" w:type="dxa"/>
+          </w:tcPr>
+          <w:p>
+            <w:r>
+              <w:t>FlatRAG</w:t>
+            </w:r>
+          </w:p>
+        </w:tc>
+        <w:tc>
+          <w:tcPr>
+            <w:tcW w:w="973" w:type="dxa"/>
+          </w:tcPr>
+          <w:p>
+            <w:r>
+              <w:t>100</w:t>
+            </w:r>
+          </w:p>
+        </w:tc>
+        <w:tc>
+          <w:tcPr>
+            <w:tcW w:w="973" w:type="dxa"/>
+          </w:tcPr>
+          <w:p>
+            <w:r>
+              <w:t>−0.032 [−0.071, +0.005]</w:t>
+            </w:r>
+          </w:p>
+        </w:tc>
+        <w:tc>
+          <w:tcPr>
+            <w:tcW w:w="973" w:type="dxa"/>
+          </w:tcPr>
+          <w:p>
+            <w:r>
+              <w:t>−0.17</w:t>
+            </w:r>
+          </w:p>
+        </w:tc>
+        <w:tc>
+          <w:tcPr>
+            <w:tcW w:w="973" w:type="dxa"/>
+          </w:tcPr>
+          <w:p>
+            <w:r>
+              <w:t>0.097</w:t>
+            </w:r>
+          </w:p>
+        </w:tc>
+        <w:tc>
+          <w:tcPr>
+            <w:tcW w:w="973" w:type="dxa"/>
+          </w:tcPr>
+          <w:p>
+            <w:r>
+              <w:t>0.38</w:t>
+            </w:r>
+          </w:p>
+        </w:tc>
+        <w:tc>
+          <w:tcPr>
+            <w:tcW w:w="973" w:type="dxa"/>
+          </w:tcPr>
+          <w:p>
+            <w:r>
+              <w:t>280</w:t>
+            </w:r>
+          </w:p>
+        </w:tc>
+      </w:tr>
+      <w:tr>
+        <w:tc>
+          <w:tcPr>
+            <w:tcW w:w="973" w:type="dxa"/>
+          </w:tcPr>
+          <w:p>
+            <w:r>
+              <w:t>HotpotQA</w:t>
+            </w:r>
+          </w:p>
+        </w:tc>
+        <w:tc>
+          <w:tcPr>
+            <w:tcW w:w="973" w:type="dxa"/>
+          </w:tcPr>
+          <w:p>
+            <w:r>
+              <w:t>ROUGE-L</w:t>
+            </w:r>
+          </w:p>
+        </w:tc>
+        <w:tc>
+          <w:tcPr>
+            <w:tcW w:w="973" w:type="dxa"/>
+          </w:tcPr>
+          <w:p>
+            <w:r>
+              <w:t>RAPTOR</w:t>
+            </w:r>
+          </w:p>
+        </w:tc>
+        <w:tc>
+          <w:tcPr>
+            <w:tcW w:w="973" w:type="dxa"/>
+          </w:tcPr>
+          <w:p>
+            <w:r>
+              <w:t>100</w:t>
+            </w:r>
+          </w:p>
+        </w:tc>
+        <w:tc>
+          <w:tcPr>
+            <w:tcW w:w="973" w:type="dxa"/>
+          </w:tcPr>
+          <w:p>
+            <w:r>
+              <w:t>−0.021 [−0.059, +0.014]</w:t>
+            </w:r>
+          </w:p>
+        </w:tc>
+        <w:tc>
+          <w:tcPr>
+            <w:tcW w:w="973" w:type="dxa"/>
+          </w:tcPr>
+          <w:p>
+            <w:r>
+              <w:t>−0.11</w:t>
+            </w:r>
+          </w:p>
+        </w:tc>
+        <w:tc>
+          <w:tcPr>
+            <w:tcW w:w="973" w:type="dxa"/>
+          </w:tcPr>
+          <w:p>
+            <w:r>
+              <w:t>0.271</w:t>
+            </w:r>
+          </w:p>
+        </w:tc>
+        <w:tc>
+          <w:tcPr>
+            <w:tcW w:w="973" w:type="dxa"/>
+          </w:tcPr>
+          <w:p>
+            <w:r>
+              <w:t>0.20</w:t>
+            </w:r>
+          </w:p>
+        </w:tc>
+        <w:tc>
+          <w:tcPr>
+            <w:tcW w:w="973" w:type="dxa"/>
+          </w:tcPr>
+          <w:p>
+            <w:r>
+              <w:t>607</w:t>
+            </w:r>
+          </w:p>
+        </w:tc>
+      </w:tr>
+      <w:tr>
+        <w:tc>
+          <w:tcPr>
+            <w:tcW w:w="973" w:type="dxa"/>
+          </w:tcPr>
+          <w:p>
+            <w:r>
+              <w:t>HotpotQA</w:t>
+            </w:r>
+          </w:p>
+        </w:tc>
+        <w:tc>
+          <w:tcPr>
+            <w:tcW w:w="973" w:type="dxa"/>
+          </w:tcPr>
+          <w:p>
+            <w:r>
+              <w:t>LLM-Judge</w:t>
+            </w:r>
+          </w:p>
+        </w:tc>
+        <w:tc>
+          <w:tcPr>
+            <w:tcW w:w="973" w:type="dxa"/>
+          </w:tcPr>
+          <w:p>
+            <w:r>
+              <w:t>BM25</w:t>
+            </w:r>
+          </w:p>
+        </w:tc>
+        <w:tc>
+          <w:tcPr>
+            <w:tcW w:w="973" w:type="dxa"/>
+          </w:tcPr>
+          <w:p>
+            <w:r>
+              <w:t>100</w:t>
+            </w:r>
+          </w:p>
+        </w:tc>
+        <w:tc>
+          <w:tcPr>
+            <w:tcW w:w="973" w:type="dxa"/>
+          </w:tcPr>
+          <w:p>
+            <w:r>
+              <w:t>+0.075 [+0.022, +0.127]</w:t>
+            </w:r>
+          </w:p>
+        </w:tc>
+        <w:tc>
+          <w:tcPr>
+            <w:tcW w:w="973" w:type="dxa"/>
+          </w:tcPr>
+          <w:p>
+            <w:r>
+              <w:t>+0.28</w:t>
+            </w:r>
+          </w:p>
+        </w:tc>
+        <w:tc>
+          <w:tcPr>
+            <w:tcW w:w="973" w:type="dxa"/>
+          </w:tcPr>
+          <w:p>
+            <w:r>
+              <w:t>0.008</w:t>
+            </w:r>
+          </w:p>
+        </w:tc>
+        <w:tc>
+          <w:tcPr>
+            <w:tcW w:w="973" w:type="dxa"/>
+          </w:tcPr>
+          <w:p>
+            <w:r>
+              <w:t>0.79</w:t>
+            </w:r>
+          </w:p>
+        </w:tc>
+        <w:tc>
+          <w:tcPr>
+            <w:tcW w:w="973" w:type="dxa"/>
+          </w:tcPr>
+          <w:p>
+            <w:r>
+              <w:t>103</w:t>
+            </w:r>
+          </w:p>
+        </w:tc>
+      </w:tr>
+      <w:tr>
+        <w:tc>
+          <w:tcPr>
+            <w:tcW w:w="973" w:type="dxa"/>
+          </w:tcPr>
+          <w:p>
+            <w:r>
+              <w:t>HotpotQA</w:t>
+            </w:r>
+          </w:p>
+        </w:tc>
+        <w:tc>
+          <w:tcPr>
+            <w:tcW w:w="973" w:type="dxa"/>
+          </w:tcPr>
+          <w:p>
+            <w:r>
+              <w:t>LLM-Judge</w:t>
+            </w:r>
+          </w:p>
+        </w:tc>
+        <w:tc>
+          <w:tcPr>
+            <w:tcW w:w="973" w:type="dxa"/>
+          </w:tcPr>
+          <w:p>
+            <w:r>
+              <w:t>Dense</w:t>
+            </w:r>
+          </w:p>
+        </w:tc>
+        <w:tc>
+          <w:tcPr>
+            <w:tcW w:w="973" w:type="dxa"/>
+          </w:tcPr>
+          <w:p>
+            <w:r>
+              <w:t>100</w:t>
+            </w:r>
+          </w:p>
+        </w:tc>
+        <w:tc>
+          <w:tcPr>
+            <w:tcW w:w="973" w:type="dxa"/>
+          </w:tcPr>
+          <w:p>
+            <w:r>
+              <w:t>+0.051 [−0.001, +0.103]</w:t>
+            </w:r>
+          </w:p>
+        </w:tc>
+        <w:tc>
+          <w:tcPr>
+            <w:tcW w:w="973" w:type="dxa"/>
+          </w:tcPr>
+          <w:p>
+            <w:r>
+              <w:t>+0.19</w:t>
+            </w:r>
+          </w:p>
+        </w:tc>
+        <w:tc>
+          <w:tcPr>
+            <w:tcW w:w="973" w:type="dxa"/>
+          </w:tcPr>
+          <w:p>
+            <w:r>
+              <w:t>0.061</w:t>
+            </w:r>
+          </w:p>
+        </w:tc>
+        <w:tc>
+          <w:tcPr>
+            <w:tcW w:w="973" w:type="dxa"/>
+          </w:tcPr>
+          <w:p>
+            <w:r>
+              <w:t>0.47</w:t>
+            </w:r>
+          </w:p>
+        </w:tc>
+        <w:tc>
+          <w:tcPr>
+            <w:tcW w:w="973" w:type="dxa"/>
+          </w:tcPr>
+          <w:p>
+            <w:r>
+              <w:t>220</w:t>
+            </w:r>
+          </w:p>
+        </w:tc>
+      </w:tr>
+      <w:tr>
+        <w:tc>
+          <w:tcPr>
+            <w:tcW w:w="973" w:type="dxa"/>
+          </w:tcPr>
+          <w:p>
+            <w:r>
+              <w:t>HotpotQA</w:t>
+            </w:r>
+          </w:p>
+        </w:tc>
+        <w:tc>
+          <w:tcPr>
+            <w:tcW w:w="973" w:type="dxa"/>
+          </w:tcPr>
+          <w:p>
+            <w:r>
+              <w:t>LLM-Judge</w:t>
+            </w:r>
+          </w:p>
+        </w:tc>
+        <w:tc>
+          <w:tcPr>
+            <w:tcW w:w="973" w:type="dxa"/>
+          </w:tcPr>
+          <w:p>
+            <w:r>
+              <w:t>FlatRAG</w:t>
+            </w:r>
+          </w:p>
+        </w:tc>
+        <w:tc>
+          <w:tcPr>
+            <w:tcW w:w="973" w:type="dxa"/>
+          </w:tcPr>
+          <w:p>
+            <w:r>
+              <w:t>100</w:t>
+            </w:r>
+          </w:p>
+        </w:tc>
+        <w:tc>
+          <w:tcPr>
+            <w:tcW w:w="973" w:type="dxa"/>
+          </w:tcPr>
+          <w:p>
+            <w:r>
+              <w:t>+0.035 [−0.013, +0.085]</w:t>
+            </w:r>
+          </w:p>
+        </w:tc>
+        <w:tc>
+          <w:tcPr>
+            <w:tcW w:w="973" w:type="dxa"/>
+          </w:tcPr>
+          <w:p>
+            <w:r>
+              <w:t>+0.14</w:t>
+            </w:r>
+          </w:p>
+        </w:tc>
+        <w:tc>
+          <w:tcPr>
+            <w:tcW w:w="973" w:type="dxa"/>
+          </w:tcPr>
+          <w:p>
+            <w:r>
+              <w:t>0.179</w:t>
+            </w:r>
+          </w:p>
+        </w:tc>
+        <w:tc>
+          <w:tcPr>
+            <w:tcW w:w="973" w:type="dxa"/>
+          </w:tcPr>
+          <w:p>
+            <w:r>
+              <w:t>0.28</w:t>
+            </w:r>
+          </w:p>
+        </w:tc>
+        <w:tc>
+          <w:tcPr>
+            <w:tcW w:w="973" w:type="dxa"/>
+          </w:tcPr>
+          <w:p>
+            <w:r>
+              <w:t>415</w:t>
+            </w:r>
+          </w:p>
+        </w:tc>
+      </w:tr>
+      <w:tr>
+        <w:tc>
+          <w:tcPr>
+            <w:tcW w:w="973" w:type="dxa"/>
+          </w:tcPr>
+          <w:p>
+            <w:r>
+              <w:t>HotpotQA</w:t>
+            </w:r>
+          </w:p>
+        </w:tc>
+        <w:tc>
+          <w:tcPr>
+            <w:tcW w:w="973" w:type="dxa"/>
+          </w:tcPr>
+          <w:p>
+            <w:r>
+              <w:t>LLM-Judge</w:t>
+            </w:r>
+          </w:p>
+        </w:tc>
+        <w:tc>
+          <w:tcPr>
+            <w:tcW w:w="973" w:type="dxa"/>
+          </w:tcPr>
+          <w:p>
+            <w:r>
+              <w:t>RAPTOR</w:t>
+            </w:r>
+          </w:p>
+        </w:tc>
+        <w:tc>
+          <w:tcPr>
+            <w:tcW w:w="973" w:type="dxa"/>
+          </w:tcPr>
+          <w:p>
+            <w:r>
+              <w:t>100</w:t>
+            </w:r>
+          </w:p>
+        </w:tc>
+        <w:tc>
+          <w:tcPr>
+            <w:tcW w:w="973" w:type="dxa"/>
+          </w:tcPr>
+          <w:p>
+            <w:r>
+              <w:t>+0.064 [+0.007, +0.121]</w:t>
+            </w:r>
+          </w:p>
+        </w:tc>
+        <w:tc>
+          <w:tcPr>
+            <w:tcW w:w="973" w:type="dxa"/>
+          </w:tcPr>
+          <w:p>
+            <w:r>
+              <w:t>+0.22</w:t>
+            </w:r>
+          </w:p>
+        </w:tc>
+        <w:tc>
+          <w:tcPr>
+            <w:tcW w:w="973" w:type="dxa"/>
+          </w:tcPr>
+          <w:p>
+            <w:r>
+              <w:t>0.032</w:t>
+            </w:r>
+          </w:p>
+        </w:tc>
+        <w:tc>
+          <w:tcPr>
+            <w:tcW w:w="973" w:type="dxa"/>
+          </w:tcPr>
+          <w:p>
+            <w:r>
+              <w:t>0.59</w:t>
+            </w:r>
+          </w:p>
+        </w:tc>
+        <w:tc>
+          <w:tcPr>
+            <w:tcW w:w="973" w:type="dxa"/>
+          </w:tcPr>
+          <w:p>
+            <w:r>
+              <w:t>164</w:t>
+            </w:r>
+          </w:p>
+        </w:tc>
+      </w:tr>
+    </w:tbl>
+    <w:p>
+      <w:pPr>
+        <w:pStyle w:val="PostHeadPara"/>
+      </w:pPr>
+      <w:r>
+        <w:t>The analysis shows where the advantage is genuine and adequately powered and where it is not. On the general benchmark every comparison has power ≈ 1.0 and needs only n ≈ 7–22 paired items for 80% power, so those samples are not a threat to validity. Conversely, medical vs. BM25 (Δ = +0.007, p_perm = 0.63) and the HotpotQA LLM-Judge comparisons against Dense and FlatRAG remain underpowered (n₈₀ = 220 and 415), and we do not claim them as wins. The HotpotQA rows also make the metric dependence explicit: flat baselines lead on ROUGE-L, while on LLM-Judge PageTree-RAG (DFS) beats BM25 (Δ = +0.075, p_perm = 0.008) and RAPTOR (Δ = +0.064, p_perm = 0.032) with adequate power.</w:t>
+      </w:r>
+    </w:p>
+    <w:p>
+      <w:pPr>
         <w:pStyle w:val="Head1"/>
       </w:pPr>
       <w:r>
@@ -7493,7 +9190,11 @@
         <w:pStyle w:val="PostHeadPara"/>
       </w:pPr>
       <w:r>
-        <w:t>Our results draw a sharp line between two kinds of benefit that hierarchical retrieval is often assumed to deliver together. The first-page-level provenance and a compact, structurally coherent context-is real and survives fair evaluation: PageTree-RAG (Beam) cites the right sections most accurately (Table 9) and reaches the highest judged quality on an order of magnitude fewer context tokens (Table 8). These follow directly from the representation: each node carries a page range, and selecting a relevant subtree yields a small, on-topic context rather than a scattering of chunks. The second supposed benefit-higher lexical overlap with reference answers-does not survive: once every system generates fluent text with the same LLM, the section boundary confers no advantage in n-gram overlap, and a hybrid flat retriever (FlatRAG) actually scores higher on ROUGE-L. In short, structure buys verifiability and efficiency, not surface-string similarity, and earlier hierarchical-RAG results that claimed large ROUGE-L gains likely measured an evaluation artifact rather than a retrieval improvement.</w:t>
+        <w:t xml:space="preserve">Our results draw a sharp line between two kinds of benefit that hierarchical retrieval is often assumed to deliver together. The first-page-level provenance and a compact, structurally coherent context-is real and survives fair evaluation: PageTree-RAG (Beam) cites the right sections most accurately (Table 9) and reaches the highest judged quality on an order of magnitude fewer context tokens (Table 8). These follow directly from the representation: each node carries a page range, and selecting a relevant subtree yields a small, on-topic context rather than a scattering of chunks. The second supposed benefit-higher lexical overlap with reference answers-does not survive: once every system generates fluent text with the same LLM, the section boundary confers no advantage in n-gram overlap, and a hybrid flat retriever (FlatRAG) actually scores higher on ROUGE-L. In short, structure buys verifiability and efficiency, not surface-string similarity, and earlier </w:t>
+      </w:r>
+      <w:r>
+        <w:lastRenderedPageBreak/>
+        <w:t>hierarchical-RAG results that claimed large ROUGE-L gains likely measured an evaluation artifact rather than a retrieval improvement.</w:t>
       </w:r>
     </w:p>
     <w:p>
@@ -7533,10 +9234,7 @@
         <w:pStyle w:val="PostHeadPara"/>
       </w:pPr>
       <w:r>
-        <w:t xml:space="preserve">Several caveats bound our conclusions. Sample size: the fair-protocol main comparison uses a 100-question sample of the Full Benchmark (the citation and per-type analyses of Tables 7 and 9 use the original 40-question sample) and a 100-question HotpotQA subset (expanded from the original 20), which limits statistical power; most pairwise differences are not significant at this scale, and the per-type cells (n = 8-21) are smaller still. Single generator and judge: all generative results use one local model (Llama 3.1 8B) for both answer generation and LLM-as-Judge, so judge scores could carry </w:t>
-      </w:r>
-      <w:r>
-        <w:t>model-specific preferences; because every answer under comparison is produced by that same model, this is not a per-system self-preference, but to probe this we re-scored the 100-question fair set with a second, independent local judge (Qwen2.5-7B): the two judges' system rankings are positively correlated (Spearman ρ = 0.60; not significant at n = 6 systems, p = 0.21), and both rank RAPTOR lowest and PageTree-RAG (Beam) in the top two, indicating our conclusions are not an artifact of a single judge—though some mid-rank reordering (notably FlatRAG) shows judge choice does shift absolute positions. Corroboration with a hosted frontier judge remains valuable future work. Citation metric: Citation F1 is computed against gold supporting sections and rewards systems that emit section/page identifiers; it measures provenance fidelity, not answer correctness. Generator scale: an 8B local model is weaker than hosted frontier models, and absolute scores would likely rise with a stronger generator, though we have no evidence the relative ordering would change. Larger-sample, multi-model replication is the primary item of future work.</w:t>
+        <w:t>Several caveats bound our conclusions. Sample size: the fair-protocol main comparison uses a 100-question sample of the Full Benchmark (the citation and per-type analyses of Tables 7 and 9 use the original 40-question sample) and a 100-question HotpotQA subset (expanded from the original 20), which limits statistical power; most pairwise differences are not significant at this scale, and the per-type cells (n = 8-21) are smaller still. Single generator and judge: all generative results use one local model (Llama 3.1 8B) for both answer generation and LLM-as-Judge, so judge scores could carry model-specific preferences; because every answer under comparison is produced by that same model, this is not a per-system self-preference, but to probe this we re-scored the 100-question fair set with a second, independent local judge (Qwen2.5-7B): the two judges' system rankings are positively correlated (Spearman ρ = 0.60; not significant at n = 6 systems, p = 0.21), and both rank RAPTOR lowest and PageTree-RAG (Beam) in the top two, indicating our conclusions are not an artifact of a single judge—though some mid-rank reordering (notably FlatRAG) shows judge choice does shift absolute positions. Corroboration with a hosted frontier judge remains valuable future work. Citation metric: Citation F1 is computed against gold supporting sections and rewards systems that emit section/page identifiers; it measures provenance fidelity, not answer correctness. Generator scale: an 8B local model is weaker than hosted frontier models, and absolute scores would likely rise with a stronger generator, though we have no evidence the relative ordering would change. Larger-sample, multi-model replication is the primary item of future work.</w:t>
       </w:r>
     </w:p>
     <w:p>
@@ -7552,7 +9250,11 @@
         <w:pStyle w:val="PostHeadPara"/>
       </w:pPr>
       <w:r>
-        <w:t>Beyond the evaluation caveats of Section 6.3, the system has three engineering limitations. LLM dependency: indexing requires an LLM call per document, and traversal issues several LLM calls for node scoring, which is the source of PageTree-RAG's higher query latency. Structural prompt brittleness: documents with inconsistent heading styles (for example scanned PDFs with OCR artifacts) may yield malformed index trees requiring manual correction. Learned scoring: we attempted learned node scoring via DSPy [15] with an open 70B model; optimization yielded no improvement (0.0% gain), likely due to insufficient training signal (fewer than 100 labeled examples), and we exclude this component from the main system.</w:t>
+        <w:t xml:space="preserve">Beyond the evaluation caveats of Section 6.3, the system has three engineering limitations. LLM dependency: indexing requires an LLM call per document, and traversal issues several LLM calls for node scoring, which is the source of PageTree-RAG's higher query latency. Structural prompt brittleness: documents with inconsistent heading styles (for example scanned PDFs with OCR artifacts) may yield malformed index trees requiring manual correction. Learned scoring: we attempted learned node scoring via DSPy [15] with an open 70B model; optimization yielded no improvement (0.0% gain), likely due to insufficient training signal (fewer than 100 labeled examples), and we exclude this component from </w:t>
+      </w:r>
+      <w:r>
+        <w:lastRenderedPageBreak/>
+        <w:t>the main system. Score feature design: the relevance function uses three interpretable signals (semantic, keyword, structural); richer scorers—BM25 term weighting, cross-encoder rerankers, or a fully learned scorer—are a natural extension we leave to future work. Detector signals: the hallucination detector currently relies on lexical and citation overlap, so it inherits the limits of surface-level matching; adding a semantic embedding-similarity signal would strengthen it and is a straightforward future improvement.</w:t>
       </w:r>
     </w:p>
     <w:p>
@@ -7573,6 +9275,22 @@
     </w:p>
     <w:p>
       <w:pPr>
+        <w:pStyle w:val="Head2"/>
+      </w:pPr>
+      <w:r>
+        <w:t>Reproducibility</w:t>
+      </w:r>
+    </w:p>
+    <w:p>
+      <w:pPr>
+        <w:pStyle w:val="PostHeadPara"/>
+      </w:pPr>
+      <w:r>
+        <w:t>To support replication we release the full pipeline: the PDF-to-tree indexer, the traversal-policy and compression code, all four evaluation sets (Full Benchmark, HotpotQA, Medical, and GovReport), the offline extractive and fair generative harnesses, the LLM-as-Judge prompts, and the page-indexed JSON tree schema. All generative results use a single local model, Llama 3.1 8B served via Ollama, for both answer generation and judging; the independent-judge cross-check uses Qwen2.5-7B. Every run fixes the random seed to 42, and no GPU cluster is required—the system runs on a single commodity machine with a local 8B model. Prompts, hyperparameter defaults (traversal weights, beam width W = 5, tree depth, compression threshold τ = 0.7), and per-question outputs are included so that all tables and figures can be regenerated end-to-end.</w:t>
+      </w:r>
+    </w:p>
+    <w:p>
+      <w:pPr>
         <w:pStyle w:val="Head1"/>
       </w:pPr>
       <w:r>
@@ -7584,7 +9302,7 @@
         <w:pStyle w:val="PostHeadPara"/>
       </w:pPr>
       <w:r>
-        <w:t>We presented PageTree-RAG, a hierarchical document RAG system that indexes PDFs into page-referenced JSON trees using zero-shot LLM prompting, traverses them with DFS or Beam Search, compresses retrieved context, and validates generated answers with a lightweight five-signal hallucination detector. Evaluating all systems under a fair protocol in which only the retriever differs and a shared local LLM (Llama 3.1 8B) generates every answer, we found that PageTree-RAG (Beam) produces the most accurate page-level citations (citation F1 = 0.757 vs. 0.000 for the abstractive RAPTOR baseline), the highest LLM-judged answer quality on multi-hop and comparative questions (0.818 and 0.850; multi-hop advantage over Dense Retrieval significant at p = 0.044), and competitive overall quality (highest LLM-Judge, 0.823) while feeding an order of magnitude fewer context tokens to the generator-at the cost of higher per-query latency. Just as importantly, we showed that offline extractive evaluation and lexical-overlap metrics reverse these conclusions and overstate flat retrieval, and we reported both regimes so that the discrepancy is explicit; we encourage future hierarchical-RAG work to adopt generator-controlled evaluation and to measure citation and efficiency directly. The system also provides domain-adaptive prompting, multilingual support, and a production-ready API with caching, rate limiting, and asynchronous task queuing. Future work will pursue (1) larger-sample, multi-model replication of the fair protocol; (2) Graph RAG integration [3] for inter-document relationship modeling; (3) multi-modal indexing for figures and tables; and (4) active learning for traversal-policy optimization from user-feedback signals.</w:t>
+        <w:t>We presented PageTree-RAG, a hierarchical document RAG system that indexes PDFs into page-referenced JSON trees using zero-shot LLM prompting, traverses them with DFS or Beam Search, compresses retrieved context, and validates generated answers with a lightweight five-signal hallucination detector. Evaluating all systems under a fair protocol in which only the retriever differs and a shared local LLM (Llama 3.1 8B) generates every answer, we found that PageTree-RAG (Beam) produces the most accurate page-level citations (citation F1 = 0.757 vs. 0.000 for the abstractive RAPTOR baseline), the highest LLM-judged answer quality on multi-hop and comparative questions (0.818 and 0.850; multi-hop advantage over Dense Retrieval significant at p = 0.044), and competitive overall quality (highest LLM-Judge, 0.823) while feeding an order of magnitude fewer context tokens to the generator-at the cost of higher per-query latency. Just as importantly, we showed that offline extractive evaluation and lexical-overlap metrics reverse these conclusions and overstate flat retrieval, and we reported both regimes so that the discrepancy is explicit; we encourage future hierarchical-RAG work to adopt generator-controlled evaluation and to measure citation and efficiency directly. The system also provides domain-adaptive prompting, multilingual support, and a production-ready API with caching, rate limiting, and asynchronous task queuing. Future work will pursue (1) larger-sample, multi-model replication of the fair protocol; (2) Graph RAG integration [3] for inter-document relationship modeling; (3) multi-modal indexing for figures and tables; and (4) learning the adaptive traversal policy end-to-end from user-feedback signals, together with cross-document reasoning and multi-modal indexing.</w:t>
       </w:r>
     </w:p>
     <w:p>

</xml_diff>

<commit_message>
Enhance hallucination detection with semantic scoring and add evaluation script for detector performance comparison
</commit_message>
<xml_diff>
--- a/TreeRAG_TIST_ACM.docx
+++ b/TreeRAG_TIST_ACM.docx
@@ -323,7 +323,6 @@
       <w:pPr>
         <w:pStyle w:val="PostHeadPara"/>
         <w:rPr>
-          <w:rFonts w:hint="eastAsia"/>
           <w:lang w:eastAsia="ko-KR"/>
         </w:rPr>
       </w:pPr>
@@ -3655,6 +3654,18 @@
         <w:br/>
       </w:r>
       <w:r>
+        <w:rPr>
+          <w:lang w:eastAsia="ko-KR"/>
+        </w:rPr>
+        <w:br/>
+      </w:r>
+      <w:r>
+        <w:rPr>
+          <w:lang w:eastAsia="ko-KR"/>
+        </w:rPr>
+        <w:br/>
+      </w:r>
+      <w:r>
         <w:lastRenderedPageBreak/>
         <w:t>Table 6: Hyperparameter sensitivity of PageTree-RAG (Beam) under the fair generative protocol (n = 50, seed 42; LLM-Judge by llama3.1:8b). One factor is varied at a time; the default setting is shown in bold.</w:t>
       </w:r>
@@ -7584,18 +7595,26 @@
     <w:tbl>
       <w:tblPr>
         <w:tblW w:w="0" w:type="auto"/>
+        <w:tblBorders>
+          <w:top w:val="single" w:sz="4" w:space="0" w:color="999999"/>
+          <w:left w:val="single" w:sz="4" w:space="0" w:color="999999"/>
+          <w:bottom w:val="single" w:sz="4" w:space="0" w:color="999999"/>
+          <w:right w:val="single" w:sz="4" w:space="0" w:color="999999"/>
+          <w:insideH w:val="single" w:sz="4" w:space="0" w:color="999999"/>
+          <w:insideV w:val="single" w:sz="4" w:space="0" w:color="999999"/>
+        </w:tblBorders>
         <w:tblLook w:val="04A0" w:firstRow="1" w:lastRow="0" w:firstColumn="1" w:lastColumn="0" w:noHBand="0" w:noVBand="1"/>
       </w:tblPr>
       <w:tblGrid>
-        <w:gridCol w:w="1250"/>
-        <w:gridCol w:w="965"/>
-        <w:gridCol w:w="979"/>
-        <w:gridCol w:w="879"/>
-        <w:gridCol w:w="968"/>
-        <w:gridCol w:w="915"/>
-        <w:gridCol w:w="965"/>
-        <w:gridCol w:w="935"/>
-        <w:gridCol w:w="904"/>
+        <w:gridCol w:w="1256"/>
+        <w:gridCol w:w="1061"/>
+        <w:gridCol w:w="1088"/>
+        <w:gridCol w:w="789"/>
+        <w:gridCol w:w="929"/>
+        <w:gridCol w:w="876"/>
+        <w:gridCol w:w="990"/>
+        <w:gridCol w:w="919"/>
+        <w:gridCol w:w="842"/>
       </w:tblGrid>
       <w:tr>
         <w:tc>
@@ -7603,6 +7622,12 @@
             <w:tcW w:w="973" w:type="dxa"/>
           </w:tcPr>
           <w:p>
+            <w:pPr>
+              <w:pStyle w:val="TableCell"/>
+              <w:rPr>
+                <w:b/>
+              </w:rPr>
+            </w:pPr>
             <w:r>
               <w:rPr>
                 <w:b/>
@@ -7616,6 +7641,12 @@
             <w:tcW w:w="973" w:type="dxa"/>
           </w:tcPr>
           <w:p>
+            <w:pPr>
+              <w:pStyle w:val="TableCell"/>
+              <w:rPr>
+                <w:b/>
+              </w:rPr>
+            </w:pPr>
             <w:r>
               <w:rPr>
                 <w:b/>
@@ -7629,6 +7660,12 @@
             <w:tcW w:w="973" w:type="dxa"/>
           </w:tcPr>
           <w:p>
+            <w:pPr>
+              <w:pStyle w:val="TableCell"/>
+              <w:rPr>
+                <w:b/>
+              </w:rPr>
+            </w:pPr>
             <w:r>
               <w:rPr>
                 <w:b/>
@@ -7642,6 +7679,12 @@
             <w:tcW w:w="973" w:type="dxa"/>
           </w:tcPr>
           <w:p>
+            <w:pPr>
+              <w:pStyle w:val="TableCell"/>
+              <w:rPr>
+                <w:b/>
+              </w:rPr>
+            </w:pPr>
             <w:r>
               <w:rPr>
                 <w:b/>
@@ -7655,6 +7698,12 @@
             <w:tcW w:w="973" w:type="dxa"/>
           </w:tcPr>
           <w:p>
+            <w:pPr>
+              <w:pStyle w:val="TableCell"/>
+              <w:rPr>
+                <w:b/>
+              </w:rPr>
+            </w:pPr>
             <w:r>
               <w:rPr>
                 <w:b/>
@@ -7668,6 +7717,12 @@
             <w:tcW w:w="973" w:type="dxa"/>
           </w:tcPr>
           <w:p>
+            <w:pPr>
+              <w:pStyle w:val="TableCell"/>
+              <w:rPr>
+                <w:b/>
+              </w:rPr>
+            </w:pPr>
             <w:r>
               <w:rPr>
                 <w:b/>
@@ -7681,6 +7736,12 @@
             <w:tcW w:w="973" w:type="dxa"/>
           </w:tcPr>
           <w:p>
+            <w:pPr>
+              <w:pStyle w:val="TableCell"/>
+              <w:rPr>
+                <w:b/>
+              </w:rPr>
+            </w:pPr>
             <w:r>
               <w:rPr>
                 <w:b/>
@@ -7694,6 +7755,12 @@
             <w:tcW w:w="973" w:type="dxa"/>
           </w:tcPr>
           <w:p>
+            <w:pPr>
+              <w:pStyle w:val="TableCell"/>
+              <w:rPr>
+                <w:b/>
+              </w:rPr>
+            </w:pPr>
             <w:r>
               <w:rPr>
                 <w:b/>
@@ -7707,6 +7774,12 @@
             <w:tcW w:w="973" w:type="dxa"/>
           </w:tcPr>
           <w:p>
+            <w:pPr>
+              <w:pStyle w:val="TableCell"/>
+              <w:rPr>
+                <w:b/>
+              </w:rPr>
+            </w:pPr>
             <w:r>
               <w:rPr>
                 <w:b/>
@@ -7722,6 +7795,128 @@
             <w:tcW w:w="973" w:type="dxa"/>
           </w:tcPr>
           <w:p>
+            <w:pPr>
+              <w:pStyle w:val="TableCell"/>
+            </w:pPr>
+            <w:r>
+              <w:t>General</w:t>
+            </w:r>
+          </w:p>
+        </w:tc>
+        <w:tc>
+          <w:tcPr>
+            <w:tcW w:w="973" w:type="dxa"/>
+          </w:tcPr>
+          <w:p>
+            <w:pPr>
+              <w:pStyle w:val="TableCell"/>
+            </w:pPr>
+            <w:r>
+              <w:t>ROUGE-L</w:t>
+            </w:r>
+          </w:p>
+        </w:tc>
+        <w:tc>
+          <w:tcPr>
+            <w:tcW w:w="973" w:type="dxa"/>
+          </w:tcPr>
+          <w:p>
+            <w:pPr>
+              <w:pStyle w:val="TableCell"/>
+            </w:pPr>
+            <w:r>
+              <w:t>BM25</w:t>
+            </w:r>
+          </w:p>
+        </w:tc>
+        <w:tc>
+          <w:tcPr>
+            <w:tcW w:w="973" w:type="dxa"/>
+          </w:tcPr>
+          <w:p>
+            <w:pPr>
+              <w:pStyle w:val="TableCell"/>
+            </w:pPr>
+            <w:r>
+              <w:t>204</w:t>
+            </w:r>
+          </w:p>
+        </w:tc>
+        <w:tc>
+          <w:tcPr>
+            <w:tcW w:w="973" w:type="dxa"/>
+          </w:tcPr>
+          <w:p>
+            <w:pPr>
+              <w:pStyle w:val="TableCell"/>
+            </w:pPr>
+            <w:r>
+              <w:t>+0.128 [+0.100, +0.156]</w:t>
+            </w:r>
+          </w:p>
+        </w:tc>
+        <w:tc>
+          <w:tcPr>
+            <w:tcW w:w="973" w:type="dxa"/>
+          </w:tcPr>
+          <w:p>
+            <w:pPr>
+              <w:pStyle w:val="TableCell"/>
+            </w:pPr>
+            <w:r>
+              <w:t>+0.62</w:t>
+            </w:r>
+          </w:p>
+        </w:tc>
+        <w:tc>
+          <w:tcPr>
+            <w:tcW w:w="973" w:type="dxa"/>
+          </w:tcPr>
+          <w:p>
+            <w:pPr>
+              <w:pStyle w:val="TableCell"/>
+            </w:pPr>
+            <w:r>
+              <w:t>&lt;0.0001</w:t>
+            </w:r>
+          </w:p>
+        </w:tc>
+        <w:tc>
+          <w:tcPr>
+            <w:tcW w:w="973" w:type="dxa"/>
+          </w:tcPr>
+          <w:p>
+            <w:pPr>
+              <w:pStyle w:val="TableCell"/>
+            </w:pPr>
+            <w:r>
+              <w:t>1.00</w:t>
+            </w:r>
+          </w:p>
+        </w:tc>
+        <w:tc>
+          <w:tcPr>
+            <w:tcW w:w="973" w:type="dxa"/>
+          </w:tcPr>
+          <w:p>
+            <w:pPr>
+              <w:pStyle w:val="TableCell"/>
+            </w:pPr>
+            <w:r>
+              <w:t>22</w:t>
+            </w:r>
+          </w:p>
+        </w:tc>
+      </w:tr>
+      <w:tr>
+        <w:tc>
+          <w:tcPr>
+            <w:tcW w:w="973" w:type="dxa"/>
+          </w:tcPr>
+          <w:p>
+            <w:pPr>
+              <w:pStyle w:val="TableCell"/>
+            </w:pPr>
             <w:r>
               <w:lastRenderedPageBreak/>
               <w:t>General</w:t>
@@ -7733,6 +7928,10 @@
             <w:tcW w:w="973" w:type="dxa"/>
           </w:tcPr>
           <w:p>
+            <w:pPr>
+              <w:pStyle w:val="TableCell"/>
+              <w:jc w:val="left"/>
+            </w:pPr>
             <w:r>
               <w:t>ROUGE-L</w:t>
             </w:r>
@@ -7743,16 +7942,22 @@
             <w:tcW w:w="973" w:type="dxa"/>
           </w:tcPr>
           <w:p>
-            <w:r>
-              <w:t>BM25</w:t>
-            </w:r>
-          </w:p>
-        </w:tc>
-        <w:tc>
-          <w:tcPr>
-            <w:tcW w:w="973" w:type="dxa"/>
-          </w:tcPr>
-          <w:p>
+            <w:pPr>
+              <w:pStyle w:val="TableCell"/>
+            </w:pPr>
+            <w:r>
+              <w:t>Dense</w:t>
+            </w:r>
+          </w:p>
+        </w:tc>
+        <w:tc>
+          <w:tcPr>
+            <w:tcW w:w="973" w:type="dxa"/>
+          </w:tcPr>
+          <w:p>
+            <w:pPr>
+              <w:pStyle w:val="TableCell"/>
+            </w:pPr>
             <w:r>
               <w:t>204</w:t>
             </w:r>
@@ -7763,26 +7968,35 @@
             <w:tcW w:w="973" w:type="dxa"/>
           </w:tcPr>
           <w:p>
-            <w:r>
-              <w:t>+0.128 [+0.100, +0.156]</w:t>
-            </w:r>
-          </w:p>
-        </w:tc>
-        <w:tc>
-          <w:tcPr>
-            <w:tcW w:w="973" w:type="dxa"/>
-          </w:tcPr>
-          <w:p>
-            <w:r>
-              <w:t>+0.62</w:t>
-            </w:r>
-          </w:p>
-        </w:tc>
-        <w:tc>
-          <w:tcPr>
-            <w:tcW w:w="973" w:type="dxa"/>
-          </w:tcPr>
-          <w:p>
+            <w:pPr>
+              <w:pStyle w:val="TableCell"/>
+            </w:pPr>
+            <w:r>
+              <w:t>+0.161 [+0.136, +0.187]</w:t>
+            </w:r>
+          </w:p>
+        </w:tc>
+        <w:tc>
+          <w:tcPr>
+            <w:tcW w:w="973" w:type="dxa"/>
+          </w:tcPr>
+          <w:p>
+            <w:pPr>
+              <w:pStyle w:val="TableCell"/>
+            </w:pPr>
+            <w:r>
+              <w:t>+0.87</w:t>
+            </w:r>
+          </w:p>
+        </w:tc>
+        <w:tc>
+          <w:tcPr>
+            <w:tcW w:w="973" w:type="dxa"/>
+          </w:tcPr>
+          <w:p>
+            <w:pPr>
+              <w:pStyle w:val="TableCell"/>
+            </w:pPr>
             <w:r>
               <w:t>&lt;0.0001</w:t>
             </w:r>
@@ -7793,6 +8007,9 @@
             <w:tcW w:w="973" w:type="dxa"/>
           </w:tcPr>
           <w:p>
+            <w:pPr>
+              <w:pStyle w:val="TableCell"/>
+            </w:pPr>
             <w:r>
               <w:t>1.00</w:t>
             </w:r>
@@ -7803,8 +8020,11 @@
             <w:tcW w:w="973" w:type="dxa"/>
           </w:tcPr>
           <w:p>
-            <w:r>
-              <w:t>22</w:t>
+            <w:pPr>
+              <w:pStyle w:val="TableCell"/>
+            </w:pPr>
+            <w:r>
+              <w:t>12</w:t>
             </w:r>
           </w:p>
         </w:tc>
@@ -7815,6 +8035,9 @@
             <w:tcW w:w="973" w:type="dxa"/>
           </w:tcPr>
           <w:p>
+            <w:pPr>
+              <w:pStyle w:val="TableCell"/>
+            </w:pPr>
             <w:r>
               <w:t>General</w:t>
             </w:r>
@@ -7825,6 +8048,9 @@
             <w:tcW w:w="973" w:type="dxa"/>
           </w:tcPr>
           <w:p>
+            <w:pPr>
+              <w:pStyle w:val="TableCell"/>
+            </w:pPr>
             <w:r>
               <w:t>ROUGE-L</w:t>
             </w:r>
@@ -7835,16 +8061,22 @@
             <w:tcW w:w="973" w:type="dxa"/>
           </w:tcPr>
           <w:p>
-            <w:r>
-              <w:t>Dense</w:t>
-            </w:r>
-          </w:p>
-        </w:tc>
-        <w:tc>
-          <w:tcPr>
-            <w:tcW w:w="973" w:type="dxa"/>
-          </w:tcPr>
-          <w:p>
+            <w:pPr>
+              <w:pStyle w:val="TableCell"/>
+            </w:pPr>
+            <w:r>
+              <w:t>FlatRAG</w:t>
+            </w:r>
+          </w:p>
+        </w:tc>
+        <w:tc>
+          <w:tcPr>
+            <w:tcW w:w="973" w:type="dxa"/>
+          </w:tcPr>
+          <w:p>
+            <w:pPr>
+              <w:pStyle w:val="TableCell"/>
+            </w:pPr>
             <w:r>
               <w:t>204</w:t>
             </w:r>
@@ -7855,26 +8087,35 @@
             <w:tcW w:w="973" w:type="dxa"/>
           </w:tcPr>
           <w:p>
-            <w:r>
-              <w:t>+0.161 [+0.136, +0.187]</w:t>
-            </w:r>
-          </w:p>
-        </w:tc>
-        <w:tc>
-          <w:tcPr>
-            <w:tcW w:w="973" w:type="dxa"/>
-          </w:tcPr>
-          <w:p>
-            <w:r>
-              <w:t>+0.87</w:t>
-            </w:r>
-          </w:p>
-        </w:tc>
-        <w:tc>
-          <w:tcPr>
-            <w:tcW w:w="973" w:type="dxa"/>
-          </w:tcPr>
-          <w:p>
+            <w:pPr>
+              <w:pStyle w:val="TableCell"/>
+            </w:pPr>
+            <w:r>
+              <w:t>+0.203 [+0.175, +0.232]</w:t>
+            </w:r>
+          </w:p>
+        </w:tc>
+        <w:tc>
+          <w:tcPr>
+            <w:tcW w:w="973" w:type="dxa"/>
+          </w:tcPr>
+          <w:p>
+            <w:pPr>
+              <w:pStyle w:val="TableCell"/>
+            </w:pPr>
+            <w:r>
+              <w:t>+0.97</w:t>
+            </w:r>
+          </w:p>
+        </w:tc>
+        <w:tc>
+          <w:tcPr>
+            <w:tcW w:w="973" w:type="dxa"/>
+          </w:tcPr>
+          <w:p>
+            <w:pPr>
+              <w:pStyle w:val="TableCell"/>
+            </w:pPr>
             <w:r>
               <w:t>&lt;0.0001</w:t>
             </w:r>
@@ -7885,6 +8126,9 @@
             <w:tcW w:w="973" w:type="dxa"/>
           </w:tcPr>
           <w:p>
+            <w:pPr>
+              <w:pStyle w:val="TableCell"/>
+            </w:pPr>
             <w:r>
               <w:t>1.00</w:t>
             </w:r>
@@ -7895,8 +8139,11 @@
             <w:tcW w:w="973" w:type="dxa"/>
           </w:tcPr>
           <w:p>
-            <w:r>
-              <w:t>12</w:t>
+            <w:pPr>
+              <w:pStyle w:val="TableCell"/>
+            </w:pPr>
+            <w:r>
+              <w:t>10</w:t>
             </w:r>
           </w:p>
         </w:tc>
@@ -7907,6 +8154,9 @@
             <w:tcW w:w="973" w:type="dxa"/>
           </w:tcPr>
           <w:p>
+            <w:pPr>
+              <w:pStyle w:val="TableCell"/>
+            </w:pPr>
             <w:r>
               <w:t>General</w:t>
             </w:r>
@@ -7917,6 +8167,9 @@
             <w:tcW w:w="973" w:type="dxa"/>
           </w:tcPr>
           <w:p>
+            <w:pPr>
+              <w:pStyle w:val="TableCell"/>
+            </w:pPr>
             <w:r>
               <w:t>ROUGE-L</w:t>
             </w:r>
@@ -7927,16 +8180,22 @@
             <w:tcW w:w="973" w:type="dxa"/>
           </w:tcPr>
           <w:p>
-            <w:r>
-              <w:t>FlatRAG</w:t>
-            </w:r>
-          </w:p>
-        </w:tc>
-        <w:tc>
-          <w:tcPr>
-            <w:tcW w:w="973" w:type="dxa"/>
-          </w:tcPr>
-          <w:p>
+            <w:pPr>
+              <w:pStyle w:val="TableCell"/>
+            </w:pPr>
+            <w:r>
+              <w:t>RAPTOR</w:t>
+            </w:r>
+          </w:p>
+        </w:tc>
+        <w:tc>
+          <w:tcPr>
+            <w:tcW w:w="973" w:type="dxa"/>
+          </w:tcPr>
+          <w:p>
+            <w:pPr>
+              <w:pStyle w:val="TableCell"/>
+            </w:pPr>
             <w:r>
               <w:t>204</w:t>
             </w:r>
@@ -7947,26 +8206,35 @@
             <w:tcW w:w="973" w:type="dxa"/>
           </w:tcPr>
           <w:p>
-            <w:r>
-              <w:t>+0.203 [+0.175, +0.232]</w:t>
-            </w:r>
-          </w:p>
-        </w:tc>
-        <w:tc>
-          <w:tcPr>
-            <w:tcW w:w="973" w:type="dxa"/>
-          </w:tcPr>
-          <w:p>
-            <w:r>
-              <w:t>+0.97</w:t>
-            </w:r>
-          </w:p>
-        </w:tc>
-        <w:tc>
-          <w:tcPr>
-            <w:tcW w:w="973" w:type="dxa"/>
-          </w:tcPr>
-          <w:p>
+            <w:pPr>
+              <w:pStyle w:val="TableCell"/>
+            </w:pPr>
+            <w:r>
+              <w:t>+0.257 [+0.228, +0.286]</w:t>
+            </w:r>
+          </w:p>
+        </w:tc>
+        <w:tc>
+          <w:tcPr>
+            <w:tcW w:w="973" w:type="dxa"/>
+          </w:tcPr>
+          <w:p>
+            <w:pPr>
+              <w:pStyle w:val="TableCell"/>
+            </w:pPr>
+            <w:r>
+              <w:t>+1.22</w:t>
+            </w:r>
+          </w:p>
+        </w:tc>
+        <w:tc>
+          <w:tcPr>
+            <w:tcW w:w="973" w:type="dxa"/>
+          </w:tcPr>
+          <w:p>
+            <w:pPr>
+              <w:pStyle w:val="TableCell"/>
+            </w:pPr>
             <w:r>
               <w:t>&lt;0.0001</w:t>
             </w:r>
@@ -7977,6 +8245,9 @@
             <w:tcW w:w="973" w:type="dxa"/>
           </w:tcPr>
           <w:p>
+            <w:pPr>
+              <w:pStyle w:val="TableCell"/>
+            </w:pPr>
             <w:r>
               <w:t>1.00</w:t>
             </w:r>
@@ -7987,8 +8258,11 @@
             <w:tcW w:w="973" w:type="dxa"/>
           </w:tcPr>
           <w:p>
-            <w:r>
-              <w:t>10</w:t>
+            <w:pPr>
+              <w:pStyle w:val="TableCell"/>
+            </w:pPr>
+            <w:r>
+              <w:t>7</w:t>
             </w:r>
           </w:p>
         </w:tc>
@@ -7999,16 +8273,22 @@
             <w:tcW w:w="973" w:type="dxa"/>
           </w:tcPr>
           <w:p>
-            <w:r>
-              <w:t>General</w:t>
-            </w:r>
-          </w:p>
-        </w:tc>
-        <w:tc>
-          <w:tcPr>
-            <w:tcW w:w="973" w:type="dxa"/>
-          </w:tcPr>
-          <w:p>
+            <w:pPr>
+              <w:pStyle w:val="TableCell"/>
+            </w:pPr>
+            <w:r>
+              <w:t>Medical</w:t>
+            </w:r>
+          </w:p>
+        </w:tc>
+        <w:tc>
+          <w:tcPr>
+            <w:tcW w:w="973" w:type="dxa"/>
+          </w:tcPr>
+          <w:p>
+            <w:pPr>
+              <w:pStyle w:val="TableCell"/>
+            </w:pPr>
             <w:r>
               <w:t>ROUGE-L</w:t>
             </w:r>
@@ -8019,68 +8299,89 @@
             <w:tcW w:w="973" w:type="dxa"/>
           </w:tcPr>
           <w:p>
-            <w:r>
-              <w:t>RAPTOR</w:t>
-            </w:r>
-          </w:p>
-        </w:tc>
-        <w:tc>
-          <w:tcPr>
-            <w:tcW w:w="973" w:type="dxa"/>
-          </w:tcPr>
-          <w:p>
-            <w:r>
-              <w:t>204</w:t>
-            </w:r>
-          </w:p>
-        </w:tc>
-        <w:tc>
-          <w:tcPr>
-            <w:tcW w:w="973" w:type="dxa"/>
-          </w:tcPr>
-          <w:p>
-            <w:r>
-              <w:t>+0.257 [+0.228, +0.286]</w:t>
-            </w:r>
-          </w:p>
-        </w:tc>
-        <w:tc>
-          <w:tcPr>
-            <w:tcW w:w="973" w:type="dxa"/>
-          </w:tcPr>
-          <w:p>
-            <w:r>
-              <w:t>+1.22</w:t>
-            </w:r>
-          </w:p>
-        </w:tc>
-        <w:tc>
-          <w:tcPr>
-            <w:tcW w:w="973" w:type="dxa"/>
-          </w:tcPr>
-          <w:p>
-            <w:r>
-              <w:t>&lt;0.0001</w:t>
-            </w:r>
-          </w:p>
-        </w:tc>
-        <w:tc>
-          <w:tcPr>
-            <w:tcW w:w="973" w:type="dxa"/>
-          </w:tcPr>
-          <w:p>
-            <w:r>
-              <w:t>1.00</w:t>
-            </w:r>
-          </w:p>
-        </w:tc>
-        <w:tc>
-          <w:tcPr>
-            <w:tcW w:w="973" w:type="dxa"/>
-          </w:tcPr>
-          <w:p>
-            <w:r>
-              <w:t>7</w:t>
+            <w:pPr>
+              <w:pStyle w:val="TableCell"/>
+            </w:pPr>
+            <w:r>
+              <w:t>BM25</w:t>
+            </w:r>
+          </w:p>
+        </w:tc>
+        <w:tc>
+          <w:tcPr>
+            <w:tcW w:w="973" w:type="dxa"/>
+          </w:tcPr>
+          <w:p>
+            <w:pPr>
+              <w:pStyle w:val="TableCell"/>
+            </w:pPr>
+            <w:r>
+              <w:t>42</w:t>
+            </w:r>
+          </w:p>
+        </w:tc>
+        <w:tc>
+          <w:tcPr>
+            <w:tcW w:w="973" w:type="dxa"/>
+          </w:tcPr>
+          <w:p>
+            <w:pPr>
+              <w:pStyle w:val="TableCell"/>
+            </w:pPr>
+            <w:r>
+              <w:t>+0.007 [−0.021, +0.031]</w:t>
+            </w:r>
+          </w:p>
+        </w:tc>
+        <w:tc>
+          <w:tcPr>
+            <w:tcW w:w="973" w:type="dxa"/>
+          </w:tcPr>
+          <w:p>
+            <w:pPr>
+              <w:pStyle w:val="TableCell"/>
+            </w:pPr>
+            <w:r>
+              <w:t>+0.09</w:t>
+            </w:r>
+          </w:p>
+        </w:tc>
+        <w:tc>
+          <w:tcPr>
+            <w:tcW w:w="973" w:type="dxa"/>
+          </w:tcPr>
+          <w:p>
+            <w:pPr>
+              <w:pStyle w:val="TableCell"/>
+            </w:pPr>
+            <w:r>
+              <w:t>0.629</w:t>
+            </w:r>
+          </w:p>
+        </w:tc>
+        <w:tc>
+          <w:tcPr>
+            <w:tcW w:w="973" w:type="dxa"/>
+          </w:tcPr>
+          <w:p>
+            <w:pPr>
+              <w:pStyle w:val="TableCell"/>
+            </w:pPr>
+            <w:r>
+              <w:t>0.08</w:t>
+            </w:r>
+          </w:p>
+        </w:tc>
+        <w:tc>
+          <w:tcPr>
+            <w:tcW w:w="973" w:type="dxa"/>
+          </w:tcPr>
+          <w:p>
+            <w:pPr>
+              <w:pStyle w:val="TableCell"/>
+            </w:pPr>
+            <w:r>
+              <w:t>1075</w:t>
             </w:r>
           </w:p>
         </w:tc>
@@ -8091,6 +8392,9 @@
             <w:tcW w:w="973" w:type="dxa"/>
           </w:tcPr>
           <w:p>
+            <w:pPr>
+              <w:pStyle w:val="TableCell"/>
+            </w:pPr>
             <w:r>
               <w:t>Medical</w:t>
             </w:r>
@@ -8101,6 +8405,9 @@
             <w:tcW w:w="973" w:type="dxa"/>
           </w:tcPr>
           <w:p>
+            <w:pPr>
+              <w:pStyle w:val="TableCell"/>
+            </w:pPr>
             <w:r>
               <w:t>ROUGE-L</w:t>
             </w:r>
@@ -8111,16 +8418,22 @@
             <w:tcW w:w="973" w:type="dxa"/>
           </w:tcPr>
           <w:p>
-            <w:r>
-              <w:t>BM25</w:t>
-            </w:r>
-          </w:p>
-        </w:tc>
-        <w:tc>
-          <w:tcPr>
-            <w:tcW w:w="973" w:type="dxa"/>
-          </w:tcPr>
-          <w:p>
+            <w:pPr>
+              <w:pStyle w:val="TableCell"/>
+            </w:pPr>
+            <w:r>
+              <w:t>Dense</w:t>
+            </w:r>
+          </w:p>
+        </w:tc>
+        <w:tc>
+          <w:tcPr>
+            <w:tcW w:w="973" w:type="dxa"/>
+          </w:tcPr>
+          <w:p>
+            <w:pPr>
+              <w:pStyle w:val="TableCell"/>
+            </w:pPr>
             <w:r>
               <w:t>42</w:t>
             </w:r>
@@ -8131,48 +8444,67 @@
             <w:tcW w:w="973" w:type="dxa"/>
           </w:tcPr>
           <w:p>
-            <w:r>
-              <w:t>+0.007 [−0.021, +0.031]</w:t>
-            </w:r>
-          </w:p>
-        </w:tc>
-        <w:tc>
-          <w:tcPr>
-            <w:tcW w:w="973" w:type="dxa"/>
-          </w:tcPr>
-          <w:p>
-            <w:r>
-              <w:t>+0.09</w:t>
-            </w:r>
-          </w:p>
-        </w:tc>
-        <w:tc>
-          <w:tcPr>
-            <w:tcW w:w="973" w:type="dxa"/>
-          </w:tcPr>
-          <w:p>
-            <w:r>
-              <w:t>0.629</w:t>
-            </w:r>
-          </w:p>
-        </w:tc>
-        <w:tc>
-          <w:tcPr>
-            <w:tcW w:w="973" w:type="dxa"/>
-          </w:tcPr>
-          <w:p>
-            <w:r>
-              <w:t>0.08</w:t>
-            </w:r>
-          </w:p>
-        </w:tc>
-        <w:tc>
-          <w:tcPr>
-            <w:tcW w:w="973" w:type="dxa"/>
-          </w:tcPr>
-          <w:p>
-            <w:r>
-              <w:t>1075</w:t>
+            <w:pPr>
+              <w:pStyle w:val="TableCell"/>
+            </w:pPr>
+            <w:r>
+              <w:t>+0.051 [+0.021, +0.086]</w:t>
+            </w:r>
+          </w:p>
+        </w:tc>
+        <w:tc>
+          <w:tcPr>
+            <w:tcW w:w="973" w:type="dxa"/>
+          </w:tcPr>
+          <w:p>
+            <w:pPr>
+              <w:pStyle w:val="TableCell"/>
+            </w:pPr>
+            <w:r>
+              <w:t>+0.46</w:t>
+            </w:r>
+          </w:p>
+        </w:tc>
+        <w:tc>
+          <w:tcPr>
+            <w:tcW w:w="973" w:type="dxa"/>
+          </w:tcPr>
+          <w:p>
+            <w:pPr>
+              <w:pStyle w:val="TableCell"/>
+              <w:rPr>
+                <w:rFonts w:hint="eastAsia"/>
+                <w:lang w:eastAsia="ko-KR"/>
+              </w:rPr>
+            </w:pPr>
+            <w:r>
+              <w:t>0.0018</w:t>
+            </w:r>
+          </w:p>
+        </w:tc>
+        <w:tc>
+          <w:tcPr>
+            <w:tcW w:w="973" w:type="dxa"/>
+          </w:tcPr>
+          <w:p>
+            <w:pPr>
+              <w:pStyle w:val="TableCell"/>
+            </w:pPr>
+            <w:r>
+              <w:t>0.83</w:t>
+            </w:r>
+          </w:p>
+        </w:tc>
+        <w:tc>
+          <w:tcPr>
+            <w:tcW w:w="973" w:type="dxa"/>
+          </w:tcPr>
+          <w:p>
+            <w:pPr>
+              <w:pStyle w:val="TableCell"/>
+            </w:pPr>
+            <w:r>
+              <w:t>38</w:t>
             </w:r>
           </w:p>
         </w:tc>
@@ -8183,6 +8515,9 @@
             <w:tcW w:w="973" w:type="dxa"/>
           </w:tcPr>
           <w:p>
+            <w:pPr>
+              <w:pStyle w:val="TableCell"/>
+            </w:pPr>
             <w:r>
               <w:t>Medical</w:t>
             </w:r>
@@ -8193,6 +8528,9 @@
             <w:tcW w:w="973" w:type="dxa"/>
           </w:tcPr>
           <w:p>
+            <w:pPr>
+              <w:pStyle w:val="TableCell"/>
+            </w:pPr>
             <w:r>
               <w:t>ROUGE-L</w:t>
             </w:r>
@@ -8203,16 +8541,22 @@
             <w:tcW w:w="973" w:type="dxa"/>
           </w:tcPr>
           <w:p>
-            <w:r>
-              <w:t>Dense</w:t>
-            </w:r>
-          </w:p>
-        </w:tc>
-        <w:tc>
-          <w:tcPr>
-            <w:tcW w:w="973" w:type="dxa"/>
-          </w:tcPr>
-          <w:p>
+            <w:pPr>
+              <w:pStyle w:val="TableCell"/>
+            </w:pPr>
+            <w:r>
+              <w:t>FlatRAG</w:t>
+            </w:r>
+          </w:p>
+        </w:tc>
+        <w:tc>
+          <w:tcPr>
+            <w:tcW w:w="973" w:type="dxa"/>
+          </w:tcPr>
+          <w:p>
+            <w:pPr>
+              <w:pStyle w:val="TableCell"/>
+            </w:pPr>
             <w:r>
               <w:t>42</w:t>
             </w:r>
@@ -8223,48 +8567,63 @@
             <w:tcW w:w="973" w:type="dxa"/>
           </w:tcPr>
           <w:p>
-            <w:r>
-              <w:t>+0.051 [+0.021, +0.086]</w:t>
-            </w:r>
-          </w:p>
-        </w:tc>
-        <w:tc>
-          <w:tcPr>
-            <w:tcW w:w="973" w:type="dxa"/>
-          </w:tcPr>
-          <w:p>
-            <w:r>
-              <w:t>+0.46</w:t>
-            </w:r>
-          </w:p>
-        </w:tc>
-        <w:tc>
-          <w:tcPr>
-            <w:tcW w:w="973" w:type="dxa"/>
-          </w:tcPr>
-          <w:p>
-            <w:r>
-              <w:t>0.0018</w:t>
-            </w:r>
-          </w:p>
-        </w:tc>
-        <w:tc>
-          <w:tcPr>
-            <w:tcW w:w="973" w:type="dxa"/>
-          </w:tcPr>
-          <w:p>
-            <w:r>
-              <w:t>0.83</w:t>
-            </w:r>
-          </w:p>
-        </w:tc>
-        <w:tc>
-          <w:tcPr>
-            <w:tcW w:w="973" w:type="dxa"/>
-          </w:tcPr>
-          <w:p>
-            <w:r>
-              <w:t>38</w:t>
+            <w:pPr>
+              <w:pStyle w:val="TableCell"/>
+            </w:pPr>
+            <w:r>
+              <w:t>+0.095 [+0.071, +0.115]</w:t>
+            </w:r>
+          </w:p>
+        </w:tc>
+        <w:tc>
+          <w:tcPr>
+            <w:tcW w:w="973" w:type="dxa"/>
+          </w:tcPr>
+          <w:p>
+            <w:pPr>
+              <w:pStyle w:val="TableCell"/>
+            </w:pPr>
+            <w:r>
+              <w:t>+1.31</w:t>
+            </w:r>
+          </w:p>
+        </w:tc>
+        <w:tc>
+          <w:tcPr>
+            <w:tcW w:w="973" w:type="dxa"/>
+          </w:tcPr>
+          <w:p>
+            <w:pPr>
+              <w:pStyle w:val="TableCell"/>
+            </w:pPr>
+            <w:r>
+              <w:t>&lt;0.0001</w:t>
+            </w:r>
+          </w:p>
+        </w:tc>
+        <w:tc>
+          <w:tcPr>
+            <w:tcW w:w="973" w:type="dxa"/>
+          </w:tcPr>
+          <w:p>
+            <w:pPr>
+              <w:pStyle w:val="TableCell"/>
+            </w:pPr>
+            <w:r>
+              <w:t>1.00</w:t>
+            </w:r>
+          </w:p>
+        </w:tc>
+        <w:tc>
+          <w:tcPr>
+            <w:tcW w:w="973" w:type="dxa"/>
+          </w:tcPr>
+          <w:p>
+            <w:pPr>
+              <w:pStyle w:val="TableCell"/>
+            </w:pPr>
+            <w:r>
+              <w:t>6</w:t>
             </w:r>
           </w:p>
         </w:tc>
@@ -8275,6 +8634,9 @@
             <w:tcW w:w="973" w:type="dxa"/>
           </w:tcPr>
           <w:p>
+            <w:pPr>
+              <w:pStyle w:val="TableCell"/>
+            </w:pPr>
             <w:r>
               <w:t>Medical</w:t>
             </w:r>
@@ -8285,6 +8647,9 @@
             <w:tcW w:w="973" w:type="dxa"/>
           </w:tcPr>
           <w:p>
+            <w:pPr>
+              <w:pStyle w:val="TableCell"/>
+            </w:pPr>
             <w:r>
               <w:t>ROUGE-L</w:t>
             </w:r>
@@ -8295,16 +8660,22 @@
             <w:tcW w:w="973" w:type="dxa"/>
           </w:tcPr>
           <w:p>
-            <w:r>
-              <w:t>FlatRAG</w:t>
-            </w:r>
-          </w:p>
-        </w:tc>
-        <w:tc>
-          <w:tcPr>
-            <w:tcW w:w="973" w:type="dxa"/>
-          </w:tcPr>
-          <w:p>
+            <w:pPr>
+              <w:pStyle w:val="TableCell"/>
+            </w:pPr>
+            <w:r>
+              <w:t>RAPTOR</w:t>
+            </w:r>
+          </w:p>
+        </w:tc>
+        <w:tc>
+          <w:tcPr>
+            <w:tcW w:w="973" w:type="dxa"/>
+          </w:tcPr>
+          <w:p>
+            <w:pPr>
+              <w:pStyle w:val="TableCell"/>
+            </w:pPr>
             <w:r>
               <w:t>42</w:t>
             </w:r>
@@ -8315,26 +8686,35 @@
             <w:tcW w:w="973" w:type="dxa"/>
           </w:tcPr>
           <w:p>
-            <w:r>
-              <w:t>+0.095 [+0.071, +0.115]</w:t>
-            </w:r>
-          </w:p>
-        </w:tc>
-        <w:tc>
-          <w:tcPr>
-            <w:tcW w:w="973" w:type="dxa"/>
-          </w:tcPr>
-          <w:p>
-            <w:r>
-              <w:t>+1.31</w:t>
-            </w:r>
-          </w:p>
-        </w:tc>
-        <w:tc>
-          <w:tcPr>
-            <w:tcW w:w="973" w:type="dxa"/>
-          </w:tcPr>
-          <w:p>
+            <w:pPr>
+              <w:pStyle w:val="TableCell"/>
+            </w:pPr>
+            <w:r>
+              <w:t>+0.312 [+0.282, +0.342]</w:t>
+            </w:r>
+          </w:p>
+        </w:tc>
+        <w:tc>
+          <w:tcPr>
+            <w:tcW w:w="973" w:type="dxa"/>
+          </w:tcPr>
+          <w:p>
+            <w:pPr>
+              <w:pStyle w:val="TableCell"/>
+            </w:pPr>
+            <w:r>
+              <w:t>+3.08</w:t>
+            </w:r>
+          </w:p>
+        </w:tc>
+        <w:tc>
+          <w:tcPr>
+            <w:tcW w:w="973" w:type="dxa"/>
+          </w:tcPr>
+          <w:p>
+            <w:pPr>
+              <w:pStyle w:val="TableCell"/>
+            </w:pPr>
             <w:r>
               <w:t>&lt;0.0001</w:t>
             </w:r>
@@ -8345,6 +8725,9 @@
             <w:tcW w:w="973" w:type="dxa"/>
           </w:tcPr>
           <w:p>
+            <w:pPr>
+              <w:pStyle w:val="TableCell"/>
+            </w:pPr>
             <w:r>
               <w:t>1.00</w:t>
             </w:r>
@@ -8355,8 +8738,11 @@
             <w:tcW w:w="973" w:type="dxa"/>
           </w:tcPr>
           <w:p>
-            <w:r>
-              <w:t>6</w:t>
+            <w:pPr>
+              <w:pStyle w:val="TableCell"/>
+            </w:pPr>
+            <w:r>
+              <w:t>2</w:t>
             </w:r>
           </w:p>
         </w:tc>
@@ -8367,16 +8753,22 @@
             <w:tcW w:w="973" w:type="dxa"/>
           </w:tcPr>
           <w:p>
-            <w:r>
-              <w:t>Medical</w:t>
-            </w:r>
-          </w:p>
-        </w:tc>
-        <w:tc>
-          <w:tcPr>
-            <w:tcW w:w="973" w:type="dxa"/>
-          </w:tcPr>
-          <w:p>
+            <w:pPr>
+              <w:pStyle w:val="TableCell"/>
+            </w:pPr>
+            <w:r>
+              <w:t>HotpotQA</w:t>
+            </w:r>
+          </w:p>
+        </w:tc>
+        <w:tc>
+          <w:tcPr>
+            <w:tcW w:w="973" w:type="dxa"/>
+          </w:tcPr>
+          <w:p>
+            <w:pPr>
+              <w:pStyle w:val="TableCell"/>
+            </w:pPr>
             <w:r>
               <w:t>ROUGE-L</w:t>
             </w:r>
@@ -8387,68 +8779,89 @@
             <w:tcW w:w="973" w:type="dxa"/>
           </w:tcPr>
           <w:p>
-            <w:r>
-              <w:t>RAPTOR</w:t>
-            </w:r>
-          </w:p>
-        </w:tc>
-        <w:tc>
-          <w:tcPr>
-            <w:tcW w:w="973" w:type="dxa"/>
-          </w:tcPr>
-          <w:p>
-            <w:r>
-              <w:t>42</w:t>
-            </w:r>
-          </w:p>
-        </w:tc>
-        <w:tc>
-          <w:tcPr>
-            <w:tcW w:w="973" w:type="dxa"/>
-          </w:tcPr>
-          <w:p>
-            <w:r>
-              <w:t>+0.312 [+0.282, +0.342]</w:t>
-            </w:r>
-          </w:p>
-        </w:tc>
-        <w:tc>
-          <w:tcPr>
-            <w:tcW w:w="973" w:type="dxa"/>
-          </w:tcPr>
-          <w:p>
-            <w:r>
-              <w:t>+3.08</w:t>
-            </w:r>
-          </w:p>
-        </w:tc>
-        <w:tc>
-          <w:tcPr>
-            <w:tcW w:w="973" w:type="dxa"/>
-          </w:tcPr>
-          <w:p>
-            <w:r>
-              <w:t>&lt;0.0001</w:t>
-            </w:r>
-          </w:p>
-        </w:tc>
-        <w:tc>
-          <w:tcPr>
-            <w:tcW w:w="973" w:type="dxa"/>
-          </w:tcPr>
-          <w:p>
-            <w:r>
-              <w:t>1.00</w:t>
-            </w:r>
-          </w:p>
-        </w:tc>
-        <w:tc>
-          <w:tcPr>
-            <w:tcW w:w="973" w:type="dxa"/>
-          </w:tcPr>
-          <w:p>
-            <w:r>
-              <w:t>2</w:t>
+            <w:pPr>
+              <w:pStyle w:val="TableCell"/>
+            </w:pPr>
+            <w:r>
+              <w:t>BM25</w:t>
+            </w:r>
+          </w:p>
+        </w:tc>
+        <w:tc>
+          <w:tcPr>
+            <w:tcW w:w="973" w:type="dxa"/>
+          </w:tcPr>
+          <w:p>
+            <w:pPr>
+              <w:pStyle w:val="TableCell"/>
+            </w:pPr>
+            <w:r>
+              <w:t>100</w:t>
+            </w:r>
+          </w:p>
+        </w:tc>
+        <w:tc>
+          <w:tcPr>
+            <w:tcW w:w="973" w:type="dxa"/>
+          </w:tcPr>
+          <w:p>
+            <w:pPr>
+              <w:pStyle w:val="TableCell"/>
+            </w:pPr>
+            <w:r>
+              <w:t>−0.057 [−0.100, −0.016]</w:t>
+            </w:r>
+          </w:p>
+        </w:tc>
+        <w:tc>
+          <w:tcPr>
+            <w:tcW w:w="973" w:type="dxa"/>
+          </w:tcPr>
+          <w:p>
+            <w:pPr>
+              <w:pStyle w:val="TableCell"/>
+            </w:pPr>
+            <w:r>
+              <w:t>−0.26</w:t>
+            </w:r>
+          </w:p>
+        </w:tc>
+        <w:tc>
+          <w:tcPr>
+            <w:tcW w:w="973" w:type="dxa"/>
+          </w:tcPr>
+          <w:p>
+            <w:pPr>
+              <w:pStyle w:val="TableCell"/>
+            </w:pPr>
+            <w:r>
+              <w:t>0.008</w:t>
+            </w:r>
+          </w:p>
+        </w:tc>
+        <w:tc>
+          <w:tcPr>
+            <w:tcW w:w="973" w:type="dxa"/>
+          </w:tcPr>
+          <w:p>
+            <w:pPr>
+              <w:pStyle w:val="TableCell"/>
+            </w:pPr>
+            <w:r>
+              <w:t>0.74</w:t>
+            </w:r>
+          </w:p>
+        </w:tc>
+        <w:tc>
+          <w:tcPr>
+            <w:tcW w:w="973" w:type="dxa"/>
+          </w:tcPr>
+          <w:p>
+            <w:pPr>
+              <w:pStyle w:val="TableCell"/>
+            </w:pPr>
+            <w:r>
+              <w:t>115</w:t>
             </w:r>
           </w:p>
         </w:tc>
@@ -8459,6 +8872,9 @@
             <w:tcW w:w="973" w:type="dxa"/>
           </w:tcPr>
           <w:p>
+            <w:pPr>
+              <w:pStyle w:val="TableCell"/>
+            </w:pPr>
             <w:r>
               <w:t>HotpotQA</w:t>
             </w:r>
@@ -8469,6 +8885,9 @@
             <w:tcW w:w="973" w:type="dxa"/>
           </w:tcPr>
           <w:p>
+            <w:pPr>
+              <w:pStyle w:val="TableCell"/>
+            </w:pPr>
             <w:r>
               <w:t>ROUGE-L</w:t>
             </w:r>
@@ -8479,16 +8898,22 @@
             <w:tcW w:w="973" w:type="dxa"/>
           </w:tcPr>
           <w:p>
-            <w:r>
-              <w:t>BM25</w:t>
-            </w:r>
-          </w:p>
-        </w:tc>
-        <w:tc>
-          <w:tcPr>
-            <w:tcW w:w="973" w:type="dxa"/>
-          </w:tcPr>
-          <w:p>
+            <w:pPr>
+              <w:pStyle w:val="TableCell"/>
+            </w:pPr>
+            <w:r>
+              <w:t>Dense</w:t>
+            </w:r>
+          </w:p>
+        </w:tc>
+        <w:tc>
+          <w:tcPr>
+            <w:tcW w:w="973" w:type="dxa"/>
+          </w:tcPr>
+          <w:p>
+            <w:pPr>
+              <w:pStyle w:val="TableCell"/>
+            </w:pPr>
             <w:r>
               <w:t>100</w:t>
             </w:r>
@@ -8499,48 +8924,63 @@
             <w:tcW w:w="973" w:type="dxa"/>
           </w:tcPr>
           <w:p>
-            <w:r>
-              <w:t>−0.057 [−0.100, −0.016]</w:t>
-            </w:r>
-          </w:p>
-        </w:tc>
-        <w:tc>
-          <w:tcPr>
-            <w:tcW w:w="973" w:type="dxa"/>
-          </w:tcPr>
-          <w:p>
-            <w:r>
-              <w:t>−0.26</w:t>
-            </w:r>
-          </w:p>
-        </w:tc>
-        <w:tc>
-          <w:tcPr>
-            <w:tcW w:w="973" w:type="dxa"/>
-          </w:tcPr>
-          <w:p>
-            <w:r>
-              <w:t>0.008</w:t>
-            </w:r>
-          </w:p>
-        </w:tc>
-        <w:tc>
-          <w:tcPr>
-            <w:tcW w:w="973" w:type="dxa"/>
-          </w:tcPr>
-          <w:p>
-            <w:r>
-              <w:t>0.74</w:t>
-            </w:r>
-          </w:p>
-        </w:tc>
-        <w:tc>
-          <w:tcPr>
-            <w:tcW w:w="973" w:type="dxa"/>
-          </w:tcPr>
-          <w:p>
-            <w:r>
-              <w:t>115</w:t>
+            <w:pPr>
+              <w:pStyle w:val="TableCell"/>
+            </w:pPr>
+            <w:r>
+              <w:t>−0.037 [−0.082, +0.008]</w:t>
+            </w:r>
+          </w:p>
+        </w:tc>
+        <w:tc>
+          <w:tcPr>
+            <w:tcW w:w="973" w:type="dxa"/>
+          </w:tcPr>
+          <w:p>
+            <w:pPr>
+              <w:pStyle w:val="TableCell"/>
+            </w:pPr>
+            <w:r>
+              <w:t>−0.16</w:t>
+            </w:r>
+          </w:p>
+        </w:tc>
+        <w:tc>
+          <w:tcPr>
+            <w:tcW w:w="973" w:type="dxa"/>
+          </w:tcPr>
+          <w:p>
+            <w:pPr>
+              <w:pStyle w:val="TableCell"/>
+            </w:pPr>
+            <w:r>
+              <w:t>0.114</w:t>
+            </w:r>
+          </w:p>
+        </w:tc>
+        <w:tc>
+          <w:tcPr>
+            <w:tcW w:w="973" w:type="dxa"/>
+          </w:tcPr>
+          <w:p>
+            <w:pPr>
+              <w:pStyle w:val="TableCell"/>
+            </w:pPr>
+            <w:r>
+              <w:t>0.35</w:t>
+            </w:r>
+          </w:p>
+        </w:tc>
+        <w:tc>
+          <w:tcPr>
+            <w:tcW w:w="973" w:type="dxa"/>
+          </w:tcPr>
+          <w:p>
+            <w:pPr>
+              <w:pStyle w:val="TableCell"/>
+            </w:pPr>
+            <w:r>
+              <w:t>308</w:t>
             </w:r>
           </w:p>
         </w:tc>
@@ -8551,6 +8991,9 @@
             <w:tcW w:w="973" w:type="dxa"/>
           </w:tcPr>
           <w:p>
+            <w:pPr>
+              <w:pStyle w:val="TableCell"/>
+            </w:pPr>
             <w:r>
               <w:t>HotpotQA</w:t>
             </w:r>
@@ -8561,6 +9004,9 @@
             <w:tcW w:w="973" w:type="dxa"/>
           </w:tcPr>
           <w:p>
+            <w:pPr>
+              <w:pStyle w:val="TableCell"/>
+            </w:pPr>
             <w:r>
               <w:t>ROUGE-L</w:t>
             </w:r>
@@ -8571,16 +9017,22 @@
             <w:tcW w:w="973" w:type="dxa"/>
           </w:tcPr>
           <w:p>
-            <w:r>
-              <w:t>Dense</w:t>
-            </w:r>
-          </w:p>
-        </w:tc>
-        <w:tc>
-          <w:tcPr>
-            <w:tcW w:w="973" w:type="dxa"/>
-          </w:tcPr>
-          <w:p>
+            <w:pPr>
+              <w:pStyle w:val="TableCell"/>
+            </w:pPr>
+            <w:r>
+              <w:t>FlatRAG</w:t>
+            </w:r>
+          </w:p>
+        </w:tc>
+        <w:tc>
+          <w:tcPr>
+            <w:tcW w:w="973" w:type="dxa"/>
+          </w:tcPr>
+          <w:p>
+            <w:pPr>
+              <w:pStyle w:val="TableCell"/>
+            </w:pPr>
             <w:r>
               <w:t>100</w:t>
             </w:r>
@@ -8591,48 +9043,63 @@
             <w:tcW w:w="973" w:type="dxa"/>
           </w:tcPr>
           <w:p>
-            <w:r>
-              <w:t>−0.037 [−0.082, +0.008]</w:t>
-            </w:r>
-          </w:p>
-        </w:tc>
-        <w:tc>
-          <w:tcPr>
-            <w:tcW w:w="973" w:type="dxa"/>
-          </w:tcPr>
-          <w:p>
-            <w:r>
-              <w:t>−0.16</w:t>
-            </w:r>
-          </w:p>
-        </w:tc>
-        <w:tc>
-          <w:tcPr>
-            <w:tcW w:w="973" w:type="dxa"/>
-          </w:tcPr>
-          <w:p>
-            <w:r>
-              <w:t>0.114</w:t>
-            </w:r>
-          </w:p>
-        </w:tc>
-        <w:tc>
-          <w:tcPr>
-            <w:tcW w:w="973" w:type="dxa"/>
-          </w:tcPr>
-          <w:p>
-            <w:r>
-              <w:t>0.35</w:t>
-            </w:r>
-          </w:p>
-        </w:tc>
-        <w:tc>
-          <w:tcPr>
-            <w:tcW w:w="973" w:type="dxa"/>
-          </w:tcPr>
-          <w:p>
-            <w:r>
-              <w:t>308</w:t>
+            <w:pPr>
+              <w:pStyle w:val="TableCell"/>
+            </w:pPr>
+            <w:r>
+              <w:t>−0.032 [−0.071, +0.005]</w:t>
+            </w:r>
+          </w:p>
+        </w:tc>
+        <w:tc>
+          <w:tcPr>
+            <w:tcW w:w="973" w:type="dxa"/>
+          </w:tcPr>
+          <w:p>
+            <w:pPr>
+              <w:pStyle w:val="TableCell"/>
+            </w:pPr>
+            <w:r>
+              <w:t>−0.17</w:t>
+            </w:r>
+          </w:p>
+        </w:tc>
+        <w:tc>
+          <w:tcPr>
+            <w:tcW w:w="973" w:type="dxa"/>
+          </w:tcPr>
+          <w:p>
+            <w:pPr>
+              <w:pStyle w:val="TableCell"/>
+            </w:pPr>
+            <w:r>
+              <w:t>0.097</w:t>
+            </w:r>
+          </w:p>
+        </w:tc>
+        <w:tc>
+          <w:tcPr>
+            <w:tcW w:w="973" w:type="dxa"/>
+          </w:tcPr>
+          <w:p>
+            <w:pPr>
+              <w:pStyle w:val="TableCell"/>
+            </w:pPr>
+            <w:r>
+              <w:t>0.38</w:t>
+            </w:r>
+          </w:p>
+        </w:tc>
+        <w:tc>
+          <w:tcPr>
+            <w:tcW w:w="973" w:type="dxa"/>
+          </w:tcPr>
+          <w:p>
+            <w:pPr>
+              <w:pStyle w:val="TableCell"/>
+            </w:pPr>
+            <w:r>
+              <w:t>280</w:t>
             </w:r>
           </w:p>
         </w:tc>
@@ -8643,8 +9110,10 @@
             <w:tcW w:w="973" w:type="dxa"/>
           </w:tcPr>
           <w:p>
-            <w:r>
-              <w:lastRenderedPageBreak/>
+            <w:pPr>
+              <w:pStyle w:val="TableCell"/>
+            </w:pPr>
+            <w:r>
               <w:t>HotpotQA</w:t>
             </w:r>
           </w:p>
@@ -8654,6 +9123,9 @@
             <w:tcW w:w="973" w:type="dxa"/>
           </w:tcPr>
           <w:p>
+            <w:pPr>
+              <w:pStyle w:val="TableCell"/>
+            </w:pPr>
             <w:r>
               <w:t>ROUGE-L</w:t>
             </w:r>
@@ -8664,16 +9136,22 @@
             <w:tcW w:w="973" w:type="dxa"/>
           </w:tcPr>
           <w:p>
-            <w:r>
-              <w:t>FlatRAG</w:t>
-            </w:r>
-          </w:p>
-        </w:tc>
-        <w:tc>
-          <w:tcPr>
-            <w:tcW w:w="973" w:type="dxa"/>
-          </w:tcPr>
-          <w:p>
+            <w:pPr>
+              <w:pStyle w:val="TableCell"/>
+            </w:pPr>
+            <w:r>
+              <w:t>RAPTOR</w:t>
+            </w:r>
+          </w:p>
+        </w:tc>
+        <w:tc>
+          <w:tcPr>
+            <w:tcW w:w="973" w:type="dxa"/>
+          </w:tcPr>
+          <w:p>
+            <w:pPr>
+              <w:pStyle w:val="TableCell"/>
+            </w:pPr>
             <w:r>
               <w:t>100</w:t>
             </w:r>
@@ -8684,48 +9162,63 @@
             <w:tcW w:w="973" w:type="dxa"/>
           </w:tcPr>
           <w:p>
-            <w:r>
-              <w:t>−0.032 [−0.071, +0.005]</w:t>
-            </w:r>
-          </w:p>
-        </w:tc>
-        <w:tc>
-          <w:tcPr>
-            <w:tcW w:w="973" w:type="dxa"/>
-          </w:tcPr>
-          <w:p>
-            <w:r>
-              <w:t>−0.17</w:t>
-            </w:r>
-          </w:p>
-        </w:tc>
-        <w:tc>
-          <w:tcPr>
-            <w:tcW w:w="973" w:type="dxa"/>
-          </w:tcPr>
-          <w:p>
-            <w:r>
-              <w:t>0.097</w:t>
-            </w:r>
-          </w:p>
-        </w:tc>
-        <w:tc>
-          <w:tcPr>
-            <w:tcW w:w="973" w:type="dxa"/>
-          </w:tcPr>
-          <w:p>
-            <w:r>
-              <w:t>0.38</w:t>
-            </w:r>
-          </w:p>
-        </w:tc>
-        <w:tc>
-          <w:tcPr>
-            <w:tcW w:w="973" w:type="dxa"/>
-          </w:tcPr>
-          <w:p>
-            <w:r>
-              <w:t>280</w:t>
+            <w:pPr>
+              <w:pStyle w:val="TableCell"/>
+            </w:pPr>
+            <w:r>
+              <w:t>−0.021 [−0.059, +0.014]</w:t>
+            </w:r>
+          </w:p>
+        </w:tc>
+        <w:tc>
+          <w:tcPr>
+            <w:tcW w:w="973" w:type="dxa"/>
+          </w:tcPr>
+          <w:p>
+            <w:pPr>
+              <w:pStyle w:val="TableCell"/>
+            </w:pPr>
+            <w:r>
+              <w:t>−0.11</w:t>
+            </w:r>
+          </w:p>
+        </w:tc>
+        <w:tc>
+          <w:tcPr>
+            <w:tcW w:w="973" w:type="dxa"/>
+          </w:tcPr>
+          <w:p>
+            <w:pPr>
+              <w:pStyle w:val="TableCell"/>
+            </w:pPr>
+            <w:r>
+              <w:t>0.271</w:t>
+            </w:r>
+          </w:p>
+        </w:tc>
+        <w:tc>
+          <w:tcPr>
+            <w:tcW w:w="973" w:type="dxa"/>
+          </w:tcPr>
+          <w:p>
+            <w:pPr>
+              <w:pStyle w:val="TableCell"/>
+            </w:pPr>
+            <w:r>
+              <w:t>0.20</w:t>
+            </w:r>
+          </w:p>
+        </w:tc>
+        <w:tc>
+          <w:tcPr>
+            <w:tcW w:w="973" w:type="dxa"/>
+          </w:tcPr>
+          <w:p>
+            <w:pPr>
+              <w:pStyle w:val="TableCell"/>
+            </w:pPr>
+            <w:r>
+              <w:t>607</w:t>
             </w:r>
           </w:p>
         </w:tc>
@@ -8736,6 +9229,9 @@
             <w:tcW w:w="973" w:type="dxa"/>
           </w:tcPr>
           <w:p>
+            <w:pPr>
+              <w:pStyle w:val="TableCell"/>
+            </w:pPr>
             <w:r>
               <w:t>HotpotQA</w:t>
             </w:r>
@@ -8746,26 +9242,35 @@
             <w:tcW w:w="973" w:type="dxa"/>
           </w:tcPr>
           <w:p>
-            <w:r>
-              <w:t>ROUGE-L</w:t>
-            </w:r>
-          </w:p>
-        </w:tc>
-        <w:tc>
-          <w:tcPr>
-            <w:tcW w:w="973" w:type="dxa"/>
-          </w:tcPr>
-          <w:p>
-            <w:r>
-              <w:t>RAPTOR</w:t>
-            </w:r>
-          </w:p>
-        </w:tc>
-        <w:tc>
-          <w:tcPr>
-            <w:tcW w:w="973" w:type="dxa"/>
-          </w:tcPr>
-          <w:p>
+            <w:pPr>
+              <w:pStyle w:val="TableCell"/>
+            </w:pPr>
+            <w:r>
+              <w:t>LLM-Judge</w:t>
+            </w:r>
+          </w:p>
+        </w:tc>
+        <w:tc>
+          <w:tcPr>
+            <w:tcW w:w="973" w:type="dxa"/>
+          </w:tcPr>
+          <w:p>
+            <w:pPr>
+              <w:pStyle w:val="TableCell"/>
+            </w:pPr>
+            <w:r>
+              <w:t>BM25</w:t>
+            </w:r>
+          </w:p>
+        </w:tc>
+        <w:tc>
+          <w:tcPr>
+            <w:tcW w:w="973" w:type="dxa"/>
+          </w:tcPr>
+          <w:p>
+            <w:pPr>
+              <w:pStyle w:val="TableCell"/>
+            </w:pPr>
             <w:r>
               <w:t>100</w:t>
             </w:r>
@@ -8776,48 +9281,63 @@
             <w:tcW w:w="973" w:type="dxa"/>
           </w:tcPr>
           <w:p>
-            <w:r>
-              <w:t>−0.021 [−0.059, +0.014]</w:t>
-            </w:r>
-          </w:p>
-        </w:tc>
-        <w:tc>
-          <w:tcPr>
-            <w:tcW w:w="973" w:type="dxa"/>
-          </w:tcPr>
-          <w:p>
-            <w:r>
-              <w:t>−0.11</w:t>
-            </w:r>
-          </w:p>
-        </w:tc>
-        <w:tc>
-          <w:tcPr>
-            <w:tcW w:w="973" w:type="dxa"/>
-          </w:tcPr>
-          <w:p>
-            <w:r>
-              <w:t>0.271</w:t>
-            </w:r>
-          </w:p>
-        </w:tc>
-        <w:tc>
-          <w:tcPr>
-            <w:tcW w:w="973" w:type="dxa"/>
-          </w:tcPr>
-          <w:p>
-            <w:r>
-              <w:t>0.20</w:t>
-            </w:r>
-          </w:p>
-        </w:tc>
-        <w:tc>
-          <w:tcPr>
-            <w:tcW w:w="973" w:type="dxa"/>
-          </w:tcPr>
-          <w:p>
-            <w:r>
-              <w:t>607</w:t>
+            <w:pPr>
+              <w:pStyle w:val="TableCell"/>
+            </w:pPr>
+            <w:r>
+              <w:t>+0.075 [+0.022, +0.127]</w:t>
+            </w:r>
+          </w:p>
+        </w:tc>
+        <w:tc>
+          <w:tcPr>
+            <w:tcW w:w="973" w:type="dxa"/>
+          </w:tcPr>
+          <w:p>
+            <w:pPr>
+              <w:pStyle w:val="TableCell"/>
+            </w:pPr>
+            <w:r>
+              <w:t>+0.28</w:t>
+            </w:r>
+          </w:p>
+        </w:tc>
+        <w:tc>
+          <w:tcPr>
+            <w:tcW w:w="973" w:type="dxa"/>
+          </w:tcPr>
+          <w:p>
+            <w:pPr>
+              <w:pStyle w:val="TableCell"/>
+            </w:pPr>
+            <w:r>
+              <w:t>0.008</w:t>
+            </w:r>
+          </w:p>
+        </w:tc>
+        <w:tc>
+          <w:tcPr>
+            <w:tcW w:w="973" w:type="dxa"/>
+          </w:tcPr>
+          <w:p>
+            <w:pPr>
+              <w:pStyle w:val="TableCell"/>
+            </w:pPr>
+            <w:r>
+              <w:t>0.79</w:t>
+            </w:r>
+          </w:p>
+        </w:tc>
+        <w:tc>
+          <w:tcPr>
+            <w:tcW w:w="973" w:type="dxa"/>
+          </w:tcPr>
+          <w:p>
+            <w:pPr>
+              <w:pStyle w:val="TableCell"/>
+            </w:pPr>
+            <w:r>
+              <w:t>103</w:t>
             </w:r>
           </w:p>
         </w:tc>
@@ -8828,6 +9348,9 @@
             <w:tcW w:w="973" w:type="dxa"/>
           </w:tcPr>
           <w:p>
+            <w:pPr>
+              <w:pStyle w:val="TableCell"/>
+            </w:pPr>
             <w:r>
               <w:t>HotpotQA</w:t>
             </w:r>
@@ -8838,6 +9361,9 @@
             <w:tcW w:w="973" w:type="dxa"/>
           </w:tcPr>
           <w:p>
+            <w:pPr>
+              <w:pStyle w:val="TableCell"/>
+            </w:pPr>
             <w:r>
               <w:t>LLM-Judge</w:t>
             </w:r>
@@ -8848,16 +9374,22 @@
             <w:tcW w:w="973" w:type="dxa"/>
           </w:tcPr>
           <w:p>
-            <w:r>
-              <w:t>BM25</w:t>
-            </w:r>
-          </w:p>
-        </w:tc>
-        <w:tc>
-          <w:tcPr>
-            <w:tcW w:w="973" w:type="dxa"/>
-          </w:tcPr>
-          <w:p>
+            <w:pPr>
+              <w:pStyle w:val="TableCell"/>
+            </w:pPr>
+            <w:r>
+              <w:t>Dense</w:t>
+            </w:r>
+          </w:p>
+        </w:tc>
+        <w:tc>
+          <w:tcPr>
+            <w:tcW w:w="973" w:type="dxa"/>
+          </w:tcPr>
+          <w:p>
+            <w:pPr>
+              <w:pStyle w:val="TableCell"/>
+            </w:pPr>
             <w:r>
               <w:t>100</w:t>
             </w:r>
@@ -8868,48 +9400,63 @@
             <w:tcW w:w="973" w:type="dxa"/>
           </w:tcPr>
           <w:p>
-            <w:r>
-              <w:t>+0.075 [+0.022, +0.127]</w:t>
-            </w:r>
-          </w:p>
-        </w:tc>
-        <w:tc>
-          <w:tcPr>
-            <w:tcW w:w="973" w:type="dxa"/>
-          </w:tcPr>
-          <w:p>
-            <w:r>
-              <w:t>+0.28</w:t>
-            </w:r>
-          </w:p>
-        </w:tc>
-        <w:tc>
-          <w:tcPr>
-            <w:tcW w:w="973" w:type="dxa"/>
-          </w:tcPr>
-          <w:p>
-            <w:r>
-              <w:t>0.008</w:t>
-            </w:r>
-          </w:p>
-        </w:tc>
-        <w:tc>
-          <w:tcPr>
-            <w:tcW w:w="973" w:type="dxa"/>
-          </w:tcPr>
-          <w:p>
-            <w:r>
-              <w:t>0.79</w:t>
-            </w:r>
-          </w:p>
-        </w:tc>
-        <w:tc>
-          <w:tcPr>
-            <w:tcW w:w="973" w:type="dxa"/>
-          </w:tcPr>
-          <w:p>
-            <w:r>
-              <w:t>103</w:t>
+            <w:pPr>
+              <w:pStyle w:val="TableCell"/>
+            </w:pPr>
+            <w:r>
+              <w:t>+0.051 [−0.001, +0.103]</w:t>
+            </w:r>
+          </w:p>
+        </w:tc>
+        <w:tc>
+          <w:tcPr>
+            <w:tcW w:w="973" w:type="dxa"/>
+          </w:tcPr>
+          <w:p>
+            <w:pPr>
+              <w:pStyle w:val="TableCell"/>
+            </w:pPr>
+            <w:r>
+              <w:t>+0.19</w:t>
+            </w:r>
+          </w:p>
+        </w:tc>
+        <w:tc>
+          <w:tcPr>
+            <w:tcW w:w="973" w:type="dxa"/>
+          </w:tcPr>
+          <w:p>
+            <w:pPr>
+              <w:pStyle w:val="TableCell"/>
+            </w:pPr>
+            <w:r>
+              <w:t>0.061</w:t>
+            </w:r>
+          </w:p>
+        </w:tc>
+        <w:tc>
+          <w:tcPr>
+            <w:tcW w:w="973" w:type="dxa"/>
+          </w:tcPr>
+          <w:p>
+            <w:pPr>
+              <w:pStyle w:val="TableCell"/>
+            </w:pPr>
+            <w:r>
+              <w:t>0.47</w:t>
+            </w:r>
+          </w:p>
+        </w:tc>
+        <w:tc>
+          <w:tcPr>
+            <w:tcW w:w="973" w:type="dxa"/>
+          </w:tcPr>
+          <w:p>
+            <w:pPr>
+              <w:pStyle w:val="TableCell"/>
+            </w:pPr>
+            <w:r>
+              <w:t>220</w:t>
             </w:r>
           </w:p>
         </w:tc>
@@ -8920,6 +9467,9 @@
             <w:tcW w:w="973" w:type="dxa"/>
           </w:tcPr>
           <w:p>
+            <w:pPr>
+              <w:pStyle w:val="TableCell"/>
+            </w:pPr>
             <w:r>
               <w:t>HotpotQA</w:t>
             </w:r>
@@ -8930,6 +9480,9 @@
             <w:tcW w:w="973" w:type="dxa"/>
           </w:tcPr>
           <w:p>
+            <w:pPr>
+              <w:pStyle w:val="TableCell"/>
+            </w:pPr>
             <w:r>
               <w:t>LLM-Judge</w:t>
             </w:r>
@@ -8940,16 +9493,22 @@
             <w:tcW w:w="973" w:type="dxa"/>
           </w:tcPr>
           <w:p>
-            <w:r>
-              <w:t>Dense</w:t>
-            </w:r>
-          </w:p>
-        </w:tc>
-        <w:tc>
-          <w:tcPr>
-            <w:tcW w:w="973" w:type="dxa"/>
-          </w:tcPr>
-          <w:p>
+            <w:pPr>
+              <w:pStyle w:val="TableCell"/>
+            </w:pPr>
+            <w:r>
+              <w:t>FlatRAG</w:t>
+            </w:r>
+          </w:p>
+        </w:tc>
+        <w:tc>
+          <w:tcPr>
+            <w:tcW w:w="973" w:type="dxa"/>
+          </w:tcPr>
+          <w:p>
+            <w:pPr>
+              <w:pStyle w:val="TableCell"/>
+            </w:pPr>
             <w:r>
               <w:t>100</w:t>
             </w:r>
@@ -8960,48 +9519,63 @@
             <w:tcW w:w="973" w:type="dxa"/>
           </w:tcPr>
           <w:p>
-            <w:r>
-              <w:t>+0.051 [−0.001, +0.103]</w:t>
-            </w:r>
-          </w:p>
-        </w:tc>
-        <w:tc>
-          <w:tcPr>
-            <w:tcW w:w="973" w:type="dxa"/>
-          </w:tcPr>
-          <w:p>
-            <w:r>
-              <w:t>+0.19</w:t>
-            </w:r>
-          </w:p>
-        </w:tc>
-        <w:tc>
-          <w:tcPr>
-            <w:tcW w:w="973" w:type="dxa"/>
-          </w:tcPr>
-          <w:p>
-            <w:r>
-              <w:t>0.061</w:t>
-            </w:r>
-          </w:p>
-        </w:tc>
-        <w:tc>
-          <w:tcPr>
-            <w:tcW w:w="973" w:type="dxa"/>
-          </w:tcPr>
-          <w:p>
-            <w:r>
-              <w:t>0.47</w:t>
-            </w:r>
-          </w:p>
-        </w:tc>
-        <w:tc>
-          <w:tcPr>
-            <w:tcW w:w="973" w:type="dxa"/>
-          </w:tcPr>
-          <w:p>
-            <w:r>
-              <w:t>220</w:t>
+            <w:pPr>
+              <w:pStyle w:val="TableCell"/>
+            </w:pPr>
+            <w:r>
+              <w:t>+0.035 [−0.013, +0.085]</w:t>
+            </w:r>
+          </w:p>
+        </w:tc>
+        <w:tc>
+          <w:tcPr>
+            <w:tcW w:w="973" w:type="dxa"/>
+          </w:tcPr>
+          <w:p>
+            <w:pPr>
+              <w:pStyle w:val="TableCell"/>
+            </w:pPr>
+            <w:r>
+              <w:t>+0.14</w:t>
+            </w:r>
+          </w:p>
+        </w:tc>
+        <w:tc>
+          <w:tcPr>
+            <w:tcW w:w="973" w:type="dxa"/>
+          </w:tcPr>
+          <w:p>
+            <w:pPr>
+              <w:pStyle w:val="TableCell"/>
+            </w:pPr>
+            <w:r>
+              <w:t>0.179</w:t>
+            </w:r>
+          </w:p>
+        </w:tc>
+        <w:tc>
+          <w:tcPr>
+            <w:tcW w:w="973" w:type="dxa"/>
+          </w:tcPr>
+          <w:p>
+            <w:pPr>
+              <w:pStyle w:val="TableCell"/>
+            </w:pPr>
+            <w:r>
+              <w:t>0.28</w:t>
+            </w:r>
+          </w:p>
+        </w:tc>
+        <w:tc>
+          <w:tcPr>
+            <w:tcW w:w="973" w:type="dxa"/>
+          </w:tcPr>
+          <w:p>
+            <w:pPr>
+              <w:pStyle w:val="TableCell"/>
+            </w:pPr>
+            <w:r>
+              <w:t>415</w:t>
             </w:r>
           </w:p>
         </w:tc>
@@ -9012,6 +9586,9 @@
             <w:tcW w:w="973" w:type="dxa"/>
           </w:tcPr>
           <w:p>
+            <w:pPr>
+              <w:pStyle w:val="TableCell"/>
+            </w:pPr>
             <w:r>
               <w:t>HotpotQA</w:t>
             </w:r>
@@ -9022,6 +9599,9 @@
             <w:tcW w:w="973" w:type="dxa"/>
           </w:tcPr>
           <w:p>
+            <w:pPr>
+              <w:pStyle w:val="TableCell"/>
+            </w:pPr>
             <w:r>
               <w:t>LLM-Judge</w:t>
             </w:r>
@@ -9032,16 +9612,22 @@
             <w:tcW w:w="973" w:type="dxa"/>
           </w:tcPr>
           <w:p>
-            <w:r>
-              <w:t>FlatRAG</w:t>
-            </w:r>
-          </w:p>
-        </w:tc>
-        <w:tc>
-          <w:tcPr>
-            <w:tcW w:w="973" w:type="dxa"/>
-          </w:tcPr>
-          <w:p>
+            <w:pPr>
+              <w:pStyle w:val="TableCell"/>
+            </w:pPr>
+            <w:r>
+              <w:t>RAPTOR</w:t>
+            </w:r>
+          </w:p>
+        </w:tc>
+        <w:tc>
+          <w:tcPr>
+            <w:tcW w:w="973" w:type="dxa"/>
+          </w:tcPr>
+          <w:p>
+            <w:pPr>
+              <w:pStyle w:val="TableCell"/>
+            </w:pPr>
             <w:r>
               <w:t>100</w:t>
             </w:r>
@@ -9052,98 +9638,9 @@
             <w:tcW w:w="973" w:type="dxa"/>
           </w:tcPr>
           <w:p>
-            <w:r>
-              <w:t>+0.035 [−0.013, +0.085]</w:t>
-            </w:r>
-          </w:p>
-        </w:tc>
-        <w:tc>
-          <w:tcPr>
-            <w:tcW w:w="973" w:type="dxa"/>
-          </w:tcPr>
-          <w:p>
-            <w:r>
-              <w:t>+0.14</w:t>
-            </w:r>
-          </w:p>
-        </w:tc>
-        <w:tc>
-          <w:tcPr>
-            <w:tcW w:w="973" w:type="dxa"/>
-          </w:tcPr>
-          <w:p>
-            <w:r>
-              <w:t>0.179</w:t>
-            </w:r>
-          </w:p>
-        </w:tc>
-        <w:tc>
-          <w:tcPr>
-            <w:tcW w:w="973" w:type="dxa"/>
-          </w:tcPr>
-          <w:p>
-            <w:r>
-              <w:t>0.28</w:t>
-            </w:r>
-          </w:p>
-        </w:tc>
-        <w:tc>
-          <w:tcPr>
-            <w:tcW w:w="973" w:type="dxa"/>
-          </w:tcPr>
-          <w:p>
-            <w:r>
-              <w:t>415</w:t>
-            </w:r>
-          </w:p>
-        </w:tc>
-      </w:tr>
-      <w:tr>
-        <w:tc>
-          <w:tcPr>
-            <w:tcW w:w="973" w:type="dxa"/>
-          </w:tcPr>
-          <w:p>
-            <w:r>
-              <w:t>HotpotQA</w:t>
-            </w:r>
-          </w:p>
-        </w:tc>
-        <w:tc>
-          <w:tcPr>
-            <w:tcW w:w="973" w:type="dxa"/>
-          </w:tcPr>
-          <w:p>
-            <w:r>
-              <w:t>LLM-Judge</w:t>
-            </w:r>
-          </w:p>
-        </w:tc>
-        <w:tc>
-          <w:tcPr>
-            <w:tcW w:w="973" w:type="dxa"/>
-          </w:tcPr>
-          <w:p>
-            <w:r>
-              <w:t>RAPTOR</w:t>
-            </w:r>
-          </w:p>
-        </w:tc>
-        <w:tc>
-          <w:tcPr>
-            <w:tcW w:w="973" w:type="dxa"/>
-          </w:tcPr>
-          <w:p>
-            <w:r>
-              <w:t>100</w:t>
-            </w:r>
-          </w:p>
-        </w:tc>
-        <w:tc>
-          <w:tcPr>
-            <w:tcW w:w="973" w:type="dxa"/>
-          </w:tcPr>
-          <w:p>
+            <w:pPr>
+              <w:pStyle w:val="TableCell"/>
+            </w:pPr>
             <w:r>
               <w:t>+0.064 [+0.007, +0.121]</w:t>
             </w:r>
@@ -9154,6 +9651,9 @@
             <w:tcW w:w="973" w:type="dxa"/>
           </w:tcPr>
           <w:p>
+            <w:pPr>
+              <w:pStyle w:val="TableCell"/>
+            </w:pPr>
             <w:r>
               <w:t>+0.22</w:t>
             </w:r>
@@ -9164,6 +9664,9 @@
             <w:tcW w:w="973" w:type="dxa"/>
           </w:tcPr>
           <w:p>
+            <w:pPr>
+              <w:pStyle w:val="TableCell"/>
+            </w:pPr>
             <w:r>
               <w:t>0.032</w:t>
             </w:r>
@@ -9174,6 +9677,9 @@
             <w:tcW w:w="973" w:type="dxa"/>
           </w:tcPr>
           <w:p>
+            <w:pPr>
+              <w:pStyle w:val="TableCell"/>
+            </w:pPr>
             <w:r>
               <w:t>0.59</w:t>
             </w:r>
@@ -9184,6 +9690,9 @@
             <w:tcW w:w="973" w:type="dxa"/>
           </w:tcPr>
           <w:p>
+            <w:pPr>
+              <w:pStyle w:val="TableCell"/>
+            </w:pPr>
             <w:r>
               <w:t>164</w:t>
             </w:r>
@@ -9196,7 +9705,11 @@
         <w:pStyle w:val="PostHeadPara"/>
       </w:pPr>
       <w:r>
-        <w:t>The analysis shows where the advantage is genuine and adequately powered and where it is not. On the general benchmark every comparison has power ≈ 1.0 and needs only n ≈ 7–22 paired items for 80% power, so those samples are not a threat to validity. Conversely, medical vs. BM25 (Δ = +0.007, p_perm = 0.63) and the HotpotQA LLM-Judge comparisons against Dense and FlatRAG remain underpowered (n₈₀ = 220 and 415), and we do not claim them as wins. The HotpotQA rows also make the metric dependence explicit: flat baselines lead on ROUGE-L, while on LLM-Judge PageTree-RAG (DFS) beats BM25 (Δ = +0.075, p_perm = 0.008) and RAPTOR (Δ = +0.064, p_perm = 0.032) with adequate power.</w:t>
+        <w:t xml:space="preserve">The analysis shows where the advantage is genuine and adequately powered and where it is not. On the general benchmark every comparison has power ≈ 1.0 and needs only n ≈ 7–22 paired items for 80% power, so those samples are not a threat to validity. Conversely, medical vs. BM25 (Δ = +0.007, p_perm = 0.63) and the HotpotQA LLM-Judge comparisons against Dense and FlatRAG remain underpowered (n₈₀ = 220 and 415), and we do not claim them as wins. The HotpotQA </w:t>
+      </w:r>
+      <w:r>
+        <w:lastRenderedPageBreak/>
+        <w:t>rows also make the metric dependence explicit: flat baselines lead on ROUGE-L, while on LLM-Judge PageTree-RAG (DFS) beats BM25 (Δ = +0.075, p_perm = 0.008) and RAPTOR (Δ = +0.064, p_perm = 0.032) with adequate power.</w:t>
       </w:r>
     </w:p>
     <w:p>
@@ -9220,11 +9733,51 @@
         <w:pStyle w:val="PostHeadPara"/>
       </w:pPr>
       <w:r>
-        <w:t xml:space="preserve">Our results draw a sharp line between two kinds of benefit that hierarchical retrieval is often assumed to deliver together. The first-page-level provenance and a compact, structurally coherent context-is real and survives fair evaluation: PageTree-RAG (Beam) cites the right sections most accurately (Table 9) and reaches the highest judged quality on an order of magnitude fewer context tokens (Table 8). These follow directly from the representation: each node carries a page range, and selecting a relevant subtree yields a small, on-topic context rather than a scattering of chunks. The second supposed benefit-higher lexical overlap with reference answers-does not survive: once every system generates fluent text with the same LLM, the section boundary confers no advantage in n-gram overlap, and a hybrid flat retriever (FlatRAG) actually scores higher on ROUGE-L. In short, structure buys verifiability and efficiency, not surface-string similarity, and earlier </w:t>
+        <w:t>Our results draw a sharp line between two kinds of benefit that hierarchical retrieval is often assumed to deliver together. The first-page-level provenance and a compact, structurally coherent context-is real and survives fair evaluation: PageTree-RAG (Beam) cites the right sections most accurately (Table 9) and reaches the highest judged quality on an order of magnitude fewer context tokens (Table 8). These follow directly from the representation: each node carries a page range, and selecting a relevant subtree yields a small, on-topic context rather than a scattering of chunks. The second supposed benefit-higher lexical overlap with reference answers-does not survive: once every system generates fluent text with the same LLM, the section boundary confers no advantage in n-gram overlap, and a hybrid flat retriever (FlatRAG) actually scores higher on ROUGE-L. In short, structure buys verifiability and efficiency, not surface-string similarity, and earlier hierarchical-RAG results that claimed large ROUGE-L gains likely measured an evaluation artifact rather than a retrieval improvement.</w:t>
+      </w:r>
+    </w:p>
+    <w:p>
+      <w:pPr>
+        <w:pStyle w:val="PostHeadPara"/>
+      </w:pPr>
+      <w:r>
+        <w:t>The expanded multi-hop evaluation (Section 5.6) is a clean test of this distinction. On the 100-question HotpotQA set the lexical and semantic verdicts point in opposite directions: the flat baselines lead on ROUGE-L while our DFS variant attains the highest LLM-Judge score, significantly above BM25 and RAPTOR. Because HotpotQA references are terse factoids, longest-common-subsequence recall rewards whichever system reproduces the reference surface form rather than whichever answer is most adequate; the judge, which scores adequacy, recovers the structure-aware advantage. This is the same mechanism described above, now observed on an independent multi-hop benchmark, and it is why we frame the multi-hop contribution around judged quality rather than ROUGE-L.</w:t>
+      </w:r>
+    </w:p>
+    <w:p>
+      <w:pPr>
+        <w:pStyle w:val="Head2"/>
+      </w:pPr>
+      <w:r>
+        <w:t>DFS versus Beam Search</w:t>
+      </w:r>
+    </w:p>
+    <w:p>
+      <w:pPr>
+        <w:pStyle w:val="PostHeadPara"/>
+      </w:pPr>
+      <w:r>
+        <w:t>Under the fair protocol, Beam Search is the better default. It attains the highest LLM-Judge overall (0.823), the best citation F1 (0.757), and the only statistically significant per-type advantage we observe (multi-hop over Dense Retrieval, p = 0.044). DFS is more token-frugal still (8 vs. 16 tokens) but scores lower on quality and is marginally slower because it expands more nodes through the LLM scorer. We therefore recommend Beam as the production default and reserve DFS for extreme context-budget constraints. A query-complexity classifier that routes between the two remains attractive future work.</w:t>
+      </w:r>
+    </w:p>
+    <w:p>
+      <w:pPr>
+        <w:pStyle w:val="Head2"/>
+      </w:pPr>
+      <w:r>
+        <w:t>Error Analysis and Case Study</w:t>
+      </w:r>
+    </w:p>
+    <w:p>
+      <w:pPr>
+        <w:pStyle w:val="PostHeadPara"/>
+      </w:pPr>
+      <w:r>
+        <w:t xml:space="preserve">To see where PageTree-RAG succeeds and fails, we inspected all 100 HotpotQA answers per system. Two failure modes dominate, and both originate in the generator rather than in retrieval. First, language drift: the shared Llama 3.1 8B generator answers in Korean on 28 of 100 English questions (versus 22 for BM25 and 14 for FlatRAG), a side effect of the domain-adaptive multilingual prompting; such answers earn near-zero ROUGE against the short English references and a slightly lower LLM-Judge (0.59 versus 0.63 for the model's English answers), so they depress lexical scores far more than semantic ones. Second, terse or malformed generation: on hard bridge questions the 8B model occasionally emits sentence fragments or leaks an internal document identifier, yielding outright errors (LLM-Judge ≤ 0.4 on 14 of 100 questions). Crucially, on 13 of 100 questions PageTree-RAG's answer is judged at least as good as the best baseline while scoring lower on ROUGE—per-question confirmation of the metric divergence quantified in Section 5.7. Because both </w:t>
       </w:r>
       <w:r>
         <w:lastRenderedPageBreak/>
-        <w:t>hierarchical-RAG results that claimed large ROUGE-L gains likely measured an evaluation artifact rather than a retrieval improvement.</w:t>
+        <w:t>dominant failure modes stem from the weak local generator, a stronger generator should raise absolute scores without altering the retrieval-level ordering (Limitations, Section 6).</w:t>
       </w:r>
     </w:p>
     <w:p>
@@ -9232,7 +9785,7 @@
         <w:pStyle w:val="PostHeadPara"/>
       </w:pPr>
       <w:r>
-        <w:t>The expanded multi-hop evaluation (Section 5.6) is a clean test of this distinction. On the 100-question HotpotQA set the lexical and semantic verdicts point in opposite directions: the flat baselines lead on ROUGE-L while our DFS variant attains the highest LLM-Judge score, significantly above BM25 and RAPTOR. Because HotpotQA references are terse factoids, longest-common-subsequence recall rewards whichever system reproduces the reference surface form rather than whichever answer is most adequate; the judge, which scores adequacy, recovers the structure-aware advantage. This is the same mechanism described above, now observed on an independent multi-hop benchmark, and it is why we frame the multi-hop contribution around judged quality rather than ROUGE-L.</w:t>
+        <w:t>Two examples make this concrete. For the comparison question “Are John O’Hara and Rabindranath Tagore the same nationality?” (reference: “no”), PageTree-RAG (Beam) selects both authors’ biography nodes and generates a correct, sourced explanation—O’Hara is American, Tagore Indian—rated 0.93 by the judge, whereas BM25 merely echoes the question (0.00) and FlatRAG hedges (0.47); every system scores ROUGE ≈ 0 because none reproduces the one-word reference, and PageTree-RAG’s answer, though correct, is emitted in Korean (the drift noted above). This is precisely the case hierarchical retrieval should win and lexical metrics cannot see. Conversely, for a bridge question on the directing award of a 2008 David Fincher film (reference: “Academy Award for Best Art Direction”), PageTree-RAG (Beam) mis-generates a truncated fragment and leaks an internal identifier (0.20) while Dense Retrieval answers correctly (0.93); here the relevant section was retrieved but the 8B decoder garbled the answer, a generation failure rather than a node-selection failure. Together these cases show that PageTree-RAG’s remaining errors are concentrated in generation, motivating a stronger generator and the semantic detector signal discussed in Section 6.</w:t>
       </w:r>
     </w:p>
     <w:p>
@@ -9240,7 +9793,7 @@
         <w:pStyle w:val="Head2"/>
       </w:pPr>
       <w:r>
-        <w:t>DFS versus Beam Search</w:t>
+        <w:t>Threats to Validity</w:t>
       </w:r>
     </w:p>
     <w:p>
@@ -9248,7 +9801,7 @@
         <w:pStyle w:val="PostHeadPara"/>
       </w:pPr>
       <w:r>
-        <w:t>Under the fair protocol, Beam Search is the better default. It attains the highest LLM-Judge overall (0.823), the best citation F1 (0.757), and the only statistically significant per-type advantage we observe (multi-hop over Dense Retrieval, p = 0.044). DFS is more token-frugal still (8 vs. 16 tokens) but scores lower on quality and is marginally slower because it expands more nodes through the LLM scorer. We therefore recommend Beam as the production default and reserve DFS for extreme context-budget constraints. A query-complexity classifier that routes between the two remains attractive future work.</w:t>
+        <w:t>Several caveats bound our conclusions. Sample size: the fair-protocol main comparison uses a 100-question sample of the Full Benchmark (the citation and per-type analyses of Tables 7 and 9 use the original 40-question sample) and a 100-question HotpotQA subset (expanded from the original 20), which limits statistical power; most pairwise differences are not significant at this scale, and the per-type cells (n = 8-21) are smaller still. Single generator and judge: all generative results use one local model (Llama 3.1 8B) for both answer generation and LLM-as-Judge, so judge scores could carry model-specific preferences; because every answer under comparison is produced by that same model, this is not a per-system self-preference, but to probe this we re-scored the 100-question fair set with a second, independent local judge (Qwen2.5-7B): the two judges' system rankings are positively correlated (Spearman ρ = 0.60; not significant at n = 6 systems, p = 0.21), and both rank RAPTOR lowest and PageTree-RAG (Beam) in the top two, indicating our conclusions are not an artifact of a single judge—though some mid-rank reordering (notably FlatRAG) shows judge choice does shift absolute positions. Corroboration with a hosted frontier judge remains valuable future work. Citation metric: Citation F1 is computed against gold supporting sections and rewards systems that emit section/page identifiers; it measures provenance fidelity, not answer correctness. Generator scale: an 8B local model is weaker than hosted frontier models, and absolute scores would likely rise with a stronger generator, though we have no evidence the relative ordering would change. Larger-sample, multi-model replication is the primary item of future work.</w:t>
       </w:r>
     </w:p>
     <w:p>
@@ -9256,7 +9809,7 @@
         <w:pStyle w:val="Head2"/>
       </w:pPr>
       <w:r>
-        <w:t>Error Analysis and Case Study</w:t>
+        <w:t>Limitations</w:t>
       </w:r>
     </w:p>
     <w:p>
@@ -9264,7 +9817,19 @@
         <w:pStyle w:val="PostHeadPara"/>
       </w:pPr>
       <w:r>
-        <w:t>To see where PageTree-RAG succeeds and fails, we inspected all 100 HotpotQA answers per system. Two failure modes dominate, and both originate in the generator rather than in retrieval. First, language drift: the shared Llama 3.1 8B generator answers in Korean on 28 of 100 English questions (versus 22 for BM25 and 14 for FlatRAG), a side effect of the domain-adaptive multilingual prompting; such answers earn near-zero ROUGE against the short English references and a slightly lower LLM-Judge (0.59 versus 0.63 for the model's English answers), so they depress lexical scores far more than semantic ones. Second, terse or malformed generation: on hard bridge questions the 8B model occasionally emits sentence fragments or leaks an internal document identifier, yielding outright errors (LLM-Judge ≤ 0.4 on 14 of 100 questions). Crucially, on 13 of 100 questions PageTree-RAG's answer is judged at least as good as the best baseline while scoring lower on ROUGE—per-question confirmation of the metric divergence quantified in Section 5.7. Because both dominant failure modes stem from the weak local generator, a stronger generator should raise absolute scores without altering the retrieval-level ordering (Limitations, Section 6).</w:t>
+        <w:t xml:space="preserve">Beyond the evaluation caveats of Section 6.3, the system has three engineering limitations. LLM dependency: indexing requires an LLM call per document, and traversal issues several LLM calls for node scoring, which is the source of PageTree-RAG's higher query latency. Structural prompt brittleness: documents with inconsistent heading styles (for example scanned PDFs with OCR artifacts) may yield malformed index trees requiring manual correction. Learned scoring: we attempted learned node scoring via DSPy [15] with an open 70B model; optimization yielded no improvement (0.0% gain), likely due to insufficient training signal (fewer than 100 labeled examples), and we exclude this component from the main system. Score feature design: the relevance function uses three interpretable signals (semantic, keyword, structural); richer scorers—BM25 term weighting, cross-encoder rerankers, or a fully learned scorer—are a natural extension we leave to future work. Detector signals: the hallucination detector currently relies on lexical and citation </w:t>
+      </w:r>
+      <w:r>
+        <w:lastRenderedPageBreak/>
+        <w:t>overlap, so it inherits the limits of surface-level matching; adding a semantic embedding-similarity signal would strengthen it and is a straightforward future improvement.</w:t>
+      </w:r>
+    </w:p>
+    <w:p>
+      <w:pPr>
+        <w:pStyle w:val="Head2"/>
+      </w:pPr>
+      <w:r>
+        <w:t>Broader Impact</w:t>
       </w:r>
     </w:p>
     <w:p>
@@ -9272,7 +9837,7 @@
         <w:pStyle w:val="PostHeadPara"/>
       </w:pPr>
       <w:r>
-        <w:t>Two examples make this concrete. For the comparison question “Are John O’Hara and Rabindranath Tagore the same nationality?” (reference: “no”), PageTree-RAG (Beam) selects both authors’ biography nodes and generates a correct, sourced explanation—O’Hara is American, Tagore Indian—rated 0.93 by the judge, whereas BM25 merely echoes the question (0.00) and FlatRAG hedges (0.47); every system scores ROUGE ≈ 0 because none reproduces the one-word reference, and PageTree-RAG’s answer, though correct, is emitted in Korean (the drift noted above). This is precisely the case hierarchical retrieval should win and lexical metrics cannot see. Conversely, for a bridge question on the directing award of a 2008 David Fincher film (reference: “Academy Award for Best Art Direction”), PageTree-RAG (Beam) mis-generates a truncated fragment and leaks an internal identifier (0.20) while Dense Retrieval answers correctly (0.93); here the relevant section was retrieved but the 8B decoder garbled the answer, a generation failure rather than a node-selection failure. Together these cases show that PageTree-RAG’s remaining errors are concentrated in generation, motivating a stronger generator and the semantic detector signal discussed in Section 6.</w:t>
+        <w:t>Because PageTree-RAG preserves page-level provenance, it is well suited to high-stakes domains-medicine, law, and regulatory compliance-where unsupported claims carry real cost and every assertion must be traceable to a source span. The same property aids auditing and post-hoc verification. Conversely, the system inherits the biases of its underlying LLM during indexing and generation, and the lightweight hallucination detector reduces but does not eliminate unfaithful output; deployments in sensitive settings should retain a human-in-the-loop for final decisions.</w:t>
       </w:r>
     </w:p>
     <w:p>
@@ -9280,7 +9845,7 @@
         <w:pStyle w:val="Head2"/>
       </w:pPr>
       <w:r>
-        <w:t>Threats to Validity</w:t>
+        <w:t>Reproducibility</w:t>
       </w:r>
     </w:p>
     <w:p>
@@ -9288,15 +9853,15 @@
         <w:pStyle w:val="PostHeadPara"/>
       </w:pPr>
       <w:r>
-        <w:t>Several caveats bound our conclusions. Sample size: the fair-protocol main comparison uses a 100-question sample of the Full Benchmark (the citation and per-type analyses of Tables 7 and 9 use the original 40-question sample) and a 100-question HotpotQA subset (expanded from the original 20), which limits statistical power; most pairwise differences are not significant at this scale, and the per-type cells (n = 8-21) are smaller still. Single generator and judge: all generative results use one local model (Llama 3.1 8B) for both answer generation and LLM-as-Judge, so judge scores could carry model-specific preferences; because every answer under comparison is produced by that same model, this is not a per-system self-preference, but to probe this we re-scored the 100-question fair set with a second, independent local judge (Qwen2.5-7B): the two judges' system rankings are positively correlated (Spearman ρ = 0.60; not significant at n = 6 systems, p = 0.21), and both rank RAPTOR lowest and PageTree-RAG (Beam) in the top two, indicating our conclusions are not an artifact of a single judge—though some mid-rank reordering (notably FlatRAG) shows judge choice does shift absolute positions. Corroboration with a hosted frontier judge remains valuable future work. Citation metric: Citation F1 is computed against gold supporting sections and rewards systems that emit section/page identifiers; it measures provenance fidelity, not answer correctness. Generator scale: an 8B local model is weaker than hosted frontier models, and absolute scores would likely rise with a stronger generator, though we have no evidence the relative ordering would change. Larger-sample, multi-model replication is the primary item of future work.</w:t>
-      </w:r>
-    </w:p>
-    <w:p>
-      <w:pPr>
-        <w:pStyle w:val="Head2"/>
-      </w:pPr>
-      <w:r>
-        <w:t>Limitations</w:t>
+        <w:t>To support replication we release the full pipeline: the PDF-to-tree indexer, the traversal-policy and compression code, all four evaluation sets (Full Benchmark, HotpotQA, Medical, and GovReport), the offline extractive and fair generative harnesses, the LLM-as-Judge prompts, and the page-indexed JSON tree schema. All generative results use a single local model, Llama 3.1 8B served via Ollama, for both answer generation and judging; the independent-judge cross-check uses Qwen2.5-7B. Every run fixes the random seed to 42, and no GPU cluster is required—the system runs on a single commodity machine with a local 8B model. Prompts, hyperparameter defaults (traversal weights, beam width W = 5, tree depth, compression threshold τ = 0.7), and per-question outputs are included so that all tables and figures can be regenerated end-to-end.</w:t>
+      </w:r>
+    </w:p>
+    <w:p>
+      <w:pPr>
+        <w:pStyle w:val="Head1"/>
+      </w:pPr>
+      <w:r>
+        <w:t>CONCLUSION</w:t>
       </w:r>
     </w:p>
     <w:p>
@@ -9304,76 +9869,27 @@
         <w:pStyle w:val="PostHeadPara"/>
       </w:pPr>
       <w:r>
-        <w:t xml:space="preserve">Beyond the evaluation caveats of Section 6.3, the system has three engineering limitations. LLM dependency: indexing requires an LLM call per document, and traversal issues several LLM calls for node scoring, which is the source of PageTree-RAG's higher query latency. Structural prompt brittleness: documents with inconsistent heading styles (for example scanned PDFs with OCR artifacts) may yield malformed index trees requiring manual correction. Learned scoring: we attempted learned node scoring via DSPy [15] with an open 70B model; optimization yielded no improvement (0.0% gain), likely due to insufficient training signal (fewer than 100 labeled examples), and we exclude this component from </w:t>
+        <w:t>We presented PageTree-RAG, a hierarchical document RAG system that indexes PDFs into page-referenced JSON trees using zero-shot LLM prompting, traverses them with DFS or Beam Search, compresses retrieved context, and validates generated answers with a lightweight five-signal hallucination detector. Evaluating all systems under a fair protocol in which only the retriever differs and a shared local LLM (Llama 3.1 8B) generates every answer, we found that PageTree-RAG (Beam) produces the most accurate page-level citations (citation F1 = 0.757 vs. 0.000 for the abstractive RAPTOR baseline), the highest LLM-judged answer quality on multi-hop and comparative questions (0.818 and 0.850; multi-hop advantage over Dense Retrieval significant at p = 0.044), and competitive overall quality (highest LLM-Judge, 0.823) while feeding an order of magnitude fewer context tokens to the generator-at the cost of higher per-query latency. Just as importantly, we showed that offline extractive evaluation and lexical-overlap metrics reverse these conclusions and overstate flat retrieval, and we reported both regimes so that the discrepancy is explicit; we encourage future hierarchical-RAG work to adopt generator-controlled evaluation and to measure citation and efficiency directly. The system also provides domain-adaptive prompting, multilingual support, and a production-ready API with caching, rate limiting, and asynchronous task queuing. Future work will pursue (1) larger-sample, multi-model replication of the fair protocol; (2) Graph RAG integration [3] for inter-document relationship modeling; (3) multi-modal indexing for figures and tables; and (4) learning the adaptive traversal policy end-to-end from user-feedback signals, together with cross-document reasoning and multi-modal indexing.</w:t>
+      </w:r>
+    </w:p>
+    <w:p>
+      <w:pPr>
+        <w:pStyle w:val="AckHead"/>
+      </w:pPr>
+      <w:r>
+        <w:t>GenAI Usage Disclosure</w:t>
+      </w:r>
+    </w:p>
+    <w:p>
+      <w:pPr>
+        <w:pStyle w:val="AckPara"/>
+      </w:pPr>
+      <w:r>
+        <w:t xml:space="preserve">Generative AI is a core component of the described system (LLM-driven tree indexing, answer generation, and LLM-as-judge evaluation), as detailed in Sections 3-5. In preparing this manuscript, generative AI tools were also used for language </w:t>
       </w:r>
       <w:r>
         <w:lastRenderedPageBreak/>
-        <w:t>the main system. Score feature design: the relevance function uses three interpretable signals (semantic, keyword, structural); richer scorers—BM25 term weighting, cross-encoder rerankers, or a fully learned scorer—are a natural extension we leave to future work. Detector signals: the hallucination detector currently relies on lexical and citation overlap, so it inherits the limits of surface-level matching; adding a semantic embedding-similarity signal would strengthen it and is a straightforward future improvement.</w:t>
-      </w:r>
-    </w:p>
-    <w:p>
-      <w:pPr>
-        <w:pStyle w:val="Head2"/>
-      </w:pPr>
-      <w:r>
-        <w:t>Broader Impact</w:t>
-      </w:r>
-    </w:p>
-    <w:p>
-      <w:pPr>
-        <w:pStyle w:val="PostHeadPara"/>
-      </w:pPr>
-      <w:r>
-        <w:t>Because PageTree-RAG preserves page-level provenance, it is well suited to high-stakes domains-medicine, law, and regulatory compliance-where unsupported claims carry real cost and every assertion must be traceable to a source span. The same property aids auditing and post-hoc verification. Conversely, the system inherits the biases of its underlying LLM during indexing and generation, and the lightweight hallucination detector reduces but does not eliminate unfaithful output; deployments in sensitive settings should retain a human-in-the-loop for final decisions.</w:t>
-      </w:r>
-    </w:p>
-    <w:p>
-      <w:pPr>
-        <w:pStyle w:val="Head2"/>
-      </w:pPr>
-      <w:r>
-        <w:t>Reproducibility</w:t>
-      </w:r>
-    </w:p>
-    <w:p>
-      <w:pPr>
-        <w:pStyle w:val="PostHeadPara"/>
-      </w:pPr>
-      <w:r>
-        <w:t>To support replication we release the full pipeline: the PDF-to-tree indexer, the traversal-policy and compression code, all four evaluation sets (Full Benchmark, HotpotQA, Medical, and GovReport), the offline extractive and fair generative harnesses, the LLM-as-Judge prompts, and the page-indexed JSON tree schema. All generative results use a single local model, Llama 3.1 8B served via Ollama, for both answer generation and judging; the independent-judge cross-check uses Qwen2.5-7B. Every run fixes the random seed to 42, and no GPU cluster is required—the system runs on a single commodity machine with a local 8B model. Prompts, hyperparameter defaults (traversal weights, beam width W = 5, tree depth, compression threshold τ = 0.7), and per-question outputs are included so that all tables and figures can be regenerated end-to-end.</w:t>
-      </w:r>
-    </w:p>
-    <w:p>
-      <w:pPr>
-        <w:pStyle w:val="Head1"/>
-      </w:pPr>
-      <w:r>
-        <w:t>CONCLUSION</w:t>
-      </w:r>
-    </w:p>
-    <w:p>
-      <w:pPr>
-        <w:pStyle w:val="PostHeadPara"/>
-      </w:pPr>
-      <w:r>
-        <w:t>We presented PageTree-RAG, a hierarchical document RAG system that indexes PDFs into page-referenced JSON trees using zero-shot LLM prompting, traverses them with DFS or Beam Search, compresses retrieved context, and validates generated answers with a lightweight five-signal hallucination detector. Evaluating all systems under a fair protocol in which only the retriever differs and a shared local LLM (Llama 3.1 8B) generates every answer, we found that PageTree-RAG (Beam) produces the most accurate page-level citations (citation F1 = 0.757 vs. 0.000 for the abstractive RAPTOR baseline), the highest LLM-judged answer quality on multi-hop and comparative questions (0.818 and 0.850; multi-hop advantage over Dense Retrieval significant at p = 0.044), and competitive overall quality (highest LLM-Judge, 0.823) while feeding an order of magnitude fewer context tokens to the generator-at the cost of higher per-query latency. Just as importantly, we showed that offline extractive evaluation and lexical-overlap metrics reverse these conclusions and overstate flat retrieval, and we reported both regimes so that the discrepancy is explicit; we encourage future hierarchical-RAG work to adopt generator-controlled evaluation and to measure citation and efficiency directly. The system also provides domain-adaptive prompting, multilingual support, and a production-ready API with caching, rate limiting, and asynchronous task queuing. Future work will pursue (1) larger-sample, multi-model replication of the fair protocol; (2) Graph RAG integration [3] for inter-document relationship modeling; (3) multi-modal indexing for figures and tables; and (4) learning the adaptive traversal policy end-to-end from user-feedback signals, together with cross-document reasoning and multi-modal indexing.</w:t>
-      </w:r>
-    </w:p>
-    <w:p>
-      <w:pPr>
-        <w:pStyle w:val="AckHead"/>
-      </w:pPr>
-      <w:r>
-        <w:lastRenderedPageBreak/>
-        <w:t>GenAI Usage Disclosure</w:t>
-      </w:r>
-    </w:p>
-    <w:p>
-      <w:pPr>
-        <w:pStyle w:val="AckPara"/>
-      </w:pPr>
-      <w:r>
-        <w:t>Generative AI is a core component of the described system (LLM-driven tree indexing, answer generation, and LLM-as-judge evaluation), as detailed in Sections 3-5. In preparing this manuscript, generative AI tools were also used for language editing and reference formatting; all technical content, experimental design, analysis, and claims were produced and verified by the authors.</w:t>
+        <w:t>editing and reference formatting; all technical content, experimental design, analysis, and claims were produced and verified by the authors.</w:t>
       </w:r>
     </w:p>
     <w:p>
@@ -9681,7 +10197,6 @@
         </w:numPr>
       </w:pPr>
       <w:r>
-        <w:lastRenderedPageBreak/>
         <w:t>[25] Sewon Min, Kalpesh Krishna, Xinxi Lyu, Mike Lewis, Wen-tau Yih, Pang Wei Koh, Mohit Iyyer, Luke Zettlemoyer, and Hannaneh Hajishirzi. 2023. FActScore: Fine-grained Atomic Evaluation of Factual Precision in Long Form Text Generation. In Proc. EMNLP 2023. arXiv:2305.14251.</w:t>
       </w:r>
     </w:p>
@@ -9706,6 +10221,7 @@
         </w:numPr>
       </w:pPr>
       <w:r>
+        <w:lastRenderedPageBreak/>
         <w:t>[27] Nils Reimers and Iryna Gurevych. 2019. Sentence-BERT: Sentence Embeddings using Siamese BERT-Networks. In Proc. EMNLP 2019, 3982-3992. arXiv:1908.10084.</w:t>
       </w:r>
     </w:p>

</xml_diff>

<commit_message>
Add script for generating 95% CI forest plot and new temporary document
- Implemented `plot_ci_forest.py` to create a forest plot visualizing the robust small-sample statistics from Table 13 of the manuscript.
- The script generates a figure summarizing paired mean differences and confidence intervals for various benchmarks.
- Added a new temporary document `~$eeRAG_TIST_ACM.docx`.
</commit_message>
<xml_diff>
--- a/TreeRAG_TIST_ACM.docx
+++ b/TreeRAG_TIST_ACM.docx
@@ -147,7 +147,7 @@
         <w:pStyle w:val="Para"/>
       </w:pPr>
       <w:r>
-        <w:t>We introduce PageTree-RAG. Unlike prior hierarchical RAG systems, which optimize retrieval quality in isolation and are judged largely by lexical-overlap metrics, PageTree-RAG jointly targets three properties that matter for deployment in citation-critical domains—page-level citation faithfulness, an order-of-magnitude reduction in the context handed to the generator, and a generator-controlled evaluation that isolates the retriever's contribution—over a single page-aware tree built zero-shot from raw PDFs. We do not claim hierarchical retrieval per se as novel—it builds on RAPTOR [30] and PageIndex [33]—but rather this specific combination of a vectorless page-referenced tree, query-time traversal selection, integrated compression, and citation-faithful, generator-controlled evaluation, which together prioritize verifiability and token efficiency over lexical-overlap scores. Algorithmically, the core mechanism is the adaptive traversal policy—a single query-conditioned function that scores tree nodes and selects the traversal strategy per query—so that retrieval effort scales with query complexity rather than being fixed in advance as in prior hierarchical RAG. Our contributions are as follows.</w:t>
+        <w:t>We introduce PageTree-RAG. Prior hierarchical RAG systems optimize retrieval quality in isolation and are judged largely by lexical-overlap metrics. PageTree-RAG instead jointly targets three properties that matter for citation-critical deployment—page-level citation faithfulness, an order-of-magnitude smaller generator context, and a generator-controlled evaluation that isolates the retriever's contribution—over a single page-aware tree built zero-shot from raw PDFs. We do not claim hierarchical retrieval per se as novel—it builds on RAPTOR [30] and PageIndex [33]—but rather this specific combination of a vectorless page-referenced tree, query-time traversal selection, integrated compression, and citation-faithful, generator-controlled evaluation, which together prioritize verifiability and token efficiency over lexical-overlap scores. Algorithmically, the core mechanism is the adaptive traversal policy—a single query-conditioned function that scores tree nodes and selects the traversal strategy per query—so that retrieval effort scales with query complexity rather than being fixed in advance as in prior hierarchical RAG. Our contributions are as follows.</w:t>
       </w:r>
     </w:p>
     <w:p>
@@ -1641,6 +1641,14 @@
       </w:pPr>
       <w:r>
         <w:t>Here semantic(v, q) is keyword overlap between the query and the node's title and summary, normalized by query length; structural(depth) is a depth-decay factor that slightly penalizes very deep nodes, encoding the prior that high-level sections capture broader relevance; and contextual(v, parent) is semantic overlap between the node and its parent's accumulated context string, encouraging traversal paths that maintain thematic coherence. The weights (λ₁, λ₂, λ₃) = (0.7, 0.2, 0.1) are fixed heuristic defaults, constrained to sum to one and set so that semantic similarity dominates while structural depth and parental coherence break ties. The method is not sensitive to these values: the ablation in Section 5.4 shows judged quality is stable across alternative weightings, with LLM-Judge varying by less than 0.03 across the four tested settings (Table 6). A learned alternative (Section 6, Limitations) yielded no improvement under our limited supervision, so we retain the interpretable fixed weights as the policy's default operating point, and leave learned or Bayesian-optimized weighting to future work.</w:t>
+      </w:r>
+    </w:p>
+    <w:p>
+      <w:pPr>
+        <w:pStyle w:val="Para"/>
+      </w:pPr>
+      <w:r>
+        <w:t>Formally, the adaptive traversal policy treats retrieval as a sequential decision problem rather than a single scoring pass: at each visited node v, the Decision Rule selects an action a in {expand, prune, switch-strategy} by comparing P(v | q) to an adaptive threshold tau(q, depth), and the traversal-selection criterion chooses DFS when the query's top-1 node score dominates its runner-up by a wide margin (low ambiguity, favoring precision) and Beam Search when the score mass is spread over several candidate subtrees (high ambiguity, favoring coverage). Equation 1 is thus one instantiation of the node-scoring function inside this decision rule, not the policy itself; Section 5.4 shows the policy's output (which nodes are expanded, and which of DFS/Beam is used) is stable under alternative instantiations of P(v | q).</w:t>
       </w:r>
     </w:p>
     <w:p>
@@ -2269,7 +2277,7 @@
         </w:rPr>
         <w:drawing>
           <wp:inline distT="0" distB="0" distL="0" distR="0" wp14:anchorId="1B11197F" wp14:editId="7A0BD9D3">
-            <wp:extent cx="4846320" cy="1368373"/>
+            <wp:extent cx="4846320" cy="1363987"/>
             <wp:effectExtent l="0" t="0" r="0" b="0"/>
             <wp:docPr id="2" name="Picture 2"/>
             <wp:cNvGraphicFramePr>
@@ -2291,7 +2299,7 @@
                   <pic:spPr>
                     <a:xfrm>
                       <a:off x="0" y="0"/>
-                      <a:ext cx="4846320" cy="1368373"/>
+                      <a:ext cx="4846320" cy="1363987"/>
                     </a:xfrm>
                     <a:prstGeom prst="rect">
                       <a:avLst/>
@@ -3095,7 +3103,7 @@
         <w:lastRenderedPageBreak/>
         <w:drawing>
           <wp:inline distT="0" distB="0" distL="0" distR="0" wp14:anchorId="33B078CD" wp14:editId="141721C6">
-            <wp:extent cx="4846320" cy="3219858"/>
+            <wp:extent cx="4846320" cy="3154818"/>
             <wp:effectExtent l="0" t="0" r="0" b="0"/>
             <wp:docPr id="3" name="Picture 3"/>
             <wp:cNvGraphicFramePr>
@@ -3117,7 +3125,7 @@
                   <pic:spPr>
                     <a:xfrm>
                       <a:off x="0" y="0"/>
-                      <a:ext cx="4846320" cy="3219858"/>
+                      <a:ext cx="4846320" cy="3154818"/>
                     </a:xfrm>
                     <a:prstGeom prst="rect">
                       <a:avLst/>
@@ -3151,7 +3159,7 @@
         </w:rPr>
         <w:drawing>
           <wp:inline distT="0" distB="0" distL="0" distR="0" wp14:anchorId="56775F7A" wp14:editId="3C96AE27">
-            <wp:extent cx="4846320" cy="3210275"/>
+            <wp:extent cx="4846320" cy="3154818"/>
             <wp:effectExtent l="0" t="0" r="0" b="0"/>
             <wp:docPr id="4" name="Picture 4"/>
             <wp:cNvGraphicFramePr>
@@ -3173,7 +3181,7 @@
                   <pic:spPr>
                     <a:xfrm>
                       <a:off x="0" y="0"/>
-                      <a:ext cx="4846320" cy="3210275"/>
+                      <a:ext cx="4846320" cy="3154818"/>
                     </a:xfrm>
                     <a:prstGeom prst="rect">
                       <a:avLst/>
@@ -3664,7 +3672,7 @@
         <w:lastRenderedPageBreak/>
         <w:drawing>
           <wp:inline distT="0" distB="0" distL="0" distR="0" wp14:anchorId="7BA3D80B" wp14:editId="57A421F2">
-            <wp:extent cx="4846320" cy="2646949"/>
+            <wp:extent cx="4846320" cy="2653415"/>
             <wp:effectExtent l="0" t="0" r="0" b="0"/>
             <wp:docPr id="5" name="Picture 5"/>
             <wp:cNvGraphicFramePr>
@@ -3686,7 +3694,7 @@
                   <pic:spPr>
                     <a:xfrm>
                       <a:off x="0" y="0"/>
-                      <a:ext cx="4846320" cy="2646949"/>
+                      <a:ext cx="4846320" cy="2653415"/>
                     </a:xfrm>
                     <a:prstGeom prst="rect">
                       <a:avLst/>
@@ -5487,7 +5495,7 @@
         <w:pStyle w:val="PostHeadPara"/>
       </w:pPr>
       <w:r>
-        <w:t>Table 7 shows context-token counts and query latency from the offline evaluation (n = 204); Figures 7 and 8 visualize the latency-accuracy trade-off and the accuracy-context Pareto frontier. PageTree-RAG (DFS) uses 37.5% fewer context tokens than BM25 (65.5 vs. 104.8 tokens average) while achieving +39.5% higher ROUGE-L, Pareto-dominating every baseline. RAPTOR uses the most context (218.7 tokens, +108.7% vs. DFS) while achieving the lowest ROUGE-L, suggesting that recursive abstractive summaries degrade structural fidelity on our hierarchy-preserving benchmark. Both PageTree-RAG variants also outperform all baselines on offline latency, completing traversal in roughly 1 ms; in production, the LLM scoring step adds a few hundred milliseconds but is cached after the first call.</w:t>
+        <w:t>Table 7 shows context-token counts and query latency from the offline evaluation (n = 204); Figures 7 and 8 visualize the latency-accuracy trade-off and the accuracy-context Pareto frontier. PageTree-RAG (DFS) uses 37.5% fewer context tokens than BM25 (65.5 vs. 104.8 tokens average) while achieving +39.5% higher ROUGE-L, offering a favorable accuracy-context trade-off relative to every baseline under this offline proxy. RAPTOR uses the most context (218.7 tokens, +108.7% vs. DFS) while achieving the lowest ROUGE-L, suggesting that recursive abstractive summaries degrade structural fidelity on our hierarchy-preserving benchmark. Both PageTree-RAG variants also outperform all baselines on offline latency, completing traversal in roughly 1 ms; in production, the LLM scoring step adds a few hundred milliseconds but is cached after the first call.</w:t>
       </w:r>
     </w:p>
     <w:p>
@@ -5919,7 +5927,7 @@
         <w:lastRenderedPageBreak/>
         <w:drawing>
           <wp:inline distT="0" distB="0" distL="0" distR="0" wp14:anchorId="1F30BEA1" wp14:editId="2C0DDBFD">
-            <wp:extent cx="4846320" cy="2708403"/>
+            <wp:extent cx="4846320" cy="2765173"/>
             <wp:effectExtent l="0" t="0" r="0" b="0"/>
             <wp:docPr id="7" name="Picture 7"/>
             <wp:cNvGraphicFramePr>
@@ -5941,7 +5949,7 @@
                   <pic:spPr>
                     <a:xfrm>
                       <a:off x="0" y="0"/>
-                      <a:ext cx="4846320" cy="2708403"/>
+                      <a:ext cx="4846320" cy="2765173"/>
                     </a:xfrm>
                     <a:prstGeom prst="rect">
                       <a:avLst/>
@@ -5972,7 +5980,7 @@
         </w:rPr>
         <w:drawing>
           <wp:inline distT="0" distB="0" distL="0" distR="0" wp14:anchorId="2ABD46EA" wp14:editId="3A5635DB">
-            <wp:extent cx="4846320" cy="3016770"/>
+            <wp:extent cx="4846320" cy="3049945"/>
             <wp:effectExtent l="0" t="0" r="0" b="0"/>
             <wp:docPr id="8" name="Picture 8"/>
             <wp:cNvGraphicFramePr>
@@ -5994,7 +6002,7 @@
                   <pic:spPr>
                     <a:xfrm>
                       <a:off x="0" y="0"/>
-                      <a:ext cx="4846320" cy="3016770"/>
+                      <a:ext cx="4846320" cy="3049945"/>
                     </a:xfrm>
                     <a:prstGeom prst="rect">
                       <a:avLst/>
@@ -8176,6 +8184,7 @@
       <w:r>
         <w:t>Table 13: Robust small-sample statistics for PageTree-RAG (DFS) versus each baseline. Δ = paired mean difference (positive favors PageTree-RAG); CIs are 10,000-sample bootstrap percentiles; p_perm is the paired permutation p-value; Power is post-hoc achieved power; n₈₀ is the sample size needed for 80% power. General and medical rows use the offline extractive protocol; HotpotQA rows use the fair generative protocol.</w:t>
       </w:r>
+      <w:r/>
     </w:p>
     <w:tbl>
       <w:tblPr>
@@ -10407,10 +10416,57 @@
     </w:tbl>
     <w:p>
       <w:pPr>
+        <w:pStyle w:val="Image"/>
+      </w:pPr>
+      <w:r>
+        <w:drawing>
+          <wp:inline xmlns:a="http://schemas.openxmlformats.org/drawingml/2006/main" xmlns:pic="http://schemas.openxmlformats.org/drawingml/2006/picture">
+            <wp:extent cx="4846320" cy="5109774"/>
+            <wp:docPr id="9" name="Picture 9"/>
+            <wp:cNvGraphicFramePr>
+              <a:graphicFrameLocks noChangeAspect="1"/>
+            </wp:cNvGraphicFramePr>
+            <a:graphic>
+              <a:graphicData uri="http://schemas.openxmlformats.org/drawingml/2006/picture">
+                <pic:pic>
+                  <pic:nvPicPr>
+                    <pic:cNvPr id="0" name="figure_9_ci_forest.png"/>
+                    <pic:cNvPicPr/>
+                  </pic:nvPicPr>
+                  <pic:blipFill>
+                    <a:blip r:embed="rId23"/>
+                    <a:stretch>
+                      <a:fillRect/>
+                    </a:stretch>
+                  </pic:blipFill>
+                  <pic:spPr>
+                    <a:xfrm>
+                      <a:off x="0" y="0"/>
+                      <a:ext cx="4846320" cy="5109774"/>
+                    </a:xfrm>
+                    <a:prstGeom prst="rect"/>
+                  </pic:spPr>
+                </pic:pic>
+              </a:graphicData>
+            </a:graphic>
+          </wp:inline>
+        </w:drawing>
+      </w:r>
+    </w:p>
+    <w:p>
+      <w:pPr>
+        <w:pStyle w:val="FigureCaption"/>
+      </w:pPr>
+      <w:r>
+        <w:t>Figure 9: Paired effect sizes (PageTree-RAG (DFS) vs. each baseline) with 95% bootstrap confidence intervals, summarizing Table 13. Filled markers denote comparisons significant at p_perm &lt; 0.05; open markers are not significant at this sample size.</w:t>
+      </w:r>
+    </w:p>
+    <w:p>
+      <w:pPr>
         <w:pStyle w:val="PostHeadPara"/>
       </w:pPr>
       <w:r>
-        <w:t>The analysis shows where the advantage is genuine and adequately powered and where it is not. On the general benchmark every comparison has power ≈ 1.0 and needs only n ≈ 7–22 paired items for 80% power, so those samples are not a threat to validity. The medical vs. BM25 comparison (Δ = +0.007, p_perm = 0.63) is essentially null. On the corrected HotpotQA set PageTree-RAG (DFS) leads ROUGE-L—significantly against BM25 (Δ = +0.036, p_perm = 0.020) and directionally against the others—while the LLM-Judge gaps are small and, at n = 100, individually underpowered (Beam, not DFS, is the judge leader at 0.679). We therefore treat the multi-hop result as a consistent-direction, modestly-powered win rather than a set of individually significant comparisons.</w:t>
+        <w:t>Figure 9 visualizes these paired differences as a forest plot with 95% bootstrap confidence intervals. The analysis shows where the advantage is genuine and adequately powered and where it is not. On the general benchmark every comparison has power ≈ 1.0 and needs only n ≈ 7–22 paired items for 80% power, so those samples are not a threat to validity. The medical vs. BM25 comparison (Δ = +0.007, p_perm = 0.63) is essentially null. On the corrected HotpotQA set PageTree-RAG (DFS) leads ROUGE-L—significantly against BM25 (Δ = +0.036, p_perm = 0.020) and directionally against the others—while the LLM-Judge gaps are small and, at n = 100, individually underpowered (Beam, not DFS, is the judge leader at 0.679). We therefore treat the multi-hop result as a consistent-direction, modestly-powered win rather than a set of individually significant comparisons.</w:t>
       </w:r>
       <w:r/>
     </w:p>

</xml_diff>

<commit_message>
Update TreeRAG_TIST_ACM.docx with latest changes
</commit_message>
<xml_diff>
--- a/TreeRAG_TIST_ACM.docx
+++ b/TreeRAG_TIST_ACM.docx
@@ -39,7 +39,7 @@
         <w:pStyle w:val="Abstract"/>
       </w:pPr>
       <w:r>
-        <w:t>Retrieval-Augmented Generation (RAG) has emerged as a dominant paradigm for grounding large language model (LLM) outputs in external documents. However, conventional flat-chunk retrieval discards the inherent hierarchical structure of technical documents-chapters, sections, and articles-and loses the page-level provenance needed to verify generated answers. Unlike existing hierarchical RAG systems, which optimize retrieval quality in isolation and are judged largely by lexical-overlap metrics, PageTree-RAG jointly optimizes citation faithfulness, token efficiency, and generator-controlled evaluation through an adaptive traversal policy over page-indexed document trees. Concretely, PageTree-RAG (1) converts raw PDFs into page-aware JSON trees using zero-shot LLM prompting, (2) traverses these trees with two complementary algorithms-Depth-First Search (DFS) and Beam Search-to retrieve only structurally relevant nodes, (3) applies contextual compression to reduce token overhead, and (4) validates generated answers with a five-signal hallucination detector. We evaluate PageTree-RAG against four baselines (BM25, Dense Retrieval, FlatRAG, RAPTOR) under a controlled protocol in which every system generates answers with the same local LLM (Llama 3.1 8B), so that only the retrieval stage differs. Under this fair comparison, PageTree-RAG (Beam) produces the most accurate page-level citations (citation F1 = 0.757 vs. 0.000 for the abstractive RAPTOR baseline), the highest LLM-judged answer quality on multi-hop and comparative questions (0.818 and 0.850; multi-hop advantage over Dense Retrieval significant at p = 0.044), and competitive overall quality (LLM-Judge 0.822, statistically tied with the strongest baseline) while feeding an order of magnitude fewer context tokens to the generator (16 vs. 111-222). Crucially, we also show that lexical-overlap metrics such as ROUGE-L, and the offline extractive evaluation common in prior work, reverse these conclusions-favoring flat retrieval-and we report both regimes transparently as a cautionary methodological finding. We discuss the trade-offs, including PageTree-RAG's higher per-query latency, and the system's suitability for citation-critical document question answering.</w:t>
+        <w:t>Retrieval-Augmented Generation (RAG) has emerged as a dominant paradigm for grounding large language model (LLM) outputs in external documents. However, conventional flat-chunk retrieval discards the inherent hierarchical structure of technical documents-chapters, sections, and articles-and loses the page-level provenance needed to verify generated answers. Unlike existing hierarchical RAG systems, which optimize retrieval quality in isolation and are judged largely by lexical-overlap metrics, PageTree-RAG jointly optimizes citation faithfulness, token efficiency, and generator-controlled evaluation through an adaptive traversal policy over page-indexed document trees. Concretely, PageTree-RAG (1) converts raw PDFs into page-aware JSON trees using zero-shot LLM prompting, (2) traverses these trees with two complementary algorithms-Depth-First Search (DFS) and Beam Search-to retrieve only structurally relevant nodes, (3) applies contextual compression to reduce token overhead, and (4) validates generated answers with a five-signal hallucination detector. We evaluate PageTree-RAG against four baselines (BM25, Dense Retrieval, FlatRAG, RAPTOR) under a controlled protocol in which every system generates answers with the same local LLM (Llama 3.1 8B), so that only the retrieval stage differs. Under this fair comparison, PageTree-RAG (Beam) produces the most accurate page-level citations (citation F1 = 0.757 vs. 0.000 for the abstractive RAPTOR baseline), competitive LLM-judged answer quality on multi-hop and comparative questions (0.837 and 0.830, statistically tied with the strongest baseline, BM25), and competitive overall quality (LLM-Judge 0.822, statistically tied with the strongest baseline) while feeding an order of magnitude fewer context tokens to the generator (16 vs. 111-222). Crucially, we also show that lexical-overlap metrics such as ROUGE-L, and the offline extractive evaluation common in prior work, reverse these conclusions-favoring flat retrieval-and we report both regimes transparently as a cautionary methodological finding. We discuss the trade-offs, including PageTree-RAG's higher per-query latency, and the system's suitability for citation-critical document question answering.</w:t>
       </w:r>
     </w:p>
     <w:p>
@@ -2361,7 +2361,7 @@
         <w:pStyle w:val="PostHeadPara"/>
       </w:pPr>
       <w:r>
-        <w:t>The cache key is a SHA-256 hash of (question, index filenames, traversal settings, domain template, language, prompt cache version). Cache hits return in roughly 100 ms versus the 1.8-3.2 s of a cold LLM call. A two-layer hierarchy stores hot entries in process memory (L1) and warm entries in Redis (L2), with a cache hit rate exceeding 90% in our production trials. This application-layer caching complements inference-layer memory optimizations such as PagedAttention [18], which manages GPU KV-cache during LLM decoding.</w:t>
+        <w:t>The cache key is a SHA-256 hash of (question, index filenames, traversal settings, domain template, language, prompt cache version). Cache hits return in roughly 100 ms versus the 1.8-3.2 s of a cold LLM call. A two-layer hierarchy stores hot entries in process memory (L1) and warm entries in Redis (L2), with a cache hit rate exceeding 90% in our production trials. This application-layer caching complements inference-layer memory optimizations such as PagedAttention [18], which manages GPU KV-cache during LLM decoding. The traversal algorithm (DFS vs. Beam) is included in this key; an earlier implementation omitted it, which let same-question queries under different algorithms silently collide within the cache TTL until we discovered and fixed it (Section 6.2).</w:t>
       </w:r>
     </w:p>
     <w:p>
@@ -3202,8 +3202,7 @@
         </w:rPr>
       </w:pPr>
       <w:r>
-        <w:lastRenderedPageBreak/>
-        <w:t>Figure 4: ROUGE-L on the Full Benchmark versus the HotpotQA multi-hop subset (fair generative protocol). Every system drops sharply on multi-hop under lexical overlap; on LLM-Judge PageTree-RAG (DFS) leads the multi-hop set (Table 10, Section 5.6).</w:t>
+        <w:t>Figure 4: ROUGE-L on the Full Benchmark versus the HotpotQA multi-hop subset (fair generative protocol). Every system drops sharply on multi-hop under lexical overlap; on LLM-Judge no system leads decisively on this corrected subset—FlatRAG scores highest (0.668), with PageTree-RAG (DFS/Beam) and the other baselines clustered close behind (Table 10, Section 5.6).</w:t>
       </w:r>
       <w:r>
         <w:rPr>
@@ -7160,7 +7159,7 @@
         <w:pStyle w:val="PostHeadPara"/>
       </w:pPr>
       <w:r>
-        <w:t>Table 10 reports the HotpotQA multi-hop subset—expanded to 100 questions and re-run under the fair generative protocol—and Table 11 breaks the Full Benchmark down by question type. On the corrected multi-hop set PageTree-RAG leads on both metrics: the DFS and Beam variants tie for the highest ROUGE-L (0.077, with DFS significantly above BM25, Δ = +0.036, p_perm = 0.020), and Beam attains the highest LLM-Judge (0.679, above Dense 0.673 and DFS 0.661). This corrects an earlier run in which the flat baselines appeared to lead ROUGE-L: that gap was an artifact of a generation-language bug (our error analysis, Section 6), and once it is fixed the structural retrieval helps on both axes—though most individual pairwise gaps at n = 100 are small and not separately significant. Second, the per-type breakdown shows the consistent pattern across our work: a flat baseline wins ROUGE-L in every category, but PageTree-RAG (Beam) attains the highest LLM-Judge on multi-hop (0.818) and comparative (0.850) questions and is competitive on factual (0.822). The multi-hop advantage of PageTree-RAG (Beam) over Dense Retrieval is statistically significant (p = 0.044), consistent with the hypothesis that beam traversal helps bridge evidence across sibling sections. We state plainly that the per-type cells are small-sample results (n = 11 multi-hop, n = 8 comparative) and report them as indicative rather than conclusive.</w:t>
+        <w:t>Table 10 reports the HotpotQA multi-hop subset—expanded to 100 questions and re-run after fixing the response-cache key bug described in Section 4.3—and Table 11 breaks the Full Benchmark down by question type using the same corrected data. On the corrected multi-hop set, PageTree-RAG (Beam) leads ROUGE-L (0.104 vs. 0.054–0.080 for the other five systems), though the margin is statistically significant only against RAPTOR (Δ = +0.050, p = 0.018); DFS is second on ROUGE-L (0.080). On LLM-Judge, structural retrieval does not lead this subset: FlatRAG scores highest (0.668), with BM25, RAPTOR, DFS, and Beam all within a narrow band (0.616–0.655) and none significantly separated. The earlier version of this table showed DFS and Beam tied at ROUGE-L = 0.077 and Beam leading LLM-Judge at 0.679; both numbers were artifacts of a response-cache bug—the two algorithms had returned each other's cached answers for most questions, so the comparison was not actually between DFS and Beam. Second, the per-type breakdown (Table 11, now built from a clean 100-question run rather than the earlier 40-question one) shows a flat baseline, BM25, winning ROUGE-L in every category and also narrowly leading LLM-Judge on both multi-hop (0.843 vs. Beam's 0.837) and comparative (0.837 vs. Beam's 0.830) questions; PageTree-RAG (Beam) remains competitive and significantly ahead of FlatRAG specifically on multi-hop LLM-Judge (Δ = +0.041, p = 0.041), but the previously reported significant advantage over Dense Retrieval (p = 0.044) does not replicate in the corrected data (p = 0.225). We state plainly that the per-type cells remain small-to-moderate samples (n = 20–49) and report them as indicative rather than conclusive.</w:t>
       </w:r>
     </w:p>
     <w:p>
@@ -7168,7 +7167,7 @@
         <w:pStyle w:val="TableCaption"/>
       </w:pPr>
       <w:r>
-        <w:t>Table 10: HotpotQA multi-hop (n = 100), fair generative protocol, after fixing the generation-language bug of Section 6. PageTree-RAG leads on both metrics: DFS and Beam tie for the highest ROUGE-L (0.077; DFS significantly above BM25, p = 0.020), and Beam attains the highest LLM-Judge (0.679).</w:t>
+        <w:t>Table 10: HotpotQA multi-hop (n = 100), fair generative protocol, after fixing a response-cache key bug that had let PageTree-RAG (DFS) and (Beam) silently return each other's cached answers (Section 4.3). PageTree-RAG (Beam) leads ROUGE-L (0.104), significant only against RAPTOR (p = 0.018); on LLM-Judge, FlatRAG scores highest (0.668), with all six systems clustered in a narrow 0.62–0.67 band.</w:t>
       </w:r>
     </w:p>
     <w:tbl>
@@ -7245,13 +7244,7 @@
             <w:tcW w:w="4080" w:type="dxa"/>
           </w:tcPr>
           <w:p>
-            <w:pPr>
-              <w:pStyle w:val="TableCell"/>
-            </w:pPr>
-            <w:r>
-              <w:rPr>
-                <w:b w:val="0"/>
-              </w:rPr>
+            <w:r>
               <w:t>BM25</w:t>
             </w:r>
           </w:p>
@@ -7261,14 +7254,8 @@
             <w:tcW w:w="2047" w:type="dxa"/>
           </w:tcPr>
           <w:p>
-            <w:pPr>
-              <w:pStyle w:val="TableCell"/>
-            </w:pPr>
-            <w:r>
-              <w:rPr>
-                <w:b w:val="0"/>
-              </w:rPr>
-              <w:t>0.042</w:t>
+            <w:r>
+              <w:t>0.062</w:t>
             </w:r>
           </w:p>
         </w:tc>
@@ -7277,14 +7264,8 @@
             <w:tcW w:w="2632" w:type="dxa"/>
           </w:tcPr>
           <w:p>
-            <w:pPr>
-              <w:pStyle w:val="TableCell"/>
-            </w:pPr>
-            <w:r>
-              <w:rPr>
-                <w:b w:val="0"/>
-              </w:rPr>
-              <w:t>0.645</w:t>
+            <w:r>
+              <w:t>0.653</w:t>
             </w:r>
           </w:p>
         </w:tc>
@@ -7295,13 +7276,7 @@
             <w:tcW w:w="4080" w:type="dxa"/>
           </w:tcPr>
           <w:p>
-            <w:pPr>
-              <w:pStyle w:val="TableCell"/>
-            </w:pPr>
-            <w:r>
-              <w:rPr>
-                <w:b w:val="0"/>
-              </w:rPr>
+            <w:r>
               <w:t>Dense Retrieval</w:t>
             </w:r>
           </w:p>
@@ -7311,14 +7286,8 @@
             <w:tcW w:w="2047" w:type="dxa"/>
           </w:tcPr>
           <w:p>
-            <w:pPr>
-              <w:pStyle w:val="TableCell"/>
-            </w:pPr>
-            <w:r>
-              <w:rPr>
-                <w:b w:val="0"/>
-              </w:rPr>
-              <w:t>0.054</w:t>
+            <w:r>
+              <w:t>0.064</w:t>
             </w:r>
           </w:p>
         </w:tc>
@@ -7328,14 +7297,8 @@
             <w:shd w:val="clear" w:color="auto" w:fill="FFF2CC"/>
           </w:tcPr>
           <w:p>
-            <w:pPr>
-              <w:pStyle w:val="TableCell"/>
-            </w:pPr>
-            <w:r>
-              <w:rPr>
-                <w:b w:val="0"/>
-              </w:rPr>
-              <w:t>0.673</w:t>
+            <w:r>
+              <w:t>0.628</w:t>
             </w:r>
           </w:p>
         </w:tc>
@@ -7346,13 +7309,7 @@
             <w:tcW w:w="4080" w:type="dxa"/>
           </w:tcPr>
           <w:p>
-            <w:pPr>
-              <w:pStyle w:val="TableCell"/>
-            </w:pPr>
-            <w:r>
-              <w:rPr>
-                <w:b w:val="0"/>
-              </w:rPr>
+            <w:r>
               <w:t>FlatRAG</w:t>
             </w:r>
           </w:p>
@@ -7363,14 +7320,8 @@
             <w:shd w:val="clear" w:color="auto" w:fill="FFF2CC"/>
           </w:tcPr>
           <w:p>
-            <w:pPr>
-              <w:pStyle w:val="TableCell"/>
-            </w:pPr>
-            <w:r>
-              <w:rPr>
-                <w:b w:val="0"/>
-              </w:rPr>
-              <w:t>0.063</w:t>
+            <w:r>
+              <w:t>0.068</w:t>
             </w:r>
           </w:p>
         </w:tc>
@@ -7379,14 +7330,8 @@
             <w:tcW w:w="2632" w:type="dxa"/>
           </w:tcPr>
           <w:p>
-            <w:pPr>
-              <w:pStyle w:val="TableCell"/>
-            </w:pPr>
-            <w:r>
-              <w:rPr>
-                <w:b w:val="0"/>
-              </w:rPr>
-              <w:t>0.632</w:t>
+            <w:r>
+              <w:t>0.668</w:t>
             </w:r>
           </w:p>
         </w:tc>
@@ -7397,13 +7342,7 @@
             <w:tcW w:w="4080" w:type="dxa"/>
           </w:tcPr>
           <w:p>
-            <w:pPr>
-              <w:pStyle w:val="TableCell"/>
-            </w:pPr>
-            <w:r>
-              <w:rPr>
-                <w:b w:val="0"/>
-              </w:rPr>
+            <w:r>
               <w:t>RAPTOR</w:t>
             </w:r>
           </w:p>
@@ -7413,14 +7352,8 @@
             <w:tcW w:w="2047" w:type="dxa"/>
           </w:tcPr>
           <w:p>
-            <w:pPr>
-              <w:pStyle w:val="TableCell"/>
-            </w:pPr>
-            <w:r>
-              <w:rPr>
-                <w:b w:val="0"/>
-              </w:rPr>
-              <w:t>0.050</w:t>
+            <w:r>
+              <w:t>0.054</w:t>
             </w:r>
           </w:p>
         </w:tc>
@@ -7429,14 +7362,8 @@
             <w:tcW w:w="2632" w:type="dxa"/>
           </w:tcPr>
           <w:p>
-            <w:pPr>
-              <w:pStyle w:val="TableCell"/>
-            </w:pPr>
-            <w:r>
-              <w:rPr>
-                <w:b w:val="0"/>
-              </w:rPr>
-              <w:t>0.625</w:t>
+            <w:r>
+              <w:t>0.641</w:t>
             </w:r>
           </w:p>
         </w:tc>
@@ -7447,13 +7374,7 @@
             <w:tcW w:w="4080" w:type="dxa"/>
           </w:tcPr>
           <w:p>
-            <w:pPr>
-              <w:pStyle w:val="TableCell"/>
-            </w:pPr>
-            <w:r>
-              <w:rPr>
-                <w:b w:val="0"/>
-              </w:rPr>
+            <w:r>
               <w:t>PageTree-RAG (DFS)</w:t>
             </w:r>
           </w:p>
@@ -7464,14 +7385,8 @@
             <w:shd w:val="clear" w:color="auto" w:fill="C6EFCE"/>
           </w:tcPr>
           <w:p>
-            <w:pPr>
-              <w:pStyle w:val="TableCell"/>
-            </w:pPr>
-            <w:r>
-              <w:rPr>
-                <w:b/>
-              </w:rPr>
-              <w:t>0.077</w:t>
+            <w:r>
+              <w:t>0.080</w:t>
             </w:r>
           </w:p>
         </w:tc>
@@ -7480,14 +7395,8 @@
             <w:tcW w:w="2632" w:type="dxa"/>
           </w:tcPr>
           <w:p>
-            <w:pPr>
-              <w:pStyle w:val="TableCell"/>
-            </w:pPr>
-            <w:r>
-              <w:rPr>
-                <w:b w:val="0"/>
-              </w:rPr>
-              <w:t>0.661</w:t>
+            <w:r>
+              <w:t>0.655</w:t>
             </w:r>
           </w:p>
         </w:tc>
@@ -7498,13 +7407,7 @@
             <w:tcW w:w="4080" w:type="dxa"/>
           </w:tcPr>
           <w:p>
-            <w:pPr>
-              <w:pStyle w:val="TableCell"/>
-            </w:pPr>
-            <w:r>
-              <w:rPr>
-                <w:b w:val="0"/>
-              </w:rPr>
+            <w:r>
               <w:t>PageTree-RAG (Beam)</w:t>
             </w:r>
           </w:p>
@@ -7515,14 +7418,8 @@
             <w:shd w:val="clear" w:color="auto" w:fill="C6EFCE"/>
           </w:tcPr>
           <w:p>
-            <w:pPr>
-              <w:pStyle w:val="TableCell"/>
-            </w:pPr>
-            <w:r>
-              <w:rPr>
-                <w:b/>
-              </w:rPr>
-              <w:t>0.077</w:t>
+            <w:r>
+              <w:t>0.104</w:t>
             </w:r>
           </w:p>
         </w:tc>
@@ -7532,14 +7429,8 @@
             <w:shd w:val="clear" w:color="auto" w:fill="C6EFCE"/>
           </w:tcPr>
           <w:p>
-            <w:pPr>
-              <w:pStyle w:val="TableCell"/>
-            </w:pPr>
-            <w:r>
-              <w:rPr>
-                <w:b/>
-              </w:rPr>
-              <w:t>0.679</w:t>
+            <w:r>
+              <w:t>0.616</w:t>
             </w:r>
           </w:p>
         </w:tc>
@@ -7550,8 +7441,7 @@
         <w:pStyle w:val="TableCaption"/>
       </w:pPr>
       <w:r>
-        <w:lastRenderedPageBreak/>
-        <w:t>Table 11: Per-type breakdown (Full Benchmark, n = 40, fair protocol). A flat baseline wins ROUGE-L in every category, while PageTree-RAG (Beam) attains the highest LLM-Judge on multi-hop and comparative questions (multi-hop margin over Dense Retrieval significant, p = 0.044).</w:t>
+        <w:t>Table 11: Per-type breakdown (Full Benchmark, n = 100, fair protocol, corrected — Section 4.3). A flat baseline (BM25 in every case) wins ROUGE-L in every category; on LLM-Judge, PageTree-RAG (Beam) is competitive but not highest on multi-hop or comparative questions — BM25 narrowly leads both (0.843 vs. 0.837 multi-hop; 0.837 vs. 0.830 comparative), and neither gap is statistically significant.</w:t>
       </w:r>
     </w:p>
     <w:tbl>
@@ -7628,11 +7518,8 @@
             <w:tcW w:w="2482" w:type="dxa"/>
           </w:tcPr>
           <w:p>
-            <w:pPr>
-              <w:pStyle w:val="TableCell"/>
-            </w:pPr>
-            <w:r>
-              <w:t>Factual (21)</w:t>
+            <w:r>
+              <w:t>Factual (49)</w:t>
             </w:r>
           </w:p>
         </w:tc>
@@ -7641,11 +7528,8 @@
             <w:tcW w:w="3066" w:type="dxa"/>
           </w:tcPr>
           <w:p>
-            <w:pPr>
-              <w:pStyle w:val="TableCell"/>
-            </w:pPr>
-            <w:r>
-              <w:t>0.566 (FlatRAG)</w:t>
+            <w:r>
+              <w:t>0.615 (FlatRAG)</w:t>
             </w:r>
           </w:p>
         </w:tc>
@@ -7654,11 +7538,8 @@
             <w:tcW w:w="3212" w:type="dxa"/>
           </w:tcPr>
           <w:p>
-            <w:pPr>
-              <w:pStyle w:val="TableCell"/>
-            </w:pPr>
-            <w:r>
-              <w:t>0.822</w:t>
+            <w:r>
+              <w:t>0.810</w:t>
             </w:r>
           </w:p>
         </w:tc>
@@ -7669,11 +7550,8 @@
             <w:tcW w:w="2482" w:type="dxa"/>
           </w:tcPr>
           <w:p>
-            <w:pPr>
-              <w:pStyle w:val="TableCell"/>
-            </w:pPr>
-            <w:r>
-              <w:t>Multi-hop (11)</w:t>
+            <w:r>
+              <w:t>Multi-hop (31)</w:t>
             </w:r>
           </w:p>
         </w:tc>
@@ -7682,11 +7560,8 @@
             <w:tcW w:w="3066" w:type="dxa"/>
           </w:tcPr>
           <w:p>
-            <w:pPr>
-              <w:pStyle w:val="TableCell"/>
-            </w:pPr>
-            <w:r>
-              <w:t>0.233 (FlatRAG)</w:t>
+            <w:r>
+              <w:t>0.373 (BM25)</w:t>
             </w:r>
           </w:p>
         </w:tc>
@@ -7695,11 +7570,8 @@
             <w:tcW w:w="3212" w:type="dxa"/>
           </w:tcPr>
           <w:p>
-            <w:pPr>
-              <w:pStyle w:val="TableCell"/>
-            </w:pPr>
-            <w:r>
-              <w:t>0.818</w:t>
+            <w:r>
+              <w:t>0.837</w:t>
             </w:r>
           </w:p>
         </w:tc>
@@ -7710,11 +7582,8 @@
             <w:tcW w:w="2482" w:type="dxa"/>
           </w:tcPr>
           <w:p>
-            <w:pPr>
-              <w:pStyle w:val="TableCell"/>
-            </w:pPr>
-            <w:r>
-              <w:t>Comparative (8)</w:t>
+            <w:r>
+              <w:t>Comparative (20)</w:t>
             </w:r>
           </w:p>
         </w:tc>
@@ -7723,11 +7592,8 @@
             <w:tcW w:w="3066" w:type="dxa"/>
           </w:tcPr>
           <w:p>
-            <w:pPr>
-              <w:pStyle w:val="TableCell"/>
-            </w:pPr>
-            <w:r>
-              <w:t>0.169 (BM25)</w:t>
+            <w:r>
+              <w:t>0.390 (BM25)</w:t>
             </w:r>
           </w:p>
         </w:tc>
@@ -7736,11 +7602,8 @@
             <w:tcW w:w="3212" w:type="dxa"/>
           </w:tcPr>
           <w:p>
-            <w:pPr>
-              <w:pStyle w:val="TableCell"/>
-            </w:pPr>
-            <w:r>
-              <w:t>0.850</w:t>
+            <w:r>
+              <w:t>0.830</w:t>
             </w:r>
           </w:p>
         </w:tc>
@@ -10499,7 +10362,7 @@
         <w:pStyle w:val="PostHeadPara"/>
       </w:pPr>
       <w:r>
-        <w:t>The corrected multi-hop evaluation (Section 5.6) reinforces this reading from a different angle. Once the generation-language bug is fixed, PageTree-RAG leads HotpotQA on both ROUGE-L and LLM-Judge, so the structure-aware advantage is visible even to a lexical metric here. The divergence between lexical and judged quality that we stress elsewhere is therefore not a universal reversal but a property of specific evaluation regimes—most sharply the offline extractive proxy of Section 5.7—rather than an inherent limitation of hierarchical retrieval.</w:t>
+        <w:t>The corrected multi-hop evaluation (Section 5.6) complicates this reading rather than reinforcing it. PageTree-RAG (Beam) leads ROUGE-L on the HotpotQA subset, so the lexical/judged divergence we stress elsewhere is not universal—structure can win on a lexical metric too, at least on this subset. But on LLM-Judge, PageTree-RAG does not lead the corrected multi-hop set; FlatRAG does. The multi-hop result is therefore best read as a partial, mixed data point rather than confirmation of the citation/efficiency story: hierarchical retrieval's judged-quality advantage, which is real and significant on the overall benchmark (Table 8), does not extend to this smaller, harder subset.</w:t>
       </w:r>
     </w:p>
     <w:p>
@@ -10515,7 +10378,7 @@
         <w:pStyle w:val="PostHeadPara"/>
       </w:pPr>
       <w:r>
-        <w:t>Under the fair protocol, Beam Search is the better default among our variants. It reaches near-best overall LLM-Judge (0.822, statistically tied with the top baseline, BM25 at 0.826), the best citation F1 (0.757), and the only statistically significant per-type advantage we observe (multi-hop over Dense Retrieval, p = 0.044). DFS is more token-frugal still (8 vs. 16 tokens) but scores lower on quality and is marginally slower because it expands more nodes through the LLM scorer. We therefore recommend Beam as the production default and reserve DFS for extreme context-budget constraints. A query-complexity classifier that routes between the two remains attractive future work.</w:t>
+        <w:t>Under the fair protocol, Beam Search is the better default among our variants. It reaches near-best overall LLM-Judge (0.822, statistically tied with the top baseline, BM25 at 0.826), the best citation F1 (0.757), and a statistically significant per-type advantage over FlatRAG on multi-hop questions (p = 0.041); the previously reported advantage over Dense Retrieval on this subset did not replicate after we corrected a response-cache bug (Section 4.3) and is no longer significant (p = 0.225). DFS is more token-frugal still (8 vs. 16 tokens) but scores lower on quality and is marginally slower because it expands more nodes through the LLM scorer. We therefore recommend Beam as the production default and reserve DFS for extreme context-budget constraints. A query-complexity classifier that routes between the two remains attractive future work.</w:t>
       </w:r>
     </w:p>
     <w:p>
@@ -10540,7 +10403,15 @@
         <w:pStyle w:val="PostHeadPara"/>
       </w:pPr>
       <w:r>
-        <w:t>Two examples make this concrete. For the comparison question “Are John O’Hara and Rabindranath Tagore the same nationality?” (reference: “no”), PageTree-RAG (Beam) selects both authors’ biography nodes and returns a correct, sourced English explanation—O’Hara is American, Tagore Indian—rated 0.93 by the judge, whereas BM25 merely echoes the question (0.20); every system still scores ROUGE ≈ 0 because none reproduces the one-word reference, so the judge, not ROUGE, credits the correct answer. Conversely, on a bridge question whose reference is “One Night in Bangkok,” PageTree-RAG (Beam) confidently returns a wrong answer (“Merchandising,” judge 0.20) while Dense Retrieval is more cautious and scores higher (0.73); the relevant evidence spanned two distractor-heavy passages that beam traversal did not fully bridge—a genuine multi-hop failure. Across the set such per-question outcomes are often close, and PageTree-RAG’s edge shows mainly in aggregate—fewer catastrophic failures and higher mean judged quality—rather than in dramatic single-question wins.</w:t>
+        <w:t>A second, independent bug surfaced during later experimentation on an adaptive traversal-selection policy: the response cache key (Section 4.3) did not include which traversal algorithm (DFS or Beam) produced a query, so within the cache's TTL a Beam Search query could silently return a DFS query's cached answer for the same question, and vice versa. This affected every earlier HotpotQA multi-hop run (Table 10) and the per-type breakdown's source data (Table 11): in the most recent pre-fix run, 100% of DFS/Beam answer pairs on the multi-hop set were byte-identical, and 85–90% were identical in the per-type breakdown's source runs. We fixed the cache key to include the traversal algorithm, confirmed the fix (the post-fix identical-answer rate fell to 2–4%, consistent with genuine coincidental ties), archived the affected raw reports, and re-ran both experiments; Tables 10 and 11 and the case studies below reflect the corrected runs.</w:t>
+      </w:r>
+    </w:p>
+    <w:p>
+      <w:pPr>
+        <w:pStyle w:val="PostHeadPara"/>
+      </w:pPr>
+      <w:r>
+        <w:t>Two examples make this concrete. For the comparison question “Are John O’Hara and Rabindranath Tagore the same nationality?” (reference: “no”), PageTree-RAG (Beam) selects both authors’ biography nodes and returns a correct, sourced English explanation—O’Hara is American, Tagore Indian—rated 0.93 by the judge, while BM25 also answers correctly in the corrected run but scores lower (0.73); every system still scores ROUGE ≈ 0 because none reproduces the one-word reference, so the judge, not ROUGE, credits the correct answer. Conversely, on a bridge question whose reference is “One Night in Bangkok,” PageTree-RAG (Beam) confidently returns a wrong answer (“Cosmic Dancer,” judge 0.20) while Dense Retrieval is more cautious and scores higher (0.73) despite not naming the correct song either; the relevant evidence spanned two distractor-heavy passages that beam traversal did not fully bridge—a genuine multi-hop failure. Across the set such per-question outcomes are often close, and PageTree-RAG’s edge shows mainly in aggregate—fewer catastrophic failures and higher mean judged quality—rather than in dramatic single-question wins.</w:t>
       </w:r>
     </w:p>
     <w:p>
@@ -10624,7 +10495,7 @@
         <w:pStyle w:val="PostHeadPara"/>
       </w:pPr>
       <w:r>
-        <w:t>We presented PageTree-RAG, a hierarchical document RAG system that indexes PDFs into page-referenced JSON trees using zero-shot LLM prompting, traverses them with DFS or Beam Search, compresses retrieved context, and validates generated answers with a lightweight five-signal hallucination detector. Evaluating all systems under a fair protocol in which only the retriever differs and a shared local LLM (Llama 3.1 8B) generates every answer, we found that PageTree-RAG (Beam) produces the most accurate page-level citations (citation F1 = 0.757 vs. 0.000 for the abstractive RAPTOR baseline), the highest LLM-judged answer quality on multi-hop and comparative questions (0.818 and 0.850; multi-hop advantage over Dense Retrieval significant at p = 0.044), and competitive overall quality (LLM-Judge 0.822, statistically tied with the strongest baseline) while feeding an order of magnitude fewer context tokens to the generator-at the cost of higher per-query latency. Just as importantly, we showed that offline extractive evaluation and lexical-overlap metrics reverse these conclusions and overstate flat retrieval, and we reported both regimes so that the discrepancy is explicit; we encourage future hierarchical-RAG work to adopt generator-controlled evaluation and to measure citation and efficiency directly. The system also provides domain-adaptive prompting, multilingual support, and a production-ready API with caching, rate limiting, and asynchronous task queuing. Future work will pursue (1) larger-sample, multi-model replication of the fair protocol; (2) Graph RAG integration [3] for inter-document relationship modeling; (3) multi-modal indexing for figures and tables; and (4) learning the adaptive traversal policy end-to-end from user-feedback signals, together with cross-document reasoning and multi-modal indexing.</w:t>
+        <w:t>We presented PageTree-RAG, a hierarchical document RAG system that indexes PDFs into page-referenced JSON trees using zero-shot LLM prompting, traverses them with DFS or Beam Search, compresses retrieved context, and validates generated answers with a lightweight five-signal hallucination detector. Evaluating all systems under a fair protocol in which only the retriever differs and a shared local LLM (Llama 3.1 8B) generates every answer, we found that PageTree-RAG (Beam) produces the most accurate page-level citations (citation F1 = 0.757 vs. 0.000 for the abstractive RAPTOR baseline), competitive LLM-judged answer quality on multi-hop and comparative questions (0.837 and 0.830, statistically tied with the strongest baseline, BM25), and competitive overall quality (LLM-Judge 0.822, statistically tied with the strongest baseline) while feeding an order of magnitude fewer context tokens to the generator-at the cost of higher per-query latency. Just as importantly, we showed that offline extractive evaluation and lexical-overlap metrics reverse these conclusions and overstate flat retrieval, and we reported both regimes so that the discrepancy is explicit; we encourage future hierarchical-RAG work to adopt generator-controlled evaluation and to measure citation and efficiency directly. The system also provides domain-adaptive prompting, multilingual support, and a production-ready API with caching, rate limiting, and asynchronous task queuing. Future work will pursue (1) larger-sample, multi-model replication of the fair protocol; (2) Graph RAG integration [3] for inter-document relationship modeling; (3) multi-modal indexing for figures and tables; and (4) learning the adaptive traversal policy end-to-end from user-feedback signals, together with cross-document reasoning and multi-modal indexing.</w:t>
       </w:r>
     </w:p>
     <w:p>

</xml_diff>

<commit_message>
Add multiple HotpotQA index files with multi-hop context questions
- Created new JSON index files for HotpotQA with various multi-hop context questions and summaries.
- Each file includes a unique title and summary related to the question posed.
- The indices cover a wide range of topics, including music, literature, history, and more.
</commit_message>
<xml_diff>
--- a/TreeRAG_TIST_ACM.docx
+++ b/TreeRAG_TIST_ACM.docx
@@ -220,7 +220,7 @@
         <w:pStyle w:val="PostHeadPara"/>
       </w:pPr>
       <w:r>
-        <w:t>LlamaIndex [21] constructs a tree of progressively coarser summaries and navigates it top-down, retrieving leaf nodes for generation; its retrieval is embedding-based, requiring a vector store. RAPTOR [30] takes the opposite direction: it recursively clusters leaf chunks and summarizes each cluster, building a bottom-up tree, and at query time retrieves at the most informative tree level. Unlike PageTree-RAG, RAPTOR's tree reflects embedding-cluster geography rather than the document's own section hierarchy, and it lacks traversal-algorithm selection or compression. This distinction matters in domains where the authored section structure is itself the semantics of the document, such as regulations and clinical protocols.</w:t>
+        <w:t>LlamaIndex [21] constructs a tree of progressively coarser summaries and navigates it top-down, retrieving leaf nodes for generation; its retrieval is embedding-based, requiring a vector store. RAPTOR [30] takes the opposite direction: it recursively clusters leaf chunks and summarizes each cluster, building a bottom-up tree, and at query time retrieves at the most informative tree level. Unlike PageTree-RAG, RAPTOR's tree reflects embedding-cluster geography rather than the document's own section hierarchy. RAPTOR does offer two retrieval strategies—tree traversal and collapsed tree—but these are fixed a priori rather than selected per query, and its compression is baked into lossy recursive summarization at indexing time, which discards the original wording and page-level provenance that citation-critical use cases require. This distinction matters in domains where the authored section structure is itself the semantics of the document, such as regulations and clinical protocols.</w:t>
       </w:r>
     </w:p>
     <w:p>
@@ -228,15 +228,10 @@
         <w:pStyle w:val="Para"/>
       </w:pPr>
       <w:r>
-        <w:t xml:space="preserve">HiRAG [10] explores graph-based hierarchies but requires pre-built knowledge graphs and domain-specific schema engineering. Similarly, GraphRAG [3] builds entity knowledge graphs from source documents and generates community summaries for global query-focused summarization, but requires an entity extraction pipeline and does not preserve document section hierarchy. PageTree-RAG requires only a raw PDF and an LLM API key. Self-RAG [1] takes a complementary adaptive approach: it trains an LM to decide on-demand whether to retrieve, and to critique retrieved passages via special reflection tokens. PageTree-RAG instead uses a fixed two-stage pipeline with query-time algorithm </w:t>
-      </w:r>
-      <w:r>
-        <w:lastRenderedPageBreak/>
-        <w:t>selection (DFS vs. Beam Search) without requiring fine-tuning, which lowers the barrier to deployment on new document collections. A recently proposed, identically named system, TreeRAG [39], likewise organizes long documents as a tree, but differs from ours in construction, traversal, and objective: it builds the tree by embedding text chunks (“Tree-Chunking”) and retrieves with a fixed bidirectional (root-to-leaf and leaf-to-root) traversal for query-focused summarization, whereas PageTree-RAG parses the document’s native section hierarchy into a page-referenced tree via zero-shot LLM prompting, selects between DFS and Beam traversal per query, and targets page-level citation faithfulness under a generator-controlled evaluation. Crucially, the two systems also pursue different success criteria: that work optimizes retrieval recall and precision for summarization, whereas PageTree-RAG is evaluated on citation fidelity, context efficiency, and judged answer quality—axes on which a tree's page-level provenance, rather than its lexical coverage, is the decisive advantage.</w:t>
-      </w:r>
-      <w:r>
-        <w:t xml:space="preserve"> More broadly, recent work extends RAG toward longer contexts and greater autonomy: MemoRAG [41] adds a global memory module via KV compression to handle book-length inputs, and a growing line of agentic RAG systems lets the LLM itself plan and issue retrieval calls [42]. PageTree-RAG is deliberately lighter-weight—requiring neither a long-context memory model nor agent fine-tuning—yet its query-time choice of traversal strategy supplies a form of adaptivity, here coupled with page-level citation and a controlled evaluation.</w:t>
-      </w:r>
+        <w:t>HiRAG [10] explores graph-based hierarchies, constructing and reasoning over a multi-level entity knowledge graph extracted from the input documents—an entity-extraction and graph-construction pipeline more elaborate than PageTree-RAG's page-referenced tree, and one that does not preserve the document's own section structure. Similarly, GraphRAG [3] builds entity knowledge graphs from source documents and generates community summaries for global query-focused summarization, but requires an entity extraction pipeline and does not preserve document section hierarchy. PageTree-RAG requires only a raw PDF and an LLM API key. Self-RAG [1] takes a complementary adaptive approach: it trains an LM to decide on-demand whether to retrieve, and to critique retrieved passages via special reflection tokens. PageTree-RAG instead uses a fixed two-stage pipeline with query-time algorithm selection (DFS vs. Beam Search) without requiring fine-tuning, which lowers the barrier to deployment on new document collections. A recently proposed, identically named system, TreeRAG [39], likewise organizes long documents as a tree, but differs from ours in construction, traversal, and objective: it builds the tree by embedding text chunks (“Tree-Chunking”) and retrieves with a fixed bidirectional (root-to-leaf and leaf-to-root) traversal for query-focused summarization, whereas PageTree-RAG parses the document’s native section hierarchy into a page-referenced tree via zero-shot LLM prompting, selects between DFS and Beam traversal per query, and targets page-level citation faithfulness under a generator-controlled evaluation. Crucially, the two systems also pursue different success criteria: that work optimizes retrieval recall and precision for summarization, whereas PageTree-RAG is evaluated on citation fidelity, context efficiency, and judged answer quality—axes on which a tree's page-level provenance, rather than its lexical coverage, is the decisive advantage. More broadly, recent work extends RAG toward longer contexts and greater autonomy: MemoRAG [41] adds a global memory module via KV compression to handle book-length inputs, and a growing line of agentic RAG systems lets the LLM itself plan and issue retrieval calls [42]. PageTree-RAG is deliberately lighter-weight—requiring neither a long-context memory model nor agent fine-tuning—yet its query-time choice of traversal strategy supplies a form of adaptivity, here coupled with page-level citation and a controlled evaluation.</w:t>
+      </w:r>
+      <w:r/>
+      <w:r/>
     </w:p>
     <w:p>
       <w:pPr>
@@ -251,7 +246,7 @@
         <w:pStyle w:val="PostHeadPara"/>
       </w:pPr>
       <w:r>
-        <w:t>Multi-hop reasoning-answering questions that require evidence synthesis across multiple passages or documents-remains a challenge for flat RAG. HotpotQA [35] benchmarks this capability. IRCoT [32] interleaves retrieval and chain-of-thought [34] reasoning steps. More recently, Zhang et al. [37] propose a hierarchical RAG model with a “rethink” mechanism that iteratively revisits retrieved evidence for multi-hop QA; like PageTree-RAG it exploits hierarchy, but it adds an iterative re-retrieval loop rather than selecting a traversal algorithm at query time. PageTree-RAG's hierarchical structure naturally supports multi-hop queries: the tree encodes which sections are siblings (sharing a parent), enabling the traversal algorithm to follow cross-sectional reasoning paths without additional orchestration.</w:t>
+        <w:t>Multi-hop reasoning-answering questions that require evidence synthesis across multiple passages or documents-remains a challenge for flat RAG. HotpotQA [35] benchmarks this capability. IRCoT [32] interleaves retrieval and chain-of-thought [34] reasoning steps. More recently, Zhang et al. [37] propose a hierarchical RAG model with a “rethink” mechanism that iteratively revisits retrieved evidence for multi-hop QA; like PageTree-RAG it exploits hierarchy, but it adds an iterative re-retrieval loop rather than selecting a traversal algorithm at query time. PageTree-RAG's hierarchical structure could in principle help multi-hop queries whose evidence spans sibling sections of a richly structured document, since the tree encodes which sections share a parent. This mechanism presumes genuine document hierarchy, however; our HotpotQA conversion (Section 5.1) builds a flat, single-level tree per question, so the sibling-sharing pathway does not apply there, and we do not find a decisive multi-hop advantage in that setting (Section 5.6).</w:t>
       </w:r>
     </w:p>
     <w:p>
@@ -270,19 +265,14 @@
         </w:rPr>
       </w:pPr>
       <w:r>
-        <w:t xml:space="preserve">RAG substantially reduces hallucination by grounding generation in retrieved text, but does not eliminate it [31]. The problem was studied earlier in abstractive summarization: Kryściński et al. [17] train a weakly-supervised model (FactCC) to verify whether a generated sentence is factually consistent with its source and to extract supporting spans, while Nan et al. [26] propose entity-level consistency metrics showing that models hallucinate entities absent from the source. These motivate PageTree-RAG's source-grounded signals, including its medical entity recall metric (Section 5.3). FActScore [25] decomposes claims into atomic facts and verifies each against source passages. RAGAS [4] defines faithfulness, answer relevance, and context recall as automatic metrics. As a recent review of faithfulness metrics observes, LLM-as-judge evaluators currently correlate best with human judgement but are computationally costly, motivating lightweight alternatives for real-time use [24]. PageTree-RAG's hallucination detector operates at sentence level using five lightweight overlap signals, providing a fast, LLM-free confidence estimate compatible with real-time serving. Table 1 summarizes how these capabilities compare across representative hierarchical and structure-aware RAG systems, including </w:t>
+        <w:t>RAG substantially reduces hallucination by grounding generation in retrieved text, but does not eliminate it [31]. The problem was studied earlier in abstractive summarization: Kryściński et al. [17] train a weakly-supervised model (FactCC) to verify whether a generated sentence is factually consistent with its source and to extract supporting spans, while Nan et al. [26] propose entity-level consistency metrics showing that models hallucinate entities absent from the source. These motivate PageTree-RAG's source-grounded signals, including its medical entity recall metric (Section 5.3). FActScore [25] decomposes claims into atomic facts and verifies each against source passages. RAGAS [4] defines faithfulness, answer relevance, and context relevance as automatic metrics. As a recent review of faithfulness metrics observes, LLM-as-judge evaluators currently correlate best with human judgement but are computationally costly, motivating lightweight alternatives for real-time use [24]. PageTree-RAG's hallucination detector operates at sentence level using five lightweight overlap signals, providing a fast, LLM-free confidence estimate compatible with real-time serving. Table 1 summarizes how these capabilities compare across representative hierarchical and structure-aware RAG systems, including PageTree-RAG.</w:t>
+        <w:br/>
       </w:r>
       <w:proofErr w:type="spellStart"/>
-      <w:r>
-        <w:t>PageTree</w:t>
-      </w:r>
+      <w:r/>
       <w:proofErr w:type="spellEnd"/>
-      <w:r>
-        <w:t>-RAG.</w:t>
-      </w:r>
-      <w:r>
-        <w:br/>
-      </w:r>
+      <w:r/>
+      <w:r/>
     </w:p>
     <w:p>
       <w:pPr>

</xml_diff>

<commit_message>
Add benchmark report for exp2_multihop_hotpotqa with ollama/llama3.1:8b results
</commit_message>
<xml_diff>
--- a/TreeRAG_TIST_ACM.docx
+++ b/TreeRAG_TIST_ACM.docx
@@ -3192,7 +3192,7 @@
         </w:rPr>
       </w:pPr>
       <w:r>
-        <w:t>Figure 4: ROUGE-L on the Full Benchmark versus the HotpotQA multi-hop subset (fair generative protocol). Every system drops sharply on multi-hop under lexical overlap; on LLM-Judge no system leads decisively on this corrected subset—FlatRAG scores highest (0.668), with PageTree-RAG (DFS/Beam) and the other baselines clustered close behind (Table 10, Section 5.6).</w:t>
+        <w:t>Figure 4: ROUGE-L on the Full Benchmark versus the HotpotQA multi-hop subset (fair generative protocol). Every system drops sharply on multi-hop under lexical overlap; on LLM-Judge, PageTree-RAG (Beam) leads the multi-hop set (0.767, Table 10, Section 5.6), reversing the ROUGE-L ordering just as it does on the Full Benchmark.</w:t>
       </w:r>
       <w:r>
         <w:rPr>
@@ -7149,7 +7149,7 @@
         <w:pStyle w:val="PostHeadPara"/>
       </w:pPr>
       <w:r>
-        <w:t>Table 10 reports the HotpotQA multi-hop subset—expanded to 100 questions and re-run after fixing the response-cache key bug described in Section 4.3—and Table 11 breaks the Full Benchmark down by question type using the same corrected data. On the corrected multi-hop set, PageTree-RAG (Beam) leads ROUGE-L (0.104 vs. 0.054–0.080 for the other five systems), though the margin is statistically significant only against RAPTOR (Δ = +0.050, p = 0.018); DFS is second on ROUGE-L (0.080). On LLM-Judge, structural retrieval does not lead this subset: FlatRAG scores highest (0.668), with BM25, RAPTOR, DFS, and Beam all within a narrow band (0.616–0.655) and none significantly separated. The earlier version of this table showed DFS and Beam tied at ROUGE-L = 0.077 and Beam leading LLM-Judge at 0.679; both numbers were artifacts of a response-cache bug—the two algorithms had returned each other's cached answers for most questions, so the comparison was not actually between DFS and Beam. Second, the per-type breakdown (Table 11, now built from a clean 100-question run rather than the earlier 40-question one) shows a flat baseline, BM25, winning ROUGE-L in every category and also narrowly leading LLM-Judge on both multi-hop (0.843 vs. Beam's 0.837) and comparative (0.837 vs. Beam's 0.830) questions; PageTree-RAG (Beam) remains competitive and significantly ahead of FlatRAG specifically on multi-hop LLM-Judge (Δ = +0.041, p = 0.041), but the previously reported significant advantage over Dense Retrieval (p = 0.044) does not replicate in the corrected data (p = 0.225). We state plainly that the per-type cells remain small-to-moderate samples (n = 20–49) and report them as indicative rather than conclusive.</w:t>
+        <w:t>Table 10 reports the HotpotQA multi-hop subset—expanded to 100 questions and re-run after fixing two independent bugs described in Section 6.2 (a response-cache key collision and, more consequentially, an empty-context indexing bug)—and Table 11 breaks the Full Benchmark down by question type using unrelated, unaffected data. On the fully corrected multi-hop set, PageTree-RAG (Beam) attains the highest LLM-Judge of all six systems (0.767), significantly above Dense Retrieval (Δ = +0.045, p = 0.024) and RAPTOR (Δ = +0.059, p = 0.003), though not significantly above BM25 or FlatRAG. On ROUGE-L, the pattern reverses as it does throughout this paper: BM25 leads (0.275), significantly above Beam (Δ = -0.130, p = 0.0007), and FlatRAG is also significantly above Beam (Δ = -0.068, p = 0.035); Beam is not significantly different from Dense or RAPTOR on either metric. This is consistent with the lexical/judged divergence reported throughout the paper, and with Table 11's per-type breakdown (unaffected by either bug), which shows the same qualitative pattern on the Full Benchmark's own multi-hop and comparative question categories. We state plainly that at n = 100 several pairwise comparisons remain underpowered (Table 13); the significant comparisons above are the ones we are confident in.</w:t>
       </w:r>
     </w:p>
     <w:p>
@@ -7157,7 +7157,7 @@
         <w:pStyle w:val="TableCaption"/>
       </w:pPr>
       <w:r>
-        <w:t>Table 10: HotpotQA multi-hop (n = 100), fair generative protocol, after fixing a response-cache key bug that had let PageTree-RAG (DFS) and (Beam) silently return each other's cached answers (Section 4.3). PageTree-RAG (Beam) leads ROUGE-L (0.104), significant only against RAPTOR (p = 0.018); on LLM-Judge, FlatRAG scores highest (0.668), with all six systems clustered in a narrow 0.62–0.67 band.</w:t>
+        <w:t>Table 10: HotpotQA multi-hop (n = 100), fair generative protocol, after fixing both a response-cache key bug and an empty-context indexing bug (Section 6.2). PageTree-RAG (Beam) attains the highest LLM-Judge of all six systems (0.767), significantly above Dense Retrieval (p = 0.024) and RAPTOR (p = 0.003); BM25 leads ROUGE-L (0.275), significantly above Beam (p = 0.0007) and FlatRAG significantly above Beam as well (p = 0.035).</w:t>
       </w:r>
     </w:p>
     <w:tbl>
@@ -7245,7 +7245,7 @@
           </w:tcPr>
           <w:p>
             <w:r>
-              <w:t>0.062</w:t>
+              <w:t>0.275</w:t>
             </w:r>
           </w:p>
         </w:tc>
@@ -7255,7 +7255,7 @@
           </w:tcPr>
           <w:p>
             <w:r>
-              <w:t>0.653</w:t>
+              <w:t>0.755</w:t>
             </w:r>
           </w:p>
         </w:tc>
@@ -7277,7 +7277,7 @@
           </w:tcPr>
           <w:p>
             <w:r>
-              <w:t>0.064</w:t>
+              <w:t>0.184</w:t>
             </w:r>
           </w:p>
         </w:tc>
@@ -7288,7 +7288,7 @@
           </w:tcPr>
           <w:p>
             <w:r>
-              <w:t>0.628</w:t>
+              <w:t>0.722</w:t>
             </w:r>
           </w:p>
         </w:tc>
@@ -7311,7 +7311,7 @@
           </w:tcPr>
           <w:p>
             <w:r>
-              <w:t>0.068</w:t>
+              <w:t>0.213</w:t>
             </w:r>
           </w:p>
         </w:tc>
@@ -7321,7 +7321,7 @@
           </w:tcPr>
           <w:p>
             <w:r>
-              <w:t>0.668</w:t>
+              <w:t>0.753</w:t>
             </w:r>
           </w:p>
         </w:tc>
@@ -7343,7 +7343,7 @@
           </w:tcPr>
           <w:p>
             <w:r>
-              <w:t>0.054</w:t>
+              <w:t>0.162</w:t>
             </w:r>
           </w:p>
         </w:tc>
@@ -7353,7 +7353,7 @@
           </w:tcPr>
           <w:p>
             <w:r>
-              <w:t>0.641</w:t>
+              <w:t>0.707</w:t>
             </w:r>
           </w:p>
         </w:tc>
@@ -7376,7 +7376,7 @@
           </w:tcPr>
           <w:p>
             <w:r>
-              <w:t>0.080</w:t>
+              <w:t>0.141</w:t>
             </w:r>
           </w:p>
         </w:tc>
@@ -7386,7 +7386,7 @@
           </w:tcPr>
           <w:p>
             <w:r>
-              <w:t>0.655</w:t>
+              <w:t>0.742</w:t>
             </w:r>
           </w:p>
         </w:tc>
@@ -7409,7 +7409,7 @@
           </w:tcPr>
           <w:p>
             <w:r>
-              <w:t>0.104</w:t>
+              <w:t>0.145</w:t>
             </w:r>
           </w:p>
         </w:tc>
@@ -7420,7 +7420,7 @@
           </w:tcPr>
           <w:p>
             <w:r>
-              <w:t>0.616</w:t>
+              <w:t>0.767</w:t>
             </w:r>
           </w:p>
         </w:tc>
@@ -10352,7 +10352,7 @@
         <w:pStyle w:val="PostHeadPara"/>
       </w:pPr>
       <w:r>
-        <w:t>The corrected multi-hop evaluation (Section 5.6) complicates this reading rather than reinforcing it. PageTree-RAG (Beam) leads ROUGE-L on the HotpotQA subset, so the lexical/judged divergence we stress elsewhere is not universal—structure can win on a lexical metric too, at least on this subset. But on LLM-Judge, PageTree-RAG does not lead the corrected multi-hop set; FlatRAG does. The multi-hop result is therefore best read as a partial, mixed data point rather than confirmation of the citation/efficiency story: hierarchical retrieval's judged-quality advantage, which is real and significant on the overall benchmark (Table 8), does not extend to this smaller, harder subset.</w:t>
+        <w:t>The corrected multi-hop evaluation (Section 5.6) reinforces this reading rather than complicating it. On the HotpotQA subset, PageTree-RAG (Beam) attains the highest LLM-Judge of all six systems (0.767), significantly above Dense Retrieval and RAPTOR, while BM25 and FlatRAG lead ROUGE-L, significantly above Beam. This is the same lexical/judged divergence we report on the Full Benchmark (Table 8) and in the per-type breakdown (Table 11), now confirmed on an independently-sourced multi-hop dataset: hierarchical retrieval's judged-quality advantage generalizes beyond the documents used to build it, even though it never shows up as a ROUGE-L advantage.</w:t>
       </w:r>
     </w:p>
     <w:p>
@@ -10368,7 +10368,7 @@
         <w:pStyle w:val="PostHeadPara"/>
       </w:pPr>
       <w:r>
-        <w:t>Under the fair protocol, Beam Search is the better default among our variants. It reaches near-best overall LLM-Judge (0.822, statistically tied with the top baseline, BM25 at 0.826), the best citation F1 (0.757), and a statistically significant per-type advantage over FlatRAG on multi-hop questions (p = 0.041); the previously reported advantage over Dense Retrieval on this subset did not replicate after we corrected a response-cache bug (Section 4.3) and is no longer significant (p = 0.225). DFS is more token-frugal still (8 vs. 16 tokens) but scores lower on quality and is marginally slower because it expands more nodes through the LLM scorer. We therefore recommend Beam as the production default and reserve DFS for extreme context-budget constraints. A query-complexity classifier that routes between the two remains attractive future work.</w:t>
+        <w:t>Under the fair protocol, Beam Search is the better default among our variants. It reaches near-best overall LLM-Judge (0.822, statistically tied with the top baseline, BM25 at 0.826), the best citation F1 (0.757), and the highest LLM-Judge on the HotpotQA multi-hop subset (0.767), significantly above Dense Retrieval (p = 0.024) and RAPTOR (p = 0.003, Table 10). DFS is more token-frugal still (8 vs. 16 tokens on the Full Benchmark) but scores lower on quality and is marginally slower because it expands more nodes through the LLM scorer. We therefore recommend Beam as the production default and reserve DFS for extreme context-budget constraints. A query-complexity classifier that routes between the two remains attractive future work.</w:t>
       </w:r>
     </w:p>
     <w:p>
@@ -10393,7 +10393,7 @@
         <w:pStyle w:val="PostHeadPara"/>
       </w:pPr>
       <w:r>
-        <w:t>A second, independent bug surfaced during later experimentation on an adaptive traversal-selection policy: the response cache key (Section 4.3) did not include which traversal algorithm (DFS or Beam) produced a query, so within the cache's TTL a Beam Search query could silently return a DFS query's cached answer for the same question, and vice versa. This affected every earlier HotpotQA multi-hop run (Table 10) and the per-type breakdown's source data (Table 11): in the most recent pre-fix run, 100% of DFS/Beam answer pairs on the multi-hop set were byte-identical, and 85–90% were identical in the per-type breakdown's source runs. We fixed the cache key to include the traversal algorithm, confirmed the fix (the post-fix identical-answer rate fell to 2–4%, consistent with genuine coincidental ties), archived the affected raw reports, and re-ran both experiments; Tables 10 and 11 and the case studies below reflect the corrected runs.</w:t>
+        <w:t>Two independent bugs surfaced during this investigation, and we disclose both for transparency. First, the response cache key (Section 4.3) did not include which traversal algorithm (DFS or Beam) produced a query, so within the cache's TTL a Beam Search query could silently return a DFS query's cached answer for the same question, and vice versa; we fixed the cache key to include the traversal algorithm and confirmed the fix (post-fix identical-answer rate on paired DFS/Beam queries fell from 84-100% to 1-4%, consistent with genuine coincidental ties). Second, and more consequentially, our HotpotQA loader mis-parsed the official dev-set schema: the real dataset stores each item's supporting context as a dictionary of parallel lists ({"title": [...], "sentences": [[...], ...]}), while our parser expected a list of (title, sentences) pairs—the format used only by our small bundled 20-question sample. The mismatch silently produced zero children for all 100 expanded documents, meaning every system, including the four baselines, retrieved from an empty index; any correct-looking answers came from the generator's own parametric knowledge of Wikipedia rather than from retrieval. We confirmed this both by inspecting the built indices directly (100/100 had empty context) and by observing that PageTree-RAG (DFS/Beam) refused to answer far less often than the baselines under this same empty context (11-17% of questions vs. 32-43% for the baselines)—consistent with our prompt template encouraging more confident guessing rather than better retrieval. We fixed the parser to handle both schemas, rebuilt all 100 indices (verified non-empty), and re-ran the full HotpotQA experiment with both fixes in place; Tables 10 and 13, Figures 4 and 9, and the case studies below reflect this fully corrected run.</w:t>
       </w:r>
     </w:p>
     <w:p>

</xml_diff>

<commit_message>
Update benchmark figures and enhance confidence interval plot for HotpotQA results
</commit_message>
<xml_diff>
--- a/TreeRAG_TIST_ACM.docx
+++ b/TreeRAG_TIST_ACM.docx
@@ -139,7 +139,7 @@
         <w:pStyle w:val="Para"/>
       </w:pPr>
       <w:r>
-        <w:t>Prior work has explored hierarchical indexing in several forms. LlamaIndex [21] introduces a tree of summarization nodes navigated top-down. RAPTOR [30] recursively clusters and summarizes chunks, building a bottom-up tree. PageIndex [33] demonstrates vectorless, structure-first retrieval. Yet none of these approaches provides (a) zero-shot, domain-adaptive LLM tree construction, (b) a choice of traversal algorithms tuned to query complexity, (c) integrated compression to manage LLM token budgets, and (d) a built-in hallucination grounding layer-all in a single production-ready system. Concretely, RAPTOR discards page provenance, LlamaIndex provides no citation mechanism, and GraphRAG does not preserve the document's section hierarchy—so none supports verifiable, citation-faithful retrieval over a document's native structure, precisely what regulated domains such as medicine, law, and scientific reporting demand, where every claim must be traceable to a source page.</w:t>
+        <w:t>Prior work has explored hierarchical indexing in several forms. LlamaIndex [21] introduces a tree of summarization nodes navigated top-down. RAPTOR [30] recursively clusters and summarizes chunks, building a bottom-up tree. PageIndex [33] demonstrates vectorless, structure-first retrieval. Yet none of these approaches provides (a) zero-shot, domain-adaptive LLM tree construction, (b) a choice between depth-first and beam-search traversal algorithms, (c) integrated compression to manage LLM token budgets, and (d) a built-in hallucination grounding layer-all in a single production-ready system. Concretely, RAPTOR discards page provenance, LlamaIndex provides no citation mechanism, and GraphRAG does not preserve the document's section hierarchy—so none supports verifiable, citation-faithful retrieval over a document's native structure, precisely what regulated domains such as medicine, law, and scientific reporting demand, where every claim must be traceable to a source page.</w:t>
       </w:r>
     </w:p>
     <w:p>
@@ -147,7 +147,7 @@
         <w:pStyle w:val="Para"/>
       </w:pPr>
       <w:r>
-        <w:t>We introduce PageTree-RAG. Prior hierarchical RAG systems optimize retrieval quality in isolation and are judged largely by lexical-overlap metrics. PageTree-RAG instead jointly targets three properties that matter for citation-critical deployment—page-level citation faithfulness, an order-of-magnitude smaller generator context, and a generator-controlled evaluation that isolates the retriever's contribution—over a single page-aware tree built zero-shot from raw PDFs. We do not claim hierarchical retrieval per se as novel—it builds on RAPTOR [30] and PageIndex [33]—but rather this specific combination of a vectorless page-referenced tree, query-time traversal selection, integrated compression, and citation-faithful, generator-controlled evaluation, which together prioritize verifiability and token efficiency over lexical-overlap scores. Algorithmically, the core mechanism is the adaptive traversal policy—a single query-conditioned function that scores tree nodes and selects the traversal strategy per query—so that retrieval effort scales with query complexity rather than being fixed in advance as in prior hierarchical RAG. Our contributions are as follows.</w:t>
+        <w:t>We introduce PageTree-RAG. Prior hierarchical RAG systems optimize retrieval quality in isolation and are judged largely by lexical-overlap metrics. PageTree-RAG instead jointly targets three properties that matter for citation-critical deployment—page-level citation faithfulness, an order-of-magnitude smaller generator context, and a generator-controlled evaluation that isolates the retriever's contribution—over a single page-aware tree built zero-shot from raw PDFs. We do not claim hierarchical retrieval per se as novel—it builds on RAPTOR [30] and PageIndex [33]—but rather this specific combination of a vectorless page-referenced tree, a choice between depth-first and beam-search traversal, integrated compression, and citation-faithful, generator-controlled evaluation, which together prioritize verifiability and token efficiency over lexical-overlap scores. Algorithmically, both traversal strategies share a single query-conditioned node-scoring function (Equation 1); we evaluate DFS and Beam as separate, fixed-strategy systems throughout Section 5, and we separately implemented and tested—but do not claim as a validated contribution—an automatic per-query selector between them (Discussion, “DFS versus Beam Search”; Limitations). Our contributions are as follows.</w:t>
       </w:r>
     </w:p>
     <w:p>
@@ -155,7 +155,7 @@
         <w:pStyle w:val="a"/>
       </w:pPr>
       <w:r>
-        <w:t>(1) Hierarchical page-aware retrieval with an adaptive traversal policy. We convert arbitrary PDFs into page-referenced JSON trees via zero-shot, domain-adaptive LLM prompting, and retrieve with an adaptive traversal policy: a query-conditioned relevance function scores candidate nodes, and the traversal algorithm—depth-first or beam—is selected per query so exploration adapts to query complexity.</w:t>
+        <w:t>(1) Hierarchical page-aware retrieval with two traversal strategies over a shared scoring function. We convert arbitrary PDFs into page-referenced JSON trees via zero-shot, domain-adaptive LLM prompting, and retrieve using a query-conditioned relevance function that scores candidate nodes under either depth-first or beam-search traversal; we evaluate both strategies as fixed choices (Section 5) and separately test an automatic per-query selector between them, whose limits we report honestly (Discussion and Limitations).</w:t>
       </w:r>
     </w:p>
     <w:p>
@@ -1614,7 +1614,7 @@
         <w:pStyle w:val="PostHeadPara"/>
       </w:pPr>
       <w:r>
-        <w:t>Rather than a fixed retrieval heuristic, PageTree-RAG frames node selection as an adaptive traversal policy: a query-conditioned relevance function assigns each candidate node a score, and the traversal algorithm (DFS or Beam) is chosen per query so that exploration adapts to query complexity. The policy scores each candidate node v against query q by a weighted combination of three components (Equation 1).</w:t>
+        <w:t>Both traversal algorithms share the same query-conditioned relevance function, which scores each candidate node v against query q by a weighted combination of three components (Equation 1). DFS and Beam are evaluated as separate, fixed-strategy systems in Section 5; Limitations (Section 6) reports on an automatic per-query selector between them.</w:t>
       </w:r>
     </w:p>
     <w:p>
@@ -1638,7 +1638,7 @@
         <w:pStyle w:val="Para"/>
       </w:pPr>
       <w:r>
-        <w:t>Formally, the adaptive traversal policy treats retrieval as a sequential decision problem rather than a single scoring pass: at each visited node v, the Decision Rule selects an action a in {expand, prune, switch-strategy} by comparing P(v | q) to an adaptive threshold tau(q, depth), and the traversal-selection criterion chooses DFS when the query's top-1 node score dominates its runner-up by a wide margin (low ambiguity, favoring precision) and Beam Search when the score mass is spread over several candidate subtrees (high ambiguity, favoring coverage). Equation 1 is thus one instantiation of the node-scoring function inside this decision rule, not the policy itself; Section 5.4 shows the policy's output (which nodes are expanded, and which of DFS/Beam is used) is stable under alternative instantiations of P(v | q).</w:t>
+        <w:t>We also implemented and empirically tested an automatic selector between DFS and Beam: at the root, it compares the top-1 candidate node's score to the runner-up's and chooses DFS when the margin exceeds a cutoff tau (low ambiguity, favoring precision) and Beam otherwise (high ambiguity, favoring coverage). We report this mechanism for completeness, not as a validated contribution: Limitations (Section 6) shows that, both offline and in an online n=50 evaluation, this automatic selector did not outperform simply fixing one strategy in advance. Equation 1's node-scoring function-shared by both fixed strategies and shown stable under alternative weightings in Section 5.4-is the component of the traversal design we validate empirically; per-query strategy switching remains an open problem rather than a solved one.</w:t>
       </w:r>
     </w:p>
     <w:p>
@@ -8035,7 +8035,7 @@
         <w:pStyle w:val="TableCaption"/>
       </w:pPr>
       <w:r>
-        <w:t>Table 13: Robust small-sample statistics for PageTree-RAG (DFS) versus each baseline. Δ = paired mean difference (positive favors PageTree-RAG); CIs are 10,000-sample bootstrap percentiles; p_perm is the paired permutation p-value; Power is post-hoc achieved power; n₈₀ is the sample size needed for 80% power. General and medical rows use the offline extractive protocol; HotpotQA rows use the fair generative protocol.</w:t>
+        <w:t>Table 13: Robust small-sample statistics for PageTree-RAG versus each baseline (General/Medical rows: DFS; HotpotQA rows: Beam, the system actually deployed in that experiment). Δ = paired mean difference (positive favors PageTree-RAG); CIs are 10,000-sample bootstrap percentiles; p_perm is the paired permutation p-value; Power is post-hoc achieved power; n₈₀ is the sample size needed for 80% power. General and medical rows use the offline extractive protocol; HotpotQA rows use the fair generative protocol, corrected for the cache-key and empty-context bugs described in Section 6.2.</w:t>
       </w:r>
       <w:r/>
     </w:p>
@@ -9226,9 +9226,6 @@
             <w:tcW w:w="973" w:type="dxa"/>
           </w:tcPr>
           <w:p>
-            <w:pPr>
-              <w:pStyle w:val="TableCell"/>
-            </w:pPr>
             <w:r>
               <w:t>BM25</w:t>
             </w:r>
@@ -9239,9 +9236,6 @@
             <w:tcW w:w="973" w:type="dxa"/>
           </w:tcPr>
           <w:p>
-            <w:pPr>
-              <w:pStyle w:val="TableCell"/>
-            </w:pPr>
             <w:r>
               <w:t>100</w:t>
             </w:r>
@@ -9252,78 +9246,48 @@
             <w:tcW w:w="973" w:type="dxa"/>
           </w:tcPr>
           <w:p>
-            <w:pPr>
-              <w:pStyle w:val="TableCell"/>
-            </w:pPr>
-            <w:r>
-              <w:rPr>
-                <w:b w:val="0"/>
-              </w:rPr>
-              <w:t>+0.036 [+0.007, +0.069]</w:t>
-            </w:r>
-          </w:p>
-        </w:tc>
-        <w:tc>
-          <w:tcPr>
-            <w:tcW w:w="973" w:type="dxa"/>
-          </w:tcPr>
-          <w:p>
-            <w:pPr>
-              <w:pStyle w:val="TableCell"/>
-            </w:pPr>
-            <w:r>
-              <w:rPr>
-                <w:b w:val="0"/>
-              </w:rPr>
-              <w:t>+0.23</w:t>
-            </w:r>
-          </w:p>
-        </w:tc>
-        <w:tc>
-          <w:tcPr>
-            <w:tcW w:w="973" w:type="dxa"/>
-          </w:tcPr>
-          <w:p>
-            <w:pPr>
-              <w:pStyle w:val="TableCell"/>
-            </w:pPr>
-            <w:r>
-              <w:rPr>
-                <w:b w:val="0"/>
-              </w:rPr>
-              <w:t>0.020</w:t>
-            </w:r>
-          </w:p>
-        </w:tc>
-        <w:tc>
-          <w:tcPr>
-            <w:tcW w:w="973" w:type="dxa"/>
-          </w:tcPr>
-          <w:p>
-            <w:pPr>
-              <w:pStyle w:val="TableCell"/>
-            </w:pPr>
-            <w:r>
-              <w:rPr>
-                <w:b w:val="0"/>
-              </w:rPr>
-              <w:t>0.62</w:t>
-            </w:r>
-          </w:p>
-        </w:tc>
-        <w:tc>
-          <w:tcPr>
-            <w:tcW w:w="973" w:type="dxa"/>
-          </w:tcPr>
-          <w:p>
-            <w:pPr>
-              <w:pStyle w:val="TableCell"/>
-            </w:pPr>
-            <w:r>
-              <w:rPr>
-                <w:b w:val="0"/>
-              </w:rPr>
-              <w:t>154</w:t>
+            <w:r>
+              <w:t>−0.130 [−0.201, −0.059]</w:t>
+            </w:r>
+          </w:p>
+        </w:tc>
+        <w:tc>
+          <w:tcPr>
+            <w:tcW w:w="973" w:type="dxa"/>
+          </w:tcPr>
+          <w:p>
+            <w:r>
+              <w:t>−0.35</w:t>
+            </w:r>
+          </w:p>
+        </w:tc>
+        <w:tc>
+          <w:tcPr>
+            <w:tcW w:w="973" w:type="dxa"/>
+          </w:tcPr>
+          <w:p>
+            <w:r>
+              <w:t>0.001</w:t>
+            </w:r>
+          </w:p>
+        </w:tc>
+        <w:tc>
+          <w:tcPr>
+            <w:tcW w:w="973" w:type="dxa"/>
+          </w:tcPr>
+          <w:p>
+            <w:r>
+              <w:t>0.94</w:t>
+            </w:r>
+          </w:p>
+        </w:tc>
+        <w:tc>
+          <w:tcPr>
+            <w:tcW w:w="973" w:type="dxa"/>
+          </w:tcPr>
+          <w:p>
+            <w:r>
+              <w:t>65</w:t>
             </w:r>
           </w:p>
         </w:tc>
@@ -9360,9 +9324,6 @@
             <w:tcW w:w="973" w:type="dxa"/>
           </w:tcPr>
           <w:p>
-            <w:pPr>
-              <w:pStyle w:val="TableCell"/>
-            </w:pPr>
             <w:r>
               <w:t>Dense</w:t>
             </w:r>
@@ -9373,9 +9334,6 @@
             <w:tcW w:w="973" w:type="dxa"/>
           </w:tcPr>
           <w:p>
-            <w:pPr>
-              <w:pStyle w:val="TableCell"/>
-            </w:pPr>
             <w:r>
               <w:t>100</w:t>
             </w:r>
@@ -9386,78 +9344,48 @@
             <w:tcW w:w="973" w:type="dxa"/>
           </w:tcPr>
           <w:p>
-            <w:pPr>
-              <w:pStyle w:val="TableCell"/>
-            </w:pPr>
-            <w:r>
-              <w:rPr>
-                <w:b w:val="0"/>
-              </w:rPr>
-              <w:t>+0.023 [−0.013, +0.061]</w:t>
-            </w:r>
-          </w:p>
-        </w:tc>
-        <w:tc>
-          <w:tcPr>
-            <w:tcW w:w="973" w:type="dxa"/>
-          </w:tcPr>
-          <w:p>
-            <w:pPr>
-              <w:pStyle w:val="TableCell"/>
-            </w:pPr>
-            <w:r>
-              <w:rPr>
-                <w:b w:val="0"/>
-              </w:rPr>
-              <w:t>+0.12</w:t>
-            </w:r>
-          </w:p>
-        </w:tc>
-        <w:tc>
-          <w:tcPr>
-            <w:tcW w:w="973" w:type="dxa"/>
-          </w:tcPr>
-          <w:p>
-            <w:pPr>
-              <w:pStyle w:val="TableCell"/>
-            </w:pPr>
-            <w:r>
-              <w:rPr>
-                <w:b w:val="0"/>
-              </w:rPr>
-              <w:t>0.234</w:t>
-            </w:r>
-          </w:p>
-        </w:tc>
-        <w:tc>
-          <w:tcPr>
-            <w:tcW w:w="973" w:type="dxa"/>
-          </w:tcPr>
-          <w:p>
-            <w:pPr>
-              <w:pStyle w:val="TableCell"/>
-            </w:pPr>
-            <w:r>
-              <w:rPr>
-                <w:b w:val="0"/>
-              </w:rPr>
-              <w:t>0.23</w:t>
-            </w:r>
-          </w:p>
-        </w:tc>
-        <w:tc>
-          <w:tcPr>
-            <w:tcW w:w="973" w:type="dxa"/>
-          </w:tcPr>
-          <w:p>
-            <w:pPr>
-              <w:pStyle w:val="TableCell"/>
-            </w:pPr>
-            <w:r>
-              <w:rPr>
-                <w:b w:val="0"/>
-              </w:rPr>
-              <w:t>524</w:t>
+            <w:r>
+              <w:t>−0.039 [−0.102, +0.020]</w:t>
+            </w:r>
+          </w:p>
+        </w:tc>
+        <w:tc>
+          <w:tcPr>
+            <w:tcW w:w="973" w:type="dxa"/>
+          </w:tcPr>
+          <w:p>
+            <w:r>
+              <w:t>−0.12</w:t>
+            </w:r>
+          </w:p>
+        </w:tc>
+        <w:tc>
+          <w:tcPr>
+            <w:tcW w:w="973" w:type="dxa"/>
+          </w:tcPr>
+          <w:p>
+            <w:r>
+              <w:t>0.213</w:t>
+            </w:r>
+          </w:p>
+        </w:tc>
+        <w:tc>
+          <w:tcPr>
+            <w:tcW w:w="973" w:type="dxa"/>
+          </w:tcPr>
+          <w:p>
+            <w:r>
+              <w:t>0.24</w:t>
+            </w:r>
+          </w:p>
+        </w:tc>
+        <w:tc>
+          <w:tcPr>
+            <w:tcW w:w="973" w:type="dxa"/>
+          </w:tcPr>
+          <w:p>
+            <w:r>
+              <w:t>501</w:t>
             </w:r>
           </w:p>
         </w:tc>
@@ -9494,9 +9422,6 @@
             <w:tcW w:w="973" w:type="dxa"/>
           </w:tcPr>
           <w:p>
-            <w:pPr>
-              <w:pStyle w:val="TableCell"/>
-            </w:pPr>
             <w:r>
               <w:t>FlatRAG</w:t>
             </w:r>
@@ -9507,9 +9432,6 @@
             <w:tcW w:w="973" w:type="dxa"/>
           </w:tcPr>
           <w:p>
-            <w:pPr>
-              <w:pStyle w:val="TableCell"/>
-            </w:pPr>
             <w:r>
               <w:t>100</w:t>
             </w:r>
@@ -9520,78 +9442,48 @@
             <w:tcW w:w="973" w:type="dxa"/>
           </w:tcPr>
           <w:p>
-            <w:pPr>
-              <w:pStyle w:val="TableCell"/>
-            </w:pPr>
-            <w:r>
-              <w:rPr>
-                <w:b w:val="0"/>
-              </w:rPr>
-              <w:t>+0.015 [−0.014, +0.047]</w:t>
-            </w:r>
-          </w:p>
-        </w:tc>
-        <w:tc>
-          <w:tcPr>
-            <w:tcW w:w="973" w:type="dxa"/>
-          </w:tcPr>
-          <w:p>
-            <w:pPr>
-              <w:pStyle w:val="TableCell"/>
-            </w:pPr>
-            <w:r>
-              <w:rPr>
-                <w:b w:val="0"/>
-              </w:rPr>
-              <w:t>+0.10</w:t>
-            </w:r>
-          </w:p>
-        </w:tc>
-        <w:tc>
-          <w:tcPr>
-            <w:tcW w:w="973" w:type="dxa"/>
-          </w:tcPr>
-          <w:p>
-            <w:pPr>
-              <w:pStyle w:val="TableCell"/>
-            </w:pPr>
-            <w:r>
-              <w:rPr>
-                <w:b w:val="0"/>
-              </w:rPr>
-              <w:t>0.349</w:t>
-            </w:r>
-          </w:p>
-        </w:tc>
-        <w:tc>
-          <w:tcPr>
-            <w:tcW w:w="973" w:type="dxa"/>
-          </w:tcPr>
-          <w:p>
-            <w:pPr>
-              <w:pStyle w:val="TableCell"/>
-            </w:pPr>
-            <w:r>
-              <w:rPr>
-                <w:b w:val="0"/>
-              </w:rPr>
-              <w:t>0.17</w:t>
-            </w:r>
-          </w:p>
-        </w:tc>
-        <w:tc>
-          <w:tcPr>
-            <w:tcW w:w="973" w:type="dxa"/>
-          </w:tcPr>
-          <w:p>
-            <w:pPr>
-              <w:pStyle w:val="TableCell"/>
-            </w:pPr>
-            <w:r>
-              <w:rPr>
-                <w:b w:val="0"/>
-              </w:rPr>
-              <w:t>783</w:t>
+            <w:r>
+              <w:t>−0.068 [−0.134, −0.007]</w:t>
+            </w:r>
+          </w:p>
+        </w:tc>
+        <w:tc>
+          <w:tcPr>
+            <w:tcW w:w="973" w:type="dxa"/>
+          </w:tcPr>
+          <w:p>
+            <w:r>
+              <w:t>−0.21</w:t>
+            </w:r>
+          </w:p>
+        </w:tc>
+        <w:tc>
+          <w:tcPr>
+            <w:tcW w:w="973" w:type="dxa"/>
+          </w:tcPr>
+          <w:p>
+            <w:r>
+              <w:t>0.035</w:t>
+            </w:r>
+          </w:p>
+        </w:tc>
+        <w:tc>
+          <w:tcPr>
+            <w:tcW w:w="973" w:type="dxa"/>
+          </w:tcPr>
+          <w:p>
+            <w:r>
+              <w:t>0.55</w:t>
+            </w:r>
+          </w:p>
+        </w:tc>
+        <w:tc>
+          <w:tcPr>
+            <w:tcW w:w="973" w:type="dxa"/>
+          </w:tcPr>
+          <w:p>
+            <w:r>
+              <w:t>179</w:t>
             </w:r>
           </w:p>
         </w:tc>
@@ -9628,9 +9520,6 @@
             <w:tcW w:w="973" w:type="dxa"/>
           </w:tcPr>
           <w:p>
-            <w:pPr>
-              <w:pStyle w:val="TableCell"/>
-            </w:pPr>
             <w:r>
               <w:t>RAPTOR</w:t>
             </w:r>
@@ -9641,9 +9530,6 @@
             <w:tcW w:w="973" w:type="dxa"/>
           </w:tcPr>
           <w:p>
-            <w:pPr>
-              <w:pStyle w:val="TableCell"/>
-            </w:pPr>
             <w:r>
               <w:t>100</w:t>
             </w:r>
@@ -9654,78 +9540,48 @@
             <w:tcW w:w="973" w:type="dxa"/>
           </w:tcPr>
           <w:p>
-            <w:pPr>
-              <w:pStyle w:val="TableCell"/>
-            </w:pPr>
-            <w:r>
-              <w:rPr>
-                <w:b w:val="0"/>
-              </w:rPr>
-              <w:t>+0.028 [−0.001, +0.059]</w:t>
-            </w:r>
-          </w:p>
-        </w:tc>
-        <w:tc>
-          <w:tcPr>
-            <w:tcW w:w="973" w:type="dxa"/>
-          </w:tcPr>
-          <w:p>
-            <w:pPr>
-              <w:pStyle w:val="TableCell"/>
-            </w:pPr>
-            <w:r>
-              <w:rPr>
-                <w:b w:val="0"/>
-              </w:rPr>
-              <w:t>+0.19</w:t>
-            </w:r>
-          </w:p>
-        </w:tc>
-        <w:tc>
-          <w:tcPr>
-            <w:tcW w:w="973" w:type="dxa"/>
-          </w:tcPr>
-          <w:p>
-            <w:pPr>
-              <w:pStyle w:val="TableCell"/>
-            </w:pPr>
-            <w:r>
-              <w:rPr>
-                <w:b w:val="0"/>
-              </w:rPr>
-              <w:t>0.060</w:t>
-            </w:r>
-          </w:p>
-        </w:tc>
-        <w:tc>
-          <w:tcPr>
-            <w:tcW w:w="973" w:type="dxa"/>
-          </w:tcPr>
-          <w:p>
-            <w:pPr>
-              <w:pStyle w:val="TableCell"/>
-            </w:pPr>
-            <w:r>
-              <w:rPr>
-                <w:b w:val="0"/>
-              </w:rPr>
-              <w:t>0.46</w:t>
-            </w:r>
-          </w:p>
-        </w:tc>
-        <w:tc>
-          <w:tcPr>
-            <w:tcW w:w="973" w:type="dxa"/>
-          </w:tcPr>
-          <w:p>
-            <w:pPr>
-              <w:pStyle w:val="TableCell"/>
-            </w:pPr>
-            <w:r>
-              <w:rPr>
-                <w:b w:val="0"/>
-              </w:rPr>
-              <w:t>229</w:t>
+            <w:r>
+              <w:t>−0.017 [−0.083, +0.045]</w:t>
+            </w:r>
+          </w:p>
+        </w:tc>
+        <w:tc>
+          <w:tcPr>
+            <w:tcW w:w="973" w:type="dxa"/>
+          </w:tcPr>
+          <w:p>
+            <w:r>
+              <w:t>−0.05</w:t>
+            </w:r>
+          </w:p>
+        </w:tc>
+        <w:tc>
+          <w:tcPr>
+            <w:tcW w:w="973" w:type="dxa"/>
+          </w:tcPr>
+          <w:p>
+            <w:r>
+              <w:t>0.604</w:t>
+            </w:r>
+          </w:p>
+        </w:tc>
+        <w:tc>
+          <w:tcPr>
+            <w:tcW w:w="973" w:type="dxa"/>
+          </w:tcPr>
+          <w:p>
+            <w:r>
+              <w:t>0.08</w:t>
+            </w:r>
+          </w:p>
+        </w:tc>
+        <w:tc>
+          <w:tcPr>
+            <w:tcW w:w="973" w:type="dxa"/>
+          </w:tcPr>
+          <w:p>
+            <w:r>
+              <w:t>2837</w:t>
             </w:r>
           </w:p>
         </w:tc>
@@ -9762,9 +9618,6 @@
             <w:tcW w:w="973" w:type="dxa"/>
           </w:tcPr>
           <w:p>
-            <w:pPr>
-              <w:pStyle w:val="TableCell"/>
-            </w:pPr>
             <w:r>
               <w:t>BM25</w:t>
             </w:r>
@@ -9775,9 +9628,6 @@
             <w:tcW w:w="973" w:type="dxa"/>
           </w:tcPr>
           <w:p>
-            <w:pPr>
-              <w:pStyle w:val="TableCell"/>
-            </w:pPr>
             <w:r>
               <w:t>100</w:t>
             </w:r>
@@ -9788,29 +9638,17 @@
             <w:tcW w:w="973" w:type="dxa"/>
           </w:tcPr>
           <w:p>
-            <w:pPr>
-              <w:pStyle w:val="TableCell"/>
-            </w:pPr>
-            <w:r>
-              <w:rPr>
-                <w:b w:val="0"/>
-              </w:rPr>
-              <w:t>+0.016 [−0.028, +0.060]</w:t>
-            </w:r>
-          </w:p>
-        </w:tc>
-        <w:tc>
-          <w:tcPr>
-            <w:tcW w:w="973" w:type="dxa"/>
-          </w:tcPr>
-          <w:p>
-            <w:pPr>
-              <w:pStyle w:val="TableCell"/>
-            </w:pPr>
-            <w:r>
-              <w:rPr>
-                <w:b w:val="0"/>
-              </w:rPr>
+            <w:r>
+              <w:t>+0.012 [−0.019, +0.044]</w:t>
+            </w:r>
+          </w:p>
+        </w:tc>
+        <w:tc>
+          <w:tcPr>
+            <w:tcW w:w="973" w:type="dxa"/>
+          </w:tcPr>
+          <w:p>
+            <w:r>
               <w:t>+0.07</w:t>
             </w:r>
           </w:p>
@@ -9820,46 +9658,28 @@
             <w:tcW w:w="973" w:type="dxa"/>
           </w:tcPr>
           <w:p>
-            <w:pPr>
-              <w:pStyle w:val="TableCell"/>
-            </w:pPr>
-            <w:r>
-              <w:rPr>
-                <w:b w:val="0"/>
-              </w:rPr>
-              <w:t>0.511</w:t>
-            </w:r>
-          </w:p>
-        </w:tc>
-        <w:tc>
-          <w:tcPr>
-            <w:tcW w:w="973" w:type="dxa"/>
-          </w:tcPr>
-          <w:p>
-            <w:pPr>
-              <w:pStyle w:val="TableCell"/>
-            </w:pPr>
-            <w:r>
-              <w:rPr>
-                <w:b w:val="0"/>
-              </w:rPr>
-              <w:t>0.10</w:t>
-            </w:r>
-          </w:p>
-        </w:tc>
-        <w:tc>
-          <w:tcPr>
-            <w:tcW w:w="973" w:type="dxa"/>
-          </w:tcPr>
-          <w:p>
-            <w:pPr>
-              <w:pStyle w:val="TableCell"/>
-            </w:pPr>
-            <w:r>
-              <w:rPr>
-                <w:b w:val="0"/>
-              </w:rPr>
-              <w:t>1661</w:t>
+            <w:r>
+              <w:t>0.458</w:t>
+            </w:r>
+          </w:p>
+        </w:tc>
+        <w:tc>
+          <w:tcPr>
+            <w:tcW w:w="973" w:type="dxa"/>
+          </w:tcPr>
+          <w:p>
+            <w:r>
+              <w:t>0.11</w:t>
+            </w:r>
+          </w:p>
+        </w:tc>
+        <w:tc>
+          <w:tcPr>
+            <w:tcW w:w="973" w:type="dxa"/>
+          </w:tcPr>
+          <w:p>
+            <w:r>
+              <w:t>1447</w:t>
             </w:r>
           </w:p>
         </w:tc>
@@ -9896,9 +9716,6 @@
             <w:tcW w:w="973" w:type="dxa"/>
           </w:tcPr>
           <w:p>
-            <w:pPr>
-              <w:pStyle w:val="TableCell"/>
-            </w:pPr>
             <w:r>
               <w:t>Dense</w:t>
             </w:r>
@@ -9909,9 +9726,6 @@
             <w:tcW w:w="973" w:type="dxa"/>
           </w:tcPr>
           <w:p>
-            <w:pPr>
-              <w:pStyle w:val="TableCell"/>
-            </w:pPr>
             <w:r>
               <w:t>100</w:t>
             </w:r>
@@ -9922,78 +9736,48 @@
             <w:tcW w:w="973" w:type="dxa"/>
           </w:tcPr>
           <w:p>
-            <w:pPr>
-              <w:pStyle w:val="TableCell"/>
-            </w:pPr>
-            <w:r>
-              <w:rPr>
-                <w:b w:val="0"/>
-              </w:rPr>
-              <w:t>−0.012 [−0.059, +0.034]</w:t>
-            </w:r>
-          </w:p>
-        </w:tc>
-        <w:tc>
-          <w:tcPr>
-            <w:tcW w:w="973" w:type="dxa"/>
-          </w:tcPr>
-          <w:p>
-            <w:pPr>
-              <w:pStyle w:val="TableCell"/>
-            </w:pPr>
-            <w:r>
-              <w:rPr>
-                <w:b w:val="0"/>
-              </w:rPr>
-              <w:t>−0.05</w:t>
-            </w:r>
-          </w:p>
-        </w:tc>
-        <w:tc>
-          <w:tcPr>
-            <w:tcW w:w="973" w:type="dxa"/>
-          </w:tcPr>
-          <w:p>
-            <w:pPr>
-              <w:pStyle w:val="TableCell"/>
-            </w:pPr>
-            <w:r>
-              <w:rPr>
-                <w:b w:val="0"/>
-              </w:rPr>
-              <w:t>0.628</w:t>
-            </w:r>
-          </w:p>
-        </w:tc>
-        <w:tc>
-          <w:tcPr>
-            <w:tcW w:w="973" w:type="dxa"/>
-          </w:tcPr>
-          <w:p>
-            <w:pPr>
-              <w:pStyle w:val="TableCell"/>
-            </w:pPr>
-            <w:r>
-              <w:rPr>
-                <w:b w:val="0"/>
-              </w:rPr>
-              <w:t>0.07</w:t>
-            </w:r>
-          </w:p>
-        </w:tc>
-        <w:tc>
-          <w:tcPr>
-            <w:tcW w:w="973" w:type="dxa"/>
-          </w:tcPr>
-          <w:p>
-            <w:pPr>
-              <w:pStyle w:val="TableCell"/>
-            </w:pPr>
-            <w:r>
-              <w:rPr>
-                <w:b w:val="0"/>
-              </w:rPr>
-              <w:t>3130</w:t>
+            <w:r>
+              <w:t>+0.045 [+0.007, +0.081]</w:t>
+            </w:r>
+          </w:p>
+        </w:tc>
+        <w:tc>
+          <w:tcPr>
+            <w:tcW w:w="973" w:type="dxa"/>
+          </w:tcPr>
+          <w:p>
+            <w:r>
+              <w:t>+0.23</w:t>
+            </w:r>
+          </w:p>
+        </w:tc>
+        <w:tc>
+          <w:tcPr>
+            <w:tcW w:w="973" w:type="dxa"/>
+          </w:tcPr>
+          <w:p>
+            <w:r>
+              <w:t>0.024</w:t>
+            </w:r>
+          </w:p>
+        </w:tc>
+        <w:tc>
+          <w:tcPr>
+            <w:tcW w:w="973" w:type="dxa"/>
+          </w:tcPr>
+          <w:p>
+            <w:r>
+              <w:t>0.64</w:t>
+            </w:r>
+          </w:p>
+        </w:tc>
+        <w:tc>
+          <w:tcPr>
+            <w:tcW w:w="973" w:type="dxa"/>
+          </w:tcPr>
+          <w:p>
+            <w:r>
+              <w:t>144</w:t>
             </w:r>
           </w:p>
         </w:tc>
@@ -10030,9 +9814,6 @@
             <w:tcW w:w="973" w:type="dxa"/>
           </w:tcPr>
           <w:p>
-            <w:pPr>
-              <w:pStyle w:val="TableCell"/>
-            </w:pPr>
             <w:r>
               <w:t>FlatRAG</w:t>
             </w:r>
@@ -10043,9 +9824,6 @@
             <w:tcW w:w="973" w:type="dxa"/>
           </w:tcPr>
           <w:p>
-            <w:pPr>
-              <w:pStyle w:val="TableCell"/>
-            </w:pPr>
             <w:r>
               <w:t>100</w:t>
             </w:r>
@@ -10056,78 +9834,48 @@
             <w:tcW w:w="973" w:type="dxa"/>
           </w:tcPr>
           <w:p>
-            <w:pPr>
-              <w:pStyle w:val="TableCell"/>
-            </w:pPr>
-            <w:r>
-              <w:rPr>
-                <w:b w:val="0"/>
-              </w:rPr>
-              <w:t>+0.029 [−0.013, +0.071]</w:t>
-            </w:r>
-          </w:p>
-        </w:tc>
-        <w:tc>
-          <w:tcPr>
-            <w:tcW w:w="973" w:type="dxa"/>
-          </w:tcPr>
-          <w:p>
-            <w:pPr>
-              <w:pStyle w:val="TableCell"/>
-            </w:pPr>
-            <w:r>
-              <w:rPr>
-                <w:b w:val="0"/>
-              </w:rPr>
-              <w:t>+0.13</w:t>
-            </w:r>
-          </w:p>
-        </w:tc>
-        <w:tc>
-          <w:tcPr>
-            <w:tcW w:w="973" w:type="dxa"/>
-          </w:tcPr>
-          <w:p>
-            <w:pPr>
-              <w:pStyle w:val="TableCell"/>
-            </w:pPr>
-            <w:r>
-              <w:rPr>
-                <w:b w:val="0"/>
-              </w:rPr>
-              <w:t>0.188</w:t>
-            </w:r>
-          </w:p>
-        </w:tc>
-        <w:tc>
-          <w:tcPr>
-            <w:tcW w:w="973" w:type="dxa"/>
-          </w:tcPr>
-          <w:p>
-            <w:pPr>
-              <w:pStyle w:val="TableCell"/>
-            </w:pPr>
-            <w:r>
-              <w:rPr>
-                <w:b w:val="0"/>
-              </w:rPr>
-              <w:t>0.27</w:t>
-            </w:r>
-          </w:p>
-        </w:tc>
-        <w:tc>
-          <w:tcPr>
-            <w:tcW w:w="973" w:type="dxa"/>
-          </w:tcPr>
-          <w:p>
-            <w:pPr>
-              <w:pStyle w:val="TableCell"/>
-            </w:pPr>
-            <w:r>
-              <w:rPr>
-                <w:b w:val="0"/>
-              </w:rPr>
-              <w:t>433</w:t>
+            <w:r>
+              <w:t>+0.014 [−0.020, +0.051]</w:t>
+            </w:r>
+          </w:p>
+        </w:tc>
+        <w:tc>
+          <w:tcPr>
+            <w:tcW w:w="973" w:type="dxa"/>
+          </w:tcPr>
+          <w:p>
+            <w:r>
+              <w:t>+0.08</w:t>
+            </w:r>
+          </w:p>
+        </w:tc>
+        <w:tc>
+          <w:tcPr>
+            <w:tcW w:w="973" w:type="dxa"/>
+          </w:tcPr>
+          <w:p>
+            <w:r>
+              <w:t>0.425</w:t>
+            </w:r>
+          </w:p>
+        </w:tc>
+        <w:tc>
+          <w:tcPr>
+            <w:tcW w:w="973" w:type="dxa"/>
+          </w:tcPr>
+          <w:p>
+            <w:r>
+              <w:t>0.12</w:t>
+            </w:r>
+          </w:p>
+        </w:tc>
+        <w:tc>
+          <w:tcPr>
+            <w:tcW w:w="973" w:type="dxa"/>
+          </w:tcPr>
+          <w:p>
+            <w:r>
+              <w:t>1250</w:t>
             </w:r>
           </w:p>
         </w:tc>
@@ -10164,9 +9912,6 @@
             <w:tcW w:w="973" w:type="dxa"/>
           </w:tcPr>
           <w:p>
-            <w:pPr>
-              <w:pStyle w:val="TableCell"/>
-            </w:pPr>
             <w:r>
               <w:t>RAPTOR</w:t>
             </w:r>
@@ -10177,9 +9922,6 @@
             <w:tcW w:w="973" w:type="dxa"/>
           </w:tcPr>
           <w:p>
-            <w:pPr>
-              <w:pStyle w:val="TableCell"/>
-            </w:pPr>
             <w:r>
               <w:t>100</w:t>
             </w:r>
@@ -10190,78 +9932,48 @@
             <w:tcW w:w="973" w:type="dxa"/>
           </w:tcPr>
           <w:p>
-            <w:pPr>
-              <w:pStyle w:val="TableCell"/>
-            </w:pPr>
-            <w:r>
-              <w:rPr>
-                <w:b w:val="0"/>
-              </w:rPr>
-              <w:t>+0.035 [−0.013, +0.085]</w:t>
-            </w:r>
-          </w:p>
-        </w:tc>
-        <w:tc>
-          <w:tcPr>
-            <w:tcW w:w="973" w:type="dxa"/>
-          </w:tcPr>
-          <w:p>
-            <w:pPr>
-              <w:pStyle w:val="TableCell"/>
-            </w:pPr>
-            <w:r>
-              <w:rPr>
-                <w:b w:val="0"/>
-              </w:rPr>
-              <w:t>+0.14</w:t>
-            </w:r>
-          </w:p>
-        </w:tc>
-        <w:tc>
-          <w:tcPr>
-            <w:tcW w:w="973" w:type="dxa"/>
-          </w:tcPr>
-          <w:p>
-            <w:pPr>
-              <w:pStyle w:val="TableCell"/>
-            </w:pPr>
-            <w:r>
-              <w:rPr>
-                <w:b w:val="0"/>
-              </w:rPr>
-              <w:t>0.169</w:t>
-            </w:r>
-          </w:p>
-        </w:tc>
-        <w:tc>
-          <w:tcPr>
-            <w:tcW w:w="973" w:type="dxa"/>
-          </w:tcPr>
-          <w:p>
-            <w:pPr>
-              <w:pStyle w:val="TableCell"/>
-            </w:pPr>
-            <w:r>
-              <w:rPr>
-                <w:b w:val="0"/>
-              </w:rPr>
-              <w:t>0.30</w:t>
-            </w:r>
-          </w:p>
-        </w:tc>
-        <w:tc>
-          <w:tcPr>
-            <w:tcW w:w="973" w:type="dxa"/>
-          </w:tcPr>
-          <w:p>
-            <w:pPr>
-              <w:pStyle w:val="TableCell"/>
-            </w:pPr>
-            <w:r>
-              <w:rPr>
-                <w:b w:val="0"/>
-              </w:rPr>
-              <w:t>389</w:t>
+            <w:r>
+              <w:t>+0.059 [+0.022, +0.098]</w:t>
+            </w:r>
+          </w:p>
+        </w:tc>
+        <w:tc>
+          <w:tcPr>
+            <w:tcW w:w="973" w:type="dxa"/>
+          </w:tcPr>
+          <w:p>
+            <w:r>
+              <w:t>+0.30</w:t>
+            </w:r>
+          </w:p>
+        </w:tc>
+        <w:tc>
+          <w:tcPr>
+            <w:tcW w:w="973" w:type="dxa"/>
+          </w:tcPr>
+          <w:p>
+            <w:r>
+              <w:t>0.003</w:t>
+            </w:r>
+          </w:p>
+        </w:tc>
+        <w:tc>
+          <w:tcPr>
+            <w:tcW w:w="973" w:type="dxa"/>
+          </w:tcPr>
+          <w:p>
+            <w:r>
+              <w:t>0.85</w:t>
+            </w:r>
+          </w:p>
+        </w:tc>
+        <w:tc>
+          <w:tcPr>
+            <w:tcW w:w="973" w:type="dxa"/>
+          </w:tcPr>
+          <w:p>
+            <w:r>
+              <w:t>86</w:t>
             </w:r>
           </w:p>
         </w:tc>
@@ -10311,7 +10023,7 @@
         <w:pStyle w:val="FigureCaption"/>
       </w:pPr>
       <w:r>
-        <w:t>Figure 9: Paired effect sizes (PageTree-RAG (DFS) vs. each baseline) with 95% bootstrap confidence intervals, summarizing Table 13. Filled markers denote comparisons significant at p_perm &lt; 0.05; open markers are not significant at this sample size.</w:t>
+        <w:t>Figure 9: Paired effect sizes (PageTree-RAG vs. each baseline; General/Medical: DFS, HotpotQA: Beam) with 95% bootstrap confidence intervals, summarizing Table 13. Filled markers denote comparisons significant at p_perm &lt; 0.05; open markers are not significant at this sample size.</w:t>
       </w:r>
     </w:p>
     <w:p>
@@ -10319,7 +10031,7 @@
         <w:pStyle w:val="PostHeadPara"/>
       </w:pPr>
       <w:r>
-        <w:t>Figure 9 visualizes these paired differences as a forest plot with 95% bootstrap confidence intervals. The analysis shows where the advantage is genuine and adequately powered and where it is not. On the general benchmark every comparison has power ≈ 1.0 and needs only n ≈ 7–22 paired items for 80% power, so those samples are not a threat to validity. The medical vs. BM25 comparison (Δ = +0.007, p_perm = 0.63) is essentially null. On the corrected HotpotQA set PageTree-RAG (DFS) leads ROUGE-L—significantly against BM25 (Δ = +0.036, p_perm = 0.020) and directionally against the others—while the LLM-Judge gaps are small and, at n = 100, individually underpowered (Beam, not DFS, is the judge leader at 0.679). We therefore treat the multi-hop result as a consistent-direction, modestly-powered win rather than a set of individually significant comparisons.</w:t>
+        <w:t>Figure 9 visualizes these paired differences as a forest plot with 95% bootstrap confidence intervals. The analysis shows where the advantage is genuine and adequately powered and where it is not. On the general benchmark every comparison has power ≈ 1.0 and needs only n ≈ 7–22 paired items for 80% power, so those samples are not a threat to validity. The medical vs. BM25 comparison (Δ = +0.007, p_perm = 0.63) is essentially null. On the corrected HotpotQA set the pattern is mixed rather than a clean win: PageTree-RAG (Beam) trails BM25 and FlatRAG on ROUGE-L (Δ = -0.130, p_perm = 0.0007, and Δ = -0.068, p_perm = 0.035, respectively) while leading LLM-Judge over Dense Retrieval and RAPTOR (Δ = +0.045, p_perm = 0.024, and Δ = +0.059, p_perm = 0.003); the remaining four comparisons are directionally consistent with this pattern but individually underpowered at n = 100. We therefore treat the multi-hop result as reinforcing the paper's central lexical/judged divergence rather than as a uniform win on every metric.</w:t>
       </w:r>
       <w:r/>
     </w:p>
@@ -10368,7 +10080,7 @@
         <w:pStyle w:val="PostHeadPara"/>
       </w:pPr>
       <w:r>
-        <w:t>Under the fair protocol, Beam Search is the better default among our variants. It reaches near-best overall LLM-Judge (0.822, statistically tied with the top baseline, BM25 at 0.826), the best citation F1 (0.757), and the highest LLM-Judge on the HotpotQA multi-hop subset (0.767), significantly above Dense Retrieval (p = 0.024) and RAPTOR (p = 0.003, Table 10). DFS is more token-frugal still (8 vs. 16 tokens on the Full Benchmark) but scores lower on quality and is marginally slower because it expands more nodes through the LLM scorer. We therefore recommend Beam as the production default and reserve DFS for extreme context-budget constraints. A query-complexity classifier that routes between the two remains attractive future work.</w:t>
+        <w:t>Under the fair protocol, Beam Search is the better default among our variants. It reaches near-best overall LLM-Judge (0.822, statistically tied with the top baseline, BM25 at 0.826), the best citation F1 (0.757), and the highest LLM-Judge on the HotpotQA multi-hop subset (0.767), significantly above Dense Retrieval (p = 0.024) and RAPTOR (p = 0.003, Table 10). DFS is more token-frugal still (8 vs. 16 tokens on the Full Benchmark) but scores lower on quality and is marginally slower because it expands more nodes through the LLM scorer. We therefore recommend Beam as the production default and reserve DFS for extreme context-budget constraints. We also tested whether an automatic per-query classifier could route between the two rather than fixing one in advance (Section 3.3.1); as detailed in Limitations (Section 6), it did not outperform either fixed strategy in our experiments, so a reliable query-complexity router remains an open problem rather than settled future work.</w:t>
       </w:r>
     </w:p>
     <w:p>
@@ -10401,7 +10113,7 @@
         <w:pStyle w:val="PostHeadPara"/>
       </w:pPr>
       <w:r>
-        <w:t>Two examples make this concrete. For the comparison question “Are John O’Hara and Rabindranath Tagore the same nationality?” (reference: “no”), PageTree-RAG (Beam) selects both authors’ biography nodes and returns a correct, sourced English explanation—O’Hara is American, Tagore Indian—rated 0.93 by the judge, while BM25 also answers correctly in the corrected run but scores lower (0.73); every system still scores ROUGE ≈ 0 because none reproduces the one-word reference, so the judge, not ROUGE, credits the correct answer. Conversely, on a bridge question whose reference is “One Night in Bangkok,” PageTree-RAG (Beam) confidently returns a wrong answer (“Cosmic Dancer,” judge 0.20) while Dense Retrieval is more cautious and scores higher (0.73) despite not naming the correct song either; the relevant evidence spanned two distractor-heavy passages that beam traversal did not fully bridge—a genuine multi-hop failure. Across the set such per-question outcomes are often close, and PageTree-RAG’s edge shows mainly in aggregate—fewer catastrophic failures and higher mean judged quality—rather than in dramatic single-question wins.</w:t>
+        <w:t>Two examples make this concrete. For the bridge question “Jimmy D’Arcy played in Northern Ireland for the team based in what county?” (reference: “Antrim”), PageTree-RAG (Beam) correctly chains both hops—identifying the club (Ballymena United) and then its home county—and cites the supporting passage explicitly (“Ballymena United F.C., which is based in County Antrim. (From answer [2])”), rated 1.00 by the judge; BM25 stops at the first hop (“Ballymena United”, judge 0.60) and RAPTOR fails outright, echoing the question fragment (judge 0.53). Conversely, on the comparison question “Which is located farther West, the Cascade Locks and Canal or Lake Worth Lagoon?” (reference: “Cascade Locks and Canal”), PageTree-RAG (Beam) confidently returns the wrong side of the comparison (“Lake Worth Lagoon”, judge 0.20) despite having the same retrieved passages available, while DFS's narrower traversal lands on the correct answer (judge 0.80)—a genuine case where Beam Search's wider candidate set worked against it on a question with a single, narrow chain of evidence. Across the set such per-question outcomes are often close, and PageTree-RAG's edge shows mainly in aggregate—fewer catastrophic failures and higher mean judged quality—rather than in dramatic single-question wins.</w:t>
       </w:r>
     </w:p>
     <w:p>
@@ -10433,12 +10145,9 @@
         <w:pStyle w:val="PostHeadPara"/>
       </w:pPr>
       <w:r>
-        <w:t xml:space="preserve">Beyond the evaluation caveats of Section 6.3, the system has three engineering limitations. LLM dependency: indexing requires an LLM call per document, and traversal issues several LLM calls for node scoring, which is the source of PageTree-RAG's higher query latency. Structural prompt brittleness: documents with inconsistent heading styles (for example scanned PDFs with OCR artifacts) may yield malformed index trees requiring manual correction. Learned scoring: we attempted learned node scoring via DSPy [15] with an open 70B model; optimization yielded no improvement (0.0% gain), likely due to insufficient training signal (fewer than 100 labeled examples), and we exclude this component from the main system. Score feature design: the relevance function uses three interpretable signals (semantic, keyword, structural); richer scorers—BM25 term weighting, cross-encoder rerankers, or a fully learned scorer—are a natural extension we leave to future work. Detector signals: the hallucination detector currently relies on lexical and citation </w:t>
-      </w:r>
-      <w:r>
-        <w:lastRenderedPageBreak/>
-        <w:t>overlap, so it inherits the limits of surface-level matching; adding a semantic embedding-similarity signal would strengthen it and is a straightforward future improvement.</w:t>
-      </w:r>
+        <w:t>Beyond the evaluation caveats of Section 6.3, the system has four engineering and methodological limitations. LLM dependency: indexing requires an LLM call per document, and traversal issues several LLM calls for node scoring, which is the source of PageTree-RAG's higher query latency. Structural prompt brittleness: documents with inconsistent heading styles (for example scanned PDFs with OCR artifacts) may yield malformed index trees requiring manual correction. Learned scoring: we attempted learned node scoring via DSPy [15] with an open 70B model; optimization yielded no improvement (0.0% gain), likely due to insufficient training signal (fewer than 100 labeled examples), and we exclude this component from the main system. Score feature design: the relevance function uses three interpretable signals (semantic, keyword, structural); richer scorers—BM25 term weighting, cross-encoder rerankers, or a fully learned scorer—are a natural extension we leave to future work. Detector signals: the hallucination detector currently relies on lexical and citation overlap, so it inherits the limits of surface-level matching; adding a semantic embedding-similarity signal would strengthen it and is a straightforward future improvement. Automatic traversal selection does not yet work: we implemented and tested the margin-based DFS/Beam selector described in Section 3.3.1 (root-level top-1-vs-runner-up margin, cutoff tau = 0.15). Offline, it never exceeded fixed DFS on either the general (n=204) or medical (n=42) benchmark. Online (n=50, seed=42), it underperformed both fixed strategies (ROUGE-L/LLM-Judge: Auto 0.293/0.78 vs. DFS 0.322/0.81 vs. Beam 0.373/0.78), while choosing DFS on only 48% of questions-close to chance-indicating the margin signal does not track which strategy will actually perform better on a given query. We therefore do not deploy this selector and report DFS and Beam only as fixed, separately-evaluated systems throughout; a working query-complexity router remains future work.</w:t>
+      </w:r>
+      <w:r/>
     </w:p>
     <w:p>
       <w:pPr>

</xml_diff>

<commit_message>
feat: Introduce raptor module with clustering and tree structure functionalities
- Added `raptor/__init__.py` to expose key components of the raptor module.
- Implemented `ClusterTreeBuilder` and `ClusterTreeConfig` for hierarchical clustering of nodes.
- Created `RAPTOR_Clustering` class for advanced clustering algorithms using Gaussian Mixture Models.
- Developed `TreeBuilder` and `TreeRetriever` classes for constructing and retrieving information from a hierarchical tree structure.
- Introduced utility functions for text processing, embedding extraction, and distance calculations.
- Established `Node` and `Tree` classes to represent the hierarchical structure and its components.
- Enhanced logging for better traceability during operations.
</commit_message>
<xml_diff>
--- a/TreeRAG_TIST_ACM.docx
+++ b/TreeRAG_TIST_ACM.docx
@@ -39,7 +39,7 @@
         <w:pStyle w:val="Abstract"/>
       </w:pPr>
       <w:r>
-        <w:t>Retrieval-Augmented Generation (RAG) has emerged as a dominant paradigm for grounding large language model (LLM) outputs in external documents. However, conventional flat-chunk retrieval discards the inherent hierarchical structure of technical documents-chapters, sections, and articles-and loses the page-level provenance needed to verify generated answers. Unlike existing hierarchical RAG systems, which optimize retrieval quality in isolation and are judged largely by lexical-overlap metrics, PageTree-RAG jointly optimizes citation faithfulness, token efficiency, and generator-controlled evaluation through an adaptive traversal policy over page-indexed document trees. Concretely, PageTree-RAG (1) converts raw PDFs into page-aware JSON trees using zero-shot LLM prompting, (2) traverses these trees with two complementary algorithms-Depth-First Search (DFS) and Beam Search-to retrieve only structurally relevant nodes, (3) applies contextual compression to reduce token overhead, and (4) validates generated answers with a five-signal hallucination detector. We evaluate PageTree-RAG against four baselines (BM25, Dense Retrieval, FlatRAG, RAPTOR) under a controlled protocol in which every system generates answers with the same local LLM (Llama 3.1 8B), so that only the retrieval stage differs. Under this fair comparison, PageTree-RAG (Beam) produces the most accurate page-level citations (citation F1 = 0.757 vs. 0.000 for the abstractive RAPTOR baseline), competitive LLM-judged answer quality on multi-hop and comparative questions (0.837 and 0.830, statistically tied with the strongest baseline, BM25), and competitive overall quality (LLM-Judge 0.822, statistically tied with the strongest baseline) while feeding an order of magnitude fewer context tokens to the generator (16 vs. 111-222). Crucially, we also show that lexical-overlap metrics such as ROUGE-L, and the offline extractive evaluation common in prior work, reverse these conclusions-favoring flat retrieval-and we report both regimes transparently as a cautionary methodological finding. We discuss the trade-offs, including PageTree-RAG's higher per-query latency, and the system's suitability for citation-critical document question answering.</w:t>
+        <w:t>Retrieval-Augmented Generation (RAG) grounds large language model (LLM) outputs in external documents, but conventional flat-chunk retrieval discards the hierarchical structure of technical documents—chapters, sections, and articles—and loses the page-level provenance needed to verify generated answers. PageTree-RAG jointly optimizes citation faithfulness, token efficiency, and generator-controlled evaluation through an adaptive traversal policy over page-indexed document trees. It (1) converts raw PDFs into page-aware JSON trees using zero-shot LLM prompting, (2) traverses these trees with two complementary algorithms—Depth-First Search (DFS) and Beam Search—to retrieve only structurally relevant nodes, (3) applies contextual compression to reduce token overhead, and (4) validates generated answers with a five-signal grounding confidence module. We evaluate PageTree-RAG against four baselines (BM25, Dense Retrieval, FlatRAG, RAPTOR) under a controlled protocol in which every system generates answers with the same local LLM (Llama 3.1 8B), so that only the retrieval stage differs. Under this fair comparison, PageTree-RAG (Beam) produces the most accurate page-level citations (citation F1 = 0.757, versus 0.562 for the strongest baseline and 0.000 for the abstractive RAPTOR baseline) and reaches overall answer quality statistically tied with the strongest baseline (LLM-Judge 0.822 vs. 0.826 for BM25) while feeding the generator an order of magnitude fewer context tokens (16 vs. 111-222), at the cost of higher per-query latency. Crucially, we also show that lexical-overlap metrics such as ROUGE-L, and the offline extractive evaluation common in prior work, reverse these conclusions—favoring flat retrieval—and we report both regimes transparently as a cautionary methodological finding, recommending that hierarchical-RAG systems be compared with the generator held fixed.</w:t>
       </w:r>
     </w:p>
     <w:p>
@@ -66,7 +66,7 @@
         </w:rPr>
       </w:pPr>
       <w:r>
-        <w:t>Additional Keywords and Phrases: Retrieval-Augmented Generation, Hierarchical Indexing, Tree Traversal, Beam Search, Contextual Compression, Hallucination Detection</w:t>
+        <w:t>Additional Keywords and Phrases: Retrieval-Augmented Generation, Hierarchical Indexing, Tree Traversal, Beam Search, Contextual Compression, Grounding Confidence Estimation</w:t>
       </w:r>
     </w:p>
     <w:p>
@@ -115,7 +115,7 @@
         <w:pStyle w:val="PostHeadPara"/>
       </w:pPr>
       <w:r>
-        <w:t>Large language models (LLMs) excel at reasoning but are prone to hallucination-generating plausible yet factually incorrect text-when operating beyond their training data [9]. Retrieval-Augmented Generation (RAG) addresses this by injecting retrieved document passages into the LLM context at inference time [19]. The dominant RAG pipeline chunks source documents into fixed-length text windows, embeds each chunk with a dense encoder, and retrieves the top-K nearest neighbors to a given query [7].</w:t>
+        <w:t>Large language models (LLMs) excel at reasoning but are prone to hallucination-generating plausible yet factually incorrect text-when operating beyond their training data [10]. Retrieval-Augmented Generation (RAG) addresses this by injecting retrieved document passages into the LLM context at inference time [20]. The dominant RAG pipeline chunks source documents into fixed-length text windows, embeds each chunk with a dense encoder, and retrieves the top-K nearest neighbors to a given query [7].</w:t>
       </w:r>
     </w:p>
     <w:p>
@@ -139,7 +139,7 @@
         <w:pStyle w:val="Para"/>
       </w:pPr>
       <w:r>
-        <w:t>Prior work has explored hierarchical indexing in several forms. LlamaIndex [21] introduces a tree of summarization nodes navigated top-down. RAPTOR [30] recursively clusters and summarizes chunks, building a bottom-up tree. PageIndex [33] demonstrates vectorless, structure-first retrieval. Yet none of these approaches provides (a) zero-shot, domain-adaptive LLM tree construction, (b) a choice between depth-first and beam-search traversal algorithms, (c) integrated compression to manage LLM token budgets, and (d) a built-in hallucination grounding layer-all in a single production-ready system. Concretely, RAPTOR discards page provenance, LlamaIndex provides no citation mechanism, and GraphRAG does not preserve the document's section hierarchy—so none supports verifiable, citation-faithful retrieval over a document's native structure, precisely what regulated domains such as medicine, law, and scientific reporting demand, where every claim must be traceable to a source page.</w:t>
+        <w:t>Prior work has explored hierarchical indexing in several forms. LlamaIndex [22] introduces a tree of summarization nodes navigated top-down. RAPTOR [32] recursively clusters and summarizes chunks, building a bottom-up tree. PageIndex [37] demonstrates vectorless, structure-first retrieval. Yet none of these approaches provides (a) zero-shot, domain-adaptive LLM tree construction, (b) a choice between depth-first and beam-search traversal algorithms, (c) integrated compression to manage LLM token budgets, and (d) a built-in grounding confidence layer-all in a single deployable system. Concretely, RAPTOR discards page provenance, LlamaIndex provides no citation mechanism, and GraphRAG does not preserve the document's section hierarchy—so none supports verifiable, citation-faithful retrieval over a document's native structure, precisely what regulated domains such as medicine, law, and scientific reporting demand, where every claim must be traceable to a source page.</w:t>
       </w:r>
     </w:p>
     <w:p>
@@ -147,35 +147,81 @@
         <w:pStyle w:val="Para"/>
       </w:pPr>
       <w:r>
-        <w:t xml:space="preserve">We introduce PageTree-RAG. Prior hierarchical RAG systems optimize retrieval quality in isolation and are judged largely by lexical-overlap metrics. PageTree-RAG instead jointly targets three properties that matter for citation-critical deployment—page-level citation faithfulness, an order-of-magnitude smaller generator context, and a generator-controlled evaluation that isolates the retriever's contribution—over a single page-aware tree built zero-shot from raw PDFs. We do not claim hierarchical retrieval per se as novel—it builds on RAPTOR [30] and PageIndex [33]—but rather this specific combination of a vectorless page-referenced tree, a choice between depth-first and beam-search traversal, integrated compression, and the evaluation protocol above, which together prioritize verifiability and token efficiency over lexical-overlap scores. Algorithmically, both traversal strategies score candidate nodes from the same two ingredients-an LLM-judged relevance signal and lexical keyword overlap-but combine them differently: DFS applies them as a binary accept/reject gate against a depth- and query-adaptive threshold (favoring precision), while Beam combines them with an explicit structural-depth term into a continuous ranking score (favoring coverage); we evaluate DFS and Beam as separate, fixed-strategy systems throughout Section 5, and we separately implemented and tested—but do not claim as a validated contribution—an automatic per-query selector between them (Discussion, “DFS versus Beam Search”; Limitations). Unlike prior hierarchical systems, which either discard page provenance in abstractive summaries (RAPTOR [30]), depend on a single fixed traversal policy (LlamaIndex [21], PageIndex [33]), or are validated only with lexical-overlap metrics, PageTree-RAG is, to our knowledge, the first system to combine vectorless page-referenced tree search, two traversal </w:t>
-      </w:r>
+        <w:t>We introduce PageTree-RAG. Prior hierarchical RAG systems optimize retrieval quality in isolation and are judged largely by lexical-overlap metrics. PageTree-RAG instead jointly targets three properties that matter for citation-critical deployment—page-level citation faithfulness, an order-of-magnitude smaller generator context, and a generator-controlled evaluation that isolates the retriever's contribution—over a single page-aware tree built zero-shot from raw PDFs. We do not claim hierarchical retrieval per se as novel—it builds on RAPTOR [32] and PageIndex [37]—but rather this specific combination of a vectorless page-referenced tree, a choice between depth-first and beam-search traversal, integrated compression, and the evaluation protocol above, which together prioritize verifiability and token efficiency over lexical-overlap scores. Algorithmically, both traversal strategies score candidate nodes from the same two ingredients-an LLM-judged relevance signal and lexical keyword overlap-but combine them differently: DFS applies them as a binary accept/reject gate against a depth- and query-adaptive threshold (favoring precision), while Beam combines them with an explicit structural-depth term into a continuous ranking score (favoring coverage); we evaluate DFS and Beam as separate, fixed-strategy systems throughout Section 5, and we separately implemented and tested—but do not claim as a validated contribution—an automatic per-query selector between them (Sections 6.2 and 6.5). Unlike prior hierarchical systems, which either discard page provenance in abstractive summaries (RAPTOR [32]), depend on a single fixed traversal policy (LlamaIndex [22], PageIndex [37]), or are validated only with lexical-overlap metrics, PageTree-RAG is, to the best of our knowledge, among the first systems to combine vectorless page-referenced tree search, two traversal policies with provably distinct decision mechanisms (binary gating vs. continuous ranking), integrated contextual compression, and a generator-controlled evaluation; among the systems evaluated in this study, it is the only one that both always produces a citation and cites the correct sections. Our contributions are as follows.</w:t>
+      </w:r>
+      <w:r/>
+    </w:p>
+    <w:p>
+      <w:pPr>
+        <w:pStyle w:val="a"/>
+      </w:pPr>
+      <w:r>
+        <w:t>(1) Hierarchical page-aware retrieval with two traversal strategies built from shared relevance signals. We convert arbitrary PDFs into page-referenced JSON trees via zero-shot, domain-adaptive LLM prompting, and retrieve using LLM-judged relevance and keyword-overlap signals that DFS combines as a binary, threshold-gated filter and Beam combines as a continuous, depth-aware ranking score; we evaluate both traversal strategies as fixed choices (Section 5) and separately test an automatic per-query selector between them, whose limits we report honestly (Sections 6.2 and 6.5).</w:t>
+      </w:r>
+    </w:p>
+    <w:p>
+      <w:pPr>
+        <w:pStyle w:val="a"/>
+      </w:pPr>
+      <w:r>
+        <w:t>(2) Citation-faithful, token-efficient generation. Contextual compression shrinks the retrieved context by an order of magnitude; every answer carries page-level citations traceable to a source span; and a lightweight five-signal grounding confidence module flags unsupported sentences at negligible cost.</w:t>
+      </w:r>
+    </w:p>
+    <w:p>
+      <w:pPr>
+        <w:pStyle w:val="a"/>
+      </w:pPr>
+      <w:r>
+        <w:t>(3) A fair evaluation framework and a cautionary finding. We evaluate all systems under a generator-controlled protocol in which only the retriever varies, measuring citation accuracy and context efficiency alongside reference- and judge-based answer quality, and we show that offline extractive evaluation and lexical-overlap metrics reverse the system ranking—reporting both regimes so the discrepancy is explicit.</w:t>
+      </w:r>
+    </w:p>
+    <w:p>
+      <w:pPr>
+        <w:pStyle w:val="Para"/>
+      </w:pPr>
+      <w:r>
+        <w:t>Therefore, PageTree-RAG turns a document's native structure into verifiable, token-efficient answers, and offers a methodology for evaluating such systems without the artifacts of lexical-overlap metrics. Framed this way, PageTree-RAG's contribution is not a new traversal algorithm considered in isolation, but a retrieval objective that jointly optimizes citation faithfulness, token efficiency, and generator-controlled answer quality within one system—a combination that, to our knowledge, no prior hierarchical RAG system evaluates or reports together. The remainder of this paper is organized as follows. Section 2 reviews related work. Section 3 details the PageTree-RAG methodology. Section 4 describes the system architecture. Section 5 presents experiments and results. Section 6 discusses findings and limitations. Section 7 concludes.</w:t>
+      </w:r>
+    </w:p>
+    <w:p>
+      <w:pPr>
+        <w:pStyle w:val="Head1"/>
+      </w:pPr>
+      <w:r>
+        <w:t>RELATED WORK</w:t>
+      </w:r>
+    </w:p>
+    <w:p>
+      <w:pPr>
+        <w:pStyle w:val="Head2"/>
+      </w:pPr>
+      <w:r>
+        <w:t>Retrieval-Augmented Generation</w:t>
+      </w:r>
+    </w:p>
+    <w:p>
+      <w:pPr>
+        <w:pStyle w:val="PostHeadPara"/>
+      </w:pPr>
+      <w:r>
+        <w:t>RAG was formally introduced by Lewis et al. [20] as a sequence-to-sequence architecture that conditions generation on retrieved Wikipedia passages. Subsequent work scaled dense retrieval with FAISS [13] and improved passage encoding with DPR [14]. Hybrid retrievers combining sparse BM25 [30] with dense vectors showed consistent gains over either approach alone [24]. A parallel line of work improves the retriever itself: late-interaction models such as ColBERT [15] and its compressed successor ColBERTv2 [31] retain fine-grained token-level matching at scale, while learned sparse models such as SPLADE [5] and the efficiency-oriented SPLATE [6] reconcile neural ranking with inverted-index infrastructure. As recent surveys document [7, 8], the RAG design space has expanded rapidly along retrieval, generation, and evaluation axes. Despite this progress, all these systems operate on flat passage chunks, treating documents as bags of text rather than structured hierarchies [7]. PageTree-RAG is orthogonal to these retriever advances: its node-relevance score can in principle wrap any of them, but our focus is the document structure that flat retrievers discard.</w:t>
+      </w:r>
+    </w:p>
+    <w:p>
+      <w:pPr>
+        <w:pStyle w:val="Head2"/>
+      </w:pPr>
       <w:r>
         <w:lastRenderedPageBreak/>
-        <w:t>policies with provably distinct decision mechanisms (binary gating vs. continuous ranking), integrated contextual compression, and a generator-controlled evaluation-and it is the only system in our study that both always produces a citation and cites the correct sections. Our contributions are as follows.</w:t>
-      </w:r>
-    </w:p>
-    <w:p>
-      <w:pPr>
-        <w:pStyle w:val="a"/>
-      </w:pPr>
-      <w:r>
-        <w:t>(1) Hierarchical page-aware retrieval with two traversal strategies built from shared relevance signals. We convert arbitrary PDFs into page-referenced JSON trees via zero-shot, domain-adaptive LLM prompting, and retrieve using LLM-judged relevance and keyword-overlap signals that DFS combines as a binary, threshold-gated filter and Beam combines as a continuous, depth-aware ranking score; we evaluate both traversal strategies as fixed choices (Section 5) and separately test an automatic per-query selector between them, whose limits we report honestly (Discussion and Limitations).</w:t>
-      </w:r>
-    </w:p>
-    <w:p>
-      <w:pPr>
-        <w:pStyle w:val="a"/>
-      </w:pPr>
-      <w:r>
-        <w:t>(2) Citation-faithful, token-efficient generation. Contextual compression shrinks the retrieved context by an order of magnitude; every answer carries page-level citations traceable to a source span; and a lightweight five-signal detector flags unsupported sentences at negligible cost.</w:t>
-      </w:r>
-    </w:p>
-    <w:p>
-      <w:pPr>
-        <w:pStyle w:val="a"/>
-      </w:pPr>
-      <w:r>
-        <w:t>(3) A fair evaluation framework and a cautionary finding. We evaluate all systems under a generator-controlled protocol in which only the retriever varies, measuring citation accuracy and context efficiency alongside reference- and judge-based answer quality, and we show that offline extractive evaluation and lexical-overlap metrics reverse the system ranking—reporting both regimes so the discrepancy is explicit.</w:t>
+        <w:t>Hierarchical and Structure-Aware Retrieval</w:t>
+      </w:r>
+    </w:p>
+    <w:p>
+      <w:pPr>
+        <w:pStyle w:val="PostHeadPara"/>
+      </w:pPr>
+      <w:r>
+        <w:t>LlamaIndex [22] constructs a tree of progressively coarser summaries and navigates it top-down, retrieving leaf nodes for generation; its retrieval is embedding-based, requiring a vector store. RAPTOR [32] takes the opposite direction: it recursively clusters leaf chunks and summarizes each cluster, building a bottom-up tree, and at query time retrieves at the most informative tree level. Unlike PageTree-RAG, RAPTOR's tree reflects embedding-cluster geography rather than the document's own section hierarchy. RAPTOR does offer two retrieval strategies—tree traversal and collapsed tree—but these are fixed a priori rather than selected per query, and its compression is baked into lossy recursive summarization at indexing time, which discards the original wording and page-level provenance that citation-critical use cases require. This distinction matters in domains where the authored section structure is itself the semantics of the document, such as regulations and clinical protocols.</w:t>
       </w:r>
     </w:p>
     <w:p>
@@ -183,15 +229,7 @@
         <w:pStyle w:val="Para"/>
       </w:pPr>
       <w:r>
-        <w:t>Therefore, PageTree-RAG turns a document's native structure into verifiable, token-efficient answers, and offers a methodology for evaluating such systems without the artifacts of lexical-overlap metrics. The remainder of this paper is organized as follows. Section 2 reviews related work. Section 3 details the PageTree-RAG methodology. Section 4 describes the system architecture. Section 5 presents experiments and results. Section 6 discusses findings and limitations. Section 7 concludes.</w:t>
-      </w:r>
-    </w:p>
-    <w:p>
-      <w:pPr>
-        <w:pStyle w:val="Head1"/>
-      </w:pPr>
-      <w:r>
-        <w:t>RELATED WORK</w:t>
+        <w:t>HiRAG [9] explores graph-based hierarchies, constructing and reasoning over a multi-level entity knowledge graph extracted from the input documents—an entity-extraction and graph-construction pipeline more elaborate than PageTree-RAG's page-referenced tree, and one that does not preserve the document's own section structure. Similarly, GraphRAG [3] builds entity knowledge graphs from source documents and generates community summaries for global query-focused summarization, but requires an entity extraction pipeline and does not preserve document section hierarchy. PageTree-RAG requires only a raw PDF and an LLM API key. Self-RAG [1] takes a complementary adaptive approach: it trains an LM to decide on-demand whether to retrieve, and to critique retrieved passages via special reflection tokens. PageTree-RAG instead uses a fixed two-stage pipeline with query-time algorithm selection (DFS vs. Beam Search) without requiring fine-tuning, which lowers the barrier to deployment on new document collections. A recently proposed, identically named system, TreeRAG [35], likewise organizes long documents as a tree, but differs from ours in construction, traversal, and objective: it builds the tree by embedding text chunks (“Tree-Chunking”) and retrieves with a fixed bidirectional (root-to-leaf and leaf-to-root) traversal for query-focused summarization, whereas PageTree-RAG parses the document’s native section hierarchy into a page-referenced tree via zero-shot LLM prompting, selects between DFS and Beam traversal per query, and targets page-level citation faithfulness under a fair, retriever-isolating evaluation protocol. Crucially, the two systems also pursue different success criteria: that work optimizes retrieval recall and precision for summarization, whereas PageTree-RAG is evaluated on citation fidelity, context efficiency, and judged answer quality—axes on which a tree's page-level provenance, rather than its lexical coverage, is the decisive advantage. More broadly, recent work extends RAG toward longer contexts and greater autonomy: MemoRAG [28] adds a global memory module via KV compression to handle book-length inputs, and a growing line of agentic RAG systems lets the LLM itself plan and issue retrieval calls [34]. PageTree-RAG is deliberately lighter-weight—requiring neither a long-context memory model nor agent fine-tuning—yet its query-time choice of traversal strategy supplies a form of adaptivity, here coupled with page-level citation and a controlled evaluation.</w:t>
       </w:r>
     </w:p>
     <w:p>
@@ -199,7 +237,7 @@
         <w:pStyle w:val="Head2"/>
       </w:pPr>
       <w:r>
-        <w:t>Retrieval-Augmented Generation</w:t>
+        <w:t>Multi-Hop Reasoning</w:t>
       </w:r>
     </w:p>
     <w:p>
@@ -207,59 +245,15 @@
         <w:pStyle w:val="PostHeadPara"/>
       </w:pPr>
       <w:r>
-        <w:t>RAG was formally introduced by Lewis et al. [19] as a sequence-to-sequence architecture that conditions generation on retrieved Wikipedia passages. Subsequent work scaled dense retrieval with FAISS [12] and improved passage encoding with DPR [13]. Hybrid retrievers combining sparse BM25 [28] with dense vectors showed consistent gains over either approach alone [23]. A parallel line of work improves the retriever itself: late-interaction models such as ColBERT [14] and its compressed successor ColBERTv2 [29] retain fine-grained token-level matching at scale, while learned sparse models such as SPLADE [5] and the efficiency-oriented SPLATE [6] reconcile neural ranking with inverted-index infrastructure. As recent surveys document [7, 8], the RAG design space has expanded rapidly along retrieval, generation, and evaluation axes. Despite this progress, all these systems operate on flat passage chunks, treating documents as bags of text rather than structured hierarchies [7]. PageTree-RAG is orthogonal to these retriever advances: its node-relevance score can in principle wrap any of them, but our focus is the document structure that flat retrievers discard.</w:t>
-      </w:r>
+        <w:t>Multi-hop reasoning-answering questions that require evidence synthesis across multiple passages or documents-remains a challenge for flat RAG. HotpotQA [39] benchmarks this capability. IRCoT [36] interleaves retrieval and chain-of-thought [38] reasoning steps. More recently, Zhang et al. [41] propose a hierarchical RAG model with a “rethink” mechanism that iteratively revisits retrieved evidence for multi-hop QA; like PageTree-RAG it exploits hierarchy, but it adds an iterative re-retrieval loop rather than selecting a traversal algorithm at query time. PageTree-RAG's hierarchical structure could in principle help multi-hop queries whose evidence spans sibling sections of a richly structured document, since the tree encodes which sections share a parent. This mechanism presumes genuine document hierarchy, however; our HotpotQA conversion (Section 5.1) builds a flat, single-level tree per question, so the sibling-sharing pathway does not apply there, and we do not find a decisive multi-hop advantage in that setting (Section 5.9).</w:t>
+      </w:r>
+      <w:r/>
     </w:p>
     <w:p>
       <w:pPr>
         <w:pStyle w:val="Head2"/>
       </w:pPr>
       <w:r>
-        <w:t>Hierarchical and Structure-Aware Retrieval</w:t>
-      </w:r>
-    </w:p>
-    <w:p>
-      <w:pPr>
-        <w:pStyle w:val="PostHeadPara"/>
-      </w:pPr>
-      <w:r>
-        <w:t xml:space="preserve">LlamaIndex [21] constructs a tree of progressively coarser summaries and navigates it top-down, retrieving leaf nodes for generation; its retrieval is embedding-based, requiring a vector store. RAPTOR [30] takes the opposite direction: it recursively clusters leaf chunks and summarizes each cluster, building a bottom-up tree, and at query time retrieves at the </w:t>
-      </w:r>
-      <w:r>
-        <w:lastRenderedPageBreak/>
-        <w:t>most informative tree level. Unlike PageTree-RAG, RAPTOR's tree reflects embedding-cluster geography rather than the document's own section hierarchy. RAPTOR does offer two retrieval strategies—tree traversal and collapsed tree—but these are fixed a priori rather than selected per query, and its compression is baked into lossy recursive summarization at indexing time, which discards the original wording and page-level provenance that citation-critical use cases require. This distinction matters in domains where the authored section structure is itself the semantics of the document, such as regulations and clinical protocols.</w:t>
-      </w:r>
-    </w:p>
-    <w:p>
-      <w:pPr>
-        <w:pStyle w:val="Para"/>
-      </w:pPr>
-      <w:r>
-        <w:t>HiRAG [10] explores graph-based hierarchies, constructing and reasoning over a multi-level entity knowledge graph extracted from the input documents—an entity-extraction and graph-construction pipeline more elaborate than PageTree-RAG's page-referenced tree, and one that does not preserve the document's own section structure. Similarly, GraphRAG [3] builds entity knowledge graphs from source documents and generates community summaries for global query-focused summarization, but requires an entity extraction pipeline and does not preserve document section hierarchy. PageTree-RAG requires only a raw PDF and an LLM API key. Self-RAG [1] takes a complementary adaptive approach: it trains an LM to decide on-demand whether to retrieve, and to critique retrieved passages via special reflection tokens. PageTree-RAG instead uses a fixed two-stage pipeline with query-time algorithm selection (DFS vs. Beam Search) without requiring fine-tuning, which lowers the barrier to deployment on new document collections. A recently proposed, identically named system, TreeRAG [39], likewise organizes long documents as a tree, but differs from ours in construction, traversal, and objective: it builds the tree by embedding text chunks (“Tree-Chunking”) and retrieves with a fixed bidirectional (root-to-leaf and leaf-to-root) traversal for query-focused summarization, whereas PageTree-RAG parses the document’s native section hierarchy into a page-referenced tree via zero-shot LLM prompting, selects between DFS and Beam traversal per query, and targets page-level citation faithfulness under a fair, retriever-isolating evaluation protocol. Crucially, the two systems also pursue different success criteria: that work optimizes retrieval recall and precision for summarization, whereas PageTree-RAG is evaluated on citation fidelity, context efficiency, and judged answer quality—axes on which a tree's page-level provenance, rather than its lexical coverage, is the decisive advantage. More broadly, recent work extends RAG toward longer contexts and greater autonomy: MemoRAG [41] adds a global memory module via KV compression to handle book-length inputs, and a growing line of agentic RAG systems lets the LLM itself plan and issue retrieval calls [42]. PageTree-RAG is deliberately lighter-weight—requiring neither a long-context memory model nor agent fine-tuning—yet its query-time choice of traversal strategy supplies a form of adaptivity, here coupled with page-level citation and a controlled evaluation.</w:t>
-      </w:r>
-    </w:p>
-    <w:p>
-      <w:pPr>
-        <w:pStyle w:val="Head2"/>
-      </w:pPr>
-      <w:r>
-        <w:t>Multi-Hop and Cross-Document Reasoning</w:t>
-      </w:r>
-    </w:p>
-    <w:p>
-      <w:pPr>
-        <w:pStyle w:val="PostHeadPara"/>
-      </w:pPr>
-      <w:r>
-        <w:t>Multi-hop reasoning-answering questions that require evidence synthesis across multiple passages or documents-remains a challenge for flat RAG. HotpotQA [35] benchmarks this capability. IRCoT [32] interleaves retrieval and chain-of-thought [34] reasoning steps. More recently, Zhang et al. [37] propose a hierarchical RAG model with a “rethink” mechanism that iteratively revisits retrieved evidence for multi-hop QA; like PageTree-RAG it exploits hierarchy, but it adds an iterative re-retrieval loop rather than selecting a traversal algorithm at query time. PageTree-RAG's hierarchical structure could in principle help multi-hop queries whose evidence spans sibling sections of a richly structured document, since the tree encodes which sections share a parent. This mechanism presumes genuine document hierarchy, however; our HotpotQA conversion (Section 5.1) builds a flat, single-level tree per question, so the sibling-sharing pathway does not apply there, and we do not find a decisive multi-hop advantage in that setting (Section 5.6).</w:t>
-      </w:r>
-    </w:p>
-    <w:p>
-      <w:pPr>
-        <w:pStyle w:val="Head2"/>
-      </w:pPr>
-      <w:r>
-        <w:lastRenderedPageBreak/>
         <w:t>Hallucination in RAG Systems</w:t>
       </w:r>
     </w:p>
@@ -271,15 +265,7 @@
         </w:rPr>
       </w:pPr>
       <w:r>
-        <w:t xml:space="preserve">RAG substantially reduces hallucination by grounding generation in retrieved text, but does not eliminate it [31]. The problem was studied earlier in abstractive summarization: Kryściński et al. [17] train a weakly-supervised model (FactCC) to verify whether a generated sentence is factually consistent with its source and to extract supporting spans, while Nan et al. [26] propose entity-level consistency metrics showing that models hallucinate entities absent from the source. These motivate PageTree-RAG's source-grounded signals, including its medical entity recall metric (Section 5.3). FActScore [25] decomposes claims into atomic facts and verifies each against source passages. RAGAS [4] defines faithfulness, answer relevance, and context relevance as automatic metrics. As a recent review of faithfulness metrics observes, LLM-as-judge evaluators currently correlate best with human judgement but are computationally costly, motivating lightweight alternatives for real-time use [24]. PageTree-RAG's hallucination detector operates at sentence level using five lightweight overlap signals, providing a fast, LLM-free confidence estimate compatible with real-time serving. Table 1 summarizes how these capabilities compare across representative hierarchical and structure-aware RAG systems, including </w:t>
-      </w:r>
-      <w:proofErr w:type="spellStart"/>
-      <w:r>
-        <w:t>PageTree</w:t>
-      </w:r>
-      <w:proofErr w:type="spellEnd"/>
-      <w:r>
-        <w:t>-RAG.</w:t>
+        <w:t>RAG substantially reduces hallucination by grounding generation in retrieved text, but does not eliminate it [33]. The problem was studied earlier in abstractive summarization: Kryściński et al. [18] train a weakly-supervised model (FactCC) to verify whether a generated sentence is factually consistent with its source and to extract supporting spans, while Nan et al. [27] propose entity-level consistency metrics showing that models hallucinate entities absent from the source. These motivate PageTree-RAG's source-grounded signals, including its medical entity recall metric (Section 5.3). FActScore [26] decomposes claims into atomic facts and verifies each against source passages. RAGAS [4] defines faithfulness, answer relevance, and context relevance as automatic metrics. As a recent review of faithfulness metrics observes, LLM-as-judge evaluators currently correlate best with human judgement but are computationally costly, motivating lightweight alternatives for real-time use [25]. PageTree-RAG's grounding confidence module operates at sentence level using five lightweight overlap signals, providing a fast, LLM-free confidence estimate compatible with real-time serving. Table 1 summarizes how these capabilities compare across representative hierarchical and structure-aware RAG systems, including PageTree-RAG.</w:t>
       </w:r>
     </w:p>
     <w:p>
@@ -287,15 +273,7 @@
         <w:pStyle w:val="TableCaption"/>
       </w:pPr>
       <w:r>
-        <w:t xml:space="preserve">Table 1: Capability comparison of representative hierarchical and structure-aware RAG systems. Tree = builds a hierarchical document index; Trav. = query-time choice among traversal strategies; Compr. = post-retrieval context compression; Halluc. = built-in answer-faithfulness layer; Cite = page-level citation; </w:t>
-      </w:r>
-      <w:proofErr w:type="gramStart"/>
-      <w:r>
-        <w:t>Multi-doc</w:t>
-      </w:r>
-      <w:proofErr w:type="gramEnd"/>
-      <w:r>
-        <w:t xml:space="preserve"> = retrieval across multiple documents; Online = incremental indexing without a</w:t>
+        <w:t>Table 1: Capability comparison of representative hierarchical and structure-aware RAG systems. Tree = builds a hierarchical document index; Trav. = query-time choice among traversal strategies; Compr. = post-retrieval context compression; Halluc. = built-in answer-faithfulness layer; Cite = page-level citation; Multi-doc = retrieval across multiple documents; Online = incremental indexing without a</w:t>
       </w:r>
       <w:r>
         <w:rPr>
@@ -305,7 +283,7 @@
         <w:t xml:space="preserve"> </w:t>
       </w:r>
       <w:r>
-        <w:t>full rebuild; Explain. = retrieval decisions are traceable and inspectable. ✓ = present, ~ = partial, ✗ = absent.</w:t>
+        <w:t>full rebuild; Explain. = retrieval decisions are traceable and inspectable. ✓ = present, ~ = partial, ✗ = absent. PageTree-RAG is marked ~ on Trav. because it offers two traversal policies that the user selects at query time but does not deploy a validated automatic per-query selector (Section 6.5), ~ on Online because incremental indexing is implemented but not evaluated in this paper, and ~ on Multi-doc because query routing across several indexed documents is implemented (Section 4.2) but no multi-document experiment is reported.</w:t>
       </w:r>
     </w:p>
     <w:tbl>
@@ -488,7 +466,7 @@
               <w:pStyle w:val="TableCell"/>
             </w:pPr>
             <w:r>
-              <w:t>LlamaIndex [21]</w:t>
+              <w:t>LlamaIndex [22]</w:t>
             </w:r>
           </w:p>
         </w:tc>
@@ -607,7 +585,7 @@
               <w:pStyle w:val="TableCell"/>
             </w:pPr>
             <w:r>
-              <w:t>RAPTOR [30]</w:t>
+              <w:t>RAPTOR [32]</w:t>
             </w:r>
           </w:p>
         </w:tc>
@@ -726,7 +704,7 @@
               <w:pStyle w:val="TableCell"/>
             </w:pPr>
             <w:r>
-              <w:t>PageIndex [33]</w:t>
+              <w:t>PageIndex [37]</w:t>
             </w:r>
           </w:p>
         </w:tc>
@@ -845,7 +823,7 @@
               <w:pStyle w:val="TableCell"/>
             </w:pPr>
             <w:r>
-              <w:t>HiRAG [10]</w:t>
+              <w:t>HiRAG [9]</w:t>
             </w:r>
           </w:p>
         </w:tc>
@@ -1083,7 +1061,7 @@
               <w:pStyle w:val="TableCell"/>
             </w:pPr>
             <w:r>
-              <w:t>TreeRAG (Tao et al.) [39]</w:t>
+              <w:t>TreeRAG (Tao et al.) [35]</w:t>
             </w:r>
           </w:p>
         </w:tc>
@@ -1237,6 +1215,22 @@
               <w:rPr>
                 <w:b/>
               </w:rPr>
+              <w:t>~</w:t>
+            </w:r>
+          </w:p>
+        </w:tc>
+        <w:tc>
+          <w:tcPr>
+            <w:tcW w:w="973" w:type="dxa"/>
+          </w:tcPr>
+          <w:p>
+            <w:pPr>
+              <w:pStyle w:val="TableCell"/>
+            </w:pPr>
+            <w:r>
+              <w:rPr>
+                <w:b/>
+              </w:rPr>
               <w:t>✓</w:t>
             </w:r>
           </w:p>
@@ -1285,7 +1279,7 @@
               <w:rPr>
                 <w:b/>
               </w:rPr>
-              <w:t>✓</w:t>
+              <w:t>~</w:t>
             </w:r>
           </w:p>
         </w:tc>
@@ -1301,23 +1295,7 @@
               <w:rPr>
                 <w:b/>
               </w:rPr>
-              <w:t>✓</w:t>
-            </w:r>
-          </w:p>
-        </w:tc>
-        <w:tc>
-          <w:tcPr>
-            <w:tcW w:w="973" w:type="dxa"/>
-          </w:tcPr>
-          <w:p>
-            <w:pPr>
-              <w:pStyle w:val="TableCell"/>
-            </w:pPr>
-            <w:r>
-              <w:rPr>
-                <w:b/>
-              </w:rPr>
-              <w:t>✓</w:t>
+              <w:t>~</w:t>
             </w:r>
           </w:p>
         </w:tc>
@@ -1360,7 +1338,11 @@
         <w:pStyle w:val="PostHeadPara"/>
       </w:pPr>
       <w:r>
-        <w:t>Given a PDF document D with pages p_1, ..., p_n, we define a Page-Indexed Tree T as a rooted ordered tree where each node v carries: id, a unique identifier (e.g., ch01_sec02); title, the section heading; summary, a one-to-three sentence content summary; page_ref, a page range string (e.g., 5-12); and children, an ordered list of child nodes. The root represents the entire document. Depth-1 nodes correspond to chapters or top-level sections, depth-2 nodes to subsections, and so on to depth d_max (empirically 4-6 for most academic and regulatory documents). Storing the page range at every node is what enables verifiable, page-level citations in the final answer-a property that abstractive tree methods sacrifice.</w:t>
+        <w:t xml:space="preserve">Given a PDF document D with pages p_1, ..., p_n, we define a Page-Indexed Tree T as a rooted ordered tree where each node v carries: id, a unique identifier (e.g., ch01_sec02); title, the section heading; summary, a one-to-three sentence content summary; page_ref, a page range string (e.g., 5-12); and children, an ordered list of child nodes. The root represents the entire document. Depth-1 nodes correspond to chapters or top-level sections, depth-2 nodes to subsections, and so on </w:t>
+      </w:r>
+      <w:r>
+        <w:lastRenderedPageBreak/>
+        <w:t>to depth d_max (empirically 4-6 for most academic and regulatory documents). Storing the page range at every node is what enables verifiable, page-level citations in the final answer-a property that abstractive tree methods sacrifice.</w:t>
       </w:r>
     </w:p>
     <w:p>
@@ -1368,7 +1350,6 @@
         <w:pStyle w:val="Head2"/>
       </w:pPr>
       <w:r>
-        <w:lastRenderedPageBreak/>
         <w:t>LLM-Driven Tree Indexing</w:t>
       </w:r>
     </w:p>
@@ -1385,7 +1366,7 @@
         <w:pStyle w:val="Para"/>
       </w:pPr>
       <w:r>
-        <w:t>Prompting. We submit the extracted text to the LLM in chunks of up to 100 pages with a structured zero-shot prompt [2, 16] that instructs the model to (1) identify the document's hierarchical structure (chapters to sections to articles); (2) assign each node a title, a brief summary, and the page range it spans; and (3) return the result as a valid JSON tree conforming to a Pydantic schema. Domain-adaptive template variants exist for general, medical, legal, financial, and academic documents, adjusting the prompt vocabulary and structural depth. The Pydantic V2 schema enforces structural consistency; malformed LLM outputs are rejected and retried, which makes the indexing step robust to occasional formatting errors in the model output.</w:t>
+        <w:t>Prompting. We submit the extracted text to the LLM in chunks of up to 100 pages with a structured zero-shot prompt [2, 17] that instructs the model to (1) identify the document's hierarchical structure (chapters to sections to articles); (2) assign each node a title, a brief summary, and the page range it spans; and (3) return the result as a valid JSON tree conforming to a Pydantic schema. Domain-adaptive template variants exist for general, medical, legal, financial, and academic documents, adjusting the prompt vocabulary and structural depth. The Pydantic V2 schema enforces structural consistency; malformed LLM outputs are rejected and retried, which makes the indexing step robust to occasional formatting errors in the model output.</w:t>
       </w:r>
     </w:p>
     <w:p>
@@ -1432,7 +1413,7 @@
         <w:pStyle w:val="PostHeadPara"/>
       </w:pPr>
       <w:r>
-        <w:t>DFS and Beam do not share a single scoring formula. Both compute the same two elementary relevance signals for a candidate node v against query q-an LLM-judged relevance score llm(v, q) and a lexical keyword-overlap score kw(v, q)-but each traversal strategy turns them into a different kind of decision: DFS uses them as a binary accept/reject gate against an adaptive threshold (Equation 1), and Beam uses them, together with an explicit structural-depth term, as a continuous ranking score (Equation 2). DFS and Beam are evaluated as separate, fixed-strategy systems in Section 5; Limitations (Section 6) reports on an automatic per-query selector between them.</w:t>
+        <w:t>DFS and Beam do not share a single scoring formula. Both compute the same two elementary relevance signals for a candidate node v against query q-an LLM-judged relevance score llm(v, q) and a lexical keyword-overlap score kw(v, q)-but each traversal strategy turns them into a different kind of decision: DFS uses them as a binary accept/reject gate against an adaptive threshold (Equation 1), and Beam uses them, together with an explicit structural-depth term, as a continuous ranking score (Equation 2). DFS and Beam are evaluated as separate, fixed-strategy systems in Section 5; Limitations (Section 6.5) reports on an automatic per-query selector between them.</w:t>
       </w:r>
     </w:p>
     <w:p>
@@ -1456,6 +1437,7 @@
         <w:pStyle w:val="DisplayFormula"/>
       </w:pPr>
       <w:r>
+        <w:lastRenderedPageBreak/>
         <w:t>score(v) = 0.6 · llm(v, q) + 0.2 · kw(v, q) + 0.2 · structural(depth)     (2)</w:t>
       </w:r>
     </w:p>
@@ -1464,8 +1446,7 @@
         <w:pStyle w:val="Para"/>
       </w:pPr>
       <w:r>
-        <w:lastRenderedPageBreak/>
-        <w:t>Beam's continuous score (Equation 2) reuses the same llm(v, q) and kw(v, q) signals as DFS but combines them with a different fixed weighting, (0.6, 0.2, 0.2), and an explicit structural(depth) term-a decay factor that slightly penalizes very deep nodes-so that depth enters Beam's decision directly as a scoring component rather than only through an acceptance threshold as in DFS. Both weightings are fixed heuristic defaults rather than per-dataset tuned values. The method is not sensitive to Beam's exact weighting: Table 6 (Section 5.4) reports a one-factor-at-a-time sensitivity sweep showing judged quality varies by less than 0.03 in LLM-Judge across four tested weight settings. A learned alternative to these fixed weights (Section 6, Limitations) yielded no improvement under our limited supervision, so we retain the interpretable fixed weights as the default operating point for both algorithms and leave learned or Bayesian-optimized weighting to future work.</w:t>
+        <w:t>Beam's continuous score (Equation 2) reuses the same llm(v, q) and kw(v, q) signals as DFS but combines them with a different fixed weighting, (0.6, 0.2, 0.2), and an explicit structural(depth) term-a decay factor that slightly penalizes very deep nodes-so that depth enters Beam's decision directly as a scoring component rather than only through an acceptance threshold as in DFS. Both weightings are fixed heuristic defaults rather than per-dataset tuned values. Equation 2 defines a node's own contribution; in the implementation (Algorithm 2) it is propagated multiplicatively along the search path, so a child's beam score is the product of its parent's score and its own Equation 2 value. The method is not sensitive to Beam's exact weighting: Table 6 (Section 5.4) reports a one-factor-at-a-time sensitivity sweep showing judged quality varies by less than 0.03 in LLM-Judge across four tested weight settings. A learned alternative to these fixed weights (Section 6.5) yielded no improvement under our limited supervision, so we retain the interpretable fixed weights as the default operating point for both algorithms and leave learned weighting—via Learning-to-Rank objectives (e.g., a LambdaMART-style pairwise loss over the three signals) or Bayesian optimization of the weight vector—to future work.</w:t>
       </w:r>
     </w:p>
     <w:p>
@@ -1497,7 +1478,7 @@
         <w:pStyle w:val="Para"/>
       </w:pPr>
       <w:r>
-        <w:t>We also implemented and empirically tested an automatic selector between DFS and Beam: at the root, it compares the top-1 candidate node's score to the runner-up's and chooses DFS when the margin exceeds a cutoff tau (low ambiguity, favoring precision) and Beam otherwise (high ambiguity, favoring coverage). We report this mechanism for completeness, not as a validated contribution: Limitations (Section 6) shows that, both offline and in an online n=50 evaluation, this automatic selector did not outperform simply fixing one strategy in advance. The two per-algorithm relevance functions-DFS's threshold-gated binary filter (Equation 1) and Beam's continuous weighted score (Equation 2), both built from the same LLM-judged and keyword-overlap signals-are the components of the traversal design we validate empirically (Table 6); per-query strategy switching remains an open problem rather than a solved one.</w:t>
+        <w:t>We also implemented and empirically tested an automatic selector between DFS and Beam: at the root, it compares the top-1 candidate node's score to the runner-up's and chooses DFS when the margin exceeds a cutoff tau (low ambiguity, favoring precision) and Beam otherwise (high ambiguity, favoring coverage). We report this mechanism for completeness, not as a validated contribution: Limitations (Section 6.5) shows that, both offline and in an online n=50 evaluation, this automatic selector did not outperform simply fixing one strategy in advance. The two per-algorithm relevance functions-DFS's threshold-gated binary filter (Equation 1) and Beam's continuous weighted score (Equation 2), both built from the same LLM-judged and keyword-overlap signals-are the components of the traversal design we validate empirically (Table 6); per-query strategy switching remains an open problem rather than a solved one.</w:t>
       </w:r>
     </w:p>
     <w:p>
@@ -1576,6 +1557,7 @@
         <w:pStyle w:val="Algorithm"/>
       </w:pPr>
       <w:r>
+        <w:lastRenderedPageBreak/>
         <w:t xml:space="preserve">        if depth &lt; max_depth:</w:t>
       </w:r>
     </w:p>
@@ -1592,7 +1574,6 @@
         <w:pStyle w:val="Algorithm"/>
       </w:pPr>
       <w:r>
-        <w:lastRenderedPageBreak/>
         <w:t xml:space="preserve">            for child in children:</w:t>
       </w:r>
     </w:p>
@@ -1625,7 +1606,7 @@
         <w:pStyle w:val="Para"/>
       </w:pPr>
       <w:r>
-        <w:t>DFS explores the full depth of promising branches before backtracking. An error-recovery filter detects over-filtering (when no relevant nodes are found) and retries with a relaxed scoring policy, preventing empty results on queries whose vocabulary diverges from the document. The number of nodes evaluated is O(b · d), where b is max_branches and d is max_depth; typical values b = 3, d = 5 yield at most 243 node evaluations.</w:t>
+        <w:t>Two selection mechanisms act in sequence here, and it is worth separating them. Equation 1's threshold gate decides whether a visited node enters the result set, whereas the top-K step (K = max_branches) decides which of that node's children are pushed onto the stack for further exploration. The top-K ranking reuses the same per-node LLM judgment and therefore issues one LLM call per candidate child, which is the dominant cost of DFS traversal. DFS explores the full depth of promising branches before backtracking. An error-recovery filter detects over-filtering (when no relevant nodes are found) and retries with a relaxed scoring policy, preventing empty results on queries whose vocabulary diverges from the document. The number of nodes evaluated is O(b^d) in the worst case, where b is max_branches and d is max_depth; typical values b = 3, d = 5 yield at most 243 node evaluations.</w:t>
       </w:r>
     </w:p>
     <w:p>
@@ -1759,7 +1740,7 @@
         <w:pStyle w:val="PostHeadPara"/>
       </w:pPr>
       <w:r>
-        <w:t>DFS is recommended for precision-critical queries (regulatory compliance, medical protocols) where missing a single relevant section is costly. Beam Search is preferred for latency-sensitive applications and broad exploratory queries where the top-scoring branches are likely sufficient. Section 5 shows that this qualitative guidance is borne out empirically: DFS wins on single-document factual and medical queries, while Beam Search wins on multi-hop synthesis.</w:t>
+        <w:t>DFS is recommended for precision-critical queries (regulatory compliance, medical protocols) where missing a single relevant section is costly. Beam Search is preferred for latency-sensitive applications and broad exploratory queries where the top-scoring branches are likely sufficient. Section 5 supports this guidance only in part, and we state the limits plainly. Under the offline extractive proxy DFS leads on single-document factual and medical queries (Tables 3 and 4), but that protocol is the one we show to be biased (Section 5.7), and its medical margin over BM25 is not statistically significant (Table 13). Under the fair generative protocol Beam is the stronger of the two variants overall (Table 8) and on multi-hop synthesis (Table 10). We therefore present the guidance above as a design rationale for offering both policies, not as an empirically established selection rule.</w:t>
       </w:r>
     </w:p>
     <w:p>
@@ -1776,7 +1757,7 @@
         <w:pStyle w:val="PostHeadPara"/>
       </w:pPr>
       <w:r>
-        <w:t>Post-traversal, the selected node set may still exceed the LLM context limit or contain redundant passages. Long contexts can degrade LLM performance, especially when relevant information appears in the middle of the input [22]. Prompt-compression methods such as LLMLingua [11] address this by dropping low-information tokens, achieving large compression ratios with little quality loss; PageTree-RAG instead compresses at the node level, pruning and deduplicating whole tree nodes by TF-IDF relevance so that page-level citations remain intact. The compressor (1) tokenizes each node's content (whitespace-based proxy) and assigns a token count; (2) computes TF-IDF cosine similarity between each node and the query, pruning nodes below MIN_CHUNK_RELEVANCE = 0.2; (3) merges node pairs with cosine similarity above SIMILARITY_THRESHOLD = 0.7, retaining the higher-scoring node's content; and (4) sorts the remaining nodes by relevance and truncates to MAX_OUTPUT_TOKENS = 4000. The net effect is a 22-37% reduction in context tokens (Table 4) with minimal retrieval-quality degradation, as shown in the ablation study (Section 5.4).</w:t>
+        <w:t>Post-traversal, the selected node set may still exceed the LLM context limit or contain redundant passages. Long contexts can degrade LLM performance, especially when relevant information appears in the middle of the input [23]. Prompt-compression methods such as LLMLingua [12] address this by dropping low-information tokens, achieving large compression ratios with little quality loss; PageTree-RAG instead compresses at the node level, pruning and deduplicating whole tree nodes by TF-IDF relevance so that page-level citations remain intact. The compressor (1) tokenizes each node's content (whitespace-based proxy) and assigns a token count; (2) computes TF-IDF cosine similarity between each node and the query, pruning nodes below MIN_CHUNK_RELEVANCE = 0.2; (3) merges node pairs with cosine similarity above SIMILARITY_THRESHOLD = 0.7, retaining the higher-scoring node's content; and (4) sorts the remaining nodes by relevance and truncates to MAX_OUTPUT_TOKENS = 4000. The net effect is a 22-37% reduction in context tokens (Table 5) with minimal retrieval-quality degradation, as shown in the ablation study (Section 5.4).</w:t>
       </w:r>
     </w:p>
     <w:p>
@@ -1792,7 +1773,7 @@
         <w:pStyle w:val="PostHeadPara"/>
       </w:pPr>
       <w:r>
-        <w:t>Technical documents frequently use internal references (“Section 3.2 conditions”, “Article 5 limitations”). Without resolution, the traversal misses the referenced node even if it is relevant. The reference resolver (1) detects reference patterns (regular expressions over Korean section markers, English “Section/Chapter/Article X”, and numeric citations); (2) fuzzy-matches detected references against all node titles in the index; and (3) injects matched nodes into the traversal result before generation. This module is particularly impactful for legal and regulatory documents, where cross-references are dense; the ablation in Section 5.4 quantifies its precision/coverage trade-off.</w:t>
+        <w:t>Technical documents frequently use internal references (“Section 3.2 conditions”, “Article 5 limitations”). Without resolution, the traversal misses the referenced node even if it is relevant. The reference resolver (1) detects reference patterns (regular expressions over Korean section markers, English “Section/Chapter/Article X”, and numeric citations); (2) fuzzy-matches detected references against all node titles in the index; and (3) injects matched nodes into the traversal result before generation. This module is particularly impactful for legal and regulatory documents, where cross-references are dense; the ablation in Section 5.4 reports its net effect on ROUGE-L and context size, and a dedicated precision/coverage analysis is left to future work.</w:t>
       </w:r>
     </w:p>
     <w:p>
@@ -1800,7 +1781,7 @@
         <w:pStyle w:val="Head2"/>
       </w:pPr>
       <w:r>
-        <w:t>Hallucination Detection</w:t>
+        <w:t>Grounding Confidence Estimation</w:t>
       </w:r>
     </w:p>
     <w:p>
@@ -1811,15 +1792,7 @@
         </w:rPr>
       </w:pPr>
       <w:r>
-        <w:t xml:space="preserve">Figure 1 illustrates the five-signal scoring pipeline. Each generated answer sentence is scored against the retrieved node set using five overlap signals (Table 2). A per-sentence confidence score is the mean of the five signals; an overall document confidence is the mean over all sentences. When confidence falls below 0.6, or when more than 70% of sentences have low confidence, a warning is surfaced to the user. The five signals are simple n-gram and character-overlap statistics computed in a single pass, so the detector is LLM-free and adds negligible latency relative to the generation call. This is a deliberate accuracy-for-speed trade-off: unlike LLM-based verifiers such as FActScore [25] and RAGAS [4], which issue additional model queries per claim, our detector is cheap enough to run on every response in a live system, at the cost of </w:t>
-      </w:r>
-      <w:proofErr w:type="gramStart"/>
-      <w:r>
-        <w:t>coarser</w:t>
-      </w:r>
-      <w:proofErr w:type="gramEnd"/>
-      <w:r>
-        <w:t>, surface-level faithfulness signals.</w:t>
+        <w:t>Figure 1 illustrates the five-signal scoring pipeline. Each generated answer sentence is scored against the retrieved node set using five overlap signals (Table 2). A per-sentence confidence score is the mean of the five signals; an overall document confidence is the mean over all sentences. When confidence falls below 0.6, or when more than 70% of sentences have low confidence, a warning is surfaced to the user. The five signals are simple n-gram and character-overlap statistics computed in a single pass, so the detector is LLM-free and adds negligible latency relative to the generation call. This is a deliberate accuracy-for-speed trade-off: unlike LLM-based verifiers such as FActScore [26] and RAGAS [4], which issue additional model queries per claim, our detector is cheap enough to run on every response in a live system, at the cost of coarser, surface-level faithfulness signals.</w:t>
       </w:r>
     </w:p>
     <w:p>
@@ -1827,7 +1800,7 @@
         <w:pStyle w:val="TableCaption"/>
       </w:pPr>
       <w:r>
-        <w:t>Table 2: The five overlap signals of the hallucination detector.</w:t>
+        <w:t>Table 2: The five overlap signals of the grounding confidence module.</w:t>
       </w:r>
     </w:p>
     <w:tbl>
@@ -2073,7 +2046,7 @@
         <w:pStyle w:val="FigureCaption"/>
       </w:pPr>
       <w:r>
-        <w:t>Figure 1: The five-signal hallucination detection pipeline, which scores each answer sentence against the retrieved nodes and surfaces a per-response confidence estimate.</w:t>
+        <w:t>Figure 1: The five-signal grounding confidence pipeline, which scores each answer sentence against the retrieved nodes and surfaces a per-response confidence estimate.</w:t>
       </w:r>
     </w:p>
     <w:p>
@@ -2097,7 +2070,7 @@
         <w:pStyle w:val="PostHeadPara"/>
       </w:pPr>
       <w:r>
-        <w:t>PageTree-RAG is deployed as a two-tier system: a Python FastAPI backend and a Next.js frontend, containerized with Docker Compose. Figure 2 shows the top-level pipeline. The backend comprises API routes (upload, index, chat, tree, graph), core modules (indexer, reasoner, traversal, compressor, reference resolver, hallucination detector), a Redis L1+L2 hybrid cache, and Celery workers for asynchronous indexing tasks.</w:t>
+        <w:t>PageTree-RAG is deployed as a two-tier system: a Python FastAPI backend and a Next.js frontend, containerized with Docker Compose. Figure 2 shows the top-level pipeline. The backend comprises API routes (upload, index, chat, tree, graph), core modules (indexer, reasoner, traversal, compressor, reference resolver, grounding confidence module), a Redis L1+L2 hybrid cache, and Celery workers for asynchronous indexing tasks.</w:t>
       </w:r>
     </w:p>
     <w:p>
@@ -2178,7 +2151,7 @@
       </w:r>
       <w:r>
         <w:lastRenderedPageBreak/>
-        <w:t>compressor on the selected nodes; (5) calls the LLM with the compressed context and a domain-specific prompt template; (6) runs the hallucination detector on the response; and (7) returns the answer with page citations, traversal statistics, and a confidence score.</w:t>
+        <w:t>compressor on the selected nodes; (5) calls the LLM with the compressed context and a domain-specific prompt template; (6) runs the grounding confidence module on the response; and (7) returns the answer with page citations, traversal statistics, and a confidence score.</w:t>
       </w:r>
     </w:p>
     <w:p>
@@ -2194,7 +2167,7 @@
         <w:pStyle w:val="PostHeadPara"/>
       </w:pPr>
       <w:r>
-        <w:t>The cache key is a SHA-256 hash of (question, index filenames, traversal settings, domain template, language, prompt cache version). Cache hits return in roughly 100 ms versus the 1.8-3.2 s of a cold LLM call. A two-layer hierarchy stores hot entries in process memory (L1) and warm entries in Redis (L2), with a cache hit rate exceeding 90% in our production trials. This application-layer caching complements inference-layer memory optimizations such as PagedAttention [18], which manages GPU KV-cache during LLM decoding. The traversal algorithm (DFS vs. Beam) is included in this key; an earlier implementation omitted it, which let same-question queries under different algorithms silently collide within the cache TTL until we discovered and fixed it (Section 6.2).</w:t>
+        <w:t>The cache key is a SHA-256 hash of (question, index filenames, traversal settings, domain template, language, prompt cache version). Cache hits return in roughly 100 ms versus the 1.8-3.2 s of a cold generation call in the deployed configuration. These figures characterize the deployed serving stack and are not comparable to the end-to-end query latencies reported in Table 8, which were measured on a local, unbatched 8B model and additionally include LLM-scored traversal (Section 5.6). A two-layer hierarchy stores hot entries in process memory (L1) and warm entries in Redis (L2), In internal usage we observed cache hit rates above 90%, but we did not instrument this systematically and do not report it as an experimental result. This application-layer caching complements inference-layer memory optimizations such as PagedAttention [19], which manages GPU KV-cache during LLM decoding. The traversal algorithm (DFS vs. Beam) is included in this key; an earlier implementation omitted it, which let same-question queries under different algorithms silently collide within the cache TTL until we discovered and fixed it (Section 6.3).</w:t>
       </w:r>
     </w:p>
     <w:p>
@@ -2210,7 +2183,7 @@
         <w:pStyle w:val="PostHeadPara"/>
       </w:pPr>
       <w:r>
-        <w:t>The backend exposes RESTful endpoints for document upload, indexing, chat, tree visualization, and reasoning-graph construction. The frontend provides a multi-document chat interface, an interactive tree explorer, and a PDF viewer with page-highlighted citations. Rate limiting and security middleware (Content-Security-Policy headers, file MIME/size validation, path-traversal guards) are production-hardened.</w:t>
+        <w:t>The backend exposes RESTful endpoints for document upload, indexing, chat, tree visualization, and reasoning-graph construction. The frontend provides a multi-document chat interface, an interactive tree explorer, and a PDF viewer with page-highlighted citations. Rate limiting and security middleware (Content-Security-Policy headers, file MIME/size validation, path-traversal guards) are implemented, though we report no deployment study to substantiate operational readiness.</w:t>
       </w:r>
     </w:p>
     <w:p>
@@ -2250,7 +2223,7 @@
         <w:pStyle w:val="PostHeadPara"/>
       </w:pPr>
       <w:r>
-        <w:t>Datasets. We evaluate on three datasets. The Full Benchmark (n = 204) is an automatically generated QA set spanning seven documents (academic papers and biomedical reports); questions are produced by the LLM with three types (factual/single-hop, multi-hop/cross-section, comparative), and validation ensures answer hints appear verbatim in source nodes. The HotpotQA subset is a sample from the HotpotQA development set [35] converted to page-indexed trees, requiring two-hop reasoning across supporting passages; we use 20 questions for the offline extractive protocol and expand to 100 questions for the fair generative protocol (Section 5.6). The Medical Benchmark (n = 42) is auto-generated from Japanese-language biomedical engineering lecture materials and biomedical literature, with clinical factual, procedure, comparison, and safety question subtypes, and includes a domain-specific medical entity recall metric.</w:t>
+        <w:t>Datasets. We evaluate on three datasets. The Full Benchmark (n = 204) is an automatically generated QA set spanning seven documents (academic papers and biomedical reports); questions are produced by the LLM with three types (factual/single-hop, multi-hop/cross-section, comparative), and validation ensures answer hints appear verbatim in source nodes. The HotpotQA subset is a sample from the HotpotQA development set [39] converted to page-indexed trees, requiring two-hop reasoning across supporting passages; we use 20 questions for the offline extractive protocol and expand to 100 questions for the fair generative protocol (Section 5.6). The Medical Benchmark (n = 42) is auto-generated from Japanese-language biomedical engineering lecture materials and biomedical literature, with clinical factual, procedure, comparison, and safety question subtypes, and includes a domain-specific medical entity recall metric.</w:t>
       </w:r>
     </w:p>
     <w:p>
@@ -2258,19 +2231,16 @@
         <w:pStyle w:val="Para"/>
       </w:pPr>
       <w:r>
-        <w:t xml:space="preserve">Baselines. We compare against BM25 (Okapi BM25 keyword retrieval over document chunks), Dense Retrieval (Sentence-BERT [27] embedding with cosine retrieval), FlatRAG (a hybrid of BM25 60%, semantic 25%, structural 15%), </w:t>
-      </w:r>
-      <w:r>
-        <w:lastRenderedPageBreak/>
-        <w:t>and RAPTOR (recursive abstractive processing of chunks into a tree [30]), alongside our PageTree-RAG (DFS) and PageTree-RAG (Beam).</w:t>
-      </w:r>
+        <w:t>Baselines. We compare against BM25 (Okapi BM25 keyword retrieval over document chunks), Dense Retrieval (Sentence-BERT [29] embedding with cosine retrieval), FlatRAG (a hybrid of BM25 60%, semantic 25%, structural 15%), and RAPTOR (recursive abstractive processing of chunks into a tree [32]), alongside our PageTree-RAG (DFS) and PageTree-RAG (Beam).</w:t>
+      </w:r>
+      <w:r/>
     </w:p>
     <w:p>
       <w:pPr>
         <w:pStyle w:val="Para"/>
       </w:pPr>
       <w:r>
-        <w:t>Metrics. We report ROUGE-L [20] (longest-common-subsequence recall against reference answers); BERTScore [36] (contextual embedding precision); LLM-as-Judge [38], scored by the same locally hosted Llama 3.1 8B model used for generation (faithfulness, relevance, completeness, 0-1 scale); Medical Entity Recall (fraction of reference medical terms recovered); Latency (average wall-clock time per query); and Context Tokens (average token count handed to the generator). To measure source provenance we add two citation metrics: Citation Availability (fraction of answers that carry a valid page reference) and Citation F1 (overlap between the sections/pages cited and the gold supporting sections). Statistical significance is assessed with paired t-tests and effect size with Cohen's d. For significance we report paired t-tests and, for the small multi-hop cells, assumption-free paired permutation tests—preferred because they test the null hypothesis directly without a normality assumption—alongside Cohen's d effect sizes; bootstrap 95% confidence intervals and a power analysis for the headline comparisons are consolidated in Table 13 (Statistical Robustness).</w:t>
+        <w:t>Metrics. We report ROUGE-L [21] (longest-common-subsequence recall against reference answers); BERTScore [40] (contextual embedding precision); LLM-as-Judge [42], scored by the same locally hosted Llama 3.1 8B model used for generation (faithfulness, relevance, completeness, 0-1 scale); Medical Entity Recall (fraction of reference medical terms recovered); Latency (average wall-clock time per query); and Context Tokens (average token count handed to the generator). Context Tokens counts the whitespace-delimited tokens of the retrieved-context string that is interpolated into the generator prompt, instrumented identically for every system. The string differs in kind across systems: for PageTree-RAG it holds the selected nodes' titles and summaries after compression, whereas for the chunk-based baselines it holds retrieved chunk text. The metric should therefore be read as the size of the evidence payload each retriever hands the generator, not as a like-for-like measure of the information that payload carries. To measure source provenance we add two citation metrics: Citation Availability (fraction of answers that carry a valid page reference) and Citation F1 (overlap between the sections/pages cited and the gold supporting sections). Statistical significance is assessed with paired t-tests and effect size with Cohen's d. For significance we report paired t-tests and, for the small multi-hop cells, assumption-free paired permutation tests—preferred because they test the null hypothesis directly without a normality assumption—alongside Cohen's d effect sizes; bootstrap 95% confidence intervals and a power analysis for the headline comparisons are consolidated in Table 13 (Statistical Robustness).</w:t>
       </w:r>
     </w:p>
     <w:p>
@@ -2281,7 +2251,7 @@
         </w:rPr>
       </w:pPr>
       <w:r>
-        <w:t>Evaluation protocols. We evaluate under two protocols. The extractive (offline) protocol approximates traversal with keyword scoring and assembles answers by concatenating retrieved node summaries; it is fast but, as we show in Section 5.7, systematically biased. The fair generative protocol is our primary one: every system feeds its retrieved context to the same local LLM (Llama 3.1 8B) for answer generation, so that the only thing that differs across systems is the retrieval stage. The same model serves as the LLM judge. Because online generation through a hosted API was not available to us, all generative results use this local model; the fair-protocol experiments are run on a fixed 40-question sample of the Full Benchmark (seed 42) and on the HotpotQA subset (100 questions under the fair protocol, expanded from an initial 20), which bounds their statistical power and which we treat as a limitation (Section 6.4).</w:t>
+        <w:t>Evaluation protocols. We evaluate under two protocols. The extractive (offline) protocol approximates traversal with keyword scoring and assembles answers by concatenating retrieved node summaries; it is fast but, as we show in Section 5.7, systematically biased. The fair generative protocol is our primary one: every system feeds its retrieved context to the same local LLM (Llama 3.1 8B) for answer generation, so that the only thing that differs across systems is the retrieval stage. The same model serves as the LLM judge. Because online generation through a hosted API was not available to us, all generative results use this local model; the fair-protocol experiments are run on a fixed 100-question sample of the Full Benchmark (seed 42; the citation analysis of Table 9 uses an earlier 40-question sample of the same benchmark) and on the HotpotQA subset (100 questions under the fair protocol, expanded from an initial 20), which bounds their statistical power and which we treat as a limitation (Section 6.4).</w:t>
       </w:r>
     </w:p>
     <w:p>
@@ -2305,19 +2275,16 @@
         <w:pStyle w:val="Para"/>
       </w:pPr>
       <w:r>
-        <w:t xml:space="preserve">FlatRAG's high LLM-Judge score (0.81) despite low ROUGE-L (0.248) highlights a known divergence between lexical overlap metrics and semantic quality: FlatRAG's hybrid scoring produces fluent answers that an LLM judge rates highly, even though they miss the specific phrasing of reference answers. PageTree-RAG (Beam)'s LLM-Judge (0.70) is second highest. RAPTOR underperforms on both ROUGE-L (0.194) and LLM-Judge (0.67), likely because its cluster-based tree does not preserve section-level structure-known to be suboptimal for documents with explicit hierarchies [30]. The latency </w:t>
-      </w:r>
-      <w:r>
-        <w:lastRenderedPageBreak/>
-        <w:t>column (offline ms) shows both PageTree-RAG variants are faster than BM25 and RAPTOR even in offline mode, because keyword-based tree traversal over a pre-built JSON index is more efficient than BM25's inverted-index lookup over raw chunks or RAPTOR's recursive summarization pipeline.</w:t>
-      </w:r>
+        <w:t>FlatRAG's high LLM-Judge score (0.81) despite low ROUGE-L (0.248) highlights a known divergence between lexical overlap metrics and semantic quality: FlatRAG's hybrid scoring produces fluent answers that an LLM judge rates highly, even though they miss the specific phrasing of reference answers. PageTree-RAG (Beam)'s LLM-Judge (0.70) is second highest. RAPTOR underperforms on both ROUGE-L (0.194) and LLM-Judge (0.67), likely because its cluster-based tree does not preserve section-level structure-known to be suboptimal for documents with explicit hierarchies [32]. The latency column (offline ms) shows both PageTree-RAG variants are faster than BM25 and RAPTOR even in offline mode, because keyword-based tree traversal over a pre-built JSON index is more efficient than BM25's inverted-index lookup over raw chunks or RAPTOR's recursive summarization pipeline.</w:t>
+      </w:r>
+      <w:r/>
     </w:p>
     <w:p>
       <w:pPr>
         <w:pStyle w:val="TableCaption"/>
       </w:pPr>
       <w:r>
-        <w:t>Table 3: Main Results (n = 204 / n = 20). Best per column in bold (see text); all † comparisons have p &lt; 0.001 vs. PageTree-RAG (Beam) (paired t-test). Latency is offline traversal time only (no LLM call).</w:t>
+        <w:t>Table 3: Main Results (n = 204 / n = 20). Best per column in bold (see text); all † comparisons have p &lt; 0.001 vs. PageTree-RAG (Beam) (paired t-test). Latency is offline traversal time only (no LLM call). "-" denotes a cell not run in the offline HotpotQA protocol.</w:t>
       </w:r>
     </w:p>
     <w:tbl>
@@ -2979,7 +2946,7 @@
         <w:pStyle w:val="FigureCaption"/>
       </w:pPr>
       <w:r>
-        <w:t>Figure 3: Main results under the fair generative protocol (n = 100): ROUGE-L and BERTScore by system. Flat baselines lead on these lexical-overlap metrics, whereas PageTree-RAG leads on LLM-Judge (Table 8); the divergence is analyzed in Section 5.5.</w:t>
+        <w:t>Figure 3: Main results under the fair generative protocol (n = 100): ROUGE-L and BERTScore by system. Flat baselines lead on these lexical-overlap metrics, whereas PageTree-RAG (Beam) reaches LLM-Judge statistically indistinguishable from the best baseline (Table 8); the divergence is analyzed in Section 5.7.</w:t>
       </w:r>
     </w:p>
     <w:p>
@@ -3038,8 +3005,7 @@
         </w:rPr>
       </w:pPr>
       <w:r>
-        <w:lastRenderedPageBreak/>
-        <w:t>Figure 4: ROUGE-L on the Full Benchmark versus the HotpotQA multi-hop subset (fair generative protocol). Every system drops sharply on multi-hop under lexical overlap; on LLM-Judge, PageTree-RAG (Beam) leads the multi-hop set (0.767, Table 10, Section 5.6), reversing the ROUGE-L ordering just as it does on the Full Benchmark.</w:t>
+        <w:t>Figure 4: ROUGE-L on the Full Benchmark versus the HotpotQA multi-hop subset (fair generative protocol). Every system drops sharply on multi-hop under lexical overlap; on LLM-Judge, PageTree-RAG (Beam) leads the multi-hop set (0.767, Table 10, Section 5.9), reversing the ROUGE-L ordering; on the Full Benchmark the same reversal brings PageTree-RAG (Beam) level with the strongest baseline rather than ahead of it (Table 8).</w:t>
       </w:r>
       <w:r>
         <w:rPr>
@@ -3061,7 +3027,7 @@
         <w:pStyle w:val="PostHeadPara"/>
       </w:pPr>
       <w:r>
-        <w:t>Table 4 and Figure 5 present domain-specific results on the 42-question medical benchmark. PageTree-RAG (DFS) achieves the highest ROUGE-L (0.366) while maintaining perfect medical entity recall (1.000) and the smallest non-zero context footprint (73.5 tokens). Critically, RAPTOR drops to ROUGE-L 0.053 (-85.5% vs. PageTree-RAG (DFS)) because its recursive abstractive clustering loses domain-specific clinical terminology; additionally, its abstractive summaries strip page references entirely (citation availability = 0.000), making RAPTOR unsuitable for clinical settings where source traceability is a regulatory requirement.</w:t>
+        <w:t>Table 4 and Figure 5 present domain-specific results on the 42-question medical benchmark. PageTree-RAG (DFS) achieves the highest ROUGE-L (0.366) while maintaining perfect medical entity recall (1.000) and the smallest non-zero context footprint (73.5 tokens). Critically, RAPTOR drops to ROUGE-L 0.053 (-85.5% vs. PageTree-RAG (DFS)) because its recursive abstractive clustering loses domain-specific clinical terminology; additionally, its abstractive summaries strip section identifiers, so although it nominally attaches a reference its citation F1 is 0.000 (Table 9), making RAPTOR unsuitable for clinical settings where source traceability is a regulatory requirement.</w:t>
       </w:r>
     </w:p>
     <w:p>
@@ -3077,7 +3043,7 @@
         <w:pStyle w:val="TableCaption"/>
       </w:pPr>
       <w:r>
-        <w:t>Table 4: Medical Domain Results (n = 42). ‡ FlatRAG in offline mode uses no retrieved passage context (0 tokens); online mode retrieves hybrid chunks.</w:t>
+        <w:t>Table 4: Medical Domain Results (n = 42). ‡ Our instrumentation does not capture FlatRAG's passage context, so its 0 entries denote missing measurements rather than a true absence of context; FlatRAG's actual context is non-zero and its context-efficiency comparisons should be read as unavailable.</w:t>
       </w:r>
     </w:p>
     <w:tbl>
@@ -3548,7 +3514,7 @@
         <w:pStyle w:val="FigureCaption"/>
       </w:pPr>
       <w:r>
-        <w:t>Figure 5: Medical-domain comparison (n = 42). PageTree-RAG (DFS) leads on ROUGE-L with perfect entity recall, while RAPTOR collapses and loses page citations.</w:t>
+        <w:t>Figure 5: Medical-domain comparison (n = 42). PageTree-RAG (DFS) leads on ROUGE-L with perfect entity recall, while RAPTOR collapses and loses usable page citations (citation F1 = 0.000, Table 9).</w:t>
       </w:r>
     </w:p>
     <w:p>
@@ -3564,7 +3530,7 @@
         <w:pStyle w:val="PostHeadPara"/>
       </w:pPr>
       <w:r>
-        <w:t>Table 5 and Figure 6 isolate the contribution of each component by progressively enabling features. Four findings emerge. First, DFS alone is a strong baseline: base DFS achieves the highest ROUGE-L (0.496 vs. 0.449 for Full, delta = +0.047), confirming that exhaustive depth-first traversal captures relevant text effectively. Second, Beam Search without compression degrades quality: adding Beam Search alone drops ROUGE-L by 0.050 vs. the Full system and inflates context by +22.8% (107.4 to 170.5 tokens), as the wider beam captures more nodes per iteration, introducing noise. Third, compression restores quality: adding contextual compression brings ROUGE-L back to 0.493 while reducing context to 107.5 tokens, effectively filtering the beam's noisy additions. Fourth, reference resolution trades precision for coverage: the Full system underperforms base DFS on ROUGE-L (-0.047) but resolves cross-references that DFS alone misses; the ROUGE-L penalty is partly an artifact of the offline extractive evaluation, since cross-reference resolution inserts additional related nodes that dilute extractive-match scores while providing richer grounded context for generation.</w:t>
+        <w:t>Table 5 and Figure 6 isolate the contribution of each component by progressively enabling features. Four findings emerge. First, DFS alone is a strong baseline: base DFS achieves the highest ROUGE-L (0.496 vs. 0.449 for Full, delta = +0.047), confirming that exhaustive depth-first traversal captures relevant text effectively. Second, Beam Search without compression degrades quality: adding Beam Search alone drops ROUGE-L by 0.050 vs. the Full system and inflates context by +22.8% relative to the Full system (170.5 vs. 138.9 tokens; +58.8% relative to base DFS's 107.4), as the wider beam captures more nodes per iteration, introducing noise. Third, compression restores quality: adding contextual compression brings ROUGE-L back to 0.493 while reducing context to 107.5 tokens, effectively filtering the beam's noisy additions. Fourth, reference resolution trades precision for coverage: the Full system underperforms base DFS on ROUGE-L (-0.047) but resolves cross-references that DFS alone misses; the ROUGE-L penalty is partly an artifact of the offline extractive evaluation, since cross-reference resolution inserts additional related nodes that dilute extractive-match scores while providing richer grounded context for generation.</w:t>
       </w:r>
     </w:p>
     <w:p>
@@ -5261,7 +5227,7 @@
         <w:pStyle w:val="PostHeadPara"/>
       </w:pPr>
       <w:r>
-        <w:t>Table 6 reports a one-factor-at-a-time sensitivity sweep over the four main hyperparameters, evaluated under the fair protocol on 50 questions. Beam width shows a clear optimum: a width of one collapses judged quality (0.735), the default width of five is best (0.813), and a wider beam of eight adds tokens and latency without improving quality. Traversal depth and the relevance weights are comparatively flat—LLM-Judge stays within roughly 0.79–0.82 across depths 2–10 and across all four weightings—indicating the fixed defaults are robust rather than finely tuned. The compression threshold is likewise stable, with a slightly higher value (0.8) marginally edging out the default (0.7) on judged quality; we retain the more conservative default. Overall the sweep supports the default configuration and shows that no single hyperparameter is a hidden lever behind the reported results. We therefore adopt τ = 0.7 as a conservative default that balances context size against judged answer quality. Because the sweep varies one factor at a time, it does not capture parameter interactions (for example beam width × depth); an exhaustive grid search is outside the scope of this work and is left to future work.</w:t>
+        <w:t>Table 6 reports a one-factor-at-a-time sensitivity sweep over the four main hyperparameters, evaluated under the fair protocol on 50 questions. Beam width shows a clear optimum: a width of one collapses judged quality (0.735), the default width of five is best (0.813), and a wider beam of eight adds tokens and latency without improving quality. Traversal depth and the relevance weights are comparatively flat—LLM-Judge stays within roughly 0.78-0.82 across depths 2-10 and across all four weightings—indicating the fixed defaults are robust rather than finely tuned. The compression threshold is likewise stable, with a slightly higher value (0.8) edging out the default (0.7) by 0.025 on judged quality, which is within the run-to-run variance quantified below; we retain the more conservative default. One caveat bounds how finely this sweep can be read. Each row is a single run, and the default configuration appears once in every sweep, so its four appearances give a direct estimate of run-to-run variance: LLM-Judge ranges over 0.787-0.813 and ROUGE-L over 0.242-0.299 for the same settings. Differences smaller than roughly 0.03 LLM-Judge should therefore not be read as real. Only the beam-width effect (0.735 at W=1 versus 0.813 at W=5) clearly exceeds this band; the flatness we report for depth, weights, and compression threshold is consistent with those factors having no effect large enough for this protocol to resolve. Overall the sweep supports the default configuration and shows that no single hyperparameter is a hidden lever behind the reported results. We therefore adopt τ = 0.7 as a conservative default that balances context size against judged answer quality. Because the sweep varies one factor at a time, it does not capture parameter interactions (for example beam width × depth); an exhaustive grid search is outside the scope of this work and is left to future work.</w:t>
       </w:r>
     </w:p>
     <w:p>
@@ -5331,7 +5297,7 @@
         <w:pStyle w:val="PostHeadPara"/>
       </w:pPr>
       <w:r>
-        <w:t>Table 7 shows context-token counts and query latency from the offline evaluation (n = 204); Figures 7 and 8 visualize the latency-accuracy trade-off and the accuracy-context Pareto frontier. PageTree-RAG (DFS) uses 37.5% fewer context tokens than BM25 (65.5 vs. 104.8 tokens average) while achieving +39.5% higher ROUGE-L, offering a favorable accuracy-context trade-off relative to every baseline under this offline proxy. RAPTOR uses the most context (218.7 tokens, +108.7% vs. DFS) while achieving the lowest ROUGE-L, suggesting that recursive abstractive summaries degrade structural fidelity on our hierarchy-preserving benchmark. Both PageTree-RAG variants also outperform all baselines on offline latency, completing traversal in roughly 1 ms; in production, the LLM scoring step adds a few hundred milliseconds but is cached after the first call. In short, structure buys context efficiency under the offline proxy: PageTree-RAG delivers the highest offline accuracy of any system while consuming the least retrieved context of any retrieval-based baseline.</w:t>
+        <w:t>Table 7 shows context-token counts and query latency from the offline evaluation (n = 204); Figures 7 and 8 visualize the latency-accuracy trade-off and the accuracy-context Pareto frontier. PageTree-RAG (DFS) uses 37.5% fewer context tokens than BM25 (65.5 vs. 104.8 tokens average) while achieving +39.5% higher ROUGE-L, offering a favorable accuracy-context trade-off relative to every baseline under this offline proxy. RAPTOR uses the most context (218.7 tokens, +233.9% vs. DFS) while achieving the lowest ROUGE-L, suggesting that recursive abstractive summaries degrade structural fidelity on our hierarchy-preserving benchmark. Both PageTree-RAG variants also outperform all baselines on offline latency, completing traversal in roughly 1 ms; in production, the LLM scoring step adds a few hundred milliseconds but is cached after the first call. In short, structure buys context efficiency under the offline proxy: PageTree-RAG delivers the highest offline accuracy of any system while consuming the least retrieved context of any retrieval-based baseline.</w:t>
       </w:r>
     </w:p>
     <w:p>
@@ -5339,7 +5305,7 @@
         <w:pStyle w:val="TableCaption"/>
       </w:pPr>
       <w:r>
-        <w:t>Table 7: Efficiency Analysis (offline mode, n = 204). † Offline latency includes tree traversal only (no LLM call); online generation adds ~1-3 s per query, collapsing to ~100 ms with L1/L2 cache hits. ‡ FlatRAG in offline mode uses no retrieved passage context.</w:t>
+        <w:t>Table 7: Efficiency Analysis (offline mode, n = 204). † Offline latency includes tree traversal only (no LLM call). Adding generation in the deployed serving stack costs a further ~1-3 s per query, collapsing to ~100 ms on an L1/L2 cache hit; the substantially larger end-to-end latencies of Table 8 reflect a different setting - a local, unbatched 8B model with LLM-scored traversal - and the two should not be compared directly. ‡ Our instrumentation does not capture FlatRAG's passage context, so its 0 entries denote missing measurements rather than a true absence of context; FlatRAG's actual context is non-zero and its context-efficiency comparisons should be read as unavailable.</w:t>
       </w:r>
     </w:p>
     <w:tbl>
@@ -5803,7 +5769,7 @@
         <w:pStyle w:val="FigureCaption"/>
       </w:pPr>
       <w:r>
-        <w:t>Figure 7: Latency versus LLM-Judge (fair generative protocol, n = 100). PageTree-RAG reaches the highest judged quality but at higher per-query latency, because it runs LLM-scored node selection during traversal; latency is the cost of the approach.</w:t>
+        <w:t>Figure 7: Latency versus LLM-Judge (fair generative protocol, n = 100). PageTree-RAG (Beam) reaches judged quality statistically tied with the strongest baseline but at higher per-query latency, because it runs LLM-scored node selection during traversal; latency is the cost of the approach.</w:t>
       </w:r>
     </w:p>
     <w:p>
@@ -5855,12 +5821,11 @@
       <w:pPr>
         <w:pStyle w:val="FigureCaption"/>
         <w:rPr>
-          <w:rFonts w:hint="eastAsia"/>
           <w:lang w:eastAsia="ko-KR"/>
         </w:rPr>
       </w:pPr>
       <w:r>
-        <w:t>Figure 8: LLM-Judge versus context size (fair generative protocol, n = 100). PageTree-RAG sits on the Pareto frontier—highest judged quality at 10× fewer context tokens; FlatRAG uses no retrieval context by construction.</w:t>
+        <w:t>Figure 8: LLM-Judge versus context size (fair generative protocol, n = 100). PageTree-RAG sits on the Pareto frontier—judged quality statistically tied with the strongest baseline at 10× fewer context tokens. FlatRAG is plotted at zero context only because our instrumentation does not capture its passage context (Table 8); its true position on the horizontal axis is unknown and it should not be read as a frontier point.</w:t>
       </w:r>
       <w:r>
         <w:br/>
@@ -5880,7 +5845,7 @@
         <w:pStyle w:val="PostHeadPara"/>
       </w:pPr>
       <w:r>
-        <w:t>We now turn to our primary protocol, in which all six systems generate answers with the same local Llama 3.1 8B and only the retriever differs (Table 8). The picture is more nuanced than the extractive proxy suggested. On lexical-overlap metrics a flat system leads: FlatRAG attains the highest ROUGE-L (0.479) and BM25 the highest BERTScore (0.530), with the PageTree-RAG variants close behind. On LLM-Judge the top of the table is effectively a tie: BM25 scores highest (0.826) and PageTree-RAG (Beam) second (0.822), a gap of 0.004 that is not statistically significant (paired permutation p = 0.82). The headline result is efficiency at equal quality: despite feeding the generator only 16 context tokens on average—10× fewer than BM25 and Dense Retrieval (111-113) and 14× fewer than RAPTOR (222)—PageTree-RAG (Beam) reaches judged quality statistically indistinguishable from the best baseline, thanks to contextual compression over a compact subtree; PageTree-RAG (DFS) uses the fewest tokens (8) at a small quality cost. The clear trade-off is latency: PageTree-RAG performs LLM-scored node selection during traversal, so it is several times slower per query (about 119 s for Beam and 94 s for DFS on our local 8B setup) than the single-call baselines (14-21 s). We read Table 8 as showing that PageTree-RAG matches the best baseline on judged quality at a fraction of the context, rather than dominating on every axis.</w:t>
+        <w:t>We now turn to our primary protocol, in which all six systems generate answers with the same local Llama 3.1 8B and only the retriever differs (Table 8). The picture is more nuanced than the extractive proxy suggested. On lexical-overlap metrics a flat system leads: FlatRAG attains the highest ROUGE-L (0.479) and BM25 the highest BERTScore (0.530), with the PageTree-RAG variants close behind. On LLM-Judge the top of the table is effectively a tie: BM25 scores highest (0.826) and PageTree-RAG (Beam) second (0.822), a gap of 0.004 that is not statistically significant (paired permutation p = 0.82). The headline result is efficiency at equal quality: despite feeding the generator only 16 context tokens on average—10× fewer than BM25 and Dense Retrieval (111-113) and 14× fewer than RAPTOR (222)—PageTree-RAG (Beam) reaches judged quality statistically indistinguishable from the best baseline, thanks to contextual compression over a compact subtree; PageTree-RAG (DFS) uses the fewest tokens (8) at a small quality cost. The clear trade-off is latency: PageTree-RAG performs LLM-scored node selection during traversal, so it is several times slower per query (about 119 s for Beam and 94 s for DFS on our local 8B setup) than the single-call baselines (14-21 s). This latency mainly reflects the added LLM calls for node-relevance scoring under a local, unbatched 8B model rather than an inherent cost of the traversal algorithm itself; a hosted or batched inference endpoint would likely reduce it substantially, though we have not measured that setting directly. We read Table 8 as showing that PageTree-RAG matches the best baseline on judged quality at a fraction of the context, rather than dominating on every axis.</w:t>
       </w:r>
     </w:p>
     <w:p>
@@ -5888,7 +5853,7 @@
         <w:pStyle w:val="TableCaption"/>
       </w:pPr>
       <w:r>
-        <w:t>Table 8: Fair generator-controlled results (Full Benchmark, n = 100, seed 42). Every system generates answers with the same local Llama 3.1 8B; only retrieval differs. ‡ Context instrumentation could not capture FlatRAG's passage context; its true context is non-zero.</w:t>
+        <w:t>Table 8: Fair generator-controlled results (Full Benchmark, n = 100, seed 42). Every system generates answers with the same local Llama 3.1 8B; only retrieval differs. ‡ Our instrumentation does not capture FlatRAG's passage context, so its 0 entries denote missing measurements rather than a true absence of context; FlatRAG's actual context is non-zero and its context-efficiency comparisons should be read as unavailable.</w:t>
       </w:r>
     </w:p>
     <w:tbl>
@@ -6519,7 +6484,7 @@
         <w:pStyle w:val="PostHeadPara"/>
       </w:pPr>
       <w:r>
-        <w:t>Comparing Table 3 (extractive) with Table 8 (fair generative) exposes a methodological hazard. Under the extractive proxy, PageTree-RAG (DFS) appears to win decisively, with ROUGE-L 0.451 versus 0.248 for FlatRAG-an apparent +81.9% advantage. Under fair generation, the ranking inverts: FlatRAG leads ROUGE-L (0.405) and PageTree-RAG (DFS) falls to 0.308. Nothing about the retrievers changed between the two tables; only the answer surface form did. Extractive concatenation of PageTree-RAG's node summaries happens to resemble the reference phrasing, inflating n-gram overlap, whereas fluent generation-which any deployed system actually uses-does not. We therefore caution that offline extractive evaluation and lexical-overlap metrics can manufacture or erase apparent gains for structure-aware retrieval, and we recommend that hierarchical-RAG systems be compared under a generator-controlled protocol. Reporting only the extractive numbers, as an earlier version of this work did, would have substantially overstated PageTree-RAG's accuracy.</w:t>
+        <w:t>Comparing Table 3 (extractive) with Table 8 (fair generative) exposes a methodological hazard. Under the extractive proxy, PageTree-RAG (DFS) appears to win decisively, with ROUGE-L 0.451 versus 0.248 for FlatRAG-an apparent +81.9% advantage. Under fair generation, the ranking inverts: FlatRAG leads ROUGE-L (0.479) and PageTree-RAG (DFS) falls to 0.340. Nothing about the retrievers changed between the two tables; only the answer surface form did. Extractive concatenation of PageTree-RAG's node summaries happens to resemble the reference phrasing, inflating n-gram overlap, whereas fluent generation-which any deployed system actually uses-does not. We therefore caution that offline extractive evaluation and lexical-overlap metrics can manufacture or erase apparent gains for structure-aware retrieval, and we recommend that hierarchical-RAG systems be compared under a generator-controlled protocol. Reporting only the extractive numbers, as an earlier version of this work did, would have substantially overstated PageTree-RAG's accuracy.</w:t>
       </w:r>
     </w:p>
     <w:p>
@@ -6538,11 +6503,10 @@
         </w:rPr>
       </w:pPr>
       <w:r>
-        <w:t xml:space="preserve">A retriever's value in citation-critical domains lies partly in whether its evidence can be cited at all. Table 9 measures this. Because PageTree-RAG retains a page range at every node, PageTree-RAG (Beam) both always produces a citation (availability 1.000) and cites the correct supporting sections most accurately (citation F1 = 0.757), the best of any system. The contrast with the abstractive baseline is stark: RAPTOR's cluster summaries discard section identifiers, so although it </w:t>
-      </w:r>
-      <w:r>
-        <w:lastRenderedPageBreak/>
-        <w:t>nominally attaches a reference (availability 1.000) its citation F1 is 0.000-it can point somewhere, but not to the right place. FlatRAG retrieves section text but carries no page references at all (availability 0.000). This axis is, by construction, one that flat and abstractive methods cannot satisfy, and it is the most robust advantage we observe for PageTree-RAG. In one sentence: only the page-indexed tree can both always cite and cite correctly-flat retrieval carries no page identifiers and abstractive summarization destroys them.</w:t>
+        <w:t xml:space="preserve">A retriever's value in citation-critical domains lies partly in whether its evidence can be cited at all. Table 9 measures this. Because PageTree-RAG retains a page range at every node, PageTree-RAG (Beam) both always produces a citation </w:t>
+      </w:r>
+      <w:r>
+        <w:t>(availability 1.000) and cites the correct supporting sections most accurately (citation F1 = 0.757), the best of any system. The contrast with the abstractive baseline is stark: RAPTOR's cluster summaries discard section identifiers, so although it nominally attaches a reference (availability 1.000) its citation F1 is 0.000-it can point somewhere, but not to the right place. FlatRAG retrieves section text but carries no page references at all (availability 0.000); its non-zero citation F1 reflects the sections present in its retrieved context rather than any reference the reader could follow in its answer (see the caption of Table 9). This axis is, by construction, one that flat and abstractive methods cannot satisfy, and it is the most robust advantage we observe for PageTree-RAG. In one sentence: only the page-indexed tree can both always cite and cite correctly-flat retrieval carries no page identifiers and abstractive summarization destroys them.</w:t>
       </w:r>
     </w:p>
     <w:p>
@@ -6550,7 +6514,7 @@
         <w:pStyle w:val="TableCaption"/>
       </w:pPr>
       <w:r>
-        <w:t>Table 9: Citation traceability and accuracy (Full Benchmark, n = 40, fair protocol). PageTree-RAG (Beam) attains the highest citation F1; RAPTOR loses section identifiers (F1 = 0.000) and FlatRAG carries no page references (availability = 0.000).</w:t>
+        <w:t>Table 9: Citation traceability and accuracy (Full Benchmark, n = 40, fair protocol). PageTree-RAG (Beam) attains the highest citation F1; RAPTOR loses section identifiers (F1 = 0.000) and FlatRAG carries no page references (availability = 0.000). The two metrics are measured at different points in the pipeline: Citation Availability asks whether the generated answer text contains a parseable page reference, whereas Citation F1 compares the section identifiers attributable to the retrieved evidence against the gold supporting sections. This is why FlatRAG can obtain a non-zero F1 while emitting no page reference in its answer, and why RAPTOR can attach a reference that matches no gold section.</w:t>
       </w:r>
     </w:p>
     <w:tbl>
@@ -6881,15 +6845,53 @@
         <w:pStyle w:val="PostHeadPara"/>
       </w:pPr>
       <w:r>
-        <w:t>Table 10 reports the HotpotQA multi-hop subset—expanded to 100 questions and re-run after fixing two independent bugs described in Section 6.2 (a response-cache key collision and, more consequentially, an empty-context indexing bug)—and Table 11 breaks the Full Benchmark down by question type using unrelated, unaffected data. On the fully corrected multi-hop set, PageTree-RAG (Beam) attains the highest LLM-Judge of all six systems (0.767), significantly above Dense Retrieval (Δ = +0.045, p = 0.024) and RAPTOR (Δ = +0.059, p = 0.003), though not significantly above BM25 or FlatRAG. On ROUGE-L, the pattern reverses as it does throughout this paper: BM25 leads (0.275), significantly above Beam (Δ = -0.130, p = 0.0007), and FlatRAG is also significantly above Beam (Δ = -0.068, p = 0.035); Beam is not significantly different from Dense or RAPTOR on either metric. This is consistent with the lexical/judged divergence reported throughout the paper, and with Table 11's per-type breakdown (unaffected by either bug), which shows the same qualitative pattern on the Full Benchmark's own multi-hop and comparative question categories. We state plainly that at n = 100 several pairwise comparisons remain underpowered (Table 13); the significant comparisons above are the ones we are confident in.</w:t>
-      </w:r>
+        <w:t>Table 10 reports the HotpotQA multi-hop subset—expanded to 100 questions and re-run after fixing two independent bugs described in Section 6.3 (a response-cache key collision and, more consequentially, an empty-context indexing bug)—and Table 11 breaks the Full Benchmark down by question type using unrelated, unaffected data. On the fully corrected multi-hop set, PageTree-RAG (Beam) attains the highest LLM-Judge of all six systems (0.767), significantly above Dense Retrieval (Δ = +0.045, p = 0.024) and RAPTOR (Δ = +0.059, p = 0.003), though not significantly above BM25 or FlatRAG. On ROUGE-L, the pattern reverses as it does throughout this paper: BM25 leads (0.275), significantly above Beam (Δ = -0.130, p = 0.0007), and FlatRAG is also significantly above Beam (Δ = -0.068, p = 0.035); Beam is not significantly different from Dense or RAPTOR on either metric. This is consistent with the lexical/judged divergence reported throughout the paper, and with Table 11's per-type breakdown (unaffected by either bug), which shows the same qualitative pattern on the Full Benchmark's own multi-hop and comparative question categories. We state plainly that at n = 100 several pairwise comparisons remain underpowered (Table 13); the significant comparisons above are the ones we are confident in.</w:t>
+      </w:r>
+      <w:r>
+        <w:br/>
+      </w:r>
+      <w:r>
+        <w:br/>
+      </w:r>
+      <w:r>
+        <w:br/>
+      </w:r>
+      <w:r>
+        <w:br/>
+      </w:r>
+      <w:r>
+        <w:br/>
+      </w:r>
+      <w:r>
+        <w:br/>
+      </w:r>
+    </w:p>
+    <w:p>
+      <w:pPr>
+        <w:pStyle w:val="PostHeadPara"/>
+      </w:pPr>
+    </w:p>
+    <w:p>
+      <w:pPr>
+        <w:pStyle w:val="PostHeadPara"/>
+      </w:pPr>
+    </w:p>
+    <w:p>
+      <w:pPr>
+        <w:pStyle w:val="PostHeadPara"/>
+      </w:pPr>
+    </w:p>
+    <w:p>
+      <w:pPr>
+        <w:pStyle w:val="PostHeadPara"/>
+      </w:pPr>
     </w:p>
     <w:p>
       <w:pPr>
         <w:pStyle w:val="TableCaption"/>
       </w:pPr>
       <w:r>
-        <w:t>Table 10: HotpotQA multi-hop (n = 100), fair generative protocol, after fixing both a response-cache key bug and an empty-context indexing bug (Section 6.2). PageTree-RAG (Beam) attains the highest LLM-Judge of all six systems (0.767), significantly above Dense Retrieval (p = 0.024) and RAPTOR (p = 0.003); BM25 leads ROUGE-L (0.275), significantly above Beam (p = 0.0007) and FlatRAG significantly above Beam as well (p = 0.035).</w:t>
+        <w:t>Table 10: HotpotQA multi-hop (n = 100), fair generative protocol, after fixing both a response-cache key bug and an empty-context indexing bug (Section 6.3). PageTree-RAG (Beam) attains the highest LLM-Judge of all six systems (0.767), significantly above Dense Retrieval (p = 0.024) and RAPTOR (p = 0.003); BM25 leads ROUGE-L (0.275), significantly above Beam (p = 0.0007) and FlatRAG significantly above Beam as well (p = 0.035).</w:t>
       </w:r>
     </w:p>
     <w:tbl>
@@ -7343,8 +7345,7 @@
         <w:pStyle w:val="TableCaption"/>
       </w:pPr>
       <w:r>
-        <w:lastRenderedPageBreak/>
-        <w:t>Table 11: Per-type breakdown (Full Benchmark, n = 100, fair protocol, corrected — Section 4.3). A flat baseline (BM25 in every case) wins ROUGE-L in every category; on LLM-Judge, PageTree-RAG (Beam) is competitive but not highest on multi-hop or comparative questions — BM25 narrowly leads both (0.843 vs. 0.837 multi-hop; 0.837 vs. 0.830 comparative), and neither gap is statistically significant.</w:t>
+        <w:t>Table 11: Per-type breakdown (Full Benchmark, n = 100, fair protocol, corrected — Section 6.3). A flat baseline (BM25 in every case) wins ROUGE-L in every category; on LLM-Judge, PageTree-RAG (Beam) is competitive but not highest on multi-hop or comparative questions — BM25 narrowly leads both (0.843 vs. 0.837 multi-hop; 0.837 vs. 0.830 comparative), and neither gap is statistically significant.</w:t>
       </w:r>
     </w:p>
     <w:tbl>
@@ -7615,7 +7616,7 @@
         <w:pStyle w:val="PostHeadPara"/>
       </w:pPr>
       <w:r>
-        <w:t>To test whether the structure-aware advantage holds on longer inputs, we added a long-document benchmark of 40 questions over U.S. government reports (GovReport [40]), run under the same fair generative protocol with the local Llama 3.1 8B. Table 12 reports the result. PageTree-RAG (Beam) attains the highest ROUGE-L (0.154) and the highest LLM-Judge (0.818), while RAPTOR collapses on both axes (ROUGE-L 0.066, LLM-Judge 0.612) as its recursive abstractive summaries lose the detail needed for long, structured reports. The efficiency gap is stark on long inputs: PageTree-RAG feeds the generator about 20 context tokens (5 for DFS) versus roughly 1,950 for the flat retrievers. The margin between the PageTree-RAG variants and the flat baselines is wider here than on the shorter Full Benchmark, consistent with the hypothesis that hierarchy helps most when documents are long enough that flat retrieval fragments the relevant context. We report this as an indicative (n = 40) generalization result.</w:t>
+        <w:t>To test whether the structure-aware advantage holds on longer inputs, we added a long-document benchmark of 40 questions over U.S. government reports (GovReport [11]), run under the same fair generative protocol with the local Llama 3.1 8B. Table 12 reports the result. PageTree-RAG (Beam) attains the highest ROUGE-L (0.154) and the highest LLM-Judge (0.818), while RAPTOR collapses on both axes (ROUGE-L 0.066, LLM-Judge 0.612) as its recursive abstractive summaries lose the detail needed for long, structured reports. The efficiency gap is stark on long inputs: PageTree-RAG feeds the generator about 20 context tokens (5 for DFS) versus roughly 1,950 for the flat retrievers, measured with the same instrumentation as Table 8 and not reproduced as a column in Table 12. The margin between PageTree-RAG (Beam) and the flat baselines is wider here than on the shorter Full Benchmark, although PageTree-RAG (DFS) does not share this advantage and trails BM25 and FlatRAG on both axes. The Beam result is consistent with the hypothesis that hierarchy helps most when documents are long enough that flat retrieval fragments the relevant context. We report this as an indicative (n = 40) generalization result.</w:t>
       </w:r>
     </w:p>
     <w:p>
@@ -7623,7 +7624,7 @@
         <w:pStyle w:val="TableCaption"/>
       </w:pPr>
       <w:r>
-        <w:t>Table 12: Long-document generalization on GovReport [40] (n = 40, fair generative protocol; LLM-Judge by llama3.1:8b). PageTree-RAG (Beam) leads on both ROUGE-L and LLM-Judge; RAPTOR collapses on long structured reports.</w:t>
+        <w:t>Table 12: Long-document generalization on GovReport [11] (n = 40, fair generative protocol; LLM-Judge by llama3.1:8b). PageTree-RAG (Beam) leads on both ROUGE-L and LLM-Judge; RAPTOR collapses on long structured reports.</w:t>
       </w:r>
     </w:p>
     <w:tbl>
@@ -7974,6 +7975,7 @@
         <w:pStyle w:val="Head2"/>
       </w:pPr>
       <w:r>
+        <w:lastRenderedPageBreak/>
         <w:t>Statistical Robustness</w:t>
       </w:r>
     </w:p>
@@ -7990,58 +7992,9 @@
     </w:p>
     <w:p>
       <w:pPr>
-        <w:pStyle w:val="PostHeadPara"/>
-        <w:rPr>
-          <w:lang w:eastAsia="ko-KR"/>
-        </w:rPr>
-      </w:pPr>
-    </w:p>
-    <w:p>
-      <w:pPr>
-        <w:pStyle w:val="PostHeadPara"/>
-        <w:rPr>
-          <w:lang w:eastAsia="ko-KR"/>
-        </w:rPr>
-      </w:pPr>
-    </w:p>
-    <w:p>
-      <w:pPr>
-        <w:pStyle w:val="PostHeadPara"/>
-        <w:rPr>
-          <w:lang w:eastAsia="ko-KR"/>
-        </w:rPr>
-      </w:pPr>
-    </w:p>
-    <w:p>
-      <w:pPr>
-        <w:pStyle w:val="PostHeadPara"/>
-        <w:rPr>
-          <w:lang w:eastAsia="ko-KR"/>
-        </w:rPr>
-      </w:pPr>
-    </w:p>
-    <w:p>
-      <w:pPr>
-        <w:pStyle w:val="PostHeadPara"/>
-        <w:rPr>
-          <w:lang w:eastAsia="ko-KR"/>
-        </w:rPr>
-      </w:pPr>
-    </w:p>
-    <w:p>
-      <w:pPr>
-        <w:pStyle w:val="PostHeadPara"/>
-        <w:rPr>
-          <w:lang w:eastAsia="ko-KR"/>
-        </w:rPr>
-      </w:pPr>
-    </w:p>
-    <w:p>
-      <w:pPr>
         <w:pStyle w:val="TableCaption"/>
       </w:pPr>
       <w:r>
-        <w:lastRenderedPageBreak/>
         <w:t xml:space="preserve">Table 13: Robust small-sample statistics for PageTree-RAG versus each baseline (General/Medical rows: DFS; HotpotQA rows: Beam, the system </w:t>
       </w:r>
       <w:proofErr w:type="gramStart"/>
@@ -8050,7 +8003,7 @@
       </w:r>
       <w:proofErr w:type="gramEnd"/>
       <w:r>
-        <w:t xml:space="preserve"> in that experiment). Δ = paired mean difference (positive favors PageTree-RAG); CIs are 10,000-sample bootstrap percentiles; p_perm is the paired permutation p-value; Power is post-hoc achieved power; n₈₀ is the sample size needed for 80% power. General and medical rows use the offline extractive protocol; HotpotQA rows use the fair generative protocol, corrected for the cache-key and empty-context bugs described in Section 6.2.</w:t>
+        <w:t xml:space="preserve"> in that experiment). Δ = paired mean difference (positive favors PageTree-RAG); CIs are 10,000-sample bootstrap percentiles; p_perm is the paired permutation p-value; Power is post-hoc achieved power; n₈₀ is the sample size needed for 80% power. General and medical rows use the offline extractive protocol; HotpotQA rows use the fair generative protocol, corrected for the cache-key and empty-context bugs described in Section 6.3.</w:t>
       </w:r>
     </w:p>
     <w:tbl>
@@ -9720,6 +9673,7 @@
               <w:pStyle w:val="TableCell"/>
             </w:pPr>
             <w:r>
+              <w:lastRenderedPageBreak/>
               <w:t>HotpotQA</w:t>
             </w:r>
           </w:p>
@@ -10056,7 +10010,6 @@
               <w:pStyle w:val="TableCell"/>
             </w:pPr>
             <w:r>
-              <w:lastRenderedPageBreak/>
               <w:t>HotpotQA</w:t>
             </w:r>
           </w:p>
@@ -10655,7 +10608,7 @@
         <w:pStyle w:val="PostHeadPara"/>
       </w:pPr>
       <w:r>
-        <w:t>The corrected multi-hop evaluation (Section 5.6) reinforces this reading rather than complicating it. On the HotpotQA subset, PageTree-RAG (Beam) attains the highest LLM-Judge of all six systems (0.767), significantly above Dense Retrieval and RAPTOR, while BM25 and FlatRAG lead ROUGE-L, significantly above Beam. This is the same lexical/judged divergence we report on the Full Benchmark (Table 8) and in the per-type breakdown (Table 11), now confirmed on an independently-sourced multi-hop dataset: hierarchical retrieval's judged-quality advantage generalizes beyond the documents used to build it, even though it never shows up as a ROUGE-L advantage.</w:t>
+        <w:t>The corrected multi-hop evaluation (Section 5.9) reinforces this reading rather than complicating it. On the HotpotQA subset, PageTree-RAG (Beam) attains the highest LLM-Judge of all six systems (0.767), significantly above Dense Retrieval and RAPTOR, while BM25 and FlatRAG lead ROUGE-L, significantly above Beam. This is the same lexical/judged divergence we report on the Full Benchmark (Table 8) and in the per-type breakdown (Table 11), now confirmed on an independently-sourced multi-hop dataset: hierarchical retrieval's judged-quality advantage generalizes beyond the documents used to build it, even though it never shows up as a ROUGE-L advantage.</w:t>
       </w:r>
     </w:p>
     <w:p>
@@ -10683,7 +10636,7 @@
         <w:pStyle w:val="PostHeadPara"/>
       </w:pPr>
       <w:r>
-        <w:t>Under the fair protocol, Beam Search is the better default among our variants. It reaches near-best overall LLM-Judge (0.822, statistically tied with the top baseline, BM25 at 0.826), the best citation F1 (0.757), and the highest LLM-Judge on the HotpotQA multi-hop subset (0.767), significantly above Dense Retrieval (p = 0.024) and RAPTOR (p = 0.003, Table 10). DFS is more token-frugal still (8 vs. 16 tokens on the Full Benchmark) but scores lower on quality and is marginally slower because it expands more nodes through the LLM scorer. We therefore recommend Beam as the production default and reserve DFS for extreme context-budget constraints. We also tested whether an automatic per-query classifier could route between the two rather than fixing one in advance (Section 3.3.1); as detailed in Limitations (Section 6), it did not outperform either fixed strategy in our experiments, so a reliable query-complexity router remains an open problem rather than settled future work.</w:t>
+        <w:t>Under the fair protocol, Beam Search is the better default among our variants. It reaches near-best overall LLM-Judge (0.822, statistically tied with the top baseline, BM25 at 0.826), the best citation F1 (0.757), and the highest LLM-Judge on the HotpotQA multi-hop subset (0.767), significantly above Dense Retrieval (p = 0.024) and RAPTOR (p = 0.003, Table 10). DFS is more token-frugal still (8 vs. 16 tokens on the Full Benchmark) but scores lower on quality and is marginally slower because it expands more nodes through the LLM scorer. We therefore recommend Beam as the production default and reserve DFS for extreme context-budget constraints. We also tested whether an automatic per-query classifier could route between the two rather than fixing one in advance (Section 3.3.1); as detailed in Limitations (Section 6.5), it did not outperform either fixed strategy in our experiments, so a reliable query-complexity router remains an open problem rather than settled future work.</w:t>
       </w:r>
     </w:p>
     <w:p>
@@ -10707,7 +10660,7 @@
         <w:pStyle w:val="PostHeadPara"/>
       </w:pPr>
       <w:r>
-        <w:t>To see where PageTree-RAG succeeds and fails, we inspected the HotpotQA answers per system. Our first pass surfaced a generator bug rather than a retrieval failure: under an earlier prompt the shared Llama 3.1 8B answered English questions in Korean on 28 of 100 items (and on 22 for BM25), a side effect of the domain-adaptive multilingual prompting, which drove ROUGE to near-zero and depressed judged quality. We fixed the bug by constraining the answer language to the question's language; Korean drift on the English benchmarks fell to 2 of 100, and the corrected results in Tables 10 and 12 are what we report throughout. After the fix the remaining errors are genuine and, notably, less frequent for PageTree-RAG than for the flat baselines: outright failures (LLM-Judge ≤ 0.4) occur on 6 and 7 of 100 questions for DFS and Beam versus 13 for BM25. These residual errors are dominated by terse or malformed generation on hard bridge questions—the 8B decoder occasionally emits a sentence fragment or leaks an internal identifier—rather than by node selection, so a stronger generator should reduce them further without changing the retrieval-level ordering (Limitations, Section 6).</w:t>
+        <w:t>To see where PageTree-RAG succeeds and fails, we inspected the HotpotQA answers per system. Our first pass surfaced a generator bug rather than a retrieval failure: under an earlier prompt the shared Llama 3.1 8B answered English questions in Korean on 28 of 100 items (and on 22 for BM25), a side effect of the domain-adaptive multilingual prompting, which drove ROUGE to near-zero and depressed judged quality. We fixed the bug by constraining the answer language to the question's language; Korean drift on the English benchmarks fell to 2 of 100, and the corrected results in Tables 10 and 12 are what we report throughout. After the fix the remaining errors are genuine and, notably, less frequent for PageTree-RAG than for the flat baselines: outright failures (LLM-Judge ≤ 0.4) occur on 6 and 7 of 100 questions for DFS and Beam versus 13 for BM25. These residual errors are dominated by terse or malformed generation on hard bridge questions—the 8B decoder occasionally emits a sentence fragment or leaks an internal identifier—rather than by node selection, so a stronger generator should reduce them further without changing the retrieval-level ordering (Section 6.5).</w:t>
       </w:r>
     </w:p>
     <w:p>
@@ -10743,7 +10696,7 @@
         <w:pStyle w:val="PostHeadPara"/>
       </w:pPr>
       <w:r>
-        <w:t>Several caveats bound our conclusions. Sample size: the fair-protocol main comparison uses a 100-question sample of the Full Benchmark (the citation and per-type analyses of Tables 7 and 9 use the original 40-question sample) and a 100-question HotpotQA subset (expanded from the original 20), which limits statistical power; most pairwise differences are not significant at this scale, and the per-type cells (n = 8-21) are smaller still. Single generator and judge: all generative results use one local model (Llama 3.1 8B) for both answer generation and LLM-as-Judge, so judge scores could carry model-specific preferences. Because every answer under comparison is produced by that same model, this is not a per-system self-preference. To probe it further, we re-scored the 100-question fair set with a second, independent local judge (Qwen2.5-7B). The two judges' system rankings are positively correlated (Spearman ρ = 0.60; not significant at n = 6 systems, p = 0.21), and both rank RAPTOR lowest and PageTree-RAG (Beam) in the top two. This indicates our conclusions are not an artifact of a single judge, though some mid-rank reordering (notably FlatRAG) shows judge choice does shift absolute positions. Corroboration with a hosted frontier judge remains valuable future work. Citation metric: Citation F1 is computed against gold supporting sections and rewards systems that emit section/page identifiers; it measures provenance fidelity, not answer correctness. Generator scale: an 8B local model is weaker than hosted frontier models, and absolute scores would likely rise with a stronger generator, though we have no evidence the relative ordering would change. Larger-sample, multi-model replication is the primary item of future work.</w:t>
+        <w:t>Several caveats bound our conclusions. Sample size: the fair-protocol main comparison uses a 100-question sample of the Full Benchmark (the citation analysis of Table 9 uses an earlier 40-question sample of the same benchmark) and a 100-question HotpotQA subset (expanded from the original 20), which limits statistical power; most pairwise differences are not significant at this scale, and the per-type cells of Table 11 (n = 20-49) are smaller still. Single generator and judge: all generative results use one local model (Llama 3.1 8B) for both answer generation and LLM-as-Judge, so judge scores could carry model-specific preferences. Because every answer under comparison is produced by that same model, this is not a per-system self-preference. To probe it further, we re-scored the 100-question fair set with a second, independent local judge (Qwen2.5-7B). The two judges' system rankings are positively correlated (Spearman ρ = 0.60; not significant at n = 6 systems, p = 0.21), and both rank RAPTOR lowest and PageTree-RAG (Beam) in the top two. This indicates our conclusions are not an artifact of a single judge, though some mid-rank reordering (notably FlatRAG) shows judge choice does shift absolute positions. Corroboration with a hosted frontier judge remains valuable future work. Citation metric: Citation F1 is computed against gold supporting sections and rewards systems that emit section/page identifiers; it measures provenance fidelity, not answer correctness. Generator scale: an 8B local model is weaker than hosted frontier models, and absolute scores would likely rise with a stronger generator, though we have no evidence the relative ordering would change. Larger-sample, multi-model replication is the primary item of future work.</w:t>
       </w:r>
     </w:p>
     <w:p>
@@ -10760,7 +10713,7 @@
         <w:pStyle w:val="PostHeadPara"/>
       </w:pPr>
       <w:r>
-        <w:t>Beyond the evaluation caveats of Section 6.3, the system has four engineering and methodological limitations. LLM dependency: indexing requires an LLM call per document, and traversal issues several LLM calls for node scoring, which is the source of PageTree-RAG's higher query latency. Structural prompt brittleness: documents with inconsistent heading styles (for example scanned PDFs with OCR artifacts) may yield malformed index trees requiring manual correction. Learned scoring: we attempted learned node scoring via DSPy [15] with an open 70B model; optimization yielded no improvement (0.0% gain), likely due to insufficient training signal (fewer than 100 labeled examples), and we exclude this component from the main system. Score feature design: the relevance function uses three interpretable signals (semantic, keyword, structural); richer scorers—BM25 term weighting, cross-encoder rerankers, or a fully learned scorer—are a natural extension we leave to future work. Detector signals: the hallucination detector currently relies on lexical and citation overlap, so it inherits the limits of surface-level matching; adding a semantic embedding-similarity signal would strengthen it and is a straightforward future improvement. Automatic traversal selection does not yet work: we implemented and tested the margin-based DFS/Beam selector described in Section 3.3.1 (root-level top-1-vs-runner-up margin, cutoff tau = 0.15). Offline, it never exceeded fixed DFS on either the general (n=204) or medical (n=42) benchmark. Online (n=50, seed=42), it underperformed both fixed strategies (ROUGE-L/LLM-Judge: Auto 0.293/0.78 vs. DFS 0.322/0.81 vs. Beam 0.373/0.78), while choosing DFS on only 48% of questions-close to chance-indicating the margin signal does not track which strategy will actually perform better on a given query. We therefore do not deploy this selector and report DFS and Beam only as fixed, separately-evaluated systems throughout; a working query-complexity router remains future work.</w:t>
+        <w:t>Beyond the evaluation caveats of Section 6.4, the system has four engineering and methodological limitations. LLM dependency: indexing requires an LLM call per document, and traversal issues several LLM calls for node scoring, which is the source of PageTree-RAG's higher query latency. Structural prompt brittleness: documents with inconsistent heading styles (for example scanned PDFs with OCR artifacts) may yield malformed index trees requiring manual correction. Learned scoring: we attempted learned node scoring via DSPy [16] with an open 70B model; optimization yielded no improvement (0.0% gain), likely due to insufficient training signal (fewer than 100 labeled examples), and we exclude this component from the main system. Score feature design: the relevance function uses three interpretable signals (semantic, keyword, structural); richer scorers—BM25 term weighting, cross-encoder rerankers, or a fully learned Learning-to-Rank scorer—are a natural extension we leave to future work. Detector signals: the grounding confidence module currently relies on lexical and citation overlap, so it inherits the limits of surface-level matching; adding a semantic embedding-similarity signal would strengthen it and is a straightforward future improvement. We also note that the module's detection accuracy is not itself evaluated in this paper: we report its cost and its design, not its precision and recall against labeled unfaithful sentences, and a labeled hallucination set for that purpose is future work. Automatic traversal selection does not yet work: we implemented and tested the margin-based DFS/Beam selector described in Section 3.3.1 (root-level top-1-vs-runner-up margin, cutoff tau = 0.15). Offline, it never exceeded fixed DFS on either the general (n=204) or medical (n=42) benchmark. Online (n=50, seed=42), it underperformed both fixed strategies (ROUGE-L/LLM-Judge: Auto 0.293/0.78 vs. DFS 0.322/0.81 vs. Beam 0.373/0.78), while choosing DFS on only 48% of questions-close to chance-indicating the margin signal does not track which strategy will actually perform better on a given query. We therefore do not deploy this selector and report DFS and Beam only as fixed, separately-evaluated systems throughout; a working query-complexity router remains future work.</w:t>
       </w:r>
     </w:p>
     <w:p>
@@ -10776,7 +10729,7 @@
         <w:pStyle w:val="PostHeadPara"/>
       </w:pPr>
       <w:r>
-        <w:t>Because PageTree-RAG preserves page-level provenance, it is well suited to high-stakes domains-medicine, law, and regulatory compliance-where unsupported claims carry real cost and every assertion must be traceable to a source span. The same property aids auditing and post-hoc verification. Conversely, the system inherits the biases of its underlying LLM during indexing and generation, and the lightweight hallucination detector reduces but does not eliminate unfaithful output; deployments in sensitive settings should retain a human-in-the-loop for final decisions.</w:t>
+        <w:t>Because PageTree-RAG preserves page-level provenance, it is well suited to high-stakes domains-medicine, law, and regulatory compliance-where unsupported claims carry real cost and every assertion must be traceable to a source span. The same property aids auditing and post-hoc verification. Conversely, the system inherits the biases of its underlying LLM during indexing and generation, and the lightweight grounding confidence module reduces but does not eliminate unfaithful output; deployments in sensitive settings should retain a human-in-the-loop for final decisions.</w:t>
       </w:r>
     </w:p>
     <w:p>
@@ -10792,7 +10745,7 @@
         <w:pStyle w:val="PostHeadPara"/>
       </w:pPr>
       <w:r>
-        <w:t>To support replication we release the full pipeline: the PDF-to-tree indexer, the traversal-policy and compression code, all four evaluation sets (Full Benchmark, HotpotQA, Medical, and GovReport), the offline extractive and fair generative harnesses, the LLM-as-Judge prompts (Appendix A.1), the traversal node-relevance prompts and decoding settings (Appendix A.2), and the page-indexed JSON tree schema. All generative results use a single local model, Llama 3.1 8B served via Ollama, for both answer generation and judging; the independent-judge cross-check uses Qwen2.5-7B. Every run fixes the random seed to 42, and no GPU cluster is required—the system runs on a single commodity machine with a local 8B model. Prompts, hyperparameter defaults (DFS gate weights 0.7/0.3 and Beam scoring weights 0.6/0.2/0.2, beam width W = 5, tree depth, compression threshold τ = 0.7), and per-question outputs are included so that all tables and figures can be regenerated end-to-end.</w:t>
+        <w:t>To support replication we release the full pipeline at &lt;&lt;REPOSITORY URL - TO BE INSERTED&gt;&gt;: the PDF-to-tree indexer, the traversal-policy and compression code, all four evaluation sets (Full Benchmark, HotpotQA, Medical, and GovReport), the offline extractive and fair generative harnesses, the LLM-as-Judge prompts (Appendix A.1), the traversal node-relevance prompts and decoding settings (Appendix A.2), and the page-indexed JSON tree schema. All generative results use a single local model, Llama 3.1 8B served via Ollama, for both answer generation and judging; the independent-judge cross-check uses Qwen2.5-7B. Every run fixes the random seed to 42, and no GPU cluster is required—the system runs on a single commodity machine with a local 8B model. Prompts, hyperparameter defaults (DFS gate weights 0.7/0.3 and Beam scoring weights 0.6/0.2/0.2, beam width W = 5, tree depth, compression threshold τ = 0.7), and per-question outputs are included so that all tables and figures can be regenerated end-to-end.</w:t>
       </w:r>
     </w:p>
     <w:p>
@@ -10808,11 +10761,10 @@
         <w:pStyle w:val="PostHeadPara"/>
       </w:pPr>
       <w:r>
-        <w:t xml:space="preserve">We presented PageTree-RAG, a hierarchical document RAG system that indexes PDFs into page-referenced JSON trees using zero-shot LLM prompting, traverses them with DFS or Beam Search, compresses retrieved context, and validates generated answers with a lightweight five-signal hallucination detector. Evaluating all systems under a fair protocol in </w:t>
-      </w:r>
-      <w:r>
-        <w:lastRenderedPageBreak/>
-        <w:t>which only the retriever differs and a shared local LLM (Llama 3.1 8B) generates every answer, we found that PageTree-RAG (Beam) produces the most accurate page-level citations (citation F1 = 0.757 vs. 0.000 for the abstractive RAPTOR baseline), competitive LLM-judged answer quality on multi-hop and comparative questions (0.837 and 0.830, statistically tied with the strongest baseline, BM25), and competitive overall quality (LLM-Judge 0.822, statistically tied with the strongest baseline) while feeding 10× fewer context tokens to the generator-at the cost of higher per-query latency. Just as importantly, we showed that offline extractive evaluation and lexical-overlap metrics reverse these conclusions and overstate flat retrieval, and we reported both regimes so that the discrepancy is explicit; we encourage future hierarchical-RAG work to hold the generator fixed when comparing retrievers, and to measure citation and efficiency directly. The system also provides domain-adaptive prompting, multilingual support, and a production-ready API with caching, rate limiting, and asynchronous task queuing. Future work will pursue (1) larger-sample, multi-model replication of the fair protocol; (2) Graph RAG integration [3] for inter-document relationship modeling; (3) multi-modal indexing for figures and tables; and (4) learning the adaptive traversal policy end-to-end from user-feedback signals, together with cross-document reasoning and multi-modal indexing.</w:t>
+        <w:t xml:space="preserve">We presented PageTree-RAG, a hierarchical document RAG system that indexes PDFs into page-referenced JSON trees using zero-shot LLM prompting, traverses them with DFS or Beam Search, compresses retrieved context, and validates </w:t>
+      </w:r>
+      <w:r>
+        <w:t>generated answers with a lightweight five-signal grounding confidence module. Evaluating all systems under a fair protocol in which only the retriever differs and a shared local LLM (Llama 3.1 8B) generates every answer, we found that PageTree-RAG (Beam) produces the most accurate page-level citations (citation F1 = 0.757, vs. 0.562 for the strongest baseline and 0.000 for the abstractive RAPTOR baseline), competitive LLM-judged answer quality on multi-hop and comparative questions (0.837 and 0.830, statistically tied with the strongest baseline, BM25), and competitive overall quality (LLM-Judge 0.822, statistically tied with the strongest baseline) while feeding 10× fewer context tokens to the generator-at the cost of higher per-query latency. Just as importantly, we showed that offline extractive evaluation and lexical-overlap metrics reverse these conclusions and overstate flat retrieval, and we reported both regimes so that the discrepancy is explicit; we encourage future hierarchical-RAG work to hold the generator fixed when comparing retrievers, and to measure citation and efficiency directly. The system also provides domain-adaptive prompting, multilingual support, and a deployable API with caching, rate limiting, and asynchronous task queuing. Future work will pursue (1) larger-sample, multi-model replication of the fair protocol; (2) Graph RAG integration [3] for inter-document relationship modeling; (3) multi-modal indexing for figures and tables; and (4) learning the adaptive traversal policy end-to-end from user-feedback signals, together with cross-document reasoning and multi-modal indexing.</w:t>
       </w:r>
     </w:p>
     <w:p>
@@ -10868,7 +10820,7 @@
         <w:pStyle w:val="AckPara"/>
       </w:pPr>
       <w:r>
-        <w:t>Generative AI is a core component of the described system (LLM-driven tree indexing, answer generation, and LLM-as-judge evaluation), as detailed in Sections 3-5. In preparing this manuscript, generative AI tools were also used for language editing and reference formatting; all technical content, experimental design, analysis, and claims were produced and verified by the authors.</w:t>
+        <w:t>Generative AI is a core component of the described system (LLM-driven tree indexing, answer generation, and LLM-as-judge evaluation), as detailed in Sections 3-5. In preparing this manuscript, generative AI tools were also used for language editing and reference formatting; all technical content, experimental design, analysis, and claims were produced and verified by the author.</w:t>
       </w:r>
     </w:p>
     <w:p>
@@ -11037,7 +10989,7 @@
         <w:pStyle w:val="Para"/>
       </w:pPr>
       <w:r>
-        <w:t>Each of the three axes is normalized from its raw 0-5 integer score to [0, 1] and the reported LLM-Judge value is the unweighted mean of the three normalized axes; a response that fails to parse as valid JSON on any axis is recorded as a missing score rather than a zero, so it is excluded from the mean rather than penalizing it. We do not explicitly pin a sampling temperature for judge calls-both GeminiJudge and LocalJudge use the underlying client's default decoding settings-so a single question's score is not guaranteed to be bit-identical across repeated runs; every reported result nonetheless uses one fixed run at seed = 42 (Section 6, Reproducibility), and Threats to Validity (Section 6) reports a full independent re-judging of the 100-question fair set with a second local model (Qwen2.5-7B) as a check on judge-specific sensitivity rather than run-to-run sampling noise. A representative real output is {"faithfulness": 4, "relevance": 5, "completeness": 3, "reasoning": "Grounded and on-point but omits the renewal deadline mentioned in the source."}, which normalizes to (0.8 + 1.0 + 0.6)/3 = 0.80.</w:t>
+        <w:t>Each of the three axes is normalized from its raw 0-5 integer score to [0, 1] and the reported LLM-Judge value is the unweighted mean of the three normalized axes; a response that fails to parse as valid JSON on any axis is recorded as a missing score rather than a zero, so it is excluded from the mean rather than penalizing it. We do not explicitly pin a sampling temperature for judge calls-both GeminiJudge and LocalJudge use the underlying client's default decoding settings-so a single question's score is not guaranteed to be bit-identical across repeated runs; every reported result nonetheless uses one fixed run at seed = 42 (Section 6.7), and Threats to Validity (Section 6.4) reports a full independent re-judging of the 100-question fair set with a second local model (Qwen2.5-7B) as a check on judge-specific sensitivity rather than run-to-run sampling noise. A representative real output is {"faithfulness": 4, "relevance": 5, "completeness": 3, "reasoning": "Grounded and on-point but omits the renewal deadline mentioned in the source."}, which normalizes to (0.8 + 1.0 + 0.6)/3 = 0.80.</w:t>
       </w:r>
     </w:p>
     <w:p>
@@ -11469,20 +11421,7 @@
         </w:rPr>
       </w:pPr>
       <w:r>
-        <w:t xml:space="preserve">Two guard rules precede the DFS gate and are applied before any LLM call: the root node is always accepted, and a node whose summary is shorter than 20 characters and whose title is shorter than 10 characters is auto-rejected as too sparse to evaluate. Together with the closed-form threshold of Equation 3 and the seeds and model versions listed in Section 6 (Reproducibility), these settings specify </w:t>
-      </w:r>
-      <w:proofErr w:type="spellStart"/>
-      <w:proofErr w:type="gramStart"/>
-      <w:r>
-        <w:t>llm</w:t>
-      </w:r>
-      <w:proofErr w:type="spellEnd"/>
-      <w:r>
-        <w:t>(</w:t>
-      </w:r>
-      <w:proofErr w:type="gramEnd"/>
-      <w:r>
-        <w:t>v, q) completely.</w:t>
+        <w:t>Two guard rules precede the DFS gate and are applied before any LLM call: the root node is always accepted, and a node whose summary is shorter than 20 characters and whose title is shorter than 10 characters is auto-rejected as too sparse to evaluate. Together with the closed-form threshold of Equation 3 and the seeds and model versions listed in Section 6.7, these settings specify llm(v, q) completely.</w:t>
       </w:r>
     </w:p>
     <w:p>
@@ -11521,7 +11460,6 @@
       <w:pPr>
         <w:pStyle w:val="ParaContinue"/>
         <w:rPr>
-          <w:rFonts w:hint="eastAsia"/>
           <w:lang w:eastAsia="ko-KR"/>
         </w:rPr>
       </w:pPr>
@@ -11556,7 +11494,7 @@
         </w:numPr>
       </w:pPr>
       <w:r>
-        <w:t>[2] Tom B. Brown et al. 2020. Language Models are Few-Shot Learners. In Advances in Neural Information Processing Systems 33 (NeurIPS 2020), 1877-1901. arXiv:2005.14165.</w:t>
+        <w:t>[2] Tom B. Brown, Benjamin Mann, Nick Ryder, Melanie Subbiah, Jared Kaplan, Prafulla Dhariwal, Arvind Neelakantan, Pranav Shyam, Girish Sastry, Amanda Askell, Sandhini Agarwal, Ariel Herbert-Voss, Gretchen Krueger, Tom Henighan, Rewon Child, Aditya Ramesh, Daniel M. Ziegler, Jeffrey Wu, Clemens Winter, Christopher Hesse, Mark Chen, Eric Sigler, Mateusz Litwin, Scott Gray, Benjamin Chess, Jack Clark, Christopher Berner, Sam McCandlish, Alec Radford, Ilya Sutskever, and Dario Amodei. 2020. Language Models are Few-Shot Learners. In Advances in Neural Information Processing Systems 33 (NeurIPS 2020), 1877-1901. arXiv:2005.14165.</w:t>
       </w:r>
     </w:p>
     <w:p>
@@ -11568,7 +11506,7 @@
         </w:numPr>
       </w:pPr>
       <w:r>
-        <w:t>[3] Darren Edge, Ha Trinh, Newman Cheng, Joshua Bradley, Alex Chao, Apurva Mody, Steven Truitt, Dasha Metropolitansky, Robert Osazuwa Ness, and Jonathan Larson. 2025. From Local to Global: A GraphRAG Approach to Query-Focused Summarization. arXiv:2404.16130.</w:t>
+        <w:t>[3] Darren Edge, Ha Trinh, Newman Cheng, Joshua Bradley, Alex Chao, Apurva Mody, Steven Truitt, Dasha Metropolitansky, Robert Osazuwa Ness, and Jonathan Larson. 2024. From Local to Global: A GraphRAG Approach to Query-Focused Summarization. arXiv:2404.16130.</w:t>
       </w:r>
     </w:p>
     <w:p>
@@ -11592,7 +11530,7 @@
         </w:numPr>
       </w:pPr>
       <w:r>
-        <w:t>[5] Thibault Formal, Benjamin Piwowarski, and Stephane Clinchant. 2021. SPLADE: Sparse Lexical and Expansion Model for First Stage Ranking. In Proc. SIGIR 2021, 2288-2292. https://doi.org/10.1145/3404835.3463098.</w:t>
+        <w:t>[5] Thibault Formal, Benjamin Piwowarski, and Stéphane Clinchant. 2021. SPLADE: Sparse Lexical and Expansion Model for First Stage Ranking. In Proc. SIGIR 2021, 2288-2292. https://doi.org/10.1145/3404835.3463098</w:t>
       </w:r>
     </w:p>
     <w:p>
@@ -11604,7 +11542,7 @@
         </w:numPr>
       </w:pPr>
       <w:r>
-        <w:t>[6] Thibault Formal, Stephane Clinchant, Herve Dejean, and Carlos Lassance. 2024. SPLATE: Sparse Late Interaction Retrieval. In Proc. SIGIR 2024. arXiv:2404.13950.</w:t>
+        <w:t>[6] Thibault Formal, Stéphane Clinchant, Hervé Déjean, and Carlos Lassance. 2024. SPLATE: Sparse Late Interaction Retrieval. In Proc. SIGIR 2024. https://doi.org/10.1145/3626772.3657968</w:t>
       </w:r>
     </w:p>
     <w:p>
@@ -11640,7 +11578,7 @@
         </w:numPr>
       </w:pPr>
       <w:r>
-        <w:t>[9] Lei Huang et al. 2025. A Survey on Hallucination in Large Language Models: Principles, Taxonomy, Challenges, and Open Questions. ACM Trans. Inf. Syst. 43, 2, Article 42. https://doi.org/10.1145/3703155.</w:t>
+        <w:t>[9] Haoyu Huang, Yongfeng Huang, Junjie Yang, Zhenyu Pan, Yongqiang Chen, Kaili Ma, Hongzhi Chen, and James Cheng. 2025. Retrieval-Augmented Generation with Hierarchical Knowledge. In Findings of the Association for Computational Linguistics: EMNLP 2025. arXiv:2503.10150.</w:t>
       </w:r>
     </w:p>
     <w:p>
@@ -11652,7 +11590,7 @@
         </w:numPr>
       </w:pPr>
       <w:r>
-        <w:t>[10] Haoyu Huang, Yongfeng Huang, Junjie Yang, Zhenyu Pan, Yongqiang Chen, Kaili Ma, Hongzhi Chen, and James Cheng. 2025. Retrieval-Augmented Generation with Hierarchical Knowledge. arXiv:2503.10150.</w:t>
+        <w:t>[10] Lei Huang, Weijiang Yu, Weitao Ma, Weihong Zhong, Zhangyin Feng, Haotian Wang, Qianglong Chen, Weihua Peng, Xiaocheng Feng, Bing Qin, and Ting Liu. 2025. A Survey on Hallucination in Large Language Models: Principles, Taxonomy, Challenges, and Open Questions. ACM Trans. Inf. Syst. 43, 2, Article 42. https://doi.org/10.1145/3703155</w:t>
       </w:r>
     </w:p>
     <w:p>
@@ -11664,7 +11602,7 @@
         </w:numPr>
       </w:pPr>
       <w:r>
-        <w:t>[11] Huiqiang Jiang, Qianhui Wu, Chin-Yew Lin, Yuqing Yang, and Lili Qiu. 2023. LLMLingua: Compressing Prompts for Accelerated Inference of Large Language Models. In Proc. EMNLP 2023, 13358-13376. arXiv:2310.05736.</w:t>
+        <w:t>[11] Luyang Huang, Shuyang Cao, Nikolaus Parulian, Heng Ji, and Lu Wang. 2021. Efficient Attentions for Long Document Summarization. In Proc. NAACL-HLT 2021, 1419-1436. arXiv:2104.02112.</w:t>
       </w:r>
     </w:p>
     <w:p>
@@ -11676,7 +11614,7 @@
         </w:numPr>
       </w:pPr>
       <w:r>
-        <w:t>[12] Jeff Johnson, Matthijs Douze, and Herve Jegou. 2019. Billion-scale Similarity Search with GPUs. IEEE Trans. Big Data 7, 3, 535-547. arXiv:1702.08734.</w:t>
+        <w:t>[12] Huiqiang Jiang, Qianhui Wu, Chin-Yew Lin, Yuqing Yang, and Lili Qiu. 2023. LLMLingua: Compressing Prompts for Accelerated Inference of Large Language Models. In Proc. EMNLP 2023, 13358-13376. arXiv:2310.05736.</w:t>
       </w:r>
     </w:p>
     <w:p>
@@ -11688,7 +11626,7 @@
         </w:numPr>
       </w:pPr>
       <w:r>
-        <w:t>[13] Vladimir Karpukhin, Barlas Oguz, Sewon Min, Patrick Lewis, Ledell Wu, Sergey Edunov, Danqi Chen, and Wen-tau Yih. 2020. Dense Passage Retrieval for Open-Domain Question Answering. In Proc. EMNLP 2020, 6769-6781.</w:t>
+        <w:t>[13] Jeff Johnson, Matthijs Douze, and Hervé Jégou. 2021. Billion-scale Similarity Search with GPUs. IEEE Trans. Big Data 7, 3, 535-547. arXiv:1702.08734.</w:t>
       </w:r>
     </w:p>
     <w:p>
@@ -11700,7 +11638,7 @@
         </w:numPr>
       </w:pPr>
       <w:r>
-        <w:t>[14] Omar Khattab and Matei Zaharia. 2020. ColBERT: Efficient and Effective Passage Search via Contextualized Late Interaction over BERT. In Proc. SIGIR 2020, 39-48. https://doi.org/10.1145/3397271.3401075.</w:t>
+        <w:t>[14] Vladimir Karpukhin, Barlas Oğuz, Sewon Min, Patrick Lewis, Ledell Wu, Sergey Edunov, Danqi Chen, and Wen-tau Yih. 2020. Dense Passage Retrieval for Open-Domain Question Answering. In Proc. EMNLP 2020, 6769-6781. arXiv:2004.04906.</w:t>
       </w:r>
     </w:p>
     <w:p>
@@ -11712,7 +11650,7 @@
         </w:numPr>
       </w:pPr>
       <w:r>
-        <w:t>[15] Omar Khattab, Arnav Singhvi, Paridhi Maheshwari, Zhiyuan Zhang, Keshav Santhanam, Sri Vardhamanan, Saiful Haq, Ashutosh Sharma, Thomas T. Joshi, Hanna Moazam, Heather Miller, Matei Zaharia, and Christopher Potts. 2024. DSPy: Compiling Declarative Language Model Calls into Self-Improving Pipelines. In Proc. ICLR 2024. arXiv:2310.03714.</w:t>
+        <w:t>[15] Omar Khattab and Matei Zaharia. 2020. ColBERT: Efficient and Effective Passage Search via Contextualized Late Interaction over BERT. In Proc. SIGIR 2020, 39-48. https://doi.org/10.1145/3397271.3401075</w:t>
       </w:r>
     </w:p>
     <w:p>
@@ -11724,7 +11662,7 @@
         </w:numPr>
       </w:pPr>
       <w:r>
-        <w:t>[16] Takeshi Kojima, Shixiang Shane Gu, Machel Reid, Yutaka Matsuo, and Yusuke Iwasawa. 2022. Large Language Models are Zero-Shot Reasoners. In Advances in Neural Information Processing Systems 35 (NeurIPS 2022). arXiv:2205.11916.</w:t>
+        <w:t>[16] Omar Khattab, Arnav Singhvi, Paridhi Maheshwari, Zhiyuan Zhang, Keshav Santhanam, Sri Vardhamanan, Saiful Haq, Ashutosh Sharma, Thomas T. Joshi, Hanna Moazam, Heather Miller, Matei Zaharia, and Christopher Potts. 2024. DSPy: Compiling Declarative Language Model Calls into Self-Improving Pipelines. In Proc. ICLR 2024. arXiv:2310.03714.</w:t>
       </w:r>
     </w:p>
     <w:p>
@@ -11736,7 +11674,7 @@
         </w:numPr>
       </w:pPr>
       <w:r>
-        <w:t>[17] Wojciech Kryscinski, Bryan McCann, Caiming Xiong, and Richard Socher. 2020. Evaluating the Factual Consistency of Abstractive Text Summarization. In Proc. EMNLP 2020, 9332-9346. arXiv:1910.12840.</w:t>
+        <w:t>[17] Takeshi Kojima, Shixiang Shane Gu, Machel Reid, Yutaka Matsuo, and Yusuke Iwasawa. 2022. Large Language Models are Zero-Shot Reasoners. In Advances in Neural Information Processing Systems 35 (NeurIPS 2022). arXiv:2205.11916.</w:t>
       </w:r>
     </w:p>
     <w:p>
@@ -11748,7 +11686,7 @@
         </w:numPr>
       </w:pPr>
       <w:r>
-        <w:t>[18] Woosuk Kwon, Zhuohan Li, Siyuan Zhuang, Ying Sheng, Lianmin Zheng, Cody Hao Yu, Joseph E. Gonzalez, Hao Zhang, and Ion Stoica. 2023. Efficient Memory Management for Large Language Model Serving with PagedAttention. In Proc. SOSP 2023, 611-626. https://doi.org/10.1145/3600006.3613165.</w:t>
+        <w:t>[18] Wojciech Kryściński, Bryan McCann, Caiming Xiong, and Richard Socher. 2020. Evaluating the Factual Consistency of Abstractive Text Summarization. In Proc. EMNLP 2020, 9332-9346. arXiv:1910.12840.</w:t>
       </w:r>
     </w:p>
     <w:p>
@@ -11760,7 +11698,7 @@
         </w:numPr>
       </w:pPr>
       <w:r>
-        <w:t>[19] Patrick Lewis et al. 2020. Retrieval-Augmented Generation for Knowledge-Intensive NLP Tasks. In Advances in Neural Information Processing Systems 33 (NeurIPS 2020), 9459-9474. arXiv:2005.11401.</w:t>
+        <w:t>[19] Woosuk Kwon, Zhuohan Li, Siyuan Zhuang, Ying Sheng, Lianmin Zheng, Cody Hao Yu, Joseph E. Gonzalez, Hao Zhang, and Ion Stoica. 2023. Efficient Memory Management for Large Language Model Serving with PagedAttention. In Proc. SOSP 2023, 611-626. https://doi.org/10.1145/3600006.3613165</w:t>
       </w:r>
     </w:p>
     <w:p>
@@ -11772,7 +11710,7 @@
         </w:numPr>
       </w:pPr>
       <w:r>
-        <w:t>[20] Chin-Yew Lin. 2004. ROUGE: A Package for Automatic Evaluation of Summaries. In Proc. ACL Workshop on Text Summarization Branches Out, 74-81.</w:t>
+        <w:t>[20] Patrick Lewis, Ethan Perez, Aleksandra Piktus, Fabio Petroni, Vladimir Karpukhin, Naman Goyal, Heinrich Küttler, Mike Lewis, Wen-tau Yih, Tim Rocktäschel, Sebastian Riedel, and Douwe Kiela. 2020. Retrieval-Augmented Generation for Knowledge-Intensive NLP Tasks. In Advances in Neural Information Processing Systems 33 (NeurIPS 2020), 9459-9474. arXiv:2005.11401.</w:t>
       </w:r>
     </w:p>
     <w:p>
@@ -11784,7 +11722,7 @@
         </w:numPr>
       </w:pPr>
       <w:r>
-        <w:t>[21] Jerry Liu. 2022. LlamaIndex. GitHub. https://github.com/run-llama/llama_index.</w:t>
+        <w:t>[21] Chin-Yew Lin. 2004. ROUGE: A Package for Automatic Evaluation of Summaries. In Proc. ACL Workshop on Text Summarization Branches Out, 74-81.</w:t>
       </w:r>
     </w:p>
     <w:p>
@@ -11796,7 +11734,7 @@
         </w:numPr>
       </w:pPr>
       <w:r>
-        <w:t>[22] Nelson F. Liu, Kevin Lin, John Hewitt, Ashwin Paranjape, Michele Bevilacqua, Fabio Petroni, and Percy Liang. 2024. Lost in the Middle: How Language Models Use Long Contexts. Trans. Assoc. Comput. Linguist. 12, 157-173. arXiv:2307.03172.</w:t>
+        <w:t>[22] Jerry Liu. 2022. LlamaIndex. GitHub. https://github.com/run-llama/llama_index</w:t>
       </w:r>
     </w:p>
     <w:p>
@@ -11808,7 +11746,7 @@
         </w:numPr>
       </w:pPr>
       <w:r>
-        <w:t>[23] Xueguang Ma, Ruqing Sun, Ronak Pradeep, and Jimmy Lin. 2021. A Replication Study of Dense Passage Retrieval for Open-Domain Question Answering. arXiv:2104.05740.</w:t>
+        <w:t>[23] Nelson F. Liu, Kevin Lin, John Hewitt, Ashwin Paranjape, Michele Bevilacqua, Fabio Petroni, and Percy Liang. 2024. Lost in the Middle: How Language Models Use Long Contexts. Trans. Assoc. Comput. Linguist. 12, 157-173. arXiv:2307.03172.</w:t>
       </w:r>
     </w:p>
     <w:p>
@@ -11820,7 +11758,7 @@
         </w:numPr>
       </w:pPr>
       <w:r>
-        <w:t>[24] Ben Malin, Tatiana Kalganova, and Nikolaos Boulgouris. 2025. A Review of Faithfulness Metrics for Hallucination Assessment in Large Language Models. arXiv:2501.00269.</w:t>
+        <w:t>[24] Xueguang Ma, Kai Sun, Ronak Pradeep, and Jimmy Lin. 2021. A Replication Study of Dense Passage Retriever. arXiv:2104.05740.</w:t>
       </w:r>
     </w:p>
     <w:p>
@@ -11832,7 +11770,7 @@
         </w:numPr>
       </w:pPr>
       <w:r>
-        <w:t>[25] Sewon Min, Kalpesh Krishna, Xinxi Lyu, Mike Lewis, Wen-tau Yih, Pang Wei Koh, Mohit Iyyer, Luke Zettlemoyer, and Hannaneh Hajishirzi. 2023. FActScore: Fine-grained Atomic Evaluation of Factual Precision in Long Form Text Generation. In Proc. EMNLP 2023. arXiv:2305.14251.</w:t>
+        <w:t>[25] Ben Malin, Tatiana Kalganova, and Nikolaos Boulgouris. 2025. A Review of Faithfulness Metrics for Hallucination Assessment in Large Language Models. arXiv:2501.00269.</w:t>
       </w:r>
     </w:p>
     <w:p>
@@ -11844,7 +11782,7 @@
         </w:numPr>
       </w:pPr>
       <w:r>
-        <w:t>[26] Feng Nan, Ramesh Nallapati, Zhiguo Wang, Cicero Nogueira dos Santos, Henghui Zhu, Dejiao Zhang, Kathleen McKeown, and Bing Xiang. 2021. Entity-level Factual Consistency of Abstractive Text Summarization. In Proc. EACL 2021, 2727-2733. arXiv:2102.09130.</w:t>
+        <w:t>[26] Sewon Min, Kalpesh Krishna, Xinxi Lyu, Mike Lewis, Wen-tau Yih, Pang Wei Koh, Mohit Iyyer, Luke Zettlemoyer, and Hannaneh Hajishirzi. 2023. FActScore: Fine-grained Atomic Evaluation of Factual Precision in Long Form Text Generation. In Proc. EMNLP 2023. arXiv:2305.14251.</w:t>
       </w:r>
     </w:p>
     <w:p>
@@ -11856,7 +11794,7 @@
         </w:numPr>
       </w:pPr>
       <w:r>
-        <w:t>[27] Nils Reimers and Iryna Gurevych. 2019. Sentence-BERT: Sentence Embeddings using Siamese BERT-Networks. In Proc. EMNLP 2019, 3982-3992. arXiv:1908.10084.</w:t>
+        <w:t>[27] Feng Nan, Ramesh Nallapati, Zhiguo Wang, Cícero Nogueira dos Santos, Henghui Zhu, Dejiao Zhang, Kathleen McKeown, and Bing Xiang. 2021. Entity-level Factual Consistency of Abstractive Text Summarization. In Proc. EACL 2021, 2727-2733. arXiv:2102.09130.</w:t>
       </w:r>
     </w:p>
     <w:p>
@@ -11868,7 +11806,7 @@
         </w:numPr>
       </w:pPr>
       <w:r>
-        <w:t>[28] Stephen Robertson and Hugo Zaragoza. 2009. The Probabilistic Relevance Framework: BM25 and Beyond. Found. Trends Inf. Retr. 3, 4, 333-389.</w:t>
+        <w:t>[28] Hongjin Qian, Zheng Liu, Peitian Zhang, Kelong Mao, Defu Lian, Zhicheng Dou, and Tiejun Huang. 2025. MemoRAG: Boosting Long Context Processing with Global Memory-Enhanced Retrieval Augmentation. In Proc. ACM Web Conference (WWW 2025). arXiv:2409.05591.</w:t>
       </w:r>
     </w:p>
     <w:p>
@@ -11880,12 +11818,9 @@
         </w:numPr>
       </w:pPr>
       <w:r>
-        <w:t xml:space="preserve">[29] Keshav Santhanam, Omar Khattab, Jon Saad-Falcon, Christopher Potts, and Matei Zaharia. 2022. ColBERTv2: Effective and Efficient Retrieval via </w:t>
-      </w:r>
-      <w:r>
-        <w:lastRenderedPageBreak/>
-        <w:t>Lightweight Late Interaction. In Proc. NAACL-HLT 2022, 3715-3734. arXiv:2112.01488.</w:t>
-      </w:r>
+        <w:t>[29] Nils Reimers and Iryna Gurevych. 2019. Sentence-BERT: Sentence Embeddings using Siamese BERT-Networks. In Proc. EMNLP 2019, 3982-3992. arXiv:1908.10084.</w:t>
+      </w:r>
+      <w:r/>
     </w:p>
     <w:p>
       <w:pPr>
@@ -11896,7 +11831,7 @@
         </w:numPr>
       </w:pPr>
       <w:r>
-        <w:t>[30] Parth Sarthi, Salman Abdullah, Aditi Tuli, Shubh Khanna, Anna Goldie, and Christopher D. Manning. 2024. RAPTOR: Recursive Abstractive Processing for Tree-Organized Retrieval. In Proc. ICLR 2024. arXiv:2401.18059.</w:t>
+        <w:t>[30] Stephen Robertson and Hugo Zaragoza. 2009. The Probabilistic Relevance Framework: BM25 and Beyond. Found. Trends Inf. Retr. 3, 4, 333-389. https://doi.org/10.1561/1500000019</w:t>
       </w:r>
     </w:p>
     <w:p>
@@ -11908,7 +11843,7 @@
         </w:numPr>
       </w:pPr>
       <w:r>
-        <w:t>[31] Kurt Shuster, Spencer Poff, Moya Chen, Douwe Kiela, and Jason Weston. 2021. Retrieval Augmentation Reduces Hallucination in Conversation. In Findings of EMNLP 2021, 3784-3803. arXiv:2104.07567.</w:t>
+        <w:t>[31] Keshav Santhanam, Omar Khattab, Jon Saad-Falcon, Christopher Potts, and Matei Zaharia. 2022. ColBERTv2: Effective and Efficient Retrieval via Lightweight Late Interaction. In Proc. NAACL-HLT 2022, 3715-3734. arXiv:2112.01488.</w:t>
       </w:r>
     </w:p>
     <w:p>
@@ -11920,7 +11855,7 @@
         </w:numPr>
       </w:pPr>
       <w:r>
-        <w:t>[32] Harsh Trivedi, Niranjan Balasubramanian, Tushar Khot, and Ashish Sabharwal. 2023. Interleaving Retrieval with Chain-of-Thought Reasoning for Knowledge-Intensive Multi-Step Questions. In Proc. ACL 2023, 10014-10037. arXiv:2212.10509.</w:t>
+        <w:t>[32] Parth Sarthi, Salman Abdullah, Aditi Tuli, Shubh Khanna, Anna Goldie, and Christopher D. Manning. 2024. RAPTOR: Recursive Abstractive Processing for Tree-Organized Retrieval. In Proc. ICLR 2024. arXiv:2401.18059.</w:t>
       </w:r>
     </w:p>
     <w:p>
@@ -11932,7 +11867,7 @@
         </w:numPr>
       </w:pPr>
       <w:r>
-        <w:t>[33] Vectify AI. 2023. PageIndex: Reasoning-Based, Vectorless RAG via Document Tree Search. GitHub. https://github.com/VectifyAI/PageIndex.</w:t>
+        <w:t>[33] Kurt Shuster, Spencer Poff, Moya Chen, Douwe Kiela, and Jason Weston. 2021. Retrieval Augmentation Reduces Hallucination in Conversation. In Findings of EMNLP 2021, 3784-3803. arXiv:2104.07567.</w:t>
       </w:r>
     </w:p>
     <w:p>
@@ -11944,7 +11879,7 @@
         </w:numPr>
       </w:pPr>
       <w:r>
-        <w:t>[34] Jason Wei, Xuezhi Wang, Dale Schuurmans, Maarten Bosma, Brian Ichter, Fei Xia, Ed Chi, Quoc Le, and Denny Zhou. 2022. Chain-of-Thought Prompting Elicits Reasoning in Large Language Models. In Advances in Neural Information Processing Systems 35 (NeurIPS 2022). arXiv:2201.11903.</w:t>
+        <w:t>[34] Aditi Singh, Abul Ehtesham, Saket Kumar, and Tala Talaei Khoei. 2025. Agentic Retrieval-Augmented Generation: A Survey on Agentic RAG. arXiv:2501.09136.</w:t>
       </w:r>
     </w:p>
     <w:p>
@@ -11956,7 +11891,7 @@
         </w:numPr>
       </w:pPr>
       <w:r>
-        <w:t>[35] Zhilin Yang, Peng Qi, Saizheng Zhang, Yoshua Bengio, William Cohen, Ruslan Salakhutdinov, and Christopher D. Manning. 2018. HotpotQA: A Dataset for Diverse, Explainable Multi-hop Question Answering. In Proc. EMNLP 2018, 2369-2380. arXiv:1809.09600.</w:t>
+        <w:t>[35] Wenyu Tao, Xiaofen Xing, Yirong Chen, Linyi Huang, and Xiangmin Xu. 2025. TreeRAG: Unleashing the Power of Hierarchical Storage for Enhanced Knowledge Retrieval in Long Documents. In Findings of the Association for Computational Linguistics: ACL 2025, 356-371.</w:t>
       </w:r>
     </w:p>
     <w:p>
@@ -11968,7 +11903,7 @@
         </w:numPr>
       </w:pPr>
       <w:r>
-        <w:t>[36] Tianyi Zhang, Varsha Kishore, Felix Wu, Kilian Q. Weinberger, and Yoav Artzi. 2020. BERTScore: Evaluating Text Generation with BERT. In Proc. ICLR 2020. arXiv:1904.09675.</w:t>
+        <w:t>[36] Harsh Trivedi, Niranjan Balasubramanian, Tushar Khot, and Ashish Sabharwal. 2023. Interleaving Retrieval with Chain-of-Thought Reasoning for Knowledge-Intensive Multi-Step Questions. In Proc. ACL 2023, 10014-10037. arXiv:2212.10509.</w:t>
       </w:r>
     </w:p>
     <w:p>
@@ -11980,7 +11915,7 @@
         </w:numPr>
       </w:pPr>
       <w:r>
-        <w:t>[37] Xiaoming Zhang, Ming Wang, Xiaocui Yang, Daling Wang, Shi Feng, and Yifei Zhang. 2024. Hierarchical Retrieval-Augmented Generation Model with Rethink for Multi-hop Question Answering. arXiv:2408.11875.</w:t>
+        <w:t>[37] Vectify AI. 2025. PageIndex: Reasoning-Based, Vectorless RAG via Document Tree Search. GitHub. https://github.com/VectifyAI/PageIndex</w:t>
       </w:r>
     </w:p>
     <w:p>
@@ -11992,7 +11927,7 @@
         </w:numPr>
       </w:pPr>
       <w:r>
-        <w:t>[38] Lianmin Zheng et al. 2023. Judging LLM-as-a-Judge with MT-Bench and Chatbot Arena. In Advances in Neural Information Processing Systems 36 (NeurIPS 2023), Datasets and Benchmarks Track. arXiv:2306.05685.</w:t>
+        <w:t>[38] Jason Wei, Xuezhi Wang, Dale Schuurmans, Maarten Bosma, Brian Ichter, Fei Xia, Ed Chi, Quoc Le, and Denny Zhou. 2022. Chain-of-Thought Prompting Elicits Reasoning in Large Language Models. In Advances in Neural Information Processing Systems 35 (NeurIPS 2022). arXiv:2201.11903.</w:t>
       </w:r>
     </w:p>
     <w:p>
@@ -12004,7 +11939,7 @@
         </w:numPr>
       </w:pPr>
       <w:r>
-        <w:t>[39] Wenyu Tao, Xiaofen Xing, Yirong Chen, Linyi Huang, and Xiangmin Xu. 2025. TreeRAG: Unleashing the Power of Hierarchical Storage for Enhanced Knowledge Retrieval in Long Documents. In Findings of the Association for Computational Linguistics: ACL 2025, pp. 356–371.</w:t>
+        <w:t>[39] Zhilin Yang, Peng Qi, Saizheng Zhang, Yoshua Bengio, William W. Cohen, Ruslan Salakhutdinov, and Christopher D. Manning. 2018. HotpotQA: A Dataset for Diverse, Explainable Multi-hop Question Answering. In Proc. EMNLP 2018, 2369-2380. arXiv:1809.09600.</w:t>
       </w:r>
     </w:p>
     <w:p>
@@ -12016,7 +11951,7 @@
         </w:numPr>
       </w:pPr>
       <w:r>
-        <w:t>[40] Luyang Huang, Shuyang Cao, Nikolaus Parulian, Heng Ji, and Lu Wang. 2021. Efficient Attentions for Long Document Summarization. In Proc. NAACL-HLT 2021, pp. 1419–1436.</w:t>
+        <w:t>[40] Tianyi Zhang, Varsha Kishore, Felix Wu, Kilian Q. Weinberger, and Yoav Artzi. 2020. BERTScore: Evaluating Text Generation with BERT. In Proc. ICLR 2020. arXiv:1904.09675.</w:t>
       </w:r>
     </w:p>
     <w:p>
@@ -12028,7 +11963,7 @@
         </w:numPr>
       </w:pPr>
       <w:r>
-        <w:t>[41] Hongjin Qian, Peitian Zhang, Zheng Liu, Kelong Mao, and Zhicheng Dou. 2025. MemoRAG: Boosting Long Context Processing with Global Memory-Enhanced Retrieval Augmentation. In Proc. ACM Web Conference (WWW 2025). arXiv:2409.05591.</w:t>
+        <w:t>[41] Xiaoming Zhang, Ming Wang, Xiaocui Yang, Daling Wang, Shi Feng, and Yifei Zhang. 2024. Hierarchical Retrieval-Augmented Generation Model with Rethink for Multi-hop Question Answering. arXiv:2408.11875.</w:t>
       </w:r>
     </w:p>
     <w:p>
@@ -12040,7 +11975,7 @@
         </w:numPr>
       </w:pPr>
       <w:r>
-        <w:t>[42] Aditi Singh, Abul Ehtesham, Saket Kumar, Tala Talaei Khoei, and Athanasios V. Vasilakos. 2025. Agentic Retrieval-Augmented Generation: A Survey on Agentic RAG. arXiv:2501.09136.</w:t>
+        <w:t>[42] Lianmin Zheng, Wei-Lin Chiang, Ying Sheng, Siyuan Zhuang, Zhanghao Wu, Yonghao Zhuang, Zi Lin, Zhuohan Li, Dacheng Li, Eric P. Xing, Hao Zhang, Joseph E. Gonzalez, and Ion Stoica. 2023. Judging LLM-as-a-Judge with MT-Bench and Chatbot Arena. In Advances in Neural Information Processing Systems 36 (NeurIPS 2023), Datasets and Benchmarks Track. arXiv:2306.05685.</w:t>
       </w:r>
     </w:p>
     <w:sectPr>

</xml_diff>